<commit_message>
Polish gallery scale, interaction volumes and catalogue UI
Enlarge paintings across M01-M03, use smaller front-facing interaction boxes, and separate wall trim surfaces. Apply aspect-preserving catalogue image styles, correct displayed font sizes, and remove nameplate backgrounds and inventory summaries.
</commit_message>
<xml_diff>
--- a/Museum_Heist_GDD.docx
+++ b/Museum_Heist_GDD.docx
@@ -7372,7 +7372,7 @@
               <w:pStyle w:val="TableText"/>
             </w:pPr>
             <w:r>
-              <w:t>Inventory에서 Secured Value와 함께 확인하고 Result에서 최종 비교</w:t>
+              <w:t>Result에서 Secured Value와 최종 비교한다. Inventory 요약에는 표시하지 않는다.</w:t>
             </w:r>
           </w:p>
         </w:tc>
@@ -8932,6 +8932,9 @@
     <w:p>
       <w:r>
         <w:t>각 맵은 탈취 가능한 20점 외에 상호작용하지 않는 일반 전시물을 함께 배치한다. 일반 전시물은 단독·연작·다단 군집으로 전시실을 구성하고 탈취 대상과 같거나 더 큰 작품도 포함한다. 탈취 가능한 작품은 두꺼운 프레임과 하단 보안 패널로 접근 전에 구별한다. 작품 크기, 중앙 위치 또는 양옆의 일반 작품 수가 정답을 드러내는 고정 패턴을 사용하지 않는다. 근거리 행동 안내는 탈취 대상에만 표시하며, 필수 작품은 기존 계약 단서와 발견 표시를 따른다.</w:t>
+      </w:r>
+      <w:r>
+        <w:t xml:space="preserve"> 전시 그림과 프레임은 기존 배치도 대비 1.5배 크기로 확대하며 군집의 간격과 설치 높이를 함께 조정한다. 탈취 작품의 행동 영역은 작품 정면의 근거리로 한정한다. 벽 하단 걸레받이와 상단 몰딩은 벽 두께의 1.15배로 돌출시켜 표면 겹침을 없앤다.</w:t>
       </w:r>
     </w:p>
     <w:p>
@@ -12795,7 +12798,7 @@
     </w:p>
     <w:p>
       <w:r>
-        <w:t>Remote Nameplate는 Player Name, Player Color, 거리, 핵심 상태 아이콘을 표시한다. Local Player 자신의 Nameplate는 표시하지 않는다. Guard·Loot·SoundPing은 이 체계를 재사용하지 않는다.</w:t>
+        <w:t>Remote Nameplate는 Player Name, Player Color, 거리, 핵심 상태 아이콘을 표시하며 이름 주변 배경 패널은 사용하지 않는다. Local Player 자신의 Nameplate는 표시하지 않는다. Guard·Loot·SoundPing은 이 체계를 재사용하지 않는다.</w:t>
       </w:r>
     </w:p>
     <w:p>
@@ -13784,7 +13787,7 @@
         </w:numPr>
       </w:pPr>
       <w:r>
-        <w:t>확보 가치, 예상 점수, Carried/Secured/Quota와 무게 수치는 Main HUD에서 제외한다. 전리품과 무게 상세는 Inventory가 소유하고 HUD에는 Inventory 단축키와 가벼움 초록→무거움 빨강의 상태 색상만 남긴다.</w:t>
+        <w:t>확보 가치, 예상 점수, Carried/Secured/Quota와 무게 수치는 Main HUD에서 제외한다. Inventory는 전리품 Grid와 닫기로 구성하며 배낭 상태·계약 가치 요약은 표시하지 않는다. HUD의 Inventory 단축키와 무게 상태 색상은 유지한다.</w:t>
       </w:r>
     </w:p>
     <w:p>

</xml_diff>

<commit_message>
Separate security and detention wings from gallery routes
</commit_message>
<xml_diff>
--- a/Museum_Heist_GDD.docx
+++ b/Museum_Heist_GDD.docx
@@ -15487,10 +15487,10 @@
         </w:numPr>
       </w:pPr>
       <w:r>
-        <w:t>세 맵은 동일한 Gameplay Rule을 사용하되, Material과 Lighting만이 아니라 Macro Topology, 첫 10초의 정보 공개 방식, Landmark, Target 이후 귀환 경로로 서로 다른 플레이 정체성을 만든다.</w:t>
-      </w:r>
-      <w:r>
-        <w:t xml:space="preserve"> 야간 침입은 상시 전면 조명 대신 꺼진 구역과 국소 조명의 대비로 표현한다. M01은 따뜻한 전시 잔등, M02는 푸른 중정과 어두운 회랑, M03는 차가운 유리 채광과 서비스 조명을 중심으로 구성한다. 작품 앞과 버튼·출구는 식별 가능하게 유지하며 조명만으로 도난 대상을 알려주지 않는다.</w:t>
+        <w:t>세 맵은 동일한 Gameplay Rule을 사용하되, Material과 Lighting만이 아니라 Macro Topology, 첫 10초의 정보 공개 방식, Landmark, Target 이후 귀환 경로로 서로 다른 플레이 정체성을 만든다. 야간 침입은 상시 전면 조명 대신 꺼진 구역과 국소 조명의 대비로 표현한다. M01은 따뜻한 전시 잔등, M02는 푸른 중정과 어두운 회랑, M03는 차가운 유리 채광과 서비스 조명을 중심으로 구성한다. 작품 앞과 버튼·출구는 식별 가능하게 유지하며 조명만으로 도난 대상을 알려주지 않는다. 경비실과 구금실은 관람 동선에서 갈라지는 단일 보안 진입부 뒤에 둔다. 폭 1.8m 출입구와 불투명 전실 벽으로 직접 시야를 끊고, CCTV와 내부 순찰을 통과한 뒤 압수품 회수 또는 구금실 구조를 선택한다. 구금실에는 측면 개구부가 있는 철제 칸막이와 고정 벤치를 두고, 보안 표지·금속 문틀·차가운 국소등으로 일반 전시실과 경계를 구분한다. 추가 열쇠나 해킹 없이 기존 상호작용으로 구조·회수하며 구조 후 동일 진입부로 귀환한다.</w:t>
+      </w:r>
+      <w:r>
+        <w:t xml:space="preserve"/>
       </w:r>
     </w:p>
     <w:p>
@@ -16043,7 +16043,7 @@
     </w:p>
     <w:p>
       <w:r>
-        <w:t>84×64m의 고전미술관이다. 24×20m 중앙 홀을 방향 기준점으로 두고, 북측 5개와 남측 5개 전시실을 두 순환 루프로 연결한다. 서측 진입 전실과 동측 증거실·구금실을 분리하고 북·남 끝 4m 관리 회랑으로 우회한다. 18개 구역과 30개 문을 사용하며 동측 두 선택 전시실에 Laser 지름길과 일반 우회로를 둔다. 필수 작품은 북동 N4 전시실의 동쪽 벽에 두고, 고가 작품은 N5와 S5에 배치한다. 벽 높이는 4.4m이고 대리석 바닥·금장 문틀·정돈된 벽면 전시로 고전미술관의 질서를 만든다.</w:t>
+        <w:t>84×64m의 고전미술관이다. 24×20m 중앙 홀을 방향 기준점으로 두고, 북측 5개와 남측 5개 전시실을 두 순환 루프로 연결한다. 서측 진입 전실과 동측 증거실·구금실을 분리하고 북·남 끝 4m 관리 회랑으로 우회한다. 18개 구역과 27개 문을 사용하며 동측 두 선택 전시실에 Laser 지름길과 일반 우회로를 둔다. 필수 작품은 북동 N4 전시실의 동쪽 벽에 두고, 고가 작품은 N5와 S5에 배치한다. 벽 높이는 4.4m이고 대리석 바닥·금장 문틀·정돈된 벽면 전시로 고전미술관의 질서를 만든다. 동쪽 홀에서만 보안 별관에 진입하며 북동·남동 전시실 및 홀에서 구금실로 바로 통하는 문을 닫는다. 경비실 전실을 남쪽으로 돌아 들어간 뒤 구금실의 동쪽 개구부로 접근한다.</w:t>
       </w:r>
     </w:p>
     <w:tbl>
@@ -16358,7 +16358,7 @@
     </w:p>
     <w:p>
       <w:r>
-        <w:t>72×64m의 중정형 동양미술관이다. 20×20m 정원과 폭 4m 순환 회랑을 중심으로 21개 구역을 29개 문으로 연결한다. 남서측 전실의 두 꺾임 뒤 정원이 드러나며, 벽에 붙은 입구 병풍과 버튼 대기용 차폐벽, 정원 안의 수면·식재·정자를 정돈해 배치한다. 비스듬한 독립 가림막과 회랑에 흩어진 바위·관목은 배치하지 않는다. 세 CCTV 지름길은 긴 우회 동선과 위험을 교환하고 북동·남동 선택실에 Laser를 둔다. 필수 작품은 동측 E2 전시실의 동쪽 벽에 둔다. 북동 고가실과 E2 사이의 바로 옆 출입문을 닫고, 북쪽 관리 회랑을 일반 우회·이탈로로 유지한다. 북동 버튼은 전시실 북동 모서리, 남동 버튼은 진입문의 동쪽 벽감에 두어 통과 순찰선과 분리한다. 벽 높이는 4.4m이며 목재·동장 프레임·낮은 정원 식재로 관람 공간의 질서를 유지한다. 남동 고가실과 증거실 사이의 중복 지름길도 닫고 서쪽 S3 전시실을 통한 일반 출입·이탈을 유지한다. 차폐벽 아래의 버튼은 국소 조명으로 식별성을 유지한다.</w:t>
+        <w:t>72×64m의 중정형 동양미술관이다. 20×20m 정원과 폭 4m 순환 회랑을 중심으로 21개 구역을 28개 문으로 연결한다. 남서측 전실의 두 꺾임 뒤 정원이 드러나며, 벽에 붙은 입구 병풍과 버튼 대기용 차폐벽, 정원 안의 수면·식재·정자를 정돈해 배치한다. 비스듬한 독립 가림막과 회랑에 흩어진 바위·관목은 배치하지 않는다. 세 CCTV 지름길은 긴 우회 동선과 위험을 교환하고 북동·남동 선택실에 Laser를 둔다. 필수 작품은 동측 E2 전시실의 동쪽 벽에 둔다. 북동 고가실과 E2 사이의 바로 옆 출입문을 닫고, 북쪽 관리 회랑을 일반 우회·이탈로로 유지한다. 북동 버튼은 전시실 북동 모서리, 남동 버튼은 진입문의 동쪽 벽감에 두어 통과 순찰선과 분리한다. 벽 높이는 4.4m이며 목재·동장 프레임·낮은 정원 식재로 관람 공간의 질서를 유지한다. 남동 고가실과 증거실 사이의 중복 지름길도 닫고 서쪽 S3 전시실을 통한 일반 출입·이탈을 유지한다. 차폐벽 아래의 버튼은 국소 조명으로 식별성을 유지한다. 남동 보안 구역은 E1 전시실에서만 진입하며 남쪽 관리 회랑의 구금실 직통 문을 닫는다. 입구 안쪽 벽의 서쪽을 돌아 압수품 보관실과 구금실로 진입하고 기존 남측 순찰에 이 구역 왕복을 포함한다.</w:t>
       </w:r>
     </w:p>
     <w:tbl>
@@ -16669,7 +16669,7 @@
     </w:p>
     <w:p>
       <w:r>
-        <w:t>96×56m의 현대미술관이다. 북측 전시 레인, 불투명 벽으로 구획한 중앙 레인, 남측 복원·서비스 레인을 19개 구역과 33개 문으로 연결한다. 중앙 문의 위치를 남북으로 번갈아 배치하여 긴 직선 시야를 끊고 각 교차로에서 우회·횡단·귀환을 선택하게 한다. 북동·중앙 동측·남측 고가 선택실에 Laser를 두되 독립적인 일반 이탈 문을 제공한다. 벽 높이는 5m이며 고측 유리 채광과 금속 구조, 백색 콘크리트 벽면으로 현대미술관을 표현한다. 필수 작품은 Laser가 없는 북동 N4 전시실의 북쪽 벽에 둔다. 세 버튼은 각각 N4 남동·C3 남동·S2 남동 모서리의 차폐 공간에 두고, 일직선 통과 순찰선에서 벗어나 진입 준비와 역할 교대를 할 수 있게 한다. 남측 버튼과 겹치던 전리품 받침대는 동쪽 서비스실로 옮겨 차폐 공간의 바닥을 비운다.</w:t>
+        <w:t>96×56m의 현대미술관이다. 북측 전시 레인, 불투명 벽으로 구획한 중앙 레인, 남측 복원·서비스 레인을 19개 구역과 30개 문으로 연결한다. 중앙 문의 위치를 남북으로 번갈아 배치하여 긴 직선 시야를 끊고 각 교차로에서 우회·횡단·귀환을 선택하게 한다. 북동·중앙 동측·남측 고가 선택실에 Laser를 두되 독립적인 일반 이탈 문을 제공한다. 벽 높이는 5m이며 고측 유리 채광과 금속 구조, 백색 콘크리트 벽면으로 현대미술관을 표현한다. 필수 작품은 Laser가 없는 북동 N4 전시실의 북쪽 벽에 둔다. 세 버튼은 각각 N4 남동·C3 남동·S2 남동 모서리의 차폐 공간에 두고, 일직선 통과 순찰선에서 벗어나 진입 준비와 역할 교대를 할 수 있게 한다. 남측 버튼과 겹치던 전리품 받침대는 동쪽 서비스실로 옮겨 차폐 공간의 바닥을 비운다. 남쪽 서비스 레인 S4에서만 보안 구역으로 진입하며 중앙 C4와 구금실 및 남쪽 회랑의 직통 문을 닫는다. 전실 남쪽으로 꺾어 들어가는 접근로와 구금실 동쪽 개구부로 경계를 단계적으로 통과한다.</w:t>
       </w:r>
     </w:p>
     <w:tbl>

</xml_diff>

<commit_message>
Implement detention escape and guarded cell layouts
Restore controls after five seconds, add authoritative three-latch solo escape and teammate rescue, and integrate detention guards, UI, audio, map authoring scripts, documentation, and regression coverage.
</commit_message>
<xml_diff>
--- a/Museum_Heist_GDD.docx
+++ b/Museum_Heist_GDD.docx
@@ -7834,7 +7834,7 @@
               <w:pStyle w:val="TableText"/>
             </w:pPr>
             <w:r>
-              <w:t>Required Target 미확보, 전원 Arrest, Lockdown 종료 등</w:t>
+              <w:t>Required Target 미확보, 회복 불가능한 전원 Arrest, Lockdown 종료 등</w:t>
             </w:r>
           </w:p>
         </w:tc>
@@ -11318,7 +11318,7 @@
         </w:numPr>
       </w:pPr>
       <w:r>
-        <w:t>Guard의 Stun이 끝나면 서버가 Arrest를 확정하기 전에 미정산 Inventory의 Loose Loot와 Original을 전부 압수하고, 플레이어를 맵의 Detention Cell로 이송한다. Arrest는 Stun과 구분되는 Cuffed/Disabled 상태이며 Local Screen, Team Status, 감옥 위치 피드백을 제공한다.</w:t>
+        <w:t>Guard Stun 뒤 미정산 전리품을 압수하고 철창 구금실로 이송한다. 5초 뒤 실내 이동과 시점을 복원하지만 철창문은 잠겨 있다. 안쪽에서는 잠금장치의 걸쇠 세 개를 타이밍에 맞춰 해제한다. 성공 구간은 단계마다 좁아지며 숙련자의 첫 성공까지 12~18초를 목표로 한다. 실수하면 현재 걸쇠만 다시 시도하고 금속음으로 근처 경비가 조사한다. 자리를 벗어나도 완료한 걸쇠는 유지한다. 동료는 바깥 잠금장치를 2초간 유지해 더 빠르게 구조한다. 문 개방 후 직접 이탈해야 하며 압수품은 별도 보관 공간에서 회수한다. 구금 중에도 회복 가능한 플레이어가 있으면 전원 체포만으로 게임을 끝내지 않는다. Lockdown과 계약 시간 만료는 그대로 종료한다.</w:t>
       </w:r>
     </w:p>
     <w:p>
@@ -15487,7 +15487,7 @@
         </w:numPr>
       </w:pPr>
       <w:r>
-        <w:t>세 맵은 동일한 Gameplay Rule을 사용하되, Material과 Lighting만이 아니라 Macro Topology, 첫 10초의 정보 공개 방식, Landmark, Target 이후 귀환 경로로 서로 다른 플레이 정체성을 만든다. 야간 침입은 상시 전면 조명 대신 꺼진 구역과 국소 조명의 대비로 표현한다. M01은 따뜻한 전시 잔등, M02는 푸른 중정과 어두운 회랑, M03는 차가운 유리 채광과 서비스 조명을 중심으로 구성한다. 작품 앞과 버튼·출구는 식별 가능하게 유지하며 조명만으로 도난 대상을 알려주지 않는다. 경비실과 구금실은 관람 동선에서 갈라지는 단일 보안 진입부 뒤에 둔다. 폭 1.8m 출입구와 불투명 전실 벽으로 직접 시야를 끊고, CCTV와 내부 순찰을 통과한 뒤 압수품 회수 또는 구금실 구조를 선택한다. 구금실에는 측면 개구부가 있는 철제 칸막이와 고정 벤치를 두고, 보안 표지·금속 문틀·차가운 국소등으로 일반 전시실과 경계를 구분한다. 추가 열쇠나 해킹 없이 기존 상호작용으로 구조·회수하며 구조 후 동일 진입부로 귀환한다.</w:t>
+        <w:t>세 맵은 동일한 Gameplay Rule을 사용하되, Material과 Lighting만이 아니라 Macro Topology, 첫 10초의 정보 공개 방식, Landmark, Target 이후 귀환 경로로 서로 다른 플레이 정체성을 만든다. 야간 침입은 상시 전면 조명 대신 꺼진 구역과 국소 조명의 대비로 표현한다. M01은 따뜻한 전시 잔등, M02는 푸른 중정과 어두운 회랑, M03는 차가운 유리 채광과 서비스 조명을 중심으로 구성한다. 작품 앞과 버튼·출구는 식별 가능하게 유지하며 조명만으로 도난 대상을 알려주지 않는다. 경비실과 구금실은 관람 동선에서 갈라지는 단일 보안 진입부 뒤에 둔다. 폭 1.8m 출입구와 불투명 전실 벽으로 직접 시야를 끊고, CCTV와 내부 순찰을 통과한 뒤 압수품 회수 또는 구금실 구조를 선택한다. 구금실에는 잠긴 철창문으로만 통과할 수 있는 완전한 철제 칸막이와 고정 벤치를 두고, 보안 표지·금속 문틀·차가운 국소등으로 일반 전시실과 경계를 구분한다. 추가 열쇠나 해킹 없이 기존 상호작용으로 구조·회수하며 구조 또는 구속 시간 경과 후 동일 진입부를 통해 탈출을 시도한다. 각 맵의 기존 경비 한 명을 보안 구역과 인접 복도를 순찰하도록 배치한다. 순환 목표는 25~35초이며 철창 앞에서 2~3초 확인한다. 철창 안 구금자는 시야만으로 재체포하지 않으며 작업 실패 소음에는 조사로 반응한다.</w:t>
       </w:r>
       <w:r>
         <w:t xml:space="preserve"/>

</xml_diff>

<commit_message>
Expand museum exploration layouts and refresh floor plans
</commit_message>
<xml_diff>
--- a/Museum_Heist_GDD.docx
+++ b/Museum_Heist_GDD.docx
@@ -15498,7 +15498,13 @@
         <w:pStyle w:val="a0"/>
       </w:pPr>
       <w:r>
-        <w:t>전시실은 작품 벽과 관람 공간을 함께 설계한다. 승인 평면도 기준 외벽 0.40m, 내벽 0.24m, 연결 문 3~4m, 후면 관리 회랑 4m를 사용한다. 작품 앞 작업 공간은 2.2m를 확보하며 활성 작품은 벽에서 1.6m 떨어진 접근점으로 진입할 수 있어야 한다. 맵별 활성 작품 20점, 일반 작품 M01 51점·M02 53점·M03 61점과 12종 전시 패턴을 배치한다. 통과 폭과 15~25분 플레이 시간은 실제 멀티플레이로 검증한다.</w:t>
+        <w:t>전시실은 작품 벽과 관람 공간을 함께 설계한다. 승인 평면도 기준 외벽 0.40m, 내벽 0.24m, 일반 연결 문 3~4m, 후면 관리 회랑 약 5.5~5.7m를 사용한다. 작품 앞 작업 공간은 2.2m를 확보하며 활성 작품은 그림 표면에서 정면 0.7m의 근거리 접근점으로 진입할 수 있어야 한다. 맵별 활성 작품 20점, 일반 작품 M01 51점·M02 53점·M03 61점과 12종 전시 패턴을 배치한다. 통과 폭과 15~25분 플레이 시간은 실제 멀티플레이로 검증한다.</w:t>
+      </w:r>
+      <w:r>
+        <w:t xml:space="preserve"> 작품 발견과 다음 전시 구역 진입이 연달아 끝나지 않도록 맵별 바닥 면적을 이전 배치의 약 2배로 확장한다. 활성 작품 20점과 일반 작품 수, 군집 내부 간격, 액자·문·상호작용 영역 크기와 위조 시간은 유지하고 구역 및 군집 사이 이동 거리를 늘린다. 기존 엇갈린 출입구와 차폐벽을 유지하며 탐색·위험 판단·귀환에 드는 시간을 함께 평가한다. 면적 증가를 15~25분 플레이 시간 달성으로 간주하지 않고 실제 경로와 플레이 테스트로 검증한다.</w:t>
+      </w:r>
+      <w:r>
+        <w:t xml:space="preserve"> 초반 전시실과 필수 작품 전시실에는 높이 3.2m의 벽 연결형 차폐벽을 총 8개 배치해 한 자리에서 여러 작품을 연속 확인하는 시야를 나누고, 벽 끝의 열린 통로로 우회하도록 한다.</w:t>
       </w:r>
     </w:p>
     <w:p>
@@ -16043,7 +16049,7 @@
     </w:p>
     <w:p>
       <w:r>
-        <w:t>84×64m의 고전미술관이다. 24×20m 중앙 홀을 방향 기준점으로 두고, 북측 5개와 남측 5개 전시실을 두 순환 루프로 연결한다. 서측 진입 전실과 동측 증거실·구금실을 분리하고 북·남 끝 4m 관리 회랑으로 우회한다. 18개 구역과 27개 문을 사용하며 동측 두 선택 전시실에 Laser 지름길과 일반 우회로를 둔다. 필수 작품은 북동 N4 전시실의 동쪽 벽에 두고, 고가 작품은 N5와 S5에 배치한다. 벽 높이는 4.4m이고 대리석 바닥·금장 문틀·정돈된 벽면 전시로 고전미술관의 질서를 만든다. 동쪽 홀에서만 보안 별관에 진입하며 북동·남동 전시실 및 홀에서 구금실로 바로 통하는 문을 닫는다. 경비실 전실을 남쪽으로 돌아 들어간 뒤 구금실의 동쪽 개구부로 접근한다.</w:t>
+        <w:t>120×88m의 고전미술관이다. 약 34.3×27.5m 중앙 홀을 방향 기준점으로 두고, 북측 5개와 남측 5개 전시실을 두 순환 루프로 연결한다. 서측 진입 전실과 동측 증거실·구금실을 분리하고 북·남 끝 5.5m 관리 회랑으로 우회한다. 18개 구역과 27개 문을 사용하며 동측 두 선택 전시실에 Laser 지름길과 일반 우회로를 둔다. 필수 작품은 북동 N4 전시실의 동쪽 벽에 두고, 고가 작품은 N5와 S5에 배치한다. 벽 높이는 4.4m이고 대리석 바닥·금장 문틀·정돈된 벽면 전시로 고전미술관의 질서를 만든다. 동쪽 홀에서만 보안 별관에 진입하며 북동·남동 전시실 및 홀에서 구금실로 바로 통하는 문을 닫는다. 경비실 전실을 남쪽으로 돌아 들어간 뒤 구금실의 동쪽 개구부로 접근한다.</w:t>
       </w:r>
     </w:p>
     <w:tbl>
@@ -16358,7 +16364,7 @@
     </w:p>
     <w:p>
       <w:r>
-        <w:t>72×64m의 중정형 동양미술관이다. 20×20m 정원과 폭 4m 순환 회랑을 중심으로 21개 구역을 28개 문으로 연결한다. 남서측 전실의 두 꺾임 뒤 정원이 드러나며, 벽에 붙은 입구 병풍과 버튼 대기용 차폐벽, 정원 안의 수면·식재·정자를 정돈해 배치한다. 비스듬한 독립 가림막과 회랑에 흩어진 바위·관목은 배치하지 않는다. 세 CCTV 지름길은 긴 우회 동선과 위험을 교환하고 북동·남동 선택실에 Laser를 둔다. 필수 작품은 동측 E2 전시실의 동쪽 벽에 둔다. 북동 고가실과 E2 사이의 바로 옆 출입문을 닫고, 북쪽 관리 회랑을 일반 우회·이탈로로 유지한다. 북동 버튼은 전시실 북동 모서리, 남동 버튼은 진입문의 동쪽 벽감에 두어 통과 순찰선과 분리한다. 벽 높이는 4.4m이며 목재·동장 프레임·낮은 정원 식재로 관람 공간의 질서를 유지한다. 남동 고가실과 증거실 사이의 중복 지름길도 닫고 서쪽 S3 전시실을 통한 일반 출입·이탈을 유지한다. 차폐벽 아래의 버튼은 국소 조명으로 식별성을 유지한다. 남동 보안 구역은 E1 전시실에서만 진입하며 남쪽 관리 회랑의 구금실 직통 문을 닫는다. 입구 안쪽 벽의 서쪽을 돌아 압수품 보관실과 구금실로 진입하고 기존 남측 순찰에 이 구역 왕복을 포함한다.</w:t>
+        <w:t>108×88m의 중정형 동양미술관이다. 30×27.5m 정원과 폭 5.5~6m 순환 회랑을 중심으로 21개 구역을 28개 문으로 연결한다. 남서측 전실의 두 꺾임 뒤 정원이 드러나며, 벽에 붙은 입구 병풍과 버튼 대기용 차폐벽, 정원 안의 수면·식재·정자를 정돈해 배치한다. 비스듬한 독립 가림막과 회랑에 흩어진 바위·관목은 배치하지 않는다. 세 CCTV 지름길은 긴 우회 동선과 위험을 교환하고 북동·남동 선택실에 Laser를 둔다. 필수 작품은 동측 E2 전시실의 동쪽 벽에 둔다. 북동 고가실과 E2 사이의 바로 옆 출입문을 닫고, 북쪽 관리 회랑을 일반 우회·이탈로로 유지한다. 북동 버튼은 전시실 북동 모서리, 남동 버튼은 진입문의 동쪽 벽감에 두어 통과 순찰선과 분리한다. 벽 높이는 4.4m이며 목재·동장 프레임·낮은 정원 식재로 관람 공간의 질서를 유지한다. 남동 고가실과 증거실 사이의 중복 지름길도 닫고 서쪽 S3 전시실을 통한 일반 출입·이탈을 유지한다. 차폐벽 아래의 버튼은 국소 조명으로 식별성을 유지한다. 남동 보안 구역은 E1 전시실에서만 진입하며 남쪽 관리 회랑의 구금실 직통 문을 닫는다. 입구 안쪽 벽의 서쪽을 돌아 압수품 보관실과 구금실로 진입하고 기존 남측 순찰에 이 구역 왕복을 포함한다.</w:t>
       </w:r>
     </w:p>
     <w:tbl>
@@ -16516,7 +16522,7 @@
           </w:tcPr>
           <w:p>
             <w:r>
-              <w:t>20×20m 중정, 4m 순환 회랑, 굴절 진입, 북·남 관리 회랑</w:t>
+              <w:t>30×27.5m 중정, 5.5~6m 순환 회랑, 굴절 진입, 북·남 관리 회랑</w:t>
             </w:r>
           </w:p>
         </w:tc>
@@ -16669,7 +16675,7 @@
     </w:p>
     <w:p>
       <w:r>
-        <w:t>96×56m의 현대미술관이다. 북측 전시 레인, 불투명 벽으로 구획한 중앙 레인, 남측 복원·서비스 레인을 19개 구역과 30개 문으로 연결한다. 중앙 문의 위치를 남북으로 번갈아 배치하여 긴 직선 시야를 끊고 각 교차로에서 우회·횡단·귀환을 선택하게 한다. 북동·중앙 동측·남측 고가 선택실에 Laser를 두되 독립적인 일반 이탈 문을 제공한다. 벽 높이는 5m이며 고측 유리 채광과 금속 구조, 백색 콘크리트 벽면으로 현대미술관을 표현한다. 필수 작품은 Laser가 없는 북동 N4 전시실의 북쪽 벽에 둔다. 세 버튼은 각각 N4 남동·C3 남동·S2 남동 모서리의 차폐 공간에 두고, 일직선 통과 순찰선에서 벗어나 진입 준비와 역할 교대를 할 수 있게 한다. 남측 버튼과 겹치던 전리품 받침대는 동쪽 서비스실로 옮겨 차폐 공간의 바닥을 비운다. 남쪽 서비스 레인 S4에서만 보안 구역으로 진입하며 중앙 C4와 구금실 및 남쪽 회랑의 직통 문을 닫는다. 전실 남쪽으로 꺾어 들어가는 접근로와 구금실 동쪽 개구부로 경계를 단계적으로 통과한다.</w:t>
+        <w:t>132×80m의 현대미술관이다. 북측 전시 레인, 불투명 벽으로 구획한 중앙 레인, 남측 복원·서비스 레인을 19개 구역과 30개 문으로 연결한다. 중앙 문의 위치를 남북으로 번갈아 배치하여 긴 직선 시야를 끊고 각 교차로에서 우회·횡단·귀환을 선택하게 한다. 북동·중앙 동측·남측 고가 선택실에 Laser를 두되 독립적인 일반 이탈 문을 제공한다. 벽 높이는 5m이며 고측 유리 채광과 금속 구조, 백색 콘크리트 벽면으로 현대미술관을 표현한다. 필수 작품은 Laser가 없는 북동 N4 전시실의 북쪽 벽에 둔다. 세 버튼은 각각 N4 남동·C3 남동·S2 남동 모서리의 차폐 공간에 두고, 일직선 통과 순찰선에서 벗어나 진입 준비와 역할 교대를 할 수 있게 한다. 남측 버튼과 겹치던 전리품 받침대는 동쪽 서비스실로 옮겨 차폐 공간의 바닥을 비운다. 남쪽 서비스 레인 S4에서만 보안 구역으로 진입하며 중앙 C4와 구금실 및 남쪽 회랑의 직통 문을 닫는다. 전실 남쪽으로 꺾어 들어가는 접근로와 구금실 동쪽 개구부로 경계를 단계적으로 통과한다.</w:t>
       </w:r>
     </w:p>
     <w:tbl>

</xml_diff>

<commit_message>
Differentiate museum room and corridor layouts
Rework M01-M03 connections and patrol routes, refresh floor plans and GDD, and add reproducible playtime comparison tools.

Validation: three-map native checks, four contract regression tests with warnings, and 18 modeled schedule checks passed. Natural multiplayer playtime remains unverified.
</commit_message>
<xml_diff>
--- a/Museum_Heist_GDD.docx
+++ b/Museum_Heist_GDD.docx
@@ -1825,7 +1825,7 @@
             <w:noProof/>
             <w:webHidden/>
           </w:rPr>
-          <w:t>10</w:t>
+          <w:t>11</w:t>
         </w:r>
         <w:r>
           <w:rPr>
@@ -1977,7 +1977,7 @@
             <w:noProof/>
             <w:webHidden/>
           </w:rPr>
-          <w:t>11</w:t>
+          <w:t>12</w:t>
         </w:r>
         <w:r>
           <w:rPr>
@@ -4101,7 +4101,7 @@
             <w:noProof/>
             <w:webHidden/>
           </w:rPr>
-          <w:t>23</w:t>
+          <w:t>24</w:t>
         </w:r>
         <w:r>
           <w:rPr>
@@ -4177,7 +4177,7 @@
             <w:noProof/>
             <w:webHidden/>
           </w:rPr>
-          <w:t>24</w:t>
+          <w:t>25</w:t>
         </w:r>
         <w:r>
           <w:rPr>
@@ -4253,7 +4253,7 @@
             <w:noProof/>
             <w:webHidden/>
           </w:rPr>
-          <w:t>24</w:t>
+          <w:t>26</w:t>
         </w:r>
         <w:r>
           <w:rPr>
@@ -4329,7 +4329,7 @@
             <w:noProof/>
             <w:webHidden/>
           </w:rPr>
-          <w:t>26</w:t>
+          <w:t>27</w:t>
         </w:r>
         <w:r>
           <w:rPr>
@@ -4405,7 +4405,7 @@
             <w:noProof/>
             <w:webHidden/>
           </w:rPr>
-          <w:t>27</w:t>
+          <w:t>28</w:t>
         </w:r>
         <w:r>
           <w:rPr>
@@ -4481,7 +4481,7 @@
             <w:noProof/>
             <w:webHidden/>
           </w:rPr>
-          <w:t>28</w:t>
+          <w:t>29</w:t>
         </w:r>
         <w:r>
           <w:rPr>
@@ -4557,7 +4557,7 @@
             <w:noProof/>
             <w:webHidden/>
           </w:rPr>
-          <w:t>28</w:t>
+          <w:t>29</w:t>
         </w:r>
         <w:r>
           <w:rPr>
@@ -4633,7 +4633,7 @@
             <w:noProof/>
             <w:webHidden/>
           </w:rPr>
-          <w:t>29</w:t>
+          <w:t>30</w:t>
         </w:r>
         <w:r>
           <w:rPr>
@@ -4708,7 +4708,7 @@
             <w:noProof/>
             <w:webHidden/>
           </w:rPr>
-          <w:t>30</w:t>
+          <w:t>31</w:t>
         </w:r>
         <w:r>
           <w:rPr>
@@ -4784,7 +4784,7 @@
             <w:noProof/>
             <w:webHidden/>
           </w:rPr>
-          <w:t>30</w:t>
+          <w:t>31</w:t>
         </w:r>
         <w:r>
           <w:rPr>
@@ -4860,7 +4860,7 @@
             <w:noProof/>
             <w:webHidden/>
           </w:rPr>
-          <w:t>30</w:t>
+          <w:t>31</w:t>
         </w:r>
         <w:r>
           <w:rPr>
@@ -4936,7 +4936,7 @@
             <w:noProof/>
             <w:webHidden/>
           </w:rPr>
-          <w:t>30</w:t>
+          <w:t>31</w:t>
         </w:r>
         <w:r>
           <w:rPr>
@@ -5012,7 +5012,7 @@
             <w:noProof/>
             <w:webHidden/>
           </w:rPr>
-          <w:t>31</w:t>
+          <w:t>32</w:t>
         </w:r>
         <w:r>
           <w:rPr>
@@ -5088,7 +5088,7 @@
             <w:noProof/>
             <w:webHidden/>
           </w:rPr>
-          <w:t>31</w:t>
+          <w:t>32</w:t>
         </w:r>
         <w:r>
           <w:rPr>
@@ -5164,7 +5164,7 @@
             <w:noProof/>
             <w:webHidden/>
           </w:rPr>
-          <w:t>32</w:t>
+          <w:t>33</w:t>
         </w:r>
         <w:r>
           <w:rPr>
@@ -5240,7 +5240,7 @@
             <w:noProof/>
             <w:webHidden/>
           </w:rPr>
-          <w:t>32</w:t>
+          <w:t>33</w:t>
         </w:r>
         <w:r>
           <w:rPr>
@@ -5315,7 +5315,7 @@
             <w:noProof/>
             <w:webHidden/>
           </w:rPr>
-          <w:t>33</w:t>
+          <w:t>34</w:t>
         </w:r>
         <w:r>
           <w:rPr>
@@ -5390,7 +5390,7 @@
             <w:noProof/>
             <w:webHidden/>
           </w:rPr>
-          <w:t>33</w:t>
+          <w:t>34</w:t>
         </w:r>
         <w:r>
           <w:rPr>
@@ -5465,7 +5465,7 @@
             <w:noProof/>
             <w:webHidden/>
           </w:rPr>
-          <w:t>34</w:t>
+          <w:t>35</w:t>
         </w:r>
         <w:r>
           <w:rPr>
@@ -8931,10 +8931,7 @@
     </w:p>
     <w:p>
       <w:r>
-        <w:t>각 맵은 탈취 가능한 20점 외에 상호작용하지 않는 일반 전시물을 함께 배치한다. 일반 전시물은 단독·연작·다단 군집으로 전시실을 구성하고 탈취 대상과 같거나 더 큰 작품도 포함한다. 탈취 가능한 작품은 두꺼운 프레임과 하단 보안 패널로 접근 전에 구별한다. 작품 크기, 중앙 위치 또는 양옆의 일반 작품 수가 정답을 드러내는 고정 패턴을 사용하지 않는다. 근거리 행동 안내는 탈취 대상에만 표시하며, 필수 작품은 기존 계약 단서와 발견 표시를 따른다.</w:t>
-      </w:r>
-      <w:r>
-        <w:t xml:space="preserve"> 전시 그림과 프레임은 기존 배치도 대비 1.5배 크기로 확대하며 군집의 간격과 설치 높이를 함께 조정한다. 탈취 작품의 행동 영역은 작품 정면의 근거리로 한정한다. 벽 하단 걸레받이와 상단 몰딩은 벽 두께의 1.15배로 돌출시켜 표면 겹침을 없앤다.</w:t>
+        <w:t>각 맵은 탈취 가능한 20점 외에 상호작용하지 않는 일반 전시물을 함께 배치한다. 일반 전시물은 단독·연작·다단 군집으로 전시실을 구성하고 탈취 대상과 같거나 더 큰 작품도 포함한다. 탈취 가능한 작품은 두꺼운 프레임과 하단 보안 패널로 접근 전에 구별한다. 작품 크기, 중앙 위치 또는 양옆의 일반 작품 수가 정답을 드러내는 고정 패턴을 사용하지 않는다. 근거리 행동 안내는 탈취 대상에만 표시하며, 필수 작품은 기존 계약 단서와 발견 표시를 따른다. 전시 그림과 프레임은 기존 배치도 대비 1.5배 크기로 확대하며 군집의 간격과 설치 높이를 함께 조정한다. 탈취 작품의 행동 영역은 작품 정면의 근거리로 한정한다. 벽 하단 걸레받이와 상단 몰딩은 벽 두께의 1.15배로 돌출시켜 표면 겹침을 없앤다.</w:t>
       </w:r>
     </w:p>
     <w:p>
@@ -8981,11 +8978,8 @@
         </w:numPr>
       </w:pPr>
       <w:r>
-        <w:t xml:space="preserve">World View가 완전히 가려진 Full-Screen 화면으로 전환된다. World Audio와 팀 음성은 유지하지만 Alert/Lockdown 상세 정보는 작업 화면에 중복 표시하지 않는다. </w:t>
-      </w:r>
-      <w:r>
         <w:lastRenderedPageBreak/>
-        <w:t>Suspicious/Searching에서는 현재 작업을 유지한다. Alarmed/Lockdown 진입 시 서버가 작업 Session을 먼저 취소하고 화면을 닫아 이동·시점·탈출 판단을 즉시 복원하며, 위험 단계에서는 신규 작업 진입을 허용하지 않는다.</w:t>
+        <w:t>World View가 완전히 가려진 Full-Screen 화면으로 전환된다. World Audio와 팀 음성은 유지하지만 Alert/Lockdown 상세 정보는 작업 화면에 중복 표시하지 않는다. Suspicious/Searching에서는 현재 작업을 유지한다. Alarmed/Lockdown 진입 시 서버가 작업 Session을 먼저 취소하고 화면을 닫아 이동·시점·탈출 판단을 즉시 복원하며, 위험 단계에서는 신규 작업 진입을 허용하지 않는다.</w:t>
       </w:r>
     </w:p>
     <w:p>
@@ -9132,6 +9126,7 @@
       </w:pPr>
       <w:bookmarkStart w:id="16" w:name="_Toc240136937"/>
       <w:r>
+        <w:lastRenderedPageBreak/>
         <w:t>Object Assembly — Deferred Expansion</w:t>
       </w:r>
       <w:bookmarkEnd w:id="16"/>
@@ -9157,7 +9152,6 @@
         </w:numPr>
       </w:pPr>
       <w:r>
-        <w:lastRenderedPageBreak/>
         <w:t>v1.0에서는 Object Assembly를 Required Target 또는 Optional Exhibit Pool에 넣지 않고, 활성 Object Display Case·Assembly Widget·Result 열을 Player에게 노출하지 않는다.</w:t>
       </w:r>
     </w:p>
@@ -9489,6 +9483,7 @@
       </w:pPr>
       <w:bookmarkStart w:id="18" w:name="_Toc240136939"/>
       <w:r>
+        <w:lastRenderedPageBreak/>
         <w:t>핵심</w:t>
       </w:r>
       <w:r>
@@ -9740,7 +9735,6 @@
           </w:tcPr>
           <w:p>
             <w:r>
-              <w:lastRenderedPageBreak/>
               <w:t>기준 미달 제출</w:t>
             </w:r>
           </w:p>
@@ -13118,7 +13112,6 @@
       <w:bookmarkEnd w:id="34"/>
     </w:p>
     <w:p>
-      <w:pPr/>
       <w:r>
         <w:t>메뉴와 작업 화면은 전시 도록을 펼쳐 보는 분위기로 통일한다. 먹색 바탕, 아이보리 종이 탭과 절제된 금색 테두리를 사용하고, 주요 행동은 밝은 종이 버튼으로 강조한다. 제목은 명조 계열, 본문과 수치는 고딕 계열로 구분한다. HUD는 월드 시야를 가리는 장식을 줄이고 미션·경계도·팀 상태의 판독성을 우선한다. 로비의 맵 선택은 각 박물관의 실제 장면을 보여준다.</w:t>
       </w:r>
@@ -13690,6 +13683,7 @@
           </w:tcPr>
           <w:p>
             <w:r>
+              <w:lastRenderedPageBreak/>
               <w:t>MAP [M]</w:t>
             </w:r>
           </w:p>
@@ -13743,7 +13737,6 @@
       </w:pPr>
       <w:bookmarkStart w:id="37" w:name="_Toc240136958"/>
       <w:r>
-        <w:lastRenderedPageBreak/>
         <w:t>최소</w:t>
       </w:r>
       <w:r>
@@ -14243,6 +14236,7 @@
           </w:tcPr>
           <w:p>
             <w:r>
+              <w:lastRenderedPageBreak/>
               <w:t>Assembly (Deferred)</w:t>
             </w:r>
           </w:p>
@@ -14305,7 +14299,6 @@
       </w:pPr>
       <w:bookmarkStart w:id="39" w:name="_Toc240136960"/>
       <w:r>
-        <w:lastRenderedPageBreak/>
         <w:t>Floor Plan</w:t>
       </w:r>
       <w:r>
@@ -15259,6 +15252,7 @@
         </w:numPr>
       </w:pPr>
       <w:r>
+        <w:lastRenderedPageBreak/>
         <w:t>첫 20초 안에 Contract Card를 읽고 Target/Quota를 구분한다.</w:t>
       </w:r>
     </w:p>
@@ -15296,7 +15290,6 @@
       </w:pPr>
       <w:bookmarkStart w:id="43" w:name="_Toc240136964"/>
       <w:r>
-        <w:lastRenderedPageBreak/>
         <w:t>접근성</w:t>
       </w:r>
       <w:r>
@@ -15489,30 +15482,30 @@
       <w:r>
         <w:t>세 맵은 동일한 Gameplay Rule을 사용하되, Material과 Lighting만이 아니라 Macro Topology, 첫 10초의 정보 공개 방식, Landmark, Target 이후 귀환 경로로 서로 다른 플레이 정체성을 만든다. 야간 침입은 상시 전면 조명 대신 꺼진 구역과 국소 조명의 대비로 표현한다. M01은 따뜻한 전시 잔등, M02는 푸른 중정과 어두운 회랑, M03는 차가운 유리 채광과 서비스 조명을 중심으로 구성한다. 작품 앞과 버튼·출구는 식별 가능하게 유지하며 조명만으로 도난 대상을 알려주지 않는다. 경비실과 구금실은 관람 동선에서 갈라지는 단일 보안 진입부 뒤에 둔다. 폭 1.8m 출입구와 불투명 전실 벽으로 직접 시야를 끊고, CCTV와 내부 순찰을 통과한 뒤 압수품 회수 또는 구금실 구조를 선택한다. 구금실에는 잠긴 철창문으로만 통과할 수 있는 완전한 철제 칸막이와 고정 벤치를 두고, 보안 표지·금속 문틀·차가운 국소등으로 일반 전시실과 경계를 구분한다. 추가 열쇠나 해킹 없이 기존 상호작용으로 구조·회수하며 구조 또는 구속 시간 경과 후 동일 진입부를 통해 탈출을 시도한다. 각 맵의 기존 경비 한 명을 보안 구역과 인접 복도를 순찰하도록 배치한다. 순환 목표는 25~35초이며 철창 앞에서 2~3초 확인한다. 철창 안 구금자는 시야만으로 재체포하지 않으며 작업 실패 소음에는 조사로 반응한다.</w:t>
       </w:r>
-      <w:r>
-        <w:t xml:space="preserve"/>
-      </w:r>
     </w:p>
     <w:p>
       <w:pPr>
         <w:pStyle w:val="a0"/>
       </w:pPr>
       <w:r>
-        <w:t>전시실은 작품 벽과 관람 공간을 함께 설계한다. 승인 평면도 기준 외벽 0.40m, 내벽 0.24m, 일반 연결 문 3~4m, 후면 관리 회랑 약 5.5~5.7m를 사용한다. 작품 앞 작업 공간은 2.2m를 확보하며 활성 작품은 그림 표면에서 정면 0.7m의 근거리 접근점으로 진입할 수 있어야 한다. 맵별 활성 작품 20점, 일반 작품 M01 51점·M02 53점·M03 61점과 12종 전시 패턴을 배치한다. 통과 폭과 15~25분 플레이 시간은 실제 멀티플레이로 검증한다.</w:t>
-      </w:r>
-      <w:r>
-        <w:t xml:space="preserve"> 작품 발견과 다음 전시 구역 진입이 연달아 끝나지 않도록 맵별 바닥 면적을 이전 배치의 약 2배로 확장한다. 활성 작품 20점과 일반 작품 수, 군집 내부 간격, 액자·문·상호작용 영역 크기와 위조 시간은 유지하고 구역 및 군집 사이 이동 거리를 늘린다. 기존 엇갈린 출입구와 차폐벽을 유지하며 탐색·위험 판단·귀환에 드는 시간을 함께 평가한다. 면적 증가를 15~25분 플레이 시간 달성으로 간주하지 않고 실제 경로와 플레이 테스트로 검증한다.</w:t>
-      </w:r>
-      <w:r>
-        <w:t xml:space="preserve"> 초반 전시실과 필수 작품 전시실에는 높이 3.2m의 벽 연결형 차폐벽을 총 8개 배치해 한 자리에서 여러 작품을 연속 확인하는 시야를 나누고, 벽 끝의 열린 통로로 우회하도록 한다.</w:t>
+        <w:t xml:space="preserve">전시실은 작품 벽과 관람 공간을 함께 설계한다. 승인 평면도 기준 외벽 0.40m, 내벽 0.24m, 일반 연결 문 3~4m, 후면 관리 회랑 약 5.5~5.7m를 사용한다. 작품 앞 작업 공간은 2.2m를 확보하며 활성 작품은 그림 표면에서 정면 0.7m의 근거리 접근점으로 진입할 수 있어야 한다. 맵별 활성 작품 20점, 일반 작품 M01 51점·M02 53점·M03 61점과 12종 전시 패턴을 배치한다. 통과 폭과 15~25분 플레이 시간은 실제 멀티플레이로 검증한다. 작품 발견과 다음 전시 구역 진입이 연달아 끝나지 않도록 맵별 바닥 면적을 이전 배치의 약 2배로 확장한다. 활성 작품 20점과 일반 작품 수, 군집 내부 간격, 액자·문·상호작용 영역 크기와 위조 시간은 유지하고 구역 및 군집 사이 이동 거리를 늘린다. 기존 엇갈린 출입구와 차폐벽을 유지하며 탐색·위험 판단·귀환에 드는 시간을 함께 평가한다. 면적 증가를 15~25분 플레이 시간 달성으로 간주하지 않고 실제 경로와 플레이 </w:t>
+      </w:r>
+      <w:r>
+        <w:lastRenderedPageBreak/>
+        <w:t>테스트로 검증한다. 초반 전시실과 필수 작품 전시실에는 높이 3.2m의 벽 연결형 차폐벽을 총 7개 배치해 한 자리에서 여러 작품을 연속 확인하는 시야를 나누고, 벽 끝의 열린 통로로 우회하도록 한다.</w:t>
       </w:r>
     </w:p>
     <w:p>
+      <w:r>
+        <w:t>방·복도 구분 개편: M01은 중앙 Rotunda와 굴절 복도, 소전시실과 연속 전시실 묶음을 연결한다. M02는 정원 회랑을 방향 기준으로 유지하고 서측 막다른 전시 묶음·동측 특별전·남측 회귀 루프를 비대칭으로 구성한다. M03은 중앙 전시실의 반복 사거리를 없애고 위·아래로 교대해 꺾이는 복도에서 독립 전시실로 진입한다. 일반 전시실의 출입구는 1~2개를 기본으로 하되 구역 연결실과 보안 전실은 예외로 둔다. 작품 수·액자 크기·위조 시간과 확장된 외곽 크기는 유지한다. 경비 순찰과 귀환 우회로를 재배치하고 실제 경로 검증 후 적용하며, 플레이타임 증가를 보장하는 수치로 취급하지 않는다.</w:t>
+      </w:r>
+    </w:p>
+    <w:p>
       <w:pPr>
         <w:pStyle w:val="a0"/>
       </w:pPr>
       <w:r>
-        <w:t>M01은 중앙 Rotunda의 개방감을 유지하고 북·남 회랑을 여러 전시실로 나눈다. M02는 중정을 대표 개방 공간으로 남기고 벽에 연결된 병풍과 엇갈린 입구로 시야를 굴절시킨다. M03는 세 레인을 유지하면서 중앙의 긴 전망을 불투명 전시벽으로 구간화하고, 측면 복원 구역에 은폐 공간을 제공한다. Laser 고가 작품에는 경보 문턱과 독립적인 이탈 경로를 함께 둔다. 필수 작품은 서측에서 계약을 끝내는 동선을 방지하도록 동측 일반 전시실에 둔다. 일곱 Laser는 모두 FourStar 고가 작품에 연결하고, 버튼은 문을 통과하는 경비와 몸이 부딪히지 않는 벽면 차폐 공간에 둔다. 홀드는 동료의 진입과 복귀에 필요한 동안 선택하며 위조 작업 전체의 의무 대기로 만들지 않는다.</w:t>
+        <w:t>M01은 중앙 Rotunda의 개방감을 유지하고 북·남 회랑을 여러 전시실로 나눈다. M02는 중정을 대표 개방 공간으로 남기고 벽에 연결된 병풍과 엇갈린 입구로 시야를 굴절시킨다. M03는 중앙의 교대 굴절 복도와 독립 전시실, 북측 전시 날개, 남측 복원·서비스 동선으로 구분한다. Laser 고가 작품에는 경보 문턱과 독립적인 이탈 경로를 함께 둔다. 필수 작품은 서측에서 계약을 끝내는 동선을 방지하도록 동측 일반 전시실에 둔다. 일곱 Laser는 모두 FourStar 고가 작품에 연결하고, 버튼은 문을 통과하는 경비와 몸이 부딪히지 않는 벽면 차폐 공간에 둔다. 홀드는 동료의 진입과 복귀에 필요한 동안 선택하며 위조 작업 전체의 의무 대기로 만들지 않는다.</w:t>
       </w:r>
     </w:p>
     <w:p>
@@ -15567,7 +15560,6 @@
         <w:pStyle w:val="a0"/>
       </w:pPr>
       <w:r>
-        <w:lastRenderedPageBreak/>
         <w:t>2단 3열 격자형 · 세로 2단형 · 크기 혼합 살롱형 · 큰 작품 옆 세로 쌍형: 행·열·높이와 크기 관계가 다른 구성을 사용한다.</w:t>
       </w:r>
     </w:p>
@@ -15594,6 +15586,7 @@
       </w:pPr>
       <w:bookmarkStart w:id="47" w:name="_Toc240136968"/>
       <w:r>
+        <w:lastRenderedPageBreak/>
         <w:t>맵</w:t>
       </w:r>
       <w:r>
@@ -15798,7 +15791,7 @@
               <w:pStyle w:val="TableText"/>
             </w:pPr>
             <w:r>
-              <w:t>공개형 Figure-8·북/남 순환</w:t>
+              <w:t>중앙홀·굴절 복도·소전시실</w:t>
             </w:r>
           </w:p>
         </w:tc>
@@ -15880,7 +15873,7 @@
           </w:tcPr>
           <w:p>
             <w:r>
-              <w:t>중정 순환 회랑·굴절 진입·CCTV 지름길</w:t>
+              <w:t>정원 회랑·비대칭 전시 날개·회귀 루프</w:t>
             </w:r>
           </w:p>
         </w:tc>
@@ -15962,7 +15955,7 @@
           </w:tcPr>
           <w:p>
             <w:r>
-              <w:t>3개 레인·엇갈린 문·불투명 구획</w:t>
+              <w:t>교대 굴절 복도·독립 전시실·서비스 동선</w:t>
             </w:r>
           </w:p>
         </w:tc>
@@ -16027,6 +16020,7 @@
     <w:p>
       <w:pPr>
         <w:pStyle w:val="21"/>
+        <w:pageBreakBefore/>
         <w:numPr>
           <w:ilvl w:val="1"/>
           <w:numId w:val="7"/>
@@ -16034,6 +16028,7 @@
       </w:pPr>
       <w:bookmarkStart w:id="48" w:name="_Toc240136969"/>
       <w:r>
+        <w:lastRenderedPageBreak/>
         <w:t xml:space="preserve">M01 — </w:t>
       </w:r>
       <w:r>
@@ -16049,7 +16044,7 @@
     </w:p>
     <w:p>
       <w:r>
-        <w:t>120×88m의 고전미술관이다. 약 34.3×27.5m 중앙 홀을 방향 기준점으로 두고, 북측 5개와 남측 5개 전시실을 두 순환 루프로 연결한다. 서측 진입 전실과 동측 증거실·구금실을 분리하고 북·남 끝 5.5m 관리 회랑으로 우회한다. 18개 구역과 27개 문을 사용하며 동측 두 선택 전시실에 Laser 지름길과 일반 우회로를 둔다. 필수 작품은 북동 N4 전시실의 동쪽 벽에 두고, 고가 작품은 N5와 S5에 배치한다. 벽 높이는 4.4m이고 대리석 바닥·금장 문틀·정돈된 벽면 전시로 고전미술관의 질서를 만든다. 동쪽 홀에서만 보안 별관에 진입하며 북동·남동 전시실 및 홀에서 구금실로 바로 통하는 문을 닫는다. 경비실 전실을 남쪽으로 돌아 들어간 뒤 구금실의 동쪽 개구부로 접근한다.</w:t>
+        <w:t>120×88m의 고전미술관이다. 약 34.3×27.5m 중앙 홀을 방향 기준점으로 두고, 북·남 전시 묶음과 굴절 복도, 두 소전시실을 비대칭 순환·막다른 가지로 연결한다. 서측 진입 전실과 동측 증거실·구금실을 분리하고 북·남 끝 5.5m 관리 회랑으로 우회한다. 24개 구역과 25개 문을 사용하며 동측 두 선택 전시실에 Laser 지름길과 일반 우회로를 둔다. 필수 작품은 북동 N4 전시실의 동쪽 벽에 두고, 고가 작품은 N5와 S5에 배치한다. 벽 높이는 4.4m이고 대리석 바닥·금장 문틀·정돈된 벽면 전시로 고전미술관의 질서를 만든다. 동쪽 홀에서만 보안 별관에 진입하며 북동·남동 전시실 및 홀에서 구금실로 바로 통하는 문을 닫는다. 경비실 전실을 남쪽으로 돌아 들어간 뒤 구금실의 동쪽 개구부로 접근한다.</w:t>
       </w:r>
     </w:p>
     <w:tbl>
@@ -16210,7 +16205,7 @@
               <w:pStyle w:val="TableText"/>
             </w:pPr>
             <w:r>
-              <w:t>Vent 전실, 중앙 Rotunda, 북·남 Figure-8 회랑, 서측 귀환 Vent</w:t>
+              <w:t>Vent 전실, 중앙 Rotunda, 동·서 굴절 복도와 소전시실</w:t>
             </w:r>
           </w:p>
         </w:tc>
@@ -16224,7 +16219,7 @@
               <w:pStyle w:val="TableText"/>
             </w:pPr>
             <w:r>
-              <w:t>공개된 중앙 교차·두 순환 루프·동측 노출 구간</w:t>
+              <w:t>복도 교차·전시실 출입구·동측 보안 접근</w:t>
             </w:r>
           </w:p>
         </w:tc>
@@ -16288,7 +16283,6 @@
               <w:rPr>
                 <w:noProof/>
               </w:rPr>
-              <w:lastRenderedPageBreak/>
               <w:drawing>
                 <wp:inline distT="0" distB="0" distL="0" distR="0" wp14:anchorId="4E0D75E9" wp14:editId="757157FD">
                   <wp:extent cx="5120640" cy="3200400"/>
@@ -16364,7 +16358,7 @@
     </w:p>
     <w:p>
       <w:r>
-        <w:t>108×88m의 중정형 동양미술관이다. 30×27.5m 정원과 폭 5.5~6m 순환 회랑을 중심으로 21개 구역을 28개 문으로 연결한다. 남서측 전실의 두 꺾임 뒤 정원이 드러나며, 벽에 붙은 입구 병풍과 버튼 대기용 차폐벽, 정원 안의 수면·식재·정자를 정돈해 배치한다. 비스듬한 독립 가림막과 회랑에 흩어진 바위·관목은 배치하지 않는다. 세 CCTV 지름길은 긴 우회 동선과 위험을 교환하고 북동·남동 선택실에 Laser를 둔다. 필수 작품은 동측 E2 전시실의 동쪽 벽에 둔다. 북동 고가실과 E2 사이의 바로 옆 출입문을 닫고, 북쪽 관리 회랑을 일반 우회·이탈로로 유지한다. 북동 버튼은 전시실 북동 모서리, 남동 버튼은 진입문의 동쪽 벽감에 두어 통과 순찰선과 분리한다. 벽 높이는 4.4m이며 목재·동장 프레임·낮은 정원 식재로 관람 공간의 질서를 유지한다. 남동 고가실과 증거실 사이의 중복 지름길도 닫고 서쪽 S3 전시실을 통한 일반 출입·이탈을 유지한다. 차폐벽 아래의 버튼은 국소 조명으로 식별성을 유지한다. 남동 보안 구역은 E1 전시실에서만 진입하며 남쪽 관리 회랑의 구금실 직통 문을 닫는다. 입구 안쪽 벽의 서쪽을 돌아 압수품 보관실과 구금실로 진입하고 기존 남측 순찰에 이 구역 왕복을 포함한다.</w:t>
+        <w:t>108×88m의 중정형 동양미술관이다. 30×27.5m 정원과 폭 5.5~6m 순환 회랑을 중심으로 21개 구역을 23개 문으로 연결한다. 남서측 전실의 두 꺾임 뒤 정원이 드러나며, 벽에 붙은 입구 병풍과 버튼 대기용 차폐벽, 정원 안의 수면·식재·정자를 정돈해 배치한다. 비스듬한 독립 가림막과 회랑에 흩어진 바위·관목은 배치하지 않는다. 세 CCTV 지름길은 긴 우회 동선과 위험을 교환하고 북동·남동 선택실에 Laser를 둔다. 필수 작품은 동측 E2 전시실의 동쪽 벽에 둔다. 북동 고가실과 E2 사이의 바로 옆 출입문을 닫고, 북쪽 관리 회랑을 일반 우회·이탈로로 유지한다. 북동 버튼은 전시실 북동 모서리, 남동 버튼은 진입문의 동쪽 벽감에 두어 통과 순찰선과 분리한다. 벽 높이는 4.4m이며 목재·동장 프레임·낮은 정원 식재로 관람 공간의 질서를 유지한다. 남동 고가실과 증거실 사이의 중복 지름길도 닫고 서쪽 S3 전시실을 통한 일반 출입·이탈을 유지한다. 차폐벽 아래의 버튼은 국소 조명으로 식별성을 유지한다. 남동 보안 구역은 E1 전시실에서만 진입하며 남쪽 관리 회랑의 구금실 직통 문을 닫는다. 입구 안쪽 벽의 서쪽을 돌아 압수품 보관실과 구금실로 진입하고 기존 남측 순찰에 이 구역 왕복을 포함한다.</w:t>
       </w:r>
     </w:p>
     <w:tbl>
@@ -16675,7 +16669,7 @@
     </w:p>
     <w:p>
       <w:r>
-        <w:t>132×80m의 현대미술관이다. 북측 전시 레인, 불투명 벽으로 구획한 중앙 레인, 남측 복원·서비스 레인을 19개 구역과 30개 문으로 연결한다. 중앙 문의 위치를 남북으로 번갈아 배치하여 긴 직선 시야를 끊고 각 교차로에서 우회·횡단·귀환을 선택하게 한다. 북동·중앙 동측·남측 고가 선택실에 Laser를 두되 독립적인 일반 이탈 문을 제공한다. 벽 높이는 5m이며 고측 유리 채광과 금속 구조, 백색 콘크리트 벽면으로 현대미술관을 표현한다. 필수 작품은 Laser가 없는 북동 N4 전시실의 북쪽 벽에 둔다. 세 버튼은 각각 N4 남동·C3 남동·S2 남동 모서리의 차폐 공간에 두고, 일직선 통과 순찰선에서 벗어나 진입 준비와 역할 교대를 할 수 있게 한다. 남측 버튼과 겹치던 전리품 받침대는 동쪽 서비스실로 옮겨 차폐 공간의 바닥을 비운다. 남쪽 서비스 레인 S4에서만 보안 구역으로 진입하며 중앙 C4와 구금실 및 남쪽 회랑의 직통 문을 닫는다. 전실 남쪽으로 꺾어 들어가는 접근로와 구금실 동쪽 개구부로 경계를 단계적으로 통과한다.</w:t>
+        <w:t>132×80m의 현대미술관이다. 북측 전시 날개, 중앙 굴절 복도와 독립 전시실, 남측 복원·서비스 동선을 25개 구역과 25개 문으로 연결한다. 중앙 복도는 위·아래로 교대해 꺾이며 C1·C2 소전시실은 단일 출입구, C3 전시실은 북측 날개로 이어지는 두 출입구를 사용한다. 북동·중앙 동측·남측 고가 선택실에 Laser를 두되 독립적인 일반 이탈 문을 제공한다. 벽 높이는 5m이며 고측 유리 채광과 금속 구조, 백색 콘크리트 벽면으로 현대미술관을 표현한다. 필수 작품은 Laser가 없는 북동 N4 전시실의 북쪽 벽에 둔다. 세 버튼은 각각 N4 남동·C3 남동·S2 남동 모서리의 차폐 공간에 두고, 일직선 통과 순찰선에서 벗어나 진입 준비와 역할 교대를 할 수 있게 한다. 남측 버튼과 겹치던 전리품 받침대는 동쪽 서비스실로 옮겨 차폐 공간의 바닥을 비운다. 남쪽 서비스 레인 S4에서만 보안 구역으로 진입하며 중앙 C4와 구금실 및 남쪽 회랑의 직통 문을 닫는다. 전실 남쪽으로 꺾어 들어가는 접근로와 구금실 동쪽 개구부로 경계를 단계적으로 통과한다.</w:t>
       </w:r>
     </w:p>
     <w:tbl>

</xml_diff>

<commit_message>
Fix session recovery and show compact mission value progress
</commit_message>
<xml_diff>
--- a/Museum_Heist_GDD.docx
+++ b/Museum_Heist_GDD.docx
@@ -564,7 +564,7 @@
       <w:r>
         <w:fldChar w:fldCharType="separate"/>
       </w:r>
-      <w:hyperlink w:anchor="_Toc240136921" w:history="1">
+      <w:hyperlink w:anchor="_Toc241040006" w:history="1">
         <w:r>
           <w:rPr>
             <w:rStyle w:val="aff1"/>
@@ -591,7 +591,7 @@
             <w:noProof/>
             <w:webHidden/>
           </w:rPr>
-          <w:instrText xml:space="preserve"> PAGEREF _Toc240136921 \h </w:instrText>
+          <w:instrText xml:space="preserve"> PAGEREF _Toc241040006 \h </w:instrText>
         </w:r>
         <w:r>
           <w:rPr>
@@ -640,7 +640,7 @@
           <w14:ligatures w14:val="standardContextual"/>
         </w:rPr>
       </w:pPr>
-      <w:hyperlink w:anchor="_Toc240136922" w:history="1">
+      <w:hyperlink w:anchor="_Toc241040007" w:history="1">
         <w:r>
           <w:rPr>
             <w:rStyle w:val="aff1"/>
@@ -667,7 +667,7 @@
             <w:noProof/>
             <w:webHidden/>
           </w:rPr>
-          <w:instrText xml:space="preserve"> PAGEREF _Toc240136922 \h </w:instrText>
+          <w:instrText xml:space="preserve"> PAGEREF _Toc241040007 \h </w:instrText>
         </w:r>
         <w:r>
           <w:rPr>
@@ -716,7 +716,7 @@
           <w14:ligatures w14:val="standardContextual"/>
         </w:rPr>
       </w:pPr>
-      <w:hyperlink w:anchor="_Toc240136923" w:history="1">
+      <w:hyperlink w:anchor="_Toc241040008" w:history="1">
         <w:r>
           <w:rPr>
             <w:rStyle w:val="aff1"/>
@@ -743,7 +743,7 @@
             <w:noProof/>
             <w:webHidden/>
           </w:rPr>
-          <w:instrText xml:space="preserve"> PAGEREF _Toc240136923 \h </w:instrText>
+          <w:instrText xml:space="preserve"> PAGEREF _Toc241040008 \h </w:instrText>
         </w:r>
         <w:r>
           <w:rPr>
@@ -792,7 +792,7 @@
           <w14:ligatures w14:val="standardContextual"/>
         </w:rPr>
       </w:pPr>
-      <w:hyperlink w:anchor="_Toc240136924" w:history="1">
+      <w:hyperlink w:anchor="_Toc241040009" w:history="1">
         <w:r>
           <w:rPr>
             <w:rStyle w:val="aff1"/>
@@ -819,7 +819,7 @@
             <w:noProof/>
             <w:webHidden/>
           </w:rPr>
-          <w:instrText xml:space="preserve"> PAGEREF _Toc240136924 \h </w:instrText>
+          <w:instrText xml:space="preserve"> PAGEREF _Toc241040009 \h </w:instrText>
         </w:r>
         <w:r>
           <w:rPr>
@@ -868,7 +868,7 @@
           <w14:ligatures w14:val="standardContextual"/>
         </w:rPr>
       </w:pPr>
-      <w:hyperlink w:anchor="_Toc240136925" w:history="1">
+      <w:hyperlink w:anchor="_Toc241040010" w:history="1">
         <w:r>
           <w:rPr>
             <w:rStyle w:val="aff1"/>
@@ -895,7 +895,7 @@
             <w:noProof/>
             <w:webHidden/>
           </w:rPr>
-          <w:instrText xml:space="preserve"> PAGEREF _Toc240136925 \h </w:instrText>
+          <w:instrText xml:space="preserve"> PAGEREF _Toc241040010 \h </w:instrText>
         </w:r>
         <w:r>
           <w:rPr>
@@ -944,7 +944,7 @@
           <w14:ligatures w14:val="standardContextual"/>
         </w:rPr>
       </w:pPr>
-      <w:hyperlink w:anchor="_Toc240136926" w:history="1">
+      <w:hyperlink w:anchor="_Toc241040011" w:history="1">
         <w:r>
           <w:rPr>
             <w:rStyle w:val="aff1"/>
@@ -971,7 +971,7 @@
             <w:noProof/>
             <w:webHidden/>
           </w:rPr>
-          <w:instrText xml:space="preserve"> PAGEREF _Toc240136926 \h </w:instrText>
+          <w:instrText xml:space="preserve"> PAGEREF _Toc241040011 \h </w:instrText>
         </w:r>
         <w:r>
           <w:rPr>
@@ -1020,7 +1020,7 @@
           <w14:ligatures w14:val="standardContextual"/>
         </w:rPr>
       </w:pPr>
-      <w:hyperlink w:anchor="_Toc240136927" w:history="1">
+      <w:hyperlink w:anchor="_Toc241040012" w:history="1">
         <w:r>
           <w:rPr>
             <w:rStyle w:val="aff1"/>
@@ -1047,7 +1047,7 @@
             <w:noProof/>
             <w:webHidden/>
           </w:rPr>
-          <w:instrText xml:space="preserve"> PAGEREF _Toc240136927 \h </w:instrText>
+          <w:instrText xml:space="preserve"> PAGEREF _Toc241040012 \h </w:instrText>
         </w:r>
         <w:r>
           <w:rPr>
@@ -1095,7 +1095,7 @@
           <w14:ligatures w14:val="standardContextual"/>
         </w:rPr>
       </w:pPr>
-      <w:hyperlink w:anchor="_Toc240136928" w:history="1">
+      <w:hyperlink w:anchor="_Toc241040013" w:history="1">
         <w:r>
           <w:rPr>
             <w:rStyle w:val="aff1"/>
@@ -1122,7 +1122,7 @@
             <w:noProof/>
             <w:webHidden/>
           </w:rPr>
-          <w:instrText xml:space="preserve"> PAGEREF _Toc240136928 \h </w:instrText>
+          <w:instrText xml:space="preserve"> PAGEREF _Toc241040013 \h </w:instrText>
         </w:r>
         <w:r>
           <w:rPr>
@@ -1171,7 +1171,7 @@
           <w14:ligatures w14:val="standardContextual"/>
         </w:rPr>
       </w:pPr>
-      <w:hyperlink w:anchor="_Toc240136929" w:history="1">
+      <w:hyperlink w:anchor="_Toc241040014" w:history="1">
         <w:r>
           <w:rPr>
             <w:rStyle w:val="aff1"/>
@@ -1198,7 +1198,7 @@
             <w:noProof/>
             <w:webHidden/>
           </w:rPr>
-          <w:instrText xml:space="preserve"> PAGEREF _Toc240136929 \h </w:instrText>
+          <w:instrText xml:space="preserve"> PAGEREF _Toc241040014 \h </w:instrText>
         </w:r>
         <w:r>
           <w:rPr>
@@ -1247,7 +1247,7 @@
           <w14:ligatures w14:val="standardContextual"/>
         </w:rPr>
       </w:pPr>
-      <w:hyperlink w:anchor="_Toc240136930" w:history="1">
+      <w:hyperlink w:anchor="_Toc241040015" w:history="1">
         <w:r>
           <w:rPr>
             <w:rStyle w:val="aff1"/>
@@ -1274,7 +1274,7 @@
             <w:noProof/>
             <w:webHidden/>
           </w:rPr>
-          <w:instrText xml:space="preserve"> PAGEREF _Toc240136930 \h </w:instrText>
+          <w:instrText xml:space="preserve"> PAGEREF _Toc241040015 \h </w:instrText>
         </w:r>
         <w:r>
           <w:rPr>
@@ -1323,7 +1323,7 @@
           <w14:ligatures w14:val="standardContextual"/>
         </w:rPr>
       </w:pPr>
-      <w:hyperlink w:anchor="_Toc240136931" w:history="1">
+      <w:hyperlink w:anchor="_Toc241040016" w:history="1">
         <w:r>
           <w:rPr>
             <w:rStyle w:val="aff1"/>
@@ -1350,7 +1350,7 @@
             <w:noProof/>
             <w:webHidden/>
           </w:rPr>
-          <w:instrText xml:space="preserve"> PAGEREF _Toc240136931 \h </w:instrText>
+          <w:instrText xml:space="preserve"> PAGEREF _Toc241040016 \h </w:instrText>
         </w:r>
         <w:r>
           <w:rPr>
@@ -1399,7 +1399,7 @@
           <w14:ligatures w14:val="standardContextual"/>
         </w:rPr>
       </w:pPr>
-      <w:hyperlink w:anchor="_Toc240136932" w:history="1">
+      <w:hyperlink w:anchor="_Toc241040017" w:history="1">
         <w:r>
           <w:rPr>
             <w:rStyle w:val="aff1"/>
@@ -1426,7 +1426,7 @@
             <w:noProof/>
             <w:webHidden/>
           </w:rPr>
-          <w:instrText xml:space="preserve"> PAGEREF _Toc240136932 \h </w:instrText>
+          <w:instrText xml:space="preserve"> PAGEREF _Toc241040017 \h </w:instrText>
         </w:r>
         <w:r>
           <w:rPr>
@@ -1475,7 +1475,7 @@
           <w14:ligatures w14:val="standardContextual"/>
         </w:rPr>
       </w:pPr>
-      <w:hyperlink w:anchor="_Toc240136933" w:history="1">
+      <w:hyperlink w:anchor="_Toc241040018" w:history="1">
         <w:r>
           <w:rPr>
             <w:rStyle w:val="aff1"/>
@@ -1502,7 +1502,7 @@
             <w:noProof/>
             <w:webHidden/>
           </w:rPr>
-          <w:instrText xml:space="preserve"> PAGEREF _Toc240136933 \h </w:instrText>
+          <w:instrText xml:space="preserve"> PAGEREF _Toc241040018 \h </w:instrText>
         </w:r>
         <w:r>
           <w:rPr>
@@ -1550,7 +1550,7 @@
           <w14:ligatures w14:val="standardContextual"/>
         </w:rPr>
       </w:pPr>
-      <w:hyperlink w:anchor="_Toc240136934" w:history="1">
+      <w:hyperlink w:anchor="_Toc241040019" w:history="1">
         <w:r>
           <w:rPr>
             <w:rStyle w:val="aff1"/>
@@ -1577,7 +1577,7 @@
             <w:noProof/>
             <w:webHidden/>
           </w:rPr>
-          <w:instrText xml:space="preserve"> PAGEREF _Toc240136934 \h </w:instrText>
+          <w:instrText xml:space="preserve"> PAGEREF _Toc241040019 \h </w:instrText>
         </w:r>
         <w:r>
           <w:rPr>
@@ -1626,7 +1626,7 @@
           <w14:ligatures w14:val="standardContextual"/>
         </w:rPr>
       </w:pPr>
-      <w:hyperlink w:anchor="_Toc240136935" w:history="1">
+      <w:hyperlink w:anchor="_Toc241040020" w:history="1">
         <w:r>
           <w:rPr>
             <w:rStyle w:val="aff1"/>
@@ -1653,7 +1653,7 @@
             <w:noProof/>
             <w:webHidden/>
           </w:rPr>
-          <w:instrText xml:space="preserve"> PAGEREF _Toc240136935 \h </w:instrText>
+          <w:instrText xml:space="preserve"> PAGEREF _Toc241040020 \h </w:instrText>
         </w:r>
         <w:r>
           <w:rPr>
@@ -1702,7 +1702,7 @@
           <w14:ligatures w14:val="standardContextual"/>
         </w:rPr>
       </w:pPr>
-      <w:hyperlink w:anchor="_Toc240136936" w:history="1">
+      <w:hyperlink w:anchor="_Toc241040021" w:history="1">
         <w:r>
           <w:rPr>
             <w:rStyle w:val="aff1"/>
@@ -1729,7 +1729,7 @@
             <w:noProof/>
             <w:webHidden/>
           </w:rPr>
-          <w:instrText xml:space="preserve"> PAGEREF _Toc240136936 \h </w:instrText>
+          <w:instrText xml:space="preserve"> PAGEREF _Toc241040021 \h </w:instrText>
         </w:r>
         <w:r>
           <w:rPr>
@@ -1778,7 +1778,7 @@
           <w14:ligatures w14:val="standardContextual"/>
         </w:rPr>
       </w:pPr>
-      <w:hyperlink w:anchor="_Toc240136937" w:history="1">
+      <w:hyperlink w:anchor="_Toc241040022" w:history="1">
         <w:r>
           <w:rPr>
             <w:rStyle w:val="aff1"/>
@@ -1805,7 +1805,7 @@
             <w:noProof/>
             <w:webHidden/>
           </w:rPr>
-          <w:instrText xml:space="preserve"> PAGEREF _Toc240136937 \h </w:instrText>
+          <w:instrText xml:space="preserve"> PAGEREF _Toc241040022 \h </w:instrText>
         </w:r>
         <w:r>
           <w:rPr>
@@ -1854,7 +1854,7 @@
           <w14:ligatures w14:val="standardContextual"/>
         </w:rPr>
       </w:pPr>
-      <w:hyperlink w:anchor="_Toc240136938" w:history="1">
+      <w:hyperlink w:anchor="_Toc241040023" w:history="1">
         <w:r>
           <w:rPr>
             <w:rStyle w:val="aff1"/>
@@ -1881,7 +1881,7 @@
             <w:noProof/>
             <w:webHidden/>
           </w:rPr>
-          <w:instrText xml:space="preserve"> PAGEREF _Toc240136938 \h </w:instrText>
+          <w:instrText xml:space="preserve"> PAGEREF _Toc241040023 \h </w:instrText>
         </w:r>
         <w:r>
           <w:rPr>
@@ -1930,7 +1930,7 @@
           <w14:ligatures w14:val="standardContextual"/>
         </w:rPr>
       </w:pPr>
-      <w:hyperlink w:anchor="_Toc240136939" w:history="1">
+      <w:hyperlink w:anchor="_Toc241040024" w:history="1">
         <w:r>
           <w:rPr>
             <w:rStyle w:val="aff1"/>
@@ -1957,7 +1957,7 @@
             <w:noProof/>
             <w:webHidden/>
           </w:rPr>
-          <w:instrText xml:space="preserve"> PAGEREF _Toc240136939 \h </w:instrText>
+          <w:instrText xml:space="preserve"> PAGEREF _Toc241040024 \h </w:instrText>
         </w:r>
         <w:r>
           <w:rPr>
@@ -2006,7 +2006,7 @@
           <w14:ligatures w14:val="standardContextual"/>
         </w:rPr>
       </w:pPr>
-      <w:hyperlink w:anchor="_Toc240136940" w:history="1">
+      <w:hyperlink w:anchor="_Toc241040025" w:history="1">
         <w:r>
           <w:rPr>
             <w:rStyle w:val="aff1"/>
@@ -2033,7 +2033,7 @@
             <w:noProof/>
             <w:webHidden/>
           </w:rPr>
-          <w:instrText xml:space="preserve"> PAGEREF _Toc240136940 \h </w:instrText>
+          <w:instrText xml:space="preserve"> PAGEREF _Toc241040025 \h </w:instrText>
         </w:r>
         <w:r>
           <w:rPr>
@@ -2081,7 +2081,7 @@
           <w14:ligatures w14:val="standardContextual"/>
         </w:rPr>
       </w:pPr>
-      <w:hyperlink w:anchor="_Toc240136941" w:history="1">
+      <w:hyperlink w:anchor="_Toc241040026" w:history="1">
         <w:r>
           <w:rPr>
             <w:rStyle w:val="aff1"/>
@@ -2108,7 +2108,7 @@
             <w:noProof/>
             <w:webHidden/>
           </w:rPr>
-          <w:instrText xml:space="preserve"> PAGEREF _Toc240136941 \h </w:instrText>
+          <w:instrText xml:space="preserve"> PAGEREF _Toc241040026 \h </w:instrText>
         </w:r>
         <w:r>
           <w:rPr>
@@ -2157,7 +2157,7 @@
           <w14:ligatures w14:val="standardContextual"/>
         </w:rPr>
       </w:pPr>
-      <w:hyperlink w:anchor="_Toc240136942" w:history="1">
+      <w:hyperlink w:anchor="_Toc241040027" w:history="1">
         <w:r>
           <w:rPr>
             <w:rStyle w:val="aff1"/>
@@ -2184,7 +2184,7 @@
             <w:noProof/>
             <w:webHidden/>
           </w:rPr>
-          <w:instrText xml:space="preserve"> PAGEREF _Toc240136942 \h </w:instrText>
+          <w:instrText xml:space="preserve"> PAGEREF _Toc241040027 \h </w:instrText>
         </w:r>
         <w:r>
           <w:rPr>
@@ -2233,7 +2233,7 @@
           <w14:ligatures w14:val="standardContextual"/>
         </w:rPr>
       </w:pPr>
-      <w:hyperlink w:anchor="_Toc240136943" w:history="1">
+      <w:hyperlink w:anchor="_Toc241040028" w:history="1">
         <w:r>
           <w:rPr>
             <w:rStyle w:val="aff1"/>
@@ -2260,7 +2260,7 @@
             <w:noProof/>
             <w:webHidden/>
           </w:rPr>
-          <w:instrText xml:space="preserve"> PAGEREF _Toc240136943 \h </w:instrText>
+          <w:instrText xml:space="preserve"> PAGEREF _Toc241040028 \h </w:instrText>
         </w:r>
         <w:r>
           <w:rPr>
@@ -2309,7 +2309,7 @@
           <w14:ligatures w14:val="standardContextual"/>
         </w:rPr>
       </w:pPr>
-      <w:hyperlink w:anchor="_Toc240136944" w:history="1">
+      <w:hyperlink w:anchor="_Toc241040029" w:history="1">
         <w:r>
           <w:rPr>
             <w:rStyle w:val="aff1"/>
@@ -2336,7 +2336,7 @@
             <w:noProof/>
             <w:webHidden/>
           </w:rPr>
-          <w:instrText xml:space="preserve"> PAGEREF _Toc240136944 \h </w:instrText>
+          <w:instrText xml:space="preserve"> PAGEREF _Toc241040029 \h </w:instrText>
         </w:r>
         <w:r>
           <w:rPr>
@@ -2385,7 +2385,7 @@
           <w14:ligatures w14:val="standardContextual"/>
         </w:rPr>
       </w:pPr>
-      <w:hyperlink w:anchor="_Toc240136945" w:history="1">
+      <w:hyperlink w:anchor="_Toc241040030" w:history="1">
         <w:r>
           <w:rPr>
             <w:rStyle w:val="aff1"/>
@@ -2412,7 +2412,7 @@
             <w:noProof/>
             <w:webHidden/>
           </w:rPr>
-          <w:instrText xml:space="preserve"> PAGEREF _Toc240136945 \h </w:instrText>
+          <w:instrText xml:space="preserve"> PAGEREF _Toc241040030 \h </w:instrText>
         </w:r>
         <w:r>
           <w:rPr>
@@ -2461,7 +2461,7 @@
           <w14:ligatures w14:val="standardContextual"/>
         </w:rPr>
       </w:pPr>
-      <w:hyperlink w:anchor="_Toc240136946" w:history="1">
+      <w:hyperlink w:anchor="_Toc241040031" w:history="1">
         <w:r>
           <w:rPr>
             <w:rStyle w:val="aff1"/>
@@ -2488,7 +2488,7 @@
             <w:noProof/>
             <w:webHidden/>
           </w:rPr>
-          <w:instrText xml:space="preserve"> PAGEREF _Toc240136946 \h </w:instrText>
+          <w:instrText xml:space="preserve"> PAGEREF _Toc241040031 \h </w:instrText>
         </w:r>
         <w:r>
           <w:rPr>
@@ -2537,7 +2537,7 @@
           <w14:ligatures w14:val="standardContextual"/>
         </w:rPr>
       </w:pPr>
-      <w:hyperlink w:anchor="_Toc240136947" w:history="1">
+      <w:hyperlink w:anchor="_Toc241040032" w:history="1">
         <w:r>
           <w:rPr>
             <w:rStyle w:val="aff1"/>
@@ -2564,7 +2564,7 @@
             <w:noProof/>
             <w:webHidden/>
           </w:rPr>
-          <w:instrText xml:space="preserve"> PAGEREF _Toc240136947 \h </w:instrText>
+          <w:instrText xml:space="preserve"> PAGEREF _Toc241040032 \h </w:instrText>
         </w:r>
         <w:r>
           <w:rPr>
@@ -2612,7 +2612,7 @@
           <w14:ligatures w14:val="standardContextual"/>
         </w:rPr>
       </w:pPr>
-      <w:hyperlink w:anchor="_Toc240136948" w:history="1">
+      <w:hyperlink w:anchor="_Toc241040033" w:history="1">
         <w:r>
           <w:rPr>
             <w:rStyle w:val="aff1"/>
@@ -2639,7 +2639,7 @@
             <w:noProof/>
             <w:webHidden/>
           </w:rPr>
-          <w:instrText xml:space="preserve"> PAGEREF _Toc240136948 \h </w:instrText>
+          <w:instrText xml:space="preserve"> PAGEREF _Toc241040033 \h </w:instrText>
         </w:r>
         <w:r>
           <w:rPr>
@@ -2688,7 +2688,7 @@
           <w14:ligatures w14:val="standardContextual"/>
         </w:rPr>
       </w:pPr>
-      <w:hyperlink w:anchor="_Toc240136949" w:history="1">
+      <w:hyperlink w:anchor="_Toc241040034" w:history="1">
         <w:r>
           <w:rPr>
             <w:rStyle w:val="aff1"/>
@@ -2715,7 +2715,7 @@
             <w:noProof/>
             <w:webHidden/>
           </w:rPr>
-          <w:instrText xml:space="preserve"> PAGEREF _Toc240136949 \h </w:instrText>
+          <w:instrText xml:space="preserve"> PAGEREF _Toc241040034 \h </w:instrText>
         </w:r>
         <w:r>
           <w:rPr>
@@ -2764,7 +2764,7 @@
           <w14:ligatures w14:val="standardContextual"/>
         </w:rPr>
       </w:pPr>
-      <w:hyperlink w:anchor="_Toc240136950" w:history="1">
+      <w:hyperlink w:anchor="_Toc241040035" w:history="1">
         <w:r>
           <w:rPr>
             <w:rStyle w:val="aff1"/>
@@ -2791,7 +2791,7 @@
             <w:noProof/>
             <w:webHidden/>
           </w:rPr>
-          <w:instrText xml:space="preserve"> PAGEREF _Toc240136950 \h </w:instrText>
+          <w:instrText xml:space="preserve"> PAGEREF _Toc241040035 \h </w:instrText>
         </w:r>
         <w:r>
           <w:rPr>
@@ -2840,7 +2840,7 @@
           <w14:ligatures w14:val="standardContextual"/>
         </w:rPr>
       </w:pPr>
-      <w:hyperlink w:anchor="_Toc240136951" w:history="1">
+      <w:hyperlink w:anchor="_Toc241040036" w:history="1">
         <w:r>
           <w:rPr>
             <w:rStyle w:val="aff1"/>
@@ -2867,7 +2867,7 @@
             <w:noProof/>
             <w:webHidden/>
           </w:rPr>
-          <w:instrText xml:space="preserve"> PAGEREF _Toc240136951 \h </w:instrText>
+          <w:instrText xml:space="preserve"> PAGEREF _Toc241040036 \h </w:instrText>
         </w:r>
         <w:r>
           <w:rPr>
@@ -2916,7 +2916,7 @@
           <w14:ligatures w14:val="standardContextual"/>
         </w:rPr>
       </w:pPr>
-      <w:hyperlink w:anchor="_Toc240136952" w:history="1">
+      <w:hyperlink w:anchor="_Toc241040037" w:history="1">
         <w:r>
           <w:rPr>
             <w:rStyle w:val="aff1"/>
@@ -2943,7 +2943,7 @@
             <w:noProof/>
             <w:webHidden/>
           </w:rPr>
-          <w:instrText xml:space="preserve"> PAGEREF _Toc240136952 \h </w:instrText>
+          <w:instrText xml:space="preserve"> PAGEREF _Toc241040037 \h </w:instrText>
         </w:r>
         <w:r>
           <w:rPr>
@@ -2992,7 +2992,7 @@
           <w14:ligatures w14:val="standardContextual"/>
         </w:rPr>
       </w:pPr>
-      <w:hyperlink w:anchor="_Toc240136953" w:history="1">
+      <w:hyperlink w:anchor="_Toc241040038" w:history="1">
         <w:r>
           <w:rPr>
             <w:rStyle w:val="aff1"/>
@@ -3019,7 +3019,7 @@
             <w:noProof/>
             <w:webHidden/>
           </w:rPr>
-          <w:instrText xml:space="preserve"> PAGEREF _Toc240136953 \h </w:instrText>
+          <w:instrText xml:space="preserve"> PAGEREF _Toc241040038 \h </w:instrText>
         </w:r>
         <w:r>
           <w:rPr>
@@ -3068,7 +3068,7 @@
           <w14:ligatures w14:val="standardContextual"/>
         </w:rPr>
       </w:pPr>
-      <w:hyperlink w:anchor="_Toc240136954" w:history="1">
+      <w:hyperlink w:anchor="_Toc241040039" w:history="1">
         <w:r>
           <w:rPr>
             <w:rStyle w:val="aff1"/>
@@ -3095,7 +3095,7 @@
             <w:noProof/>
             <w:webHidden/>
           </w:rPr>
-          <w:instrText xml:space="preserve"> PAGEREF _Toc240136954 \h </w:instrText>
+          <w:instrText xml:space="preserve"> PAGEREF _Toc241040039 \h </w:instrText>
         </w:r>
         <w:r>
           <w:rPr>
@@ -3143,7 +3143,7 @@
           <w14:ligatures w14:val="standardContextual"/>
         </w:rPr>
       </w:pPr>
-      <w:hyperlink w:anchor="_Toc240136955" w:history="1">
+      <w:hyperlink w:anchor="_Toc241040040" w:history="1">
         <w:r>
           <w:rPr>
             <w:rStyle w:val="aff1"/>
@@ -3170,7 +3170,7 @@
             <w:noProof/>
             <w:webHidden/>
           </w:rPr>
-          <w:instrText xml:space="preserve"> PAGEREF _Toc240136955 \h </w:instrText>
+          <w:instrText xml:space="preserve"> PAGEREF _Toc241040040 \h </w:instrText>
         </w:r>
         <w:r>
           <w:rPr>
@@ -3219,7 +3219,7 @@
           <w14:ligatures w14:val="standardContextual"/>
         </w:rPr>
       </w:pPr>
-      <w:hyperlink w:anchor="_Toc240136956" w:history="1">
+      <w:hyperlink w:anchor="_Toc241040041" w:history="1">
         <w:r>
           <w:rPr>
             <w:rStyle w:val="aff1"/>
@@ -3246,7 +3246,7 @@
             <w:noProof/>
             <w:webHidden/>
           </w:rPr>
-          <w:instrText xml:space="preserve"> PAGEREF _Toc240136956 \h </w:instrText>
+          <w:instrText xml:space="preserve"> PAGEREF _Toc241040041 \h </w:instrText>
         </w:r>
         <w:r>
           <w:rPr>
@@ -3295,7 +3295,7 @@
           <w14:ligatures w14:val="standardContextual"/>
         </w:rPr>
       </w:pPr>
-      <w:hyperlink w:anchor="_Toc240136957" w:history="1">
+      <w:hyperlink w:anchor="_Toc241040042" w:history="1">
         <w:r>
           <w:rPr>
             <w:rStyle w:val="aff1"/>
@@ -3322,7 +3322,7 @@
             <w:noProof/>
             <w:webHidden/>
           </w:rPr>
-          <w:instrText xml:space="preserve"> PAGEREF _Toc240136957 \h </w:instrText>
+          <w:instrText xml:space="preserve"> PAGEREF _Toc241040042 \h </w:instrText>
         </w:r>
         <w:r>
           <w:rPr>
@@ -3371,7 +3371,7 @@
           <w14:ligatures w14:val="standardContextual"/>
         </w:rPr>
       </w:pPr>
-      <w:hyperlink w:anchor="_Toc240136958" w:history="1">
+      <w:hyperlink w:anchor="_Toc241040043" w:history="1">
         <w:r>
           <w:rPr>
             <w:rStyle w:val="aff1"/>
@@ -3398,7 +3398,7 @@
             <w:noProof/>
             <w:webHidden/>
           </w:rPr>
-          <w:instrText xml:space="preserve"> PAGEREF _Toc240136958 \h </w:instrText>
+          <w:instrText xml:space="preserve"> PAGEREF _Toc241040043 \h </w:instrText>
         </w:r>
         <w:r>
           <w:rPr>
@@ -3447,7 +3447,7 @@
           <w14:ligatures w14:val="standardContextual"/>
         </w:rPr>
       </w:pPr>
-      <w:hyperlink w:anchor="_Toc240136959" w:history="1">
+      <w:hyperlink w:anchor="_Toc241040044" w:history="1">
         <w:r>
           <w:rPr>
             <w:rStyle w:val="aff1"/>
@@ -3474,7 +3474,7 @@
             <w:noProof/>
             <w:webHidden/>
           </w:rPr>
-          <w:instrText xml:space="preserve"> PAGEREF _Toc240136959 \h </w:instrText>
+          <w:instrText xml:space="preserve"> PAGEREF _Toc241040044 \h </w:instrText>
         </w:r>
         <w:r>
           <w:rPr>
@@ -3523,7 +3523,7 @@
           <w14:ligatures w14:val="standardContextual"/>
         </w:rPr>
       </w:pPr>
-      <w:hyperlink w:anchor="_Toc240136960" w:history="1">
+      <w:hyperlink w:anchor="_Toc241040045" w:history="1">
         <w:r>
           <w:rPr>
             <w:rStyle w:val="aff1"/>
@@ -3550,7 +3550,7 @@
             <w:noProof/>
             <w:webHidden/>
           </w:rPr>
-          <w:instrText xml:space="preserve"> PAGEREF _Toc240136960 \h </w:instrText>
+          <w:instrText xml:space="preserve"> PAGEREF _Toc241040045 \h </w:instrText>
         </w:r>
         <w:r>
           <w:rPr>
@@ -3599,7 +3599,7 @@
           <w14:ligatures w14:val="standardContextual"/>
         </w:rPr>
       </w:pPr>
-      <w:hyperlink w:anchor="_Toc240136961" w:history="1">
+      <w:hyperlink w:anchor="_Toc241040046" w:history="1">
         <w:r>
           <w:rPr>
             <w:rStyle w:val="aff1"/>
@@ -3626,7 +3626,7 @@
             <w:noProof/>
             <w:webHidden/>
           </w:rPr>
-          <w:instrText xml:space="preserve"> PAGEREF _Toc240136961 \h </w:instrText>
+          <w:instrText xml:space="preserve"> PAGEREF _Toc241040046 \h </w:instrText>
         </w:r>
         <w:r>
           <w:rPr>
@@ -3675,7 +3675,7 @@
           <w14:ligatures w14:val="standardContextual"/>
         </w:rPr>
       </w:pPr>
-      <w:hyperlink w:anchor="_Toc240136962" w:history="1">
+      <w:hyperlink w:anchor="_Toc241040047" w:history="1">
         <w:r>
           <w:rPr>
             <w:rStyle w:val="aff1"/>
@@ -3702,7 +3702,7 @@
             <w:noProof/>
             <w:webHidden/>
           </w:rPr>
-          <w:instrText xml:space="preserve"> PAGEREF _Toc240136962 \h </w:instrText>
+          <w:instrText xml:space="preserve"> PAGEREF _Toc241040047 \h </w:instrText>
         </w:r>
         <w:r>
           <w:rPr>
@@ -3751,7 +3751,7 @@
           <w14:ligatures w14:val="standardContextual"/>
         </w:rPr>
       </w:pPr>
-      <w:hyperlink w:anchor="_Toc240136963" w:history="1">
+      <w:hyperlink w:anchor="_Toc241040048" w:history="1">
         <w:r>
           <w:rPr>
             <w:rStyle w:val="aff1"/>
@@ -3778,7 +3778,7 @@
             <w:noProof/>
             <w:webHidden/>
           </w:rPr>
-          <w:instrText xml:space="preserve"> PAGEREF _Toc240136963 \h </w:instrText>
+          <w:instrText xml:space="preserve"> PAGEREF _Toc241040048 \h </w:instrText>
         </w:r>
         <w:r>
           <w:rPr>
@@ -3827,7 +3827,7 @@
           <w14:ligatures w14:val="standardContextual"/>
         </w:rPr>
       </w:pPr>
-      <w:hyperlink w:anchor="_Toc240136964" w:history="1">
+      <w:hyperlink w:anchor="_Toc241040049" w:history="1">
         <w:r>
           <w:rPr>
             <w:rStyle w:val="aff1"/>
@@ -3854,7 +3854,7 @@
             <w:noProof/>
             <w:webHidden/>
           </w:rPr>
-          <w:instrText xml:space="preserve"> PAGEREF _Toc240136964 \h </w:instrText>
+          <w:instrText xml:space="preserve"> PAGEREF _Toc241040049 \h </w:instrText>
         </w:r>
         <w:r>
           <w:rPr>
@@ -3902,7 +3902,7 @@
           <w14:ligatures w14:val="standardContextual"/>
         </w:rPr>
       </w:pPr>
-      <w:hyperlink w:anchor="_Toc240136965" w:history="1">
+      <w:hyperlink w:anchor="_Toc241040050" w:history="1">
         <w:r>
           <w:rPr>
             <w:rStyle w:val="aff1"/>
@@ -3929,7 +3929,7 @@
             <w:noProof/>
             <w:webHidden/>
           </w:rPr>
-          <w:instrText xml:space="preserve"> PAGEREF _Toc240136965 \h </w:instrText>
+          <w:instrText xml:space="preserve"> PAGEREF _Toc241040050 \h </w:instrText>
         </w:r>
         <w:r>
           <w:rPr>
@@ -3978,7 +3978,7 @@
           <w14:ligatures w14:val="standardContextual"/>
         </w:rPr>
       </w:pPr>
-      <w:hyperlink w:anchor="_Toc240136966" w:history="1">
+      <w:hyperlink w:anchor="_Toc241040051" w:history="1">
         <w:r>
           <w:rPr>
             <w:rStyle w:val="aff1"/>
@@ -4005,7 +4005,7 @@
             <w:noProof/>
             <w:webHidden/>
           </w:rPr>
-          <w:instrText xml:space="preserve"> PAGEREF _Toc240136966 \h </w:instrText>
+          <w:instrText xml:space="preserve"> PAGEREF _Toc241040051 \h </w:instrText>
         </w:r>
         <w:r>
           <w:rPr>
@@ -4054,7 +4054,7 @@
           <w14:ligatures w14:val="standardContextual"/>
         </w:rPr>
       </w:pPr>
-      <w:hyperlink w:anchor="_Toc240136967" w:history="1">
+      <w:hyperlink w:anchor="_Toc241040052" w:history="1">
         <w:r>
           <w:rPr>
             <w:rStyle w:val="aff1"/>
@@ -4081,7 +4081,7 @@
             <w:noProof/>
             <w:webHidden/>
           </w:rPr>
-          <w:instrText xml:space="preserve"> PAGEREF _Toc240136967 \h </w:instrText>
+          <w:instrText xml:space="preserve"> PAGEREF _Toc241040052 \h </w:instrText>
         </w:r>
         <w:r>
           <w:rPr>
@@ -4130,7 +4130,7 @@
           <w14:ligatures w14:val="standardContextual"/>
         </w:rPr>
       </w:pPr>
-      <w:hyperlink w:anchor="_Toc240136968" w:history="1">
+      <w:hyperlink w:anchor="_Toc241040053" w:history="1">
         <w:r>
           <w:rPr>
             <w:rStyle w:val="aff1"/>
@@ -4157,7 +4157,7 @@
             <w:noProof/>
             <w:webHidden/>
           </w:rPr>
-          <w:instrText xml:space="preserve"> PAGEREF _Toc240136968 \h </w:instrText>
+          <w:instrText xml:space="preserve"> PAGEREF _Toc241040053 \h </w:instrText>
         </w:r>
         <w:r>
           <w:rPr>
@@ -4206,7 +4206,7 @@
           <w14:ligatures w14:val="standardContextual"/>
         </w:rPr>
       </w:pPr>
-      <w:hyperlink w:anchor="_Toc240136969" w:history="1">
+      <w:hyperlink w:anchor="_Toc241040054" w:history="1">
         <w:r>
           <w:rPr>
             <w:rStyle w:val="aff1"/>
@@ -4233,7 +4233,7 @@
             <w:noProof/>
             <w:webHidden/>
           </w:rPr>
-          <w:instrText xml:space="preserve"> PAGEREF _Toc240136969 \h </w:instrText>
+          <w:instrText xml:space="preserve"> PAGEREF _Toc241040054 \h </w:instrText>
         </w:r>
         <w:r>
           <w:rPr>
@@ -4282,7 +4282,7 @@
           <w14:ligatures w14:val="standardContextual"/>
         </w:rPr>
       </w:pPr>
-      <w:hyperlink w:anchor="_Toc240136970" w:history="1">
+      <w:hyperlink w:anchor="_Toc241040055" w:history="1">
         <w:r>
           <w:rPr>
             <w:rStyle w:val="aff1"/>
@@ -4309,7 +4309,7 @@
             <w:noProof/>
             <w:webHidden/>
           </w:rPr>
-          <w:instrText xml:space="preserve"> PAGEREF _Toc240136970 \h </w:instrText>
+          <w:instrText xml:space="preserve"> PAGEREF _Toc241040055 \h </w:instrText>
         </w:r>
         <w:r>
           <w:rPr>
@@ -4358,7 +4358,7 @@
           <w14:ligatures w14:val="standardContextual"/>
         </w:rPr>
       </w:pPr>
-      <w:hyperlink w:anchor="_Toc240136971" w:history="1">
+      <w:hyperlink w:anchor="_Toc241040056" w:history="1">
         <w:r>
           <w:rPr>
             <w:rStyle w:val="aff1"/>
@@ -4385,7 +4385,7 @@
             <w:noProof/>
             <w:webHidden/>
           </w:rPr>
-          <w:instrText xml:space="preserve"> PAGEREF _Toc240136971 \h </w:instrText>
+          <w:instrText xml:space="preserve"> PAGEREF _Toc241040056 \h </w:instrText>
         </w:r>
         <w:r>
           <w:rPr>
@@ -4434,7 +4434,7 @@
           <w14:ligatures w14:val="standardContextual"/>
         </w:rPr>
       </w:pPr>
-      <w:hyperlink w:anchor="_Toc240136972" w:history="1">
+      <w:hyperlink w:anchor="_Toc241040057" w:history="1">
         <w:r>
           <w:rPr>
             <w:rStyle w:val="aff1"/>
@@ -4461,7 +4461,7 @@
             <w:noProof/>
             <w:webHidden/>
           </w:rPr>
-          <w:instrText xml:space="preserve"> PAGEREF _Toc240136972 \h </w:instrText>
+          <w:instrText xml:space="preserve"> PAGEREF _Toc241040057 \h </w:instrText>
         </w:r>
         <w:r>
           <w:rPr>
@@ -4510,7 +4510,7 @@
           <w14:ligatures w14:val="standardContextual"/>
         </w:rPr>
       </w:pPr>
-      <w:hyperlink w:anchor="_Toc240136973" w:history="1">
+      <w:hyperlink w:anchor="_Toc241040058" w:history="1">
         <w:r>
           <w:rPr>
             <w:rStyle w:val="aff1"/>
@@ -4537,7 +4537,7 @@
             <w:noProof/>
             <w:webHidden/>
           </w:rPr>
-          <w:instrText xml:space="preserve"> PAGEREF _Toc240136973 \h </w:instrText>
+          <w:instrText xml:space="preserve"> PAGEREF _Toc241040058 \h </w:instrText>
         </w:r>
         <w:r>
           <w:rPr>
@@ -4586,7 +4586,7 @@
           <w14:ligatures w14:val="standardContextual"/>
         </w:rPr>
       </w:pPr>
-      <w:hyperlink w:anchor="_Toc240136974" w:history="1">
+      <w:hyperlink w:anchor="_Toc241040059" w:history="1">
         <w:r>
           <w:rPr>
             <w:rStyle w:val="aff1"/>
@@ -4613,7 +4613,7 @@
             <w:noProof/>
             <w:webHidden/>
           </w:rPr>
-          <w:instrText xml:space="preserve"> PAGEREF _Toc240136974 \h </w:instrText>
+          <w:instrText xml:space="preserve"> PAGEREF _Toc241040059 \h </w:instrText>
         </w:r>
         <w:r>
           <w:rPr>
@@ -4661,7 +4661,7 @@
           <w14:ligatures w14:val="standardContextual"/>
         </w:rPr>
       </w:pPr>
-      <w:hyperlink w:anchor="_Toc240136975" w:history="1">
+      <w:hyperlink w:anchor="_Toc241040060" w:history="1">
         <w:r>
           <w:rPr>
             <w:rStyle w:val="aff1"/>
@@ -4688,7 +4688,7 @@
             <w:noProof/>
             <w:webHidden/>
           </w:rPr>
-          <w:instrText xml:space="preserve"> PAGEREF _Toc240136975 \h </w:instrText>
+          <w:instrText xml:space="preserve"> PAGEREF _Toc241040060 \h </w:instrText>
         </w:r>
         <w:r>
           <w:rPr>
@@ -4737,7 +4737,7 @@
           <w14:ligatures w14:val="standardContextual"/>
         </w:rPr>
       </w:pPr>
-      <w:hyperlink w:anchor="_Toc240136976" w:history="1">
+      <w:hyperlink w:anchor="_Toc241040061" w:history="1">
         <w:r>
           <w:rPr>
             <w:rStyle w:val="aff1"/>
@@ -4764,7 +4764,7 @@
             <w:noProof/>
             <w:webHidden/>
           </w:rPr>
-          <w:instrText xml:space="preserve"> PAGEREF _Toc240136976 \h </w:instrText>
+          <w:instrText xml:space="preserve"> PAGEREF _Toc241040061 \h </w:instrText>
         </w:r>
         <w:r>
           <w:rPr>
@@ -4813,7 +4813,7 @@
           <w14:ligatures w14:val="standardContextual"/>
         </w:rPr>
       </w:pPr>
-      <w:hyperlink w:anchor="_Toc240136977" w:history="1">
+      <w:hyperlink w:anchor="_Toc241040062" w:history="1">
         <w:r>
           <w:rPr>
             <w:rStyle w:val="aff1"/>
@@ -4840,7 +4840,7 @@
             <w:noProof/>
             <w:webHidden/>
           </w:rPr>
-          <w:instrText xml:space="preserve"> PAGEREF _Toc240136977 \h </w:instrText>
+          <w:instrText xml:space="preserve"> PAGEREF _Toc241040062 \h </w:instrText>
         </w:r>
         <w:r>
           <w:rPr>
@@ -4889,7 +4889,7 @@
           <w14:ligatures w14:val="standardContextual"/>
         </w:rPr>
       </w:pPr>
-      <w:hyperlink w:anchor="_Toc240136978" w:history="1">
+      <w:hyperlink w:anchor="_Toc241040063" w:history="1">
         <w:r>
           <w:rPr>
             <w:rStyle w:val="aff1"/>
@@ -4916,7 +4916,7 @@
             <w:noProof/>
             <w:webHidden/>
           </w:rPr>
-          <w:instrText xml:space="preserve"> PAGEREF _Toc240136978 \h </w:instrText>
+          <w:instrText xml:space="preserve"> PAGEREF _Toc241040063 \h </w:instrText>
         </w:r>
         <w:r>
           <w:rPr>
@@ -4965,7 +4965,7 @@
           <w14:ligatures w14:val="standardContextual"/>
         </w:rPr>
       </w:pPr>
-      <w:hyperlink w:anchor="_Toc240136979" w:history="1">
+      <w:hyperlink w:anchor="_Toc241040064" w:history="1">
         <w:r>
           <w:rPr>
             <w:rStyle w:val="aff1"/>
@@ -4992,7 +4992,7 @@
             <w:noProof/>
             <w:webHidden/>
           </w:rPr>
-          <w:instrText xml:space="preserve"> PAGEREF _Toc240136979 \h </w:instrText>
+          <w:instrText xml:space="preserve"> PAGEREF _Toc241040064 \h </w:instrText>
         </w:r>
         <w:r>
           <w:rPr>
@@ -5041,7 +5041,7 @@
           <w14:ligatures w14:val="standardContextual"/>
         </w:rPr>
       </w:pPr>
-      <w:hyperlink w:anchor="_Toc240136980" w:history="1">
+      <w:hyperlink w:anchor="_Toc241040065" w:history="1">
         <w:r>
           <w:rPr>
             <w:rStyle w:val="aff1"/>
@@ -5068,7 +5068,7 @@
             <w:noProof/>
             <w:webHidden/>
           </w:rPr>
-          <w:instrText xml:space="preserve"> PAGEREF _Toc240136980 \h </w:instrText>
+          <w:instrText xml:space="preserve"> PAGEREF _Toc241040065 \h </w:instrText>
         </w:r>
         <w:r>
           <w:rPr>
@@ -5117,7 +5117,7 @@
           <w14:ligatures w14:val="standardContextual"/>
         </w:rPr>
       </w:pPr>
-      <w:hyperlink w:anchor="_Toc240136981" w:history="1">
+      <w:hyperlink w:anchor="_Toc241040066" w:history="1">
         <w:r>
           <w:rPr>
             <w:rStyle w:val="aff1"/>
@@ -5144,7 +5144,7 @@
             <w:noProof/>
             <w:webHidden/>
           </w:rPr>
-          <w:instrText xml:space="preserve"> PAGEREF _Toc240136981 \h </w:instrText>
+          <w:instrText xml:space="preserve"> PAGEREF _Toc241040066 \h </w:instrText>
         </w:r>
         <w:r>
           <w:rPr>
@@ -5193,7 +5193,7 @@
           <w14:ligatures w14:val="standardContextual"/>
         </w:rPr>
       </w:pPr>
-      <w:hyperlink w:anchor="_Toc240136982" w:history="1">
+      <w:hyperlink w:anchor="_Toc241040067" w:history="1">
         <w:r>
           <w:rPr>
             <w:rStyle w:val="aff1"/>
@@ -5220,7 +5220,7 @@
             <w:noProof/>
             <w:webHidden/>
           </w:rPr>
-          <w:instrText xml:space="preserve"> PAGEREF _Toc240136982 \h </w:instrText>
+          <w:instrText xml:space="preserve"> PAGEREF _Toc241040067 \h </w:instrText>
         </w:r>
         <w:r>
           <w:rPr>
@@ -5268,7 +5268,7 @@
           <w14:ligatures w14:val="standardContextual"/>
         </w:rPr>
       </w:pPr>
-      <w:hyperlink w:anchor="_Toc240136983" w:history="1">
+      <w:hyperlink w:anchor="_Toc241040068" w:history="1">
         <w:r>
           <w:rPr>
             <w:rStyle w:val="aff1"/>
@@ -5295,7 +5295,7 @@
             <w:noProof/>
             <w:webHidden/>
           </w:rPr>
-          <w:instrText xml:space="preserve"> PAGEREF _Toc240136983 \h </w:instrText>
+          <w:instrText xml:space="preserve"> PAGEREF _Toc241040068 \h </w:instrText>
         </w:r>
         <w:r>
           <w:rPr>
@@ -5343,7 +5343,7 @@
           <w14:ligatures w14:val="standardContextual"/>
         </w:rPr>
       </w:pPr>
-      <w:hyperlink w:anchor="_Toc240136984" w:history="1">
+      <w:hyperlink w:anchor="_Toc241040069" w:history="1">
         <w:r>
           <w:rPr>
             <w:rStyle w:val="aff1"/>
@@ -5370,7 +5370,7 @@
             <w:noProof/>
             <w:webHidden/>
           </w:rPr>
-          <w:instrText xml:space="preserve"> PAGEREF _Toc240136984 \h </w:instrText>
+          <w:instrText xml:space="preserve"> PAGEREF _Toc241040069 \h </w:instrText>
         </w:r>
         <w:r>
           <w:rPr>
@@ -5418,7 +5418,7 @@
           <w14:ligatures w14:val="standardContextual"/>
         </w:rPr>
       </w:pPr>
-      <w:hyperlink w:anchor="_Toc240136985" w:history="1">
+      <w:hyperlink w:anchor="_Toc241040070" w:history="1">
         <w:r>
           <w:rPr>
             <w:rStyle w:val="aff1"/>
@@ -5445,7 +5445,7 @@
             <w:noProof/>
             <w:webHidden/>
           </w:rPr>
-          <w:instrText xml:space="preserve"> PAGEREF _Toc240136985 \h </w:instrText>
+          <w:instrText xml:space="preserve"> PAGEREF _Toc241040070 \h </w:instrText>
         </w:r>
         <w:r>
           <w:rPr>
@@ -5495,7 +5495,7 @@
           <w:numId w:val="7"/>
         </w:numPr>
       </w:pPr>
-      <w:bookmarkStart w:id="0" w:name="_Toc240136921"/>
+      <w:bookmarkStart w:id="0" w:name="_Toc241040006"/>
       <w:r>
         <w:lastRenderedPageBreak/>
         <w:t>게임</w:t>
@@ -5528,7 +5528,7 @@
           <w:numId w:val="7"/>
         </w:numPr>
       </w:pPr>
-      <w:bookmarkStart w:id="1" w:name="_Toc240136922"/>
+      <w:bookmarkStart w:id="1" w:name="_Toc241040007"/>
       <w:r>
         <w:t>Executive Summary</w:t>
       </w:r>
@@ -5599,7 +5599,7 @@
           <w:numId w:val="7"/>
         </w:numPr>
       </w:pPr>
-      <w:bookmarkStart w:id="2" w:name="_Toc240136923"/>
+      <w:bookmarkStart w:id="2" w:name="_Toc241040008"/>
       <w:r>
         <w:t>Rev 16 Release Profile</w:t>
       </w:r>
@@ -5623,7 +5623,7 @@
           <w:numId w:val="7"/>
         </w:numPr>
       </w:pPr>
-      <w:bookmarkStart w:id="3" w:name="_Toc240136924"/>
+      <w:bookmarkStart w:id="3" w:name="_Toc241040009"/>
       <w:r>
         <w:t>제품</w:t>
       </w:r>
@@ -5913,7 +5913,7 @@
           <w:numId w:val="7"/>
         </w:numPr>
       </w:pPr>
-      <w:bookmarkStart w:id="4" w:name="_Toc240136925"/>
+      <w:bookmarkStart w:id="4" w:name="_Toc241040010"/>
       <w:r>
         <w:t>디자인</w:t>
       </w:r>
@@ -6283,7 +6283,7 @@
           <w:numId w:val="7"/>
         </w:numPr>
       </w:pPr>
-      <w:bookmarkStart w:id="5" w:name="_Toc240136926"/>
+      <w:bookmarkStart w:id="5" w:name="_Toc241040011"/>
       <w:r>
         <w:t>Target Experience</w:t>
       </w:r>
@@ -6357,7 +6357,7 @@
           <w:numId w:val="7"/>
         </w:numPr>
       </w:pPr>
-      <w:bookmarkStart w:id="6" w:name="_Toc240136927"/>
+      <w:bookmarkStart w:id="6" w:name="_Toc241040012"/>
       <w:r>
         <w:t>명시적</w:t>
       </w:r>
@@ -6629,7 +6629,7 @@
           <w:numId w:val="7"/>
         </w:numPr>
       </w:pPr>
-      <w:bookmarkStart w:id="7" w:name="_Toc240136928"/>
+      <w:bookmarkStart w:id="7" w:name="_Toc241040013"/>
       <w:r>
         <w:lastRenderedPageBreak/>
         <w:t>Contract Run</w:t>
@@ -6665,7 +6665,7 @@
           <w:numId w:val="7"/>
         </w:numPr>
       </w:pPr>
-      <w:bookmarkStart w:id="8" w:name="_Toc240136929"/>
+      <w:bookmarkStart w:id="8" w:name="_Toc241040014"/>
       <w:r>
         <w:t>Core Loop</w:t>
       </w:r>
@@ -7159,7 +7159,7 @@
           <w:numId w:val="7"/>
         </w:numPr>
       </w:pPr>
-      <w:bookmarkStart w:id="9" w:name="_Toc240136930"/>
+      <w:bookmarkStart w:id="9" w:name="_Toc241040015"/>
       <w:r>
         <w:t xml:space="preserve">Contract </w:t>
       </w:r>
@@ -7583,7 +7583,7 @@
           <w:numId w:val="7"/>
         </w:numPr>
       </w:pPr>
-      <w:bookmarkStart w:id="10" w:name="_Toc240136931"/>
+      <w:bookmarkStart w:id="10" w:name="_Toc241040016"/>
       <w:r>
         <w:lastRenderedPageBreak/>
         <w:t>성공</w:t>
@@ -7875,7 +7875,7 @@
           <w:numId w:val="7"/>
         </w:numPr>
       </w:pPr>
-      <w:bookmarkStart w:id="11" w:name="_Toc240136932"/>
+      <w:bookmarkStart w:id="11" w:name="_Toc241040017"/>
       <w:r>
         <w:t>Greed Decision</w:t>
       </w:r>
@@ -8244,7 +8244,7 @@
           <w:numId w:val="7"/>
         </w:numPr>
       </w:pPr>
-      <w:bookmarkStart w:id="12" w:name="_Toc240136933"/>
+      <w:bookmarkStart w:id="12" w:name="_Toc241040018"/>
       <w:r>
         <w:t>15~25</w:t>
       </w:r>
@@ -8614,7 +8614,7 @@
           <w:numId w:val="7"/>
         </w:numPr>
       </w:pPr>
-      <w:bookmarkStart w:id="13" w:name="_Toc240136934"/>
+      <w:bookmarkStart w:id="13" w:name="_Toc241040019"/>
       <w:r>
         <w:lastRenderedPageBreak/>
         <w:t>위조와</w:t>
@@ -8641,7 +8641,7 @@
           <w:numId w:val="7"/>
         </w:numPr>
       </w:pPr>
-      <w:bookmarkStart w:id="14" w:name="_Toc240136935"/>
+      <w:bookmarkStart w:id="14" w:name="_Toc241040020"/>
       <w:r>
         <w:t>Artifact</w:t>
       </w:r>
@@ -8942,7 +8942,7 @@
           <w:numId w:val="7"/>
         </w:numPr>
       </w:pPr>
-      <w:bookmarkStart w:id="15" w:name="_Toc240136936"/>
+      <w:bookmarkStart w:id="15" w:name="_Toc241040021"/>
       <w:r>
         <w:t xml:space="preserve">Surface Forgery </w:t>
       </w:r>
@@ -9124,7 +9124,7 @@
           <w:numId w:val="7"/>
         </w:numPr>
       </w:pPr>
-      <w:bookmarkStart w:id="16" w:name="_Toc240136937"/>
+      <w:bookmarkStart w:id="16" w:name="_Toc241040022"/>
       <w:r>
         <w:lastRenderedPageBreak/>
         <w:t>Object Assembly — Deferred Expansion</w:t>
@@ -9192,7 +9192,7 @@
           <w:numId w:val="7"/>
         </w:numPr>
       </w:pPr>
-      <w:bookmarkStart w:id="17" w:name="_Toc240136938"/>
+      <w:bookmarkStart w:id="17" w:name="_Toc241040023"/>
       <w:r>
         <w:t>Quality</w:t>
       </w:r>
@@ -9481,7 +9481,7 @@
           <w:numId w:val="7"/>
         </w:numPr>
       </w:pPr>
-      <w:bookmarkStart w:id="18" w:name="_Toc240136939"/>
+      <w:bookmarkStart w:id="18" w:name="_Toc241040024"/>
       <w:r>
         <w:lastRenderedPageBreak/>
         <w:t>핵심</w:t>
@@ -9983,7 +9983,7 @@
           <w:numId w:val="7"/>
         </w:numPr>
       </w:pPr>
-      <w:bookmarkStart w:id="19" w:name="_Toc240136940"/>
+      <w:bookmarkStart w:id="19" w:name="_Toc241040025"/>
       <w:r>
         <w:t xml:space="preserve">Owner-only Forgery </w:t>
       </w:r>
@@ -10230,7 +10230,7 @@
           <w:numId w:val="7"/>
         </w:numPr>
       </w:pPr>
-      <w:bookmarkStart w:id="20" w:name="_Toc240136941"/>
+      <w:bookmarkStart w:id="20" w:name="_Toc241040026"/>
       <w:r>
         <w:lastRenderedPageBreak/>
         <w:t>잠입</w:t>
@@ -10263,7 +10263,7 @@
           <w:numId w:val="7"/>
         </w:numPr>
       </w:pPr>
-      <w:bookmarkStart w:id="21" w:name="_Toc240136942"/>
+      <w:bookmarkStart w:id="21" w:name="_Toc241040027"/>
       <w:r>
         <w:t xml:space="preserve">First-Person </w:t>
       </w:r>
@@ -10328,7 +10328,7 @@
           <w:numId w:val="7"/>
         </w:numPr>
       </w:pPr>
-      <w:bookmarkStart w:id="22" w:name="_Toc240136943"/>
+      <w:bookmarkStart w:id="22" w:name="_Toc241040028"/>
       <w:r>
         <w:t>Walk, Sprint, Weight, Footstep</w:t>
       </w:r>
@@ -10671,7 +10671,7 @@
           <w:numId w:val="7"/>
         </w:numPr>
       </w:pPr>
-      <w:bookmarkStart w:id="23" w:name="_Toc240136944"/>
+      <w:bookmarkStart w:id="23" w:name="_Toc241040029"/>
       <w:r>
         <w:t>Patrol Guard</w:t>
       </w:r>
@@ -11022,7 +11022,7 @@
           <w:numId w:val="7"/>
         </w:numPr>
       </w:pPr>
-      <w:bookmarkStart w:id="24" w:name="_Toc240136945"/>
+      <w:bookmarkStart w:id="24" w:name="_Toc241040030"/>
       <w:r>
         <w:t>CCTV</w:t>
       </w:r>
@@ -11272,7 +11272,7 @@
           <w:numId w:val="7"/>
         </w:numPr>
       </w:pPr>
-      <w:bookmarkStart w:id="25" w:name="_Toc240136946"/>
+      <w:bookmarkStart w:id="25" w:name="_Toc241040031"/>
       <w:r>
         <w:lastRenderedPageBreak/>
         <w:t>Stun, Arrest, Recovery</w:t>
@@ -11347,7 +11347,7 @@
           <w:numId w:val="7"/>
         </w:numPr>
       </w:pPr>
-      <w:bookmarkStart w:id="26" w:name="_Toc240136947"/>
+      <w:bookmarkStart w:id="26" w:name="_Toc241040032"/>
       <w:r>
         <w:t>두</w:t>
       </w:r>
@@ -11823,7 +11823,7 @@
           <w:numId w:val="7"/>
         </w:numPr>
       </w:pPr>
-      <w:bookmarkStart w:id="27" w:name="_Toc240136948"/>
+      <w:bookmarkStart w:id="27" w:name="_Toc241040033"/>
       <w:r>
         <w:lastRenderedPageBreak/>
         <w:t>협동</w:t>
@@ -11850,7 +11850,7 @@
           <w:numId w:val="7"/>
         </w:numPr>
       </w:pPr>
-      <w:bookmarkStart w:id="28" w:name="_Toc240136949"/>
+      <w:bookmarkStart w:id="28" w:name="_Toc241040034"/>
       <w:r>
         <w:t>Role Switching</w:t>
       </w:r>
@@ -12258,7 +12258,7 @@
           <w:numId w:val="7"/>
         </w:numPr>
       </w:pPr>
-      <w:bookmarkStart w:id="29" w:name="_Toc240136950"/>
+      <w:bookmarkStart w:id="29" w:name="_Toc241040035"/>
       <w:r>
         <w:t>거리</w:t>
       </w:r>
@@ -12317,7 +12317,7 @@
           <w:numId w:val="7"/>
         </w:numPr>
       </w:pPr>
-      <w:bookmarkStart w:id="30" w:name="_Toc240136951"/>
+      <w:bookmarkStart w:id="30" w:name="_Toc241040036"/>
       <w:r>
         <w:t>Inventory, Loose Loot, Coin</w:t>
       </w:r>
@@ -12380,7 +12380,7 @@
           <w:numId w:val="7"/>
         </w:numPr>
       </w:pPr>
-      <w:bookmarkStart w:id="31" w:name="_Toc240136952"/>
+      <w:bookmarkStart w:id="31" w:name="_Toc241040037"/>
       <w:r>
         <w:t>Player Identity</w:t>
       </w:r>
@@ -12803,7 +12803,7 @@
           <w:numId w:val="7"/>
         </w:numPr>
       </w:pPr>
-      <w:bookmarkStart w:id="32" w:name="_Toc240136953"/>
+      <w:bookmarkStart w:id="32" w:name="_Toc241040038"/>
       <w:r>
         <w:t xml:space="preserve">Floor Plan Map </w:t>
       </w:r>
@@ -13015,7 +13015,7 @@
           <w:numId w:val="7"/>
         </w:numPr>
       </w:pPr>
-      <w:bookmarkStart w:id="33" w:name="_Toc240136954"/>
+      <w:bookmarkStart w:id="33" w:name="_Toc241040039"/>
       <w:r>
         <w:t>Shared Extraction</w:t>
       </w:r>
@@ -13095,7 +13095,7 @@
           <w:numId w:val="7"/>
         </w:numPr>
       </w:pPr>
-      <w:bookmarkStart w:id="34" w:name="_Toc240136955"/>
+      <w:bookmarkStart w:id="34" w:name="_Toc241040040"/>
       <w:r>
         <w:lastRenderedPageBreak/>
         <w:t xml:space="preserve">UI, </w:t>
@@ -13124,7 +13124,7 @@
           <w:numId w:val="7"/>
         </w:numPr>
       </w:pPr>
-      <w:bookmarkStart w:id="35" w:name="_Toc240136956"/>
+      <w:bookmarkStart w:id="35" w:name="_Toc241040041"/>
       <w:r>
         <w:t>HUD Information Architecture</w:t>
       </w:r>
@@ -13425,7 +13425,7 @@
           <w:numId w:val="7"/>
         </w:numPr>
       </w:pPr>
-      <w:bookmarkStart w:id="36" w:name="_Toc240136957"/>
+      <w:bookmarkStart w:id="36" w:name="_Toc241040042"/>
       <w:r>
         <w:t xml:space="preserve">Main HUD </w:t>
       </w:r>
@@ -13493,6 +13493,29 @@
               <w:t>필수 목표 작품명</w:t>
             </w:r>
           </w:p>
+          <w:p>
+            <w:r>
+              <w:t>운반</w:t>
+            </w:r>
+            <w:r>
+              <w:t>·</w:t>
+            </w:r>
+            <w:r>
+              <w:t>확보</w:t>
+            </w:r>
+            <w:r>
+              <w:t xml:space="preserve"> </w:t>
+            </w:r>
+            <w:r>
+              <w:t>현재</w:t>
+            </w:r>
+            <w:r>
+              <w:t xml:space="preserve"> / </w:t>
+            </w:r>
+            <w:r>
+              <w:t>목표</w:t>
+            </w:r>
+          </w:p>
         </w:tc>
         <w:tc>
           <w:tcPr>
@@ -13619,6 +13642,7 @@
           </w:tcPr>
           <w:p>
             <w:r>
+              <w:lastRenderedPageBreak/>
               <w:t>INVENTORY [TAB]</w:t>
             </w:r>
             <w:r>
@@ -13683,7 +13707,6 @@
           </w:tcPr>
           <w:p>
             <w:r>
-              <w:lastRenderedPageBreak/>
               <w:t>MAP [M]</w:t>
             </w:r>
           </w:p>
@@ -13735,7 +13758,7 @@
           <w:numId w:val="7"/>
         </w:numPr>
       </w:pPr>
-      <w:bookmarkStart w:id="37" w:name="_Toc240136958"/>
+      <w:bookmarkStart w:id="37" w:name="_Toc241040043"/>
       <w:r>
         <w:t>최소</w:t>
       </w:r>
@@ -13768,7 +13791,7 @@
         </w:numPr>
       </w:pPr>
       <w:r>
-        <w:t>좌측 상단은 ‘미션’, 남은 시간 MM : SS와 필수 목표 작품명만 표시한다. 작품명은 미획득 회색, 획득 초록이며 남은 시간이 60초 미만이면 시간만 빨간색으로 바꾼다.</w:t>
+        <w:t>좌측 상단은 ‘미션’, 남은 시간 MM : SS, 필수 목표 작품명과 ‘운반·확보 현재 / 목표’ 한 줄을 표시한다. 현재 값은 팀이 운반 중인 가치와 이미 반출한 가치의 합이며, 실제 반출 완료를 뜻하지 않는다. 작품명은 미획득 회색, 획득 초록이며 남은 시간이 60초 미만이면 시간만 빨간색으로 바꾼다.</w:t>
       </w:r>
     </w:p>
     <w:p>
@@ -13780,7 +13803,7 @@
         </w:numPr>
       </w:pPr>
       <w:r>
-        <w:t>확보 가치, 예상 점수, Carried/Secured/Quota와 무게 수치는 Main HUD에서 제외한다. Inventory는 전리품 Grid와 닫기로 구성하며 배낭 상태·계약 가치 요약은 표시하지 않는다. HUD의 Inventory 단축키와 무게 상태 색상은 유지한다.</w:t>
+        <w:t>미션의 간결한 가치 진행 한 줄 외에는 Main HUD에 운반·확보 가치의 개별 상세, 예상 점수와 무게 수치를 추가하지 않는다. 계약 성공은 필수 목표 반출과 실제 확보 가치의 할당량 충족으로 확정한다. Inventory는 전리품 Grid와 닫기로 구성하며 배낭 상태·계약 가치 요약은 표시하지 않는다.</w:t>
       </w:r>
     </w:p>
     <w:p>
@@ -13816,7 +13839,7 @@
           <w:numId w:val="7"/>
         </w:numPr>
       </w:pPr>
-      <w:bookmarkStart w:id="38" w:name="_Toc240136959"/>
+      <w:bookmarkStart w:id="38" w:name="_Toc241040044"/>
       <w:r>
         <w:t xml:space="preserve">Input Mode </w:t>
       </w:r>
@@ -14118,6 +14141,7 @@
               <w:rPr>
                 <w:sz w:val="16"/>
               </w:rPr>
+              <w:lastRenderedPageBreak/>
               <w:t>Map</w:t>
             </w:r>
           </w:p>
@@ -14236,7 +14260,6 @@
           </w:tcPr>
           <w:p>
             <w:r>
-              <w:lastRenderedPageBreak/>
               <w:t>Assembly (Deferred)</w:t>
             </w:r>
           </w:p>
@@ -14297,7 +14320,7 @@
           <w:numId w:val="7"/>
         </w:numPr>
       </w:pPr>
-      <w:bookmarkStart w:id="39" w:name="_Toc240136960"/>
+      <w:bookmarkStart w:id="39" w:name="_Toc241040045"/>
       <w:r>
         <w:t>Floor Plan</w:t>
       </w:r>
@@ -14320,7 +14343,7 @@
           <w:numId w:val="7"/>
         </w:numPr>
       </w:pPr>
-      <w:bookmarkStart w:id="40" w:name="_Toc240136961"/>
+      <w:bookmarkStart w:id="40" w:name="_Toc241040046"/>
       <w:r>
         <w:t xml:space="preserve">Floor Plan Map </w:t>
       </w:r>
@@ -14635,7 +14658,7 @@
           <w:numId w:val="7"/>
         </w:numPr>
       </w:pPr>
-      <w:bookmarkStart w:id="41" w:name="_Toc240136962"/>
+      <w:bookmarkStart w:id="41" w:name="_Toc241040047"/>
       <w:r>
         <w:t xml:space="preserve">Team Result / Replica Recap </w:t>
       </w:r>
@@ -15013,7 +15036,7 @@
           <w:numId w:val="7"/>
         </w:numPr>
       </w:pPr>
-      <w:bookmarkStart w:id="42" w:name="_Toc240136963"/>
+      <w:bookmarkStart w:id="42" w:name="_Toc241040048"/>
       <w:r>
         <w:t>첫</w:t>
       </w:r>
@@ -15150,6 +15173,7 @@
           </w:tcPr>
           <w:p>
             <w:r>
+              <w:lastRenderedPageBreak/>
               <w:t>관찰→위조→Submit 후 월드 복귀→회수 대기 케이스 재접근→교체 소음→Grid 운반→Deposit</w:t>
             </w:r>
           </w:p>
@@ -15252,7 +15276,6 @@
         </w:numPr>
       </w:pPr>
       <w:r>
-        <w:lastRenderedPageBreak/>
         <w:t>첫 20초 안에 Contract Card를 읽고 Target/Quota를 구분한다.</w:t>
       </w:r>
     </w:p>
@@ -15288,7 +15311,7 @@
           <w:numId w:val="7"/>
         </w:numPr>
       </w:pPr>
-      <w:bookmarkStart w:id="43" w:name="_Toc240136964"/>
+      <w:bookmarkStart w:id="43" w:name="_Toc241040049"/>
       <w:r>
         <w:t>접근성</w:t>
       </w:r>
@@ -15360,7 +15383,7 @@
           <w:numId w:val="7"/>
         </w:numPr>
       </w:pPr>
-      <w:bookmarkStart w:id="44" w:name="_Toc240136965"/>
+      <w:bookmarkStart w:id="44" w:name="_Toc241040050"/>
       <w:r>
         <w:lastRenderedPageBreak/>
         <w:t>레벨</w:t>
@@ -15393,7 +15416,7 @@
           <w:numId w:val="7"/>
         </w:numPr>
       </w:pPr>
-      <w:bookmarkStart w:id="45" w:name="_Toc240136966"/>
+      <w:bookmarkStart w:id="45" w:name="_Toc241040051"/>
       <w:r>
         <w:t>세</w:t>
       </w:r>
@@ -15512,7 +15535,7 @@
       <w:pPr>
         <w:pStyle w:val="31"/>
       </w:pPr>
-      <w:bookmarkStart w:id="46" w:name="_Toc240136967"/>
+      <w:bookmarkStart w:id="46" w:name="_Toc241040052"/>
       <w:r>
         <w:t>전시</w:t>
       </w:r>
@@ -15584,7 +15607,7 @@
           <w:numId w:val="7"/>
         </w:numPr>
       </w:pPr>
-      <w:bookmarkStart w:id="47" w:name="_Toc240136968"/>
+      <w:bookmarkStart w:id="47" w:name="_Toc241040053"/>
       <w:r>
         <w:lastRenderedPageBreak/>
         <w:t>맵</w:t>
@@ -16026,7 +16049,7 @@
           <w:numId w:val="7"/>
         </w:numPr>
       </w:pPr>
-      <w:bookmarkStart w:id="48" w:name="_Toc240136969"/>
+      <w:bookmarkStart w:id="48" w:name="_Toc241040054"/>
       <w:r>
         <w:lastRenderedPageBreak/>
         <w:t xml:space="preserve">M01 — </w:t>
@@ -16340,7 +16363,7 @@
           <w:numId w:val="7"/>
         </w:numPr>
       </w:pPr>
-      <w:bookmarkStart w:id="49" w:name="_Toc240136970"/>
+      <w:bookmarkStart w:id="49" w:name="_Toc241040055"/>
       <w:r>
         <w:lastRenderedPageBreak/>
         <w:t xml:space="preserve">M02 — </w:t>
@@ -16651,7 +16674,7 @@
           <w:numId w:val="7"/>
         </w:numPr>
       </w:pPr>
-      <w:bookmarkStart w:id="50" w:name="_Toc240136971"/>
+      <w:bookmarkStart w:id="50" w:name="_Toc241040056"/>
       <w:r>
         <w:lastRenderedPageBreak/>
         <w:t xml:space="preserve">M03 — </w:t>
@@ -16956,7 +16979,7 @@
           <w:numId w:val="7"/>
         </w:numPr>
       </w:pPr>
-      <w:bookmarkStart w:id="51" w:name="_Toc240136972"/>
+      <w:bookmarkStart w:id="51" w:name="_Toc241040057"/>
       <w:r>
         <w:lastRenderedPageBreak/>
         <w:t xml:space="preserve">First-Person </w:t>
@@ -17040,7 +17063,7 @@
           <w:numId w:val="7"/>
         </w:numPr>
       </w:pPr>
-      <w:bookmarkStart w:id="52" w:name="_Toc240136973"/>
+      <w:bookmarkStart w:id="52" w:name="_Toc241040058"/>
       <w:r>
         <w:t>사운드</w:t>
       </w:r>
@@ -17480,7 +17503,7 @@
           <w:numId w:val="7"/>
         </w:numPr>
       </w:pPr>
-      <w:bookmarkStart w:id="53" w:name="_Toc240136974"/>
+      <w:bookmarkStart w:id="53" w:name="_Toc241040059"/>
       <w:r>
         <w:lastRenderedPageBreak/>
         <w:t>세계관과</w:t>
@@ -17727,7 +17750,7 @@
           <w:numId w:val="7"/>
         </w:numPr>
       </w:pPr>
-      <w:bookmarkStart w:id="54" w:name="_Toc240136975"/>
+      <w:bookmarkStart w:id="54" w:name="_Toc241040060"/>
       <w:r>
         <w:lastRenderedPageBreak/>
         <w:t>범위</w:t>
@@ -17754,7 +17777,7 @@
           <w:numId w:val="7"/>
         </w:numPr>
       </w:pPr>
-      <w:bookmarkStart w:id="55" w:name="_Toc240136976"/>
+      <w:bookmarkStart w:id="55" w:name="_Toc241040061"/>
       <w:r>
         <w:t>v1.0 Required Scope</w:t>
       </w:r>
@@ -18122,7 +18145,7 @@
           <w:numId w:val="7"/>
         </w:numPr>
       </w:pPr>
-      <w:bookmarkStart w:id="56" w:name="_Toc240136977"/>
+      <w:bookmarkStart w:id="56" w:name="_Toc241040062"/>
       <w:r>
         <w:t>Deferred Expansion</w:t>
       </w:r>
@@ -18146,7 +18169,7 @@
           <w:numId w:val="7"/>
         </w:numPr>
       </w:pPr>
-      <w:bookmarkStart w:id="57" w:name="_Toc240136978"/>
+      <w:bookmarkStart w:id="57" w:name="_Toc241040063"/>
       <w:r>
         <w:t>Stretch</w:t>
       </w:r>
@@ -18524,7 +18547,7 @@
           <w:numId w:val="7"/>
         </w:numPr>
       </w:pPr>
-      <w:bookmarkStart w:id="58" w:name="_Toc240136979"/>
+      <w:bookmarkStart w:id="58" w:name="_Toc241040064"/>
       <w:r>
         <w:lastRenderedPageBreak/>
         <w:t>Starting Balance Targets</w:t>
@@ -19123,7 +19146,7 @@
           <w:numId w:val="7"/>
         </w:numPr>
       </w:pPr>
-      <w:bookmarkStart w:id="59" w:name="_Toc240136980"/>
+      <w:bookmarkStart w:id="59" w:name="_Toc241040065"/>
       <w:r>
         <w:t>Playtest Questions</w:t>
       </w:r>
@@ -19209,7 +19232,7 @@
           <w:numId w:val="7"/>
         </w:numPr>
       </w:pPr>
-      <w:bookmarkStart w:id="60" w:name="_Toc240136981"/>
+      <w:bookmarkStart w:id="60" w:name="_Toc241040066"/>
       <w:r>
         <w:lastRenderedPageBreak/>
         <w:t>Release KPI</w:t>
@@ -19541,7 +19564,7 @@
           <w:numId w:val="7"/>
         </w:numPr>
       </w:pPr>
-      <w:bookmarkStart w:id="61" w:name="_Toc240136982"/>
+      <w:bookmarkStart w:id="61" w:name="_Toc241040067"/>
       <w:r>
         <w:t>W6~W12 Roadmap</w:t>
       </w:r>
@@ -19907,7 +19930,7 @@
         <w:keepLines/>
         <w:pageBreakBefore w:val="0"/>
       </w:pPr>
-      <w:bookmarkStart w:id="62" w:name="_Toc240136983"/>
+      <w:bookmarkStart w:id="62" w:name="_Toc241040068"/>
       <w:r>
         <w:t>Appendix A — 용어</w:t>
       </w:r>
@@ -20298,7 +20321,7 @@
         <w:keepLines/>
         <w:pageBreakBefore w:val="0"/>
       </w:pPr>
-      <w:bookmarkStart w:id="63" w:name="_Toc240136984"/>
+      <w:bookmarkStart w:id="63" w:name="_Toc241040069"/>
       <w:r>
         <w:rPr>
           <w:sz w:val="32"/>
@@ -20525,7 +20548,7 @@
         <w:keepLines/>
         <w:pageBreakBefore w:val="0"/>
       </w:pPr>
-      <w:bookmarkStart w:id="64" w:name="_Toc240136985"/>
+      <w:bookmarkStart w:id="64" w:name="_Toc241040070"/>
       <w:r>
         <w:rPr>
           <w:sz w:val="32"/>

</xml_diff>

<commit_message>
Improve CCTV sight, warning lights and pause-on-detection behavior
</commit_message>
<xml_diff>
--- a/Museum_Heist_GDD.docx
+++ b/Museum_Heist_GDD.docx
@@ -190,11 +190,6 @@
               <w:pStyle w:val="TableText"/>
             </w:pPr>
             <w:r>
-              <w:rPr>
-                <w:b/>
-                <w:color w:val="17365D"/>
-                <w:sz w:val="19"/>
-              </w:rPr>
               <w:t>Focus</w:t>
             </w:r>
           </w:p>
@@ -564,7 +559,7 @@
       <w:r>
         <w:fldChar w:fldCharType="separate"/>
       </w:r>
-      <w:hyperlink w:anchor="_Toc241040006" w:history="1">
+      <w:hyperlink w:anchor="_Toc241099431" w:history="1">
         <w:r>
           <w:rPr>
             <w:rStyle w:val="aff1"/>
@@ -591,7 +586,7 @@
             <w:noProof/>
             <w:webHidden/>
           </w:rPr>
-          <w:instrText xml:space="preserve"> PAGEREF _Toc241040006 \h </w:instrText>
+          <w:instrText xml:space="preserve"> PAGEREF _Toc241099431 \h </w:instrText>
         </w:r>
         <w:r>
           <w:rPr>
@@ -640,7 +635,7 @@
           <w14:ligatures w14:val="standardContextual"/>
         </w:rPr>
       </w:pPr>
-      <w:hyperlink w:anchor="_Toc241040007" w:history="1">
+      <w:hyperlink w:anchor="_Toc241099432" w:history="1">
         <w:r>
           <w:rPr>
             <w:rStyle w:val="aff1"/>
@@ -667,7 +662,7 @@
             <w:noProof/>
             <w:webHidden/>
           </w:rPr>
-          <w:instrText xml:space="preserve"> PAGEREF _Toc241040007 \h </w:instrText>
+          <w:instrText xml:space="preserve"> PAGEREF _Toc241099432 \h </w:instrText>
         </w:r>
         <w:r>
           <w:rPr>
@@ -716,7 +711,7 @@
           <w14:ligatures w14:val="standardContextual"/>
         </w:rPr>
       </w:pPr>
-      <w:hyperlink w:anchor="_Toc241040008" w:history="1">
+      <w:hyperlink w:anchor="_Toc241099433" w:history="1">
         <w:r>
           <w:rPr>
             <w:rStyle w:val="aff1"/>
@@ -743,7 +738,7 @@
             <w:noProof/>
             <w:webHidden/>
           </w:rPr>
-          <w:instrText xml:space="preserve"> PAGEREF _Toc241040008 \h </w:instrText>
+          <w:instrText xml:space="preserve"> PAGEREF _Toc241099433 \h </w:instrText>
         </w:r>
         <w:r>
           <w:rPr>
@@ -792,7 +787,7 @@
           <w14:ligatures w14:val="standardContextual"/>
         </w:rPr>
       </w:pPr>
-      <w:hyperlink w:anchor="_Toc241040009" w:history="1">
+      <w:hyperlink w:anchor="_Toc241099434" w:history="1">
         <w:r>
           <w:rPr>
             <w:rStyle w:val="aff1"/>
@@ -819,7 +814,7 @@
             <w:noProof/>
             <w:webHidden/>
           </w:rPr>
-          <w:instrText xml:space="preserve"> PAGEREF _Toc241040009 \h </w:instrText>
+          <w:instrText xml:space="preserve"> PAGEREF _Toc241099434 \h </w:instrText>
         </w:r>
         <w:r>
           <w:rPr>
@@ -868,7 +863,7 @@
           <w14:ligatures w14:val="standardContextual"/>
         </w:rPr>
       </w:pPr>
-      <w:hyperlink w:anchor="_Toc241040010" w:history="1">
+      <w:hyperlink w:anchor="_Toc241099435" w:history="1">
         <w:r>
           <w:rPr>
             <w:rStyle w:val="aff1"/>
@@ -895,7 +890,7 @@
             <w:noProof/>
             <w:webHidden/>
           </w:rPr>
-          <w:instrText xml:space="preserve"> PAGEREF _Toc241040010 \h </w:instrText>
+          <w:instrText xml:space="preserve"> PAGEREF _Toc241099435 \h </w:instrText>
         </w:r>
         <w:r>
           <w:rPr>
@@ -944,7 +939,7 @@
           <w14:ligatures w14:val="standardContextual"/>
         </w:rPr>
       </w:pPr>
-      <w:hyperlink w:anchor="_Toc241040011" w:history="1">
+      <w:hyperlink w:anchor="_Toc241099436" w:history="1">
         <w:r>
           <w:rPr>
             <w:rStyle w:val="aff1"/>
@@ -971,7 +966,7 @@
             <w:noProof/>
             <w:webHidden/>
           </w:rPr>
-          <w:instrText xml:space="preserve"> PAGEREF _Toc241040011 \h </w:instrText>
+          <w:instrText xml:space="preserve"> PAGEREF _Toc241099436 \h </w:instrText>
         </w:r>
         <w:r>
           <w:rPr>
@@ -1020,7 +1015,7 @@
           <w14:ligatures w14:val="standardContextual"/>
         </w:rPr>
       </w:pPr>
-      <w:hyperlink w:anchor="_Toc241040012" w:history="1">
+      <w:hyperlink w:anchor="_Toc241099437" w:history="1">
         <w:r>
           <w:rPr>
             <w:rStyle w:val="aff1"/>
@@ -1047,7 +1042,7 @@
             <w:noProof/>
             <w:webHidden/>
           </w:rPr>
-          <w:instrText xml:space="preserve"> PAGEREF _Toc241040012 \h </w:instrText>
+          <w:instrText xml:space="preserve"> PAGEREF _Toc241099437 \h </w:instrText>
         </w:r>
         <w:r>
           <w:rPr>
@@ -1095,7 +1090,7 @@
           <w14:ligatures w14:val="standardContextual"/>
         </w:rPr>
       </w:pPr>
-      <w:hyperlink w:anchor="_Toc241040013" w:history="1">
+      <w:hyperlink w:anchor="_Toc241099438" w:history="1">
         <w:r>
           <w:rPr>
             <w:rStyle w:val="aff1"/>
@@ -1122,7 +1117,7 @@
             <w:noProof/>
             <w:webHidden/>
           </w:rPr>
-          <w:instrText xml:space="preserve"> PAGEREF _Toc241040013 \h </w:instrText>
+          <w:instrText xml:space="preserve"> PAGEREF _Toc241099438 \h </w:instrText>
         </w:r>
         <w:r>
           <w:rPr>
@@ -1171,7 +1166,7 @@
           <w14:ligatures w14:val="standardContextual"/>
         </w:rPr>
       </w:pPr>
-      <w:hyperlink w:anchor="_Toc241040014" w:history="1">
+      <w:hyperlink w:anchor="_Toc241099439" w:history="1">
         <w:r>
           <w:rPr>
             <w:rStyle w:val="aff1"/>
@@ -1198,7 +1193,7 @@
             <w:noProof/>
             <w:webHidden/>
           </w:rPr>
-          <w:instrText xml:space="preserve"> PAGEREF _Toc241040014 \h </w:instrText>
+          <w:instrText xml:space="preserve"> PAGEREF _Toc241099439 \h </w:instrText>
         </w:r>
         <w:r>
           <w:rPr>
@@ -1247,7 +1242,7 @@
           <w14:ligatures w14:val="standardContextual"/>
         </w:rPr>
       </w:pPr>
-      <w:hyperlink w:anchor="_Toc241040015" w:history="1">
+      <w:hyperlink w:anchor="_Toc241099440" w:history="1">
         <w:r>
           <w:rPr>
             <w:rStyle w:val="aff1"/>
@@ -1274,7 +1269,7 @@
             <w:noProof/>
             <w:webHidden/>
           </w:rPr>
-          <w:instrText xml:space="preserve"> PAGEREF _Toc241040015 \h </w:instrText>
+          <w:instrText xml:space="preserve"> PAGEREF _Toc241099440 \h </w:instrText>
         </w:r>
         <w:r>
           <w:rPr>
@@ -1323,7 +1318,7 @@
           <w14:ligatures w14:val="standardContextual"/>
         </w:rPr>
       </w:pPr>
-      <w:hyperlink w:anchor="_Toc241040016" w:history="1">
+      <w:hyperlink w:anchor="_Toc241099441" w:history="1">
         <w:r>
           <w:rPr>
             <w:rStyle w:val="aff1"/>
@@ -1350,7 +1345,7 @@
             <w:noProof/>
             <w:webHidden/>
           </w:rPr>
-          <w:instrText xml:space="preserve"> PAGEREF _Toc241040016 \h </w:instrText>
+          <w:instrText xml:space="preserve"> PAGEREF _Toc241099441 \h </w:instrText>
         </w:r>
         <w:r>
           <w:rPr>
@@ -1399,7 +1394,7 @@
           <w14:ligatures w14:val="standardContextual"/>
         </w:rPr>
       </w:pPr>
-      <w:hyperlink w:anchor="_Toc241040017" w:history="1">
+      <w:hyperlink w:anchor="_Toc241099442" w:history="1">
         <w:r>
           <w:rPr>
             <w:rStyle w:val="aff1"/>
@@ -1426,7 +1421,7 @@
             <w:noProof/>
             <w:webHidden/>
           </w:rPr>
-          <w:instrText xml:space="preserve"> PAGEREF _Toc241040017 \h </w:instrText>
+          <w:instrText xml:space="preserve"> PAGEREF _Toc241099442 \h </w:instrText>
         </w:r>
         <w:r>
           <w:rPr>
@@ -1475,7 +1470,7 @@
           <w14:ligatures w14:val="standardContextual"/>
         </w:rPr>
       </w:pPr>
-      <w:hyperlink w:anchor="_Toc241040018" w:history="1">
+      <w:hyperlink w:anchor="_Toc241099443" w:history="1">
         <w:r>
           <w:rPr>
             <w:rStyle w:val="aff1"/>
@@ -1502,7 +1497,7 @@
             <w:noProof/>
             <w:webHidden/>
           </w:rPr>
-          <w:instrText xml:space="preserve"> PAGEREF _Toc241040018 \h </w:instrText>
+          <w:instrText xml:space="preserve"> PAGEREF _Toc241099443 \h </w:instrText>
         </w:r>
         <w:r>
           <w:rPr>
@@ -1550,7 +1545,7 @@
           <w14:ligatures w14:val="standardContextual"/>
         </w:rPr>
       </w:pPr>
-      <w:hyperlink w:anchor="_Toc241040019" w:history="1">
+      <w:hyperlink w:anchor="_Toc241099444" w:history="1">
         <w:r>
           <w:rPr>
             <w:rStyle w:val="aff1"/>
@@ -1577,7 +1572,7 @@
             <w:noProof/>
             <w:webHidden/>
           </w:rPr>
-          <w:instrText xml:space="preserve"> PAGEREF _Toc241040019 \h </w:instrText>
+          <w:instrText xml:space="preserve"> PAGEREF _Toc241099444 \h </w:instrText>
         </w:r>
         <w:r>
           <w:rPr>
@@ -1626,7 +1621,7 @@
           <w14:ligatures w14:val="standardContextual"/>
         </w:rPr>
       </w:pPr>
-      <w:hyperlink w:anchor="_Toc241040020" w:history="1">
+      <w:hyperlink w:anchor="_Toc241099445" w:history="1">
         <w:r>
           <w:rPr>
             <w:rStyle w:val="aff1"/>
@@ -1653,7 +1648,7 @@
             <w:noProof/>
             <w:webHidden/>
           </w:rPr>
-          <w:instrText xml:space="preserve"> PAGEREF _Toc241040020 \h </w:instrText>
+          <w:instrText xml:space="preserve"> PAGEREF _Toc241099445 \h </w:instrText>
         </w:r>
         <w:r>
           <w:rPr>
@@ -1702,7 +1697,7 @@
           <w14:ligatures w14:val="standardContextual"/>
         </w:rPr>
       </w:pPr>
-      <w:hyperlink w:anchor="_Toc241040021" w:history="1">
+      <w:hyperlink w:anchor="_Toc241099446" w:history="1">
         <w:r>
           <w:rPr>
             <w:rStyle w:val="aff1"/>
@@ -1729,7 +1724,7 @@
             <w:noProof/>
             <w:webHidden/>
           </w:rPr>
-          <w:instrText xml:space="preserve"> PAGEREF _Toc241040021 \h </w:instrText>
+          <w:instrText xml:space="preserve"> PAGEREF _Toc241099446 \h </w:instrText>
         </w:r>
         <w:r>
           <w:rPr>
@@ -1778,7 +1773,7 @@
           <w14:ligatures w14:val="standardContextual"/>
         </w:rPr>
       </w:pPr>
-      <w:hyperlink w:anchor="_Toc241040022" w:history="1">
+      <w:hyperlink w:anchor="_Toc241099447" w:history="1">
         <w:r>
           <w:rPr>
             <w:rStyle w:val="aff1"/>
@@ -1805,7 +1800,7 @@
             <w:noProof/>
             <w:webHidden/>
           </w:rPr>
-          <w:instrText xml:space="preserve"> PAGEREF _Toc241040022 \h </w:instrText>
+          <w:instrText xml:space="preserve"> PAGEREF _Toc241099447 \h </w:instrText>
         </w:r>
         <w:r>
           <w:rPr>
@@ -1854,7 +1849,7 @@
           <w14:ligatures w14:val="standardContextual"/>
         </w:rPr>
       </w:pPr>
-      <w:hyperlink w:anchor="_Toc241040023" w:history="1">
+      <w:hyperlink w:anchor="_Toc241099448" w:history="1">
         <w:r>
           <w:rPr>
             <w:rStyle w:val="aff1"/>
@@ -1881,7 +1876,7 @@
             <w:noProof/>
             <w:webHidden/>
           </w:rPr>
-          <w:instrText xml:space="preserve"> PAGEREF _Toc241040023 \h </w:instrText>
+          <w:instrText xml:space="preserve"> PAGEREF _Toc241099448 \h </w:instrText>
         </w:r>
         <w:r>
           <w:rPr>
@@ -1930,7 +1925,7 @@
           <w14:ligatures w14:val="standardContextual"/>
         </w:rPr>
       </w:pPr>
-      <w:hyperlink w:anchor="_Toc241040024" w:history="1">
+      <w:hyperlink w:anchor="_Toc241099449" w:history="1">
         <w:r>
           <w:rPr>
             <w:rStyle w:val="aff1"/>
@@ -1957,7 +1952,7 @@
             <w:noProof/>
             <w:webHidden/>
           </w:rPr>
-          <w:instrText xml:space="preserve"> PAGEREF _Toc241040024 \h </w:instrText>
+          <w:instrText xml:space="preserve"> PAGEREF _Toc241099449 \h </w:instrText>
         </w:r>
         <w:r>
           <w:rPr>
@@ -2006,7 +2001,7 @@
           <w14:ligatures w14:val="standardContextual"/>
         </w:rPr>
       </w:pPr>
-      <w:hyperlink w:anchor="_Toc241040025" w:history="1">
+      <w:hyperlink w:anchor="_Toc241099450" w:history="1">
         <w:r>
           <w:rPr>
             <w:rStyle w:val="aff1"/>
@@ -2033,7 +2028,7 @@
             <w:noProof/>
             <w:webHidden/>
           </w:rPr>
-          <w:instrText xml:space="preserve"> PAGEREF _Toc241040025 \h </w:instrText>
+          <w:instrText xml:space="preserve"> PAGEREF _Toc241099450 \h </w:instrText>
         </w:r>
         <w:r>
           <w:rPr>
@@ -2081,7 +2076,7 @@
           <w14:ligatures w14:val="standardContextual"/>
         </w:rPr>
       </w:pPr>
-      <w:hyperlink w:anchor="_Toc241040026" w:history="1">
+      <w:hyperlink w:anchor="_Toc241099451" w:history="1">
         <w:r>
           <w:rPr>
             <w:rStyle w:val="aff1"/>
@@ -2108,7 +2103,7 @@
             <w:noProof/>
             <w:webHidden/>
           </w:rPr>
-          <w:instrText xml:space="preserve"> PAGEREF _Toc241040026 \h </w:instrText>
+          <w:instrText xml:space="preserve"> PAGEREF _Toc241099451 \h </w:instrText>
         </w:r>
         <w:r>
           <w:rPr>
@@ -2157,7 +2152,7 @@
           <w14:ligatures w14:val="standardContextual"/>
         </w:rPr>
       </w:pPr>
-      <w:hyperlink w:anchor="_Toc241040027" w:history="1">
+      <w:hyperlink w:anchor="_Toc241099452" w:history="1">
         <w:r>
           <w:rPr>
             <w:rStyle w:val="aff1"/>
@@ -2184,7 +2179,7 @@
             <w:noProof/>
             <w:webHidden/>
           </w:rPr>
-          <w:instrText xml:space="preserve"> PAGEREF _Toc241040027 \h </w:instrText>
+          <w:instrText xml:space="preserve"> PAGEREF _Toc241099452 \h </w:instrText>
         </w:r>
         <w:r>
           <w:rPr>
@@ -2233,7 +2228,7 @@
           <w14:ligatures w14:val="standardContextual"/>
         </w:rPr>
       </w:pPr>
-      <w:hyperlink w:anchor="_Toc241040028" w:history="1">
+      <w:hyperlink w:anchor="_Toc241099453" w:history="1">
         <w:r>
           <w:rPr>
             <w:rStyle w:val="aff1"/>
@@ -2260,7 +2255,7 @@
             <w:noProof/>
             <w:webHidden/>
           </w:rPr>
-          <w:instrText xml:space="preserve"> PAGEREF _Toc241040028 \h </w:instrText>
+          <w:instrText xml:space="preserve"> PAGEREF _Toc241099453 \h </w:instrText>
         </w:r>
         <w:r>
           <w:rPr>
@@ -2309,7 +2304,7 @@
           <w14:ligatures w14:val="standardContextual"/>
         </w:rPr>
       </w:pPr>
-      <w:hyperlink w:anchor="_Toc241040029" w:history="1">
+      <w:hyperlink w:anchor="_Toc241099454" w:history="1">
         <w:r>
           <w:rPr>
             <w:rStyle w:val="aff1"/>
@@ -2336,7 +2331,7 @@
             <w:noProof/>
             <w:webHidden/>
           </w:rPr>
-          <w:instrText xml:space="preserve"> PAGEREF _Toc241040029 \h </w:instrText>
+          <w:instrText xml:space="preserve"> PAGEREF _Toc241099454 \h </w:instrText>
         </w:r>
         <w:r>
           <w:rPr>
@@ -2385,7 +2380,7 @@
           <w14:ligatures w14:val="standardContextual"/>
         </w:rPr>
       </w:pPr>
-      <w:hyperlink w:anchor="_Toc241040030" w:history="1">
+      <w:hyperlink w:anchor="_Toc241099455" w:history="1">
         <w:r>
           <w:rPr>
             <w:rStyle w:val="aff1"/>
@@ -2412,7 +2407,7 @@
             <w:noProof/>
             <w:webHidden/>
           </w:rPr>
-          <w:instrText xml:space="preserve"> PAGEREF _Toc241040030 \h </w:instrText>
+          <w:instrText xml:space="preserve"> PAGEREF _Toc241099455 \h </w:instrText>
         </w:r>
         <w:r>
           <w:rPr>
@@ -2461,7 +2456,7 @@
           <w14:ligatures w14:val="standardContextual"/>
         </w:rPr>
       </w:pPr>
-      <w:hyperlink w:anchor="_Toc241040031" w:history="1">
+      <w:hyperlink w:anchor="_Toc241099456" w:history="1">
         <w:r>
           <w:rPr>
             <w:rStyle w:val="aff1"/>
@@ -2488,7 +2483,7 @@
             <w:noProof/>
             <w:webHidden/>
           </w:rPr>
-          <w:instrText xml:space="preserve"> PAGEREF _Toc241040031 \h </w:instrText>
+          <w:instrText xml:space="preserve"> PAGEREF _Toc241099456 \h </w:instrText>
         </w:r>
         <w:r>
           <w:rPr>
@@ -2537,7 +2532,7 @@
           <w14:ligatures w14:val="standardContextual"/>
         </w:rPr>
       </w:pPr>
-      <w:hyperlink w:anchor="_Toc241040032" w:history="1">
+      <w:hyperlink w:anchor="_Toc241099457" w:history="1">
         <w:r>
           <w:rPr>
             <w:rStyle w:val="aff1"/>
@@ -2564,7 +2559,7 @@
             <w:noProof/>
             <w:webHidden/>
           </w:rPr>
-          <w:instrText xml:space="preserve"> PAGEREF _Toc241040032 \h </w:instrText>
+          <w:instrText xml:space="preserve"> PAGEREF _Toc241099457 \h </w:instrText>
         </w:r>
         <w:r>
           <w:rPr>
@@ -2612,7 +2607,7 @@
           <w14:ligatures w14:val="standardContextual"/>
         </w:rPr>
       </w:pPr>
-      <w:hyperlink w:anchor="_Toc241040033" w:history="1">
+      <w:hyperlink w:anchor="_Toc241099458" w:history="1">
         <w:r>
           <w:rPr>
             <w:rStyle w:val="aff1"/>
@@ -2639,7 +2634,7 @@
             <w:noProof/>
             <w:webHidden/>
           </w:rPr>
-          <w:instrText xml:space="preserve"> PAGEREF _Toc241040033 \h </w:instrText>
+          <w:instrText xml:space="preserve"> PAGEREF _Toc241099458 \h </w:instrText>
         </w:r>
         <w:r>
           <w:rPr>
@@ -2688,7 +2683,7 @@
           <w14:ligatures w14:val="standardContextual"/>
         </w:rPr>
       </w:pPr>
-      <w:hyperlink w:anchor="_Toc241040034" w:history="1">
+      <w:hyperlink w:anchor="_Toc241099459" w:history="1">
         <w:r>
           <w:rPr>
             <w:rStyle w:val="aff1"/>
@@ -2715,7 +2710,7 @@
             <w:noProof/>
             <w:webHidden/>
           </w:rPr>
-          <w:instrText xml:space="preserve"> PAGEREF _Toc241040034 \h </w:instrText>
+          <w:instrText xml:space="preserve"> PAGEREF _Toc241099459 \h </w:instrText>
         </w:r>
         <w:r>
           <w:rPr>
@@ -2764,7 +2759,7 @@
           <w14:ligatures w14:val="standardContextual"/>
         </w:rPr>
       </w:pPr>
-      <w:hyperlink w:anchor="_Toc241040035" w:history="1">
+      <w:hyperlink w:anchor="_Toc241099460" w:history="1">
         <w:r>
           <w:rPr>
             <w:rStyle w:val="aff1"/>
@@ -2791,7 +2786,7 @@
             <w:noProof/>
             <w:webHidden/>
           </w:rPr>
-          <w:instrText xml:space="preserve"> PAGEREF _Toc241040035 \h </w:instrText>
+          <w:instrText xml:space="preserve"> PAGEREF _Toc241099460 \h </w:instrText>
         </w:r>
         <w:r>
           <w:rPr>
@@ -2840,7 +2835,7 @@
           <w14:ligatures w14:val="standardContextual"/>
         </w:rPr>
       </w:pPr>
-      <w:hyperlink w:anchor="_Toc241040036" w:history="1">
+      <w:hyperlink w:anchor="_Toc241099461" w:history="1">
         <w:r>
           <w:rPr>
             <w:rStyle w:val="aff1"/>
@@ -2867,7 +2862,7 @@
             <w:noProof/>
             <w:webHidden/>
           </w:rPr>
-          <w:instrText xml:space="preserve"> PAGEREF _Toc241040036 \h </w:instrText>
+          <w:instrText xml:space="preserve"> PAGEREF _Toc241099461 \h </w:instrText>
         </w:r>
         <w:r>
           <w:rPr>
@@ -2916,7 +2911,7 @@
           <w14:ligatures w14:val="standardContextual"/>
         </w:rPr>
       </w:pPr>
-      <w:hyperlink w:anchor="_Toc241040037" w:history="1">
+      <w:hyperlink w:anchor="_Toc241099462" w:history="1">
         <w:r>
           <w:rPr>
             <w:rStyle w:val="aff1"/>
@@ -2943,7 +2938,7 @@
             <w:noProof/>
             <w:webHidden/>
           </w:rPr>
-          <w:instrText xml:space="preserve"> PAGEREF _Toc241040037 \h </w:instrText>
+          <w:instrText xml:space="preserve"> PAGEREF _Toc241099462 \h </w:instrText>
         </w:r>
         <w:r>
           <w:rPr>
@@ -2992,7 +2987,7 @@
           <w14:ligatures w14:val="standardContextual"/>
         </w:rPr>
       </w:pPr>
-      <w:hyperlink w:anchor="_Toc241040038" w:history="1">
+      <w:hyperlink w:anchor="_Toc241099463" w:history="1">
         <w:r>
           <w:rPr>
             <w:rStyle w:val="aff1"/>
@@ -3019,7 +3014,7 @@
             <w:noProof/>
             <w:webHidden/>
           </w:rPr>
-          <w:instrText xml:space="preserve"> PAGEREF _Toc241040038 \h </w:instrText>
+          <w:instrText xml:space="preserve"> PAGEREF _Toc241099463 \h </w:instrText>
         </w:r>
         <w:r>
           <w:rPr>
@@ -3068,7 +3063,7 @@
           <w14:ligatures w14:val="standardContextual"/>
         </w:rPr>
       </w:pPr>
-      <w:hyperlink w:anchor="_Toc241040039" w:history="1">
+      <w:hyperlink w:anchor="_Toc241099464" w:history="1">
         <w:r>
           <w:rPr>
             <w:rStyle w:val="aff1"/>
@@ -3095,7 +3090,7 @@
             <w:noProof/>
             <w:webHidden/>
           </w:rPr>
-          <w:instrText xml:space="preserve"> PAGEREF _Toc241040039 \h </w:instrText>
+          <w:instrText xml:space="preserve"> PAGEREF _Toc241099464 \h </w:instrText>
         </w:r>
         <w:r>
           <w:rPr>
@@ -3143,7 +3138,7 @@
           <w14:ligatures w14:val="standardContextual"/>
         </w:rPr>
       </w:pPr>
-      <w:hyperlink w:anchor="_Toc241040040" w:history="1">
+      <w:hyperlink w:anchor="_Toc241099465" w:history="1">
         <w:r>
           <w:rPr>
             <w:rStyle w:val="aff1"/>
@@ -3170,7 +3165,7 @@
             <w:noProof/>
             <w:webHidden/>
           </w:rPr>
-          <w:instrText xml:space="preserve"> PAGEREF _Toc241040040 \h </w:instrText>
+          <w:instrText xml:space="preserve"> PAGEREF _Toc241099465 \h </w:instrText>
         </w:r>
         <w:r>
           <w:rPr>
@@ -3219,7 +3214,7 @@
           <w14:ligatures w14:val="standardContextual"/>
         </w:rPr>
       </w:pPr>
-      <w:hyperlink w:anchor="_Toc241040041" w:history="1">
+      <w:hyperlink w:anchor="_Toc241099466" w:history="1">
         <w:r>
           <w:rPr>
             <w:rStyle w:val="aff1"/>
@@ -3246,7 +3241,7 @@
             <w:noProof/>
             <w:webHidden/>
           </w:rPr>
-          <w:instrText xml:space="preserve"> PAGEREF _Toc241040041 \h </w:instrText>
+          <w:instrText xml:space="preserve"> PAGEREF _Toc241099466 \h </w:instrText>
         </w:r>
         <w:r>
           <w:rPr>
@@ -3295,7 +3290,7 @@
           <w14:ligatures w14:val="standardContextual"/>
         </w:rPr>
       </w:pPr>
-      <w:hyperlink w:anchor="_Toc241040042" w:history="1">
+      <w:hyperlink w:anchor="_Toc241099467" w:history="1">
         <w:r>
           <w:rPr>
             <w:rStyle w:val="aff1"/>
@@ -3322,7 +3317,7 @@
             <w:noProof/>
             <w:webHidden/>
           </w:rPr>
-          <w:instrText xml:space="preserve"> PAGEREF _Toc241040042 \h </w:instrText>
+          <w:instrText xml:space="preserve"> PAGEREF _Toc241099467 \h </w:instrText>
         </w:r>
         <w:r>
           <w:rPr>
@@ -3371,7 +3366,7 @@
           <w14:ligatures w14:val="standardContextual"/>
         </w:rPr>
       </w:pPr>
-      <w:hyperlink w:anchor="_Toc241040043" w:history="1">
+      <w:hyperlink w:anchor="_Toc241099468" w:history="1">
         <w:r>
           <w:rPr>
             <w:rStyle w:val="aff1"/>
@@ -3398,7 +3393,7 @@
             <w:noProof/>
             <w:webHidden/>
           </w:rPr>
-          <w:instrText xml:space="preserve"> PAGEREF _Toc241040043 \h </w:instrText>
+          <w:instrText xml:space="preserve"> PAGEREF _Toc241099468 \h </w:instrText>
         </w:r>
         <w:r>
           <w:rPr>
@@ -3447,7 +3442,7 @@
           <w14:ligatures w14:val="standardContextual"/>
         </w:rPr>
       </w:pPr>
-      <w:hyperlink w:anchor="_Toc241040044" w:history="1">
+      <w:hyperlink w:anchor="_Toc241099469" w:history="1">
         <w:r>
           <w:rPr>
             <w:rStyle w:val="aff1"/>
@@ -3474,7 +3469,7 @@
             <w:noProof/>
             <w:webHidden/>
           </w:rPr>
-          <w:instrText xml:space="preserve"> PAGEREF _Toc241040044 \h </w:instrText>
+          <w:instrText xml:space="preserve"> PAGEREF _Toc241099469 \h </w:instrText>
         </w:r>
         <w:r>
           <w:rPr>
@@ -3523,7 +3518,7 @@
           <w14:ligatures w14:val="standardContextual"/>
         </w:rPr>
       </w:pPr>
-      <w:hyperlink w:anchor="_Toc241040045" w:history="1">
+      <w:hyperlink w:anchor="_Toc241099470" w:history="1">
         <w:r>
           <w:rPr>
             <w:rStyle w:val="aff1"/>
@@ -3550,7 +3545,7 @@
             <w:noProof/>
             <w:webHidden/>
           </w:rPr>
-          <w:instrText xml:space="preserve"> PAGEREF _Toc241040045 \h </w:instrText>
+          <w:instrText xml:space="preserve"> PAGEREF _Toc241099470 \h </w:instrText>
         </w:r>
         <w:r>
           <w:rPr>
@@ -3599,7 +3594,7 @@
           <w14:ligatures w14:val="standardContextual"/>
         </w:rPr>
       </w:pPr>
-      <w:hyperlink w:anchor="_Toc241040046" w:history="1">
+      <w:hyperlink w:anchor="_Toc241099471" w:history="1">
         <w:r>
           <w:rPr>
             <w:rStyle w:val="aff1"/>
@@ -3626,7 +3621,7 @@
             <w:noProof/>
             <w:webHidden/>
           </w:rPr>
-          <w:instrText xml:space="preserve"> PAGEREF _Toc241040046 \h </w:instrText>
+          <w:instrText xml:space="preserve"> PAGEREF _Toc241099471 \h </w:instrText>
         </w:r>
         <w:r>
           <w:rPr>
@@ -3675,7 +3670,7 @@
           <w14:ligatures w14:val="standardContextual"/>
         </w:rPr>
       </w:pPr>
-      <w:hyperlink w:anchor="_Toc241040047" w:history="1">
+      <w:hyperlink w:anchor="_Toc241099472" w:history="1">
         <w:r>
           <w:rPr>
             <w:rStyle w:val="aff1"/>
@@ -3702,7 +3697,7 @@
             <w:noProof/>
             <w:webHidden/>
           </w:rPr>
-          <w:instrText xml:space="preserve"> PAGEREF _Toc241040047 \h </w:instrText>
+          <w:instrText xml:space="preserve"> PAGEREF _Toc241099472 \h </w:instrText>
         </w:r>
         <w:r>
           <w:rPr>
@@ -3751,7 +3746,7 @@
           <w14:ligatures w14:val="standardContextual"/>
         </w:rPr>
       </w:pPr>
-      <w:hyperlink w:anchor="_Toc241040048" w:history="1">
+      <w:hyperlink w:anchor="_Toc241099473" w:history="1">
         <w:r>
           <w:rPr>
             <w:rStyle w:val="aff1"/>
@@ -3778,7 +3773,7 @@
             <w:noProof/>
             <w:webHidden/>
           </w:rPr>
-          <w:instrText xml:space="preserve"> PAGEREF _Toc241040048 \h </w:instrText>
+          <w:instrText xml:space="preserve"> PAGEREF _Toc241099473 \h </w:instrText>
         </w:r>
         <w:r>
           <w:rPr>
@@ -3827,7 +3822,7 @@
           <w14:ligatures w14:val="standardContextual"/>
         </w:rPr>
       </w:pPr>
-      <w:hyperlink w:anchor="_Toc241040049" w:history="1">
+      <w:hyperlink w:anchor="_Toc241099474" w:history="1">
         <w:r>
           <w:rPr>
             <w:rStyle w:val="aff1"/>
@@ -3854,7 +3849,7 @@
             <w:noProof/>
             <w:webHidden/>
           </w:rPr>
-          <w:instrText xml:space="preserve"> PAGEREF _Toc241040049 \h </w:instrText>
+          <w:instrText xml:space="preserve"> PAGEREF _Toc241099474 \h </w:instrText>
         </w:r>
         <w:r>
           <w:rPr>
@@ -3902,7 +3897,7 @@
           <w14:ligatures w14:val="standardContextual"/>
         </w:rPr>
       </w:pPr>
-      <w:hyperlink w:anchor="_Toc241040050" w:history="1">
+      <w:hyperlink w:anchor="_Toc241099475" w:history="1">
         <w:r>
           <w:rPr>
             <w:rStyle w:val="aff1"/>
@@ -3929,7 +3924,7 @@
             <w:noProof/>
             <w:webHidden/>
           </w:rPr>
-          <w:instrText xml:space="preserve"> PAGEREF _Toc241040050 \h </w:instrText>
+          <w:instrText xml:space="preserve"> PAGEREF _Toc241099475 \h </w:instrText>
         </w:r>
         <w:r>
           <w:rPr>
@@ -3978,7 +3973,7 @@
           <w14:ligatures w14:val="standardContextual"/>
         </w:rPr>
       </w:pPr>
-      <w:hyperlink w:anchor="_Toc241040051" w:history="1">
+      <w:hyperlink w:anchor="_Toc241099476" w:history="1">
         <w:r>
           <w:rPr>
             <w:rStyle w:val="aff1"/>
@@ -4005,7 +4000,7 @@
             <w:noProof/>
             <w:webHidden/>
           </w:rPr>
-          <w:instrText xml:space="preserve"> PAGEREF _Toc241040051 \h </w:instrText>
+          <w:instrText xml:space="preserve"> PAGEREF _Toc241099476 \h </w:instrText>
         </w:r>
         <w:r>
           <w:rPr>
@@ -4054,7 +4049,7 @@
           <w14:ligatures w14:val="standardContextual"/>
         </w:rPr>
       </w:pPr>
-      <w:hyperlink w:anchor="_Toc241040052" w:history="1">
+      <w:hyperlink w:anchor="_Toc241099477" w:history="1">
         <w:r>
           <w:rPr>
             <w:rStyle w:val="aff1"/>
@@ -4081,7 +4076,7 @@
             <w:noProof/>
             <w:webHidden/>
           </w:rPr>
-          <w:instrText xml:space="preserve"> PAGEREF _Toc241040052 \h </w:instrText>
+          <w:instrText xml:space="preserve"> PAGEREF _Toc241099477 \h </w:instrText>
         </w:r>
         <w:r>
           <w:rPr>
@@ -4130,7 +4125,7 @@
           <w14:ligatures w14:val="standardContextual"/>
         </w:rPr>
       </w:pPr>
-      <w:hyperlink w:anchor="_Toc241040053" w:history="1">
+      <w:hyperlink w:anchor="_Toc241099478" w:history="1">
         <w:r>
           <w:rPr>
             <w:rStyle w:val="aff1"/>
@@ -4157,7 +4152,7 @@
             <w:noProof/>
             <w:webHidden/>
           </w:rPr>
-          <w:instrText xml:space="preserve"> PAGEREF _Toc241040053 \h </w:instrText>
+          <w:instrText xml:space="preserve"> PAGEREF _Toc241099478 \h </w:instrText>
         </w:r>
         <w:r>
           <w:rPr>
@@ -4206,7 +4201,7 @@
           <w14:ligatures w14:val="standardContextual"/>
         </w:rPr>
       </w:pPr>
-      <w:hyperlink w:anchor="_Toc241040054" w:history="1">
+      <w:hyperlink w:anchor="_Toc241099479" w:history="1">
         <w:r>
           <w:rPr>
             <w:rStyle w:val="aff1"/>
@@ -4233,7 +4228,7 @@
             <w:noProof/>
             <w:webHidden/>
           </w:rPr>
-          <w:instrText xml:space="preserve"> PAGEREF _Toc241040054 \h </w:instrText>
+          <w:instrText xml:space="preserve"> PAGEREF _Toc241099479 \h </w:instrText>
         </w:r>
         <w:r>
           <w:rPr>
@@ -4282,7 +4277,7 @@
           <w14:ligatures w14:val="standardContextual"/>
         </w:rPr>
       </w:pPr>
-      <w:hyperlink w:anchor="_Toc241040055" w:history="1">
+      <w:hyperlink w:anchor="_Toc241099480" w:history="1">
         <w:r>
           <w:rPr>
             <w:rStyle w:val="aff1"/>
@@ -4309,7 +4304,7 @@
             <w:noProof/>
             <w:webHidden/>
           </w:rPr>
-          <w:instrText xml:space="preserve"> PAGEREF _Toc241040055 \h </w:instrText>
+          <w:instrText xml:space="preserve"> PAGEREF _Toc241099480 \h </w:instrText>
         </w:r>
         <w:r>
           <w:rPr>
@@ -4358,7 +4353,7 @@
           <w14:ligatures w14:val="standardContextual"/>
         </w:rPr>
       </w:pPr>
-      <w:hyperlink w:anchor="_Toc241040056" w:history="1">
+      <w:hyperlink w:anchor="_Toc241099481" w:history="1">
         <w:r>
           <w:rPr>
             <w:rStyle w:val="aff1"/>
@@ -4385,7 +4380,7 @@
             <w:noProof/>
             <w:webHidden/>
           </w:rPr>
-          <w:instrText xml:space="preserve"> PAGEREF _Toc241040056 \h </w:instrText>
+          <w:instrText xml:space="preserve"> PAGEREF _Toc241099481 \h </w:instrText>
         </w:r>
         <w:r>
           <w:rPr>
@@ -4434,7 +4429,7 @@
           <w14:ligatures w14:val="standardContextual"/>
         </w:rPr>
       </w:pPr>
-      <w:hyperlink w:anchor="_Toc241040057" w:history="1">
+      <w:hyperlink w:anchor="_Toc241099482" w:history="1">
         <w:r>
           <w:rPr>
             <w:rStyle w:val="aff1"/>
@@ -4461,7 +4456,7 @@
             <w:noProof/>
             <w:webHidden/>
           </w:rPr>
-          <w:instrText xml:space="preserve"> PAGEREF _Toc241040057 \h </w:instrText>
+          <w:instrText xml:space="preserve"> PAGEREF _Toc241099482 \h </w:instrText>
         </w:r>
         <w:r>
           <w:rPr>
@@ -4510,7 +4505,7 @@
           <w14:ligatures w14:val="standardContextual"/>
         </w:rPr>
       </w:pPr>
-      <w:hyperlink w:anchor="_Toc241040058" w:history="1">
+      <w:hyperlink w:anchor="_Toc241099483" w:history="1">
         <w:r>
           <w:rPr>
             <w:rStyle w:val="aff1"/>
@@ -4537,7 +4532,7 @@
             <w:noProof/>
             <w:webHidden/>
           </w:rPr>
-          <w:instrText xml:space="preserve"> PAGEREF _Toc241040058 \h </w:instrText>
+          <w:instrText xml:space="preserve"> PAGEREF _Toc241099483 \h </w:instrText>
         </w:r>
         <w:r>
           <w:rPr>
@@ -4586,7 +4581,7 @@
           <w14:ligatures w14:val="standardContextual"/>
         </w:rPr>
       </w:pPr>
-      <w:hyperlink w:anchor="_Toc241040059" w:history="1">
+      <w:hyperlink w:anchor="_Toc241099484" w:history="1">
         <w:r>
           <w:rPr>
             <w:rStyle w:val="aff1"/>
@@ -4613,7 +4608,7 @@
             <w:noProof/>
             <w:webHidden/>
           </w:rPr>
-          <w:instrText xml:space="preserve"> PAGEREF _Toc241040059 \h </w:instrText>
+          <w:instrText xml:space="preserve"> PAGEREF _Toc241099484 \h </w:instrText>
         </w:r>
         <w:r>
           <w:rPr>
@@ -4661,7 +4656,7 @@
           <w14:ligatures w14:val="standardContextual"/>
         </w:rPr>
       </w:pPr>
-      <w:hyperlink w:anchor="_Toc241040060" w:history="1">
+      <w:hyperlink w:anchor="_Toc241099485" w:history="1">
         <w:r>
           <w:rPr>
             <w:rStyle w:val="aff1"/>
@@ -4688,7 +4683,7 @@
             <w:noProof/>
             <w:webHidden/>
           </w:rPr>
-          <w:instrText xml:space="preserve"> PAGEREF _Toc241040060 \h </w:instrText>
+          <w:instrText xml:space="preserve"> PAGEREF _Toc241099485 \h </w:instrText>
         </w:r>
         <w:r>
           <w:rPr>
@@ -4737,7 +4732,7 @@
           <w14:ligatures w14:val="standardContextual"/>
         </w:rPr>
       </w:pPr>
-      <w:hyperlink w:anchor="_Toc241040061" w:history="1">
+      <w:hyperlink w:anchor="_Toc241099486" w:history="1">
         <w:r>
           <w:rPr>
             <w:rStyle w:val="aff1"/>
@@ -4764,7 +4759,7 @@
             <w:noProof/>
             <w:webHidden/>
           </w:rPr>
-          <w:instrText xml:space="preserve"> PAGEREF _Toc241040061 \h </w:instrText>
+          <w:instrText xml:space="preserve"> PAGEREF _Toc241099486 \h </w:instrText>
         </w:r>
         <w:r>
           <w:rPr>
@@ -4813,7 +4808,7 @@
           <w14:ligatures w14:val="standardContextual"/>
         </w:rPr>
       </w:pPr>
-      <w:hyperlink w:anchor="_Toc241040062" w:history="1">
+      <w:hyperlink w:anchor="_Toc241099487" w:history="1">
         <w:r>
           <w:rPr>
             <w:rStyle w:val="aff1"/>
@@ -4840,7 +4835,7 @@
             <w:noProof/>
             <w:webHidden/>
           </w:rPr>
-          <w:instrText xml:space="preserve"> PAGEREF _Toc241040062 \h </w:instrText>
+          <w:instrText xml:space="preserve"> PAGEREF _Toc241099487 \h </w:instrText>
         </w:r>
         <w:r>
           <w:rPr>
@@ -4889,7 +4884,7 @@
           <w14:ligatures w14:val="standardContextual"/>
         </w:rPr>
       </w:pPr>
-      <w:hyperlink w:anchor="_Toc241040063" w:history="1">
+      <w:hyperlink w:anchor="_Toc241099488" w:history="1">
         <w:r>
           <w:rPr>
             <w:rStyle w:val="aff1"/>
@@ -4916,7 +4911,7 @@
             <w:noProof/>
             <w:webHidden/>
           </w:rPr>
-          <w:instrText xml:space="preserve"> PAGEREF _Toc241040063 \h </w:instrText>
+          <w:instrText xml:space="preserve"> PAGEREF _Toc241099488 \h </w:instrText>
         </w:r>
         <w:r>
           <w:rPr>
@@ -4965,7 +4960,7 @@
           <w14:ligatures w14:val="standardContextual"/>
         </w:rPr>
       </w:pPr>
-      <w:hyperlink w:anchor="_Toc241040064" w:history="1">
+      <w:hyperlink w:anchor="_Toc241099489" w:history="1">
         <w:r>
           <w:rPr>
             <w:rStyle w:val="aff1"/>
@@ -4992,7 +4987,7 @@
             <w:noProof/>
             <w:webHidden/>
           </w:rPr>
-          <w:instrText xml:space="preserve"> PAGEREF _Toc241040064 \h </w:instrText>
+          <w:instrText xml:space="preserve"> PAGEREF _Toc241099489 \h </w:instrText>
         </w:r>
         <w:r>
           <w:rPr>
@@ -5041,7 +5036,7 @@
           <w14:ligatures w14:val="standardContextual"/>
         </w:rPr>
       </w:pPr>
-      <w:hyperlink w:anchor="_Toc241040065" w:history="1">
+      <w:hyperlink w:anchor="_Toc241099490" w:history="1">
         <w:r>
           <w:rPr>
             <w:rStyle w:val="aff1"/>
@@ -5068,7 +5063,7 @@
             <w:noProof/>
             <w:webHidden/>
           </w:rPr>
-          <w:instrText xml:space="preserve"> PAGEREF _Toc241040065 \h </w:instrText>
+          <w:instrText xml:space="preserve"> PAGEREF _Toc241099490 \h </w:instrText>
         </w:r>
         <w:r>
           <w:rPr>
@@ -5117,7 +5112,7 @@
           <w14:ligatures w14:val="standardContextual"/>
         </w:rPr>
       </w:pPr>
-      <w:hyperlink w:anchor="_Toc241040066" w:history="1">
+      <w:hyperlink w:anchor="_Toc241099491" w:history="1">
         <w:r>
           <w:rPr>
             <w:rStyle w:val="aff1"/>
@@ -5144,7 +5139,7 @@
             <w:noProof/>
             <w:webHidden/>
           </w:rPr>
-          <w:instrText xml:space="preserve"> PAGEREF _Toc241040066 \h </w:instrText>
+          <w:instrText xml:space="preserve"> PAGEREF _Toc241099491 \h </w:instrText>
         </w:r>
         <w:r>
           <w:rPr>
@@ -5193,7 +5188,7 @@
           <w14:ligatures w14:val="standardContextual"/>
         </w:rPr>
       </w:pPr>
-      <w:hyperlink w:anchor="_Toc241040067" w:history="1">
+      <w:hyperlink w:anchor="_Toc241099492" w:history="1">
         <w:r>
           <w:rPr>
             <w:rStyle w:val="aff1"/>
@@ -5220,7 +5215,7 @@
             <w:noProof/>
             <w:webHidden/>
           </w:rPr>
-          <w:instrText xml:space="preserve"> PAGEREF _Toc241040067 \h </w:instrText>
+          <w:instrText xml:space="preserve"> PAGEREF _Toc241099492 \h </w:instrText>
         </w:r>
         <w:r>
           <w:rPr>
@@ -5268,7 +5263,7 @@
           <w14:ligatures w14:val="standardContextual"/>
         </w:rPr>
       </w:pPr>
-      <w:hyperlink w:anchor="_Toc241040068" w:history="1">
+      <w:hyperlink w:anchor="_Toc241099493" w:history="1">
         <w:r>
           <w:rPr>
             <w:rStyle w:val="aff1"/>
@@ -5295,7 +5290,7 @@
             <w:noProof/>
             <w:webHidden/>
           </w:rPr>
-          <w:instrText xml:space="preserve"> PAGEREF _Toc241040068 \h </w:instrText>
+          <w:instrText xml:space="preserve"> PAGEREF _Toc241099493 \h </w:instrText>
         </w:r>
         <w:r>
           <w:rPr>
@@ -5343,7 +5338,7 @@
           <w14:ligatures w14:val="standardContextual"/>
         </w:rPr>
       </w:pPr>
-      <w:hyperlink w:anchor="_Toc241040069" w:history="1">
+      <w:hyperlink w:anchor="_Toc241099494" w:history="1">
         <w:r>
           <w:rPr>
             <w:rStyle w:val="aff1"/>
@@ -5370,7 +5365,7 @@
             <w:noProof/>
             <w:webHidden/>
           </w:rPr>
-          <w:instrText xml:space="preserve"> PAGEREF _Toc241040069 \h </w:instrText>
+          <w:instrText xml:space="preserve"> PAGEREF _Toc241099494 \h </w:instrText>
         </w:r>
         <w:r>
           <w:rPr>
@@ -5418,7 +5413,7 @@
           <w14:ligatures w14:val="standardContextual"/>
         </w:rPr>
       </w:pPr>
-      <w:hyperlink w:anchor="_Toc241040070" w:history="1">
+      <w:hyperlink w:anchor="_Toc241099495" w:history="1">
         <w:r>
           <w:rPr>
             <w:rStyle w:val="aff1"/>
@@ -5445,7 +5440,7 @@
             <w:noProof/>
             <w:webHidden/>
           </w:rPr>
-          <w:instrText xml:space="preserve"> PAGEREF _Toc241040070 \h </w:instrText>
+          <w:instrText xml:space="preserve"> PAGEREF _Toc241099495 \h </w:instrText>
         </w:r>
         <w:r>
           <w:rPr>
@@ -5495,7 +5490,7 @@
           <w:numId w:val="7"/>
         </w:numPr>
       </w:pPr>
-      <w:bookmarkStart w:id="0" w:name="_Toc241040006"/>
+      <w:bookmarkStart w:id="0" w:name="_Toc241099431"/>
       <w:r>
         <w:lastRenderedPageBreak/>
         <w:t>게임</w:t>
@@ -5528,7 +5523,7 @@
           <w:numId w:val="7"/>
         </w:numPr>
       </w:pPr>
-      <w:bookmarkStart w:id="1" w:name="_Toc241040007"/>
+      <w:bookmarkStart w:id="1" w:name="_Toc241099432"/>
       <w:r>
         <w:t>Executive Summary</w:t>
       </w:r>
@@ -5599,7 +5594,7 @@
           <w:numId w:val="7"/>
         </w:numPr>
       </w:pPr>
-      <w:bookmarkStart w:id="2" w:name="_Toc241040008"/>
+      <w:bookmarkStart w:id="2" w:name="_Toc241099433"/>
       <w:r>
         <w:t>Rev 16 Release Profile</w:t>
       </w:r>
@@ -5623,7 +5618,7 @@
           <w:numId w:val="7"/>
         </w:numPr>
       </w:pPr>
-      <w:bookmarkStart w:id="3" w:name="_Toc241040009"/>
+      <w:bookmarkStart w:id="3" w:name="_Toc241099434"/>
       <w:r>
         <w:t>제품</w:t>
       </w:r>
@@ -5913,7 +5908,7 @@
           <w:numId w:val="7"/>
         </w:numPr>
       </w:pPr>
-      <w:bookmarkStart w:id="4" w:name="_Toc241040010"/>
+      <w:bookmarkStart w:id="4" w:name="_Toc241099435"/>
       <w:r>
         <w:t>디자인</w:t>
       </w:r>
@@ -6283,7 +6278,7 @@
           <w:numId w:val="7"/>
         </w:numPr>
       </w:pPr>
-      <w:bookmarkStart w:id="5" w:name="_Toc241040011"/>
+      <w:bookmarkStart w:id="5" w:name="_Toc241099436"/>
       <w:r>
         <w:t>Target Experience</w:t>
       </w:r>
@@ -6357,7 +6352,7 @@
           <w:numId w:val="7"/>
         </w:numPr>
       </w:pPr>
-      <w:bookmarkStart w:id="6" w:name="_Toc241040012"/>
+      <w:bookmarkStart w:id="6" w:name="_Toc241099437"/>
       <w:r>
         <w:t>명시적</w:t>
       </w:r>
@@ -6629,7 +6624,7 @@
           <w:numId w:val="7"/>
         </w:numPr>
       </w:pPr>
-      <w:bookmarkStart w:id="7" w:name="_Toc241040013"/>
+      <w:bookmarkStart w:id="7" w:name="_Toc241099438"/>
       <w:r>
         <w:lastRenderedPageBreak/>
         <w:t>Contract Run</w:t>
@@ -6665,7 +6660,7 @@
           <w:numId w:val="7"/>
         </w:numPr>
       </w:pPr>
-      <w:bookmarkStart w:id="8" w:name="_Toc241040014"/>
+      <w:bookmarkStart w:id="8" w:name="_Toc241099439"/>
       <w:r>
         <w:t>Core Loop</w:t>
       </w:r>
@@ -7159,7 +7154,7 @@
           <w:numId w:val="7"/>
         </w:numPr>
       </w:pPr>
-      <w:bookmarkStart w:id="9" w:name="_Toc241040015"/>
+      <w:bookmarkStart w:id="9" w:name="_Toc241099440"/>
       <w:r>
         <w:t xml:space="preserve">Contract </w:t>
       </w:r>
@@ -7583,7 +7578,7 @@
           <w:numId w:val="7"/>
         </w:numPr>
       </w:pPr>
-      <w:bookmarkStart w:id="10" w:name="_Toc241040016"/>
+      <w:bookmarkStart w:id="10" w:name="_Toc241099441"/>
       <w:r>
         <w:lastRenderedPageBreak/>
         <w:t>성공</w:t>
@@ -7875,7 +7870,7 @@
           <w:numId w:val="7"/>
         </w:numPr>
       </w:pPr>
-      <w:bookmarkStart w:id="11" w:name="_Toc241040017"/>
+      <w:bookmarkStart w:id="11" w:name="_Toc241099442"/>
       <w:r>
         <w:t>Greed Decision</w:t>
       </w:r>
@@ -8244,7 +8239,7 @@
           <w:numId w:val="7"/>
         </w:numPr>
       </w:pPr>
-      <w:bookmarkStart w:id="12" w:name="_Toc241040018"/>
+      <w:bookmarkStart w:id="12" w:name="_Toc241099443"/>
       <w:r>
         <w:t>15~25</w:t>
       </w:r>
@@ -8614,7 +8609,7 @@
           <w:numId w:val="7"/>
         </w:numPr>
       </w:pPr>
-      <w:bookmarkStart w:id="13" w:name="_Toc241040019"/>
+      <w:bookmarkStart w:id="13" w:name="_Toc241099444"/>
       <w:r>
         <w:lastRenderedPageBreak/>
         <w:t>위조와</w:t>
@@ -8641,7 +8636,7 @@
           <w:numId w:val="7"/>
         </w:numPr>
       </w:pPr>
-      <w:bookmarkStart w:id="14" w:name="_Toc241040020"/>
+      <w:bookmarkStart w:id="14" w:name="_Toc241099445"/>
       <w:r>
         <w:t>Artifact</w:t>
       </w:r>
@@ -8942,7 +8937,7 @@
           <w:numId w:val="7"/>
         </w:numPr>
       </w:pPr>
-      <w:bookmarkStart w:id="15" w:name="_Toc241040021"/>
+      <w:bookmarkStart w:id="15" w:name="_Toc241099446"/>
       <w:r>
         <w:t xml:space="preserve">Surface Forgery </w:t>
       </w:r>
@@ -9124,7 +9119,7 @@
           <w:numId w:val="7"/>
         </w:numPr>
       </w:pPr>
-      <w:bookmarkStart w:id="16" w:name="_Toc241040022"/>
+      <w:bookmarkStart w:id="16" w:name="_Toc241099447"/>
       <w:r>
         <w:lastRenderedPageBreak/>
         <w:t>Object Assembly — Deferred Expansion</w:t>
@@ -9192,7 +9187,7 @@
           <w:numId w:val="7"/>
         </w:numPr>
       </w:pPr>
-      <w:bookmarkStart w:id="17" w:name="_Toc241040023"/>
+      <w:bookmarkStart w:id="17" w:name="_Toc241099448"/>
       <w:r>
         <w:t>Quality</w:t>
       </w:r>
@@ -9481,7 +9476,7 @@
           <w:numId w:val="7"/>
         </w:numPr>
       </w:pPr>
-      <w:bookmarkStart w:id="18" w:name="_Toc241040024"/>
+      <w:bookmarkStart w:id="18" w:name="_Toc241099449"/>
       <w:r>
         <w:lastRenderedPageBreak/>
         <w:t>핵심</w:t>
@@ -9983,7 +9978,7 @@
           <w:numId w:val="7"/>
         </w:numPr>
       </w:pPr>
-      <w:bookmarkStart w:id="19" w:name="_Toc241040025"/>
+      <w:bookmarkStart w:id="19" w:name="_Toc241099450"/>
       <w:r>
         <w:t xml:space="preserve">Owner-only Forgery </w:t>
       </w:r>
@@ -10230,7 +10225,7 @@
           <w:numId w:val="7"/>
         </w:numPr>
       </w:pPr>
-      <w:bookmarkStart w:id="20" w:name="_Toc241040026"/>
+      <w:bookmarkStart w:id="20" w:name="_Toc241099451"/>
       <w:r>
         <w:lastRenderedPageBreak/>
         <w:t>잠입</w:t>
@@ -10263,7 +10258,7 @@
           <w:numId w:val="7"/>
         </w:numPr>
       </w:pPr>
-      <w:bookmarkStart w:id="21" w:name="_Toc241040027"/>
+      <w:bookmarkStart w:id="21" w:name="_Toc241099452"/>
       <w:r>
         <w:t xml:space="preserve">First-Person </w:t>
       </w:r>
@@ -10328,7 +10323,7 @@
           <w:numId w:val="7"/>
         </w:numPr>
       </w:pPr>
-      <w:bookmarkStart w:id="22" w:name="_Toc241040028"/>
+      <w:bookmarkStart w:id="22" w:name="_Toc241099453"/>
       <w:r>
         <w:t>Walk, Sprint, Weight, Footstep</w:t>
       </w:r>
@@ -10671,7 +10666,7 @@
           <w:numId w:val="7"/>
         </w:numPr>
       </w:pPr>
-      <w:bookmarkStart w:id="23" w:name="_Toc241040029"/>
+      <w:bookmarkStart w:id="23" w:name="_Toc241099454"/>
       <w:r>
         <w:t>Patrol Guard</w:t>
       </w:r>
@@ -11022,7 +11017,7 @@
           <w:numId w:val="7"/>
         </w:numPr>
       </w:pPr>
-      <w:bookmarkStart w:id="24" w:name="_Toc241040030"/>
+      <w:bookmarkStart w:id="24" w:name="_Toc241099455"/>
       <w:r>
         <w:t>CCTV</w:t>
       </w:r>
@@ -11036,7 +11031,7 @@
     </w:p>
     <w:p>
       <w:r>
-        <w:t>CCTV는 Guard와 다른 고정 World Detection Source다. 1.2~1.5초 동안 거리·각도·가림을 모두 만족한 완전 발각만 경계도 +0.5와 근처 Guard 1회 조사로 이어지며, 짧은 노출은 경고만 제공한다.</w:t>
+        <w:t>CCTV는 첫 포착 시 회전을 멈추고 2.025초 노출 시 경계도 +0.5와 근처 Guard 조사를 유발한다. 모두 시야를 벗어나면 누적을 지우고 1.5초 뒤 같은 각도·방향에서 회전을 재개한다. 재포착은 복귀를 취소한다. 렌즈·본체·조명은 함께 움직이고 흰빛은 누적에 따라 붉어져 발각 시 잠시 유지된다. 감지·조명 거리는 기존의 2/3이며 시야각·야간 조명은 유지한다.</w:t>
       </w:r>
     </w:p>
     <w:p>
@@ -11209,7 +11204,7 @@
           </w:tcPr>
           <w:p>
             <w:r>
-              <w:t>벽 뒤 탐지 금지, 1.2~1.5초 Build-up, Cooldown</w:t>
+              <w:t>벽 뒤 탐지 금지, 1.8~2.25초 Build-up, Cooldown</w:t>
             </w:r>
           </w:p>
         </w:tc>
@@ -11272,7 +11267,7 @@
           <w:numId w:val="7"/>
         </w:numPr>
       </w:pPr>
-      <w:bookmarkStart w:id="25" w:name="_Toc241040031"/>
+      <w:bookmarkStart w:id="25" w:name="_Toc241099456"/>
       <w:r>
         <w:lastRenderedPageBreak/>
         <w:t>Stun, Arrest, Recovery</w:t>
@@ -11347,7 +11342,7 @@
           <w:numId w:val="7"/>
         </w:numPr>
       </w:pPr>
-      <w:bookmarkStart w:id="26" w:name="_Toc241040032"/>
+      <w:bookmarkStart w:id="26" w:name="_Toc241099457"/>
       <w:r>
         <w:t>두</w:t>
       </w:r>
@@ -11823,7 +11818,7 @@
           <w:numId w:val="7"/>
         </w:numPr>
       </w:pPr>
-      <w:bookmarkStart w:id="27" w:name="_Toc241040033"/>
+      <w:bookmarkStart w:id="27" w:name="_Toc241099458"/>
       <w:r>
         <w:lastRenderedPageBreak/>
         <w:t>협동</w:t>
@@ -11850,7 +11845,7 @@
           <w:numId w:val="7"/>
         </w:numPr>
       </w:pPr>
-      <w:bookmarkStart w:id="28" w:name="_Toc241040034"/>
+      <w:bookmarkStart w:id="28" w:name="_Toc241099459"/>
       <w:r>
         <w:t>Role Switching</w:t>
       </w:r>
@@ -12258,7 +12253,7 @@
           <w:numId w:val="7"/>
         </w:numPr>
       </w:pPr>
-      <w:bookmarkStart w:id="29" w:name="_Toc241040035"/>
+      <w:bookmarkStart w:id="29" w:name="_Toc241099460"/>
       <w:r>
         <w:t>거리</w:t>
       </w:r>
@@ -12317,7 +12312,7 @@
           <w:numId w:val="7"/>
         </w:numPr>
       </w:pPr>
-      <w:bookmarkStart w:id="30" w:name="_Toc241040036"/>
+      <w:bookmarkStart w:id="30" w:name="_Toc241099461"/>
       <w:r>
         <w:t>Inventory, Loose Loot, Coin</w:t>
       </w:r>
@@ -12380,7 +12375,7 @@
           <w:numId w:val="7"/>
         </w:numPr>
       </w:pPr>
-      <w:bookmarkStart w:id="31" w:name="_Toc241040037"/>
+      <w:bookmarkStart w:id="31" w:name="_Toc241099462"/>
       <w:r>
         <w:t>Player Identity</w:t>
       </w:r>
@@ -12803,7 +12798,7 @@
           <w:numId w:val="7"/>
         </w:numPr>
       </w:pPr>
-      <w:bookmarkStart w:id="32" w:name="_Toc241040038"/>
+      <w:bookmarkStart w:id="32" w:name="_Toc241099463"/>
       <w:r>
         <w:t xml:space="preserve">Floor Plan Map </w:t>
       </w:r>
@@ -13015,7 +13010,7 @@
           <w:numId w:val="7"/>
         </w:numPr>
       </w:pPr>
-      <w:bookmarkStart w:id="33" w:name="_Toc241040039"/>
+      <w:bookmarkStart w:id="33" w:name="_Toc241099464"/>
       <w:r>
         <w:t>Shared Extraction</w:t>
       </w:r>
@@ -13095,7 +13090,7 @@
           <w:numId w:val="7"/>
         </w:numPr>
       </w:pPr>
-      <w:bookmarkStart w:id="34" w:name="_Toc241040040"/>
+      <w:bookmarkStart w:id="34" w:name="_Toc241099465"/>
       <w:r>
         <w:lastRenderedPageBreak/>
         <w:t xml:space="preserve">UI, </w:t>
@@ -13124,7 +13119,7 @@
           <w:numId w:val="7"/>
         </w:numPr>
       </w:pPr>
-      <w:bookmarkStart w:id="35" w:name="_Toc241040041"/>
+      <w:bookmarkStart w:id="35" w:name="_Toc241099466"/>
       <w:r>
         <w:t>HUD Information Architecture</w:t>
       </w:r>
@@ -13425,7 +13420,7 @@
           <w:numId w:val="7"/>
         </w:numPr>
       </w:pPr>
-      <w:bookmarkStart w:id="36" w:name="_Toc241040042"/>
+      <w:bookmarkStart w:id="36" w:name="_Toc241099467"/>
       <w:r>
         <w:t xml:space="preserve">Main HUD </w:t>
       </w:r>
@@ -13495,25 +13490,7 @@
           </w:p>
           <w:p>
             <w:r>
-              <w:t>운반</w:t>
-            </w:r>
-            <w:r>
-              <w:t>·</w:t>
-            </w:r>
-            <w:r>
-              <w:t>확보</w:t>
-            </w:r>
-            <w:r>
-              <w:t xml:space="preserve"> </w:t>
-            </w:r>
-            <w:r>
-              <w:t>현재</w:t>
-            </w:r>
-            <w:r>
-              <w:t xml:space="preserve"> / </w:t>
-            </w:r>
-            <w:r>
-              <w:t>목표</w:t>
+              <w:t>운반·확보 현재 / 목표</w:t>
             </w:r>
           </w:p>
         </w:tc>
@@ -13758,7 +13735,7 @@
           <w:numId w:val="7"/>
         </w:numPr>
       </w:pPr>
-      <w:bookmarkStart w:id="37" w:name="_Toc241040043"/>
+      <w:bookmarkStart w:id="37" w:name="_Toc241099468"/>
       <w:r>
         <w:t>최소</w:t>
       </w:r>
@@ -13839,7 +13816,7 @@
           <w:numId w:val="7"/>
         </w:numPr>
       </w:pPr>
-      <w:bookmarkStart w:id="38" w:name="_Toc241040044"/>
+      <w:bookmarkStart w:id="38" w:name="_Toc241099469"/>
       <w:r>
         <w:t xml:space="preserve">Input Mode </w:t>
       </w:r>
@@ -14320,7 +14297,7 @@
           <w:numId w:val="7"/>
         </w:numPr>
       </w:pPr>
-      <w:bookmarkStart w:id="39" w:name="_Toc241040045"/>
+      <w:bookmarkStart w:id="39" w:name="_Toc241099470"/>
       <w:r>
         <w:t>Floor Plan</w:t>
       </w:r>
@@ -14343,7 +14320,7 @@
           <w:numId w:val="7"/>
         </w:numPr>
       </w:pPr>
-      <w:bookmarkStart w:id="40" w:name="_Toc241040046"/>
+      <w:bookmarkStart w:id="40" w:name="_Toc241099471"/>
       <w:r>
         <w:t xml:space="preserve">Floor Plan Map </w:t>
       </w:r>
@@ -14658,7 +14635,7 @@
           <w:numId w:val="7"/>
         </w:numPr>
       </w:pPr>
-      <w:bookmarkStart w:id="41" w:name="_Toc241040047"/>
+      <w:bookmarkStart w:id="41" w:name="_Toc241099472"/>
       <w:r>
         <w:t xml:space="preserve">Team Result / Replica Recap </w:t>
       </w:r>
@@ -15036,7 +15013,7 @@
           <w:numId w:val="7"/>
         </w:numPr>
       </w:pPr>
-      <w:bookmarkStart w:id="42" w:name="_Toc241040048"/>
+      <w:bookmarkStart w:id="42" w:name="_Toc241099473"/>
       <w:r>
         <w:t>첫</w:t>
       </w:r>
@@ -15311,7 +15288,7 @@
           <w:numId w:val="7"/>
         </w:numPr>
       </w:pPr>
-      <w:bookmarkStart w:id="43" w:name="_Toc241040049"/>
+      <w:bookmarkStart w:id="43" w:name="_Toc241099474"/>
       <w:r>
         <w:t>접근성</w:t>
       </w:r>
@@ -15383,7 +15360,7 @@
           <w:numId w:val="7"/>
         </w:numPr>
       </w:pPr>
-      <w:bookmarkStart w:id="44" w:name="_Toc241040050"/>
+      <w:bookmarkStart w:id="44" w:name="_Toc241099475"/>
       <w:r>
         <w:lastRenderedPageBreak/>
         <w:t>레벨</w:t>
@@ -15416,7 +15393,7 @@
           <w:numId w:val="7"/>
         </w:numPr>
       </w:pPr>
-      <w:bookmarkStart w:id="45" w:name="_Toc241040051"/>
+      <w:bookmarkStart w:id="45" w:name="_Toc241099476"/>
       <w:r>
         <w:t>세</w:t>
       </w:r>
@@ -15535,7 +15512,7 @@
       <w:pPr>
         <w:pStyle w:val="31"/>
       </w:pPr>
-      <w:bookmarkStart w:id="46" w:name="_Toc241040052"/>
+      <w:bookmarkStart w:id="46" w:name="_Toc241099477"/>
       <w:r>
         <w:t>전시</w:t>
       </w:r>
@@ -15607,7 +15584,7 @@
           <w:numId w:val="7"/>
         </w:numPr>
       </w:pPr>
-      <w:bookmarkStart w:id="47" w:name="_Toc241040053"/>
+      <w:bookmarkStart w:id="47" w:name="_Toc241099478"/>
       <w:r>
         <w:lastRenderedPageBreak/>
         <w:t>맵</w:t>
@@ -16049,7 +16026,7 @@
           <w:numId w:val="7"/>
         </w:numPr>
       </w:pPr>
-      <w:bookmarkStart w:id="48" w:name="_Toc241040054"/>
+      <w:bookmarkStart w:id="48" w:name="_Toc241099479"/>
       <w:r>
         <w:lastRenderedPageBreak/>
         <w:t xml:space="preserve">M01 — </w:t>
@@ -16363,7 +16340,7 @@
           <w:numId w:val="7"/>
         </w:numPr>
       </w:pPr>
-      <w:bookmarkStart w:id="49" w:name="_Toc241040055"/>
+      <w:bookmarkStart w:id="49" w:name="_Toc241099480"/>
       <w:r>
         <w:lastRenderedPageBreak/>
         <w:t xml:space="preserve">M02 — </w:t>
@@ -16674,7 +16651,7 @@
           <w:numId w:val="7"/>
         </w:numPr>
       </w:pPr>
-      <w:bookmarkStart w:id="50" w:name="_Toc241040056"/>
+      <w:bookmarkStart w:id="50" w:name="_Toc241099481"/>
       <w:r>
         <w:lastRenderedPageBreak/>
         <w:t xml:space="preserve">M03 — </w:t>
@@ -16979,7 +16956,7 @@
           <w:numId w:val="7"/>
         </w:numPr>
       </w:pPr>
-      <w:bookmarkStart w:id="51" w:name="_Toc241040057"/>
+      <w:bookmarkStart w:id="51" w:name="_Toc241099482"/>
       <w:r>
         <w:lastRenderedPageBreak/>
         <w:t xml:space="preserve">First-Person </w:t>
@@ -17063,7 +17040,7 @@
           <w:numId w:val="7"/>
         </w:numPr>
       </w:pPr>
-      <w:bookmarkStart w:id="52" w:name="_Toc241040058"/>
+      <w:bookmarkStart w:id="52" w:name="_Toc241099483"/>
       <w:r>
         <w:t>사운드</w:t>
       </w:r>
@@ -17503,7 +17480,7 @@
           <w:numId w:val="7"/>
         </w:numPr>
       </w:pPr>
-      <w:bookmarkStart w:id="53" w:name="_Toc241040059"/>
+      <w:bookmarkStart w:id="53" w:name="_Toc241099484"/>
       <w:r>
         <w:lastRenderedPageBreak/>
         <w:t>세계관과</w:t>
@@ -17750,7 +17727,7 @@
           <w:numId w:val="7"/>
         </w:numPr>
       </w:pPr>
-      <w:bookmarkStart w:id="54" w:name="_Toc241040060"/>
+      <w:bookmarkStart w:id="54" w:name="_Toc241099485"/>
       <w:r>
         <w:lastRenderedPageBreak/>
         <w:t>범위</w:t>
@@ -17777,7 +17754,7 @@
           <w:numId w:val="7"/>
         </w:numPr>
       </w:pPr>
-      <w:bookmarkStart w:id="55" w:name="_Toc241040061"/>
+      <w:bookmarkStart w:id="55" w:name="_Toc241099486"/>
       <w:r>
         <w:t>v1.0 Required Scope</w:t>
       </w:r>
@@ -18145,7 +18122,7 @@
           <w:numId w:val="7"/>
         </w:numPr>
       </w:pPr>
-      <w:bookmarkStart w:id="56" w:name="_Toc241040062"/>
+      <w:bookmarkStart w:id="56" w:name="_Toc241099487"/>
       <w:r>
         <w:t>Deferred Expansion</w:t>
       </w:r>
@@ -18169,7 +18146,7 @@
           <w:numId w:val="7"/>
         </w:numPr>
       </w:pPr>
-      <w:bookmarkStart w:id="57" w:name="_Toc241040063"/>
+      <w:bookmarkStart w:id="57" w:name="_Toc241099488"/>
       <w:r>
         <w:t>Stretch</w:t>
       </w:r>
@@ -18547,7 +18524,7 @@
           <w:numId w:val="7"/>
         </w:numPr>
       </w:pPr>
-      <w:bookmarkStart w:id="58" w:name="_Toc241040064"/>
+      <w:bookmarkStart w:id="58" w:name="_Toc241099489"/>
       <w:r>
         <w:lastRenderedPageBreak/>
         <w:t>Starting Balance Targets</w:t>
@@ -19146,7 +19123,7 @@
           <w:numId w:val="7"/>
         </w:numPr>
       </w:pPr>
-      <w:bookmarkStart w:id="59" w:name="_Toc241040065"/>
+      <w:bookmarkStart w:id="59" w:name="_Toc241099490"/>
       <w:r>
         <w:t>Playtest Questions</w:t>
       </w:r>
@@ -19232,7 +19209,7 @@
           <w:numId w:val="7"/>
         </w:numPr>
       </w:pPr>
-      <w:bookmarkStart w:id="60" w:name="_Toc241040066"/>
+      <w:bookmarkStart w:id="60" w:name="_Toc241099491"/>
       <w:r>
         <w:lastRenderedPageBreak/>
         <w:t>Release KPI</w:t>
@@ -19564,7 +19541,7 @@
           <w:numId w:val="7"/>
         </w:numPr>
       </w:pPr>
-      <w:bookmarkStart w:id="61" w:name="_Toc241040067"/>
+      <w:bookmarkStart w:id="61" w:name="_Toc241099492"/>
       <w:r>
         <w:t>W6~W12 Roadmap</w:t>
       </w:r>
@@ -19930,7 +19907,7 @@
         <w:keepLines/>
         <w:pageBreakBefore w:val="0"/>
       </w:pPr>
-      <w:bookmarkStart w:id="62" w:name="_Toc241040068"/>
+      <w:bookmarkStart w:id="62" w:name="_Toc241099493"/>
       <w:r>
         <w:t>Appendix A — 용어</w:t>
       </w:r>
@@ -20321,7 +20298,7 @@
         <w:keepLines/>
         <w:pageBreakBefore w:val="0"/>
       </w:pPr>
-      <w:bookmarkStart w:id="63" w:name="_Toc241040069"/>
+      <w:bookmarkStart w:id="63" w:name="_Toc241099494"/>
       <w:r>
         <w:rPr>
           <w:sz w:val="32"/>
@@ -20548,7 +20525,7 @@
         <w:keepLines/>
         <w:pageBreakBefore w:val="0"/>
       </w:pPr>
-      <w:bookmarkStart w:id="64" w:name="_Toc241040070"/>
+      <w:bookmarkStart w:id="64" w:name="_Toc241099495"/>
       <w:r>
         <w:rPr>
           <w:sz w:val="32"/>

</xml_diff>

<commit_message>
Migrate to authored canvas map pipeline
Shifts the project fully away from SunTemple/sample defaults and into the Museum Heist authored-map workflow. Engine/game/input config was updated for title/lobby flow, Steam voice/session setup, Korean localization, packaging targets, and legacy mobile/lightmass/sample files were removed.

Introduces the new surface-forgery canvas material set and map content (canvas/print materials, light fixture and floor PCG blueprints, updated M01–M03 maps), while retiring old procedural map builders via hard-fail guards and adding read-only/auditing and targeted editor scripts for canvas, lighting, and PCG application.

Gameplay code now treats painting display cases as a single-canvas visual path (no separate replica mesh), updates debug contracts accordingly, and adds automation coverage for canvas material transitions and interaction offset handling.
</commit_message>
<xml_diff>
--- a/Museum_Heist_GDD.docx
+++ b/Museum_Heist_GDD.docx
@@ -559,7 +559,7 @@
       <w:r>
         <w:fldChar w:fldCharType="separate"/>
       </w:r>
-      <w:hyperlink w:anchor="_Toc241099431" w:history="1">
+      <w:hyperlink w:anchor="_Toc241397275" w:history="1">
         <w:r>
           <w:rPr>
             <w:rStyle w:val="aff1"/>
@@ -586,7 +586,7 @@
             <w:noProof/>
             <w:webHidden/>
           </w:rPr>
-          <w:instrText xml:space="preserve"> PAGEREF _Toc241099431 \h </w:instrText>
+          <w:instrText xml:space="preserve"> PAGEREF _Toc241397275 \h </w:instrText>
         </w:r>
         <w:r>
           <w:rPr>
@@ -635,7 +635,7 @@
           <w14:ligatures w14:val="standardContextual"/>
         </w:rPr>
       </w:pPr>
-      <w:hyperlink w:anchor="_Toc241099432" w:history="1">
+      <w:hyperlink w:anchor="_Toc241397276" w:history="1">
         <w:r>
           <w:rPr>
             <w:rStyle w:val="aff1"/>
@@ -662,7 +662,7 @@
             <w:noProof/>
             <w:webHidden/>
           </w:rPr>
-          <w:instrText xml:space="preserve"> PAGEREF _Toc241099432 \h </w:instrText>
+          <w:instrText xml:space="preserve"> PAGEREF _Toc241397276 \h </w:instrText>
         </w:r>
         <w:r>
           <w:rPr>
@@ -711,7 +711,7 @@
           <w14:ligatures w14:val="standardContextual"/>
         </w:rPr>
       </w:pPr>
-      <w:hyperlink w:anchor="_Toc241099433" w:history="1">
+      <w:hyperlink w:anchor="_Toc241397277" w:history="1">
         <w:r>
           <w:rPr>
             <w:rStyle w:val="aff1"/>
@@ -738,7 +738,7 @@
             <w:noProof/>
             <w:webHidden/>
           </w:rPr>
-          <w:instrText xml:space="preserve"> PAGEREF _Toc241099433 \h </w:instrText>
+          <w:instrText xml:space="preserve"> PAGEREF _Toc241397277 \h </w:instrText>
         </w:r>
         <w:r>
           <w:rPr>
@@ -787,7 +787,7 @@
           <w14:ligatures w14:val="standardContextual"/>
         </w:rPr>
       </w:pPr>
-      <w:hyperlink w:anchor="_Toc241099434" w:history="1">
+      <w:hyperlink w:anchor="_Toc241397278" w:history="1">
         <w:r>
           <w:rPr>
             <w:rStyle w:val="aff1"/>
@@ -814,7 +814,7 @@
             <w:noProof/>
             <w:webHidden/>
           </w:rPr>
-          <w:instrText xml:space="preserve"> PAGEREF _Toc241099434 \h </w:instrText>
+          <w:instrText xml:space="preserve"> PAGEREF _Toc241397278 \h </w:instrText>
         </w:r>
         <w:r>
           <w:rPr>
@@ -863,7 +863,7 @@
           <w14:ligatures w14:val="standardContextual"/>
         </w:rPr>
       </w:pPr>
-      <w:hyperlink w:anchor="_Toc241099435" w:history="1">
+      <w:hyperlink w:anchor="_Toc241397279" w:history="1">
         <w:r>
           <w:rPr>
             <w:rStyle w:val="aff1"/>
@@ -890,7 +890,7 @@
             <w:noProof/>
             <w:webHidden/>
           </w:rPr>
-          <w:instrText xml:space="preserve"> PAGEREF _Toc241099435 \h </w:instrText>
+          <w:instrText xml:space="preserve"> PAGEREF _Toc241397279 \h </w:instrText>
         </w:r>
         <w:r>
           <w:rPr>
@@ -939,7 +939,7 @@
           <w14:ligatures w14:val="standardContextual"/>
         </w:rPr>
       </w:pPr>
-      <w:hyperlink w:anchor="_Toc241099436" w:history="1">
+      <w:hyperlink w:anchor="_Toc241397280" w:history="1">
         <w:r>
           <w:rPr>
             <w:rStyle w:val="aff1"/>
@@ -966,7 +966,7 @@
             <w:noProof/>
             <w:webHidden/>
           </w:rPr>
-          <w:instrText xml:space="preserve"> PAGEREF _Toc241099436 \h </w:instrText>
+          <w:instrText xml:space="preserve"> PAGEREF _Toc241397280 \h </w:instrText>
         </w:r>
         <w:r>
           <w:rPr>
@@ -1015,7 +1015,7 @@
           <w14:ligatures w14:val="standardContextual"/>
         </w:rPr>
       </w:pPr>
-      <w:hyperlink w:anchor="_Toc241099437" w:history="1">
+      <w:hyperlink w:anchor="_Toc241397281" w:history="1">
         <w:r>
           <w:rPr>
             <w:rStyle w:val="aff1"/>
@@ -1042,7 +1042,7 @@
             <w:noProof/>
             <w:webHidden/>
           </w:rPr>
-          <w:instrText xml:space="preserve"> PAGEREF _Toc241099437 \h </w:instrText>
+          <w:instrText xml:space="preserve"> PAGEREF _Toc241397281 \h </w:instrText>
         </w:r>
         <w:r>
           <w:rPr>
@@ -1090,7 +1090,7 @@
           <w14:ligatures w14:val="standardContextual"/>
         </w:rPr>
       </w:pPr>
-      <w:hyperlink w:anchor="_Toc241099438" w:history="1">
+      <w:hyperlink w:anchor="_Toc241397282" w:history="1">
         <w:r>
           <w:rPr>
             <w:rStyle w:val="aff1"/>
@@ -1117,7 +1117,7 @@
             <w:noProof/>
             <w:webHidden/>
           </w:rPr>
-          <w:instrText xml:space="preserve"> PAGEREF _Toc241099438 \h </w:instrText>
+          <w:instrText xml:space="preserve"> PAGEREF _Toc241397282 \h </w:instrText>
         </w:r>
         <w:r>
           <w:rPr>
@@ -1166,7 +1166,7 @@
           <w14:ligatures w14:val="standardContextual"/>
         </w:rPr>
       </w:pPr>
-      <w:hyperlink w:anchor="_Toc241099439" w:history="1">
+      <w:hyperlink w:anchor="_Toc241397283" w:history="1">
         <w:r>
           <w:rPr>
             <w:rStyle w:val="aff1"/>
@@ -1193,7 +1193,7 @@
             <w:noProof/>
             <w:webHidden/>
           </w:rPr>
-          <w:instrText xml:space="preserve"> PAGEREF _Toc241099439 \h </w:instrText>
+          <w:instrText xml:space="preserve"> PAGEREF _Toc241397283 \h </w:instrText>
         </w:r>
         <w:r>
           <w:rPr>
@@ -1242,7 +1242,7 @@
           <w14:ligatures w14:val="standardContextual"/>
         </w:rPr>
       </w:pPr>
-      <w:hyperlink w:anchor="_Toc241099440" w:history="1">
+      <w:hyperlink w:anchor="_Toc241397284" w:history="1">
         <w:r>
           <w:rPr>
             <w:rStyle w:val="aff1"/>
@@ -1269,7 +1269,7 @@
             <w:noProof/>
             <w:webHidden/>
           </w:rPr>
-          <w:instrText xml:space="preserve"> PAGEREF _Toc241099440 \h </w:instrText>
+          <w:instrText xml:space="preserve"> PAGEREF _Toc241397284 \h </w:instrText>
         </w:r>
         <w:r>
           <w:rPr>
@@ -1318,7 +1318,7 @@
           <w14:ligatures w14:val="standardContextual"/>
         </w:rPr>
       </w:pPr>
-      <w:hyperlink w:anchor="_Toc241099441" w:history="1">
+      <w:hyperlink w:anchor="_Toc241397285" w:history="1">
         <w:r>
           <w:rPr>
             <w:rStyle w:val="aff1"/>
@@ -1345,7 +1345,7 @@
             <w:noProof/>
             <w:webHidden/>
           </w:rPr>
-          <w:instrText xml:space="preserve"> PAGEREF _Toc241099441 \h </w:instrText>
+          <w:instrText xml:space="preserve"> PAGEREF _Toc241397285 \h </w:instrText>
         </w:r>
         <w:r>
           <w:rPr>
@@ -1394,7 +1394,7 @@
           <w14:ligatures w14:val="standardContextual"/>
         </w:rPr>
       </w:pPr>
-      <w:hyperlink w:anchor="_Toc241099442" w:history="1">
+      <w:hyperlink w:anchor="_Toc241397286" w:history="1">
         <w:r>
           <w:rPr>
             <w:rStyle w:val="aff1"/>
@@ -1421,7 +1421,7 @@
             <w:noProof/>
             <w:webHidden/>
           </w:rPr>
-          <w:instrText xml:space="preserve"> PAGEREF _Toc241099442 \h </w:instrText>
+          <w:instrText xml:space="preserve"> PAGEREF _Toc241397286 \h </w:instrText>
         </w:r>
         <w:r>
           <w:rPr>
@@ -1470,7 +1470,7 @@
           <w14:ligatures w14:val="standardContextual"/>
         </w:rPr>
       </w:pPr>
-      <w:hyperlink w:anchor="_Toc241099443" w:history="1">
+      <w:hyperlink w:anchor="_Toc241397287" w:history="1">
         <w:r>
           <w:rPr>
             <w:rStyle w:val="aff1"/>
@@ -1497,7 +1497,7 @@
             <w:noProof/>
             <w:webHidden/>
           </w:rPr>
-          <w:instrText xml:space="preserve"> PAGEREF _Toc241099443 \h </w:instrText>
+          <w:instrText xml:space="preserve"> PAGEREF _Toc241397287 \h </w:instrText>
         </w:r>
         <w:r>
           <w:rPr>
@@ -1545,7 +1545,7 @@
           <w14:ligatures w14:val="standardContextual"/>
         </w:rPr>
       </w:pPr>
-      <w:hyperlink w:anchor="_Toc241099444" w:history="1">
+      <w:hyperlink w:anchor="_Toc241397288" w:history="1">
         <w:r>
           <w:rPr>
             <w:rStyle w:val="aff1"/>
@@ -1572,7 +1572,7 @@
             <w:noProof/>
             <w:webHidden/>
           </w:rPr>
-          <w:instrText xml:space="preserve"> PAGEREF _Toc241099444 \h </w:instrText>
+          <w:instrText xml:space="preserve"> PAGEREF _Toc241397288 \h </w:instrText>
         </w:r>
         <w:r>
           <w:rPr>
@@ -1621,7 +1621,7 @@
           <w14:ligatures w14:val="standardContextual"/>
         </w:rPr>
       </w:pPr>
-      <w:hyperlink w:anchor="_Toc241099445" w:history="1">
+      <w:hyperlink w:anchor="_Toc241397289" w:history="1">
         <w:r>
           <w:rPr>
             <w:rStyle w:val="aff1"/>
@@ -1648,7 +1648,7 @@
             <w:noProof/>
             <w:webHidden/>
           </w:rPr>
-          <w:instrText xml:space="preserve"> PAGEREF _Toc241099445 \h </w:instrText>
+          <w:instrText xml:space="preserve"> PAGEREF _Toc241397289 \h </w:instrText>
         </w:r>
         <w:r>
           <w:rPr>
@@ -1697,7 +1697,7 @@
           <w14:ligatures w14:val="standardContextual"/>
         </w:rPr>
       </w:pPr>
-      <w:hyperlink w:anchor="_Toc241099446" w:history="1">
+      <w:hyperlink w:anchor="_Toc241397290" w:history="1">
         <w:r>
           <w:rPr>
             <w:rStyle w:val="aff1"/>
@@ -1724,7 +1724,7 @@
             <w:noProof/>
             <w:webHidden/>
           </w:rPr>
-          <w:instrText xml:space="preserve"> PAGEREF _Toc241099446 \h </w:instrText>
+          <w:instrText xml:space="preserve"> PAGEREF _Toc241397290 \h </w:instrText>
         </w:r>
         <w:r>
           <w:rPr>
@@ -1773,7 +1773,7 @@
           <w14:ligatures w14:val="standardContextual"/>
         </w:rPr>
       </w:pPr>
-      <w:hyperlink w:anchor="_Toc241099447" w:history="1">
+      <w:hyperlink w:anchor="_Toc241397291" w:history="1">
         <w:r>
           <w:rPr>
             <w:rStyle w:val="aff1"/>
@@ -1800,7 +1800,7 @@
             <w:noProof/>
             <w:webHidden/>
           </w:rPr>
-          <w:instrText xml:space="preserve"> PAGEREF _Toc241099447 \h </w:instrText>
+          <w:instrText xml:space="preserve"> PAGEREF _Toc241397291 \h </w:instrText>
         </w:r>
         <w:r>
           <w:rPr>
@@ -1849,7 +1849,7 @@
           <w14:ligatures w14:val="standardContextual"/>
         </w:rPr>
       </w:pPr>
-      <w:hyperlink w:anchor="_Toc241099448" w:history="1">
+      <w:hyperlink w:anchor="_Toc241397292" w:history="1">
         <w:r>
           <w:rPr>
             <w:rStyle w:val="aff1"/>
@@ -1876,7 +1876,7 @@
             <w:noProof/>
             <w:webHidden/>
           </w:rPr>
-          <w:instrText xml:space="preserve"> PAGEREF _Toc241099448 \h </w:instrText>
+          <w:instrText xml:space="preserve"> PAGEREF _Toc241397292 \h </w:instrText>
         </w:r>
         <w:r>
           <w:rPr>
@@ -1925,7 +1925,7 @@
           <w14:ligatures w14:val="standardContextual"/>
         </w:rPr>
       </w:pPr>
-      <w:hyperlink w:anchor="_Toc241099449" w:history="1">
+      <w:hyperlink w:anchor="_Toc241397293" w:history="1">
         <w:r>
           <w:rPr>
             <w:rStyle w:val="aff1"/>
@@ -1952,7 +1952,7 @@
             <w:noProof/>
             <w:webHidden/>
           </w:rPr>
-          <w:instrText xml:space="preserve"> PAGEREF _Toc241099449 \h </w:instrText>
+          <w:instrText xml:space="preserve"> PAGEREF _Toc241397293 \h </w:instrText>
         </w:r>
         <w:r>
           <w:rPr>
@@ -2001,7 +2001,7 @@
           <w14:ligatures w14:val="standardContextual"/>
         </w:rPr>
       </w:pPr>
-      <w:hyperlink w:anchor="_Toc241099450" w:history="1">
+      <w:hyperlink w:anchor="_Toc241397294" w:history="1">
         <w:r>
           <w:rPr>
             <w:rStyle w:val="aff1"/>
@@ -2028,7 +2028,7 @@
             <w:noProof/>
             <w:webHidden/>
           </w:rPr>
-          <w:instrText xml:space="preserve"> PAGEREF _Toc241099450 \h </w:instrText>
+          <w:instrText xml:space="preserve"> PAGEREF _Toc241397294 \h </w:instrText>
         </w:r>
         <w:r>
           <w:rPr>
@@ -2076,7 +2076,7 @@
           <w14:ligatures w14:val="standardContextual"/>
         </w:rPr>
       </w:pPr>
-      <w:hyperlink w:anchor="_Toc241099451" w:history="1">
+      <w:hyperlink w:anchor="_Toc241397295" w:history="1">
         <w:r>
           <w:rPr>
             <w:rStyle w:val="aff1"/>
@@ -2103,7 +2103,7 @@
             <w:noProof/>
             <w:webHidden/>
           </w:rPr>
-          <w:instrText xml:space="preserve"> PAGEREF _Toc241099451 \h </w:instrText>
+          <w:instrText xml:space="preserve"> PAGEREF _Toc241397295 \h </w:instrText>
         </w:r>
         <w:r>
           <w:rPr>
@@ -2152,7 +2152,7 @@
           <w14:ligatures w14:val="standardContextual"/>
         </w:rPr>
       </w:pPr>
-      <w:hyperlink w:anchor="_Toc241099452" w:history="1">
+      <w:hyperlink w:anchor="_Toc241397296" w:history="1">
         <w:r>
           <w:rPr>
             <w:rStyle w:val="aff1"/>
@@ -2179,7 +2179,7 @@
             <w:noProof/>
             <w:webHidden/>
           </w:rPr>
-          <w:instrText xml:space="preserve"> PAGEREF _Toc241099452 \h </w:instrText>
+          <w:instrText xml:space="preserve"> PAGEREF _Toc241397296 \h </w:instrText>
         </w:r>
         <w:r>
           <w:rPr>
@@ -2228,7 +2228,7 @@
           <w14:ligatures w14:val="standardContextual"/>
         </w:rPr>
       </w:pPr>
-      <w:hyperlink w:anchor="_Toc241099453" w:history="1">
+      <w:hyperlink w:anchor="_Toc241397297" w:history="1">
         <w:r>
           <w:rPr>
             <w:rStyle w:val="aff1"/>
@@ -2255,7 +2255,7 @@
             <w:noProof/>
             <w:webHidden/>
           </w:rPr>
-          <w:instrText xml:space="preserve"> PAGEREF _Toc241099453 \h </w:instrText>
+          <w:instrText xml:space="preserve"> PAGEREF _Toc241397297 \h </w:instrText>
         </w:r>
         <w:r>
           <w:rPr>
@@ -2304,7 +2304,7 @@
           <w14:ligatures w14:val="standardContextual"/>
         </w:rPr>
       </w:pPr>
-      <w:hyperlink w:anchor="_Toc241099454" w:history="1">
+      <w:hyperlink w:anchor="_Toc241397298" w:history="1">
         <w:r>
           <w:rPr>
             <w:rStyle w:val="aff1"/>
@@ -2331,7 +2331,7 @@
             <w:noProof/>
             <w:webHidden/>
           </w:rPr>
-          <w:instrText xml:space="preserve"> PAGEREF _Toc241099454 \h </w:instrText>
+          <w:instrText xml:space="preserve"> PAGEREF _Toc241397298 \h </w:instrText>
         </w:r>
         <w:r>
           <w:rPr>
@@ -2380,7 +2380,7 @@
           <w14:ligatures w14:val="standardContextual"/>
         </w:rPr>
       </w:pPr>
-      <w:hyperlink w:anchor="_Toc241099455" w:history="1">
+      <w:hyperlink w:anchor="_Toc241397299" w:history="1">
         <w:r>
           <w:rPr>
             <w:rStyle w:val="aff1"/>
@@ -2407,7 +2407,7 @@
             <w:noProof/>
             <w:webHidden/>
           </w:rPr>
-          <w:instrText xml:space="preserve"> PAGEREF _Toc241099455 \h </w:instrText>
+          <w:instrText xml:space="preserve"> PAGEREF _Toc241397299 \h </w:instrText>
         </w:r>
         <w:r>
           <w:rPr>
@@ -2456,7 +2456,7 @@
           <w14:ligatures w14:val="standardContextual"/>
         </w:rPr>
       </w:pPr>
-      <w:hyperlink w:anchor="_Toc241099456" w:history="1">
+      <w:hyperlink w:anchor="_Toc241397300" w:history="1">
         <w:r>
           <w:rPr>
             <w:rStyle w:val="aff1"/>
@@ -2483,7 +2483,7 @@
             <w:noProof/>
             <w:webHidden/>
           </w:rPr>
-          <w:instrText xml:space="preserve"> PAGEREF _Toc241099456 \h </w:instrText>
+          <w:instrText xml:space="preserve"> PAGEREF _Toc241397300 \h </w:instrText>
         </w:r>
         <w:r>
           <w:rPr>
@@ -2532,7 +2532,7 @@
           <w14:ligatures w14:val="standardContextual"/>
         </w:rPr>
       </w:pPr>
-      <w:hyperlink w:anchor="_Toc241099457" w:history="1">
+      <w:hyperlink w:anchor="_Toc241397301" w:history="1">
         <w:r>
           <w:rPr>
             <w:rStyle w:val="aff1"/>
@@ -2559,7 +2559,7 @@
             <w:noProof/>
             <w:webHidden/>
           </w:rPr>
-          <w:instrText xml:space="preserve"> PAGEREF _Toc241099457 \h </w:instrText>
+          <w:instrText xml:space="preserve"> PAGEREF _Toc241397301 \h </w:instrText>
         </w:r>
         <w:r>
           <w:rPr>
@@ -2607,7 +2607,7 @@
           <w14:ligatures w14:val="standardContextual"/>
         </w:rPr>
       </w:pPr>
-      <w:hyperlink w:anchor="_Toc241099458" w:history="1">
+      <w:hyperlink w:anchor="_Toc241397302" w:history="1">
         <w:r>
           <w:rPr>
             <w:rStyle w:val="aff1"/>
@@ -2634,7 +2634,7 @@
             <w:noProof/>
             <w:webHidden/>
           </w:rPr>
-          <w:instrText xml:space="preserve"> PAGEREF _Toc241099458 \h </w:instrText>
+          <w:instrText xml:space="preserve"> PAGEREF _Toc241397302 \h </w:instrText>
         </w:r>
         <w:r>
           <w:rPr>
@@ -2683,7 +2683,7 @@
           <w14:ligatures w14:val="standardContextual"/>
         </w:rPr>
       </w:pPr>
-      <w:hyperlink w:anchor="_Toc241099459" w:history="1">
+      <w:hyperlink w:anchor="_Toc241397303" w:history="1">
         <w:r>
           <w:rPr>
             <w:rStyle w:val="aff1"/>
@@ -2710,7 +2710,7 @@
             <w:noProof/>
             <w:webHidden/>
           </w:rPr>
-          <w:instrText xml:space="preserve"> PAGEREF _Toc241099459 \h </w:instrText>
+          <w:instrText xml:space="preserve"> PAGEREF _Toc241397303 \h </w:instrText>
         </w:r>
         <w:r>
           <w:rPr>
@@ -2759,7 +2759,7 @@
           <w14:ligatures w14:val="standardContextual"/>
         </w:rPr>
       </w:pPr>
-      <w:hyperlink w:anchor="_Toc241099460" w:history="1">
+      <w:hyperlink w:anchor="_Toc241397304" w:history="1">
         <w:r>
           <w:rPr>
             <w:rStyle w:val="aff1"/>
@@ -2786,7 +2786,7 @@
             <w:noProof/>
             <w:webHidden/>
           </w:rPr>
-          <w:instrText xml:space="preserve"> PAGEREF _Toc241099460 \h </w:instrText>
+          <w:instrText xml:space="preserve"> PAGEREF _Toc241397304 \h </w:instrText>
         </w:r>
         <w:r>
           <w:rPr>
@@ -2835,7 +2835,7 @@
           <w14:ligatures w14:val="standardContextual"/>
         </w:rPr>
       </w:pPr>
-      <w:hyperlink w:anchor="_Toc241099461" w:history="1">
+      <w:hyperlink w:anchor="_Toc241397305" w:history="1">
         <w:r>
           <w:rPr>
             <w:rStyle w:val="aff1"/>
@@ -2862,7 +2862,7 @@
             <w:noProof/>
             <w:webHidden/>
           </w:rPr>
-          <w:instrText xml:space="preserve"> PAGEREF _Toc241099461 \h </w:instrText>
+          <w:instrText xml:space="preserve"> PAGEREF _Toc241397305 \h </w:instrText>
         </w:r>
         <w:r>
           <w:rPr>
@@ -2911,7 +2911,7 @@
           <w14:ligatures w14:val="standardContextual"/>
         </w:rPr>
       </w:pPr>
-      <w:hyperlink w:anchor="_Toc241099462" w:history="1">
+      <w:hyperlink w:anchor="_Toc241397306" w:history="1">
         <w:r>
           <w:rPr>
             <w:rStyle w:val="aff1"/>
@@ -2938,7 +2938,7 @@
             <w:noProof/>
             <w:webHidden/>
           </w:rPr>
-          <w:instrText xml:space="preserve"> PAGEREF _Toc241099462 \h </w:instrText>
+          <w:instrText xml:space="preserve"> PAGEREF _Toc241397306 \h </w:instrText>
         </w:r>
         <w:r>
           <w:rPr>
@@ -2987,7 +2987,7 @@
           <w14:ligatures w14:val="standardContextual"/>
         </w:rPr>
       </w:pPr>
-      <w:hyperlink w:anchor="_Toc241099463" w:history="1">
+      <w:hyperlink w:anchor="_Toc241397307" w:history="1">
         <w:r>
           <w:rPr>
             <w:rStyle w:val="aff1"/>
@@ -3014,7 +3014,7 @@
             <w:noProof/>
             <w:webHidden/>
           </w:rPr>
-          <w:instrText xml:space="preserve"> PAGEREF _Toc241099463 \h </w:instrText>
+          <w:instrText xml:space="preserve"> PAGEREF _Toc241397307 \h </w:instrText>
         </w:r>
         <w:r>
           <w:rPr>
@@ -3063,7 +3063,7 @@
           <w14:ligatures w14:val="standardContextual"/>
         </w:rPr>
       </w:pPr>
-      <w:hyperlink w:anchor="_Toc241099464" w:history="1">
+      <w:hyperlink w:anchor="_Toc241397308" w:history="1">
         <w:r>
           <w:rPr>
             <w:rStyle w:val="aff1"/>
@@ -3090,7 +3090,7 @@
             <w:noProof/>
             <w:webHidden/>
           </w:rPr>
-          <w:instrText xml:space="preserve"> PAGEREF _Toc241099464 \h </w:instrText>
+          <w:instrText xml:space="preserve"> PAGEREF _Toc241397308 \h </w:instrText>
         </w:r>
         <w:r>
           <w:rPr>
@@ -3138,7 +3138,7 @@
           <w14:ligatures w14:val="standardContextual"/>
         </w:rPr>
       </w:pPr>
-      <w:hyperlink w:anchor="_Toc241099465" w:history="1">
+      <w:hyperlink w:anchor="_Toc241397309" w:history="1">
         <w:r>
           <w:rPr>
             <w:rStyle w:val="aff1"/>
@@ -3165,7 +3165,7 @@
             <w:noProof/>
             <w:webHidden/>
           </w:rPr>
-          <w:instrText xml:space="preserve"> PAGEREF _Toc241099465 \h </w:instrText>
+          <w:instrText xml:space="preserve"> PAGEREF _Toc241397309 \h </w:instrText>
         </w:r>
         <w:r>
           <w:rPr>
@@ -3214,7 +3214,7 @@
           <w14:ligatures w14:val="standardContextual"/>
         </w:rPr>
       </w:pPr>
-      <w:hyperlink w:anchor="_Toc241099466" w:history="1">
+      <w:hyperlink w:anchor="_Toc241397310" w:history="1">
         <w:r>
           <w:rPr>
             <w:rStyle w:val="aff1"/>
@@ -3241,7 +3241,7 @@
             <w:noProof/>
             <w:webHidden/>
           </w:rPr>
-          <w:instrText xml:space="preserve"> PAGEREF _Toc241099466 \h </w:instrText>
+          <w:instrText xml:space="preserve"> PAGEREF _Toc241397310 \h </w:instrText>
         </w:r>
         <w:r>
           <w:rPr>
@@ -3290,7 +3290,7 @@
           <w14:ligatures w14:val="standardContextual"/>
         </w:rPr>
       </w:pPr>
-      <w:hyperlink w:anchor="_Toc241099467" w:history="1">
+      <w:hyperlink w:anchor="_Toc241397311" w:history="1">
         <w:r>
           <w:rPr>
             <w:rStyle w:val="aff1"/>
@@ -3317,7 +3317,7 @@
             <w:noProof/>
             <w:webHidden/>
           </w:rPr>
-          <w:instrText xml:space="preserve"> PAGEREF _Toc241099467 \h </w:instrText>
+          <w:instrText xml:space="preserve"> PAGEREF _Toc241397311 \h </w:instrText>
         </w:r>
         <w:r>
           <w:rPr>
@@ -3366,7 +3366,7 @@
           <w14:ligatures w14:val="standardContextual"/>
         </w:rPr>
       </w:pPr>
-      <w:hyperlink w:anchor="_Toc241099468" w:history="1">
+      <w:hyperlink w:anchor="_Toc241397312" w:history="1">
         <w:r>
           <w:rPr>
             <w:rStyle w:val="aff1"/>
@@ -3393,7 +3393,7 @@
             <w:noProof/>
             <w:webHidden/>
           </w:rPr>
-          <w:instrText xml:space="preserve"> PAGEREF _Toc241099468 \h </w:instrText>
+          <w:instrText xml:space="preserve"> PAGEREF _Toc241397312 \h </w:instrText>
         </w:r>
         <w:r>
           <w:rPr>
@@ -3442,7 +3442,7 @@
           <w14:ligatures w14:val="standardContextual"/>
         </w:rPr>
       </w:pPr>
-      <w:hyperlink w:anchor="_Toc241099469" w:history="1">
+      <w:hyperlink w:anchor="_Toc241397313" w:history="1">
         <w:r>
           <w:rPr>
             <w:rStyle w:val="aff1"/>
@@ -3469,7 +3469,7 @@
             <w:noProof/>
             <w:webHidden/>
           </w:rPr>
-          <w:instrText xml:space="preserve"> PAGEREF _Toc241099469 \h </w:instrText>
+          <w:instrText xml:space="preserve"> PAGEREF _Toc241397313 \h </w:instrText>
         </w:r>
         <w:r>
           <w:rPr>
@@ -3518,7 +3518,7 @@
           <w14:ligatures w14:val="standardContextual"/>
         </w:rPr>
       </w:pPr>
-      <w:hyperlink w:anchor="_Toc241099470" w:history="1">
+      <w:hyperlink w:anchor="_Toc241397314" w:history="1">
         <w:r>
           <w:rPr>
             <w:rStyle w:val="aff1"/>
@@ -3545,7 +3545,7 @@
             <w:noProof/>
             <w:webHidden/>
           </w:rPr>
-          <w:instrText xml:space="preserve"> PAGEREF _Toc241099470 \h </w:instrText>
+          <w:instrText xml:space="preserve"> PAGEREF _Toc241397314 \h </w:instrText>
         </w:r>
         <w:r>
           <w:rPr>
@@ -3594,7 +3594,7 @@
           <w14:ligatures w14:val="standardContextual"/>
         </w:rPr>
       </w:pPr>
-      <w:hyperlink w:anchor="_Toc241099471" w:history="1">
+      <w:hyperlink w:anchor="_Toc241397315" w:history="1">
         <w:r>
           <w:rPr>
             <w:rStyle w:val="aff1"/>
@@ -3621,7 +3621,7 @@
             <w:noProof/>
             <w:webHidden/>
           </w:rPr>
-          <w:instrText xml:space="preserve"> PAGEREF _Toc241099471 \h </w:instrText>
+          <w:instrText xml:space="preserve"> PAGEREF _Toc241397315 \h </w:instrText>
         </w:r>
         <w:r>
           <w:rPr>
@@ -3670,7 +3670,7 @@
           <w14:ligatures w14:val="standardContextual"/>
         </w:rPr>
       </w:pPr>
-      <w:hyperlink w:anchor="_Toc241099472" w:history="1">
+      <w:hyperlink w:anchor="_Toc241397316" w:history="1">
         <w:r>
           <w:rPr>
             <w:rStyle w:val="aff1"/>
@@ -3697,7 +3697,7 @@
             <w:noProof/>
             <w:webHidden/>
           </w:rPr>
-          <w:instrText xml:space="preserve"> PAGEREF _Toc241099472 \h </w:instrText>
+          <w:instrText xml:space="preserve"> PAGEREF _Toc241397316 \h </w:instrText>
         </w:r>
         <w:r>
           <w:rPr>
@@ -3746,7 +3746,7 @@
           <w14:ligatures w14:val="standardContextual"/>
         </w:rPr>
       </w:pPr>
-      <w:hyperlink w:anchor="_Toc241099473" w:history="1">
+      <w:hyperlink w:anchor="_Toc241397317" w:history="1">
         <w:r>
           <w:rPr>
             <w:rStyle w:val="aff1"/>
@@ -3773,7 +3773,7 @@
             <w:noProof/>
             <w:webHidden/>
           </w:rPr>
-          <w:instrText xml:space="preserve"> PAGEREF _Toc241099473 \h </w:instrText>
+          <w:instrText xml:space="preserve"> PAGEREF _Toc241397317 \h </w:instrText>
         </w:r>
         <w:r>
           <w:rPr>
@@ -3822,7 +3822,7 @@
           <w14:ligatures w14:val="standardContextual"/>
         </w:rPr>
       </w:pPr>
-      <w:hyperlink w:anchor="_Toc241099474" w:history="1">
+      <w:hyperlink w:anchor="_Toc241397318" w:history="1">
         <w:r>
           <w:rPr>
             <w:rStyle w:val="aff1"/>
@@ -3849,7 +3849,7 @@
             <w:noProof/>
             <w:webHidden/>
           </w:rPr>
-          <w:instrText xml:space="preserve"> PAGEREF _Toc241099474 \h </w:instrText>
+          <w:instrText xml:space="preserve"> PAGEREF _Toc241397318 \h </w:instrText>
         </w:r>
         <w:r>
           <w:rPr>
@@ -3897,7 +3897,7 @@
           <w14:ligatures w14:val="standardContextual"/>
         </w:rPr>
       </w:pPr>
-      <w:hyperlink w:anchor="_Toc241099475" w:history="1">
+      <w:hyperlink w:anchor="_Toc241397319" w:history="1">
         <w:r>
           <w:rPr>
             <w:rStyle w:val="aff1"/>
@@ -3924,7 +3924,7 @@
             <w:noProof/>
             <w:webHidden/>
           </w:rPr>
-          <w:instrText xml:space="preserve"> PAGEREF _Toc241099475 \h </w:instrText>
+          <w:instrText xml:space="preserve"> PAGEREF _Toc241397319 \h </w:instrText>
         </w:r>
         <w:r>
           <w:rPr>
@@ -3973,7 +3973,7 @@
           <w14:ligatures w14:val="standardContextual"/>
         </w:rPr>
       </w:pPr>
-      <w:hyperlink w:anchor="_Toc241099476" w:history="1">
+      <w:hyperlink w:anchor="_Toc241397320" w:history="1">
         <w:r>
           <w:rPr>
             <w:rStyle w:val="aff1"/>
@@ -4000,7 +4000,7 @@
             <w:noProof/>
             <w:webHidden/>
           </w:rPr>
-          <w:instrText xml:space="preserve"> PAGEREF _Toc241099476 \h </w:instrText>
+          <w:instrText xml:space="preserve"> PAGEREF _Toc241397320 \h </w:instrText>
         </w:r>
         <w:r>
           <w:rPr>
@@ -4049,7 +4049,7 @@
           <w14:ligatures w14:val="standardContextual"/>
         </w:rPr>
       </w:pPr>
-      <w:hyperlink w:anchor="_Toc241099477" w:history="1">
+      <w:hyperlink w:anchor="_Toc241397321" w:history="1">
         <w:r>
           <w:rPr>
             <w:rStyle w:val="aff1"/>
@@ -4076,7 +4076,7 @@
             <w:noProof/>
             <w:webHidden/>
           </w:rPr>
-          <w:instrText xml:space="preserve"> PAGEREF _Toc241099477 \h </w:instrText>
+          <w:instrText xml:space="preserve"> PAGEREF _Toc241397321 \h </w:instrText>
         </w:r>
         <w:r>
           <w:rPr>
@@ -4125,7 +4125,7 @@
           <w14:ligatures w14:val="standardContextual"/>
         </w:rPr>
       </w:pPr>
-      <w:hyperlink w:anchor="_Toc241099478" w:history="1">
+      <w:hyperlink w:anchor="_Toc241397322" w:history="1">
         <w:r>
           <w:rPr>
             <w:rStyle w:val="aff1"/>
@@ -4152,7 +4152,7 @@
             <w:noProof/>
             <w:webHidden/>
           </w:rPr>
-          <w:instrText xml:space="preserve"> PAGEREF _Toc241099478 \h </w:instrText>
+          <w:instrText xml:space="preserve"> PAGEREF _Toc241397322 \h </w:instrText>
         </w:r>
         <w:r>
           <w:rPr>
@@ -4201,7 +4201,7 @@
           <w14:ligatures w14:val="standardContextual"/>
         </w:rPr>
       </w:pPr>
-      <w:hyperlink w:anchor="_Toc241099479" w:history="1">
+      <w:hyperlink w:anchor="_Toc241397323" w:history="1">
         <w:r>
           <w:rPr>
             <w:rStyle w:val="aff1"/>
@@ -4228,7 +4228,7 @@
             <w:noProof/>
             <w:webHidden/>
           </w:rPr>
-          <w:instrText xml:space="preserve"> PAGEREF _Toc241099479 \h </w:instrText>
+          <w:instrText xml:space="preserve"> PAGEREF _Toc241397323 \h </w:instrText>
         </w:r>
         <w:r>
           <w:rPr>
@@ -4277,7 +4277,7 @@
           <w14:ligatures w14:val="standardContextual"/>
         </w:rPr>
       </w:pPr>
-      <w:hyperlink w:anchor="_Toc241099480" w:history="1">
+      <w:hyperlink w:anchor="_Toc241397324" w:history="1">
         <w:r>
           <w:rPr>
             <w:rStyle w:val="aff1"/>
@@ -4304,7 +4304,7 @@
             <w:noProof/>
             <w:webHidden/>
           </w:rPr>
-          <w:instrText xml:space="preserve"> PAGEREF _Toc241099480 \h </w:instrText>
+          <w:instrText xml:space="preserve"> PAGEREF _Toc241397324 \h </w:instrText>
         </w:r>
         <w:r>
           <w:rPr>
@@ -4353,7 +4353,7 @@
           <w14:ligatures w14:val="standardContextual"/>
         </w:rPr>
       </w:pPr>
-      <w:hyperlink w:anchor="_Toc241099481" w:history="1">
+      <w:hyperlink w:anchor="_Toc241397325" w:history="1">
         <w:r>
           <w:rPr>
             <w:rStyle w:val="aff1"/>
@@ -4380,7 +4380,7 @@
             <w:noProof/>
             <w:webHidden/>
           </w:rPr>
-          <w:instrText xml:space="preserve"> PAGEREF _Toc241099481 \h </w:instrText>
+          <w:instrText xml:space="preserve"> PAGEREF _Toc241397325 \h </w:instrText>
         </w:r>
         <w:r>
           <w:rPr>
@@ -4429,7 +4429,7 @@
           <w14:ligatures w14:val="standardContextual"/>
         </w:rPr>
       </w:pPr>
-      <w:hyperlink w:anchor="_Toc241099482" w:history="1">
+      <w:hyperlink w:anchor="_Toc241397326" w:history="1">
         <w:r>
           <w:rPr>
             <w:rStyle w:val="aff1"/>
@@ -4456,7 +4456,7 @@
             <w:noProof/>
             <w:webHidden/>
           </w:rPr>
-          <w:instrText xml:space="preserve"> PAGEREF _Toc241099482 \h </w:instrText>
+          <w:instrText xml:space="preserve"> PAGEREF _Toc241397326 \h </w:instrText>
         </w:r>
         <w:r>
           <w:rPr>
@@ -4505,7 +4505,7 @@
           <w14:ligatures w14:val="standardContextual"/>
         </w:rPr>
       </w:pPr>
-      <w:hyperlink w:anchor="_Toc241099483" w:history="1">
+      <w:hyperlink w:anchor="_Toc241397327" w:history="1">
         <w:r>
           <w:rPr>
             <w:rStyle w:val="aff1"/>
@@ -4532,7 +4532,7 @@
             <w:noProof/>
             <w:webHidden/>
           </w:rPr>
-          <w:instrText xml:space="preserve"> PAGEREF _Toc241099483 \h </w:instrText>
+          <w:instrText xml:space="preserve"> PAGEREF _Toc241397327 \h </w:instrText>
         </w:r>
         <w:r>
           <w:rPr>
@@ -4581,7 +4581,7 @@
           <w14:ligatures w14:val="standardContextual"/>
         </w:rPr>
       </w:pPr>
-      <w:hyperlink w:anchor="_Toc241099484" w:history="1">
+      <w:hyperlink w:anchor="_Toc241397328" w:history="1">
         <w:r>
           <w:rPr>
             <w:rStyle w:val="aff1"/>
@@ -4608,7 +4608,7 @@
             <w:noProof/>
             <w:webHidden/>
           </w:rPr>
-          <w:instrText xml:space="preserve"> PAGEREF _Toc241099484 \h </w:instrText>
+          <w:instrText xml:space="preserve"> PAGEREF _Toc241397328 \h </w:instrText>
         </w:r>
         <w:r>
           <w:rPr>
@@ -4656,7 +4656,7 @@
           <w14:ligatures w14:val="standardContextual"/>
         </w:rPr>
       </w:pPr>
-      <w:hyperlink w:anchor="_Toc241099485" w:history="1">
+      <w:hyperlink w:anchor="_Toc241397329" w:history="1">
         <w:r>
           <w:rPr>
             <w:rStyle w:val="aff1"/>
@@ -4683,7 +4683,7 @@
             <w:noProof/>
             <w:webHidden/>
           </w:rPr>
-          <w:instrText xml:space="preserve"> PAGEREF _Toc241099485 \h </w:instrText>
+          <w:instrText xml:space="preserve"> PAGEREF _Toc241397329 \h </w:instrText>
         </w:r>
         <w:r>
           <w:rPr>
@@ -4732,7 +4732,7 @@
           <w14:ligatures w14:val="standardContextual"/>
         </w:rPr>
       </w:pPr>
-      <w:hyperlink w:anchor="_Toc241099486" w:history="1">
+      <w:hyperlink w:anchor="_Toc241397330" w:history="1">
         <w:r>
           <w:rPr>
             <w:rStyle w:val="aff1"/>
@@ -4759,7 +4759,7 @@
             <w:noProof/>
             <w:webHidden/>
           </w:rPr>
-          <w:instrText xml:space="preserve"> PAGEREF _Toc241099486 \h </w:instrText>
+          <w:instrText xml:space="preserve"> PAGEREF _Toc241397330 \h </w:instrText>
         </w:r>
         <w:r>
           <w:rPr>
@@ -4808,7 +4808,7 @@
           <w14:ligatures w14:val="standardContextual"/>
         </w:rPr>
       </w:pPr>
-      <w:hyperlink w:anchor="_Toc241099487" w:history="1">
+      <w:hyperlink w:anchor="_Toc241397331" w:history="1">
         <w:r>
           <w:rPr>
             <w:rStyle w:val="aff1"/>
@@ -4835,7 +4835,7 @@
             <w:noProof/>
             <w:webHidden/>
           </w:rPr>
-          <w:instrText xml:space="preserve"> PAGEREF _Toc241099487 \h </w:instrText>
+          <w:instrText xml:space="preserve"> PAGEREF _Toc241397331 \h </w:instrText>
         </w:r>
         <w:r>
           <w:rPr>
@@ -4884,7 +4884,7 @@
           <w14:ligatures w14:val="standardContextual"/>
         </w:rPr>
       </w:pPr>
-      <w:hyperlink w:anchor="_Toc241099488" w:history="1">
+      <w:hyperlink w:anchor="_Toc241397332" w:history="1">
         <w:r>
           <w:rPr>
             <w:rStyle w:val="aff1"/>
@@ -4911,7 +4911,7 @@
             <w:noProof/>
             <w:webHidden/>
           </w:rPr>
-          <w:instrText xml:space="preserve"> PAGEREF _Toc241099488 \h </w:instrText>
+          <w:instrText xml:space="preserve"> PAGEREF _Toc241397332 \h </w:instrText>
         </w:r>
         <w:r>
           <w:rPr>
@@ -4960,7 +4960,7 @@
           <w14:ligatures w14:val="standardContextual"/>
         </w:rPr>
       </w:pPr>
-      <w:hyperlink w:anchor="_Toc241099489" w:history="1">
+      <w:hyperlink w:anchor="_Toc241397333" w:history="1">
         <w:r>
           <w:rPr>
             <w:rStyle w:val="aff1"/>
@@ -4987,7 +4987,7 @@
             <w:noProof/>
             <w:webHidden/>
           </w:rPr>
-          <w:instrText xml:space="preserve"> PAGEREF _Toc241099489 \h </w:instrText>
+          <w:instrText xml:space="preserve"> PAGEREF _Toc241397333 \h </w:instrText>
         </w:r>
         <w:r>
           <w:rPr>
@@ -5036,7 +5036,7 @@
           <w14:ligatures w14:val="standardContextual"/>
         </w:rPr>
       </w:pPr>
-      <w:hyperlink w:anchor="_Toc241099490" w:history="1">
+      <w:hyperlink w:anchor="_Toc241397334" w:history="1">
         <w:r>
           <w:rPr>
             <w:rStyle w:val="aff1"/>
@@ -5063,7 +5063,7 @@
             <w:noProof/>
             <w:webHidden/>
           </w:rPr>
-          <w:instrText xml:space="preserve"> PAGEREF _Toc241099490 \h </w:instrText>
+          <w:instrText xml:space="preserve"> PAGEREF _Toc241397334 \h </w:instrText>
         </w:r>
         <w:r>
           <w:rPr>
@@ -5112,7 +5112,7 @@
           <w14:ligatures w14:val="standardContextual"/>
         </w:rPr>
       </w:pPr>
-      <w:hyperlink w:anchor="_Toc241099491" w:history="1">
+      <w:hyperlink w:anchor="_Toc241397335" w:history="1">
         <w:r>
           <w:rPr>
             <w:rStyle w:val="aff1"/>
@@ -5139,7 +5139,7 @@
             <w:noProof/>
             <w:webHidden/>
           </w:rPr>
-          <w:instrText xml:space="preserve"> PAGEREF _Toc241099491 \h </w:instrText>
+          <w:instrText xml:space="preserve"> PAGEREF _Toc241397335 \h </w:instrText>
         </w:r>
         <w:r>
           <w:rPr>
@@ -5188,7 +5188,7 @@
           <w14:ligatures w14:val="standardContextual"/>
         </w:rPr>
       </w:pPr>
-      <w:hyperlink w:anchor="_Toc241099492" w:history="1">
+      <w:hyperlink w:anchor="_Toc241397336" w:history="1">
         <w:r>
           <w:rPr>
             <w:rStyle w:val="aff1"/>
@@ -5215,7 +5215,7 @@
             <w:noProof/>
             <w:webHidden/>
           </w:rPr>
-          <w:instrText xml:space="preserve"> PAGEREF _Toc241099492 \h </w:instrText>
+          <w:instrText xml:space="preserve"> PAGEREF _Toc241397336 \h </w:instrText>
         </w:r>
         <w:r>
           <w:rPr>
@@ -5263,7 +5263,7 @@
           <w14:ligatures w14:val="standardContextual"/>
         </w:rPr>
       </w:pPr>
-      <w:hyperlink w:anchor="_Toc241099493" w:history="1">
+      <w:hyperlink w:anchor="_Toc241397337" w:history="1">
         <w:r>
           <w:rPr>
             <w:rStyle w:val="aff1"/>
@@ -5290,7 +5290,7 @@
             <w:noProof/>
             <w:webHidden/>
           </w:rPr>
-          <w:instrText xml:space="preserve"> PAGEREF _Toc241099493 \h </w:instrText>
+          <w:instrText xml:space="preserve"> PAGEREF _Toc241397337 \h </w:instrText>
         </w:r>
         <w:r>
           <w:rPr>
@@ -5338,7 +5338,7 @@
           <w14:ligatures w14:val="standardContextual"/>
         </w:rPr>
       </w:pPr>
-      <w:hyperlink w:anchor="_Toc241099494" w:history="1">
+      <w:hyperlink w:anchor="_Toc241397338" w:history="1">
         <w:r>
           <w:rPr>
             <w:rStyle w:val="aff1"/>
@@ -5365,7 +5365,7 @@
             <w:noProof/>
             <w:webHidden/>
           </w:rPr>
-          <w:instrText xml:space="preserve"> PAGEREF _Toc241099494 \h </w:instrText>
+          <w:instrText xml:space="preserve"> PAGEREF _Toc241397338 \h </w:instrText>
         </w:r>
         <w:r>
           <w:rPr>
@@ -5413,7 +5413,7 @@
           <w14:ligatures w14:val="standardContextual"/>
         </w:rPr>
       </w:pPr>
-      <w:hyperlink w:anchor="_Toc241099495" w:history="1">
+      <w:hyperlink w:anchor="_Toc241397339" w:history="1">
         <w:r>
           <w:rPr>
             <w:rStyle w:val="aff1"/>
@@ -5440,7 +5440,7 @@
             <w:noProof/>
             <w:webHidden/>
           </w:rPr>
-          <w:instrText xml:space="preserve"> PAGEREF _Toc241099495 \h </w:instrText>
+          <w:instrText xml:space="preserve"> PAGEREF _Toc241397339 \h </w:instrText>
         </w:r>
         <w:r>
           <w:rPr>
@@ -5490,7 +5490,7 @@
           <w:numId w:val="7"/>
         </w:numPr>
       </w:pPr>
-      <w:bookmarkStart w:id="0" w:name="_Toc241099431"/>
+      <w:bookmarkStart w:id="0" w:name="_Toc241397275"/>
       <w:r>
         <w:lastRenderedPageBreak/>
         <w:t>게임</w:t>
@@ -5523,7 +5523,7 @@
           <w:numId w:val="7"/>
         </w:numPr>
       </w:pPr>
-      <w:bookmarkStart w:id="1" w:name="_Toc241099432"/>
+      <w:bookmarkStart w:id="1" w:name="_Toc241397276"/>
       <w:r>
         <w:t>Executive Summary</w:t>
       </w:r>
@@ -5594,7 +5594,7 @@
           <w:numId w:val="7"/>
         </w:numPr>
       </w:pPr>
-      <w:bookmarkStart w:id="2" w:name="_Toc241099433"/>
+      <w:bookmarkStart w:id="2" w:name="_Toc241397277"/>
       <w:r>
         <w:t>Rev 16 Release Profile</w:t>
       </w:r>
@@ -5618,7 +5618,7 @@
           <w:numId w:val="7"/>
         </w:numPr>
       </w:pPr>
-      <w:bookmarkStart w:id="3" w:name="_Toc241099434"/>
+      <w:bookmarkStart w:id="3" w:name="_Toc241397278"/>
       <w:r>
         <w:t>제품</w:t>
       </w:r>
@@ -5908,7 +5908,7 @@
           <w:numId w:val="7"/>
         </w:numPr>
       </w:pPr>
-      <w:bookmarkStart w:id="4" w:name="_Toc241099435"/>
+      <w:bookmarkStart w:id="4" w:name="_Toc241397279"/>
       <w:r>
         <w:t>디자인</w:t>
       </w:r>
@@ -6278,7 +6278,7 @@
           <w:numId w:val="7"/>
         </w:numPr>
       </w:pPr>
-      <w:bookmarkStart w:id="5" w:name="_Toc241099436"/>
+      <w:bookmarkStart w:id="5" w:name="_Toc241397280"/>
       <w:r>
         <w:t>Target Experience</w:t>
       </w:r>
@@ -6352,7 +6352,7 @@
           <w:numId w:val="7"/>
         </w:numPr>
       </w:pPr>
-      <w:bookmarkStart w:id="6" w:name="_Toc241099437"/>
+      <w:bookmarkStart w:id="6" w:name="_Toc241397281"/>
       <w:r>
         <w:t>명시적</w:t>
       </w:r>
@@ -6624,7 +6624,7 @@
           <w:numId w:val="7"/>
         </w:numPr>
       </w:pPr>
-      <w:bookmarkStart w:id="7" w:name="_Toc241099438"/>
+      <w:bookmarkStart w:id="7" w:name="_Toc241397282"/>
       <w:r>
         <w:lastRenderedPageBreak/>
         <w:t>Contract Run</w:t>
@@ -6660,7 +6660,7 @@
           <w:numId w:val="7"/>
         </w:numPr>
       </w:pPr>
-      <w:bookmarkStart w:id="8" w:name="_Toc241099439"/>
+      <w:bookmarkStart w:id="8" w:name="_Toc241397283"/>
       <w:r>
         <w:t>Core Loop</w:t>
       </w:r>
@@ -7154,7 +7154,7 @@
           <w:numId w:val="7"/>
         </w:numPr>
       </w:pPr>
-      <w:bookmarkStart w:id="9" w:name="_Toc241099440"/>
+      <w:bookmarkStart w:id="9" w:name="_Toc241397284"/>
       <w:r>
         <w:t xml:space="preserve">Contract </w:t>
       </w:r>
@@ -7578,7 +7578,7 @@
           <w:numId w:val="7"/>
         </w:numPr>
       </w:pPr>
-      <w:bookmarkStart w:id="10" w:name="_Toc241099441"/>
+      <w:bookmarkStart w:id="10" w:name="_Toc241397285"/>
       <w:r>
         <w:lastRenderedPageBreak/>
         <w:t>성공</w:t>
@@ -7870,7 +7870,7 @@
           <w:numId w:val="7"/>
         </w:numPr>
       </w:pPr>
-      <w:bookmarkStart w:id="11" w:name="_Toc241099442"/>
+      <w:bookmarkStart w:id="11" w:name="_Toc241397286"/>
       <w:r>
         <w:t>Greed Decision</w:t>
       </w:r>
@@ -8239,7 +8239,7 @@
           <w:numId w:val="7"/>
         </w:numPr>
       </w:pPr>
-      <w:bookmarkStart w:id="12" w:name="_Toc241099443"/>
+      <w:bookmarkStart w:id="12" w:name="_Toc241397287"/>
       <w:r>
         <w:t>15~25</w:t>
       </w:r>
@@ -8609,7 +8609,7 @@
           <w:numId w:val="7"/>
         </w:numPr>
       </w:pPr>
-      <w:bookmarkStart w:id="13" w:name="_Toc241099444"/>
+      <w:bookmarkStart w:id="13" w:name="_Toc241397288"/>
       <w:r>
         <w:lastRenderedPageBreak/>
         <w:t>위조와</w:t>
@@ -8636,7 +8636,7 @@
           <w:numId w:val="7"/>
         </w:numPr>
       </w:pPr>
-      <w:bookmarkStart w:id="14" w:name="_Toc241099445"/>
+      <w:bookmarkStart w:id="14" w:name="_Toc241397289"/>
       <w:r>
         <w:t>Artifact</w:t>
       </w:r>
@@ -8937,7 +8937,7 @@
           <w:numId w:val="7"/>
         </w:numPr>
       </w:pPr>
-      <w:bookmarkStart w:id="15" w:name="_Toc241099446"/>
+      <w:bookmarkStart w:id="15" w:name="_Toc241397290"/>
       <w:r>
         <w:t xml:space="preserve">Surface Forgery </w:t>
       </w:r>
@@ -9119,7 +9119,7 @@
           <w:numId w:val="7"/>
         </w:numPr>
       </w:pPr>
-      <w:bookmarkStart w:id="16" w:name="_Toc241099447"/>
+      <w:bookmarkStart w:id="16" w:name="_Toc241397291"/>
       <w:r>
         <w:lastRenderedPageBreak/>
         <w:t>Object Assembly — Deferred Expansion</w:t>
@@ -9187,7 +9187,7 @@
           <w:numId w:val="7"/>
         </w:numPr>
       </w:pPr>
-      <w:bookmarkStart w:id="17" w:name="_Toc241099448"/>
+      <w:bookmarkStart w:id="17" w:name="_Toc241397292"/>
       <w:r>
         <w:t>Quality</w:t>
       </w:r>
@@ -9476,7 +9476,7 @@
           <w:numId w:val="7"/>
         </w:numPr>
       </w:pPr>
-      <w:bookmarkStart w:id="18" w:name="_Toc241099449"/>
+      <w:bookmarkStart w:id="18" w:name="_Toc241397293"/>
       <w:r>
         <w:lastRenderedPageBreak/>
         <w:t>핵심</w:t>
@@ -9978,7 +9978,7 @@
           <w:numId w:val="7"/>
         </w:numPr>
       </w:pPr>
-      <w:bookmarkStart w:id="19" w:name="_Toc241099450"/>
+      <w:bookmarkStart w:id="19" w:name="_Toc241397294"/>
       <w:r>
         <w:t xml:space="preserve">Owner-only Forgery </w:t>
       </w:r>
@@ -10225,7 +10225,7 @@
           <w:numId w:val="7"/>
         </w:numPr>
       </w:pPr>
-      <w:bookmarkStart w:id="20" w:name="_Toc241099451"/>
+      <w:bookmarkStart w:id="20" w:name="_Toc241397295"/>
       <w:r>
         <w:lastRenderedPageBreak/>
         <w:t>잠입</w:t>
@@ -10258,7 +10258,7 @@
           <w:numId w:val="7"/>
         </w:numPr>
       </w:pPr>
-      <w:bookmarkStart w:id="21" w:name="_Toc241099452"/>
+      <w:bookmarkStart w:id="21" w:name="_Toc241397296"/>
       <w:r>
         <w:t xml:space="preserve">First-Person </w:t>
       </w:r>
@@ -10323,7 +10323,7 @@
           <w:numId w:val="7"/>
         </w:numPr>
       </w:pPr>
-      <w:bookmarkStart w:id="22" w:name="_Toc241099453"/>
+      <w:bookmarkStart w:id="22" w:name="_Toc241397297"/>
       <w:r>
         <w:t>Walk, Sprint, Weight, Footstep</w:t>
       </w:r>
@@ -10666,7 +10666,7 @@
           <w:numId w:val="7"/>
         </w:numPr>
       </w:pPr>
-      <w:bookmarkStart w:id="23" w:name="_Toc241099454"/>
+      <w:bookmarkStart w:id="23" w:name="_Toc241397298"/>
       <w:r>
         <w:t>Patrol Guard</w:t>
       </w:r>
@@ -11017,7 +11017,7 @@
           <w:numId w:val="7"/>
         </w:numPr>
       </w:pPr>
-      <w:bookmarkStart w:id="24" w:name="_Toc241099455"/>
+      <w:bookmarkStart w:id="24" w:name="_Toc241397299"/>
       <w:r>
         <w:t>CCTV</w:t>
       </w:r>
@@ -11267,7 +11267,7 @@
           <w:numId w:val="7"/>
         </w:numPr>
       </w:pPr>
-      <w:bookmarkStart w:id="25" w:name="_Toc241099456"/>
+      <w:bookmarkStart w:id="25" w:name="_Toc241397300"/>
       <w:r>
         <w:lastRenderedPageBreak/>
         <w:t>Stun, Arrest, Recovery</w:t>
@@ -11342,7 +11342,7 @@
           <w:numId w:val="7"/>
         </w:numPr>
       </w:pPr>
-      <w:bookmarkStart w:id="26" w:name="_Toc241099457"/>
+      <w:bookmarkStart w:id="26" w:name="_Toc241397301"/>
       <w:r>
         <w:t>두</w:t>
       </w:r>
@@ -11818,7 +11818,7 @@
           <w:numId w:val="7"/>
         </w:numPr>
       </w:pPr>
-      <w:bookmarkStart w:id="27" w:name="_Toc241099458"/>
+      <w:bookmarkStart w:id="27" w:name="_Toc241397302"/>
       <w:r>
         <w:lastRenderedPageBreak/>
         <w:t>협동</w:t>
@@ -11845,7 +11845,7 @@
           <w:numId w:val="7"/>
         </w:numPr>
       </w:pPr>
-      <w:bookmarkStart w:id="28" w:name="_Toc241099459"/>
+      <w:bookmarkStart w:id="28" w:name="_Toc241397303"/>
       <w:r>
         <w:t>Role Switching</w:t>
       </w:r>
@@ -12253,7 +12253,7 @@
           <w:numId w:val="7"/>
         </w:numPr>
       </w:pPr>
-      <w:bookmarkStart w:id="29" w:name="_Toc241099460"/>
+      <w:bookmarkStart w:id="29" w:name="_Toc241397304"/>
       <w:r>
         <w:t>거리</w:t>
       </w:r>
@@ -12312,7 +12312,7 @@
           <w:numId w:val="7"/>
         </w:numPr>
       </w:pPr>
-      <w:bookmarkStart w:id="30" w:name="_Toc241099461"/>
+      <w:bookmarkStart w:id="30" w:name="_Toc241397305"/>
       <w:r>
         <w:t>Inventory, Loose Loot, Coin</w:t>
       </w:r>
@@ -12375,7 +12375,7 @@
           <w:numId w:val="7"/>
         </w:numPr>
       </w:pPr>
-      <w:bookmarkStart w:id="31" w:name="_Toc241099462"/>
+      <w:bookmarkStart w:id="31" w:name="_Toc241397306"/>
       <w:r>
         <w:t>Player Identity</w:t>
       </w:r>
@@ -12798,7 +12798,7 @@
           <w:numId w:val="7"/>
         </w:numPr>
       </w:pPr>
-      <w:bookmarkStart w:id="32" w:name="_Toc241099463"/>
+      <w:bookmarkStart w:id="32" w:name="_Toc241397307"/>
       <w:r>
         <w:t xml:space="preserve">Floor Plan Map </w:t>
       </w:r>
@@ -13010,7 +13010,7 @@
           <w:numId w:val="7"/>
         </w:numPr>
       </w:pPr>
-      <w:bookmarkStart w:id="33" w:name="_Toc241099464"/>
+      <w:bookmarkStart w:id="33" w:name="_Toc241397308"/>
       <w:r>
         <w:t>Shared Extraction</w:t>
       </w:r>
@@ -13090,7 +13090,7 @@
           <w:numId w:val="7"/>
         </w:numPr>
       </w:pPr>
-      <w:bookmarkStart w:id="34" w:name="_Toc241099465"/>
+      <w:bookmarkStart w:id="34" w:name="_Toc241397309"/>
       <w:r>
         <w:lastRenderedPageBreak/>
         <w:t xml:space="preserve">UI, </w:t>
@@ -13119,7 +13119,7 @@
           <w:numId w:val="7"/>
         </w:numPr>
       </w:pPr>
-      <w:bookmarkStart w:id="35" w:name="_Toc241099466"/>
+      <w:bookmarkStart w:id="35" w:name="_Toc241397310"/>
       <w:r>
         <w:t>HUD Information Architecture</w:t>
       </w:r>
@@ -13420,7 +13420,7 @@
           <w:numId w:val="7"/>
         </w:numPr>
       </w:pPr>
-      <w:bookmarkStart w:id="36" w:name="_Toc241099467"/>
+      <w:bookmarkStart w:id="36" w:name="_Toc241397311"/>
       <w:r>
         <w:t xml:space="preserve">Main HUD </w:t>
       </w:r>
@@ -13735,7 +13735,7 @@
           <w:numId w:val="7"/>
         </w:numPr>
       </w:pPr>
-      <w:bookmarkStart w:id="37" w:name="_Toc241099468"/>
+      <w:bookmarkStart w:id="37" w:name="_Toc241397312"/>
       <w:r>
         <w:t>최소</w:t>
       </w:r>
@@ -13816,7 +13816,7 @@
           <w:numId w:val="7"/>
         </w:numPr>
       </w:pPr>
-      <w:bookmarkStart w:id="38" w:name="_Toc241099469"/>
+      <w:bookmarkStart w:id="38" w:name="_Toc241397313"/>
       <w:r>
         <w:t xml:space="preserve">Input Mode </w:t>
       </w:r>
@@ -14297,7 +14297,7 @@
           <w:numId w:val="7"/>
         </w:numPr>
       </w:pPr>
-      <w:bookmarkStart w:id="39" w:name="_Toc241099470"/>
+      <w:bookmarkStart w:id="39" w:name="_Toc241397314"/>
       <w:r>
         <w:t>Floor Plan</w:t>
       </w:r>
@@ -14320,7 +14320,7 @@
           <w:numId w:val="7"/>
         </w:numPr>
       </w:pPr>
-      <w:bookmarkStart w:id="40" w:name="_Toc241099471"/>
+      <w:bookmarkStart w:id="40" w:name="_Toc241397315"/>
       <w:r>
         <w:t xml:space="preserve">Floor Plan Map </w:t>
       </w:r>
@@ -14635,7 +14635,7 @@
           <w:numId w:val="7"/>
         </w:numPr>
       </w:pPr>
-      <w:bookmarkStart w:id="41" w:name="_Toc241099472"/>
+      <w:bookmarkStart w:id="41" w:name="_Toc241397316"/>
       <w:r>
         <w:t xml:space="preserve">Team Result / Replica Recap </w:t>
       </w:r>
@@ -15013,7 +15013,7 @@
           <w:numId w:val="7"/>
         </w:numPr>
       </w:pPr>
-      <w:bookmarkStart w:id="42" w:name="_Toc241099473"/>
+      <w:bookmarkStart w:id="42" w:name="_Toc241397317"/>
       <w:r>
         <w:t>첫</w:t>
       </w:r>
@@ -15288,7 +15288,7 @@
           <w:numId w:val="7"/>
         </w:numPr>
       </w:pPr>
-      <w:bookmarkStart w:id="43" w:name="_Toc241099474"/>
+      <w:bookmarkStart w:id="43" w:name="_Toc241397318"/>
       <w:r>
         <w:t>접근성</w:t>
       </w:r>
@@ -15360,7 +15360,7 @@
           <w:numId w:val="7"/>
         </w:numPr>
       </w:pPr>
-      <w:bookmarkStart w:id="44" w:name="_Toc241099475"/>
+      <w:bookmarkStart w:id="44" w:name="_Toc241397319"/>
       <w:r>
         <w:lastRenderedPageBreak/>
         <w:t>레벨</w:t>
@@ -15384,6 +15384,11 @@
         <w:t>방향</w:t>
       </w:r>
       <w:bookmarkEnd w:id="44"/>
+    </w:p>
+    <w:p>
+      <w:r>
+        <w:t>작품과 바닥은 기존 박물관 에셋의 형태와 재질을 활용한다. 작품은 Showcase Canvas 7종을 바탕으로 그림 면만 교체하고, 일반 전시와 훔칠 수 있는 전시의 구분을 유지한다. 바닥은 에디터에서 공용 PCG로 타일을 배치하며, 고정된 방·복도 구조를 유지한 채 타일 종류에만 변화를 준다. 런타임 맵 생성은 포함하지 않는다. 그림은 별도 흰 여백 없이 액자 안을 채우고, 비율을 유지한 채 가장자리를 잘라 맞춘다. 작은 작품도 관람 거리에서 읽히도록 키우되 주변 작품과 간격을 유지한다. 전시 조명은 작품 바로 위 천장에서 작품을 강조하고, 통로 조명은 길을 읽을 수 있는 낮은 밝기로 제한한다. Showcase Droplights 3종은 작품의 폭과 구성에 맞춰 선택하며, Drop Ceiling은 통로에만 사용한다. 종류를 순환하거나 무작위로 섞지 않는다. 야간 대비를 위해 기존 환경 광원의 밝기를 절반으로 낮춘다.</w:t>
+      </w:r>
     </w:p>
     <w:p>
       <w:pPr>
@@ -15393,7 +15398,7 @@
           <w:numId w:val="7"/>
         </w:numPr>
       </w:pPr>
-      <w:bookmarkStart w:id="45" w:name="_Toc241099476"/>
+      <w:bookmarkStart w:id="45" w:name="_Toc241397320"/>
       <w:r>
         <w:t>세</w:t>
       </w:r>
@@ -15488,11 +15493,11 @@
         <w:pStyle w:val="a0"/>
       </w:pPr>
       <w:r>
-        <w:t xml:space="preserve">전시실은 작품 벽과 관람 공간을 함께 설계한다. 승인 평면도 기준 외벽 0.40m, 내벽 0.24m, 일반 연결 문 3~4m, 후면 관리 회랑 약 5.5~5.7m를 사용한다. 작품 앞 작업 공간은 2.2m를 확보하며 활성 작품은 그림 표면에서 정면 0.7m의 근거리 접근점으로 진입할 수 있어야 한다. 맵별 활성 작품 20점, 일반 작품 M01 51점·M02 53점·M03 61점과 12종 전시 패턴을 배치한다. 통과 폭과 15~25분 플레이 시간은 실제 멀티플레이로 검증한다. 작품 발견과 다음 전시 구역 진입이 연달아 끝나지 않도록 맵별 바닥 면적을 이전 배치의 약 2배로 확장한다. 활성 작품 20점과 일반 작품 수, 군집 내부 간격, 액자·문·상호작용 영역 크기와 위조 시간은 유지하고 구역 및 군집 사이 이동 거리를 늘린다. 기존 엇갈린 출입구와 차폐벽을 유지하며 탐색·위험 판단·귀환에 드는 시간을 함께 평가한다. 면적 증가를 15~25분 플레이 시간 달성으로 간주하지 않고 실제 경로와 플레이 </w:t>
+        <w:t xml:space="preserve">전시실은 작품 벽과 관람 공간을 함께 설계한다. 승인 평면도 기준 외벽 0.40m, 내벽 0.24m, 일반 연결 문 3~4m, 후면 관리 회랑 약 5.5~5.7m를 사용한다. 작품 앞 작업 공간은 2.2m를 확보하며 </w:t>
       </w:r>
       <w:r>
         <w:lastRenderedPageBreak/>
-        <w:t>테스트로 검증한다. 초반 전시실과 필수 작품 전시실에는 높이 3.2m의 벽 연결형 차폐벽을 총 7개 배치해 한 자리에서 여러 작품을 연속 확인하는 시야를 나누고, 벽 끝의 열린 통로로 우회하도록 한다.</w:t>
+        <w:t>활성 작품은 그림 표면에서 정면 0.7m의 근거리 접근점으로 진입할 수 있어야 한다. 맵별 활성 작품 20점, 일반 작품 M01 51점·M02 53점·M03 61점과 12종 전시 패턴을 배치한다. 통과 폭과 15~25분 플레이 시간은 실제 멀티플레이로 검증한다. 작품 발견과 다음 전시 구역 진입이 연달아 끝나지 않도록 맵별 바닥 면적을 이전 배치의 약 2배로 확장한다. 활성 작품 20점과 일반 작품 수, 군집 내부 간격, 액자·문·상호작용 영역 크기와 위조 시간은 유지하고 구역 및 군집 사이 이동 거리를 늘린다. 기존 엇갈린 출입구와 차폐벽을 유지하며 탐색·위험 판단·귀환에 드는 시간을 함께 평가한다. 면적 증가를 15~25분 플레이 시간 달성으로 간주하지 않고 실제 경로와 플레이 테스트로 검증한다. 초반 전시실과 필수 작품 전시실에는 높이 3.2m의 벽 연결형 차폐벽을 총 7개 배치해 한 자리에서 여러 작품을 연속 확인하는 시야를 나누고, 벽 끝의 열린 통로로 우회하도록 한다.</w:t>
       </w:r>
     </w:p>
     <w:p>
@@ -15512,7 +15517,7 @@
       <w:pPr>
         <w:pStyle w:val="31"/>
       </w:pPr>
-      <w:bookmarkStart w:id="46" w:name="_Toc241099477"/>
+      <w:bookmarkStart w:id="46" w:name="_Toc241397321"/>
       <w:r>
         <w:t>전시</w:t>
       </w:r>
@@ -15568,6 +15573,7 @@
         <w:pStyle w:val="a0"/>
       </w:pPr>
       <w:r>
+        <w:lastRenderedPageBreak/>
         <w:t>하단 기준선형 · 비대칭 균형형 · 여백으로 나눈 두 쌍형 · 코너를 잇는 2벽형: 다른 크기의 작품을 정렬하거나 군집을 분리하고 관람 방향을 전환한다.</w:t>
       </w:r>
     </w:p>
@@ -15584,9 +15590,8 @@
           <w:numId w:val="7"/>
         </w:numPr>
       </w:pPr>
-      <w:bookmarkStart w:id="47" w:name="_Toc241099478"/>
-      <w:r>
-        <w:lastRenderedPageBreak/>
+      <w:bookmarkStart w:id="47" w:name="_Toc241397322"/>
+      <w:r>
         <w:t>맵</w:t>
       </w:r>
       <w:r>
@@ -16026,7 +16031,7 @@
           <w:numId w:val="7"/>
         </w:numPr>
       </w:pPr>
-      <w:bookmarkStart w:id="48" w:name="_Toc241099479"/>
+      <w:bookmarkStart w:id="48" w:name="_Toc241397323"/>
       <w:r>
         <w:lastRenderedPageBreak/>
         <w:t xml:space="preserve">M01 — </w:t>
@@ -16340,7 +16345,7 @@
           <w:numId w:val="7"/>
         </w:numPr>
       </w:pPr>
-      <w:bookmarkStart w:id="49" w:name="_Toc241099480"/>
+      <w:bookmarkStart w:id="49" w:name="_Toc241397324"/>
       <w:r>
         <w:lastRenderedPageBreak/>
         <w:t xml:space="preserve">M02 — </w:t>
@@ -16651,7 +16656,7 @@
           <w:numId w:val="7"/>
         </w:numPr>
       </w:pPr>
-      <w:bookmarkStart w:id="50" w:name="_Toc241099481"/>
+      <w:bookmarkStart w:id="50" w:name="_Toc241397325"/>
       <w:r>
         <w:lastRenderedPageBreak/>
         <w:t xml:space="preserve">M03 — </w:t>
@@ -16956,7 +16961,7 @@
           <w:numId w:val="7"/>
         </w:numPr>
       </w:pPr>
-      <w:bookmarkStart w:id="51" w:name="_Toc241099482"/>
+      <w:bookmarkStart w:id="51" w:name="_Toc241397326"/>
       <w:r>
         <w:lastRenderedPageBreak/>
         <w:t xml:space="preserve">First-Person </w:t>
@@ -17040,7 +17045,7 @@
           <w:numId w:val="7"/>
         </w:numPr>
       </w:pPr>
-      <w:bookmarkStart w:id="52" w:name="_Toc241099483"/>
+      <w:bookmarkStart w:id="52" w:name="_Toc241397327"/>
       <w:r>
         <w:t>사운드</w:t>
       </w:r>
@@ -17480,7 +17485,7 @@
           <w:numId w:val="7"/>
         </w:numPr>
       </w:pPr>
-      <w:bookmarkStart w:id="53" w:name="_Toc241099484"/>
+      <w:bookmarkStart w:id="53" w:name="_Toc241397328"/>
       <w:r>
         <w:lastRenderedPageBreak/>
         <w:t>세계관과</w:t>
@@ -17727,7 +17732,7 @@
           <w:numId w:val="7"/>
         </w:numPr>
       </w:pPr>
-      <w:bookmarkStart w:id="54" w:name="_Toc241099485"/>
+      <w:bookmarkStart w:id="54" w:name="_Toc241397329"/>
       <w:r>
         <w:lastRenderedPageBreak/>
         <w:t>범위</w:t>
@@ -17754,7 +17759,7 @@
           <w:numId w:val="7"/>
         </w:numPr>
       </w:pPr>
-      <w:bookmarkStart w:id="55" w:name="_Toc241099486"/>
+      <w:bookmarkStart w:id="55" w:name="_Toc241397330"/>
       <w:r>
         <w:t>v1.0 Required Scope</w:t>
       </w:r>
@@ -18122,7 +18127,7 @@
           <w:numId w:val="7"/>
         </w:numPr>
       </w:pPr>
-      <w:bookmarkStart w:id="56" w:name="_Toc241099487"/>
+      <w:bookmarkStart w:id="56" w:name="_Toc241397331"/>
       <w:r>
         <w:t>Deferred Expansion</w:t>
       </w:r>
@@ -18146,7 +18151,7 @@
           <w:numId w:val="7"/>
         </w:numPr>
       </w:pPr>
-      <w:bookmarkStart w:id="57" w:name="_Toc241099488"/>
+      <w:bookmarkStart w:id="57" w:name="_Toc241397332"/>
       <w:r>
         <w:t>Stretch</w:t>
       </w:r>
@@ -18524,7 +18529,7 @@
           <w:numId w:val="7"/>
         </w:numPr>
       </w:pPr>
-      <w:bookmarkStart w:id="58" w:name="_Toc241099489"/>
+      <w:bookmarkStart w:id="58" w:name="_Toc241397333"/>
       <w:r>
         <w:lastRenderedPageBreak/>
         <w:t>Starting Balance Targets</w:t>
@@ -19123,7 +19128,7 @@
           <w:numId w:val="7"/>
         </w:numPr>
       </w:pPr>
-      <w:bookmarkStart w:id="59" w:name="_Toc241099490"/>
+      <w:bookmarkStart w:id="59" w:name="_Toc241397334"/>
       <w:r>
         <w:t>Playtest Questions</w:t>
       </w:r>
@@ -19209,7 +19214,7 @@
           <w:numId w:val="7"/>
         </w:numPr>
       </w:pPr>
-      <w:bookmarkStart w:id="60" w:name="_Toc241099491"/>
+      <w:bookmarkStart w:id="60" w:name="_Toc241397335"/>
       <w:r>
         <w:lastRenderedPageBreak/>
         <w:t>Release KPI</w:t>
@@ -19541,7 +19546,7 @@
           <w:numId w:val="7"/>
         </w:numPr>
       </w:pPr>
-      <w:bookmarkStart w:id="61" w:name="_Toc241099492"/>
+      <w:bookmarkStart w:id="61" w:name="_Toc241397336"/>
       <w:r>
         <w:t>W6~W12 Roadmap</w:t>
       </w:r>
@@ -19907,7 +19912,7 @@
         <w:keepLines/>
         <w:pageBreakBefore w:val="0"/>
       </w:pPr>
-      <w:bookmarkStart w:id="62" w:name="_Toc241099493"/>
+      <w:bookmarkStart w:id="62" w:name="_Toc241397337"/>
       <w:r>
         <w:t>Appendix A — 용어</w:t>
       </w:r>
@@ -20298,7 +20303,7 @@
         <w:keepLines/>
         <w:pageBreakBefore w:val="0"/>
       </w:pPr>
-      <w:bookmarkStart w:id="63" w:name="_Toc241099494"/>
+      <w:bookmarkStart w:id="63" w:name="_Toc241397338"/>
       <w:r>
         <w:rPr>
           <w:sz w:val="32"/>
@@ -20439,11 +20444,8 @@
             <w:vAlign w:val="center"/>
           </w:tcPr>
           <w:p>
-            <w:pPr>
-              <w:pStyle w:val="TableText"/>
-            </w:pPr>
-            <w:r>
-              <w:t>PvP, Progression, Dedicated Server, PCG, Security Room Hack/전역 CCTV Disable/Control Minigame, Cinematic, Perspective Toggle, Minimap/Radar, Stamina</w:t>
+            <w:r>
+              <w:t>PvP, Progression, Dedicated Server, 런타임 절차형 맵 생성, Security Room Hack/전역 CCTV Disable/Control Minigame, Cinematic, Perspective Toggle, Minimap/Radar, Stamina</w:t>
             </w:r>
           </w:p>
         </w:tc>
@@ -20525,7 +20527,7 @@
         <w:keepLines/>
         <w:pageBreakBefore w:val="0"/>
       </w:pPr>
-      <w:bookmarkStart w:id="64" w:name="_Toc241099495"/>
+      <w:bookmarkStart w:id="64" w:name="_Toc241397339"/>
       <w:r>
         <w:rPr>
           <w:sz w:val="32"/>

</xml_diff>

<commit_message>
Rebuild M03 gallery and refine shared lighting and artwork
</commit_message>
<xml_diff>
--- a/Museum_Heist_GDD.docx
+++ b/Museum_Heist_GDD.docx
@@ -559,7 +559,7 @@
       <w:r>
         <w:fldChar w:fldCharType="separate"/>
       </w:r>
-      <w:hyperlink w:anchor="_Toc241397275" w:history="1">
+      <w:hyperlink w:anchor="_Toc241417928" w:history="1">
         <w:r>
           <w:rPr>
             <w:rStyle w:val="aff1"/>
@@ -586,7 +586,7 @@
             <w:noProof/>
             <w:webHidden/>
           </w:rPr>
-          <w:instrText xml:space="preserve"> PAGEREF _Toc241397275 \h </w:instrText>
+          <w:instrText xml:space="preserve"> PAGEREF _Toc241417928 \h </w:instrText>
         </w:r>
         <w:r>
           <w:rPr>
@@ -635,7 +635,7 @@
           <w14:ligatures w14:val="standardContextual"/>
         </w:rPr>
       </w:pPr>
-      <w:hyperlink w:anchor="_Toc241397276" w:history="1">
+      <w:hyperlink w:anchor="_Toc241417929" w:history="1">
         <w:r>
           <w:rPr>
             <w:rStyle w:val="aff1"/>
@@ -662,7 +662,7 @@
             <w:noProof/>
             <w:webHidden/>
           </w:rPr>
-          <w:instrText xml:space="preserve"> PAGEREF _Toc241397276 \h </w:instrText>
+          <w:instrText xml:space="preserve"> PAGEREF _Toc241417929 \h </w:instrText>
         </w:r>
         <w:r>
           <w:rPr>
@@ -711,7 +711,7 @@
           <w14:ligatures w14:val="standardContextual"/>
         </w:rPr>
       </w:pPr>
-      <w:hyperlink w:anchor="_Toc241397277" w:history="1">
+      <w:hyperlink w:anchor="_Toc241417930" w:history="1">
         <w:r>
           <w:rPr>
             <w:rStyle w:val="aff1"/>
@@ -738,7 +738,7 @@
             <w:noProof/>
             <w:webHidden/>
           </w:rPr>
-          <w:instrText xml:space="preserve"> PAGEREF _Toc241397277 \h </w:instrText>
+          <w:instrText xml:space="preserve"> PAGEREF _Toc241417930 \h </w:instrText>
         </w:r>
         <w:r>
           <w:rPr>
@@ -787,7 +787,7 @@
           <w14:ligatures w14:val="standardContextual"/>
         </w:rPr>
       </w:pPr>
-      <w:hyperlink w:anchor="_Toc241397278" w:history="1">
+      <w:hyperlink w:anchor="_Toc241417931" w:history="1">
         <w:r>
           <w:rPr>
             <w:rStyle w:val="aff1"/>
@@ -814,7 +814,7 @@
             <w:noProof/>
             <w:webHidden/>
           </w:rPr>
-          <w:instrText xml:space="preserve"> PAGEREF _Toc241397278 \h </w:instrText>
+          <w:instrText xml:space="preserve"> PAGEREF _Toc241417931 \h </w:instrText>
         </w:r>
         <w:r>
           <w:rPr>
@@ -863,7 +863,7 @@
           <w14:ligatures w14:val="standardContextual"/>
         </w:rPr>
       </w:pPr>
-      <w:hyperlink w:anchor="_Toc241397279" w:history="1">
+      <w:hyperlink w:anchor="_Toc241417932" w:history="1">
         <w:r>
           <w:rPr>
             <w:rStyle w:val="aff1"/>
@@ -890,7 +890,7 @@
             <w:noProof/>
             <w:webHidden/>
           </w:rPr>
-          <w:instrText xml:space="preserve"> PAGEREF _Toc241397279 \h </w:instrText>
+          <w:instrText xml:space="preserve"> PAGEREF _Toc241417932 \h </w:instrText>
         </w:r>
         <w:r>
           <w:rPr>
@@ -939,7 +939,7 @@
           <w14:ligatures w14:val="standardContextual"/>
         </w:rPr>
       </w:pPr>
-      <w:hyperlink w:anchor="_Toc241397280" w:history="1">
+      <w:hyperlink w:anchor="_Toc241417933" w:history="1">
         <w:r>
           <w:rPr>
             <w:rStyle w:val="aff1"/>
@@ -966,7 +966,7 @@
             <w:noProof/>
             <w:webHidden/>
           </w:rPr>
-          <w:instrText xml:space="preserve"> PAGEREF _Toc241397280 \h </w:instrText>
+          <w:instrText xml:space="preserve"> PAGEREF _Toc241417933 \h </w:instrText>
         </w:r>
         <w:r>
           <w:rPr>
@@ -1015,7 +1015,7 @@
           <w14:ligatures w14:val="standardContextual"/>
         </w:rPr>
       </w:pPr>
-      <w:hyperlink w:anchor="_Toc241397281" w:history="1">
+      <w:hyperlink w:anchor="_Toc241417934" w:history="1">
         <w:r>
           <w:rPr>
             <w:rStyle w:val="aff1"/>
@@ -1042,7 +1042,7 @@
             <w:noProof/>
             <w:webHidden/>
           </w:rPr>
-          <w:instrText xml:space="preserve"> PAGEREF _Toc241397281 \h </w:instrText>
+          <w:instrText xml:space="preserve"> PAGEREF _Toc241417934 \h </w:instrText>
         </w:r>
         <w:r>
           <w:rPr>
@@ -1090,7 +1090,7 @@
           <w14:ligatures w14:val="standardContextual"/>
         </w:rPr>
       </w:pPr>
-      <w:hyperlink w:anchor="_Toc241397282" w:history="1">
+      <w:hyperlink w:anchor="_Toc241417935" w:history="1">
         <w:r>
           <w:rPr>
             <w:rStyle w:val="aff1"/>
@@ -1117,7 +1117,7 @@
             <w:noProof/>
             <w:webHidden/>
           </w:rPr>
-          <w:instrText xml:space="preserve"> PAGEREF _Toc241397282 \h </w:instrText>
+          <w:instrText xml:space="preserve"> PAGEREF _Toc241417935 \h </w:instrText>
         </w:r>
         <w:r>
           <w:rPr>
@@ -1166,7 +1166,7 @@
           <w14:ligatures w14:val="standardContextual"/>
         </w:rPr>
       </w:pPr>
-      <w:hyperlink w:anchor="_Toc241397283" w:history="1">
+      <w:hyperlink w:anchor="_Toc241417936" w:history="1">
         <w:r>
           <w:rPr>
             <w:rStyle w:val="aff1"/>
@@ -1193,7 +1193,7 @@
             <w:noProof/>
             <w:webHidden/>
           </w:rPr>
-          <w:instrText xml:space="preserve"> PAGEREF _Toc241397283 \h </w:instrText>
+          <w:instrText xml:space="preserve"> PAGEREF _Toc241417936 \h </w:instrText>
         </w:r>
         <w:r>
           <w:rPr>
@@ -1242,7 +1242,7 @@
           <w14:ligatures w14:val="standardContextual"/>
         </w:rPr>
       </w:pPr>
-      <w:hyperlink w:anchor="_Toc241397284" w:history="1">
+      <w:hyperlink w:anchor="_Toc241417937" w:history="1">
         <w:r>
           <w:rPr>
             <w:rStyle w:val="aff1"/>
@@ -1269,7 +1269,7 @@
             <w:noProof/>
             <w:webHidden/>
           </w:rPr>
-          <w:instrText xml:space="preserve"> PAGEREF _Toc241397284 \h </w:instrText>
+          <w:instrText xml:space="preserve"> PAGEREF _Toc241417937 \h </w:instrText>
         </w:r>
         <w:r>
           <w:rPr>
@@ -1318,7 +1318,7 @@
           <w14:ligatures w14:val="standardContextual"/>
         </w:rPr>
       </w:pPr>
-      <w:hyperlink w:anchor="_Toc241397285" w:history="1">
+      <w:hyperlink w:anchor="_Toc241417938" w:history="1">
         <w:r>
           <w:rPr>
             <w:rStyle w:val="aff1"/>
@@ -1345,7 +1345,7 @@
             <w:noProof/>
             <w:webHidden/>
           </w:rPr>
-          <w:instrText xml:space="preserve"> PAGEREF _Toc241397285 \h </w:instrText>
+          <w:instrText xml:space="preserve"> PAGEREF _Toc241417938 \h </w:instrText>
         </w:r>
         <w:r>
           <w:rPr>
@@ -1394,7 +1394,7 @@
           <w14:ligatures w14:val="standardContextual"/>
         </w:rPr>
       </w:pPr>
-      <w:hyperlink w:anchor="_Toc241397286" w:history="1">
+      <w:hyperlink w:anchor="_Toc241417939" w:history="1">
         <w:r>
           <w:rPr>
             <w:rStyle w:val="aff1"/>
@@ -1421,7 +1421,7 @@
             <w:noProof/>
             <w:webHidden/>
           </w:rPr>
-          <w:instrText xml:space="preserve"> PAGEREF _Toc241397286 \h </w:instrText>
+          <w:instrText xml:space="preserve"> PAGEREF _Toc241417939 \h </w:instrText>
         </w:r>
         <w:r>
           <w:rPr>
@@ -1470,7 +1470,7 @@
           <w14:ligatures w14:val="standardContextual"/>
         </w:rPr>
       </w:pPr>
-      <w:hyperlink w:anchor="_Toc241397287" w:history="1">
+      <w:hyperlink w:anchor="_Toc241417940" w:history="1">
         <w:r>
           <w:rPr>
             <w:rStyle w:val="aff1"/>
@@ -1497,7 +1497,7 @@
             <w:noProof/>
             <w:webHidden/>
           </w:rPr>
-          <w:instrText xml:space="preserve"> PAGEREF _Toc241397287 \h </w:instrText>
+          <w:instrText xml:space="preserve"> PAGEREF _Toc241417940 \h </w:instrText>
         </w:r>
         <w:r>
           <w:rPr>
@@ -1545,7 +1545,7 @@
           <w14:ligatures w14:val="standardContextual"/>
         </w:rPr>
       </w:pPr>
-      <w:hyperlink w:anchor="_Toc241397288" w:history="1">
+      <w:hyperlink w:anchor="_Toc241417941" w:history="1">
         <w:r>
           <w:rPr>
             <w:rStyle w:val="aff1"/>
@@ -1572,7 +1572,7 @@
             <w:noProof/>
             <w:webHidden/>
           </w:rPr>
-          <w:instrText xml:space="preserve"> PAGEREF _Toc241397288 \h </w:instrText>
+          <w:instrText xml:space="preserve"> PAGEREF _Toc241417941 \h </w:instrText>
         </w:r>
         <w:r>
           <w:rPr>
@@ -1621,7 +1621,7 @@
           <w14:ligatures w14:val="standardContextual"/>
         </w:rPr>
       </w:pPr>
-      <w:hyperlink w:anchor="_Toc241397289" w:history="1">
+      <w:hyperlink w:anchor="_Toc241417942" w:history="1">
         <w:r>
           <w:rPr>
             <w:rStyle w:val="aff1"/>
@@ -1648,7 +1648,7 @@
             <w:noProof/>
             <w:webHidden/>
           </w:rPr>
-          <w:instrText xml:space="preserve"> PAGEREF _Toc241397289 \h </w:instrText>
+          <w:instrText xml:space="preserve"> PAGEREF _Toc241417942 \h </w:instrText>
         </w:r>
         <w:r>
           <w:rPr>
@@ -1697,7 +1697,7 @@
           <w14:ligatures w14:val="standardContextual"/>
         </w:rPr>
       </w:pPr>
-      <w:hyperlink w:anchor="_Toc241397290" w:history="1">
+      <w:hyperlink w:anchor="_Toc241417943" w:history="1">
         <w:r>
           <w:rPr>
             <w:rStyle w:val="aff1"/>
@@ -1724,7 +1724,7 @@
             <w:noProof/>
             <w:webHidden/>
           </w:rPr>
-          <w:instrText xml:space="preserve"> PAGEREF _Toc241397290 \h </w:instrText>
+          <w:instrText xml:space="preserve"> PAGEREF _Toc241417943 \h </w:instrText>
         </w:r>
         <w:r>
           <w:rPr>
@@ -1773,7 +1773,7 @@
           <w14:ligatures w14:val="standardContextual"/>
         </w:rPr>
       </w:pPr>
-      <w:hyperlink w:anchor="_Toc241397291" w:history="1">
+      <w:hyperlink w:anchor="_Toc241417944" w:history="1">
         <w:r>
           <w:rPr>
             <w:rStyle w:val="aff1"/>
@@ -1800,7 +1800,7 @@
             <w:noProof/>
             <w:webHidden/>
           </w:rPr>
-          <w:instrText xml:space="preserve"> PAGEREF _Toc241397291 \h </w:instrText>
+          <w:instrText xml:space="preserve"> PAGEREF _Toc241417944 \h </w:instrText>
         </w:r>
         <w:r>
           <w:rPr>
@@ -1849,7 +1849,7 @@
           <w14:ligatures w14:val="standardContextual"/>
         </w:rPr>
       </w:pPr>
-      <w:hyperlink w:anchor="_Toc241397292" w:history="1">
+      <w:hyperlink w:anchor="_Toc241417945" w:history="1">
         <w:r>
           <w:rPr>
             <w:rStyle w:val="aff1"/>
@@ -1876,7 +1876,7 @@
             <w:noProof/>
             <w:webHidden/>
           </w:rPr>
-          <w:instrText xml:space="preserve"> PAGEREF _Toc241397292 \h </w:instrText>
+          <w:instrText xml:space="preserve"> PAGEREF _Toc241417945 \h </w:instrText>
         </w:r>
         <w:r>
           <w:rPr>
@@ -1925,7 +1925,7 @@
           <w14:ligatures w14:val="standardContextual"/>
         </w:rPr>
       </w:pPr>
-      <w:hyperlink w:anchor="_Toc241397293" w:history="1">
+      <w:hyperlink w:anchor="_Toc241417946" w:history="1">
         <w:r>
           <w:rPr>
             <w:rStyle w:val="aff1"/>
@@ -1952,7 +1952,7 @@
             <w:noProof/>
             <w:webHidden/>
           </w:rPr>
-          <w:instrText xml:space="preserve"> PAGEREF _Toc241397293 \h </w:instrText>
+          <w:instrText xml:space="preserve"> PAGEREF _Toc241417946 \h </w:instrText>
         </w:r>
         <w:r>
           <w:rPr>
@@ -2001,7 +2001,7 @@
           <w14:ligatures w14:val="standardContextual"/>
         </w:rPr>
       </w:pPr>
-      <w:hyperlink w:anchor="_Toc241397294" w:history="1">
+      <w:hyperlink w:anchor="_Toc241417947" w:history="1">
         <w:r>
           <w:rPr>
             <w:rStyle w:val="aff1"/>
@@ -2028,7 +2028,7 @@
             <w:noProof/>
             <w:webHidden/>
           </w:rPr>
-          <w:instrText xml:space="preserve"> PAGEREF _Toc241397294 \h </w:instrText>
+          <w:instrText xml:space="preserve"> PAGEREF _Toc241417947 \h </w:instrText>
         </w:r>
         <w:r>
           <w:rPr>
@@ -2076,7 +2076,7 @@
           <w14:ligatures w14:val="standardContextual"/>
         </w:rPr>
       </w:pPr>
-      <w:hyperlink w:anchor="_Toc241397295" w:history="1">
+      <w:hyperlink w:anchor="_Toc241417948" w:history="1">
         <w:r>
           <w:rPr>
             <w:rStyle w:val="aff1"/>
@@ -2103,7 +2103,7 @@
             <w:noProof/>
             <w:webHidden/>
           </w:rPr>
-          <w:instrText xml:space="preserve"> PAGEREF _Toc241397295 \h </w:instrText>
+          <w:instrText xml:space="preserve"> PAGEREF _Toc241417948 \h </w:instrText>
         </w:r>
         <w:r>
           <w:rPr>
@@ -2152,7 +2152,7 @@
           <w14:ligatures w14:val="standardContextual"/>
         </w:rPr>
       </w:pPr>
-      <w:hyperlink w:anchor="_Toc241397296" w:history="1">
+      <w:hyperlink w:anchor="_Toc241417949" w:history="1">
         <w:r>
           <w:rPr>
             <w:rStyle w:val="aff1"/>
@@ -2179,7 +2179,7 @@
             <w:noProof/>
             <w:webHidden/>
           </w:rPr>
-          <w:instrText xml:space="preserve"> PAGEREF _Toc241397296 \h </w:instrText>
+          <w:instrText xml:space="preserve"> PAGEREF _Toc241417949 \h </w:instrText>
         </w:r>
         <w:r>
           <w:rPr>
@@ -2228,7 +2228,7 @@
           <w14:ligatures w14:val="standardContextual"/>
         </w:rPr>
       </w:pPr>
-      <w:hyperlink w:anchor="_Toc241397297" w:history="1">
+      <w:hyperlink w:anchor="_Toc241417950" w:history="1">
         <w:r>
           <w:rPr>
             <w:rStyle w:val="aff1"/>
@@ -2255,7 +2255,7 @@
             <w:noProof/>
             <w:webHidden/>
           </w:rPr>
-          <w:instrText xml:space="preserve"> PAGEREF _Toc241397297 \h </w:instrText>
+          <w:instrText xml:space="preserve"> PAGEREF _Toc241417950 \h </w:instrText>
         </w:r>
         <w:r>
           <w:rPr>
@@ -2304,7 +2304,7 @@
           <w14:ligatures w14:val="standardContextual"/>
         </w:rPr>
       </w:pPr>
-      <w:hyperlink w:anchor="_Toc241397298" w:history="1">
+      <w:hyperlink w:anchor="_Toc241417951" w:history="1">
         <w:r>
           <w:rPr>
             <w:rStyle w:val="aff1"/>
@@ -2331,7 +2331,7 @@
             <w:noProof/>
             <w:webHidden/>
           </w:rPr>
-          <w:instrText xml:space="preserve"> PAGEREF _Toc241397298 \h </w:instrText>
+          <w:instrText xml:space="preserve"> PAGEREF _Toc241417951 \h </w:instrText>
         </w:r>
         <w:r>
           <w:rPr>
@@ -2380,7 +2380,7 @@
           <w14:ligatures w14:val="standardContextual"/>
         </w:rPr>
       </w:pPr>
-      <w:hyperlink w:anchor="_Toc241397299" w:history="1">
+      <w:hyperlink w:anchor="_Toc241417952" w:history="1">
         <w:r>
           <w:rPr>
             <w:rStyle w:val="aff1"/>
@@ -2407,7 +2407,7 @@
             <w:noProof/>
             <w:webHidden/>
           </w:rPr>
-          <w:instrText xml:space="preserve"> PAGEREF _Toc241397299 \h </w:instrText>
+          <w:instrText xml:space="preserve"> PAGEREF _Toc241417952 \h </w:instrText>
         </w:r>
         <w:r>
           <w:rPr>
@@ -2456,7 +2456,7 @@
           <w14:ligatures w14:val="standardContextual"/>
         </w:rPr>
       </w:pPr>
-      <w:hyperlink w:anchor="_Toc241397300" w:history="1">
+      <w:hyperlink w:anchor="_Toc241417953" w:history="1">
         <w:r>
           <w:rPr>
             <w:rStyle w:val="aff1"/>
@@ -2483,7 +2483,7 @@
             <w:noProof/>
             <w:webHidden/>
           </w:rPr>
-          <w:instrText xml:space="preserve"> PAGEREF _Toc241397300 \h </w:instrText>
+          <w:instrText xml:space="preserve"> PAGEREF _Toc241417953 \h </w:instrText>
         </w:r>
         <w:r>
           <w:rPr>
@@ -2532,7 +2532,7 @@
           <w14:ligatures w14:val="standardContextual"/>
         </w:rPr>
       </w:pPr>
-      <w:hyperlink w:anchor="_Toc241397301" w:history="1">
+      <w:hyperlink w:anchor="_Toc241417954" w:history="1">
         <w:r>
           <w:rPr>
             <w:rStyle w:val="aff1"/>
@@ -2559,7 +2559,7 @@
             <w:noProof/>
             <w:webHidden/>
           </w:rPr>
-          <w:instrText xml:space="preserve"> PAGEREF _Toc241397301 \h </w:instrText>
+          <w:instrText xml:space="preserve"> PAGEREF _Toc241417954 \h </w:instrText>
         </w:r>
         <w:r>
           <w:rPr>
@@ -2607,7 +2607,7 @@
           <w14:ligatures w14:val="standardContextual"/>
         </w:rPr>
       </w:pPr>
-      <w:hyperlink w:anchor="_Toc241397302" w:history="1">
+      <w:hyperlink w:anchor="_Toc241417955" w:history="1">
         <w:r>
           <w:rPr>
             <w:rStyle w:val="aff1"/>
@@ -2634,7 +2634,7 @@
             <w:noProof/>
             <w:webHidden/>
           </w:rPr>
-          <w:instrText xml:space="preserve"> PAGEREF _Toc241397302 \h </w:instrText>
+          <w:instrText xml:space="preserve"> PAGEREF _Toc241417955 \h </w:instrText>
         </w:r>
         <w:r>
           <w:rPr>
@@ -2654,7 +2654,7 @@
             <w:noProof/>
             <w:webHidden/>
           </w:rPr>
-          <w:t>16</w:t>
+          <w:t>17</w:t>
         </w:r>
         <w:r>
           <w:rPr>
@@ -2683,7 +2683,7 @@
           <w14:ligatures w14:val="standardContextual"/>
         </w:rPr>
       </w:pPr>
-      <w:hyperlink w:anchor="_Toc241397303" w:history="1">
+      <w:hyperlink w:anchor="_Toc241417956" w:history="1">
         <w:r>
           <w:rPr>
             <w:rStyle w:val="aff1"/>
@@ -2710,7 +2710,7 @@
             <w:noProof/>
             <w:webHidden/>
           </w:rPr>
-          <w:instrText xml:space="preserve"> PAGEREF _Toc241397303 \h </w:instrText>
+          <w:instrText xml:space="preserve"> PAGEREF _Toc241417956 \h </w:instrText>
         </w:r>
         <w:r>
           <w:rPr>
@@ -2730,7 +2730,7 @@
             <w:noProof/>
             <w:webHidden/>
           </w:rPr>
-          <w:t>16</w:t>
+          <w:t>17</w:t>
         </w:r>
         <w:r>
           <w:rPr>
@@ -2759,7 +2759,7 @@
           <w14:ligatures w14:val="standardContextual"/>
         </w:rPr>
       </w:pPr>
-      <w:hyperlink w:anchor="_Toc241397304" w:history="1">
+      <w:hyperlink w:anchor="_Toc241417957" w:history="1">
         <w:r>
           <w:rPr>
             <w:rStyle w:val="aff1"/>
@@ -2786,7 +2786,7 @@
             <w:noProof/>
             <w:webHidden/>
           </w:rPr>
-          <w:instrText xml:space="preserve"> PAGEREF _Toc241397304 \h </w:instrText>
+          <w:instrText xml:space="preserve"> PAGEREF _Toc241417957 \h </w:instrText>
         </w:r>
         <w:r>
           <w:rPr>
@@ -2806,7 +2806,7 @@
             <w:noProof/>
             <w:webHidden/>
           </w:rPr>
-          <w:t>16</w:t>
+          <w:t>17</w:t>
         </w:r>
         <w:r>
           <w:rPr>
@@ -2835,7 +2835,7 @@
           <w14:ligatures w14:val="standardContextual"/>
         </w:rPr>
       </w:pPr>
-      <w:hyperlink w:anchor="_Toc241397305" w:history="1">
+      <w:hyperlink w:anchor="_Toc241417958" w:history="1">
         <w:r>
           <w:rPr>
             <w:rStyle w:val="aff1"/>
@@ -2862,7 +2862,7 @@
             <w:noProof/>
             <w:webHidden/>
           </w:rPr>
-          <w:instrText xml:space="preserve"> PAGEREF _Toc241397305 \h </w:instrText>
+          <w:instrText xml:space="preserve"> PAGEREF _Toc241417958 \h </w:instrText>
         </w:r>
         <w:r>
           <w:rPr>
@@ -2882,7 +2882,7 @@
             <w:noProof/>
             <w:webHidden/>
           </w:rPr>
-          <w:t>16</w:t>
+          <w:t>17</w:t>
         </w:r>
         <w:r>
           <w:rPr>
@@ -2911,7 +2911,7 @@
           <w14:ligatures w14:val="standardContextual"/>
         </w:rPr>
       </w:pPr>
-      <w:hyperlink w:anchor="_Toc241397306" w:history="1">
+      <w:hyperlink w:anchor="_Toc241417959" w:history="1">
         <w:r>
           <w:rPr>
             <w:rStyle w:val="aff1"/>
@@ -2938,7 +2938,7 @@
             <w:noProof/>
             <w:webHidden/>
           </w:rPr>
-          <w:instrText xml:space="preserve"> PAGEREF _Toc241397306 \h </w:instrText>
+          <w:instrText xml:space="preserve"> PAGEREF _Toc241417959 \h </w:instrText>
         </w:r>
         <w:r>
           <w:rPr>
@@ -2958,7 +2958,7 @@
             <w:noProof/>
             <w:webHidden/>
           </w:rPr>
-          <w:t>17</w:t>
+          <w:t>18</w:t>
         </w:r>
         <w:r>
           <w:rPr>
@@ -2987,7 +2987,7 @@
           <w14:ligatures w14:val="standardContextual"/>
         </w:rPr>
       </w:pPr>
-      <w:hyperlink w:anchor="_Toc241397307" w:history="1">
+      <w:hyperlink w:anchor="_Toc241417960" w:history="1">
         <w:r>
           <w:rPr>
             <w:rStyle w:val="aff1"/>
@@ -3014,7 +3014,7 @@
             <w:noProof/>
             <w:webHidden/>
           </w:rPr>
-          <w:instrText xml:space="preserve"> PAGEREF _Toc241397307 \h </w:instrText>
+          <w:instrText xml:space="preserve"> PAGEREF _Toc241417960 \h </w:instrText>
         </w:r>
         <w:r>
           <w:rPr>
@@ -3034,7 +3034,7 @@
             <w:noProof/>
             <w:webHidden/>
           </w:rPr>
-          <w:t>17</w:t>
+          <w:t>18</w:t>
         </w:r>
         <w:r>
           <w:rPr>
@@ -3063,7 +3063,7 @@
           <w14:ligatures w14:val="standardContextual"/>
         </w:rPr>
       </w:pPr>
-      <w:hyperlink w:anchor="_Toc241397308" w:history="1">
+      <w:hyperlink w:anchor="_Toc241417961" w:history="1">
         <w:r>
           <w:rPr>
             <w:rStyle w:val="aff1"/>
@@ -3090,7 +3090,7 @@
             <w:noProof/>
             <w:webHidden/>
           </w:rPr>
-          <w:instrText xml:space="preserve"> PAGEREF _Toc241397308 \h </w:instrText>
+          <w:instrText xml:space="preserve"> PAGEREF _Toc241417961 \h </w:instrText>
         </w:r>
         <w:r>
           <w:rPr>
@@ -3110,7 +3110,7 @@
             <w:noProof/>
             <w:webHidden/>
           </w:rPr>
-          <w:t>17</w:t>
+          <w:t>18</w:t>
         </w:r>
         <w:r>
           <w:rPr>
@@ -3138,7 +3138,7 @@
           <w14:ligatures w14:val="standardContextual"/>
         </w:rPr>
       </w:pPr>
-      <w:hyperlink w:anchor="_Toc241397309" w:history="1">
+      <w:hyperlink w:anchor="_Toc241417962" w:history="1">
         <w:r>
           <w:rPr>
             <w:rStyle w:val="aff1"/>
@@ -3165,7 +3165,7 @@
             <w:noProof/>
             <w:webHidden/>
           </w:rPr>
-          <w:instrText xml:space="preserve"> PAGEREF _Toc241397309 \h </w:instrText>
+          <w:instrText xml:space="preserve"> PAGEREF _Toc241417962 \h </w:instrText>
         </w:r>
         <w:r>
           <w:rPr>
@@ -3185,7 +3185,7 @@
             <w:noProof/>
             <w:webHidden/>
           </w:rPr>
-          <w:t>19</w:t>
+          <w:t>20</w:t>
         </w:r>
         <w:r>
           <w:rPr>
@@ -3214,7 +3214,7 @@
           <w14:ligatures w14:val="standardContextual"/>
         </w:rPr>
       </w:pPr>
-      <w:hyperlink w:anchor="_Toc241397310" w:history="1">
+      <w:hyperlink w:anchor="_Toc241417963" w:history="1">
         <w:r>
           <w:rPr>
             <w:rStyle w:val="aff1"/>
@@ -3241,7 +3241,7 @@
             <w:noProof/>
             <w:webHidden/>
           </w:rPr>
-          <w:instrText xml:space="preserve"> PAGEREF _Toc241397310 \h </w:instrText>
+          <w:instrText xml:space="preserve"> PAGEREF _Toc241417963 \h </w:instrText>
         </w:r>
         <w:r>
           <w:rPr>
@@ -3261,7 +3261,7 @@
             <w:noProof/>
             <w:webHidden/>
           </w:rPr>
-          <w:t>19</w:t>
+          <w:t>20</w:t>
         </w:r>
         <w:r>
           <w:rPr>
@@ -3290,7 +3290,7 @@
           <w14:ligatures w14:val="standardContextual"/>
         </w:rPr>
       </w:pPr>
-      <w:hyperlink w:anchor="_Toc241397311" w:history="1">
+      <w:hyperlink w:anchor="_Toc241417964" w:history="1">
         <w:r>
           <w:rPr>
             <w:rStyle w:val="aff1"/>
@@ -3317,7 +3317,7 @@
             <w:noProof/>
             <w:webHidden/>
           </w:rPr>
-          <w:instrText xml:space="preserve"> PAGEREF _Toc241397311 \h </w:instrText>
+          <w:instrText xml:space="preserve"> PAGEREF _Toc241417964 \h </w:instrText>
         </w:r>
         <w:r>
           <w:rPr>
@@ -3337,7 +3337,7 @@
             <w:noProof/>
             <w:webHidden/>
           </w:rPr>
-          <w:t>19</w:t>
+          <w:t>20</w:t>
         </w:r>
         <w:r>
           <w:rPr>
@@ -3366,7 +3366,7 @@
           <w14:ligatures w14:val="standardContextual"/>
         </w:rPr>
       </w:pPr>
-      <w:hyperlink w:anchor="_Toc241397312" w:history="1">
+      <w:hyperlink w:anchor="_Toc241417965" w:history="1">
         <w:r>
           <w:rPr>
             <w:rStyle w:val="aff1"/>
@@ -3393,7 +3393,7 @@
             <w:noProof/>
             <w:webHidden/>
           </w:rPr>
-          <w:instrText xml:space="preserve"> PAGEREF _Toc241397312 \h </w:instrText>
+          <w:instrText xml:space="preserve"> PAGEREF _Toc241417965 \h </w:instrText>
         </w:r>
         <w:r>
           <w:rPr>
@@ -3413,7 +3413,7 @@
             <w:noProof/>
             <w:webHidden/>
           </w:rPr>
-          <w:t>20</w:t>
+          <w:t>21</w:t>
         </w:r>
         <w:r>
           <w:rPr>
@@ -3442,7 +3442,7 @@
           <w14:ligatures w14:val="standardContextual"/>
         </w:rPr>
       </w:pPr>
-      <w:hyperlink w:anchor="_Toc241397313" w:history="1">
+      <w:hyperlink w:anchor="_Toc241417966" w:history="1">
         <w:r>
           <w:rPr>
             <w:rStyle w:val="aff1"/>
@@ -3469,7 +3469,7 @@
             <w:noProof/>
             <w:webHidden/>
           </w:rPr>
-          <w:instrText xml:space="preserve"> PAGEREF _Toc241397313 \h </w:instrText>
+          <w:instrText xml:space="preserve"> PAGEREF _Toc241417966 \h </w:instrText>
         </w:r>
         <w:r>
           <w:rPr>
@@ -3489,7 +3489,7 @@
             <w:noProof/>
             <w:webHidden/>
           </w:rPr>
-          <w:t>20</w:t>
+          <w:t>21</w:t>
         </w:r>
         <w:r>
           <w:rPr>
@@ -3518,7 +3518,7 @@
           <w14:ligatures w14:val="standardContextual"/>
         </w:rPr>
       </w:pPr>
-      <w:hyperlink w:anchor="_Toc241397314" w:history="1">
+      <w:hyperlink w:anchor="_Toc241417967" w:history="1">
         <w:r>
           <w:rPr>
             <w:rStyle w:val="aff1"/>
@@ -3545,7 +3545,7 @@
             <w:noProof/>
             <w:webHidden/>
           </w:rPr>
-          <w:instrText xml:space="preserve"> PAGEREF _Toc241397314 \h </w:instrText>
+          <w:instrText xml:space="preserve"> PAGEREF _Toc241417967 \h </w:instrText>
         </w:r>
         <w:r>
           <w:rPr>
@@ -3565,7 +3565,7 @@
             <w:noProof/>
             <w:webHidden/>
           </w:rPr>
-          <w:t>21</w:t>
+          <w:t>22</w:t>
         </w:r>
         <w:r>
           <w:rPr>
@@ -3594,7 +3594,7 @@
           <w14:ligatures w14:val="standardContextual"/>
         </w:rPr>
       </w:pPr>
-      <w:hyperlink w:anchor="_Toc241397315" w:history="1">
+      <w:hyperlink w:anchor="_Toc241417968" w:history="1">
         <w:r>
           <w:rPr>
             <w:rStyle w:val="aff1"/>
@@ -3621,7 +3621,7 @@
             <w:noProof/>
             <w:webHidden/>
           </w:rPr>
-          <w:instrText xml:space="preserve"> PAGEREF _Toc241397315 \h </w:instrText>
+          <w:instrText xml:space="preserve"> PAGEREF _Toc241417968 \h </w:instrText>
         </w:r>
         <w:r>
           <w:rPr>
@@ -3641,7 +3641,7 @@
             <w:noProof/>
             <w:webHidden/>
           </w:rPr>
-          <w:t>21</w:t>
+          <w:t>22</w:t>
         </w:r>
         <w:r>
           <w:rPr>
@@ -3670,7 +3670,7 @@
           <w14:ligatures w14:val="standardContextual"/>
         </w:rPr>
       </w:pPr>
-      <w:hyperlink w:anchor="_Toc241397316" w:history="1">
+      <w:hyperlink w:anchor="_Toc241417969" w:history="1">
         <w:r>
           <w:rPr>
             <w:rStyle w:val="aff1"/>
@@ -3697,7 +3697,7 @@
             <w:noProof/>
             <w:webHidden/>
           </w:rPr>
-          <w:instrText xml:space="preserve"> PAGEREF _Toc241397316 \h </w:instrText>
+          <w:instrText xml:space="preserve"> PAGEREF _Toc241417969 \h </w:instrText>
         </w:r>
         <w:r>
           <w:rPr>
@@ -3717,7 +3717,7 @@
             <w:noProof/>
             <w:webHidden/>
           </w:rPr>
-          <w:t>21</w:t>
+          <w:t>22</w:t>
         </w:r>
         <w:r>
           <w:rPr>
@@ -3746,7 +3746,7 @@
           <w14:ligatures w14:val="standardContextual"/>
         </w:rPr>
       </w:pPr>
-      <w:hyperlink w:anchor="_Toc241397317" w:history="1">
+      <w:hyperlink w:anchor="_Toc241417970" w:history="1">
         <w:r>
           <w:rPr>
             <w:rStyle w:val="aff1"/>
@@ -3773,7 +3773,7 @@
             <w:noProof/>
             <w:webHidden/>
           </w:rPr>
-          <w:instrText xml:space="preserve"> PAGEREF _Toc241397317 \h </w:instrText>
+          <w:instrText xml:space="preserve"> PAGEREF _Toc241417970 \h </w:instrText>
         </w:r>
         <w:r>
           <w:rPr>
@@ -3793,7 +3793,7 @@
             <w:noProof/>
             <w:webHidden/>
           </w:rPr>
-          <w:t>21</w:t>
+          <w:t>22</w:t>
         </w:r>
         <w:r>
           <w:rPr>
@@ -3822,7 +3822,7 @@
           <w14:ligatures w14:val="standardContextual"/>
         </w:rPr>
       </w:pPr>
-      <w:hyperlink w:anchor="_Toc241397318" w:history="1">
+      <w:hyperlink w:anchor="_Toc241417971" w:history="1">
         <w:r>
           <w:rPr>
             <w:rStyle w:val="aff1"/>
@@ -3849,7 +3849,7 @@
             <w:noProof/>
             <w:webHidden/>
           </w:rPr>
-          <w:instrText xml:space="preserve"> PAGEREF _Toc241397318 \h </w:instrText>
+          <w:instrText xml:space="preserve"> PAGEREF _Toc241417971 \h </w:instrText>
         </w:r>
         <w:r>
           <w:rPr>
@@ -3869,7 +3869,7 @@
             <w:noProof/>
             <w:webHidden/>
           </w:rPr>
-          <w:t>22</w:t>
+          <w:t>23</w:t>
         </w:r>
         <w:r>
           <w:rPr>
@@ -3897,7 +3897,7 @@
           <w14:ligatures w14:val="standardContextual"/>
         </w:rPr>
       </w:pPr>
-      <w:hyperlink w:anchor="_Toc241397319" w:history="1">
+      <w:hyperlink w:anchor="_Toc241417972" w:history="1">
         <w:r>
           <w:rPr>
             <w:rStyle w:val="aff1"/>
@@ -3924,7 +3924,7 @@
             <w:noProof/>
             <w:webHidden/>
           </w:rPr>
-          <w:instrText xml:space="preserve"> PAGEREF _Toc241397319 \h </w:instrText>
+          <w:instrText xml:space="preserve"> PAGEREF _Toc241417972 \h </w:instrText>
         </w:r>
         <w:r>
           <w:rPr>
@@ -3944,7 +3944,7 @@
             <w:noProof/>
             <w:webHidden/>
           </w:rPr>
-          <w:t>23</w:t>
+          <w:t>24</w:t>
         </w:r>
         <w:r>
           <w:rPr>
@@ -3973,7 +3973,7 @@
           <w14:ligatures w14:val="standardContextual"/>
         </w:rPr>
       </w:pPr>
-      <w:hyperlink w:anchor="_Toc241397320" w:history="1">
+      <w:hyperlink w:anchor="_Toc241417973" w:history="1">
         <w:r>
           <w:rPr>
             <w:rStyle w:val="aff1"/>
@@ -4000,7 +4000,7 @@
             <w:noProof/>
             <w:webHidden/>
           </w:rPr>
-          <w:instrText xml:space="preserve"> PAGEREF _Toc241397320 \h </w:instrText>
+          <w:instrText xml:space="preserve"> PAGEREF _Toc241417973 \h </w:instrText>
         </w:r>
         <w:r>
           <w:rPr>
@@ -4020,7 +4020,7 @@
             <w:noProof/>
             <w:webHidden/>
           </w:rPr>
-          <w:t>23</w:t>
+          <w:t>24</w:t>
         </w:r>
         <w:r>
           <w:rPr>
@@ -4049,7 +4049,7 @@
           <w14:ligatures w14:val="standardContextual"/>
         </w:rPr>
       </w:pPr>
-      <w:hyperlink w:anchor="_Toc241397321" w:history="1">
+      <w:hyperlink w:anchor="_Toc241417974" w:history="1">
         <w:r>
           <w:rPr>
             <w:rStyle w:val="aff1"/>
@@ -4076,7 +4076,7 @@
             <w:noProof/>
             <w:webHidden/>
           </w:rPr>
-          <w:instrText xml:space="preserve"> PAGEREF _Toc241397321 \h </w:instrText>
+          <w:instrText xml:space="preserve"> PAGEREF _Toc241417974 \h </w:instrText>
         </w:r>
         <w:r>
           <w:rPr>
@@ -4096,7 +4096,7 @@
             <w:noProof/>
             <w:webHidden/>
           </w:rPr>
-          <w:t>24</w:t>
+          <w:t>25</w:t>
         </w:r>
         <w:r>
           <w:rPr>
@@ -4125,7 +4125,7 @@
           <w14:ligatures w14:val="standardContextual"/>
         </w:rPr>
       </w:pPr>
-      <w:hyperlink w:anchor="_Toc241397322" w:history="1">
+      <w:hyperlink w:anchor="_Toc241417975" w:history="1">
         <w:r>
           <w:rPr>
             <w:rStyle w:val="aff1"/>
@@ -4152,7 +4152,7 @@
             <w:noProof/>
             <w:webHidden/>
           </w:rPr>
-          <w:instrText xml:space="preserve"> PAGEREF _Toc241397322 \h </w:instrText>
+          <w:instrText xml:space="preserve"> PAGEREF _Toc241417975 \h </w:instrText>
         </w:r>
         <w:r>
           <w:rPr>
@@ -4172,7 +4172,7 @@
             <w:noProof/>
             <w:webHidden/>
           </w:rPr>
-          <w:t>25</w:t>
+          <w:t>26</w:t>
         </w:r>
         <w:r>
           <w:rPr>
@@ -4201,7 +4201,7 @@
           <w14:ligatures w14:val="standardContextual"/>
         </w:rPr>
       </w:pPr>
-      <w:hyperlink w:anchor="_Toc241397323" w:history="1">
+      <w:hyperlink w:anchor="_Toc241417976" w:history="1">
         <w:r>
           <w:rPr>
             <w:rStyle w:val="aff1"/>
@@ -4228,7 +4228,7 @@
             <w:noProof/>
             <w:webHidden/>
           </w:rPr>
-          <w:instrText xml:space="preserve"> PAGEREF _Toc241397323 \h </w:instrText>
+          <w:instrText xml:space="preserve"> PAGEREF _Toc241417976 \h </w:instrText>
         </w:r>
         <w:r>
           <w:rPr>
@@ -4248,7 +4248,7 @@
             <w:noProof/>
             <w:webHidden/>
           </w:rPr>
-          <w:t>26</w:t>
+          <w:t>27</w:t>
         </w:r>
         <w:r>
           <w:rPr>
@@ -4277,7 +4277,7 @@
           <w14:ligatures w14:val="standardContextual"/>
         </w:rPr>
       </w:pPr>
-      <w:hyperlink w:anchor="_Toc241397324" w:history="1">
+      <w:hyperlink w:anchor="_Toc241417977" w:history="1">
         <w:r>
           <w:rPr>
             <w:rStyle w:val="aff1"/>
@@ -4304,7 +4304,7 @@
             <w:noProof/>
             <w:webHidden/>
           </w:rPr>
-          <w:instrText xml:space="preserve"> PAGEREF _Toc241397324 \h </w:instrText>
+          <w:instrText xml:space="preserve"> PAGEREF _Toc241417977 \h </w:instrText>
         </w:r>
         <w:r>
           <w:rPr>
@@ -4324,7 +4324,7 @@
             <w:noProof/>
             <w:webHidden/>
           </w:rPr>
-          <w:t>27</w:t>
+          <w:t>28</w:t>
         </w:r>
         <w:r>
           <w:rPr>
@@ -4353,7 +4353,7 @@
           <w14:ligatures w14:val="standardContextual"/>
         </w:rPr>
       </w:pPr>
-      <w:hyperlink w:anchor="_Toc241397325" w:history="1">
+      <w:hyperlink w:anchor="_Toc241417978" w:history="1">
         <w:r>
           <w:rPr>
             <w:rStyle w:val="aff1"/>
@@ -4380,7 +4380,7 @@
             <w:noProof/>
             <w:webHidden/>
           </w:rPr>
-          <w:instrText xml:space="preserve"> PAGEREF _Toc241397325 \h </w:instrText>
+          <w:instrText xml:space="preserve"> PAGEREF _Toc241417978 \h </w:instrText>
         </w:r>
         <w:r>
           <w:rPr>
@@ -4400,7 +4400,7 @@
             <w:noProof/>
             <w:webHidden/>
           </w:rPr>
-          <w:t>28</w:t>
+          <w:t>29</w:t>
         </w:r>
         <w:r>
           <w:rPr>
@@ -4429,7 +4429,7 @@
           <w14:ligatures w14:val="standardContextual"/>
         </w:rPr>
       </w:pPr>
-      <w:hyperlink w:anchor="_Toc241397326" w:history="1">
+      <w:hyperlink w:anchor="_Toc241417979" w:history="1">
         <w:r>
           <w:rPr>
             <w:rStyle w:val="aff1"/>
@@ -4456,7 +4456,7 @@
             <w:noProof/>
             <w:webHidden/>
           </w:rPr>
-          <w:instrText xml:space="preserve"> PAGEREF _Toc241397326 \h </w:instrText>
+          <w:instrText xml:space="preserve"> PAGEREF _Toc241417979 \h </w:instrText>
         </w:r>
         <w:r>
           <w:rPr>
@@ -4476,7 +4476,7 @@
             <w:noProof/>
             <w:webHidden/>
           </w:rPr>
-          <w:t>29</w:t>
+          <w:t>30</w:t>
         </w:r>
         <w:r>
           <w:rPr>
@@ -4505,7 +4505,7 @@
           <w14:ligatures w14:val="standardContextual"/>
         </w:rPr>
       </w:pPr>
-      <w:hyperlink w:anchor="_Toc241397327" w:history="1">
+      <w:hyperlink w:anchor="_Toc241417980" w:history="1">
         <w:r>
           <w:rPr>
             <w:rStyle w:val="aff1"/>
@@ -4532,7 +4532,7 @@
             <w:noProof/>
             <w:webHidden/>
           </w:rPr>
-          <w:instrText xml:space="preserve"> PAGEREF _Toc241397327 \h </w:instrText>
+          <w:instrText xml:space="preserve"> PAGEREF _Toc241417980 \h </w:instrText>
         </w:r>
         <w:r>
           <w:rPr>
@@ -4552,7 +4552,7 @@
             <w:noProof/>
             <w:webHidden/>
           </w:rPr>
-          <w:t>29</w:t>
+          <w:t>30</w:t>
         </w:r>
         <w:r>
           <w:rPr>
@@ -4581,7 +4581,7 @@
           <w14:ligatures w14:val="standardContextual"/>
         </w:rPr>
       </w:pPr>
-      <w:hyperlink w:anchor="_Toc241397328" w:history="1">
+      <w:hyperlink w:anchor="_Toc241417981" w:history="1">
         <w:r>
           <w:rPr>
             <w:rStyle w:val="aff1"/>
@@ -4608,7 +4608,7 @@
             <w:noProof/>
             <w:webHidden/>
           </w:rPr>
-          <w:instrText xml:space="preserve"> PAGEREF _Toc241397328 \h </w:instrText>
+          <w:instrText xml:space="preserve"> PAGEREF _Toc241417981 \h </w:instrText>
         </w:r>
         <w:r>
           <w:rPr>
@@ -4628,7 +4628,7 @@
             <w:noProof/>
             <w:webHidden/>
           </w:rPr>
-          <w:t>30</w:t>
+          <w:t>31</w:t>
         </w:r>
         <w:r>
           <w:rPr>
@@ -4656,7 +4656,7 @@
           <w14:ligatures w14:val="standardContextual"/>
         </w:rPr>
       </w:pPr>
-      <w:hyperlink w:anchor="_Toc241397329" w:history="1">
+      <w:hyperlink w:anchor="_Toc241417982" w:history="1">
         <w:r>
           <w:rPr>
             <w:rStyle w:val="aff1"/>
@@ -4683,7 +4683,7 @@
             <w:noProof/>
             <w:webHidden/>
           </w:rPr>
-          <w:instrText xml:space="preserve"> PAGEREF _Toc241397329 \h </w:instrText>
+          <w:instrText xml:space="preserve"> PAGEREF _Toc241417982 \h </w:instrText>
         </w:r>
         <w:r>
           <w:rPr>
@@ -4703,7 +4703,7 @@
             <w:noProof/>
             <w:webHidden/>
           </w:rPr>
-          <w:t>31</w:t>
+          <w:t>32</w:t>
         </w:r>
         <w:r>
           <w:rPr>
@@ -4732,7 +4732,7 @@
           <w14:ligatures w14:val="standardContextual"/>
         </w:rPr>
       </w:pPr>
-      <w:hyperlink w:anchor="_Toc241397330" w:history="1">
+      <w:hyperlink w:anchor="_Toc241417983" w:history="1">
         <w:r>
           <w:rPr>
             <w:rStyle w:val="aff1"/>
@@ -4759,7 +4759,7 @@
             <w:noProof/>
             <w:webHidden/>
           </w:rPr>
-          <w:instrText xml:space="preserve"> PAGEREF _Toc241397330 \h </w:instrText>
+          <w:instrText xml:space="preserve"> PAGEREF _Toc241417983 \h </w:instrText>
         </w:r>
         <w:r>
           <w:rPr>
@@ -4779,7 +4779,7 @@
             <w:noProof/>
             <w:webHidden/>
           </w:rPr>
-          <w:t>31</w:t>
+          <w:t>32</w:t>
         </w:r>
         <w:r>
           <w:rPr>
@@ -4808,7 +4808,7 @@
           <w14:ligatures w14:val="standardContextual"/>
         </w:rPr>
       </w:pPr>
-      <w:hyperlink w:anchor="_Toc241397331" w:history="1">
+      <w:hyperlink w:anchor="_Toc241417984" w:history="1">
         <w:r>
           <w:rPr>
             <w:rStyle w:val="aff1"/>
@@ -4835,7 +4835,7 @@
             <w:noProof/>
             <w:webHidden/>
           </w:rPr>
-          <w:instrText xml:space="preserve"> PAGEREF _Toc241397331 \h </w:instrText>
+          <w:instrText xml:space="preserve"> PAGEREF _Toc241417984 \h </w:instrText>
         </w:r>
         <w:r>
           <w:rPr>
@@ -4855,7 +4855,7 @@
             <w:noProof/>
             <w:webHidden/>
           </w:rPr>
-          <w:t>31</w:t>
+          <w:t>32</w:t>
         </w:r>
         <w:r>
           <w:rPr>
@@ -4884,7 +4884,7 @@
           <w14:ligatures w14:val="standardContextual"/>
         </w:rPr>
       </w:pPr>
-      <w:hyperlink w:anchor="_Toc241397332" w:history="1">
+      <w:hyperlink w:anchor="_Toc241417985" w:history="1">
         <w:r>
           <w:rPr>
             <w:rStyle w:val="aff1"/>
@@ -4911,7 +4911,7 @@
             <w:noProof/>
             <w:webHidden/>
           </w:rPr>
-          <w:instrText xml:space="preserve"> PAGEREF _Toc241397332 \h </w:instrText>
+          <w:instrText xml:space="preserve"> PAGEREF _Toc241417985 \h </w:instrText>
         </w:r>
         <w:r>
           <w:rPr>
@@ -4931,7 +4931,7 @@
             <w:noProof/>
             <w:webHidden/>
           </w:rPr>
-          <w:t>31</w:t>
+          <w:t>32</w:t>
         </w:r>
         <w:r>
           <w:rPr>
@@ -4960,7 +4960,7 @@
           <w14:ligatures w14:val="standardContextual"/>
         </w:rPr>
       </w:pPr>
-      <w:hyperlink w:anchor="_Toc241397333" w:history="1">
+      <w:hyperlink w:anchor="_Toc241417986" w:history="1">
         <w:r>
           <w:rPr>
             <w:rStyle w:val="aff1"/>
@@ -4987,7 +4987,7 @@
             <w:noProof/>
             <w:webHidden/>
           </w:rPr>
-          <w:instrText xml:space="preserve"> PAGEREF _Toc241397333 \h </w:instrText>
+          <w:instrText xml:space="preserve"> PAGEREF _Toc241417986 \h </w:instrText>
         </w:r>
         <w:r>
           <w:rPr>
@@ -5007,7 +5007,7 @@
             <w:noProof/>
             <w:webHidden/>
           </w:rPr>
-          <w:t>32</w:t>
+          <w:t>33</w:t>
         </w:r>
         <w:r>
           <w:rPr>
@@ -5036,7 +5036,7 @@
           <w14:ligatures w14:val="standardContextual"/>
         </w:rPr>
       </w:pPr>
-      <w:hyperlink w:anchor="_Toc241397334" w:history="1">
+      <w:hyperlink w:anchor="_Toc241417987" w:history="1">
         <w:r>
           <w:rPr>
             <w:rStyle w:val="aff1"/>
@@ -5063,7 +5063,7 @@
             <w:noProof/>
             <w:webHidden/>
           </w:rPr>
-          <w:instrText xml:space="preserve"> PAGEREF _Toc241397334 \h </w:instrText>
+          <w:instrText xml:space="preserve"> PAGEREF _Toc241417987 \h </w:instrText>
         </w:r>
         <w:r>
           <w:rPr>
@@ -5083,7 +5083,7 @@
             <w:noProof/>
             <w:webHidden/>
           </w:rPr>
-          <w:t>32</w:t>
+          <w:t>33</w:t>
         </w:r>
         <w:r>
           <w:rPr>
@@ -5112,7 +5112,7 @@
           <w14:ligatures w14:val="standardContextual"/>
         </w:rPr>
       </w:pPr>
-      <w:hyperlink w:anchor="_Toc241397335" w:history="1">
+      <w:hyperlink w:anchor="_Toc241417988" w:history="1">
         <w:r>
           <w:rPr>
             <w:rStyle w:val="aff1"/>
@@ -5139,7 +5139,7 @@
             <w:noProof/>
             <w:webHidden/>
           </w:rPr>
-          <w:instrText xml:space="preserve"> PAGEREF _Toc241397335 \h </w:instrText>
+          <w:instrText xml:space="preserve"> PAGEREF _Toc241417988 \h </w:instrText>
         </w:r>
         <w:r>
           <w:rPr>
@@ -5159,7 +5159,7 @@
             <w:noProof/>
             <w:webHidden/>
           </w:rPr>
-          <w:t>33</w:t>
+          <w:t>34</w:t>
         </w:r>
         <w:r>
           <w:rPr>
@@ -5188,7 +5188,7 @@
           <w14:ligatures w14:val="standardContextual"/>
         </w:rPr>
       </w:pPr>
-      <w:hyperlink w:anchor="_Toc241397336" w:history="1">
+      <w:hyperlink w:anchor="_Toc241417989" w:history="1">
         <w:r>
           <w:rPr>
             <w:rStyle w:val="aff1"/>
@@ -5215,7 +5215,7 @@
             <w:noProof/>
             <w:webHidden/>
           </w:rPr>
-          <w:instrText xml:space="preserve"> PAGEREF _Toc241397336 \h </w:instrText>
+          <w:instrText xml:space="preserve"> PAGEREF _Toc241417989 \h </w:instrText>
         </w:r>
         <w:r>
           <w:rPr>
@@ -5235,7 +5235,7 @@
             <w:noProof/>
             <w:webHidden/>
           </w:rPr>
-          <w:t>33</w:t>
+          <w:t>34</w:t>
         </w:r>
         <w:r>
           <w:rPr>
@@ -5263,7 +5263,7 @@
           <w14:ligatures w14:val="standardContextual"/>
         </w:rPr>
       </w:pPr>
-      <w:hyperlink w:anchor="_Toc241397337" w:history="1">
+      <w:hyperlink w:anchor="_Toc241417990" w:history="1">
         <w:r>
           <w:rPr>
             <w:rStyle w:val="aff1"/>
@@ -5290,7 +5290,7 @@
             <w:noProof/>
             <w:webHidden/>
           </w:rPr>
-          <w:instrText xml:space="preserve"> PAGEREF _Toc241397337 \h </w:instrText>
+          <w:instrText xml:space="preserve"> PAGEREF _Toc241417990 \h </w:instrText>
         </w:r>
         <w:r>
           <w:rPr>
@@ -5310,7 +5310,7 @@
             <w:noProof/>
             <w:webHidden/>
           </w:rPr>
-          <w:t>34</w:t>
+          <w:t>35</w:t>
         </w:r>
         <w:r>
           <w:rPr>
@@ -5338,7 +5338,7 @@
           <w14:ligatures w14:val="standardContextual"/>
         </w:rPr>
       </w:pPr>
-      <w:hyperlink w:anchor="_Toc241397338" w:history="1">
+      <w:hyperlink w:anchor="_Toc241417991" w:history="1">
         <w:r>
           <w:rPr>
             <w:rStyle w:val="aff1"/>
@@ -5365,7 +5365,7 @@
             <w:noProof/>
             <w:webHidden/>
           </w:rPr>
-          <w:instrText xml:space="preserve"> PAGEREF _Toc241397338 \h </w:instrText>
+          <w:instrText xml:space="preserve"> PAGEREF _Toc241417991 \h </w:instrText>
         </w:r>
         <w:r>
           <w:rPr>
@@ -5385,7 +5385,7 @@
             <w:noProof/>
             <w:webHidden/>
           </w:rPr>
-          <w:t>34</w:t>
+          <w:t>35</w:t>
         </w:r>
         <w:r>
           <w:rPr>
@@ -5413,7 +5413,7 @@
           <w14:ligatures w14:val="standardContextual"/>
         </w:rPr>
       </w:pPr>
-      <w:hyperlink w:anchor="_Toc241397339" w:history="1">
+      <w:hyperlink w:anchor="_Toc241417992" w:history="1">
         <w:r>
           <w:rPr>
             <w:rStyle w:val="aff1"/>
@@ -5440,7 +5440,7 @@
             <w:noProof/>
             <w:webHidden/>
           </w:rPr>
-          <w:instrText xml:space="preserve"> PAGEREF _Toc241397339 \h </w:instrText>
+          <w:instrText xml:space="preserve"> PAGEREF _Toc241417992 \h </w:instrText>
         </w:r>
         <w:r>
           <w:rPr>
@@ -5460,7 +5460,7 @@
             <w:noProof/>
             <w:webHidden/>
           </w:rPr>
-          <w:t>35</w:t>
+          <w:t>36</w:t>
         </w:r>
         <w:r>
           <w:rPr>
@@ -5490,7 +5490,7 @@
           <w:numId w:val="7"/>
         </w:numPr>
       </w:pPr>
-      <w:bookmarkStart w:id="0" w:name="_Toc241397275"/>
+      <w:bookmarkStart w:id="0" w:name="_Toc241417928"/>
       <w:r>
         <w:lastRenderedPageBreak/>
         <w:t>게임</w:t>
@@ -5523,7 +5523,7 @@
           <w:numId w:val="7"/>
         </w:numPr>
       </w:pPr>
-      <w:bookmarkStart w:id="1" w:name="_Toc241397276"/>
+      <w:bookmarkStart w:id="1" w:name="_Toc241417929"/>
       <w:r>
         <w:t>Executive Summary</w:t>
       </w:r>
@@ -5594,7 +5594,7 @@
           <w:numId w:val="7"/>
         </w:numPr>
       </w:pPr>
-      <w:bookmarkStart w:id="2" w:name="_Toc241397277"/>
+      <w:bookmarkStart w:id="2" w:name="_Toc241417930"/>
       <w:r>
         <w:t>Rev 16 Release Profile</w:t>
       </w:r>
@@ -5618,7 +5618,7 @@
           <w:numId w:val="7"/>
         </w:numPr>
       </w:pPr>
-      <w:bookmarkStart w:id="3" w:name="_Toc241397278"/>
+      <w:bookmarkStart w:id="3" w:name="_Toc241417931"/>
       <w:r>
         <w:t>제품</w:t>
       </w:r>
@@ -5908,7 +5908,7 @@
           <w:numId w:val="7"/>
         </w:numPr>
       </w:pPr>
-      <w:bookmarkStart w:id="4" w:name="_Toc241397279"/>
+      <w:bookmarkStart w:id="4" w:name="_Toc241417932"/>
       <w:r>
         <w:t>디자인</w:t>
       </w:r>
@@ -6278,7 +6278,7 @@
           <w:numId w:val="7"/>
         </w:numPr>
       </w:pPr>
-      <w:bookmarkStart w:id="5" w:name="_Toc241397280"/>
+      <w:bookmarkStart w:id="5" w:name="_Toc241417933"/>
       <w:r>
         <w:t>Target Experience</w:t>
       </w:r>
@@ -6352,7 +6352,7 @@
           <w:numId w:val="7"/>
         </w:numPr>
       </w:pPr>
-      <w:bookmarkStart w:id="6" w:name="_Toc241397281"/>
+      <w:bookmarkStart w:id="6" w:name="_Toc241417934"/>
       <w:r>
         <w:t>명시적</w:t>
       </w:r>
@@ -6624,7 +6624,7 @@
           <w:numId w:val="7"/>
         </w:numPr>
       </w:pPr>
-      <w:bookmarkStart w:id="7" w:name="_Toc241397282"/>
+      <w:bookmarkStart w:id="7" w:name="_Toc241417935"/>
       <w:r>
         <w:lastRenderedPageBreak/>
         <w:t>Contract Run</w:t>
@@ -6660,7 +6660,7 @@
           <w:numId w:val="7"/>
         </w:numPr>
       </w:pPr>
-      <w:bookmarkStart w:id="8" w:name="_Toc241397283"/>
+      <w:bookmarkStart w:id="8" w:name="_Toc241417936"/>
       <w:r>
         <w:t>Core Loop</w:t>
       </w:r>
@@ -7154,7 +7154,7 @@
           <w:numId w:val="7"/>
         </w:numPr>
       </w:pPr>
-      <w:bookmarkStart w:id="9" w:name="_Toc241397284"/>
+      <w:bookmarkStart w:id="9" w:name="_Toc241417937"/>
       <w:r>
         <w:t xml:space="preserve">Contract </w:t>
       </w:r>
@@ -7578,7 +7578,7 @@
           <w:numId w:val="7"/>
         </w:numPr>
       </w:pPr>
-      <w:bookmarkStart w:id="10" w:name="_Toc241397285"/>
+      <w:bookmarkStart w:id="10" w:name="_Toc241417938"/>
       <w:r>
         <w:lastRenderedPageBreak/>
         <w:t>성공</w:t>
@@ -7870,7 +7870,7 @@
           <w:numId w:val="7"/>
         </w:numPr>
       </w:pPr>
-      <w:bookmarkStart w:id="11" w:name="_Toc241397286"/>
+      <w:bookmarkStart w:id="11" w:name="_Toc241417939"/>
       <w:r>
         <w:t>Greed Decision</w:t>
       </w:r>
@@ -8239,7 +8239,7 @@
           <w:numId w:val="7"/>
         </w:numPr>
       </w:pPr>
-      <w:bookmarkStart w:id="12" w:name="_Toc241397287"/>
+      <w:bookmarkStart w:id="12" w:name="_Toc241417940"/>
       <w:r>
         <w:t>15~25</w:t>
       </w:r>
@@ -8609,7 +8609,7 @@
           <w:numId w:val="7"/>
         </w:numPr>
       </w:pPr>
-      <w:bookmarkStart w:id="13" w:name="_Toc241397288"/>
+      <w:bookmarkStart w:id="13" w:name="_Toc241417941"/>
       <w:r>
         <w:lastRenderedPageBreak/>
         <w:t>위조와</w:t>
@@ -8636,7 +8636,7 @@
           <w:numId w:val="7"/>
         </w:numPr>
       </w:pPr>
-      <w:bookmarkStart w:id="14" w:name="_Toc241397289"/>
+      <w:bookmarkStart w:id="14" w:name="_Toc241417942"/>
       <w:r>
         <w:t>Artifact</w:t>
       </w:r>
@@ -8937,7 +8937,7 @@
           <w:numId w:val="7"/>
         </w:numPr>
       </w:pPr>
-      <w:bookmarkStart w:id="15" w:name="_Toc241397290"/>
+      <w:bookmarkStart w:id="15" w:name="_Toc241417943"/>
       <w:r>
         <w:t xml:space="preserve">Surface Forgery </w:t>
       </w:r>
@@ -9119,7 +9119,7 @@
           <w:numId w:val="7"/>
         </w:numPr>
       </w:pPr>
-      <w:bookmarkStart w:id="16" w:name="_Toc241397291"/>
+      <w:bookmarkStart w:id="16" w:name="_Toc241417944"/>
       <w:r>
         <w:lastRenderedPageBreak/>
         <w:t>Object Assembly — Deferred Expansion</w:t>
@@ -9187,7 +9187,7 @@
           <w:numId w:val="7"/>
         </w:numPr>
       </w:pPr>
-      <w:bookmarkStart w:id="17" w:name="_Toc241397292"/>
+      <w:bookmarkStart w:id="17" w:name="_Toc241417945"/>
       <w:r>
         <w:t>Quality</w:t>
       </w:r>
@@ -9476,7 +9476,7 @@
           <w:numId w:val="7"/>
         </w:numPr>
       </w:pPr>
-      <w:bookmarkStart w:id="18" w:name="_Toc241397293"/>
+      <w:bookmarkStart w:id="18" w:name="_Toc241417946"/>
       <w:r>
         <w:lastRenderedPageBreak/>
         <w:t>핵심</w:t>
@@ -9978,7 +9978,7 @@
           <w:numId w:val="7"/>
         </w:numPr>
       </w:pPr>
-      <w:bookmarkStart w:id="19" w:name="_Toc241397294"/>
+      <w:bookmarkStart w:id="19" w:name="_Toc241417947"/>
       <w:r>
         <w:t xml:space="preserve">Owner-only Forgery </w:t>
       </w:r>
@@ -10225,7 +10225,7 @@
           <w:numId w:val="7"/>
         </w:numPr>
       </w:pPr>
-      <w:bookmarkStart w:id="20" w:name="_Toc241397295"/>
+      <w:bookmarkStart w:id="20" w:name="_Toc241417948"/>
       <w:r>
         <w:lastRenderedPageBreak/>
         <w:t>잠입</w:t>
@@ -10258,7 +10258,7 @@
           <w:numId w:val="7"/>
         </w:numPr>
       </w:pPr>
-      <w:bookmarkStart w:id="21" w:name="_Toc241397296"/>
+      <w:bookmarkStart w:id="21" w:name="_Toc241417949"/>
       <w:r>
         <w:t xml:space="preserve">First-Person </w:t>
       </w:r>
@@ -10316,6 +10316,11 @@
       </w:r>
     </w:p>
     <w:p>
+      <w:r>
+        <w:t>손전등은 F 키로 켜고 끄며 처음에는 꺼져 있다. 카메라가 향하는 곳을 비추고 동료도 그 빛을 볼 수 있다. PlayerOverlay는 [F] 손전등 ON/OFF를 항상 읽을 수 있게 표시한다. 인벤토리·지도·위조 화면에서는 토글하지 않으며, 기절·구금·탈출 또는 매치 종료 시 꺼진다. 배터리와 손전등 전용 경비 감지 규칙은 추가하지 않는다.</w:t>
+      </w:r>
+    </w:p>
+    <w:p>
       <w:pPr>
         <w:pStyle w:val="21"/>
         <w:numPr>
@@ -10323,7 +10328,7 @@
           <w:numId w:val="7"/>
         </w:numPr>
       </w:pPr>
-      <w:bookmarkStart w:id="22" w:name="_Toc241397297"/>
+      <w:bookmarkStart w:id="22" w:name="_Toc241417950"/>
       <w:r>
         <w:t>Walk, Sprint, Weight, Footstep</w:t>
       </w:r>
@@ -10666,7 +10671,7 @@
           <w:numId w:val="7"/>
         </w:numPr>
       </w:pPr>
-      <w:bookmarkStart w:id="23" w:name="_Toc241397298"/>
+      <w:bookmarkStart w:id="23" w:name="_Toc241417951"/>
       <w:r>
         <w:t>Patrol Guard</w:t>
       </w:r>
@@ -10718,6 +10723,7 @@
         <w:spacing w:after="20"/>
       </w:pPr>
       <w:r>
+        <w:lastRenderedPageBreak/>
         <w:t>경계도는 서버가 확정하는 0.0~10.0 수치이며 0.5 단위로만 변한다. 시간 경과만으로 자동 상승하지 않고, 10.0에 도달하면 즉시 Lockdown으로 전환한다. Guard에게 붙잡히면 +1.0, CCTV 완전 발각과 활성 Laser 접촉은 각각 +0.5다.</w:t>
       </w:r>
     </w:p>
@@ -10757,7 +10763,6 @@
               <w:keepNext/>
             </w:pPr>
             <w:r>
-              <w:lastRenderedPageBreak/>
               <w:t>경계도</w:t>
             </w:r>
           </w:p>
@@ -11017,7 +11022,7 @@
           <w:numId w:val="7"/>
         </w:numPr>
       </w:pPr>
-      <w:bookmarkStart w:id="24" w:name="_Toc241397299"/>
+      <w:bookmarkStart w:id="24" w:name="_Toc241417952"/>
       <w:r>
         <w:t>CCTV</w:t>
       </w:r>
@@ -11036,7 +11041,7 @@
     </w:p>
     <w:p>
       <w:r>
-        <w:t>고가 Painting의 Laser는 Map에 명시적으로 연결하고 FourStar 작품인지 검증한다. Forgery Quality는 작업 후 확정되는 유사도이므로 Laser 배치 기준으로 사용하지 않는다.</w:t>
+        <w:t>고가 Painting의 Laser는 Map에 명시적으로 연결하고 FourStar 작품인지 검증한다. Forgery Quality는 작업 후 확정되는 유사도이므로 Laser 배치 기준으로 사용하지 않는다. 레이저는 문턱을 가로지르는 붉은 빔 3줄로 표시한다. 버튼 Hold와 재가동 유예 중에는 빔이 즉시 사라지고, 재가동 완료 시 다시 나타난다.</w:t>
       </w:r>
     </w:p>
     <w:p>
@@ -11171,6 +11176,7 @@
           </w:tcPr>
           <w:p>
             <w:r>
+              <w:lastRenderedPageBreak/>
               <w:t>CCTV</w:t>
             </w:r>
           </w:p>
@@ -11267,9 +11273,8 @@
           <w:numId w:val="7"/>
         </w:numPr>
       </w:pPr>
-      <w:bookmarkStart w:id="25" w:name="_Toc241397300"/>
-      <w:r>
-        <w:lastRenderedPageBreak/>
+      <w:bookmarkStart w:id="25" w:name="_Toc241417953"/>
+      <w:r>
         <w:t>Stun, Arrest, Recovery</w:t>
       </w:r>
       <w:bookmarkEnd w:id="25"/>
@@ -11342,7 +11347,7 @@
           <w:numId w:val="7"/>
         </w:numPr>
       </w:pPr>
-      <w:bookmarkStart w:id="26" w:name="_Toc241397301"/>
+      <w:bookmarkStart w:id="26" w:name="_Toc241417954"/>
       <w:r>
         <w:t>두</w:t>
       </w:r>
@@ -11630,6 +11635,7 @@
               <w:pStyle w:val="TableText"/>
             </w:pPr>
             <w:r>
+              <w:lastRenderedPageBreak/>
               <w:t>Arrest</w:t>
             </w:r>
           </w:p>
@@ -11818,7 +11824,7 @@
           <w:numId w:val="7"/>
         </w:numPr>
       </w:pPr>
-      <w:bookmarkStart w:id="27" w:name="_Toc241397302"/>
+      <w:bookmarkStart w:id="27" w:name="_Toc241417955"/>
       <w:r>
         <w:lastRenderedPageBreak/>
         <w:t>협동</w:t>
@@ -11845,7 +11851,7 @@
           <w:numId w:val="7"/>
         </w:numPr>
       </w:pPr>
-      <w:bookmarkStart w:id="28" w:name="_Toc241397303"/>
+      <w:bookmarkStart w:id="28" w:name="_Toc241417956"/>
       <w:r>
         <w:t>Role Switching</w:t>
       </w:r>
@@ -12253,7 +12259,7 @@
           <w:numId w:val="7"/>
         </w:numPr>
       </w:pPr>
-      <w:bookmarkStart w:id="29" w:name="_Toc241397304"/>
+      <w:bookmarkStart w:id="29" w:name="_Toc241417957"/>
       <w:r>
         <w:t>거리</w:t>
       </w:r>
@@ -12312,7 +12318,7 @@
           <w:numId w:val="7"/>
         </w:numPr>
       </w:pPr>
-      <w:bookmarkStart w:id="30" w:name="_Toc241397305"/>
+      <w:bookmarkStart w:id="30" w:name="_Toc241417958"/>
       <w:r>
         <w:t>Inventory, Loose Loot, Coin</w:t>
       </w:r>
@@ -12375,7 +12381,7 @@
           <w:numId w:val="7"/>
         </w:numPr>
       </w:pPr>
-      <w:bookmarkStart w:id="31" w:name="_Toc241397306"/>
+      <w:bookmarkStart w:id="31" w:name="_Toc241417959"/>
       <w:r>
         <w:t>Player Identity</w:t>
       </w:r>
@@ -12798,7 +12804,7 @@
           <w:numId w:val="7"/>
         </w:numPr>
       </w:pPr>
-      <w:bookmarkStart w:id="32" w:name="_Toc241397307"/>
+      <w:bookmarkStart w:id="32" w:name="_Toc241417960"/>
       <w:r>
         <w:t xml:space="preserve">Floor Plan Map </w:t>
       </w:r>
@@ -13010,7 +13016,7 @@
           <w:numId w:val="7"/>
         </w:numPr>
       </w:pPr>
-      <w:bookmarkStart w:id="33" w:name="_Toc241397308"/>
+      <w:bookmarkStart w:id="33" w:name="_Toc241417961"/>
       <w:r>
         <w:t>Shared Extraction</w:t>
       </w:r>
@@ -13090,7 +13096,7 @@
           <w:numId w:val="7"/>
         </w:numPr>
       </w:pPr>
-      <w:bookmarkStart w:id="34" w:name="_Toc241397309"/>
+      <w:bookmarkStart w:id="34" w:name="_Toc241417962"/>
       <w:r>
         <w:lastRenderedPageBreak/>
         <w:t xml:space="preserve">UI, </w:t>
@@ -13119,7 +13125,7 @@
           <w:numId w:val="7"/>
         </w:numPr>
       </w:pPr>
-      <w:bookmarkStart w:id="35" w:name="_Toc241397310"/>
+      <w:bookmarkStart w:id="35" w:name="_Toc241417963"/>
       <w:r>
         <w:t>HUD Information Architecture</w:t>
       </w:r>
@@ -13420,7 +13426,7 @@
           <w:numId w:val="7"/>
         </w:numPr>
       </w:pPr>
-      <w:bookmarkStart w:id="36" w:name="_Toc241397311"/>
+      <w:bookmarkStart w:id="36" w:name="_Toc241417964"/>
       <w:r>
         <w:t xml:space="preserve">Main HUD </w:t>
       </w:r>
@@ -13735,7 +13741,7 @@
           <w:numId w:val="7"/>
         </w:numPr>
       </w:pPr>
-      <w:bookmarkStart w:id="37" w:name="_Toc241397312"/>
+      <w:bookmarkStart w:id="37" w:name="_Toc241417965"/>
       <w:r>
         <w:t>최소</w:t>
       </w:r>
@@ -13816,7 +13822,7 @@
           <w:numId w:val="7"/>
         </w:numPr>
       </w:pPr>
-      <w:bookmarkStart w:id="38" w:name="_Toc241397313"/>
+      <w:bookmarkStart w:id="38" w:name="_Toc241417966"/>
       <w:r>
         <w:t xml:space="preserve">Input Mode </w:t>
       </w:r>
@@ -14297,7 +14303,7 @@
           <w:numId w:val="7"/>
         </w:numPr>
       </w:pPr>
-      <w:bookmarkStart w:id="39" w:name="_Toc241397314"/>
+      <w:bookmarkStart w:id="39" w:name="_Toc241417967"/>
       <w:r>
         <w:t>Floor Plan</w:t>
       </w:r>
@@ -14320,7 +14326,7 @@
           <w:numId w:val="7"/>
         </w:numPr>
       </w:pPr>
-      <w:bookmarkStart w:id="40" w:name="_Toc241397315"/>
+      <w:bookmarkStart w:id="40" w:name="_Toc241417968"/>
       <w:r>
         <w:t xml:space="preserve">Floor Plan Map </w:t>
       </w:r>
@@ -14635,7 +14641,7 @@
           <w:numId w:val="7"/>
         </w:numPr>
       </w:pPr>
-      <w:bookmarkStart w:id="41" w:name="_Toc241397316"/>
+      <w:bookmarkStart w:id="41" w:name="_Toc241417969"/>
       <w:r>
         <w:t xml:space="preserve">Team Result / Replica Recap </w:t>
       </w:r>
@@ -15013,7 +15019,7 @@
           <w:numId w:val="7"/>
         </w:numPr>
       </w:pPr>
-      <w:bookmarkStart w:id="42" w:name="_Toc241397317"/>
+      <w:bookmarkStart w:id="42" w:name="_Toc241417970"/>
       <w:r>
         <w:t>첫</w:t>
       </w:r>
@@ -15288,7 +15294,7 @@
           <w:numId w:val="7"/>
         </w:numPr>
       </w:pPr>
-      <w:bookmarkStart w:id="43" w:name="_Toc241397318"/>
+      <w:bookmarkStart w:id="43" w:name="_Toc241417971"/>
       <w:r>
         <w:t>접근성</w:t>
       </w:r>
@@ -15360,7 +15366,7 @@
           <w:numId w:val="7"/>
         </w:numPr>
       </w:pPr>
-      <w:bookmarkStart w:id="44" w:name="_Toc241397319"/>
+      <w:bookmarkStart w:id="44" w:name="_Toc241417972"/>
       <w:r>
         <w:lastRenderedPageBreak/>
         <w:t>레벨</w:t>
@@ -15387,7 +15393,7 @@
     </w:p>
     <w:p>
       <w:r>
-        <w:t>작품과 바닥은 기존 박물관 에셋의 형태와 재질을 활용한다. 작품은 Showcase Canvas 7종을 바탕으로 그림 면만 교체하고, 일반 전시와 훔칠 수 있는 전시의 구분을 유지한다. 바닥은 에디터에서 공용 PCG로 타일을 배치하며, 고정된 방·복도 구조를 유지한 채 타일 종류에만 변화를 준다. 런타임 맵 생성은 포함하지 않는다. 그림은 별도 흰 여백 없이 액자 안을 채우고, 비율을 유지한 채 가장자리를 잘라 맞춘다. 작은 작품도 관람 거리에서 읽히도록 키우되 주변 작품과 간격을 유지한다. 전시 조명은 작품 바로 위 천장에서 작품을 강조하고, 통로 조명은 길을 읽을 수 있는 낮은 밝기로 제한한다. Showcase Droplights 3종은 작품의 폭과 구성에 맞춰 선택하며, Drop Ceiling은 통로에만 사용한다. 종류를 순환하거나 무작위로 섞지 않는다. 야간 대비를 위해 기존 환경 광원의 밝기를 절반으로 낮춘다.</w:t>
+        <w:t>작품과 바닥은 기존 박물관 에셋의 형태와 재질을 활용한다. 작품은 Showcase Canvas 7종을 바탕으로 그림 면만 교체하고, 일반 전시와 훔칠 수 있는 전시의 구분을 유지한다. 바닥은 에디터에서 공용 PCG로 타일을 배치하며, 고정된 방·복도 구조를 유지한 채 타일 종류에만 변화를 준다. 런타임 맵 생성은 포함하지 않는다. 그림은 별도 흰 여백 없이 액자 안을 채우고, 비율을 유지한 채 가장자리를 잘라 맞춘다. 작은 작품도 관람 거리에서 읽히도록 키우되 주변 작품과 간격을 유지한다. 전시 조명은 작품 바로 위 천장에서 작품을 강조하고, 통로 조명은 길을 읽을 수 있는 낮은 밝기로 제한한다. Showcase Droplights 3종은 작품의 폭과 구성에 맞춰 선택하며, Drop Ceiling은 통로에만 사용한다. 종류를 순환하거나 무작위로 섞지 않는다. 야간 대비를 위해 기존 환경 광원의 밝기를 절반으로 낮춘다. 작품의 기존 군집은 유지하되 같은 줄의 중심 높이, 세로 쌓기의 중심축과 액자 사이 여백을 정돈한다. 전등은 종류마다 천장에서 내려오는 길이를 통일해 임의로 크기를 보정한 인상을 없앤다.</w:t>
       </w:r>
     </w:p>
     <w:p>
@@ -15398,7 +15404,7 @@
           <w:numId w:val="7"/>
         </w:numPr>
       </w:pPr>
-      <w:bookmarkStart w:id="45" w:name="_Toc241397320"/>
+      <w:bookmarkStart w:id="45" w:name="_Toc241417973"/>
       <w:r>
         <w:t>세</w:t>
       </w:r>
@@ -15485,7 +15491,11 @@
         </w:numPr>
       </w:pPr>
       <w:r>
-        <w:t>세 맵은 동일한 Gameplay Rule을 사용하되, Material과 Lighting만이 아니라 Macro Topology, 첫 10초의 정보 공개 방식, Landmark, Target 이후 귀환 경로로 서로 다른 플레이 정체성을 만든다. 야간 침입은 상시 전면 조명 대신 꺼진 구역과 국소 조명의 대비로 표현한다. M01은 따뜻한 전시 잔등, M02는 푸른 중정과 어두운 회랑, M03는 차가운 유리 채광과 서비스 조명을 중심으로 구성한다. 작품 앞과 버튼·출구는 식별 가능하게 유지하며 조명만으로 도난 대상을 알려주지 않는다. 경비실과 구금실은 관람 동선에서 갈라지는 단일 보안 진입부 뒤에 둔다. 폭 1.8m 출입구와 불투명 전실 벽으로 직접 시야를 끊고, CCTV와 내부 순찰을 통과한 뒤 압수품 회수 또는 구금실 구조를 선택한다. 구금실에는 잠긴 철창문으로만 통과할 수 있는 완전한 철제 칸막이와 고정 벤치를 두고, 보안 표지·금속 문틀·차가운 국소등으로 일반 전시실과 경계를 구분한다. 추가 열쇠나 해킹 없이 기존 상호작용으로 구조·회수하며 구조 또는 구속 시간 경과 후 동일 진입부를 통해 탈출을 시도한다. 각 맵의 기존 경비 한 명을 보안 구역과 인접 복도를 순찰하도록 배치한다. 순환 목표는 25~35초이며 철창 앞에서 2~3초 확인한다. 철창 안 구금자는 시야만으로 재체포하지 않으며 작업 실패 소음에는 조사로 반응한다.</w:t>
+        <w:t xml:space="preserve">세 맵은 동일한 Gameplay Rule을 사용하되, Material과 Lighting만이 아니라 Macro Topology, 첫 10초의 정보 공개 방식, Landmark, Target 이후 귀환 경로로 서로 다른 플레이 정체성을 만든다. 야간 침입은 상시 전면 조명 대신 꺼진 구역과 국소 조명의 대비로 표현한다. M01은 따뜻한 전시 잔등, M02는 푸른 중정과 어두운 회랑, M03는 차가운 유리 채광과 서비스 조명을 중심으로 구성한다. 작품 앞과 버튼·출구는 식별 가능하게 유지하며 조명만으로 도난 대상을 알려주지 않는다. 경비실과 구금실은 관람 동선에서 갈라지는 단일 보안 진입부 뒤에 둔다. 폭 1.8m 출입구와 불투명 전실 벽으로 직접 시야를 끊고, CCTV와 내부 순찰을 통과한 뒤 압수품 회수 또는 구금실 구조를 선택한다. 구금실에는 잠긴 철창문으로만 통과할 수 있는 완전한 철제 칸막이와 고정 벤치를 두고, 보안 표지·금속 문틀·차가운 국소등으로 일반 전시실과 경계를 구분한다. 추가 열쇠나 해킹 없이 기존 상호작용으로 구조·회수하며 구조 또는 구속 시간 경과 후 동일 진입부를 통해 탈출을 시도한다. 각 맵의 기존 경비 한 명을 보안 구역과 인접 복도를 순찰하도록 배치한다. 순환 목표는 </w:t>
+      </w:r>
+      <w:r>
+        <w:lastRenderedPageBreak/>
+        <w:t>25~35초이며 철창 앞에서 2~3초 확인한다. 철창 안 구금자는 시야만으로 재체포하지 않으며 작업 실패 소음에는 조사로 반응한다.</w:t>
       </w:r>
     </w:p>
     <w:p>
@@ -15493,11 +15503,7 @@
         <w:pStyle w:val="a0"/>
       </w:pPr>
       <w:r>
-        <w:t xml:space="preserve">전시실은 작품 벽과 관람 공간을 함께 설계한다. 승인 평면도 기준 외벽 0.40m, 내벽 0.24m, 일반 연결 문 3~4m, 후면 관리 회랑 약 5.5~5.7m를 사용한다. 작품 앞 작업 공간은 2.2m를 확보하며 </w:t>
-      </w:r>
-      <w:r>
-        <w:lastRenderedPageBreak/>
-        <w:t>활성 작품은 그림 표면에서 정면 0.7m의 근거리 접근점으로 진입할 수 있어야 한다. 맵별 활성 작품 20점, 일반 작품 M01 51점·M02 53점·M03 61점과 12종 전시 패턴을 배치한다. 통과 폭과 15~25분 플레이 시간은 실제 멀티플레이로 검증한다. 작품 발견과 다음 전시 구역 진입이 연달아 끝나지 않도록 맵별 바닥 면적을 이전 배치의 약 2배로 확장한다. 활성 작품 20점과 일반 작품 수, 군집 내부 간격, 액자·문·상호작용 영역 크기와 위조 시간은 유지하고 구역 및 군집 사이 이동 거리를 늘린다. 기존 엇갈린 출입구와 차폐벽을 유지하며 탐색·위험 판단·귀환에 드는 시간을 함께 평가한다. 면적 증가를 15~25분 플레이 시간 달성으로 간주하지 않고 실제 경로와 플레이 테스트로 검증한다. 초반 전시실과 필수 작품 전시실에는 높이 3.2m의 벽 연결형 차폐벽을 총 7개 배치해 한 자리에서 여러 작품을 연속 확인하는 시야를 나누고, 벽 끝의 열린 통로로 우회하도록 한다.</w:t>
+        <w:t>전시실은 작품 벽과 관람 공간을 함께 설계한다. 승인 평면도 기준 외벽 0.40m, 내벽 0.24m, 일반 연결 문 3~4m, 후면 관리 회랑 약 5.5~5.7m를 사용한다. 작품 앞 작업 공간은 2.2m를 확보하며 활성 작품은 그림 표면에서 정면 0.7m의 근거리 접근점으로 진입할 수 있어야 한다. 맵별 활성 작품 20점, 일반 작품 M01 51점·M02 53점·M03 61점과 12종 전시 패턴을 배치한다. 통과 폭과 15~25분 플레이 시간은 실제 멀티플레이로 검증한다. 작품 발견과 다음 전시 구역 진입이 연달아 끝나지 않도록 맵별 바닥 면적을 이전 배치의 약 2배로 확장한다. 활성 작품 20점과 일반 작품 수, 군집 내부 간격, 액자·문·상호작용 영역 크기와 위조 시간은 유지하고 구역 및 군집 사이 이동 거리를 늘린다. 기존 엇갈린 출입구와 차폐벽을 유지하며 탐색·위험 판단·귀환에 드는 시간을 함께 평가한다. 면적 증가를 15~25분 플레이 시간 달성으로 간주하지 않고 실제 경로와 플레이 테스트로 검증한다. 초반 전시실과 필수 작품 전시실에는 높이 3.2m의 벽 연결형 차폐벽을 총 7개 배치해 한 자리에서 여러 작품을 연속 확인하는 시야를 나누고, 벽 끝의 열린 통로로 우회하도록 한다.</w:t>
       </w:r>
     </w:p>
     <w:p>
@@ -15517,7 +15523,7 @@
       <w:pPr>
         <w:pStyle w:val="31"/>
       </w:pPr>
-      <w:bookmarkStart w:id="46" w:name="_Toc241397321"/>
+      <w:bookmarkStart w:id="46" w:name="_Toc241417974"/>
       <w:r>
         <w:t>전시</w:t>
       </w:r>
@@ -15557,6 +15563,7 @@
         <w:pStyle w:val="a0"/>
       </w:pPr>
       <w:r>
+        <w:lastRenderedPageBreak/>
         <w:t>단독 여백형 · 동등한 2점형 · 동일 높이 3점 연작 · 긴 5점 연속형: 여백과 관람 순서, 반복 작품의 비교에 차이를 둔다.</w:t>
       </w:r>
     </w:p>
@@ -15573,7 +15580,6 @@
         <w:pStyle w:val="a0"/>
       </w:pPr>
       <w:r>
-        <w:lastRenderedPageBreak/>
         <w:t>하단 기준선형 · 비대칭 균형형 · 여백으로 나눈 두 쌍형 · 코너를 잇는 2벽형: 다른 크기의 작품을 정렬하거나 군집을 분리하고 관람 방향을 전환한다.</w:t>
       </w:r>
     </w:p>
@@ -15590,7 +15596,7 @@
           <w:numId w:val="7"/>
         </w:numPr>
       </w:pPr>
-      <w:bookmarkStart w:id="47" w:name="_Toc241397322"/>
+      <w:bookmarkStart w:id="47" w:name="_Toc241417975"/>
       <w:r>
         <w:t>맵</w:t>
       </w:r>
@@ -15960,7 +15966,7 @@
           </w:tcPr>
           <w:p>
             <w:r>
-              <w:t>교대 굴절 복도·독립 전시실·서비스 동선</w:t>
+              <w:t>원본 대형 홀·연속 전시실·외곽 직원 통로</w:t>
             </w:r>
           </w:p>
         </w:tc>
@@ -15970,14 +15976,8 @@
             <w:vAlign w:val="center"/>
           </w:tcPr>
           <w:p>
-            <w:pPr>
-              <w:pStyle w:val="TableText"/>
-            </w:pPr>
-            <w:r>
-              <w:rPr>
-                <w:sz w:val="16"/>
-              </w:rPr>
-              <w:t>백색 콘크리트·유리·금속·비상등</w:t>
+            <w:r>
+              <w:t>목재 트러스·노출 덕트·백색 전시벽·천창</w:t>
             </w:r>
           </w:p>
         </w:tc>
@@ -15987,13 +15987,7 @@
             <w:vAlign w:val="center"/>
           </w:tcPr>
           <w:p>
-            <w:pPr>
-              <w:pStyle w:val="TableText"/>
-            </w:pPr>
-            <w:r>
-              <w:rPr>
-                <w:sz w:val="16"/>
-              </w:rPr>
+            <w:r>
               <w:t>건조한 반사음·기계음</w:t>
             </w:r>
           </w:p>
@@ -16004,11 +15998,8 @@
             <w:vAlign w:val="center"/>
           </w:tcPr>
           <w:p>
-            <w:pPr>
-              <w:pStyle w:val="TableText"/>
-            </w:pPr>
-            <w:r>
-              <w:t>즉시 경로 선택·레인 전환</w:t>
+            <w:r>
+              <w:t>개방 홀의 노출과 외곽 우회 선택</w:t>
             </w:r>
           </w:p>
         </w:tc>
@@ -16031,7 +16022,7 @@
           <w:numId w:val="7"/>
         </w:numPr>
       </w:pPr>
-      <w:bookmarkStart w:id="48" w:name="_Toc241397323"/>
+      <w:bookmarkStart w:id="48" w:name="_Toc241417976"/>
       <w:r>
         <w:lastRenderedPageBreak/>
         <w:t xml:space="preserve">M01 — </w:t>
@@ -16345,7 +16336,7 @@
           <w:numId w:val="7"/>
         </w:numPr>
       </w:pPr>
-      <w:bookmarkStart w:id="49" w:name="_Toc241397324"/>
+      <w:bookmarkStart w:id="49" w:name="_Toc241417977"/>
       <w:r>
         <w:lastRenderedPageBreak/>
         <w:t xml:space="preserve">M02 — </w:t>
@@ -16656,7 +16647,7 @@
           <w:numId w:val="7"/>
         </w:numPr>
       </w:pPr>
-      <w:bookmarkStart w:id="50" w:name="_Toc241397325"/>
+      <w:bookmarkStart w:id="50" w:name="_Toc241417978"/>
       <w:r>
         <w:lastRenderedPageBreak/>
         <w:t xml:space="preserve">M03 — </w:t>
@@ -16674,7 +16665,7 @@
     </w:p>
     <w:p>
       <w:r>
-        <w:t>132×80m의 현대미술관이다. 북측 전시 날개, 중앙 굴절 복도와 독립 전시실, 남측 복원·서비스 동선을 25개 구역과 25개 문으로 연결한다. 중앙 복도는 위·아래로 교대해 꺾이며 C1·C2 소전시실은 단일 출입구, C3 전시실은 북측 날개로 이어지는 두 출입구를 사용한다. 북동·중앙 동측·남측 고가 선택실에 Laser를 두되 독립적인 일반 이탈 문을 제공한다. 벽 높이는 5m이며 고측 유리 채광과 금속 구조, 백색 콘크리트 벽면으로 현대미술관을 표현한다. 필수 작품은 Laser가 없는 북동 N4 전시실의 북쪽 벽에 둔다. 세 버튼은 각각 N4 남동·C3 남동·S2 남동 모서리의 차폐 공간에 두고, 일직선 통과 순찰선에서 벗어나 진입 준비와 역할 교대를 할 수 있게 한다. 남측 버튼과 겹치던 전리품 받침대는 동쪽 서비스실로 옮겨 차폐 공간의 바닥을 비운다. 남쪽 서비스 레인 S4에서만 보안 구역으로 진입하며 중앙 C4와 구금실 및 남쪽 회랑의 직통 문을 닫는다. 전실 남쪽으로 꺾어 들어가는 접근로와 구금실 동쪽 개구부로 경계를 단계적으로 통과한다.</w:t>
+        <w:t>사용자 승인 갤러리 팩 AIUE5_vol10_01을 기반으로 약 53×36m의 단층 현대미술관을 구성한다. 35×13m의 원본 홀과 높은 목재 트러스·노출 덕트·대표 설치물을 보존하고, 북측 A·B·C 전시실을 순차 탐색 동선으로 연결한다. 홀 6점, 각 전시실 4점, 동측 고가실 2점으로 활성 작품 20점을 배치하며 일반 장식 작품을 함께 전시한다. 서·북·동측 폭 4m 직원 통로는 별도 우회 경로이고, 동측 경비실·압수품 보관실·철창 구금실은 이 통로에서만 진입한다. 남서측 전실에 침입·회수 지점을 두고 홀과 직원 통로로 갈라진다. 필수 작품은 C 전시실에 배치하며 고가실의 레이저 협동은 선택 사항으로 유지한다. 낮은 별관 천장과 높은 원본 홀의 대비, 약한 천창 월광과 작품용 국소 조명으로 밤의 공간감을 만든다. 이 승인안은 앞의 공통 설명에 남은 M03 외곽 크기·일반 작품 수·옛 방 이름과 동선 수치에 우선한다. 면적이나 경로만으로 목표 플레이 시간을 달성했다고 판단하지 않는다.</w:t>
       </w:r>
     </w:p>
     <w:tbl>
@@ -16906,7 +16897,7 @@
               </w:rPr>
               <w:drawing>
                 <wp:inline distT="0" distB="0" distL="0" distR="0" wp14:anchorId="6384B8F9" wp14:editId="75B922F6">
-                  <wp:extent cx="5120640" cy="3200400"/>
+                  <wp:extent cx="5120640" cy="3533775"/>
                   <wp:effectExtent l="0" t="0" r="0" b="0"/>
                   <wp:docPr id="3" name="Picture 3"/>
                   <wp:cNvGraphicFramePr>
@@ -16928,7 +16919,7 @@
                         <pic:spPr>
                           <a:xfrm>
                             <a:off x="0" y="0"/>
-                            <a:ext cx="5120640" cy="3200400"/>
+                            <a:ext cx="5120640" cy="3533775"/>
                           </a:xfrm>
                           <a:prstGeom prst="rect">
                             <a:avLst/>
@@ -16961,7 +16952,7 @@
           <w:numId w:val="7"/>
         </w:numPr>
       </w:pPr>
-      <w:bookmarkStart w:id="51" w:name="_Toc241397326"/>
+      <w:bookmarkStart w:id="51" w:name="_Toc241417979"/>
       <w:r>
         <w:lastRenderedPageBreak/>
         <w:t xml:space="preserve">First-Person </w:t>
@@ -17045,7 +17036,7 @@
           <w:numId w:val="7"/>
         </w:numPr>
       </w:pPr>
-      <w:bookmarkStart w:id="52" w:name="_Toc241397327"/>
+      <w:bookmarkStart w:id="52" w:name="_Toc241417980"/>
       <w:r>
         <w:t>사운드</w:t>
       </w:r>
@@ -17485,7 +17476,7 @@
           <w:numId w:val="7"/>
         </w:numPr>
       </w:pPr>
-      <w:bookmarkStart w:id="53" w:name="_Toc241397328"/>
+      <w:bookmarkStart w:id="53" w:name="_Toc241417981"/>
       <w:r>
         <w:lastRenderedPageBreak/>
         <w:t>세계관과</w:t>
@@ -17732,7 +17723,7 @@
           <w:numId w:val="7"/>
         </w:numPr>
       </w:pPr>
-      <w:bookmarkStart w:id="54" w:name="_Toc241397329"/>
+      <w:bookmarkStart w:id="54" w:name="_Toc241417982"/>
       <w:r>
         <w:lastRenderedPageBreak/>
         <w:t>범위</w:t>
@@ -17759,7 +17750,7 @@
           <w:numId w:val="7"/>
         </w:numPr>
       </w:pPr>
-      <w:bookmarkStart w:id="55" w:name="_Toc241397330"/>
+      <w:bookmarkStart w:id="55" w:name="_Toc241417983"/>
       <w:r>
         <w:t>v1.0 Required Scope</w:t>
       </w:r>
@@ -18127,7 +18118,7 @@
           <w:numId w:val="7"/>
         </w:numPr>
       </w:pPr>
-      <w:bookmarkStart w:id="56" w:name="_Toc241397331"/>
+      <w:bookmarkStart w:id="56" w:name="_Toc241417984"/>
       <w:r>
         <w:t>Deferred Expansion</w:t>
       </w:r>
@@ -18151,7 +18142,7 @@
           <w:numId w:val="7"/>
         </w:numPr>
       </w:pPr>
-      <w:bookmarkStart w:id="57" w:name="_Toc241397332"/>
+      <w:bookmarkStart w:id="57" w:name="_Toc241417985"/>
       <w:r>
         <w:t>Stretch</w:t>
       </w:r>
@@ -18529,7 +18520,7 @@
           <w:numId w:val="7"/>
         </w:numPr>
       </w:pPr>
-      <w:bookmarkStart w:id="58" w:name="_Toc241397333"/>
+      <w:bookmarkStart w:id="58" w:name="_Toc241417986"/>
       <w:r>
         <w:lastRenderedPageBreak/>
         <w:t>Starting Balance Targets</w:t>
@@ -19128,7 +19119,7 @@
           <w:numId w:val="7"/>
         </w:numPr>
       </w:pPr>
-      <w:bookmarkStart w:id="59" w:name="_Toc241397334"/>
+      <w:bookmarkStart w:id="59" w:name="_Toc241417987"/>
       <w:r>
         <w:t>Playtest Questions</w:t>
       </w:r>
@@ -19214,7 +19205,7 @@
           <w:numId w:val="7"/>
         </w:numPr>
       </w:pPr>
-      <w:bookmarkStart w:id="60" w:name="_Toc241397335"/>
+      <w:bookmarkStart w:id="60" w:name="_Toc241417988"/>
       <w:r>
         <w:lastRenderedPageBreak/>
         <w:t>Release KPI</w:t>
@@ -19546,7 +19537,7 @@
           <w:numId w:val="7"/>
         </w:numPr>
       </w:pPr>
-      <w:bookmarkStart w:id="61" w:name="_Toc241397336"/>
+      <w:bookmarkStart w:id="61" w:name="_Toc241417989"/>
       <w:r>
         <w:t>W6~W12 Roadmap</w:t>
       </w:r>
@@ -19912,7 +19903,7 @@
         <w:keepLines/>
         <w:pageBreakBefore w:val="0"/>
       </w:pPr>
-      <w:bookmarkStart w:id="62" w:name="_Toc241397337"/>
+      <w:bookmarkStart w:id="62" w:name="_Toc241417990"/>
       <w:r>
         <w:t>Appendix A — 용어</w:t>
       </w:r>
@@ -20303,7 +20294,7 @@
         <w:keepLines/>
         <w:pageBreakBefore w:val="0"/>
       </w:pPr>
-      <w:bookmarkStart w:id="63" w:name="_Toc241397338"/>
+      <w:bookmarkStart w:id="63" w:name="_Toc241417991"/>
       <w:r>
         <w:rPr>
           <w:sz w:val="32"/>
@@ -20527,7 +20518,7 @@
         <w:keepLines/>
         <w:pageBreakBefore w:val="0"/>
       </w:pPr>
-      <w:bookmarkStart w:id="64" w:name="_Toc241397339"/>
+      <w:bookmarkStart w:id="64" w:name="_Toc241417992"/>
       <w:r>
         <w:rPr>
           <w:sz w:val="32"/>

</xml_diff>

<commit_message>
Expand M03 galleries and tune night lighting and flashlight
</commit_message>
<xml_diff>
--- a/Museum_Heist_GDD.docx
+++ b/Museum_Heist_GDD.docx
@@ -559,7 +559,7 @@
       <w:r>
         <w:fldChar w:fldCharType="separate"/>
       </w:r>
-      <w:hyperlink w:anchor="_Toc241417928" w:history="1">
+      <w:hyperlink w:anchor="_Toc241508988" w:history="1">
         <w:r>
           <w:rPr>
             <w:rStyle w:val="aff1"/>
@@ -586,7 +586,7 @@
             <w:noProof/>
             <w:webHidden/>
           </w:rPr>
-          <w:instrText xml:space="preserve"> PAGEREF _Toc241417928 \h </w:instrText>
+          <w:instrText xml:space="preserve"> PAGEREF _Toc241508988 \h </w:instrText>
         </w:r>
         <w:r>
           <w:rPr>
@@ -635,7 +635,7 @@
           <w14:ligatures w14:val="standardContextual"/>
         </w:rPr>
       </w:pPr>
-      <w:hyperlink w:anchor="_Toc241417929" w:history="1">
+      <w:hyperlink w:anchor="_Toc241508989" w:history="1">
         <w:r>
           <w:rPr>
             <w:rStyle w:val="aff1"/>
@@ -662,7 +662,7 @@
             <w:noProof/>
             <w:webHidden/>
           </w:rPr>
-          <w:instrText xml:space="preserve"> PAGEREF _Toc241417929 \h </w:instrText>
+          <w:instrText xml:space="preserve"> PAGEREF _Toc241508989 \h </w:instrText>
         </w:r>
         <w:r>
           <w:rPr>
@@ -711,7 +711,7 @@
           <w14:ligatures w14:val="standardContextual"/>
         </w:rPr>
       </w:pPr>
-      <w:hyperlink w:anchor="_Toc241417930" w:history="1">
+      <w:hyperlink w:anchor="_Toc241508990" w:history="1">
         <w:r>
           <w:rPr>
             <w:rStyle w:val="aff1"/>
@@ -738,7 +738,7 @@
             <w:noProof/>
             <w:webHidden/>
           </w:rPr>
-          <w:instrText xml:space="preserve"> PAGEREF _Toc241417930 \h </w:instrText>
+          <w:instrText xml:space="preserve"> PAGEREF _Toc241508990 \h </w:instrText>
         </w:r>
         <w:r>
           <w:rPr>
@@ -787,7 +787,7 @@
           <w14:ligatures w14:val="standardContextual"/>
         </w:rPr>
       </w:pPr>
-      <w:hyperlink w:anchor="_Toc241417931" w:history="1">
+      <w:hyperlink w:anchor="_Toc241508991" w:history="1">
         <w:r>
           <w:rPr>
             <w:rStyle w:val="aff1"/>
@@ -814,7 +814,7 @@
             <w:noProof/>
             <w:webHidden/>
           </w:rPr>
-          <w:instrText xml:space="preserve"> PAGEREF _Toc241417931 \h </w:instrText>
+          <w:instrText xml:space="preserve"> PAGEREF _Toc241508991 \h </w:instrText>
         </w:r>
         <w:r>
           <w:rPr>
@@ -863,7 +863,7 @@
           <w14:ligatures w14:val="standardContextual"/>
         </w:rPr>
       </w:pPr>
-      <w:hyperlink w:anchor="_Toc241417932" w:history="1">
+      <w:hyperlink w:anchor="_Toc241508992" w:history="1">
         <w:r>
           <w:rPr>
             <w:rStyle w:val="aff1"/>
@@ -890,7 +890,7 @@
             <w:noProof/>
             <w:webHidden/>
           </w:rPr>
-          <w:instrText xml:space="preserve"> PAGEREF _Toc241417932 \h </w:instrText>
+          <w:instrText xml:space="preserve"> PAGEREF _Toc241508992 \h </w:instrText>
         </w:r>
         <w:r>
           <w:rPr>
@@ -939,7 +939,7 @@
           <w14:ligatures w14:val="standardContextual"/>
         </w:rPr>
       </w:pPr>
-      <w:hyperlink w:anchor="_Toc241417933" w:history="1">
+      <w:hyperlink w:anchor="_Toc241508993" w:history="1">
         <w:r>
           <w:rPr>
             <w:rStyle w:val="aff1"/>
@@ -966,7 +966,7 @@
             <w:noProof/>
             <w:webHidden/>
           </w:rPr>
-          <w:instrText xml:space="preserve"> PAGEREF _Toc241417933 \h </w:instrText>
+          <w:instrText xml:space="preserve"> PAGEREF _Toc241508993 \h </w:instrText>
         </w:r>
         <w:r>
           <w:rPr>
@@ -1015,7 +1015,7 @@
           <w14:ligatures w14:val="standardContextual"/>
         </w:rPr>
       </w:pPr>
-      <w:hyperlink w:anchor="_Toc241417934" w:history="1">
+      <w:hyperlink w:anchor="_Toc241508994" w:history="1">
         <w:r>
           <w:rPr>
             <w:rStyle w:val="aff1"/>
@@ -1042,7 +1042,7 @@
             <w:noProof/>
             <w:webHidden/>
           </w:rPr>
-          <w:instrText xml:space="preserve"> PAGEREF _Toc241417934 \h </w:instrText>
+          <w:instrText xml:space="preserve"> PAGEREF _Toc241508994 \h </w:instrText>
         </w:r>
         <w:r>
           <w:rPr>
@@ -1090,7 +1090,7 @@
           <w14:ligatures w14:val="standardContextual"/>
         </w:rPr>
       </w:pPr>
-      <w:hyperlink w:anchor="_Toc241417935" w:history="1">
+      <w:hyperlink w:anchor="_Toc241508995" w:history="1">
         <w:r>
           <w:rPr>
             <w:rStyle w:val="aff1"/>
@@ -1117,7 +1117,7 @@
             <w:noProof/>
             <w:webHidden/>
           </w:rPr>
-          <w:instrText xml:space="preserve"> PAGEREF _Toc241417935 \h </w:instrText>
+          <w:instrText xml:space="preserve"> PAGEREF _Toc241508995 \h </w:instrText>
         </w:r>
         <w:r>
           <w:rPr>
@@ -1166,7 +1166,7 @@
           <w14:ligatures w14:val="standardContextual"/>
         </w:rPr>
       </w:pPr>
-      <w:hyperlink w:anchor="_Toc241417936" w:history="1">
+      <w:hyperlink w:anchor="_Toc241508996" w:history="1">
         <w:r>
           <w:rPr>
             <w:rStyle w:val="aff1"/>
@@ -1193,7 +1193,7 @@
             <w:noProof/>
             <w:webHidden/>
           </w:rPr>
-          <w:instrText xml:space="preserve"> PAGEREF _Toc241417936 \h </w:instrText>
+          <w:instrText xml:space="preserve"> PAGEREF _Toc241508996 \h </w:instrText>
         </w:r>
         <w:r>
           <w:rPr>
@@ -1242,7 +1242,7 @@
           <w14:ligatures w14:val="standardContextual"/>
         </w:rPr>
       </w:pPr>
-      <w:hyperlink w:anchor="_Toc241417937" w:history="1">
+      <w:hyperlink w:anchor="_Toc241508997" w:history="1">
         <w:r>
           <w:rPr>
             <w:rStyle w:val="aff1"/>
@@ -1269,7 +1269,7 @@
             <w:noProof/>
             <w:webHidden/>
           </w:rPr>
-          <w:instrText xml:space="preserve"> PAGEREF _Toc241417937 \h </w:instrText>
+          <w:instrText xml:space="preserve"> PAGEREF _Toc241508997 \h </w:instrText>
         </w:r>
         <w:r>
           <w:rPr>
@@ -1318,7 +1318,7 @@
           <w14:ligatures w14:val="standardContextual"/>
         </w:rPr>
       </w:pPr>
-      <w:hyperlink w:anchor="_Toc241417938" w:history="1">
+      <w:hyperlink w:anchor="_Toc241508998" w:history="1">
         <w:r>
           <w:rPr>
             <w:rStyle w:val="aff1"/>
@@ -1345,7 +1345,7 @@
             <w:noProof/>
             <w:webHidden/>
           </w:rPr>
-          <w:instrText xml:space="preserve"> PAGEREF _Toc241417938 \h </w:instrText>
+          <w:instrText xml:space="preserve"> PAGEREF _Toc241508998 \h </w:instrText>
         </w:r>
         <w:r>
           <w:rPr>
@@ -1394,7 +1394,7 @@
           <w14:ligatures w14:val="standardContextual"/>
         </w:rPr>
       </w:pPr>
-      <w:hyperlink w:anchor="_Toc241417939" w:history="1">
+      <w:hyperlink w:anchor="_Toc241508999" w:history="1">
         <w:r>
           <w:rPr>
             <w:rStyle w:val="aff1"/>
@@ -1421,7 +1421,7 @@
             <w:noProof/>
             <w:webHidden/>
           </w:rPr>
-          <w:instrText xml:space="preserve"> PAGEREF _Toc241417939 \h </w:instrText>
+          <w:instrText xml:space="preserve"> PAGEREF _Toc241508999 \h </w:instrText>
         </w:r>
         <w:r>
           <w:rPr>
@@ -1470,7 +1470,7 @@
           <w14:ligatures w14:val="standardContextual"/>
         </w:rPr>
       </w:pPr>
-      <w:hyperlink w:anchor="_Toc241417940" w:history="1">
+      <w:hyperlink w:anchor="_Toc241509000" w:history="1">
         <w:r>
           <w:rPr>
             <w:rStyle w:val="aff1"/>
@@ -1497,7 +1497,7 @@
             <w:noProof/>
             <w:webHidden/>
           </w:rPr>
-          <w:instrText xml:space="preserve"> PAGEREF _Toc241417940 \h </w:instrText>
+          <w:instrText xml:space="preserve"> PAGEREF _Toc241509000 \h </w:instrText>
         </w:r>
         <w:r>
           <w:rPr>
@@ -1545,7 +1545,7 @@
           <w14:ligatures w14:val="standardContextual"/>
         </w:rPr>
       </w:pPr>
-      <w:hyperlink w:anchor="_Toc241417941" w:history="1">
+      <w:hyperlink w:anchor="_Toc241509001" w:history="1">
         <w:r>
           <w:rPr>
             <w:rStyle w:val="aff1"/>
@@ -1572,7 +1572,7 @@
             <w:noProof/>
             <w:webHidden/>
           </w:rPr>
-          <w:instrText xml:space="preserve"> PAGEREF _Toc241417941 \h </w:instrText>
+          <w:instrText xml:space="preserve"> PAGEREF _Toc241509001 \h </w:instrText>
         </w:r>
         <w:r>
           <w:rPr>
@@ -1621,7 +1621,7 @@
           <w14:ligatures w14:val="standardContextual"/>
         </w:rPr>
       </w:pPr>
-      <w:hyperlink w:anchor="_Toc241417942" w:history="1">
+      <w:hyperlink w:anchor="_Toc241509002" w:history="1">
         <w:r>
           <w:rPr>
             <w:rStyle w:val="aff1"/>
@@ -1648,7 +1648,7 @@
             <w:noProof/>
             <w:webHidden/>
           </w:rPr>
-          <w:instrText xml:space="preserve"> PAGEREF _Toc241417942 \h </w:instrText>
+          <w:instrText xml:space="preserve"> PAGEREF _Toc241509002 \h </w:instrText>
         </w:r>
         <w:r>
           <w:rPr>
@@ -1697,7 +1697,7 @@
           <w14:ligatures w14:val="standardContextual"/>
         </w:rPr>
       </w:pPr>
-      <w:hyperlink w:anchor="_Toc241417943" w:history="1">
+      <w:hyperlink w:anchor="_Toc241509003" w:history="1">
         <w:r>
           <w:rPr>
             <w:rStyle w:val="aff1"/>
@@ -1724,7 +1724,7 @@
             <w:noProof/>
             <w:webHidden/>
           </w:rPr>
-          <w:instrText xml:space="preserve"> PAGEREF _Toc241417943 \h </w:instrText>
+          <w:instrText xml:space="preserve"> PAGEREF _Toc241509003 \h </w:instrText>
         </w:r>
         <w:r>
           <w:rPr>
@@ -1744,7 +1744,7 @@
             <w:noProof/>
             <w:webHidden/>
           </w:rPr>
-          <w:t>9</w:t>
+          <w:t>10</w:t>
         </w:r>
         <w:r>
           <w:rPr>
@@ -1773,7 +1773,7 @@
           <w14:ligatures w14:val="standardContextual"/>
         </w:rPr>
       </w:pPr>
-      <w:hyperlink w:anchor="_Toc241417944" w:history="1">
+      <w:hyperlink w:anchor="_Toc241509004" w:history="1">
         <w:r>
           <w:rPr>
             <w:rStyle w:val="aff1"/>
@@ -1800,7 +1800,7 @@
             <w:noProof/>
             <w:webHidden/>
           </w:rPr>
-          <w:instrText xml:space="preserve"> PAGEREF _Toc241417944 \h </w:instrText>
+          <w:instrText xml:space="preserve"> PAGEREF _Toc241509004 \h </w:instrText>
         </w:r>
         <w:r>
           <w:rPr>
@@ -1849,7 +1849,7 @@
           <w14:ligatures w14:val="standardContextual"/>
         </w:rPr>
       </w:pPr>
-      <w:hyperlink w:anchor="_Toc241417945" w:history="1">
+      <w:hyperlink w:anchor="_Toc241509005" w:history="1">
         <w:r>
           <w:rPr>
             <w:rStyle w:val="aff1"/>
@@ -1876,7 +1876,7 @@
             <w:noProof/>
             <w:webHidden/>
           </w:rPr>
-          <w:instrText xml:space="preserve"> PAGEREF _Toc241417945 \h </w:instrText>
+          <w:instrText xml:space="preserve"> PAGEREF _Toc241509005 \h </w:instrText>
         </w:r>
         <w:r>
           <w:rPr>
@@ -1925,7 +1925,7 @@
           <w14:ligatures w14:val="standardContextual"/>
         </w:rPr>
       </w:pPr>
-      <w:hyperlink w:anchor="_Toc241417946" w:history="1">
+      <w:hyperlink w:anchor="_Toc241509006" w:history="1">
         <w:r>
           <w:rPr>
             <w:rStyle w:val="aff1"/>
@@ -1952,7 +1952,7 @@
             <w:noProof/>
             <w:webHidden/>
           </w:rPr>
-          <w:instrText xml:space="preserve"> PAGEREF _Toc241417946 \h </w:instrText>
+          <w:instrText xml:space="preserve"> PAGEREF _Toc241509006 \h </w:instrText>
         </w:r>
         <w:r>
           <w:rPr>
@@ -2001,7 +2001,7 @@
           <w14:ligatures w14:val="standardContextual"/>
         </w:rPr>
       </w:pPr>
-      <w:hyperlink w:anchor="_Toc241417947" w:history="1">
+      <w:hyperlink w:anchor="_Toc241509007" w:history="1">
         <w:r>
           <w:rPr>
             <w:rStyle w:val="aff1"/>
@@ -2028,7 +2028,7 @@
             <w:noProof/>
             <w:webHidden/>
           </w:rPr>
-          <w:instrText xml:space="preserve"> PAGEREF _Toc241417947 \h </w:instrText>
+          <w:instrText xml:space="preserve"> PAGEREF _Toc241509007 \h </w:instrText>
         </w:r>
         <w:r>
           <w:rPr>
@@ -2076,7 +2076,7 @@
           <w14:ligatures w14:val="standardContextual"/>
         </w:rPr>
       </w:pPr>
-      <w:hyperlink w:anchor="_Toc241417948" w:history="1">
+      <w:hyperlink w:anchor="_Toc241509008" w:history="1">
         <w:r>
           <w:rPr>
             <w:rStyle w:val="aff1"/>
@@ -2103,7 +2103,7 @@
             <w:noProof/>
             <w:webHidden/>
           </w:rPr>
-          <w:instrText xml:space="preserve"> PAGEREF _Toc241417948 \h </w:instrText>
+          <w:instrText xml:space="preserve"> PAGEREF _Toc241509008 \h </w:instrText>
         </w:r>
         <w:r>
           <w:rPr>
@@ -2152,7 +2152,7 @@
           <w14:ligatures w14:val="standardContextual"/>
         </w:rPr>
       </w:pPr>
-      <w:hyperlink w:anchor="_Toc241417949" w:history="1">
+      <w:hyperlink w:anchor="_Toc241509009" w:history="1">
         <w:r>
           <w:rPr>
             <w:rStyle w:val="aff1"/>
@@ -2179,7 +2179,7 @@
             <w:noProof/>
             <w:webHidden/>
           </w:rPr>
-          <w:instrText xml:space="preserve"> PAGEREF _Toc241417949 \h </w:instrText>
+          <w:instrText xml:space="preserve"> PAGEREF _Toc241509009 \h </w:instrText>
         </w:r>
         <w:r>
           <w:rPr>
@@ -2228,7 +2228,7 @@
           <w14:ligatures w14:val="standardContextual"/>
         </w:rPr>
       </w:pPr>
-      <w:hyperlink w:anchor="_Toc241417950" w:history="1">
+      <w:hyperlink w:anchor="_Toc241509010" w:history="1">
         <w:r>
           <w:rPr>
             <w:rStyle w:val="aff1"/>
@@ -2255,7 +2255,7 @@
             <w:noProof/>
             <w:webHidden/>
           </w:rPr>
-          <w:instrText xml:space="preserve"> PAGEREF _Toc241417950 \h </w:instrText>
+          <w:instrText xml:space="preserve"> PAGEREF _Toc241509010 \h </w:instrText>
         </w:r>
         <w:r>
           <w:rPr>
@@ -2304,7 +2304,7 @@
           <w14:ligatures w14:val="standardContextual"/>
         </w:rPr>
       </w:pPr>
-      <w:hyperlink w:anchor="_Toc241417951" w:history="1">
+      <w:hyperlink w:anchor="_Toc241509011" w:history="1">
         <w:r>
           <w:rPr>
             <w:rStyle w:val="aff1"/>
@@ -2331,7 +2331,7 @@
             <w:noProof/>
             <w:webHidden/>
           </w:rPr>
-          <w:instrText xml:space="preserve"> PAGEREF _Toc241417951 \h </w:instrText>
+          <w:instrText xml:space="preserve"> PAGEREF _Toc241509011 \h </w:instrText>
         </w:r>
         <w:r>
           <w:rPr>
@@ -2380,7 +2380,7 @@
           <w14:ligatures w14:val="standardContextual"/>
         </w:rPr>
       </w:pPr>
-      <w:hyperlink w:anchor="_Toc241417952" w:history="1">
+      <w:hyperlink w:anchor="_Toc241509012" w:history="1">
         <w:r>
           <w:rPr>
             <w:rStyle w:val="aff1"/>
@@ -2407,7 +2407,7 @@
             <w:noProof/>
             <w:webHidden/>
           </w:rPr>
-          <w:instrText xml:space="preserve"> PAGEREF _Toc241417952 \h </w:instrText>
+          <w:instrText xml:space="preserve"> PAGEREF _Toc241509012 \h </w:instrText>
         </w:r>
         <w:r>
           <w:rPr>
@@ -2456,7 +2456,7 @@
           <w14:ligatures w14:val="standardContextual"/>
         </w:rPr>
       </w:pPr>
-      <w:hyperlink w:anchor="_Toc241417953" w:history="1">
+      <w:hyperlink w:anchor="_Toc241509013" w:history="1">
         <w:r>
           <w:rPr>
             <w:rStyle w:val="aff1"/>
@@ -2483,7 +2483,7 @@
             <w:noProof/>
             <w:webHidden/>
           </w:rPr>
-          <w:instrText xml:space="preserve"> PAGEREF _Toc241417953 \h </w:instrText>
+          <w:instrText xml:space="preserve"> PAGEREF _Toc241509013 \h </w:instrText>
         </w:r>
         <w:r>
           <w:rPr>
@@ -2532,7 +2532,7 @@
           <w14:ligatures w14:val="standardContextual"/>
         </w:rPr>
       </w:pPr>
-      <w:hyperlink w:anchor="_Toc241417954" w:history="1">
+      <w:hyperlink w:anchor="_Toc241509014" w:history="1">
         <w:r>
           <w:rPr>
             <w:rStyle w:val="aff1"/>
@@ -2559,7 +2559,7 @@
             <w:noProof/>
             <w:webHidden/>
           </w:rPr>
-          <w:instrText xml:space="preserve"> PAGEREF _Toc241417954 \h </w:instrText>
+          <w:instrText xml:space="preserve"> PAGEREF _Toc241509014 \h </w:instrText>
         </w:r>
         <w:r>
           <w:rPr>
@@ -2607,7 +2607,7 @@
           <w14:ligatures w14:val="standardContextual"/>
         </w:rPr>
       </w:pPr>
-      <w:hyperlink w:anchor="_Toc241417955" w:history="1">
+      <w:hyperlink w:anchor="_Toc241509015" w:history="1">
         <w:r>
           <w:rPr>
             <w:rStyle w:val="aff1"/>
@@ -2634,7 +2634,7 @@
             <w:noProof/>
             <w:webHidden/>
           </w:rPr>
-          <w:instrText xml:space="preserve"> PAGEREF _Toc241417955 \h </w:instrText>
+          <w:instrText xml:space="preserve"> PAGEREF _Toc241509015 \h </w:instrText>
         </w:r>
         <w:r>
           <w:rPr>
@@ -2683,7 +2683,7 @@
           <w14:ligatures w14:val="standardContextual"/>
         </w:rPr>
       </w:pPr>
-      <w:hyperlink w:anchor="_Toc241417956" w:history="1">
+      <w:hyperlink w:anchor="_Toc241509016" w:history="1">
         <w:r>
           <w:rPr>
             <w:rStyle w:val="aff1"/>
@@ -2710,7 +2710,7 @@
             <w:noProof/>
             <w:webHidden/>
           </w:rPr>
-          <w:instrText xml:space="preserve"> PAGEREF _Toc241417956 \h </w:instrText>
+          <w:instrText xml:space="preserve"> PAGEREF _Toc241509016 \h </w:instrText>
         </w:r>
         <w:r>
           <w:rPr>
@@ -2759,7 +2759,7 @@
           <w14:ligatures w14:val="standardContextual"/>
         </w:rPr>
       </w:pPr>
-      <w:hyperlink w:anchor="_Toc241417957" w:history="1">
+      <w:hyperlink w:anchor="_Toc241509017" w:history="1">
         <w:r>
           <w:rPr>
             <w:rStyle w:val="aff1"/>
@@ -2786,7 +2786,7 @@
             <w:noProof/>
             <w:webHidden/>
           </w:rPr>
-          <w:instrText xml:space="preserve"> PAGEREF _Toc241417957 \h </w:instrText>
+          <w:instrText xml:space="preserve"> PAGEREF _Toc241509017 \h </w:instrText>
         </w:r>
         <w:r>
           <w:rPr>
@@ -2835,7 +2835,7 @@
           <w14:ligatures w14:val="standardContextual"/>
         </w:rPr>
       </w:pPr>
-      <w:hyperlink w:anchor="_Toc241417958" w:history="1">
+      <w:hyperlink w:anchor="_Toc241509018" w:history="1">
         <w:r>
           <w:rPr>
             <w:rStyle w:val="aff1"/>
@@ -2862,7 +2862,7 @@
             <w:noProof/>
             <w:webHidden/>
           </w:rPr>
-          <w:instrText xml:space="preserve"> PAGEREF _Toc241417958 \h </w:instrText>
+          <w:instrText xml:space="preserve"> PAGEREF _Toc241509018 \h </w:instrText>
         </w:r>
         <w:r>
           <w:rPr>
@@ -2911,7 +2911,7 @@
           <w14:ligatures w14:val="standardContextual"/>
         </w:rPr>
       </w:pPr>
-      <w:hyperlink w:anchor="_Toc241417959" w:history="1">
+      <w:hyperlink w:anchor="_Toc241509019" w:history="1">
         <w:r>
           <w:rPr>
             <w:rStyle w:val="aff1"/>
@@ -2938,7 +2938,7 @@
             <w:noProof/>
             <w:webHidden/>
           </w:rPr>
-          <w:instrText xml:space="preserve"> PAGEREF _Toc241417959 \h </w:instrText>
+          <w:instrText xml:space="preserve"> PAGEREF _Toc241509019 \h </w:instrText>
         </w:r>
         <w:r>
           <w:rPr>
@@ -2987,7 +2987,7 @@
           <w14:ligatures w14:val="standardContextual"/>
         </w:rPr>
       </w:pPr>
-      <w:hyperlink w:anchor="_Toc241417960" w:history="1">
+      <w:hyperlink w:anchor="_Toc241509020" w:history="1">
         <w:r>
           <w:rPr>
             <w:rStyle w:val="aff1"/>
@@ -3014,7 +3014,7 @@
             <w:noProof/>
             <w:webHidden/>
           </w:rPr>
-          <w:instrText xml:space="preserve"> PAGEREF _Toc241417960 \h </w:instrText>
+          <w:instrText xml:space="preserve"> PAGEREF _Toc241509020 \h </w:instrText>
         </w:r>
         <w:r>
           <w:rPr>
@@ -3063,7 +3063,7 @@
           <w14:ligatures w14:val="standardContextual"/>
         </w:rPr>
       </w:pPr>
-      <w:hyperlink w:anchor="_Toc241417961" w:history="1">
+      <w:hyperlink w:anchor="_Toc241509021" w:history="1">
         <w:r>
           <w:rPr>
             <w:rStyle w:val="aff1"/>
@@ -3090,7 +3090,7 @@
             <w:noProof/>
             <w:webHidden/>
           </w:rPr>
-          <w:instrText xml:space="preserve"> PAGEREF _Toc241417961 \h </w:instrText>
+          <w:instrText xml:space="preserve"> PAGEREF _Toc241509021 \h </w:instrText>
         </w:r>
         <w:r>
           <w:rPr>
@@ -3138,7 +3138,7 @@
           <w14:ligatures w14:val="standardContextual"/>
         </w:rPr>
       </w:pPr>
-      <w:hyperlink w:anchor="_Toc241417962" w:history="1">
+      <w:hyperlink w:anchor="_Toc241509022" w:history="1">
         <w:r>
           <w:rPr>
             <w:rStyle w:val="aff1"/>
@@ -3165,7 +3165,7 @@
             <w:noProof/>
             <w:webHidden/>
           </w:rPr>
-          <w:instrText xml:space="preserve"> PAGEREF _Toc241417962 \h </w:instrText>
+          <w:instrText xml:space="preserve"> PAGEREF _Toc241509022 \h </w:instrText>
         </w:r>
         <w:r>
           <w:rPr>
@@ -3214,7 +3214,7 @@
           <w14:ligatures w14:val="standardContextual"/>
         </w:rPr>
       </w:pPr>
-      <w:hyperlink w:anchor="_Toc241417963" w:history="1">
+      <w:hyperlink w:anchor="_Toc241509023" w:history="1">
         <w:r>
           <w:rPr>
             <w:rStyle w:val="aff1"/>
@@ -3241,7 +3241,7 @@
             <w:noProof/>
             <w:webHidden/>
           </w:rPr>
-          <w:instrText xml:space="preserve"> PAGEREF _Toc241417963 \h </w:instrText>
+          <w:instrText xml:space="preserve"> PAGEREF _Toc241509023 \h </w:instrText>
         </w:r>
         <w:r>
           <w:rPr>
@@ -3290,7 +3290,7 @@
           <w14:ligatures w14:val="standardContextual"/>
         </w:rPr>
       </w:pPr>
-      <w:hyperlink w:anchor="_Toc241417964" w:history="1">
+      <w:hyperlink w:anchor="_Toc241509024" w:history="1">
         <w:r>
           <w:rPr>
             <w:rStyle w:val="aff1"/>
@@ -3317,7 +3317,7 @@
             <w:noProof/>
             <w:webHidden/>
           </w:rPr>
-          <w:instrText xml:space="preserve"> PAGEREF _Toc241417964 \h </w:instrText>
+          <w:instrText xml:space="preserve"> PAGEREF _Toc241509024 \h </w:instrText>
         </w:r>
         <w:r>
           <w:rPr>
@@ -3366,7 +3366,7 @@
           <w14:ligatures w14:val="standardContextual"/>
         </w:rPr>
       </w:pPr>
-      <w:hyperlink w:anchor="_Toc241417965" w:history="1">
+      <w:hyperlink w:anchor="_Toc241509025" w:history="1">
         <w:r>
           <w:rPr>
             <w:rStyle w:val="aff1"/>
@@ -3393,7 +3393,7 @@
             <w:noProof/>
             <w:webHidden/>
           </w:rPr>
-          <w:instrText xml:space="preserve"> PAGEREF _Toc241417965 \h </w:instrText>
+          <w:instrText xml:space="preserve"> PAGEREF _Toc241509025 \h </w:instrText>
         </w:r>
         <w:r>
           <w:rPr>
@@ -3442,7 +3442,7 @@
           <w14:ligatures w14:val="standardContextual"/>
         </w:rPr>
       </w:pPr>
-      <w:hyperlink w:anchor="_Toc241417966" w:history="1">
+      <w:hyperlink w:anchor="_Toc241509026" w:history="1">
         <w:r>
           <w:rPr>
             <w:rStyle w:val="aff1"/>
@@ -3469,7 +3469,7 @@
             <w:noProof/>
             <w:webHidden/>
           </w:rPr>
-          <w:instrText xml:space="preserve"> PAGEREF _Toc241417966 \h </w:instrText>
+          <w:instrText xml:space="preserve"> PAGEREF _Toc241509026 \h </w:instrText>
         </w:r>
         <w:r>
           <w:rPr>
@@ -3518,7 +3518,7 @@
           <w14:ligatures w14:val="standardContextual"/>
         </w:rPr>
       </w:pPr>
-      <w:hyperlink w:anchor="_Toc241417967" w:history="1">
+      <w:hyperlink w:anchor="_Toc241509027" w:history="1">
         <w:r>
           <w:rPr>
             <w:rStyle w:val="aff1"/>
@@ -3545,7 +3545,7 @@
             <w:noProof/>
             <w:webHidden/>
           </w:rPr>
-          <w:instrText xml:space="preserve"> PAGEREF _Toc241417967 \h </w:instrText>
+          <w:instrText xml:space="preserve"> PAGEREF _Toc241509027 \h </w:instrText>
         </w:r>
         <w:r>
           <w:rPr>
@@ -3594,7 +3594,7 @@
           <w14:ligatures w14:val="standardContextual"/>
         </w:rPr>
       </w:pPr>
-      <w:hyperlink w:anchor="_Toc241417968" w:history="1">
+      <w:hyperlink w:anchor="_Toc241509028" w:history="1">
         <w:r>
           <w:rPr>
             <w:rStyle w:val="aff1"/>
@@ -3621,7 +3621,7 @@
             <w:noProof/>
             <w:webHidden/>
           </w:rPr>
-          <w:instrText xml:space="preserve"> PAGEREF _Toc241417968 \h </w:instrText>
+          <w:instrText xml:space="preserve"> PAGEREF _Toc241509028 \h </w:instrText>
         </w:r>
         <w:r>
           <w:rPr>
@@ -3670,7 +3670,7 @@
           <w14:ligatures w14:val="standardContextual"/>
         </w:rPr>
       </w:pPr>
-      <w:hyperlink w:anchor="_Toc241417969" w:history="1">
+      <w:hyperlink w:anchor="_Toc241509029" w:history="1">
         <w:r>
           <w:rPr>
             <w:rStyle w:val="aff1"/>
@@ -3697,7 +3697,7 @@
             <w:noProof/>
             <w:webHidden/>
           </w:rPr>
-          <w:instrText xml:space="preserve"> PAGEREF _Toc241417969 \h </w:instrText>
+          <w:instrText xml:space="preserve"> PAGEREF _Toc241509029 \h </w:instrText>
         </w:r>
         <w:r>
           <w:rPr>
@@ -3746,7 +3746,7 @@
           <w14:ligatures w14:val="standardContextual"/>
         </w:rPr>
       </w:pPr>
-      <w:hyperlink w:anchor="_Toc241417970" w:history="1">
+      <w:hyperlink w:anchor="_Toc241509030" w:history="1">
         <w:r>
           <w:rPr>
             <w:rStyle w:val="aff1"/>
@@ -3773,7 +3773,7 @@
             <w:noProof/>
             <w:webHidden/>
           </w:rPr>
-          <w:instrText xml:space="preserve"> PAGEREF _Toc241417970 \h </w:instrText>
+          <w:instrText xml:space="preserve"> PAGEREF _Toc241509030 \h </w:instrText>
         </w:r>
         <w:r>
           <w:rPr>
@@ -3822,7 +3822,7 @@
           <w14:ligatures w14:val="standardContextual"/>
         </w:rPr>
       </w:pPr>
-      <w:hyperlink w:anchor="_Toc241417971" w:history="1">
+      <w:hyperlink w:anchor="_Toc241509031" w:history="1">
         <w:r>
           <w:rPr>
             <w:rStyle w:val="aff1"/>
@@ -3849,7 +3849,7 @@
             <w:noProof/>
             <w:webHidden/>
           </w:rPr>
-          <w:instrText xml:space="preserve"> PAGEREF _Toc241417971 \h </w:instrText>
+          <w:instrText xml:space="preserve"> PAGEREF _Toc241509031 \h </w:instrText>
         </w:r>
         <w:r>
           <w:rPr>
@@ -3897,7 +3897,7 @@
           <w14:ligatures w14:val="standardContextual"/>
         </w:rPr>
       </w:pPr>
-      <w:hyperlink w:anchor="_Toc241417972" w:history="1">
+      <w:hyperlink w:anchor="_Toc241509032" w:history="1">
         <w:r>
           <w:rPr>
             <w:rStyle w:val="aff1"/>
@@ -3924,7 +3924,7 @@
             <w:noProof/>
             <w:webHidden/>
           </w:rPr>
-          <w:instrText xml:space="preserve"> PAGEREF _Toc241417972 \h </w:instrText>
+          <w:instrText xml:space="preserve"> PAGEREF _Toc241509032 \h </w:instrText>
         </w:r>
         <w:r>
           <w:rPr>
@@ -3973,7 +3973,7 @@
           <w14:ligatures w14:val="standardContextual"/>
         </w:rPr>
       </w:pPr>
-      <w:hyperlink w:anchor="_Toc241417973" w:history="1">
+      <w:hyperlink w:anchor="_Toc241509033" w:history="1">
         <w:r>
           <w:rPr>
             <w:rStyle w:val="aff1"/>
@@ -4000,7 +4000,7 @@
             <w:noProof/>
             <w:webHidden/>
           </w:rPr>
-          <w:instrText xml:space="preserve"> PAGEREF _Toc241417973 \h </w:instrText>
+          <w:instrText xml:space="preserve"> PAGEREF _Toc241509033 \h </w:instrText>
         </w:r>
         <w:r>
           <w:rPr>
@@ -4049,7 +4049,7 @@
           <w14:ligatures w14:val="standardContextual"/>
         </w:rPr>
       </w:pPr>
-      <w:hyperlink w:anchor="_Toc241417974" w:history="1">
+      <w:hyperlink w:anchor="_Toc241509034" w:history="1">
         <w:r>
           <w:rPr>
             <w:rStyle w:val="aff1"/>
@@ -4076,7 +4076,7 @@
             <w:noProof/>
             <w:webHidden/>
           </w:rPr>
-          <w:instrText xml:space="preserve"> PAGEREF _Toc241417974 \h </w:instrText>
+          <w:instrText xml:space="preserve"> PAGEREF _Toc241509034 \h </w:instrText>
         </w:r>
         <w:r>
           <w:rPr>
@@ -4125,7 +4125,7 @@
           <w14:ligatures w14:val="standardContextual"/>
         </w:rPr>
       </w:pPr>
-      <w:hyperlink w:anchor="_Toc241417975" w:history="1">
+      <w:hyperlink w:anchor="_Toc241509035" w:history="1">
         <w:r>
           <w:rPr>
             <w:rStyle w:val="aff1"/>
@@ -4152,7 +4152,7 @@
             <w:noProof/>
             <w:webHidden/>
           </w:rPr>
-          <w:instrText xml:space="preserve"> PAGEREF _Toc241417975 \h </w:instrText>
+          <w:instrText xml:space="preserve"> PAGEREF _Toc241509035 \h </w:instrText>
         </w:r>
         <w:r>
           <w:rPr>
@@ -4201,7 +4201,7 @@
           <w14:ligatures w14:val="standardContextual"/>
         </w:rPr>
       </w:pPr>
-      <w:hyperlink w:anchor="_Toc241417976" w:history="1">
+      <w:hyperlink w:anchor="_Toc241509036" w:history="1">
         <w:r>
           <w:rPr>
             <w:rStyle w:val="aff1"/>
@@ -4228,7 +4228,7 @@
             <w:noProof/>
             <w:webHidden/>
           </w:rPr>
-          <w:instrText xml:space="preserve"> PAGEREF _Toc241417976 \h </w:instrText>
+          <w:instrText xml:space="preserve"> PAGEREF _Toc241509036 \h </w:instrText>
         </w:r>
         <w:r>
           <w:rPr>
@@ -4277,7 +4277,7 @@
           <w14:ligatures w14:val="standardContextual"/>
         </w:rPr>
       </w:pPr>
-      <w:hyperlink w:anchor="_Toc241417977" w:history="1">
+      <w:hyperlink w:anchor="_Toc241509037" w:history="1">
         <w:r>
           <w:rPr>
             <w:rStyle w:val="aff1"/>
@@ -4304,7 +4304,7 @@
             <w:noProof/>
             <w:webHidden/>
           </w:rPr>
-          <w:instrText xml:space="preserve"> PAGEREF _Toc241417977 \h </w:instrText>
+          <w:instrText xml:space="preserve"> PAGEREF _Toc241509037 \h </w:instrText>
         </w:r>
         <w:r>
           <w:rPr>
@@ -4353,7 +4353,7 @@
           <w14:ligatures w14:val="standardContextual"/>
         </w:rPr>
       </w:pPr>
-      <w:hyperlink w:anchor="_Toc241417978" w:history="1">
+      <w:hyperlink w:anchor="_Toc241509038" w:history="1">
         <w:r>
           <w:rPr>
             <w:rStyle w:val="aff1"/>
@@ -4380,7 +4380,7 @@
             <w:noProof/>
             <w:webHidden/>
           </w:rPr>
-          <w:instrText xml:space="preserve"> PAGEREF _Toc241417978 \h </w:instrText>
+          <w:instrText xml:space="preserve"> PAGEREF _Toc241509038 \h </w:instrText>
         </w:r>
         <w:r>
           <w:rPr>
@@ -4429,7 +4429,7 @@
           <w14:ligatures w14:val="standardContextual"/>
         </w:rPr>
       </w:pPr>
-      <w:hyperlink w:anchor="_Toc241417979" w:history="1">
+      <w:hyperlink w:anchor="_Toc241509039" w:history="1">
         <w:r>
           <w:rPr>
             <w:rStyle w:val="aff1"/>
@@ -4456,7 +4456,7 @@
             <w:noProof/>
             <w:webHidden/>
           </w:rPr>
-          <w:instrText xml:space="preserve"> PAGEREF _Toc241417979 \h </w:instrText>
+          <w:instrText xml:space="preserve"> PAGEREF _Toc241509039 \h </w:instrText>
         </w:r>
         <w:r>
           <w:rPr>
@@ -4476,7 +4476,7 @@
             <w:noProof/>
             <w:webHidden/>
           </w:rPr>
-          <w:t>30</w:t>
+          <w:t>31</w:t>
         </w:r>
         <w:r>
           <w:rPr>
@@ -4505,7 +4505,7 @@
           <w14:ligatures w14:val="standardContextual"/>
         </w:rPr>
       </w:pPr>
-      <w:hyperlink w:anchor="_Toc241417980" w:history="1">
+      <w:hyperlink w:anchor="_Toc241509040" w:history="1">
         <w:r>
           <w:rPr>
             <w:rStyle w:val="aff1"/>
@@ -4532,7 +4532,7 @@
             <w:noProof/>
             <w:webHidden/>
           </w:rPr>
-          <w:instrText xml:space="preserve"> PAGEREF _Toc241417980 \h </w:instrText>
+          <w:instrText xml:space="preserve"> PAGEREF _Toc241509040 \h </w:instrText>
         </w:r>
         <w:r>
           <w:rPr>
@@ -4552,7 +4552,7 @@
             <w:noProof/>
             <w:webHidden/>
           </w:rPr>
-          <w:t>30</w:t>
+          <w:t>31</w:t>
         </w:r>
         <w:r>
           <w:rPr>
@@ -4581,7 +4581,7 @@
           <w14:ligatures w14:val="standardContextual"/>
         </w:rPr>
       </w:pPr>
-      <w:hyperlink w:anchor="_Toc241417981" w:history="1">
+      <w:hyperlink w:anchor="_Toc241509041" w:history="1">
         <w:r>
           <w:rPr>
             <w:rStyle w:val="aff1"/>
@@ -4608,7 +4608,7 @@
             <w:noProof/>
             <w:webHidden/>
           </w:rPr>
-          <w:instrText xml:space="preserve"> PAGEREF _Toc241417981 \h </w:instrText>
+          <w:instrText xml:space="preserve"> PAGEREF _Toc241509041 \h </w:instrText>
         </w:r>
         <w:r>
           <w:rPr>
@@ -4628,7 +4628,7 @@
             <w:noProof/>
             <w:webHidden/>
           </w:rPr>
-          <w:t>31</w:t>
+          <w:t>32</w:t>
         </w:r>
         <w:r>
           <w:rPr>
@@ -4656,7 +4656,7 @@
           <w14:ligatures w14:val="standardContextual"/>
         </w:rPr>
       </w:pPr>
-      <w:hyperlink w:anchor="_Toc241417982" w:history="1">
+      <w:hyperlink w:anchor="_Toc241509042" w:history="1">
         <w:r>
           <w:rPr>
             <w:rStyle w:val="aff1"/>
@@ -4683,7 +4683,7 @@
             <w:noProof/>
             <w:webHidden/>
           </w:rPr>
-          <w:instrText xml:space="preserve"> PAGEREF _Toc241417982 \h </w:instrText>
+          <w:instrText xml:space="preserve"> PAGEREF _Toc241509042 \h </w:instrText>
         </w:r>
         <w:r>
           <w:rPr>
@@ -4703,7 +4703,7 @@
             <w:noProof/>
             <w:webHidden/>
           </w:rPr>
-          <w:t>32</w:t>
+          <w:t>33</w:t>
         </w:r>
         <w:r>
           <w:rPr>
@@ -4732,7 +4732,7 @@
           <w14:ligatures w14:val="standardContextual"/>
         </w:rPr>
       </w:pPr>
-      <w:hyperlink w:anchor="_Toc241417983" w:history="1">
+      <w:hyperlink w:anchor="_Toc241509043" w:history="1">
         <w:r>
           <w:rPr>
             <w:rStyle w:val="aff1"/>
@@ -4759,7 +4759,7 @@
             <w:noProof/>
             <w:webHidden/>
           </w:rPr>
-          <w:instrText xml:space="preserve"> PAGEREF _Toc241417983 \h </w:instrText>
+          <w:instrText xml:space="preserve"> PAGEREF _Toc241509043 \h </w:instrText>
         </w:r>
         <w:r>
           <w:rPr>
@@ -4779,7 +4779,7 @@
             <w:noProof/>
             <w:webHidden/>
           </w:rPr>
-          <w:t>32</w:t>
+          <w:t>33</w:t>
         </w:r>
         <w:r>
           <w:rPr>
@@ -4808,7 +4808,7 @@
           <w14:ligatures w14:val="standardContextual"/>
         </w:rPr>
       </w:pPr>
-      <w:hyperlink w:anchor="_Toc241417984" w:history="1">
+      <w:hyperlink w:anchor="_Toc241509044" w:history="1">
         <w:r>
           <w:rPr>
             <w:rStyle w:val="aff1"/>
@@ -4835,7 +4835,7 @@
             <w:noProof/>
             <w:webHidden/>
           </w:rPr>
-          <w:instrText xml:space="preserve"> PAGEREF _Toc241417984 \h </w:instrText>
+          <w:instrText xml:space="preserve"> PAGEREF _Toc241509044 \h </w:instrText>
         </w:r>
         <w:r>
           <w:rPr>
@@ -4855,7 +4855,7 @@
             <w:noProof/>
             <w:webHidden/>
           </w:rPr>
-          <w:t>32</w:t>
+          <w:t>33</w:t>
         </w:r>
         <w:r>
           <w:rPr>
@@ -4884,7 +4884,7 @@
           <w14:ligatures w14:val="standardContextual"/>
         </w:rPr>
       </w:pPr>
-      <w:hyperlink w:anchor="_Toc241417985" w:history="1">
+      <w:hyperlink w:anchor="_Toc241509045" w:history="1">
         <w:r>
           <w:rPr>
             <w:rStyle w:val="aff1"/>
@@ -4911,7 +4911,7 @@
             <w:noProof/>
             <w:webHidden/>
           </w:rPr>
-          <w:instrText xml:space="preserve"> PAGEREF _Toc241417985 \h </w:instrText>
+          <w:instrText xml:space="preserve"> PAGEREF _Toc241509045 \h </w:instrText>
         </w:r>
         <w:r>
           <w:rPr>
@@ -4931,7 +4931,7 @@
             <w:noProof/>
             <w:webHidden/>
           </w:rPr>
-          <w:t>32</w:t>
+          <w:t>33</w:t>
         </w:r>
         <w:r>
           <w:rPr>
@@ -4960,7 +4960,7 @@
           <w14:ligatures w14:val="standardContextual"/>
         </w:rPr>
       </w:pPr>
-      <w:hyperlink w:anchor="_Toc241417986" w:history="1">
+      <w:hyperlink w:anchor="_Toc241509046" w:history="1">
         <w:r>
           <w:rPr>
             <w:rStyle w:val="aff1"/>
@@ -4987,7 +4987,7 @@
             <w:noProof/>
             <w:webHidden/>
           </w:rPr>
-          <w:instrText xml:space="preserve"> PAGEREF _Toc241417986 \h </w:instrText>
+          <w:instrText xml:space="preserve"> PAGEREF _Toc241509046 \h </w:instrText>
         </w:r>
         <w:r>
           <w:rPr>
@@ -5007,7 +5007,7 @@
             <w:noProof/>
             <w:webHidden/>
           </w:rPr>
-          <w:t>33</w:t>
+          <w:t>34</w:t>
         </w:r>
         <w:r>
           <w:rPr>
@@ -5036,7 +5036,7 @@
           <w14:ligatures w14:val="standardContextual"/>
         </w:rPr>
       </w:pPr>
-      <w:hyperlink w:anchor="_Toc241417987" w:history="1">
+      <w:hyperlink w:anchor="_Toc241509047" w:history="1">
         <w:r>
           <w:rPr>
             <w:rStyle w:val="aff1"/>
@@ -5063,7 +5063,7 @@
             <w:noProof/>
             <w:webHidden/>
           </w:rPr>
-          <w:instrText xml:space="preserve"> PAGEREF _Toc241417987 \h </w:instrText>
+          <w:instrText xml:space="preserve"> PAGEREF _Toc241509047 \h </w:instrText>
         </w:r>
         <w:r>
           <w:rPr>
@@ -5083,7 +5083,7 @@
             <w:noProof/>
             <w:webHidden/>
           </w:rPr>
-          <w:t>33</w:t>
+          <w:t>34</w:t>
         </w:r>
         <w:r>
           <w:rPr>
@@ -5112,7 +5112,7 @@
           <w14:ligatures w14:val="standardContextual"/>
         </w:rPr>
       </w:pPr>
-      <w:hyperlink w:anchor="_Toc241417988" w:history="1">
+      <w:hyperlink w:anchor="_Toc241509048" w:history="1">
         <w:r>
           <w:rPr>
             <w:rStyle w:val="aff1"/>
@@ -5139,7 +5139,7 @@
             <w:noProof/>
             <w:webHidden/>
           </w:rPr>
-          <w:instrText xml:space="preserve"> PAGEREF _Toc241417988 \h </w:instrText>
+          <w:instrText xml:space="preserve"> PAGEREF _Toc241509048 \h </w:instrText>
         </w:r>
         <w:r>
           <w:rPr>
@@ -5159,7 +5159,7 @@
             <w:noProof/>
             <w:webHidden/>
           </w:rPr>
-          <w:t>34</w:t>
+          <w:t>35</w:t>
         </w:r>
         <w:r>
           <w:rPr>
@@ -5188,7 +5188,7 @@
           <w14:ligatures w14:val="standardContextual"/>
         </w:rPr>
       </w:pPr>
-      <w:hyperlink w:anchor="_Toc241417989" w:history="1">
+      <w:hyperlink w:anchor="_Toc241509049" w:history="1">
         <w:r>
           <w:rPr>
             <w:rStyle w:val="aff1"/>
@@ -5215,7 +5215,7 @@
             <w:noProof/>
             <w:webHidden/>
           </w:rPr>
-          <w:instrText xml:space="preserve"> PAGEREF _Toc241417989 \h </w:instrText>
+          <w:instrText xml:space="preserve"> PAGEREF _Toc241509049 \h </w:instrText>
         </w:r>
         <w:r>
           <w:rPr>
@@ -5235,7 +5235,7 @@
             <w:noProof/>
             <w:webHidden/>
           </w:rPr>
-          <w:t>34</w:t>
+          <w:t>35</w:t>
         </w:r>
         <w:r>
           <w:rPr>
@@ -5263,7 +5263,7 @@
           <w14:ligatures w14:val="standardContextual"/>
         </w:rPr>
       </w:pPr>
-      <w:hyperlink w:anchor="_Toc241417990" w:history="1">
+      <w:hyperlink w:anchor="_Toc241509050" w:history="1">
         <w:r>
           <w:rPr>
             <w:rStyle w:val="aff1"/>
@@ -5290,7 +5290,7 @@
             <w:noProof/>
             <w:webHidden/>
           </w:rPr>
-          <w:instrText xml:space="preserve"> PAGEREF _Toc241417990 \h </w:instrText>
+          <w:instrText xml:space="preserve"> PAGEREF _Toc241509050 \h </w:instrText>
         </w:r>
         <w:r>
           <w:rPr>
@@ -5310,7 +5310,7 @@
             <w:noProof/>
             <w:webHidden/>
           </w:rPr>
-          <w:t>35</w:t>
+          <w:t>36</w:t>
         </w:r>
         <w:r>
           <w:rPr>
@@ -5338,7 +5338,7 @@
           <w14:ligatures w14:val="standardContextual"/>
         </w:rPr>
       </w:pPr>
-      <w:hyperlink w:anchor="_Toc241417991" w:history="1">
+      <w:hyperlink w:anchor="_Toc241509051" w:history="1">
         <w:r>
           <w:rPr>
             <w:rStyle w:val="aff1"/>
@@ -5365,7 +5365,7 @@
             <w:noProof/>
             <w:webHidden/>
           </w:rPr>
-          <w:instrText xml:space="preserve"> PAGEREF _Toc241417991 \h </w:instrText>
+          <w:instrText xml:space="preserve"> PAGEREF _Toc241509051 \h </w:instrText>
         </w:r>
         <w:r>
           <w:rPr>
@@ -5385,7 +5385,7 @@
             <w:noProof/>
             <w:webHidden/>
           </w:rPr>
-          <w:t>35</w:t>
+          <w:t>36</w:t>
         </w:r>
         <w:r>
           <w:rPr>
@@ -5413,7 +5413,7 @@
           <w14:ligatures w14:val="standardContextual"/>
         </w:rPr>
       </w:pPr>
-      <w:hyperlink w:anchor="_Toc241417992" w:history="1">
+      <w:hyperlink w:anchor="_Toc241509052" w:history="1">
         <w:r>
           <w:rPr>
             <w:rStyle w:val="aff1"/>
@@ -5440,7 +5440,7 @@
             <w:noProof/>
             <w:webHidden/>
           </w:rPr>
-          <w:instrText xml:space="preserve"> PAGEREF _Toc241417992 \h </w:instrText>
+          <w:instrText xml:space="preserve"> PAGEREF _Toc241509052 \h </w:instrText>
         </w:r>
         <w:r>
           <w:rPr>
@@ -5460,7 +5460,7 @@
             <w:noProof/>
             <w:webHidden/>
           </w:rPr>
-          <w:t>36</w:t>
+          <w:t>37</w:t>
         </w:r>
         <w:r>
           <w:rPr>
@@ -5490,7 +5490,7 @@
           <w:numId w:val="7"/>
         </w:numPr>
       </w:pPr>
-      <w:bookmarkStart w:id="0" w:name="_Toc241417928"/>
+      <w:bookmarkStart w:id="0" w:name="_Toc241508988"/>
       <w:r>
         <w:lastRenderedPageBreak/>
         <w:t>게임</w:t>
@@ -5523,7 +5523,7 @@
           <w:numId w:val="7"/>
         </w:numPr>
       </w:pPr>
-      <w:bookmarkStart w:id="1" w:name="_Toc241417929"/>
+      <w:bookmarkStart w:id="1" w:name="_Toc241508989"/>
       <w:r>
         <w:t>Executive Summary</w:t>
       </w:r>
@@ -5594,7 +5594,7 @@
           <w:numId w:val="7"/>
         </w:numPr>
       </w:pPr>
-      <w:bookmarkStart w:id="2" w:name="_Toc241417930"/>
+      <w:bookmarkStart w:id="2" w:name="_Toc241508990"/>
       <w:r>
         <w:t>Rev 16 Release Profile</w:t>
       </w:r>
@@ -5618,7 +5618,7 @@
           <w:numId w:val="7"/>
         </w:numPr>
       </w:pPr>
-      <w:bookmarkStart w:id="3" w:name="_Toc241417931"/>
+      <w:bookmarkStart w:id="3" w:name="_Toc241508991"/>
       <w:r>
         <w:t>제품</w:t>
       </w:r>
@@ -5908,7 +5908,7 @@
           <w:numId w:val="7"/>
         </w:numPr>
       </w:pPr>
-      <w:bookmarkStart w:id="4" w:name="_Toc241417932"/>
+      <w:bookmarkStart w:id="4" w:name="_Toc241508992"/>
       <w:r>
         <w:t>디자인</w:t>
       </w:r>
@@ -6278,7 +6278,7 @@
           <w:numId w:val="7"/>
         </w:numPr>
       </w:pPr>
-      <w:bookmarkStart w:id="5" w:name="_Toc241417933"/>
+      <w:bookmarkStart w:id="5" w:name="_Toc241508993"/>
       <w:r>
         <w:t>Target Experience</w:t>
       </w:r>
@@ -6352,7 +6352,7 @@
           <w:numId w:val="7"/>
         </w:numPr>
       </w:pPr>
-      <w:bookmarkStart w:id="6" w:name="_Toc241417934"/>
+      <w:bookmarkStart w:id="6" w:name="_Toc241508994"/>
       <w:r>
         <w:t>명시적</w:t>
       </w:r>
@@ -6624,7 +6624,7 @@
           <w:numId w:val="7"/>
         </w:numPr>
       </w:pPr>
-      <w:bookmarkStart w:id="7" w:name="_Toc241417935"/>
+      <w:bookmarkStart w:id="7" w:name="_Toc241508995"/>
       <w:r>
         <w:lastRenderedPageBreak/>
         <w:t>Contract Run</w:t>
@@ -6660,7 +6660,7 @@
           <w:numId w:val="7"/>
         </w:numPr>
       </w:pPr>
-      <w:bookmarkStart w:id="8" w:name="_Toc241417936"/>
+      <w:bookmarkStart w:id="8" w:name="_Toc241508996"/>
       <w:r>
         <w:t>Core Loop</w:t>
       </w:r>
@@ -7154,7 +7154,7 @@
           <w:numId w:val="7"/>
         </w:numPr>
       </w:pPr>
-      <w:bookmarkStart w:id="9" w:name="_Toc241417937"/>
+      <w:bookmarkStart w:id="9" w:name="_Toc241508997"/>
       <w:r>
         <w:t xml:space="preserve">Contract </w:t>
       </w:r>
@@ -7578,7 +7578,7 @@
           <w:numId w:val="7"/>
         </w:numPr>
       </w:pPr>
-      <w:bookmarkStart w:id="10" w:name="_Toc241417938"/>
+      <w:bookmarkStart w:id="10" w:name="_Toc241508998"/>
       <w:r>
         <w:lastRenderedPageBreak/>
         <w:t>성공</w:t>
@@ -7870,7 +7870,7 @@
           <w:numId w:val="7"/>
         </w:numPr>
       </w:pPr>
-      <w:bookmarkStart w:id="11" w:name="_Toc241417939"/>
+      <w:bookmarkStart w:id="11" w:name="_Toc241508999"/>
       <w:r>
         <w:t>Greed Decision</w:t>
       </w:r>
@@ -8239,7 +8239,7 @@
           <w:numId w:val="7"/>
         </w:numPr>
       </w:pPr>
-      <w:bookmarkStart w:id="12" w:name="_Toc241417940"/>
+      <w:bookmarkStart w:id="12" w:name="_Toc241509000"/>
       <w:r>
         <w:t>15~25</w:t>
       </w:r>
@@ -8609,7 +8609,7 @@
           <w:numId w:val="7"/>
         </w:numPr>
       </w:pPr>
-      <w:bookmarkStart w:id="13" w:name="_Toc241417941"/>
+      <w:bookmarkStart w:id="13" w:name="_Toc241509001"/>
       <w:r>
         <w:lastRenderedPageBreak/>
         <w:t>위조와</w:t>
@@ -8636,7 +8636,7 @@
           <w:numId w:val="7"/>
         </w:numPr>
       </w:pPr>
-      <w:bookmarkStart w:id="14" w:name="_Toc241417942"/>
+      <w:bookmarkStart w:id="14" w:name="_Toc241509002"/>
       <w:r>
         <w:t>Artifact</w:t>
       </w:r>
@@ -8921,12 +8921,12 @@
     <w:p/>
     <w:p>
       <w:r>
-        <w:t>각 Release Map은 고유한 Surface Template 40종을 카탈로그로 보유한다. 서버는 MatchStart에 해당 맵의 카탈로그를 섞어 Required Target을 포함한 20종을 중복 없이 선택하고, 20개의 활성 Painting Exhibit에 한 작품씩 배정한다. 한 판에 노출되는 절반만 바뀌므로 같은 맵을 반복해도 작품 구성과 탐색 동선이 달라진다. 활성 20종은 모두 관찰·위조·반출 후보이며, 실제로 몇 점을 노릴지는 Required Target, Quota, Alert와 남은 시간을 보고 팀이 결정한다.</w:t>
+        <w:t>각 Release Map은 40종의 Surface Template 카탈로그를 유지한다. 서버는 MatchStart에 M01/M02에서는 20종, M03에서는 12종을 중복 없이 선택해 활성 Painting Exhibit에 한 작품씩 배정한다. Required Target도 이 수량에 포함된다. 플레이어는 Required Target, Quota, Alert와 남은 시간을 보고 추가 절도 여부를 결정한다. M03은 상호작용 작품 12개와 비상호작용 장식 48개, 총 60개를 사용한다. 액자는 Showcase 03a·04a·05a 세 종류로 제한하고 소형·중형·대형 세 단계의 정수 균등 스케일로 맞춰 실제 벽면과 출입구 경계 안에 분산한다.</w:t>
       </w:r>
     </w:p>
     <w:p>
       <w:r>
-        <w:t>각 맵은 탈취 가능한 20점 외에 상호작용하지 않는 일반 전시물을 함께 배치한다. 일반 전시물은 단독·연작·다단 군집으로 전시실을 구성하고 탈취 대상과 같거나 더 큰 작품도 포함한다. 탈취 가능한 작품은 두꺼운 프레임과 하단 보안 패널로 접근 전에 구별한다. 작품 크기, 중앙 위치 또는 양옆의 일반 작품 수가 정답을 드러내는 고정 패턴을 사용하지 않는다. 근거리 행동 안내는 탈취 대상에만 표시하며, 필수 작품은 기존 계약 단서와 발견 표시를 따른다. 전시 그림과 프레임은 기존 배치도 대비 1.5배 크기로 확대하며 군집의 간격과 설치 높이를 함께 조정한다. 탈취 작품의 행동 영역은 작품 정면의 근거리로 한정한다. 벽 하단 걸레받이와 상단 몰딩은 벽 두께의 1.15배로 돌출시켜 표면 겹침을 없앤다.</w:t>
+        <w:t>M01/M02는 탈취 가능한 20점, M03은 12점 외에 상호작용하지 않는 일반 전시물을 함께 배치한다. 일반 전시물은 단독·연작·다단 군집으로 전시실을 구성하고 탈취 대상과 같거나 더 큰 작품도 포함한다. 탈취 가능한 작품은 두꺼운 프레임과 하단 보안 패널로 접근 전에 구별한다. 작품 크기, 중앙 위치 또는 양옆의 일반 작품 수가 정답을 드러내는 고정 패턴을 사용하지 않는다. 근거리 행동 안내는 탈취 대상에만 표시하며, 필수 작품은 기존 계약 단서와 발견 표시를 따른다. 전시 그림과 프레임은 기존 배치도 대비 1.5배 크기로 확대하며 군집의 간격과 설치 높이를 함께 조정한다. 탈취 작품의 행동 영역은 작품 정면의 근거리로 한정한다. 벽 하단 걸레받이와 상단 몰딩은 벽 두께의 1.15배로 돌출시켜 표면 겹침을 없앤다.</w:t>
       </w:r>
     </w:p>
     <w:p>
@@ -8937,8 +8937,9 @@
           <w:numId w:val="7"/>
         </w:numPr>
       </w:pPr>
-      <w:bookmarkStart w:id="15" w:name="_Toc241417943"/>
-      <w:r>
+      <w:bookmarkStart w:id="15" w:name="_Toc241509003"/>
+      <w:r>
+        <w:lastRenderedPageBreak/>
         <w:t xml:space="preserve">Surface Forgery </w:t>
       </w:r>
       <w:r>
@@ -8973,7 +8974,6 @@
         </w:numPr>
       </w:pPr>
       <w:r>
-        <w:lastRenderedPageBreak/>
         <w:t>World View가 완전히 가려진 Full-Screen 화면으로 전환된다. World Audio와 팀 음성은 유지하지만 Alert/Lockdown 상세 정보는 작업 화면에 중복 표시하지 않는다. Suspicious/Searching에서는 현재 작업을 유지한다. Alarmed/Lockdown 진입 시 서버가 작업 Session을 먼저 취소하고 화면을 닫아 이동·시점·탈출 판단을 즉시 복원하며, 위험 단계에서는 신규 작업 진입을 허용하지 않는다.</w:t>
       </w:r>
     </w:p>
@@ -9119,7 +9119,7 @@
           <w:numId w:val="7"/>
         </w:numPr>
       </w:pPr>
-      <w:bookmarkStart w:id="16" w:name="_Toc241417944"/>
+      <w:bookmarkStart w:id="16" w:name="_Toc241509004"/>
       <w:r>
         <w:lastRenderedPageBreak/>
         <w:t>Object Assembly — Deferred Expansion</w:t>
@@ -9187,7 +9187,7 @@
           <w:numId w:val="7"/>
         </w:numPr>
       </w:pPr>
-      <w:bookmarkStart w:id="17" w:name="_Toc241417945"/>
+      <w:bookmarkStart w:id="17" w:name="_Toc241509005"/>
       <w:r>
         <w:t>Quality</w:t>
       </w:r>
@@ -9476,7 +9476,7 @@
           <w:numId w:val="7"/>
         </w:numPr>
       </w:pPr>
-      <w:bookmarkStart w:id="18" w:name="_Toc241417946"/>
+      <w:bookmarkStart w:id="18" w:name="_Toc241509006"/>
       <w:r>
         <w:lastRenderedPageBreak/>
         <w:t>핵심</w:t>
@@ -9978,7 +9978,7 @@
           <w:numId w:val="7"/>
         </w:numPr>
       </w:pPr>
-      <w:bookmarkStart w:id="19" w:name="_Toc241417947"/>
+      <w:bookmarkStart w:id="19" w:name="_Toc241509007"/>
       <w:r>
         <w:t xml:space="preserve">Owner-only Forgery </w:t>
       </w:r>
@@ -10225,7 +10225,7 @@
           <w:numId w:val="7"/>
         </w:numPr>
       </w:pPr>
-      <w:bookmarkStart w:id="20" w:name="_Toc241417948"/>
+      <w:bookmarkStart w:id="20" w:name="_Toc241509008"/>
       <w:r>
         <w:lastRenderedPageBreak/>
         <w:t>잠입</w:t>
@@ -10258,7 +10258,7 @@
           <w:numId w:val="7"/>
         </w:numPr>
       </w:pPr>
-      <w:bookmarkStart w:id="21" w:name="_Toc241417949"/>
+      <w:bookmarkStart w:id="21" w:name="_Toc241509009"/>
       <w:r>
         <w:t xml:space="preserve">First-Person </w:t>
       </w:r>
@@ -10328,7 +10328,7 @@
           <w:numId w:val="7"/>
         </w:numPr>
       </w:pPr>
-      <w:bookmarkStart w:id="22" w:name="_Toc241417950"/>
+      <w:bookmarkStart w:id="22" w:name="_Toc241509010"/>
       <w:r>
         <w:t>Walk, Sprint, Weight, Footstep</w:t>
       </w:r>
@@ -10671,7 +10671,7 @@
           <w:numId w:val="7"/>
         </w:numPr>
       </w:pPr>
-      <w:bookmarkStart w:id="23" w:name="_Toc241417951"/>
+      <w:bookmarkStart w:id="23" w:name="_Toc241509011"/>
       <w:r>
         <w:t>Patrol Guard</w:t>
       </w:r>
@@ -11022,7 +11022,7 @@
           <w:numId w:val="7"/>
         </w:numPr>
       </w:pPr>
-      <w:bookmarkStart w:id="24" w:name="_Toc241417952"/>
+      <w:bookmarkStart w:id="24" w:name="_Toc241509012"/>
       <w:r>
         <w:t>CCTV</w:t>
       </w:r>
@@ -11273,7 +11273,7 @@
           <w:numId w:val="7"/>
         </w:numPr>
       </w:pPr>
-      <w:bookmarkStart w:id="25" w:name="_Toc241417953"/>
+      <w:bookmarkStart w:id="25" w:name="_Toc241509013"/>
       <w:r>
         <w:t>Stun, Arrest, Recovery</w:t>
       </w:r>
@@ -11347,7 +11347,7 @@
           <w:numId w:val="7"/>
         </w:numPr>
       </w:pPr>
-      <w:bookmarkStart w:id="26" w:name="_Toc241417954"/>
+      <w:bookmarkStart w:id="26" w:name="_Toc241509014"/>
       <w:r>
         <w:t>두</w:t>
       </w:r>
@@ -11824,7 +11824,7 @@
           <w:numId w:val="7"/>
         </w:numPr>
       </w:pPr>
-      <w:bookmarkStart w:id="27" w:name="_Toc241417955"/>
+      <w:bookmarkStart w:id="27" w:name="_Toc241509015"/>
       <w:r>
         <w:lastRenderedPageBreak/>
         <w:t>협동</w:t>
@@ -11851,7 +11851,7 @@
           <w:numId w:val="7"/>
         </w:numPr>
       </w:pPr>
-      <w:bookmarkStart w:id="28" w:name="_Toc241417956"/>
+      <w:bookmarkStart w:id="28" w:name="_Toc241509016"/>
       <w:r>
         <w:t>Role Switching</w:t>
       </w:r>
@@ -12259,7 +12259,7 @@
           <w:numId w:val="7"/>
         </w:numPr>
       </w:pPr>
-      <w:bookmarkStart w:id="29" w:name="_Toc241417957"/>
+      <w:bookmarkStart w:id="29" w:name="_Toc241509017"/>
       <w:r>
         <w:t>거리</w:t>
       </w:r>
@@ -12318,7 +12318,7 @@
           <w:numId w:val="7"/>
         </w:numPr>
       </w:pPr>
-      <w:bookmarkStart w:id="30" w:name="_Toc241417958"/>
+      <w:bookmarkStart w:id="30" w:name="_Toc241509018"/>
       <w:r>
         <w:t>Inventory, Loose Loot, Coin</w:t>
       </w:r>
@@ -12381,7 +12381,7 @@
           <w:numId w:val="7"/>
         </w:numPr>
       </w:pPr>
-      <w:bookmarkStart w:id="31" w:name="_Toc241417959"/>
+      <w:bookmarkStart w:id="31" w:name="_Toc241509019"/>
       <w:r>
         <w:t>Player Identity</w:t>
       </w:r>
@@ -12804,7 +12804,7 @@
           <w:numId w:val="7"/>
         </w:numPr>
       </w:pPr>
-      <w:bookmarkStart w:id="32" w:name="_Toc241417960"/>
+      <w:bookmarkStart w:id="32" w:name="_Toc241509020"/>
       <w:r>
         <w:t xml:space="preserve">Floor Plan Map </w:t>
       </w:r>
@@ -13016,7 +13016,7 @@
           <w:numId w:val="7"/>
         </w:numPr>
       </w:pPr>
-      <w:bookmarkStart w:id="33" w:name="_Toc241417961"/>
+      <w:bookmarkStart w:id="33" w:name="_Toc241509021"/>
       <w:r>
         <w:t>Shared Extraction</w:t>
       </w:r>
@@ -13096,7 +13096,7 @@
           <w:numId w:val="7"/>
         </w:numPr>
       </w:pPr>
-      <w:bookmarkStart w:id="34" w:name="_Toc241417962"/>
+      <w:bookmarkStart w:id="34" w:name="_Toc241509022"/>
       <w:r>
         <w:lastRenderedPageBreak/>
         <w:t xml:space="preserve">UI, </w:t>
@@ -13125,7 +13125,7 @@
           <w:numId w:val="7"/>
         </w:numPr>
       </w:pPr>
-      <w:bookmarkStart w:id="35" w:name="_Toc241417963"/>
+      <w:bookmarkStart w:id="35" w:name="_Toc241509023"/>
       <w:r>
         <w:t>HUD Information Architecture</w:t>
       </w:r>
@@ -13426,7 +13426,7 @@
           <w:numId w:val="7"/>
         </w:numPr>
       </w:pPr>
-      <w:bookmarkStart w:id="36" w:name="_Toc241417964"/>
+      <w:bookmarkStart w:id="36" w:name="_Toc241509024"/>
       <w:r>
         <w:t xml:space="preserve">Main HUD </w:t>
       </w:r>
@@ -13741,7 +13741,7 @@
           <w:numId w:val="7"/>
         </w:numPr>
       </w:pPr>
-      <w:bookmarkStart w:id="37" w:name="_Toc241417965"/>
+      <w:bookmarkStart w:id="37" w:name="_Toc241509025"/>
       <w:r>
         <w:t>최소</w:t>
       </w:r>
@@ -13822,7 +13822,7 @@
           <w:numId w:val="7"/>
         </w:numPr>
       </w:pPr>
-      <w:bookmarkStart w:id="38" w:name="_Toc241417966"/>
+      <w:bookmarkStart w:id="38" w:name="_Toc241509026"/>
       <w:r>
         <w:t xml:space="preserve">Input Mode </w:t>
       </w:r>
@@ -14303,7 +14303,7 @@
           <w:numId w:val="7"/>
         </w:numPr>
       </w:pPr>
-      <w:bookmarkStart w:id="39" w:name="_Toc241417967"/>
+      <w:bookmarkStart w:id="39" w:name="_Toc241509027"/>
       <w:r>
         <w:t>Floor Plan</w:t>
       </w:r>
@@ -14326,7 +14326,7 @@
           <w:numId w:val="7"/>
         </w:numPr>
       </w:pPr>
-      <w:bookmarkStart w:id="40" w:name="_Toc241417968"/>
+      <w:bookmarkStart w:id="40" w:name="_Toc241509028"/>
       <w:r>
         <w:t xml:space="preserve">Floor Plan Map </w:t>
       </w:r>
@@ -14641,7 +14641,7 @@
           <w:numId w:val="7"/>
         </w:numPr>
       </w:pPr>
-      <w:bookmarkStart w:id="41" w:name="_Toc241417969"/>
+      <w:bookmarkStart w:id="41" w:name="_Toc241509029"/>
       <w:r>
         <w:t xml:space="preserve">Team Result / Replica Recap </w:t>
       </w:r>
@@ -15019,7 +15019,7 @@
           <w:numId w:val="7"/>
         </w:numPr>
       </w:pPr>
-      <w:bookmarkStart w:id="42" w:name="_Toc241417970"/>
+      <w:bookmarkStart w:id="42" w:name="_Toc241509030"/>
       <w:r>
         <w:t>첫</w:t>
       </w:r>
@@ -15294,7 +15294,7 @@
           <w:numId w:val="7"/>
         </w:numPr>
       </w:pPr>
-      <w:bookmarkStart w:id="43" w:name="_Toc241417971"/>
+      <w:bookmarkStart w:id="43" w:name="_Toc241509031"/>
       <w:r>
         <w:t>접근성</w:t>
       </w:r>
@@ -15366,7 +15366,7 @@
           <w:numId w:val="7"/>
         </w:numPr>
       </w:pPr>
-      <w:bookmarkStart w:id="44" w:name="_Toc241417972"/>
+      <w:bookmarkStart w:id="44" w:name="_Toc241509032"/>
       <w:r>
         <w:lastRenderedPageBreak/>
         <w:t>레벨</w:t>
@@ -15404,7 +15404,7 @@
           <w:numId w:val="7"/>
         </w:numPr>
       </w:pPr>
-      <w:bookmarkStart w:id="45" w:name="_Toc241417973"/>
+      <w:bookmarkStart w:id="45" w:name="_Toc241509033"/>
       <w:r>
         <w:t>세</w:t>
       </w:r>
@@ -15503,7 +15503,7 @@
         <w:pStyle w:val="a0"/>
       </w:pPr>
       <w:r>
-        <w:t>전시실은 작품 벽과 관람 공간을 함께 설계한다. 승인 평면도 기준 외벽 0.40m, 내벽 0.24m, 일반 연결 문 3~4m, 후면 관리 회랑 약 5.5~5.7m를 사용한다. 작품 앞 작업 공간은 2.2m를 확보하며 활성 작품은 그림 표면에서 정면 0.7m의 근거리 접근점으로 진입할 수 있어야 한다. 맵별 활성 작품 20점, 일반 작품 M01 51점·M02 53점·M03 61점과 12종 전시 패턴을 배치한다. 통과 폭과 15~25분 플레이 시간은 실제 멀티플레이로 검증한다. 작품 발견과 다음 전시 구역 진입이 연달아 끝나지 않도록 맵별 바닥 면적을 이전 배치의 약 2배로 확장한다. 활성 작품 20점과 일반 작품 수, 군집 내부 간격, 액자·문·상호작용 영역 크기와 위조 시간은 유지하고 구역 및 군집 사이 이동 거리를 늘린다. 기존 엇갈린 출입구와 차폐벽을 유지하며 탐색·위험 판단·귀환에 드는 시간을 함께 평가한다. 면적 증가를 15~25분 플레이 시간 달성으로 간주하지 않고 실제 경로와 플레이 테스트로 검증한다. 초반 전시실과 필수 작품 전시실에는 높이 3.2m의 벽 연결형 차폐벽을 총 7개 배치해 한 자리에서 여러 작품을 연속 확인하는 시야를 나누고, 벽 끝의 열린 통로로 우회하도록 한다.</w:t>
+        <w:t>전시실은 작품 벽과 관람 공간을 함께 설계한다. 승인 평면도 기준 외벽 0.40m, 내벽 0.24m, 일반 연결 문 3~4m, 후면 관리 회랑 약 5.5~5.7m를 사용한다. 작품 앞 작업 공간은 2.2m를 확보하며 활성 작품은 그림 표면에서 정면 0.7m의 근거리 접근점으로 진입할 수 있어야 한다. M01/M02 활성 작품 20점과 일반 작품 M01 51점·M02 53점, M03 활성 작품 12점과 일반 작품 48점과 12종 전시 패턴을 배치한다. 통과 폭과 15~25분 플레이 시간은 실제 멀티플레이로 검증한다. 작품 발견과 다음 전시 구역 진입이 연달아 끝나지 않도록 맵별 바닥 면적을 이전 배치의 약 2배로 확장한다. 해당 맵의 활성 작품과 일반 작품 수, 군집 내부 간격, 액자·문·상호작용 영역 크기와 위조 시간은 유지하고 구역 및 군집 사이 이동 거리를 늘린다. 기존 엇갈린 출입구와 차폐벽을 유지하며 탐색·위험 판단·귀환에 드는 시간을 함께 평가한다. 면적 증가를 15~25분 플레이 시간 달성으로 간주하지 않고 실제 경로와 플레이 테스트로 검증한다. 초반 전시실과 필수 작품 전시실에는 높이 3.2m의 벽 연결형 차폐벽을 총 7개 배치해 한 자리에서 여러 작품을 연속 확인하는 시야를 나누고, 벽 끝의 열린 통로로 우회하도록 한다.</w:t>
       </w:r>
     </w:p>
     <w:p>
@@ -15523,7 +15523,7 @@
       <w:pPr>
         <w:pStyle w:val="31"/>
       </w:pPr>
-      <w:bookmarkStart w:id="46" w:name="_Toc241417974"/>
+      <w:bookmarkStart w:id="46" w:name="_Toc241509034"/>
       <w:r>
         <w:t>전시</w:t>
       </w:r>
@@ -15596,7 +15596,7 @@
           <w:numId w:val="7"/>
         </w:numPr>
       </w:pPr>
-      <w:bookmarkStart w:id="47" w:name="_Toc241417975"/>
+      <w:bookmarkStart w:id="47" w:name="_Toc241509035"/>
       <w:r>
         <w:t>맵</w:t>
       </w:r>
@@ -16022,7 +16022,7 @@
           <w:numId w:val="7"/>
         </w:numPr>
       </w:pPr>
-      <w:bookmarkStart w:id="48" w:name="_Toc241417976"/>
+      <w:bookmarkStart w:id="48" w:name="_Toc241509036"/>
       <w:r>
         <w:lastRenderedPageBreak/>
         <w:t xml:space="preserve">M01 — </w:t>
@@ -16336,7 +16336,7 @@
           <w:numId w:val="7"/>
         </w:numPr>
       </w:pPr>
-      <w:bookmarkStart w:id="49" w:name="_Toc241417977"/>
+      <w:bookmarkStart w:id="49" w:name="_Toc241509037"/>
       <w:r>
         <w:lastRenderedPageBreak/>
         <w:t xml:space="preserve">M02 — </w:t>
@@ -16647,7 +16647,7 @@
           <w:numId w:val="7"/>
         </w:numPr>
       </w:pPr>
-      <w:bookmarkStart w:id="50" w:name="_Toc241417978"/>
+      <w:bookmarkStart w:id="50" w:name="_Toc241509038"/>
       <w:r>
         <w:lastRenderedPageBreak/>
         <w:t xml:space="preserve">M03 — </w:t>
@@ -16665,7 +16665,7 @@
     </w:p>
     <w:p>
       <w:r>
-        <w:t>사용자 승인 갤러리 팩 AIUE5_vol10_01을 기반으로 약 53×36m의 단층 현대미술관을 구성한다. 35×13m의 원본 홀과 높은 목재 트러스·노출 덕트·대표 설치물을 보존하고, 북측 A·B·C 전시실을 순차 탐색 동선으로 연결한다. 홀 6점, 각 전시실 4점, 동측 고가실 2점으로 활성 작품 20점을 배치하며 일반 장식 작품을 함께 전시한다. 서·북·동측 폭 4m 직원 통로는 별도 우회 경로이고, 동측 경비실·압수품 보관실·철창 구금실은 이 통로에서만 진입한다. 남서측 전실에 침입·회수 지점을 두고 홀과 직원 통로로 갈라진다. 필수 작품은 C 전시실에 배치하며 고가실의 레이저 협동은 선택 사항으로 유지한다. 낮은 별관 천장과 높은 원본 홀의 대비, 약한 천창 월광과 작품용 국소 조명으로 밤의 공간감을 만든다. 이 승인안은 앞의 공통 설명에 남은 M03 외곽 크기·일반 작품 수·옛 방 이름과 동선 수치에 우선한다. 면적이나 경로만으로 목표 플레이 시간을 달성했다고 판단하지 않는다.</w:t>
+        <w:t>사용자 승인 갤러리 팩 AIUE5_vol10_01의 기존 메시로 약 106×72m 단층 전시관을 구성한다. 35×13m 원본 홀과 상부 트러스·천창, 기존 A·B·C와 경비실·압수품실·구금실을 유지하고 서·동 전시실, 북측 연속 전시실과 직원 회랑, 남측 진입·전시실을 확장한다. 방과 복도는 별도 경계와 엇갈린 출입구로 구분한다. 상호작용 작품 12개와 장식 작품 48개를 분산하고 필수 작품은 북동 전시실, 레이저 보호 작품 두 점은 동측 별도 전시실에 배치한다. 필수 작품에 레이저 협동을 강제하지 않는다. 액자는 소형·중형·대형 정수 균등 스케일 세 단계로 제한하고 대형은 천장 높이가 충분한 곳에 배치한다. 기존 에셋을 여러 Actor가 참조하며 새 메시·파생 에셋을 생성하지 않는다. 약한 환경광과 작품용 국소 조명으로 밤의 공간감을 유지한다. 이 승인안은 앞의 공통 설명에 남은 M03 외곽 크기·액자 크기·옛 방 이름과 동선 수치에 우선한다. 면적이나 경로만으로 목표 플레이 시간을 달성했다고 판단하지 않는다. M03 전시실·통로 천장은 약 8m 기준으로 높이고 중앙 홀 지붕과 트러스를 함께 올린다. 작품등은 액자보다 충분히 높은 천장에 매달아 작품을 가리지 않게 하며, 통로는 어두운 야간 분위기를 유지한다. 작품 조명은 상호작용 여부와 무관하게 전체 구도와 주요 색을 읽을 수 있도록 균일하게 비춘다. 작품마다 담당 조명을 정하고 통로보다 작품을 강조하되 밝기만으로 훔칠 수 있는 작품을 구분하게 만들지 않는다. M03의 야간 보정은 환경광·작품등·통로등을 기존 균일화 기준의 절반으로 유지하고 CCTV는 가까운 표면이 하얗게 뜨지 않도록 더 낮춘다. 조명이 없는 복도에도 약한 차가운 환경광을 보완한다. 암부의 벽·바닥·출입구는 약하게 구분되도록 하되, 전체 노출을 올려 밝은 전시장으로 되돌리지 않는다.</w:t>
       </w:r>
     </w:p>
     <w:tbl>
@@ -16895,9 +16895,10 @@
               <w:rPr>
                 <w:noProof/>
               </w:rPr>
+              <w:lastRenderedPageBreak/>
               <w:drawing>
                 <wp:inline distT="0" distB="0" distL="0" distR="0" wp14:anchorId="6384B8F9" wp14:editId="75B922F6">
-                  <wp:extent cx="5120640" cy="3533775"/>
+                  <wp:extent cx="4608576" cy="3180397"/>
                   <wp:effectExtent l="0" t="0" r="0" b="0"/>
                   <wp:docPr id="3" name="Picture 3"/>
                   <wp:cNvGraphicFramePr>
@@ -16919,7 +16920,7 @@
                         <pic:spPr>
                           <a:xfrm>
                             <a:off x="0" y="0"/>
-                            <a:ext cx="5120640" cy="3533775"/>
+                            <a:ext cx="4608576" cy="3180397"/>
                           </a:xfrm>
                           <a:prstGeom prst="rect">
                             <a:avLst/>
@@ -16952,7 +16953,7 @@
           <w:numId w:val="7"/>
         </w:numPr>
       </w:pPr>
-      <w:bookmarkStart w:id="51" w:name="_Toc241417979"/>
+      <w:bookmarkStart w:id="51" w:name="_Toc241509039"/>
       <w:r>
         <w:lastRenderedPageBreak/>
         <w:t xml:space="preserve">First-Person </w:t>
@@ -17036,7 +17037,7 @@
           <w:numId w:val="7"/>
         </w:numPr>
       </w:pPr>
-      <w:bookmarkStart w:id="52" w:name="_Toc241417980"/>
+      <w:bookmarkStart w:id="52" w:name="_Toc241509040"/>
       <w:r>
         <w:t>사운드</w:t>
       </w:r>
@@ -17476,7 +17477,7 @@
           <w:numId w:val="7"/>
         </w:numPr>
       </w:pPr>
-      <w:bookmarkStart w:id="53" w:name="_Toc241417981"/>
+      <w:bookmarkStart w:id="53" w:name="_Toc241509041"/>
       <w:r>
         <w:lastRenderedPageBreak/>
         <w:t>세계관과</w:t>
@@ -17723,7 +17724,7 @@
           <w:numId w:val="7"/>
         </w:numPr>
       </w:pPr>
-      <w:bookmarkStart w:id="54" w:name="_Toc241417982"/>
+      <w:bookmarkStart w:id="54" w:name="_Toc241509042"/>
       <w:r>
         <w:lastRenderedPageBreak/>
         <w:t>범위</w:t>
@@ -17750,7 +17751,7 @@
           <w:numId w:val="7"/>
         </w:numPr>
       </w:pPr>
-      <w:bookmarkStart w:id="55" w:name="_Toc241417983"/>
+      <w:bookmarkStart w:id="55" w:name="_Toc241509043"/>
       <w:r>
         <w:t>v1.0 Required Scope</w:t>
       </w:r>
@@ -17960,7 +17961,7 @@
               <w:pStyle w:val="TableText"/>
             </w:pPr>
             <w:r>
-              <w:t>Painting + 맵별 Surface Template 40종(총 120종), 매치별 활성 20종, Object Assembly는 Deferred Expansion</w:t>
+              <w:t>Painting + 맵별 Surface Template 40종(총 120종), 매치별 활성 M01/M02 20종·M03 12종, Object Assembly는 Deferred Expansion</w:t>
             </w:r>
           </w:p>
         </w:tc>
@@ -18118,7 +18119,7 @@
           <w:numId w:val="7"/>
         </w:numPr>
       </w:pPr>
-      <w:bookmarkStart w:id="56" w:name="_Toc241417984"/>
+      <w:bookmarkStart w:id="56" w:name="_Toc241509044"/>
       <w:r>
         <w:t>Deferred Expansion</w:t>
       </w:r>
@@ -18142,7 +18143,7 @@
           <w:numId w:val="7"/>
         </w:numPr>
       </w:pPr>
-      <w:bookmarkStart w:id="57" w:name="_Toc241417985"/>
+      <w:bookmarkStart w:id="57" w:name="_Toc241509045"/>
       <w:r>
         <w:t>Stretch</w:t>
       </w:r>
@@ -18445,7 +18446,7 @@
               <w:pStyle w:val="TableText"/>
             </w:pPr>
             <w:r>
-              <w:t>120 Surface Template 카탈로그 + 매치별 20종 배정 + 기본 Loot Variety</w:t>
+              <w:t>120 Surface Template 카탈로그 + 매치별 M01/M02 20종·M03 12종 배정 + 기본 Loot Variety</w:t>
             </w:r>
           </w:p>
         </w:tc>
@@ -18520,7 +18521,7 @@
           <w:numId w:val="7"/>
         </w:numPr>
       </w:pPr>
-      <w:bookmarkStart w:id="58" w:name="_Toc241417986"/>
+      <w:bookmarkStart w:id="58" w:name="_Toc241509046"/>
       <w:r>
         <w:lastRenderedPageBreak/>
         <w:t>Starting Balance Targets</w:t>
@@ -19119,7 +19120,7 @@
           <w:numId w:val="7"/>
         </w:numPr>
       </w:pPr>
-      <w:bookmarkStart w:id="59" w:name="_Toc241417987"/>
+      <w:bookmarkStart w:id="59" w:name="_Toc241509047"/>
       <w:r>
         <w:t>Playtest Questions</w:t>
       </w:r>
@@ -19205,7 +19206,7 @@
           <w:numId w:val="7"/>
         </w:numPr>
       </w:pPr>
-      <w:bookmarkStart w:id="60" w:name="_Toc241417988"/>
+      <w:bookmarkStart w:id="60" w:name="_Toc241509048"/>
       <w:r>
         <w:lastRenderedPageBreak/>
         <w:t>Release KPI</w:t>
@@ -19537,7 +19538,7 @@
           <w:numId w:val="7"/>
         </w:numPr>
       </w:pPr>
-      <w:bookmarkStart w:id="61" w:name="_Toc241417989"/>
+      <w:bookmarkStart w:id="61" w:name="_Toc241509049"/>
       <w:r>
         <w:t>W6~W12 Roadmap</w:t>
       </w:r>
@@ -19903,7 +19904,7 @@
         <w:keepLines/>
         <w:pageBreakBefore w:val="0"/>
       </w:pPr>
-      <w:bookmarkStart w:id="62" w:name="_Toc241417990"/>
+      <w:bookmarkStart w:id="62" w:name="_Toc241509050"/>
       <w:r>
         <w:t>Appendix A — 용어</w:t>
       </w:r>
@@ -20294,7 +20295,7 @@
         <w:keepLines/>
         <w:pageBreakBefore w:val="0"/>
       </w:pPr>
-      <w:bookmarkStart w:id="63" w:name="_Toc241417991"/>
+      <w:bookmarkStart w:id="63" w:name="_Toc241509051"/>
       <w:r>
         <w:rPr>
           <w:sz w:val="32"/>
@@ -20518,7 +20519,7 @@
         <w:keepLines/>
         <w:pageBreakBefore w:val="0"/>
       </w:pPr>
-      <w:bookmarkStart w:id="64" w:name="_Toc241417992"/>
+      <w:bookmarkStart w:id="64" w:name="_Toc241509052"/>
       <w:r>
         <w:rPr>
           <w:sz w:val="32"/>

</xml_diff>

<commit_message>
Unify authored map rules and repair PCG and security interactions
Align ceiling heights, painting sizes and counts, night lighting, and floor rules across M01, M02, and M03. Repair persistent floor PCG bounds and add the shared guard flashlight.

Fix laser rearm and duplicate contact incidents, remove CCTV coverage-light specular, and add mixed-cargo arrest/Evidence recovery regression coverage. Update GDD/TDD and keep the authored map concepts.

Validation: UE 5.8 Editor Development build, eight focused Automation tests including scripted two-peer recovery, current-map runtime policy and anchor audit, and Editor script syntax checks. Natural User PIE and Steam remain untested.
</commit_message>
<xml_diff>
--- a/Museum_Heist_GDD.docx
+++ b/Museum_Heist_GDD.docx
@@ -559,7 +559,7 @@
       <w:r>
         <w:fldChar w:fldCharType="separate"/>
       </w:r>
-      <w:hyperlink w:anchor="_Toc241508988" w:history="1">
+      <w:hyperlink w:anchor="_Toc241661011" w:history="1">
         <w:r>
           <w:rPr>
             <w:rStyle w:val="aff1"/>
@@ -586,7 +586,7 @@
             <w:noProof/>
             <w:webHidden/>
           </w:rPr>
-          <w:instrText xml:space="preserve"> PAGEREF _Toc241508988 \h </w:instrText>
+          <w:instrText xml:space="preserve"> PAGEREF _Toc241661011 \h </w:instrText>
         </w:r>
         <w:r>
           <w:rPr>
@@ -635,7 +635,7 @@
           <w14:ligatures w14:val="standardContextual"/>
         </w:rPr>
       </w:pPr>
-      <w:hyperlink w:anchor="_Toc241508989" w:history="1">
+      <w:hyperlink w:anchor="_Toc241661012" w:history="1">
         <w:r>
           <w:rPr>
             <w:rStyle w:val="aff1"/>
@@ -662,7 +662,7 @@
             <w:noProof/>
             <w:webHidden/>
           </w:rPr>
-          <w:instrText xml:space="preserve"> PAGEREF _Toc241508989 \h </w:instrText>
+          <w:instrText xml:space="preserve"> PAGEREF _Toc241661012 \h </w:instrText>
         </w:r>
         <w:r>
           <w:rPr>
@@ -711,7 +711,7 @@
           <w14:ligatures w14:val="standardContextual"/>
         </w:rPr>
       </w:pPr>
-      <w:hyperlink w:anchor="_Toc241508990" w:history="1">
+      <w:hyperlink w:anchor="_Toc241661013" w:history="1">
         <w:r>
           <w:rPr>
             <w:rStyle w:val="aff1"/>
@@ -738,7 +738,7 @@
             <w:noProof/>
             <w:webHidden/>
           </w:rPr>
-          <w:instrText xml:space="preserve"> PAGEREF _Toc241508990 \h </w:instrText>
+          <w:instrText xml:space="preserve"> PAGEREF _Toc241661013 \h </w:instrText>
         </w:r>
         <w:r>
           <w:rPr>
@@ -787,7 +787,7 @@
           <w14:ligatures w14:val="standardContextual"/>
         </w:rPr>
       </w:pPr>
-      <w:hyperlink w:anchor="_Toc241508991" w:history="1">
+      <w:hyperlink w:anchor="_Toc241661014" w:history="1">
         <w:r>
           <w:rPr>
             <w:rStyle w:val="aff1"/>
@@ -814,7 +814,7 @@
             <w:noProof/>
             <w:webHidden/>
           </w:rPr>
-          <w:instrText xml:space="preserve"> PAGEREF _Toc241508991 \h </w:instrText>
+          <w:instrText xml:space="preserve"> PAGEREF _Toc241661014 \h </w:instrText>
         </w:r>
         <w:r>
           <w:rPr>
@@ -863,7 +863,7 @@
           <w14:ligatures w14:val="standardContextual"/>
         </w:rPr>
       </w:pPr>
-      <w:hyperlink w:anchor="_Toc241508992" w:history="1">
+      <w:hyperlink w:anchor="_Toc241661015" w:history="1">
         <w:r>
           <w:rPr>
             <w:rStyle w:val="aff1"/>
@@ -890,7 +890,7 @@
             <w:noProof/>
             <w:webHidden/>
           </w:rPr>
-          <w:instrText xml:space="preserve"> PAGEREF _Toc241508992 \h </w:instrText>
+          <w:instrText xml:space="preserve"> PAGEREF _Toc241661015 \h </w:instrText>
         </w:r>
         <w:r>
           <w:rPr>
@@ -939,7 +939,7 @@
           <w14:ligatures w14:val="standardContextual"/>
         </w:rPr>
       </w:pPr>
-      <w:hyperlink w:anchor="_Toc241508993" w:history="1">
+      <w:hyperlink w:anchor="_Toc241661016" w:history="1">
         <w:r>
           <w:rPr>
             <w:rStyle w:val="aff1"/>
@@ -966,7 +966,7 @@
             <w:noProof/>
             <w:webHidden/>
           </w:rPr>
-          <w:instrText xml:space="preserve"> PAGEREF _Toc241508993 \h </w:instrText>
+          <w:instrText xml:space="preserve"> PAGEREF _Toc241661016 \h </w:instrText>
         </w:r>
         <w:r>
           <w:rPr>
@@ -1015,7 +1015,7 @@
           <w14:ligatures w14:val="standardContextual"/>
         </w:rPr>
       </w:pPr>
-      <w:hyperlink w:anchor="_Toc241508994" w:history="1">
+      <w:hyperlink w:anchor="_Toc241661017" w:history="1">
         <w:r>
           <w:rPr>
             <w:rStyle w:val="aff1"/>
@@ -1042,7 +1042,7 @@
             <w:noProof/>
             <w:webHidden/>
           </w:rPr>
-          <w:instrText xml:space="preserve"> PAGEREF _Toc241508994 \h </w:instrText>
+          <w:instrText xml:space="preserve"> PAGEREF _Toc241661017 \h </w:instrText>
         </w:r>
         <w:r>
           <w:rPr>
@@ -1090,7 +1090,7 @@
           <w14:ligatures w14:val="standardContextual"/>
         </w:rPr>
       </w:pPr>
-      <w:hyperlink w:anchor="_Toc241508995" w:history="1">
+      <w:hyperlink w:anchor="_Toc241661018" w:history="1">
         <w:r>
           <w:rPr>
             <w:rStyle w:val="aff1"/>
@@ -1117,7 +1117,7 @@
             <w:noProof/>
             <w:webHidden/>
           </w:rPr>
-          <w:instrText xml:space="preserve"> PAGEREF _Toc241508995 \h </w:instrText>
+          <w:instrText xml:space="preserve"> PAGEREF _Toc241661018 \h </w:instrText>
         </w:r>
         <w:r>
           <w:rPr>
@@ -1166,7 +1166,7 @@
           <w14:ligatures w14:val="standardContextual"/>
         </w:rPr>
       </w:pPr>
-      <w:hyperlink w:anchor="_Toc241508996" w:history="1">
+      <w:hyperlink w:anchor="_Toc241661019" w:history="1">
         <w:r>
           <w:rPr>
             <w:rStyle w:val="aff1"/>
@@ -1193,7 +1193,7 @@
             <w:noProof/>
             <w:webHidden/>
           </w:rPr>
-          <w:instrText xml:space="preserve"> PAGEREF _Toc241508996 \h </w:instrText>
+          <w:instrText xml:space="preserve"> PAGEREF _Toc241661019 \h </w:instrText>
         </w:r>
         <w:r>
           <w:rPr>
@@ -1242,7 +1242,7 @@
           <w14:ligatures w14:val="standardContextual"/>
         </w:rPr>
       </w:pPr>
-      <w:hyperlink w:anchor="_Toc241508997" w:history="1">
+      <w:hyperlink w:anchor="_Toc241661020" w:history="1">
         <w:r>
           <w:rPr>
             <w:rStyle w:val="aff1"/>
@@ -1269,7 +1269,7 @@
             <w:noProof/>
             <w:webHidden/>
           </w:rPr>
-          <w:instrText xml:space="preserve"> PAGEREF _Toc241508997 \h </w:instrText>
+          <w:instrText xml:space="preserve"> PAGEREF _Toc241661020 \h </w:instrText>
         </w:r>
         <w:r>
           <w:rPr>
@@ -1318,7 +1318,7 @@
           <w14:ligatures w14:val="standardContextual"/>
         </w:rPr>
       </w:pPr>
-      <w:hyperlink w:anchor="_Toc241508998" w:history="1">
+      <w:hyperlink w:anchor="_Toc241661021" w:history="1">
         <w:r>
           <w:rPr>
             <w:rStyle w:val="aff1"/>
@@ -1345,7 +1345,7 @@
             <w:noProof/>
             <w:webHidden/>
           </w:rPr>
-          <w:instrText xml:space="preserve"> PAGEREF _Toc241508998 \h </w:instrText>
+          <w:instrText xml:space="preserve"> PAGEREF _Toc241661021 \h </w:instrText>
         </w:r>
         <w:r>
           <w:rPr>
@@ -1394,7 +1394,7 @@
           <w14:ligatures w14:val="standardContextual"/>
         </w:rPr>
       </w:pPr>
-      <w:hyperlink w:anchor="_Toc241508999" w:history="1">
+      <w:hyperlink w:anchor="_Toc241661022" w:history="1">
         <w:r>
           <w:rPr>
             <w:rStyle w:val="aff1"/>
@@ -1421,7 +1421,7 @@
             <w:noProof/>
             <w:webHidden/>
           </w:rPr>
-          <w:instrText xml:space="preserve"> PAGEREF _Toc241508999 \h </w:instrText>
+          <w:instrText xml:space="preserve"> PAGEREF _Toc241661022 \h </w:instrText>
         </w:r>
         <w:r>
           <w:rPr>
@@ -1470,7 +1470,7 @@
           <w14:ligatures w14:val="standardContextual"/>
         </w:rPr>
       </w:pPr>
-      <w:hyperlink w:anchor="_Toc241509000" w:history="1">
+      <w:hyperlink w:anchor="_Toc241661023" w:history="1">
         <w:r>
           <w:rPr>
             <w:rStyle w:val="aff1"/>
@@ -1497,7 +1497,7 @@
             <w:noProof/>
             <w:webHidden/>
           </w:rPr>
-          <w:instrText xml:space="preserve"> PAGEREF _Toc241509000 \h </w:instrText>
+          <w:instrText xml:space="preserve"> PAGEREF _Toc241661023 \h </w:instrText>
         </w:r>
         <w:r>
           <w:rPr>
@@ -1545,7 +1545,7 @@
           <w14:ligatures w14:val="standardContextual"/>
         </w:rPr>
       </w:pPr>
-      <w:hyperlink w:anchor="_Toc241509001" w:history="1">
+      <w:hyperlink w:anchor="_Toc241661024" w:history="1">
         <w:r>
           <w:rPr>
             <w:rStyle w:val="aff1"/>
@@ -1572,7 +1572,7 @@
             <w:noProof/>
             <w:webHidden/>
           </w:rPr>
-          <w:instrText xml:space="preserve"> PAGEREF _Toc241509001 \h </w:instrText>
+          <w:instrText xml:space="preserve"> PAGEREF _Toc241661024 \h </w:instrText>
         </w:r>
         <w:r>
           <w:rPr>
@@ -1621,7 +1621,7 @@
           <w14:ligatures w14:val="standardContextual"/>
         </w:rPr>
       </w:pPr>
-      <w:hyperlink w:anchor="_Toc241509002" w:history="1">
+      <w:hyperlink w:anchor="_Toc241661025" w:history="1">
         <w:r>
           <w:rPr>
             <w:rStyle w:val="aff1"/>
@@ -1648,7 +1648,7 @@
             <w:noProof/>
             <w:webHidden/>
           </w:rPr>
-          <w:instrText xml:space="preserve"> PAGEREF _Toc241509002 \h </w:instrText>
+          <w:instrText xml:space="preserve"> PAGEREF _Toc241661025 \h </w:instrText>
         </w:r>
         <w:r>
           <w:rPr>
@@ -1697,7 +1697,7 @@
           <w14:ligatures w14:val="standardContextual"/>
         </w:rPr>
       </w:pPr>
-      <w:hyperlink w:anchor="_Toc241509003" w:history="1">
+      <w:hyperlink w:anchor="_Toc241661026" w:history="1">
         <w:r>
           <w:rPr>
             <w:rStyle w:val="aff1"/>
@@ -1724,7 +1724,7 @@
             <w:noProof/>
             <w:webHidden/>
           </w:rPr>
-          <w:instrText xml:space="preserve"> PAGEREF _Toc241509003 \h </w:instrText>
+          <w:instrText xml:space="preserve"> PAGEREF _Toc241661026 \h </w:instrText>
         </w:r>
         <w:r>
           <w:rPr>
@@ -1773,7 +1773,7 @@
           <w14:ligatures w14:val="standardContextual"/>
         </w:rPr>
       </w:pPr>
-      <w:hyperlink w:anchor="_Toc241509004" w:history="1">
+      <w:hyperlink w:anchor="_Toc241661027" w:history="1">
         <w:r>
           <w:rPr>
             <w:rStyle w:val="aff1"/>
@@ -1800,7 +1800,7 @@
             <w:noProof/>
             <w:webHidden/>
           </w:rPr>
-          <w:instrText xml:space="preserve"> PAGEREF _Toc241509004 \h </w:instrText>
+          <w:instrText xml:space="preserve"> PAGEREF _Toc241661027 \h </w:instrText>
         </w:r>
         <w:r>
           <w:rPr>
@@ -1849,7 +1849,7 @@
           <w14:ligatures w14:val="standardContextual"/>
         </w:rPr>
       </w:pPr>
-      <w:hyperlink w:anchor="_Toc241509005" w:history="1">
+      <w:hyperlink w:anchor="_Toc241661028" w:history="1">
         <w:r>
           <w:rPr>
             <w:rStyle w:val="aff1"/>
@@ -1876,7 +1876,7 @@
             <w:noProof/>
             <w:webHidden/>
           </w:rPr>
-          <w:instrText xml:space="preserve"> PAGEREF _Toc241509005 \h </w:instrText>
+          <w:instrText xml:space="preserve"> PAGEREF _Toc241661028 \h </w:instrText>
         </w:r>
         <w:r>
           <w:rPr>
@@ -1925,7 +1925,7 @@
           <w14:ligatures w14:val="standardContextual"/>
         </w:rPr>
       </w:pPr>
-      <w:hyperlink w:anchor="_Toc241509006" w:history="1">
+      <w:hyperlink w:anchor="_Toc241661029" w:history="1">
         <w:r>
           <w:rPr>
             <w:rStyle w:val="aff1"/>
@@ -1952,7 +1952,7 @@
             <w:noProof/>
             <w:webHidden/>
           </w:rPr>
-          <w:instrText xml:space="preserve"> PAGEREF _Toc241509006 \h </w:instrText>
+          <w:instrText xml:space="preserve"> PAGEREF _Toc241661029 \h </w:instrText>
         </w:r>
         <w:r>
           <w:rPr>
@@ -2001,7 +2001,7 @@
           <w14:ligatures w14:val="standardContextual"/>
         </w:rPr>
       </w:pPr>
-      <w:hyperlink w:anchor="_Toc241509007" w:history="1">
+      <w:hyperlink w:anchor="_Toc241661030" w:history="1">
         <w:r>
           <w:rPr>
             <w:rStyle w:val="aff1"/>
@@ -2028,7 +2028,7 @@
             <w:noProof/>
             <w:webHidden/>
           </w:rPr>
-          <w:instrText xml:space="preserve"> PAGEREF _Toc241509007 \h </w:instrText>
+          <w:instrText xml:space="preserve"> PAGEREF _Toc241661030 \h </w:instrText>
         </w:r>
         <w:r>
           <w:rPr>
@@ -2076,7 +2076,7 @@
           <w14:ligatures w14:val="standardContextual"/>
         </w:rPr>
       </w:pPr>
-      <w:hyperlink w:anchor="_Toc241509008" w:history="1">
+      <w:hyperlink w:anchor="_Toc241661031" w:history="1">
         <w:r>
           <w:rPr>
             <w:rStyle w:val="aff1"/>
@@ -2103,7 +2103,7 @@
             <w:noProof/>
             <w:webHidden/>
           </w:rPr>
-          <w:instrText xml:space="preserve"> PAGEREF _Toc241509008 \h </w:instrText>
+          <w:instrText xml:space="preserve"> PAGEREF _Toc241661031 \h </w:instrText>
         </w:r>
         <w:r>
           <w:rPr>
@@ -2152,7 +2152,7 @@
           <w14:ligatures w14:val="standardContextual"/>
         </w:rPr>
       </w:pPr>
-      <w:hyperlink w:anchor="_Toc241509009" w:history="1">
+      <w:hyperlink w:anchor="_Toc241661032" w:history="1">
         <w:r>
           <w:rPr>
             <w:rStyle w:val="aff1"/>
@@ -2179,7 +2179,7 @@
             <w:noProof/>
             <w:webHidden/>
           </w:rPr>
-          <w:instrText xml:space="preserve"> PAGEREF _Toc241509009 \h </w:instrText>
+          <w:instrText xml:space="preserve"> PAGEREF _Toc241661032 \h </w:instrText>
         </w:r>
         <w:r>
           <w:rPr>
@@ -2228,7 +2228,7 @@
           <w14:ligatures w14:val="standardContextual"/>
         </w:rPr>
       </w:pPr>
-      <w:hyperlink w:anchor="_Toc241509010" w:history="1">
+      <w:hyperlink w:anchor="_Toc241661033" w:history="1">
         <w:r>
           <w:rPr>
             <w:rStyle w:val="aff1"/>
@@ -2255,7 +2255,7 @@
             <w:noProof/>
             <w:webHidden/>
           </w:rPr>
-          <w:instrText xml:space="preserve"> PAGEREF _Toc241509010 \h </w:instrText>
+          <w:instrText xml:space="preserve"> PAGEREF _Toc241661033 \h </w:instrText>
         </w:r>
         <w:r>
           <w:rPr>
@@ -2304,7 +2304,7 @@
           <w14:ligatures w14:val="standardContextual"/>
         </w:rPr>
       </w:pPr>
-      <w:hyperlink w:anchor="_Toc241509011" w:history="1">
+      <w:hyperlink w:anchor="_Toc241661034" w:history="1">
         <w:r>
           <w:rPr>
             <w:rStyle w:val="aff1"/>
@@ -2331,7 +2331,7 @@
             <w:noProof/>
             <w:webHidden/>
           </w:rPr>
-          <w:instrText xml:space="preserve"> PAGEREF _Toc241509011 \h </w:instrText>
+          <w:instrText xml:space="preserve"> PAGEREF _Toc241661034 \h </w:instrText>
         </w:r>
         <w:r>
           <w:rPr>
@@ -2380,7 +2380,7 @@
           <w14:ligatures w14:val="standardContextual"/>
         </w:rPr>
       </w:pPr>
-      <w:hyperlink w:anchor="_Toc241509012" w:history="1">
+      <w:hyperlink w:anchor="_Toc241661035" w:history="1">
         <w:r>
           <w:rPr>
             <w:rStyle w:val="aff1"/>
@@ -2407,7 +2407,7 @@
             <w:noProof/>
             <w:webHidden/>
           </w:rPr>
-          <w:instrText xml:space="preserve"> PAGEREF _Toc241509012 \h </w:instrText>
+          <w:instrText xml:space="preserve"> PAGEREF _Toc241661035 \h </w:instrText>
         </w:r>
         <w:r>
           <w:rPr>
@@ -2456,7 +2456,7 @@
           <w14:ligatures w14:val="standardContextual"/>
         </w:rPr>
       </w:pPr>
-      <w:hyperlink w:anchor="_Toc241509013" w:history="1">
+      <w:hyperlink w:anchor="_Toc241661036" w:history="1">
         <w:r>
           <w:rPr>
             <w:rStyle w:val="aff1"/>
@@ -2483,7 +2483,7 @@
             <w:noProof/>
             <w:webHidden/>
           </w:rPr>
-          <w:instrText xml:space="preserve"> PAGEREF _Toc241509013 \h </w:instrText>
+          <w:instrText xml:space="preserve"> PAGEREF _Toc241661036 \h </w:instrText>
         </w:r>
         <w:r>
           <w:rPr>
@@ -2532,7 +2532,7 @@
           <w14:ligatures w14:val="standardContextual"/>
         </w:rPr>
       </w:pPr>
-      <w:hyperlink w:anchor="_Toc241509014" w:history="1">
+      <w:hyperlink w:anchor="_Toc241661037" w:history="1">
         <w:r>
           <w:rPr>
             <w:rStyle w:val="aff1"/>
@@ -2559,7 +2559,7 @@
             <w:noProof/>
             <w:webHidden/>
           </w:rPr>
-          <w:instrText xml:space="preserve"> PAGEREF _Toc241509014 \h </w:instrText>
+          <w:instrText xml:space="preserve"> PAGEREF _Toc241661037 \h </w:instrText>
         </w:r>
         <w:r>
           <w:rPr>
@@ -2607,7 +2607,7 @@
           <w14:ligatures w14:val="standardContextual"/>
         </w:rPr>
       </w:pPr>
-      <w:hyperlink w:anchor="_Toc241509015" w:history="1">
+      <w:hyperlink w:anchor="_Toc241661038" w:history="1">
         <w:r>
           <w:rPr>
             <w:rStyle w:val="aff1"/>
@@ -2634,7 +2634,7 @@
             <w:noProof/>
             <w:webHidden/>
           </w:rPr>
-          <w:instrText xml:space="preserve"> PAGEREF _Toc241509015 \h </w:instrText>
+          <w:instrText xml:space="preserve"> PAGEREF _Toc241661038 \h </w:instrText>
         </w:r>
         <w:r>
           <w:rPr>
@@ -2683,7 +2683,7 @@
           <w14:ligatures w14:val="standardContextual"/>
         </w:rPr>
       </w:pPr>
-      <w:hyperlink w:anchor="_Toc241509016" w:history="1">
+      <w:hyperlink w:anchor="_Toc241661039" w:history="1">
         <w:r>
           <w:rPr>
             <w:rStyle w:val="aff1"/>
@@ -2710,7 +2710,7 @@
             <w:noProof/>
             <w:webHidden/>
           </w:rPr>
-          <w:instrText xml:space="preserve"> PAGEREF _Toc241509016 \h </w:instrText>
+          <w:instrText xml:space="preserve"> PAGEREF _Toc241661039 \h </w:instrText>
         </w:r>
         <w:r>
           <w:rPr>
@@ -2759,7 +2759,7 @@
           <w14:ligatures w14:val="standardContextual"/>
         </w:rPr>
       </w:pPr>
-      <w:hyperlink w:anchor="_Toc241509017" w:history="1">
+      <w:hyperlink w:anchor="_Toc241661040" w:history="1">
         <w:r>
           <w:rPr>
             <w:rStyle w:val="aff1"/>
@@ -2786,7 +2786,7 @@
             <w:noProof/>
             <w:webHidden/>
           </w:rPr>
-          <w:instrText xml:space="preserve"> PAGEREF _Toc241509017 \h </w:instrText>
+          <w:instrText xml:space="preserve"> PAGEREF _Toc241661040 \h </w:instrText>
         </w:r>
         <w:r>
           <w:rPr>
@@ -2835,7 +2835,7 @@
           <w14:ligatures w14:val="standardContextual"/>
         </w:rPr>
       </w:pPr>
-      <w:hyperlink w:anchor="_Toc241509018" w:history="1">
+      <w:hyperlink w:anchor="_Toc241661041" w:history="1">
         <w:r>
           <w:rPr>
             <w:rStyle w:val="aff1"/>
@@ -2862,7 +2862,7 @@
             <w:noProof/>
             <w:webHidden/>
           </w:rPr>
-          <w:instrText xml:space="preserve"> PAGEREF _Toc241509018 \h </w:instrText>
+          <w:instrText xml:space="preserve"> PAGEREF _Toc241661041 \h </w:instrText>
         </w:r>
         <w:r>
           <w:rPr>
@@ -2911,7 +2911,7 @@
           <w14:ligatures w14:val="standardContextual"/>
         </w:rPr>
       </w:pPr>
-      <w:hyperlink w:anchor="_Toc241509019" w:history="1">
+      <w:hyperlink w:anchor="_Toc241661042" w:history="1">
         <w:r>
           <w:rPr>
             <w:rStyle w:val="aff1"/>
@@ -2938,7 +2938,7 @@
             <w:noProof/>
             <w:webHidden/>
           </w:rPr>
-          <w:instrText xml:space="preserve"> PAGEREF _Toc241509019 \h </w:instrText>
+          <w:instrText xml:space="preserve"> PAGEREF _Toc241661042 \h </w:instrText>
         </w:r>
         <w:r>
           <w:rPr>
@@ -2987,7 +2987,7 @@
           <w14:ligatures w14:val="standardContextual"/>
         </w:rPr>
       </w:pPr>
-      <w:hyperlink w:anchor="_Toc241509020" w:history="1">
+      <w:hyperlink w:anchor="_Toc241661043" w:history="1">
         <w:r>
           <w:rPr>
             <w:rStyle w:val="aff1"/>
@@ -3014,7 +3014,7 @@
             <w:noProof/>
             <w:webHidden/>
           </w:rPr>
-          <w:instrText xml:space="preserve"> PAGEREF _Toc241509020 \h </w:instrText>
+          <w:instrText xml:space="preserve"> PAGEREF _Toc241661043 \h </w:instrText>
         </w:r>
         <w:r>
           <w:rPr>
@@ -3063,7 +3063,7 @@
           <w14:ligatures w14:val="standardContextual"/>
         </w:rPr>
       </w:pPr>
-      <w:hyperlink w:anchor="_Toc241509021" w:history="1">
+      <w:hyperlink w:anchor="_Toc241661044" w:history="1">
         <w:r>
           <w:rPr>
             <w:rStyle w:val="aff1"/>
@@ -3090,7 +3090,7 @@
             <w:noProof/>
             <w:webHidden/>
           </w:rPr>
-          <w:instrText xml:space="preserve"> PAGEREF _Toc241509021 \h </w:instrText>
+          <w:instrText xml:space="preserve"> PAGEREF _Toc241661044 \h </w:instrText>
         </w:r>
         <w:r>
           <w:rPr>
@@ -3138,7 +3138,7 @@
           <w14:ligatures w14:val="standardContextual"/>
         </w:rPr>
       </w:pPr>
-      <w:hyperlink w:anchor="_Toc241509022" w:history="1">
+      <w:hyperlink w:anchor="_Toc241661045" w:history="1">
         <w:r>
           <w:rPr>
             <w:rStyle w:val="aff1"/>
@@ -3165,7 +3165,7 @@
             <w:noProof/>
             <w:webHidden/>
           </w:rPr>
-          <w:instrText xml:space="preserve"> PAGEREF _Toc241509022 \h </w:instrText>
+          <w:instrText xml:space="preserve"> PAGEREF _Toc241661045 \h </w:instrText>
         </w:r>
         <w:r>
           <w:rPr>
@@ -3214,7 +3214,7 @@
           <w14:ligatures w14:val="standardContextual"/>
         </w:rPr>
       </w:pPr>
-      <w:hyperlink w:anchor="_Toc241509023" w:history="1">
+      <w:hyperlink w:anchor="_Toc241661046" w:history="1">
         <w:r>
           <w:rPr>
             <w:rStyle w:val="aff1"/>
@@ -3241,7 +3241,7 @@
             <w:noProof/>
             <w:webHidden/>
           </w:rPr>
-          <w:instrText xml:space="preserve"> PAGEREF _Toc241509023 \h </w:instrText>
+          <w:instrText xml:space="preserve"> PAGEREF _Toc241661046 \h </w:instrText>
         </w:r>
         <w:r>
           <w:rPr>
@@ -3290,7 +3290,7 @@
           <w14:ligatures w14:val="standardContextual"/>
         </w:rPr>
       </w:pPr>
-      <w:hyperlink w:anchor="_Toc241509024" w:history="1">
+      <w:hyperlink w:anchor="_Toc241661047" w:history="1">
         <w:r>
           <w:rPr>
             <w:rStyle w:val="aff1"/>
@@ -3317,7 +3317,7 @@
             <w:noProof/>
             <w:webHidden/>
           </w:rPr>
-          <w:instrText xml:space="preserve"> PAGEREF _Toc241509024 \h </w:instrText>
+          <w:instrText xml:space="preserve"> PAGEREF _Toc241661047 \h </w:instrText>
         </w:r>
         <w:r>
           <w:rPr>
@@ -3366,7 +3366,7 @@
           <w14:ligatures w14:val="standardContextual"/>
         </w:rPr>
       </w:pPr>
-      <w:hyperlink w:anchor="_Toc241509025" w:history="1">
+      <w:hyperlink w:anchor="_Toc241661048" w:history="1">
         <w:r>
           <w:rPr>
             <w:rStyle w:val="aff1"/>
@@ -3393,7 +3393,7 @@
             <w:noProof/>
             <w:webHidden/>
           </w:rPr>
-          <w:instrText xml:space="preserve"> PAGEREF _Toc241509025 \h </w:instrText>
+          <w:instrText xml:space="preserve"> PAGEREF _Toc241661048 \h </w:instrText>
         </w:r>
         <w:r>
           <w:rPr>
@@ -3442,7 +3442,7 @@
           <w14:ligatures w14:val="standardContextual"/>
         </w:rPr>
       </w:pPr>
-      <w:hyperlink w:anchor="_Toc241509026" w:history="1">
+      <w:hyperlink w:anchor="_Toc241661049" w:history="1">
         <w:r>
           <w:rPr>
             <w:rStyle w:val="aff1"/>
@@ -3469,7 +3469,7 @@
             <w:noProof/>
             <w:webHidden/>
           </w:rPr>
-          <w:instrText xml:space="preserve"> PAGEREF _Toc241509026 \h </w:instrText>
+          <w:instrText xml:space="preserve"> PAGEREF _Toc241661049 \h </w:instrText>
         </w:r>
         <w:r>
           <w:rPr>
@@ -3518,7 +3518,7 @@
           <w14:ligatures w14:val="standardContextual"/>
         </w:rPr>
       </w:pPr>
-      <w:hyperlink w:anchor="_Toc241509027" w:history="1">
+      <w:hyperlink w:anchor="_Toc241661050" w:history="1">
         <w:r>
           <w:rPr>
             <w:rStyle w:val="aff1"/>
@@ -3545,7 +3545,7 @@
             <w:noProof/>
             <w:webHidden/>
           </w:rPr>
-          <w:instrText xml:space="preserve"> PAGEREF _Toc241509027 \h </w:instrText>
+          <w:instrText xml:space="preserve"> PAGEREF _Toc241661050 \h </w:instrText>
         </w:r>
         <w:r>
           <w:rPr>
@@ -3594,7 +3594,7 @@
           <w14:ligatures w14:val="standardContextual"/>
         </w:rPr>
       </w:pPr>
-      <w:hyperlink w:anchor="_Toc241509028" w:history="1">
+      <w:hyperlink w:anchor="_Toc241661051" w:history="1">
         <w:r>
           <w:rPr>
             <w:rStyle w:val="aff1"/>
@@ -3621,7 +3621,7 @@
             <w:noProof/>
             <w:webHidden/>
           </w:rPr>
-          <w:instrText xml:space="preserve"> PAGEREF _Toc241509028 \h </w:instrText>
+          <w:instrText xml:space="preserve"> PAGEREF _Toc241661051 \h </w:instrText>
         </w:r>
         <w:r>
           <w:rPr>
@@ -3670,7 +3670,7 @@
           <w14:ligatures w14:val="standardContextual"/>
         </w:rPr>
       </w:pPr>
-      <w:hyperlink w:anchor="_Toc241509029" w:history="1">
+      <w:hyperlink w:anchor="_Toc241661052" w:history="1">
         <w:r>
           <w:rPr>
             <w:rStyle w:val="aff1"/>
@@ -3697,7 +3697,7 @@
             <w:noProof/>
             <w:webHidden/>
           </w:rPr>
-          <w:instrText xml:space="preserve"> PAGEREF _Toc241509029 \h </w:instrText>
+          <w:instrText xml:space="preserve"> PAGEREF _Toc241661052 \h </w:instrText>
         </w:r>
         <w:r>
           <w:rPr>
@@ -3746,7 +3746,7 @@
           <w14:ligatures w14:val="standardContextual"/>
         </w:rPr>
       </w:pPr>
-      <w:hyperlink w:anchor="_Toc241509030" w:history="1">
+      <w:hyperlink w:anchor="_Toc241661053" w:history="1">
         <w:r>
           <w:rPr>
             <w:rStyle w:val="aff1"/>
@@ -3773,7 +3773,7 @@
             <w:noProof/>
             <w:webHidden/>
           </w:rPr>
-          <w:instrText xml:space="preserve"> PAGEREF _Toc241509030 \h </w:instrText>
+          <w:instrText xml:space="preserve"> PAGEREF _Toc241661053 \h </w:instrText>
         </w:r>
         <w:r>
           <w:rPr>
@@ -3822,7 +3822,7 @@
           <w14:ligatures w14:val="standardContextual"/>
         </w:rPr>
       </w:pPr>
-      <w:hyperlink w:anchor="_Toc241509031" w:history="1">
+      <w:hyperlink w:anchor="_Toc241661054" w:history="1">
         <w:r>
           <w:rPr>
             <w:rStyle w:val="aff1"/>
@@ -3849,7 +3849,7 @@
             <w:noProof/>
             <w:webHidden/>
           </w:rPr>
-          <w:instrText xml:space="preserve"> PAGEREF _Toc241509031 \h </w:instrText>
+          <w:instrText xml:space="preserve"> PAGEREF _Toc241661054 \h </w:instrText>
         </w:r>
         <w:r>
           <w:rPr>
@@ -3897,7 +3897,7 @@
           <w14:ligatures w14:val="standardContextual"/>
         </w:rPr>
       </w:pPr>
-      <w:hyperlink w:anchor="_Toc241509032" w:history="1">
+      <w:hyperlink w:anchor="_Toc241661055" w:history="1">
         <w:r>
           <w:rPr>
             <w:rStyle w:val="aff1"/>
@@ -3924,7 +3924,7 @@
             <w:noProof/>
             <w:webHidden/>
           </w:rPr>
-          <w:instrText xml:space="preserve"> PAGEREF _Toc241509032 \h </w:instrText>
+          <w:instrText xml:space="preserve"> PAGEREF _Toc241661055 \h </w:instrText>
         </w:r>
         <w:r>
           <w:rPr>
@@ -3973,7 +3973,7 @@
           <w14:ligatures w14:val="standardContextual"/>
         </w:rPr>
       </w:pPr>
-      <w:hyperlink w:anchor="_Toc241509033" w:history="1">
+      <w:hyperlink w:anchor="_Toc241661056" w:history="1">
         <w:r>
           <w:rPr>
             <w:rStyle w:val="aff1"/>
@@ -4000,7 +4000,7 @@
             <w:noProof/>
             <w:webHidden/>
           </w:rPr>
-          <w:instrText xml:space="preserve"> PAGEREF _Toc241509033 \h </w:instrText>
+          <w:instrText xml:space="preserve"> PAGEREF _Toc241661056 \h </w:instrText>
         </w:r>
         <w:r>
           <w:rPr>
@@ -4049,7 +4049,7 @@
           <w14:ligatures w14:val="standardContextual"/>
         </w:rPr>
       </w:pPr>
-      <w:hyperlink w:anchor="_Toc241509034" w:history="1">
+      <w:hyperlink w:anchor="_Toc241661057" w:history="1">
         <w:r>
           <w:rPr>
             <w:rStyle w:val="aff1"/>
@@ -4076,7 +4076,7 @@
             <w:noProof/>
             <w:webHidden/>
           </w:rPr>
-          <w:instrText xml:space="preserve"> PAGEREF _Toc241509034 \h </w:instrText>
+          <w:instrText xml:space="preserve"> PAGEREF _Toc241661057 \h </w:instrText>
         </w:r>
         <w:r>
           <w:rPr>
@@ -4096,7 +4096,7 @@
             <w:noProof/>
             <w:webHidden/>
           </w:rPr>
-          <w:t>25</w:t>
+          <w:t>26</w:t>
         </w:r>
         <w:r>
           <w:rPr>
@@ -4125,7 +4125,7 @@
           <w14:ligatures w14:val="standardContextual"/>
         </w:rPr>
       </w:pPr>
-      <w:hyperlink w:anchor="_Toc241509035" w:history="1">
+      <w:hyperlink w:anchor="_Toc241661058" w:history="1">
         <w:r>
           <w:rPr>
             <w:rStyle w:val="aff1"/>
@@ -4152,7 +4152,7 @@
             <w:noProof/>
             <w:webHidden/>
           </w:rPr>
-          <w:instrText xml:space="preserve"> PAGEREF _Toc241509035 \h </w:instrText>
+          <w:instrText xml:space="preserve"> PAGEREF _Toc241661058 \h </w:instrText>
         </w:r>
         <w:r>
           <w:rPr>
@@ -4201,7 +4201,7 @@
           <w14:ligatures w14:val="standardContextual"/>
         </w:rPr>
       </w:pPr>
-      <w:hyperlink w:anchor="_Toc241509036" w:history="1">
+      <w:hyperlink w:anchor="_Toc241661059" w:history="1">
         <w:r>
           <w:rPr>
             <w:rStyle w:val="aff1"/>
@@ -4228,7 +4228,7 @@
             <w:noProof/>
             <w:webHidden/>
           </w:rPr>
-          <w:instrText xml:space="preserve"> PAGEREF _Toc241509036 \h </w:instrText>
+          <w:instrText xml:space="preserve"> PAGEREF _Toc241661059 \h </w:instrText>
         </w:r>
         <w:r>
           <w:rPr>
@@ -4248,7 +4248,7 @@
             <w:noProof/>
             <w:webHidden/>
           </w:rPr>
-          <w:t>27</w:t>
+          <w:t>28</w:t>
         </w:r>
         <w:r>
           <w:rPr>
@@ -4277,7 +4277,7 @@
           <w14:ligatures w14:val="standardContextual"/>
         </w:rPr>
       </w:pPr>
-      <w:hyperlink w:anchor="_Toc241509037" w:history="1">
+      <w:hyperlink w:anchor="_Toc241661060" w:history="1">
         <w:r>
           <w:rPr>
             <w:rStyle w:val="aff1"/>
@@ -4304,7 +4304,7 @@
             <w:noProof/>
             <w:webHidden/>
           </w:rPr>
-          <w:instrText xml:space="preserve"> PAGEREF _Toc241509037 \h </w:instrText>
+          <w:instrText xml:space="preserve"> PAGEREF _Toc241661060 \h </w:instrText>
         </w:r>
         <w:r>
           <w:rPr>
@@ -4324,7 +4324,7 @@
             <w:noProof/>
             <w:webHidden/>
           </w:rPr>
-          <w:t>28</w:t>
+          <w:t>29</w:t>
         </w:r>
         <w:r>
           <w:rPr>
@@ -4353,7 +4353,7 @@
           <w14:ligatures w14:val="standardContextual"/>
         </w:rPr>
       </w:pPr>
-      <w:hyperlink w:anchor="_Toc241509038" w:history="1">
+      <w:hyperlink w:anchor="_Toc241661061" w:history="1">
         <w:r>
           <w:rPr>
             <w:rStyle w:val="aff1"/>
@@ -4380,7 +4380,7 @@
             <w:noProof/>
             <w:webHidden/>
           </w:rPr>
-          <w:instrText xml:space="preserve"> PAGEREF _Toc241509038 \h </w:instrText>
+          <w:instrText xml:space="preserve"> PAGEREF _Toc241661061 \h </w:instrText>
         </w:r>
         <w:r>
           <w:rPr>
@@ -4400,7 +4400,7 @@
             <w:noProof/>
             <w:webHidden/>
           </w:rPr>
-          <w:t>29</w:t>
+          <w:t>30</w:t>
         </w:r>
         <w:r>
           <w:rPr>
@@ -4429,7 +4429,7 @@
           <w14:ligatures w14:val="standardContextual"/>
         </w:rPr>
       </w:pPr>
-      <w:hyperlink w:anchor="_Toc241509039" w:history="1">
+      <w:hyperlink w:anchor="_Toc241661062" w:history="1">
         <w:r>
           <w:rPr>
             <w:rStyle w:val="aff1"/>
@@ -4456,7 +4456,7 @@
             <w:noProof/>
             <w:webHidden/>
           </w:rPr>
-          <w:instrText xml:space="preserve"> PAGEREF _Toc241509039 \h </w:instrText>
+          <w:instrText xml:space="preserve"> PAGEREF _Toc241661062 \h </w:instrText>
         </w:r>
         <w:r>
           <w:rPr>
@@ -4476,7 +4476,7 @@
             <w:noProof/>
             <w:webHidden/>
           </w:rPr>
-          <w:t>31</w:t>
+          <w:t>32</w:t>
         </w:r>
         <w:r>
           <w:rPr>
@@ -4505,7 +4505,7 @@
           <w14:ligatures w14:val="standardContextual"/>
         </w:rPr>
       </w:pPr>
-      <w:hyperlink w:anchor="_Toc241509040" w:history="1">
+      <w:hyperlink w:anchor="_Toc241661063" w:history="1">
         <w:r>
           <w:rPr>
             <w:rStyle w:val="aff1"/>
@@ -4532,7 +4532,7 @@
             <w:noProof/>
             <w:webHidden/>
           </w:rPr>
-          <w:instrText xml:space="preserve"> PAGEREF _Toc241509040 \h </w:instrText>
+          <w:instrText xml:space="preserve"> PAGEREF _Toc241661063 \h </w:instrText>
         </w:r>
         <w:r>
           <w:rPr>
@@ -4552,7 +4552,7 @@
             <w:noProof/>
             <w:webHidden/>
           </w:rPr>
-          <w:t>31</w:t>
+          <w:t>32</w:t>
         </w:r>
         <w:r>
           <w:rPr>
@@ -4581,7 +4581,7 @@
           <w14:ligatures w14:val="standardContextual"/>
         </w:rPr>
       </w:pPr>
-      <w:hyperlink w:anchor="_Toc241509041" w:history="1">
+      <w:hyperlink w:anchor="_Toc241661064" w:history="1">
         <w:r>
           <w:rPr>
             <w:rStyle w:val="aff1"/>
@@ -4608,7 +4608,7 @@
             <w:noProof/>
             <w:webHidden/>
           </w:rPr>
-          <w:instrText xml:space="preserve"> PAGEREF _Toc241509041 \h </w:instrText>
+          <w:instrText xml:space="preserve"> PAGEREF _Toc241661064 \h </w:instrText>
         </w:r>
         <w:r>
           <w:rPr>
@@ -4628,7 +4628,7 @@
             <w:noProof/>
             <w:webHidden/>
           </w:rPr>
-          <w:t>32</w:t>
+          <w:t>33</w:t>
         </w:r>
         <w:r>
           <w:rPr>
@@ -4656,7 +4656,7 @@
           <w14:ligatures w14:val="standardContextual"/>
         </w:rPr>
       </w:pPr>
-      <w:hyperlink w:anchor="_Toc241509042" w:history="1">
+      <w:hyperlink w:anchor="_Toc241661065" w:history="1">
         <w:r>
           <w:rPr>
             <w:rStyle w:val="aff1"/>
@@ -4683,7 +4683,7 @@
             <w:noProof/>
             <w:webHidden/>
           </w:rPr>
-          <w:instrText xml:space="preserve"> PAGEREF _Toc241509042 \h </w:instrText>
+          <w:instrText xml:space="preserve"> PAGEREF _Toc241661065 \h </w:instrText>
         </w:r>
         <w:r>
           <w:rPr>
@@ -4703,7 +4703,7 @@
             <w:noProof/>
             <w:webHidden/>
           </w:rPr>
-          <w:t>33</w:t>
+          <w:t>34</w:t>
         </w:r>
         <w:r>
           <w:rPr>
@@ -4732,7 +4732,7 @@
           <w14:ligatures w14:val="standardContextual"/>
         </w:rPr>
       </w:pPr>
-      <w:hyperlink w:anchor="_Toc241509043" w:history="1">
+      <w:hyperlink w:anchor="_Toc241661066" w:history="1">
         <w:r>
           <w:rPr>
             <w:rStyle w:val="aff1"/>
@@ -4759,7 +4759,7 @@
             <w:noProof/>
             <w:webHidden/>
           </w:rPr>
-          <w:instrText xml:space="preserve"> PAGEREF _Toc241509043 \h </w:instrText>
+          <w:instrText xml:space="preserve"> PAGEREF _Toc241661066 \h </w:instrText>
         </w:r>
         <w:r>
           <w:rPr>
@@ -4779,7 +4779,7 @@
             <w:noProof/>
             <w:webHidden/>
           </w:rPr>
-          <w:t>33</w:t>
+          <w:t>34</w:t>
         </w:r>
         <w:r>
           <w:rPr>
@@ -4808,7 +4808,7 @@
           <w14:ligatures w14:val="standardContextual"/>
         </w:rPr>
       </w:pPr>
-      <w:hyperlink w:anchor="_Toc241509044" w:history="1">
+      <w:hyperlink w:anchor="_Toc241661067" w:history="1">
         <w:r>
           <w:rPr>
             <w:rStyle w:val="aff1"/>
@@ -4835,7 +4835,7 @@
             <w:noProof/>
             <w:webHidden/>
           </w:rPr>
-          <w:instrText xml:space="preserve"> PAGEREF _Toc241509044 \h </w:instrText>
+          <w:instrText xml:space="preserve"> PAGEREF _Toc241661067 \h </w:instrText>
         </w:r>
         <w:r>
           <w:rPr>
@@ -4855,7 +4855,7 @@
             <w:noProof/>
             <w:webHidden/>
           </w:rPr>
-          <w:t>33</w:t>
+          <w:t>34</w:t>
         </w:r>
         <w:r>
           <w:rPr>
@@ -4884,7 +4884,7 @@
           <w14:ligatures w14:val="standardContextual"/>
         </w:rPr>
       </w:pPr>
-      <w:hyperlink w:anchor="_Toc241509045" w:history="1">
+      <w:hyperlink w:anchor="_Toc241661068" w:history="1">
         <w:r>
           <w:rPr>
             <w:rStyle w:val="aff1"/>
@@ -4911,7 +4911,7 @@
             <w:noProof/>
             <w:webHidden/>
           </w:rPr>
-          <w:instrText xml:space="preserve"> PAGEREF _Toc241509045 \h </w:instrText>
+          <w:instrText xml:space="preserve"> PAGEREF _Toc241661068 \h </w:instrText>
         </w:r>
         <w:r>
           <w:rPr>
@@ -4931,7 +4931,7 @@
             <w:noProof/>
             <w:webHidden/>
           </w:rPr>
-          <w:t>33</w:t>
+          <w:t>34</w:t>
         </w:r>
         <w:r>
           <w:rPr>
@@ -4960,7 +4960,7 @@
           <w14:ligatures w14:val="standardContextual"/>
         </w:rPr>
       </w:pPr>
-      <w:hyperlink w:anchor="_Toc241509046" w:history="1">
+      <w:hyperlink w:anchor="_Toc241661069" w:history="1">
         <w:r>
           <w:rPr>
             <w:rStyle w:val="aff1"/>
@@ -4987,7 +4987,7 @@
             <w:noProof/>
             <w:webHidden/>
           </w:rPr>
-          <w:instrText xml:space="preserve"> PAGEREF _Toc241509046 \h </w:instrText>
+          <w:instrText xml:space="preserve"> PAGEREF _Toc241661069 \h </w:instrText>
         </w:r>
         <w:r>
           <w:rPr>
@@ -5007,7 +5007,7 @@
             <w:noProof/>
             <w:webHidden/>
           </w:rPr>
-          <w:t>34</w:t>
+          <w:t>35</w:t>
         </w:r>
         <w:r>
           <w:rPr>
@@ -5036,7 +5036,7 @@
           <w14:ligatures w14:val="standardContextual"/>
         </w:rPr>
       </w:pPr>
-      <w:hyperlink w:anchor="_Toc241509047" w:history="1">
+      <w:hyperlink w:anchor="_Toc241661070" w:history="1">
         <w:r>
           <w:rPr>
             <w:rStyle w:val="aff1"/>
@@ -5063,7 +5063,7 @@
             <w:noProof/>
             <w:webHidden/>
           </w:rPr>
-          <w:instrText xml:space="preserve"> PAGEREF _Toc241509047 \h </w:instrText>
+          <w:instrText xml:space="preserve"> PAGEREF _Toc241661070 \h </w:instrText>
         </w:r>
         <w:r>
           <w:rPr>
@@ -5083,7 +5083,7 @@
             <w:noProof/>
             <w:webHidden/>
           </w:rPr>
-          <w:t>34</w:t>
+          <w:t>35</w:t>
         </w:r>
         <w:r>
           <w:rPr>
@@ -5112,7 +5112,7 @@
           <w14:ligatures w14:val="standardContextual"/>
         </w:rPr>
       </w:pPr>
-      <w:hyperlink w:anchor="_Toc241509048" w:history="1">
+      <w:hyperlink w:anchor="_Toc241661071" w:history="1">
         <w:r>
           <w:rPr>
             <w:rStyle w:val="aff1"/>
@@ -5139,7 +5139,7 @@
             <w:noProof/>
             <w:webHidden/>
           </w:rPr>
-          <w:instrText xml:space="preserve"> PAGEREF _Toc241509048 \h </w:instrText>
+          <w:instrText xml:space="preserve"> PAGEREF _Toc241661071 \h </w:instrText>
         </w:r>
         <w:r>
           <w:rPr>
@@ -5159,7 +5159,7 @@
             <w:noProof/>
             <w:webHidden/>
           </w:rPr>
-          <w:t>35</w:t>
+          <w:t>36</w:t>
         </w:r>
         <w:r>
           <w:rPr>
@@ -5188,7 +5188,7 @@
           <w14:ligatures w14:val="standardContextual"/>
         </w:rPr>
       </w:pPr>
-      <w:hyperlink w:anchor="_Toc241509049" w:history="1">
+      <w:hyperlink w:anchor="_Toc241661072" w:history="1">
         <w:r>
           <w:rPr>
             <w:rStyle w:val="aff1"/>
@@ -5215,7 +5215,7 @@
             <w:noProof/>
             <w:webHidden/>
           </w:rPr>
-          <w:instrText xml:space="preserve"> PAGEREF _Toc241509049 \h </w:instrText>
+          <w:instrText xml:space="preserve"> PAGEREF _Toc241661072 \h </w:instrText>
         </w:r>
         <w:r>
           <w:rPr>
@@ -5235,7 +5235,7 @@
             <w:noProof/>
             <w:webHidden/>
           </w:rPr>
-          <w:t>35</w:t>
+          <w:t>36</w:t>
         </w:r>
         <w:r>
           <w:rPr>
@@ -5263,7 +5263,7 @@
           <w14:ligatures w14:val="standardContextual"/>
         </w:rPr>
       </w:pPr>
-      <w:hyperlink w:anchor="_Toc241509050" w:history="1">
+      <w:hyperlink w:anchor="_Toc241661073" w:history="1">
         <w:r>
           <w:rPr>
             <w:rStyle w:val="aff1"/>
@@ -5290,7 +5290,7 @@
             <w:noProof/>
             <w:webHidden/>
           </w:rPr>
-          <w:instrText xml:space="preserve"> PAGEREF _Toc241509050 \h </w:instrText>
+          <w:instrText xml:space="preserve"> PAGEREF _Toc241661073 \h </w:instrText>
         </w:r>
         <w:r>
           <w:rPr>
@@ -5310,7 +5310,7 @@
             <w:noProof/>
             <w:webHidden/>
           </w:rPr>
-          <w:t>36</w:t>
+          <w:t>37</w:t>
         </w:r>
         <w:r>
           <w:rPr>
@@ -5338,7 +5338,7 @@
           <w14:ligatures w14:val="standardContextual"/>
         </w:rPr>
       </w:pPr>
-      <w:hyperlink w:anchor="_Toc241509051" w:history="1">
+      <w:hyperlink w:anchor="_Toc241661074" w:history="1">
         <w:r>
           <w:rPr>
             <w:rStyle w:val="aff1"/>
@@ -5365,7 +5365,7 @@
             <w:noProof/>
             <w:webHidden/>
           </w:rPr>
-          <w:instrText xml:space="preserve"> PAGEREF _Toc241509051 \h </w:instrText>
+          <w:instrText xml:space="preserve"> PAGEREF _Toc241661074 \h </w:instrText>
         </w:r>
         <w:r>
           <w:rPr>
@@ -5385,7 +5385,7 @@
             <w:noProof/>
             <w:webHidden/>
           </w:rPr>
-          <w:t>36</w:t>
+          <w:t>37</w:t>
         </w:r>
         <w:r>
           <w:rPr>
@@ -5413,7 +5413,7 @@
           <w14:ligatures w14:val="standardContextual"/>
         </w:rPr>
       </w:pPr>
-      <w:hyperlink w:anchor="_Toc241509052" w:history="1">
+      <w:hyperlink w:anchor="_Toc241661075" w:history="1">
         <w:r>
           <w:rPr>
             <w:rStyle w:val="aff1"/>
@@ -5440,7 +5440,7 @@
             <w:noProof/>
             <w:webHidden/>
           </w:rPr>
-          <w:instrText xml:space="preserve"> PAGEREF _Toc241509052 \h </w:instrText>
+          <w:instrText xml:space="preserve"> PAGEREF _Toc241661075 \h </w:instrText>
         </w:r>
         <w:r>
           <w:rPr>
@@ -5460,7 +5460,7 @@
             <w:noProof/>
             <w:webHidden/>
           </w:rPr>
-          <w:t>37</w:t>
+          <w:t>38</w:t>
         </w:r>
         <w:r>
           <w:rPr>
@@ -5490,7 +5490,7 @@
           <w:numId w:val="7"/>
         </w:numPr>
       </w:pPr>
-      <w:bookmarkStart w:id="0" w:name="_Toc241508988"/>
+      <w:bookmarkStart w:id="0" w:name="_Toc241661011"/>
       <w:r>
         <w:lastRenderedPageBreak/>
         <w:t>게임</w:t>
@@ -5523,7 +5523,7 @@
           <w:numId w:val="7"/>
         </w:numPr>
       </w:pPr>
-      <w:bookmarkStart w:id="1" w:name="_Toc241508989"/>
+      <w:bookmarkStart w:id="1" w:name="_Toc241661012"/>
       <w:r>
         <w:t>Executive Summary</w:t>
       </w:r>
@@ -5594,7 +5594,7 @@
           <w:numId w:val="7"/>
         </w:numPr>
       </w:pPr>
-      <w:bookmarkStart w:id="2" w:name="_Toc241508990"/>
+      <w:bookmarkStart w:id="2" w:name="_Toc241661013"/>
       <w:r>
         <w:t>Rev 16 Release Profile</w:t>
       </w:r>
@@ -5618,7 +5618,7 @@
           <w:numId w:val="7"/>
         </w:numPr>
       </w:pPr>
-      <w:bookmarkStart w:id="3" w:name="_Toc241508991"/>
+      <w:bookmarkStart w:id="3" w:name="_Toc241661014"/>
       <w:r>
         <w:t>제품</w:t>
       </w:r>
@@ -5908,7 +5908,7 @@
           <w:numId w:val="7"/>
         </w:numPr>
       </w:pPr>
-      <w:bookmarkStart w:id="4" w:name="_Toc241508992"/>
+      <w:bookmarkStart w:id="4" w:name="_Toc241661015"/>
       <w:r>
         <w:t>디자인</w:t>
       </w:r>
@@ -6278,7 +6278,7 @@
           <w:numId w:val="7"/>
         </w:numPr>
       </w:pPr>
-      <w:bookmarkStart w:id="5" w:name="_Toc241508993"/>
+      <w:bookmarkStart w:id="5" w:name="_Toc241661016"/>
       <w:r>
         <w:t>Target Experience</w:t>
       </w:r>
@@ -6352,7 +6352,7 @@
           <w:numId w:val="7"/>
         </w:numPr>
       </w:pPr>
-      <w:bookmarkStart w:id="6" w:name="_Toc241508994"/>
+      <w:bookmarkStart w:id="6" w:name="_Toc241661017"/>
       <w:r>
         <w:t>명시적</w:t>
       </w:r>
@@ -6624,7 +6624,7 @@
           <w:numId w:val="7"/>
         </w:numPr>
       </w:pPr>
-      <w:bookmarkStart w:id="7" w:name="_Toc241508995"/>
+      <w:bookmarkStart w:id="7" w:name="_Toc241661018"/>
       <w:r>
         <w:lastRenderedPageBreak/>
         <w:t>Contract Run</w:t>
@@ -6660,7 +6660,7 @@
           <w:numId w:val="7"/>
         </w:numPr>
       </w:pPr>
-      <w:bookmarkStart w:id="8" w:name="_Toc241508996"/>
+      <w:bookmarkStart w:id="8" w:name="_Toc241661019"/>
       <w:r>
         <w:t>Core Loop</w:t>
       </w:r>
@@ -7154,7 +7154,7 @@
           <w:numId w:val="7"/>
         </w:numPr>
       </w:pPr>
-      <w:bookmarkStart w:id="9" w:name="_Toc241508997"/>
+      <w:bookmarkStart w:id="9" w:name="_Toc241661020"/>
       <w:r>
         <w:t xml:space="preserve">Contract </w:t>
       </w:r>
@@ -7578,7 +7578,7 @@
           <w:numId w:val="7"/>
         </w:numPr>
       </w:pPr>
-      <w:bookmarkStart w:id="10" w:name="_Toc241508998"/>
+      <w:bookmarkStart w:id="10" w:name="_Toc241661021"/>
       <w:r>
         <w:lastRenderedPageBreak/>
         <w:t>성공</w:t>
@@ -7870,7 +7870,7 @@
           <w:numId w:val="7"/>
         </w:numPr>
       </w:pPr>
-      <w:bookmarkStart w:id="11" w:name="_Toc241508999"/>
+      <w:bookmarkStart w:id="11" w:name="_Toc241661022"/>
       <w:r>
         <w:t>Greed Decision</w:t>
       </w:r>
@@ -8239,7 +8239,7 @@
           <w:numId w:val="7"/>
         </w:numPr>
       </w:pPr>
-      <w:bookmarkStart w:id="12" w:name="_Toc241509000"/>
+      <w:bookmarkStart w:id="12" w:name="_Toc241661023"/>
       <w:r>
         <w:t>15~25</w:t>
       </w:r>
@@ -8609,7 +8609,7 @@
           <w:numId w:val="7"/>
         </w:numPr>
       </w:pPr>
-      <w:bookmarkStart w:id="13" w:name="_Toc241509001"/>
+      <w:bookmarkStart w:id="13" w:name="_Toc241661024"/>
       <w:r>
         <w:lastRenderedPageBreak/>
         <w:t>위조와</w:t>
@@ -8636,7 +8636,7 @@
           <w:numId w:val="7"/>
         </w:numPr>
       </w:pPr>
-      <w:bookmarkStart w:id="14" w:name="_Toc241509002"/>
+      <w:bookmarkStart w:id="14" w:name="_Toc241661025"/>
       <w:r>
         <w:t>Artifact</w:t>
       </w:r>
@@ -8926,7 +8926,7 @@
     </w:p>
     <w:p>
       <w:r>
-        <w:t>M01/M02는 탈취 가능한 20점, M03은 12점 외에 상호작용하지 않는 일반 전시물을 함께 배치한다. 일반 전시물은 단독·연작·다단 군집으로 전시실을 구성하고 탈취 대상과 같거나 더 큰 작품도 포함한다. 탈취 가능한 작품은 두꺼운 프레임과 하단 보안 패널로 접근 전에 구별한다. 작품 크기, 중앙 위치 또는 양옆의 일반 작품 수가 정답을 드러내는 고정 패턴을 사용하지 않는다. 근거리 행동 안내는 탈취 대상에만 표시하며, 필수 작품은 기존 계약 단서와 발견 표시를 따른다. 전시 그림과 프레임은 기존 배치도 대비 1.5배 크기로 확대하며 군집의 간격과 설치 높이를 함께 조정한다. 탈취 작품의 행동 영역은 작품 정면의 근거리로 한정한다. 벽 하단 걸레받이와 상단 몰딩은 벽 두께의 1.15배로 돌출시켜 표면 겹침을 없앤다.</w:t>
+        <w:t>M01·M02·M03은 각각 탈취 가능한 작품 12점과 상호작용하지 않는 일반 전시물 48점, 총 60점을 배치한다. 일반 전시물은 단독·연작·다단 군집으로 전시실을 구성하고 탈취 대상과 같거나 더 큰 작품도 포함한다. 탈취 가능한 작품은 기존 프레임과 하단 보안 패널(바닥에 가까운 큰 액자는 낮은 측면 패널)로 접근 전에 구별한다. 작품 크기, 중앙 위치 또는 양옆의 일반 작품 수가 정답을 드러내는 고정 패턴을 사용하지 않는다. 근거리 행동 안내는 탈취 대상에만 표시하며, 필수 작품은 기존 계약 단서와 발견 표시를 따른다. 그림 크기는 현재 승인된 배치를 기준으로 유지한다. 과거의 1.5배·3배 확대를 반복 적용하지 않는다. 탈취 작품의 행동 영역은 작품 정면의 근거리로 한정한다. 벽 하단 걸레받이와 상단 몰딩은 벽에서 조금 돌출시키되 배율 작성 규칙과 표면 겹침 검사를 따른다.</w:t>
       </w:r>
     </w:p>
     <w:p>
@@ -8937,7 +8937,7 @@
           <w:numId w:val="7"/>
         </w:numPr>
       </w:pPr>
-      <w:bookmarkStart w:id="15" w:name="_Toc241509003"/>
+      <w:bookmarkStart w:id="15" w:name="_Toc241661026"/>
       <w:r>
         <w:lastRenderedPageBreak/>
         <w:t xml:space="preserve">Surface Forgery </w:t>
@@ -9119,7 +9119,7 @@
           <w:numId w:val="7"/>
         </w:numPr>
       </w:pPr>
-      <w:bookmarkStart w:id="16" w:name="_Toc241509004"/>
+      <w:bookmarkStart w:id="16" w:name="_Toc241661027"/>
       <w:r>
         <w:lastRenderedPageBreak/>
         <w:t>Object Assembly — Deferred Expansion</w:t>
@@ -9187,7 +9187,7 @@
           <w:numId w:val="7"/>
         </w:numPr>
       </w:pPr>
-      <w:bookmarkStart w:id="17" w:name="_Toc241509005"/>
+      <w:bookmarkStart w:id="17" w:name="_Toc241661028"/>
       <w:r>
         <w:t>Quality</w:t>
       </w:r>
@@ -9476,7 +9476,7 @@
           <w:numId w:val="7"/>
         </w:numPr>
       </w:pPr>
-      <w:bookmarkStart w:id="18" w:name="_Toc241509006"/>
+      <w:bookmarkStart w:id="18" w:name="_Toc241661029"/>
       <w:r>
         <w:lastRenderedPageBreak/>
         <w:t>핵심</w:t>
@@ -9978,7 +9978,7 @@
           <w:numId w:val="7"/>
         </w:numPr>
       </w:pPr>
-      <w:bookmarkStart w:id="19" w:name="_Toc241509007"/>
+      <w:bookmarkStart w:id="19" w:name="_Toc241661030"/>
       <w:r>
         <w:t xml:space="preserve">Owner-only Forgery </w:t>
       </w:r>
@@ -10225,7 +10225,7 @@
           <w:numId w:val="7"/>
         </w:numPr>
       </w:pPr>
-      <w:bookmarkStart w:id="20" w:name="_Toc241509008"/>
+      <w:bookmarkStart w:id="20" w:name="_Toc241661031"/>
       <w:r>
         <w:lastRenderedPageBreak/>
         <w:t>잠입</w:t>
@@ -10258,7 +10258,7 @@
           <w:numId w:val="7"/>
         </w:numPr>
       </w:pPr>
-      <w:bookmarkStart w:id="21" w:name="_Toc241509009"/>
+      <w:bookmarkStart w:id="21" w:name="_Toc241661032"/>
       <w:r>
         <w:t xml:space="preserve">First-Person </w:t>
       </w:r>
@@ -10328,7 +10328,7 @@
           <w:numId w:val="7"/>
         </w:numPr>
       </w:pPr>
-      <w:bookmarkStart w:id="22" w:name="_Toc241509010"/>
+      <w:bookmarkStart w:id="22" w:name="_Toc241661033"/>
       <w:r>
         <w:t>Walk, Sprint, Weight, Footstep</w:t>
       </w:r>
@@ -10671,7 +10671,7 @@
           <w:numId w:val="7"/>
         </w:numPr>
       </w:pPr>
-      <w:bookmarkStart w:id="23" w:name="_Toc241509011"/>
+      <w:bookmarkStart w:id="23" w:name="_Toc241661034"/>
       <w:r>
         <w:t>Patrol Guard</w:t>
       </w:r>
@@ -10725,6 +10725,11 @@
       <w:r>
         <w:lastRenderedPageBreak/>
         <w:t>경계도는 서버가 확정하는 0.0~10.0 수치이며 0.5 단위로만 변한다. 시간 경과만으로 자동 상승하지 않고, 10.0에 도달하면 즉시 Lockdown으로 전환한다. Guard에게 붙잡히면 +1.0, CCTV 완전 발각과 활성 Laser 접촉은 각각 +0.5다.</w:t>
+      </w:r>
+    </w:p>
+    <w:p>
+      <w:r>
+        <w:t>경비는 상체 앞쪽에서 진행 방향을 비추는 손전등을 항상 켜고 순찰한다. 플레이어보다 밝은 빛으로 경비의 존재와 방향을 읽을 수 있게 하되 실제 감지 범위는 기존 경비 시야 규칙을 유지한다.</w:t>
       </w:r>
     </w:p>
     <w:tbl>
@@ -11022,7 +11027,7 @@
           <w:numId w:val="7"/>
         </w:numPr>
       </w:pPr>
-      <w:bookmarkStart w:id="24" w:name="_Toc241509012"/>
+      <w:bookmarkStart w:id="24" w:name="_Toc241661035"/>
       <w:r>
         <w:t>CCTV</w:t>
       </w:r>
@@ -11273,7 +11278,7 @@
           <w:numId w:val="7"/>
         </w:numPr>
       </w:pPr>
-      <w:bookmarkStart w:id="25" w:name="_Toc241509013"/>
+      <w:bookmarkStart w:id="25" w:name="_Toc241661036"/>
       <w:r>
         <w:t>Stun, Arrest, Recovery</w:t>
       </w:r>
@@ -11347,7 +11352,7 @@
           <w:numId w:val="7"/>
         </w:numPr>
       </w:pPr>
-      <w:bookmarkStart w:id="26" w:name="_Toc241509014"/>
+      <w:bookmarkStart w:id="26" w:name="_Toc241661037"/>
       <w:r>
         <w:t>두</w:t>
       </w:r>
@@ -11824,7 +11829,7 @@
           <w:numId w:val="7"/>
         </w:numPr>
       </w:pPr>
-      <w:bookmarkStart w:id="27" w:name="_Toc241509015"/>
+      <w:bookmarkStart w:id="27" w:name="_Toc241661038"/>
       <w:r>
         <w:lastRenderedPageBreak/>
         <w:t>협동</w:t>
@@ -11851,7 +11856,7 @@
           <w:numId w:val="7"/>
         </w:numPr>
       </w:pPr>
-      <w:bookmarkStart w:id="28" w:name="_Toc241509016"/>
+      <w:bookmarkStart w:id="28" w:name="_Toc241661039"/>
       <w:r>
         <w:t>Role Switching</w:t>
       </w:r>
@@ -12259,7 +12264,7 @@
           <w:numId w:val="7"/>
         </w:numPr>
       </w:pPr>
-      <w:bookmarkStart w:id="29" w:name="_Toc241509017"/>
+      <w:bookmarkStart w:id="29" w:name="_Toc241661040"/>
       <w:r>
         <w:t>거리</w:t>
       </w:r>
@@ -12318,7 +12323,7 @@
           <w:numId w:val="7"/>
         </w:numPr>
       </w:pPr>
-      <w:bookmarkStart w:id="30" w:name="_Toc241509018"/>
+      <w:bookmarkStart w:id="30" w:name="_Toc241661041"/>
       <w:r>
         <w:t>Inventory, Loose Loot, Coin</w:t>
       </w:r>
@@ -12381,7 +12386,7 @@
           <w:numId w:val="7"/>
         </w:numPr>
       </w:pPr>
-      <w:bookmarkStart w:id="31" w:name="_Toc241509019"/>
+      <w:bookmarkStart w:id="31" w:name="_Toc241661042"/>
       <w:r>
         <w:t>Player Identity</w:t>
       </w:r>
@@ -12804,7 +12809,7 @@
           <w:numId w:val="7"/>
         </w:numPr>
       </w:pPr>
-      <w:bookmarkStart w:id="32" w:name="_Toc241509020"/>
+      <w:bookmarkStart w:id="32" w:name="_Toc241661043"/>
       <w:r>
         <w:t xml:space="preserve">Floor Plan Map </w:t>
       </w:r>
@@ -13016,7 +13021,7 @@
           <w:numId w:val="7"/>
         </w:numPr>
       </w:pPr>
-      <w:bookmarkStart w:id="33" w:name="_Toc241509021"/>
+      <w:bookmarkStart w:id="33" w:name="_Toc241661044"/>
       <w:r>
         <w:t>Shared Extraction</w:t>
       </w:r>
@@ -13096,7 +13101,7 @@
           <w:numId w:val="7"/>
         </w:numPr>
       </w:pPr>
-      <w:bookmarkStart w:id="34" w:name="_Toc241509022"/>
+      <w:bookmarkStart w:id="34" w:name="_Toc241661045"/>
       <w:r>
         <w:lastRenderedPageBreak/>
         <w:t xml:space="preserve">UI, </w:t>
@@ -13125,7 +13130,7 @@
           <w:numId w:val="7"/>
         </w:numPr>
       </w:pPr>
-      <w:bookmarkStart w:id="35" w:name="_Toc241509023"/>
+      <w:bookmarkStart w:id="35" w:name="_Toc241661046"/>
       <w:r>
         <w:t>HUD Information Architecture</w:t>
       </w:r>
@@ -13426,7 +13431,7 @@
           <w:numId w:val="7"/>
         </w:numPr>
       </w:pPr>
-      <w:bookmarkStart w:id="36" w:name="_Toc241509024"/>
+      <w:bookmarkStart w:id="36" w:name="_Toc241661047"/>
       <w:r>
         <w:t xml:space="preserve">Main HUD </w:t>
       </w:r>
@@ -13741,7 +13746,7 @@
           <w:numId w:val="7"/>
         </w:numPr>
       </w:pPr>
-      <w:bookmarkStart w:id="37" w:name="_Toc241509025"/>
+      <w:bookmarkStart w:id="37" w:name="_Toc241661048"/>
       <w:r>
         <w:t>최소</w:t>
       </w:r>
@@ -13822,7 +13827,7 @@
           <w:numId w:val="7"/>
         </w:numPr>
       </w:pPr>
-      <w:bookmarkStart w:id="38" w:name="_Toc241509026"/>
+      <w:bookmarkStart w:id="38" w:name="_Toc241661049"/>
       <w:r>
         <w:t xml:space="preserve">Input Mode </w:t>
       </w:r>
@@ -14303,7 +14308,7 @@
           <w:numId w:val="7"/>
         </w:numPr>
       </w:pPr>
-      <w:bookmarkStart w:id="39" w:name="_Toc241509027"/>
+      <w:bookmarkStart w:id="39" w:name="_Toc241661050"/>
       <w:r>
         <w:t>Floor Plan</w:t>
       </w:r>
@@ -14326,7 +14331,7 @@
           <w:numId w:val="7"/>
         </w:numPr>
       </w:pPr>
-      <w:bookmarkStart w:id="40" w:name="_Toc241509028"/>
+      <w:bookmarkStart w:id="40" w:name="_Toc241661051"/>
       <w:r>
         <w:t xml:space="preserve">Floor Plan Map </w:t>
       </w:r>
@@ -14641,7 +14646,7 @@
           <w:numId w:val="7"/>
         </w:numPr>
       </w:pPr>
-      <w:bookmarkStart w:id="41" w:name="_Toc241509029"/>
+      <w:bookmarkStart w:id="41" w:name="_Toc241661052"/>
       <w:r>
         <w:t xml:space="preserve">Team Result / Replica Recap </w:t>
       </w:r>
@@ -15019,7 +15024,7 @@
           <w:numId w:val="7"/>
         </w:numPr>
       </w:pPr>
-      <w:bookmarkStart w:id="42" w:name="_Toc241509030"/>
+      <w:bookmarkStart w:id="42" w:name="_Toc241661053"/>
       <w:r>
         <w:t>첫</w:t>
       </w:r>
@@ -15294,7 +15299,7 @@
           <w:numId w:val="7"/>
         </w:numPr>
       </w:pPr>
-      <w:bookmarkStart w:id="43" w:name="_Toc241509031"/>
+      <w:bookmarkStart w:id="43" w:name="_Toc241661054"/>
       <w:r>
         <w:t>접근성</w:t>
       </w:r>
@@ -15366,7 +15371,7 @@
           <w:numId w:val="7"/>
         </w:numPr>
       </w:pPr>
-      <w:bookmarkStart w:id="44" w:name="_Toc241509032"/>
+      <w:bookmarkStart w:id="44" w:name="_Toc241661055"/>
       <w:r>
         <w:lastRenderedPageBreak/>
         <w:t>레벨</w:t>
@@ -15393,7 +15398,17 @@
     </w:p>
     <w:p>
       <w:r>
-        <w:t>작품과 바닥은 기존 박물관 에셋의 형태와 재질을 활용한다. 작품은 Showcase Canvas 7종을 바탕으로 그림 면만 교체하고, 일반 전시와 훔칠 수 있는 전시의 구분을 유지한다. 바닥은 에디터에서 공용 PCG로 타일을 배치하며, 고정된 방·복도 구조를 유지한 채 타일 종류에만 변화를 준다. 런타임 맵 생성은 포함하지 않는다. 그림은 별도 흰 여백 없이 액자 안을 채우고, 비율을 유지한 채 가장자리를 잘라 맞춘다. 작은 작품도 관람 거리에서 읽히도록 키우되 주변 작품과 간격을 유지한다. 전시 조명은 작품 바로 위 천장에서 작품을 강조하고, 통로 조명은 길을 읽을 수 있는 낮은 밝기로 제한한다. Showcase Droplights 3종은 작품의 폭과 구성에 맞춰 선택하며, Drop Ceiling은 통로에만 사용한다. 종류를 순환하거나 무작위로 섞지 않는다. 야간 대비를 위해 기존 환경 광원의 밝기를 절반으로 낮춘다. 작품의 기존 군집은 유지하되 같은 줄의 중심 높이, 세로 쌓기의 중심축과 액자 사이 여백을 정돈한다. 전등은 종류마다 천장에서 내려오는 길이를 통일해 임의로 크기를 보정한 인상을 없앤다.</w:t>
+        <w:t>세 맵은 현재 승인된 공간 구성과 고유 컨셉을 유지하면서 같은 배치·작품 표시 규칙을 사용한다. 위치는 정수 cm, 배율은 소수점 한 자리로 작성하며 액자는 균등 배율로 종횡비를 보존한다. 배율을 단순하게 보이게 하려고 메시를 복제하거나 크기를 에셋에 구워 넣지 않는다. 세 맵의 액자는 Showcase Canvas 03a·04a·05a를 재사용하고 M03에서 승인한 소형·중형·대형 세 단계 크기를 공통 사용한다. 전시 공간의 천장 유효 높이는 바닥에서 약 8m로 맞추고, 기존 방·복도 구성과 각 맵의 건축 양식은 보존한다. 커진 작품은 벽면 끝·출입구·천장과 다른 작품을 침범하지 않도록 분산하고 작품등도 해당 작품을 비추도록 맞춘다. 작품은 그림 면만 원본과 위조본으로 교체하고 프레임·뒷면은 보존한다. 그림 전체와 종횡비를 보존해 액자 안에 맞추며 남는 영역은 그림의 검정 바탕으로 채운다. 흰 매트, 이미지 늘림과 가장자리 잘림은 사용하지 않는다. 일반 전시는 상호작용하지 않고 탈취 대상은 작은 보안 패널과 근거리 행동 안내로 구별한다.</w:t>
+      </w:r>
+    </w:p>
+    <w:p>
+      <w:r>
+        <w:t>야간 라이팅은 세 맵에 같은 기준을 적용한다. 작품등과 통로등은 4cd, CCTV는 2cd, 약한 환경광은 0.005를 사용한다. 작품등은 작품 전체를 비추고 상호작용 여부로 밝기를 나누지 않는다. Showcase Droplights 3종은 작품의 폭과 구성에 따라 선택하고 Drop Ceiling은 통로에 사용한다. 각 전등은 메시 하나와 스폿라이트 하나로 관리하며 주변 광원을 흡수하거나 타입을 무작위로 순환하지 않는다. 고정 노출과 미세한 암부 보정으로 가까운 벽·바닥·출입구의 윤곽만 남기고 손전등의 필요성을 유지한다. 각 맵의 야간 Directional/Sky, 광원 색감과 건축 분위기는 보존한다. 반복 적용으로 광원을 다시 반감하지 않는다.</w:t>
+      </w:r>
+    </w:p>
+    <w:p>
+      <w:r>
+        <w:t>공용 바닥 PCG는 에디터에서 기존 바닥 범위·높이와 맵 고유 재질을 유지하는 제작 도구로 사용한다. M01은 기존 Showcase 혼합 타일, M02는 기존 목재 마루, M03은 기존 갤러리 콘크리트 타일을 사용한다. 메시 목록·간격·범위·배율과 Seed를 바꿔 재사용하며 같은 Seed에서는 같은 배치가 생성된다. 저장된 바닥 인스턴스를 사용하고 런타임에 바닥이나 방·복도 구조를 무작위 생성하지 않는다. 필요한 에셋 사본은 목적·경로·개수에 대한 별도 승인을 받은 경우에만 만든다. 작품 수, 보안 연결과 원래 배치를 보존한 뒤 바닥 충돌·저장 재로드·실제 야간 화면을 확인한다.</w:t>
       </w:r>
     </w:p>
     <w:p>
@@ -15404,7 +15419,7 @@
           <w:numId w:val="7"/>
         </w:numPr>
       </w:pPr>
-      <w:bookmarkStart w:id="45" w:name="_Toc241509033"/>
+      <w:bookmarkStart w:id="45" w:name="_Toc241661056"/>
       <w:r>
         <w:t>세</w:t>
       </w:r>
@@ -15467,6 +15482,7 @@
         </w:numPr>
       </w:pPr>
       <w:r>
+        <w:lastRenderedPageBreak/>
         <w:t>Required Target Gallery는 계약 시작부터 읽히되 정확한 Case는 발견 전 숨길 수 있다.</w:t>
       </w:r>
     </w:p>
@@ -15491,11 +15507,7 @@
         </w:numPr>
       </w:pPr>
       <w:r>
-        <w:t xml:space="preserve">세 맵은 동일한 Gameplay Rule을 사용하되, Material과 Lighting만이 아니라 Macro Topology, 첫 10초의 정보 공개 방식, Landmark, Target 이후 귀환 경로로 서로 다른 플레이 정체성을 만든다. 야간 침입은 상시 전면 조명 대신 꺼진 구역과 국소 조명의 대비로 표현한다. M01은 따뜻한 전시 잔등, M02는 푸른 중정과 어두운 회랑, M03는 차가운 유리 채광과 서비스 조명을 중심으로 구성한다. 작품 앞과 버튼·출구는 식별 가능하게 유지하며 조명만으로 도난 대상을 알려주지 않는다. 경비실과 구금실은 관람 동선에서 갈라지는 단일 보안 진입부 뒤에 둔다. 폭 1.8m 출입구와 불투명 전실 벽으로 직접 시야를 끊고, CCTV와 내부 순찰을 통과한 뒤 압수품 회수 또는 구금실 구조를 선택한다. 구금실에는 잠긴 철창문으로만 통과할 수 있는 완전한 철제 칸막이와 고정 벤치를 두고, 보안 표지·금속 문틀·차가운 국소등으로 일반 전시실과 경계를 구분한다. 추가 열쇠나 해킹 없이 기존 상호작용으로 구조·회수하며 구조 또는 구속 시간 경과 후 동일 진입부를 통해 탈출을 시도한다. 각 맵의 기존 경비 한 명을 보안 구역과 인접 복도를 순찰하도록 배치한다. 순환 목표는 </w:t>
-      </w:r>
-      <w:r>
-        <w:lastRenderedPageBreak/>
-        <w:t>25~35초이며 철창 앞에서 2~3초 확인한다. 철창 안 구금자는 시야만으로 재체포하지 않으며 작업 실패 소음에는 조사로 반응한다.</w:t>
+        <w:t>세 맵은 동일한 Gameplay Rule을 사용하되, Material과 Lighting만이 아니라 Macro Topology, 첫 10초의 정보 공개 방식, Landmark, Target 이후 귀환 경로로 서로 다른 플레이 정체성을 만든다. 야간 침입은 상시 전면 조명 대신 꺼진 구역과 국소 조명의 대비로 표현한다. M01은 따뜻한 전시 잔등, M02는 푸른 중정과 어두운 회랑, M03는 차가운 유리 채광과 서비스 조명을 중심으로 구성한다. 작품 앞과 버튼·출구는 식별 가능하게 유지하며 조명만으로 도난 대상을 알려주지 않는다. 경비실과 구금실은 관람 동선에서 갈라지는 단일 보안 진입부 뒤에 둔다. 폭 1.8m 출입구와 불투명 전실 벽으로 직접 시야를 끊고, CCTV와 내부 순찰을 통과한 뒤 압수품 회수 또는 구금실 구조를 선택한다. 구금실에는 잠긴 철창문으로만 통과할 수 있는 완전한 철제 칸막이와 고정 벤치를 두고, 보안 표지·금속 문틀·차가운 국소등으로 일반 전시실과 경계를 구분한다. 추가 열쇠나 해킹 없이 기존 상호작용으로 구조·회수하며 구조 또는 구속 시간 경과 후 동일 진입부를 통해 탈출을 시도한다. 각 맵의 기존 경비 한 명을 보안 구역과 인접 복도를 순찰하도록 배치한다. 순환 목표는 25~35초이며 철창 앞에서 2~3초 확인한다. 철창 안 구금자는 시야만으로 재체포하지 않으며 작업 실패 소음에는 조사로 반응한다.</w:t>
       </w:r>
     </w:p>
     <w:p>
@@ -15503,12 +15515,16 @@
         <w:pStyle w:val="a0"/>
       </w:pPr>
       <w:r>
-        <w:t>전시실은 작품 벽과 관람 공간을 함께 설계한다. 승인 평면도 기준 외벽 0.40m, 내벽 0.24m, 일반 연결 문 3~4m, 후면 관리 회랑 약 5.5~5.7m를 사용한다. 작품 앞 작업 공간은 2.2m를 확보하며 활성 작품은 그림 표면에서 정면 0.7m의 근거리 접근점으로 진입할 수 있어야 한다. M01/M02 활성 작품 20점과 일반 작품 M01 51점·M02 53점, M03 활성 작품 12점과 일반 작품 48점과 12종 전시 패턴을 배치한다. 통과 폭과 15~25분 플레이 시간은 실제 멀티플레이로 검증한다. 작품 발견과 다음 전시 구역 진입이 연달아 끝나지 않도록 맵별 바닥 면적을 이전 배치의 약 2배로 확장한다. 해당 맵의 활성 작품과 일반 작품 수, 군집 내부 간격, 액자·문·상호작용 영역 크기와 위조 시간은 유지하고 구역 및 군집 사이 이동 거리를 늘린다. 기존 엇갈린 출입구와 차폐벽을 유지하며 탐색·위험 판단·귀환에 드는 시간을 함께 평가한다. 면적 증가를 15~25분 플레이 시간 달성으로 간주하지 않고 실제 경로와 플레이 테스트로 검증한다. 초반 전시실과 필수 작품 전시실에는 높이 3.2m의 벽 연결형 차폐벽을 총 7개 배치해 한 자리에서 여러 작품을 연속 확인하는 시야를 나누고, 벽 끝의 열린 통로로 우회하도록 한다.</w:t>
+        <w:t>전시실은 작품 벽과 관람 공간을 함께 설계한다. 승인 평면도 기준 외벽 0.40m, 내벽 0.24m, 일반 연결 문 3~4m, 후면 관리 회랑 약 5.5~5.7m를 사용한다. 작품 앞 작업 공간은 2.2m를 확보하며 활성 작품은 그림 표면에서 정면 0.7m의 근거리 접근점으로 진입할 수 있어야 한다. 세 맵 각각 활성 작품 12점과 일반 작품 48점, 총 60점과 12종 전시 패턴을 배치한다. 통과 폭과 15~25분 플레이 시간은 실제 멀티플레이로 검증한다. 작품 발견과 다음 전시 구역 진입이 연달아 끝나지 않도록 맵별 바닥 면적을 이전 배치의 약 2배로 확장한다. 해당 맵의 활성 작품과 일반 작품 수, 군집 내부 간격, 액자·문·상호작용 영역 크기와 위조 시간은 유지하고 구역 및 군집 사이 이동 거리를 늘린다. 기존 엇갈린 출입구와 차폐벽을 유지하며 탐색·위험 판단·귀환에 드는 시간을 함께 평가한다. 면적 증가를 15~25분 플레이 시간 달성으로 간주하지 않고 실제 경로와 플레이 테스트로 검증한다. 초반 전시실과 필수 작품 전시실에는 높이 3.2m의 벽 연결형 차폐벽을 총 7개 배치해 한 자리에서 여러 작품을 연속 확인하는 시야를 나누고, 벽 끝의 열린 통로로 우회하도록 한다.</w:t>
       </w:r>
     </w:p>
     <w:p>
       <w:r>
-        <w:t>방·복도 구분 개편: M01은 중앙 Rotunda와 굴절 복도, 소전시실과 연속 전시실 묶음을 연결한다. M02는 정원 회랑을 방향 기준으로 유지하고 서측 막다른 전시 묶음·동측 특별전·남측 회귀 루프를 비대칭으로 구성한다. M03은 중앙 전시실의 반복 사거리를 없애고 위·아래로 교대해 꺾이는 복도에서 독립 전시실로 진입한다. 일반 전시실의 출입구는 1~2개를 기본으로 하되 구역 연결실과 보안 전실은 예외로 둔다. 작품 수·액자 크기·위조 시간과 확장된 외곽 크기는 유지한다. 경비 순찰과 귀환 우회로를 재배치하고 실제 경로 검증 후 적용하며, 플레이타임 증가를 보장하는 수치로 취급하지 않는다.</w:t>
+        <w:t xml:space="preserve">방·복도 구분 개편: M01은 중앙 Rotunda와 굴절 복도, 소전시실과 연속 전시실 묶음을 연결한다. M02는 정원 회랑을 방향 기준으로 유지하고 서측 막다른 전시 묶음·동측 특별전·남측 회귀 루프를 비대칭으로 구성한다. M03은 중앙 전시실의 반복 사거리를 없애고 위·아래로 교대해 꺾이는 복도에서 독립 전시실로 진입한다. 일반 전시실의 출입구는 1~2개를 기본으로 하되 구역 연결실과 보안 전실은 </w:t>
+      </w:r>
+      <w:r>
+        <w:lastRenderedPageBreak/>
+        <w:t>예외로 둔다. 작품 수·액자 크기·위조 시간과 확장된 외곽 크기는 유지한다. 경비 순찰과 귀환 우회로를 재배치하고 실제 경로 검증 후 적용하며, 플레이타임 증가를 보장하는 수치로 취급하지 않는다.</w:t>
       </w:r>
     </w:p>
     <w:p>
@@ -15523,7 +15539,7 @@
       <w:pPr>
         <w:pStyle w:val="31"/>
       </w:pPr>
-      <w:bookmarkStart w:id="46" w:name="_Toc241509034"/>
+      <w:bookmarkStart w:id="46" w:name="_Toc241661057"/>
       <w:r>
         <w:t>전시</w:t>
       </w:r>
@@ -15563,7 +15579,6 @@
         <w:pStyle w:val="a0"/>
       </w:pPr>
       <w:r>
-        <w:lastRenderedPageBreak/>
         <w:t>단독 여백형 · 동등한 2점형 · 동일 높이 3점 연작 · 긴 5점 연속형: 여백과 관람 순서, 반복 작품의 비교에 차이를 둔다.</w:t>
       </w:r>
     </w:p>
@@ -15596,7 +15611,7 @@
           <w:numId w:val="7"/>
         </w:numPr>
       </w:pPr>
-      <w:bookmarkStart w:id="47" w:name="_Toc241509035"/>
+      <w:bookmarkStart w:id="47" w:name="_Toc241661058"/>
       <w:r>
         <w:t>맵</w:t>
       </w:r>
@@ -15873,6 +15888,7 @@
               <w:rPr>
                 <w:sz w:val="16"/>
               </w:rPr>
+              <w:lastRenderedPageBreak/>
               <w:t>M02 월야 동양미술관</w:t>
             </w:r>
           </w:p>
@@ -16022,7 +16038,7 @@
           <w:numId w:val="7"/>
         </w:numPr>
       </w:pPr>
-      <w:bookmarkStart w:id="48" w:name="_Toc241509036"/>
+      <w:bookmarkStart w:id="48" w:name="_Toc241661059"/>
       <w:r>
         <w:lastRenderedPageBreak/>
         <w:t xml:space="preserve">M01 — </w:t>
@@ -16336,7 +16352,7 @@
           <w:numId w:val="7"/>
         </w:numPr>
       </w:pPr>
-      <w:bookmarkStart w:id="49" w:name="_Toc241509037"/>
+      <w:bookmarkStart w:id="49" w:name="_Toc241661060"/>
       <w:r>
         <w:lastRenderedPageBreak/>
         <w:t xml:space="preserve">M02 — </w:t>
@@ -16647,7 +16663,7 @@
           <w:numId w:val="7"/>
         </w:numPr>
       </w:pPr>
-      <w:bookmarkStart w:id="50" w:name="_Toc241509038"/>
+      <w:bookmarkStart w:id="50" w:name="_Toc241661061"/>
       <w:r>
         <w:lastRenderedPageBreak/>
         <w:t xml:space="preserve">M03 — </w:t>
@@ -16665,7 +16681,7 @@
     </w:p>
     <w:p>
       <w:r>
-        <w:t>사용자 승인 갤러리 팩 AIUE5_vol10_01의 기존 메시로 약 106×72m 단층 전시관을 구성한다. 35×13m 원본 홀과 상부 트러스·천창, 기존 A·B·C와 경비실·압수품실·구금실을 유지하고 서·동 전시실, 북측 연속 전시실과 직원 회랑, 남측 진입·전시실을 확장한다. 방과 복도는 별도 경계와 엇갈린 출입구로 구분한다. 상호작용 작품 12개와 장식 작품 48개를 분산하고 필수 작품은 북동 전시실, 레이저 보호 작품 두 점은 동측 별도 전시실에 배치한다. 필수 작품에 레이저 협동을 강제하지 않는다. 액자는 소형·중형·대형 정수 균등 스케일 세 단계로 제한하고 대형은 천장 높이가 충분한 곳에 배치한다. 기존 에셋을 여러 Actor가 참조하며 새 메시·파생 에셋을 생성하지 않는다. 약한 환경광과 작품용 국소 조명으로 밤의 공간감을 유지한다. 이 승인안은 앞의 공통 설명에 남은 M03 외곽 크기·액자 크기·옛 방 이름과 동선 수치에 우선한다. 면적이나 경로만으로 목표 플레이 시간을 달성했다고 판단하지 않는다. M03 전시실·통로 천장은 약 8m 기준으로 높이고 중앙 홀 지붕과 트러스를 함께 올린다. 작품등은 액자보다 충분히 높은 천장에 매달아 작품을 가리지 않게 하며, 통로는 어두운 야간 분위기를 유지한다. 작품 조명은 상호작용 여부와 무관하게 전체 구도와 주요 색을 읽을 수 있도록 균일하게 비춘다. 작품마다 담당 조명을 정하고 통로보다 작품을 강조하되 밝기만으로 훔칠 수 있는 작품을 구분하게 만들지 않는다. M03의 야간 보정은 환경광·작품등·통로등을 기존 균일화 기준의 절반으로 유지하고 CCTV는 가까운 표면이 하얗게 뜨지 않도록 더 낮춘다. 조명이 없는 복도에도 약한 차가운 환경광을 보완한다. 암부의 벽·바닥·출입구는 약하게 구분되도록 하되, 전체 노출을 올려 밝은 전시장으로 되돌리지 않는다.</w:t>
+        <w:t>사용자 승인 갤러리 팩 AIUE5_vol10_01의 기존 메시로 약 106×72m 단층 전시관을 구성한다. 35×13m 원본 홀과 상부 트러스·천창, 기존 A·B·C와 경비실·압수품실·구금실을 유지하고 서·동 전시실, 북측 연속 전시실과 직원 회랑, 남측 진입·전시실을 확장한다. 방과 복도는 별도 경계와 엇갈린 출입구로 구분한다. 상호작용 작품 12개와 장식 작품 48개를 분산하고 필수 작품은 북동 전시실, 레이저 보호 작품 두 점은 동측 별도 전시실에 배치한다. 필수 작품에 레이저 협동을 강제하지 않는다. 액자는 소형·중형·대형 정수 균등 스케일 세 단계로 제한하고 대형은 천장 높이가 충분한 곳에 배치한다. 기존 에셋을 여러 Actor가 참조하며 새 메시·파생 에셋을 생성하지 않는다. 약한 환경광과 작품용 국소 조명으로 밤의 공간감을 유지한다. 이 승인안은 앞의 공통 설명에 남은 M03 외곽 크기·액자 크기·옛 방 이름과 동선 수치에 우선한다. 면적이나 경로만으로 목표 플레이 시간을 달성했다고 판단하지 않는다. M03 전시실·통로 천장은 약 8m 기준으로 높이고 중앙 홀 지붕과 트러스를 함께 올린다. 작품등은 액자보다 충분히 높은 천장에 매달아 작품을 가리지 않게 하며, 통로는 어두운 야간 분위기를 유지한다. 작품 조명은 상호작용 여부와 무관하게 전체 구도와 주요 색을 읽을 수 있도록 균일하게 비춘다. 작품마다 담당 조명을 정하고 통로보다 작품을 강조하되 밝기만으로 훔칠 수 있는 작품을 구분하게 만들지 않는다. M03의 야간 조명은 앞의 세 맵 공통 최종값을 사용하며 과거의 절반 조정을 반복하지 않는다. 조명이 없는 복도에도 약한 차가운 환경광을 보완한다. 암부의 벽·바닥·출입구는 약하게 구분되도록 하되, 전체 노출을 올려 밝은 전시장으로 되돌리지 않는다.</w:t>
       </w:r>
     </w:p>
     <w:tbl>
@@ -16953,7 +16969,7 @@
           <w:numId w:val="7"/>
         </w:numPr>
       </w:pPr>
-      <w:bookmarkStart w:id="51" w:name="_Toc241509039"/>
+      <w:bookmarkStart w:id="51" w:name="_Toc241661062"/>
       <w:r>
         <w:lastRenderedPageBreak/>
         <w:t xml:space="preserve">First-Person </w:t>
@@ -17037,7 +17053,7 @@
           <w:numId w:val="7"/>
         </w:numPr>
       </w:pPr>
-      <w:bookmarkStart w:id="52" w:name="_Toc241509040"/>
+      <w:bookmarkStart w:id="52" w:name="_Toc241661063"/>
       <w:r>
         <w:t>사운드</w:t>
       </w:r>
@@ -17477,7 +17493,7 @@
           <w:numId w:val="7"/>
         </w:numPr>
       </w:pPr>
-      <w:bookmarkStart w:id="53" w:name="_Toc241509041"/>
+      <w:bookmarkStart w:id="53" w:name="_Toc241661064"/>
       <w:r>
         <w:lastRenderedPageBreak/>
         <w:t>세계관과</w:t>
@@ -17724,7 +17740,7 @@
           <w:numId w:val="7"/>
         </w:numPr>
       </w:pPr>
-      <w:bookmarkStart w:id="54" w:name="_Toc241509042"/>
+      <w:bookmarkStart w:id="54" w:name="_Toc241661065"/>
       <w:r>
         <w:lastRenderedPageBreak/>
         <w:t>범위</w:t>
@@ -17751,7 +17767,7 @@
           <w:numId w:val="7"/>
         </w:numPr>
       </w:pPr>
-      <w:bookmarkStart w:id="55" w:name="_Toc241509043"/>
+      <w:bookmarkStart w:id="55" w:name="_Toc241661066"/>
       <w:r>
         <w:t>v1.0 Required Scope</w:t>
       </w:r>
@@ -17961,7 +17977,7 @@
               <w:pStyle w:val="TableText"/>
             </w:pPr>
             <w:r>
-              <w:t>Painting + 맵별 Surface Template 40종(총 120종), 매치별 활성 M01/M02 20종·M03 12종, Object Assembly는 Deferred Expansion</w:t>
+              <w:t>Painting + 맵별 Surface Template 40종(총 120종), 매치별 활성 세 맵 각각 12종, Object Assembly는 Deferred Expansion</w:t>
             </w:r>
           </w:p>
         </w:tc>
@@ -18119,7 +18135,7 @@
           <w:numId w:val="7"/>
         </w:numPr>
       </w:pPr>
-      <w:bookmarkStart w:id="56" w:name="_Toc241509044"/>
+      <w:bookmarkStart w:id="56" w:name="_Toc241661067"/>
       <w:r>
         <w:t>Deferred Expansion</w:t>
       </w:r>
@@ -18143,7 +18159,7 @@
           <w:numId w:val="7"/>
         </w:numPr>
       </w:pPr>
-      <w:bookmarkStart w:id="57" w:name="_Toc241509045"/>
+      <w:bookmarkStart w:id="57" w:name="_Toc241661068"/>
       <w:r>
         <w:t>Stretch</w:t>
       </w:r>
@@ -18446,7 +18462,7 @@
               <w:pStyle w:val="TableText"/>
             </w:pPr>
             <w:r>
-              <w:t>120 Surface Template 카탈로그 + 매치별 M01/M02 20종·M03 12종 배정 + 기본 Loot Variety</w:t>
+              <w:t>120 Surface Template 카탈로그 + 매치별 세 맵 각각 12종 배정 + 기본 Loot Variety</w:t>
             </w:r>
           </w:p>
         </w:tc>
@@ -18521,7 +18537,7 @@
           <w:numId w:val="7"/>
         </w:numPr>
       </w:pPr>
-      <w:bookmarkStart w:id="58" w:name="_Toc241509046"/>
+      <w:bookmarkStart w:id="58" w:name="_Toc241661069"/>
       <w:r>
         <w:lastRenderedPageBreak/>
         <w:t>Starting Balance Targets</w:t>
@@ -19120,7 +19136,7 @@
           <w:numId w:val="7"/>
         </w:numPr>
       </w:pPr>
-      <w:bookmarkStart w:id="59" w:name="_Toc241509047"/>
+      <w:bookmarkStart w:id="59" w:name="_Toc241661070"/>
       <w:r>
         <w:t>Playtest Questions</w:t>
       </w:r>
@@ -19206,7 +19222,7 @@
           <w:numId w:val="7"/>
         </w:numPr>
       </w:pPr>
-      <w:bookmarkStart w:id="60" w:name="_Toc241509048"/>
+      <w:bookmarkStart w:id="60" w:name="_Toc241661071"/>
       <w:r>
         <w:lastRenderedPageBreak/>
         <w:t>Release KPI</w:t>
@@ -19538,7 +19554,7 @@
           <w:numId w:val="7"/>
         </w:numPr>
       </w:pPr>
-      <w:bookmarkStart w:id="61" w:name="_Toc241509049"/>
+      <w:bookmarkStart w:id="61" w:name="_Toc241661072"/>
       <w:r>
         <w:t>W6~W12 Roadmap</w:t>
       </w:r>
@@ -19904,7 +19920,7 @@
         <w:keepLines/>
         <w:pageBreakBefore w:val="0"/>
       </w:pPr>
-      <w:bookmarkStart w:id="62" w:name="_Toc241509050"/>
+      <w:bookmarkStart w:id="62" w:name="_Toc241661073"/>
       <w:r>
         <w:t>Appendix A — 용어</w:t>
       </w:r>
@@ -20295,7 +20311,7 @@
         <w:keepLines/>
         <w:pageBreakBefore w:val="0"/>
       </w:pPr>
-      <w:bookmarkStart w:id="63" w:name="_Toc241509051"/>
+      <w:bookmarkStart w:id="63" w:name="_Toc241661074"/>
       <w:r>
         <w:rPr>
           <w:sz w:val="32"/>
@@ -20519,7 +20535,7 @@
         <w:keepLines/>
         <w:pageBreakBefore w:val="0"/>
       </w:pPr>
-      <w:bookmarkStart w:id="64" w:name="_Toc241509052"/>
+      <w:bookmarkStart w:id="64" w:name="_Toc241661075"/>
       <w:r>
         <w:rPr>
           <w:sz w:val="32"/>

</xml_diff>

<commit_message>
Revamp catalogue UI and HUD readability
Applies the 2026-09-30 approved UI/UX pass across title, lobby, HUD, forgery, inventory, map, and result widgets, with updated AGENTS/TDD/GDD guidance to match the new presentation contract. HUD now uses a dedicated flashlight icon atlas with ON/OFF states, collapses unused quick slots, and shifts player colors to small markers while keeping names neutral; nameplates and team cards follow the same rule.

Forgery UI replaces numeric preview copy with an "예상 완성도" label plus a progress bar and threshold-based color state, and updates palette/brush selection styling without scale-based size changes. Added/updated editor automation scripts to enforce read-only audit/render behavior, 4px layout rules, and asset/map preservation checks, plus source-art metadata for the new flashlight icon. Includes M02 map/script updates for the approved central garden lighting refinement (3 localized 40cd ceiling fixtures).
</commit_message>
<xml_diff>
--- a/Museum_Heist_GDD.docx
+++ b/Museum_Heist_GDD.docx
@@ -559,7 +559,7 @@
       <w:r>
         <w:fldChar w:fldCharType="separate"/>
       </w:r>
-      <w:hyperlink w:anchor="_Toc241661011" w:history="1">
+      <w:hyperlink w:anchor="_Toc241695167" w:history="1">
         <w:r>
           <w:rPr>
             <w:rStyle w:val="aff1"/>
@@ -586,7 +586,7 @@
             <w:noProof/>
             <w:webHidden/>
           </w:rPr>
-          <w:instrText xml:space="preserve"> PAGEREF _Toc241661011 \h </w:instrText>
+          <w:instrText xml:space="preserve"> PAGEREF _Toc241695167 \h </w:instrText>
         </w:r>
         <w:r>
           <w:rPr>
@@ -635,7 +635,7 @@
           <w14:ligatures w14:val="standardContextual"/>
         </w:rPr>
       </w:pPr>
-      <w:hyperlink w:anchor="_Toc241661012" w:history="1">
+      <w:hyperlink w:anchor="_Toc241695168" w:history="1">
         <w:r>
           <w:rPr>
             <w:rStyle w:val="aff1"/>
@@ -662,7 +662,7 @@
             <w:noProof/>
             <w:webHidden/>
           </w:rPr>
-          <w:instrText xml:space="preserve"> PAGEREF _Toc241661012 \h </w:instrText>
+          <w:instrText xml:space="preserve"> PAGEREF _Toc241695168 \h </w:instrText>
         </w:r>
         <w:r>
           <w:rPr>
@@ -711,7 +711,7 @@
           <w14:ligatures w14:val="standardContextual"/>
         </w:rPr>
       </w:pPr>
-      <w:hyperlink w:anchor="_Toc241661013" w:history="1">
+      <w:hyperlink w:anchor="_Toc241695169" w:history="1">
         <w:r>
           <w:rPr>
             <w:rStyle w:val="aff1"/>
@@ -738,7 +738,7 @@
             <w:noProof/>
             <w:webHidden/>
           </w:rPr>
-          <w:instrText xml:space="preserve"> PAGEREF _Toc241661013 \h </w:instrText>
+          <w:instrText xml:space="preserve"> PAGEREF _Toc241695169 \h </w:instrText>
         </w:r>
         <w:r>
           <w:rPr>
@@ -787,7 +787,7 @@
           <w14:ligatures w14:val="standardContextual"/>
         </w:rPr>
       </w:pPr>
-      <w:hyperlink w:anchor="_Toc241661014" w:history="1">
+      <w:hyperlink w:anchor="_Toc241695170" w:history="1">
         <w:r>
           <w:rPr>
             <w:rStyle w:val="aff1"/>
@@ -814,7 +814,7 @@
             <w:noProof/>
             <w:webHidden/>
           </w:rPr>
-          <w:instrText xml:space="preserve"> PAGEREF _Toc241661014 \h </w:instrText>
+          <w:instrText xml:space="preserve"> PAGEREF _Toc241695170 \h </w:instrText>
         </w:r>
         <w:r>
           <w:rPr>
@@ -863,7 +863,7 @@
           <w14:ligatures w14:val="standardContextual"/>
         </w:rPr>
       </w:pPr>
-      <w:hyperlink w:anchor="_Toc241661015" w:history="1">
+      <w:hyperlink w:anchor="_Toc241695171" w:history="1">
         <w:r>
           <w:rPr>
             <w:rStyle w:val="aff1"/>
@@ -890,7 +890,7 @@
             <w:noProof/>
             <w:webHidden/>
           </w:rPr>
-          <w:instrText xml:space="preserve"> PAGEREF _Toc241661015 \h </w:instrText>
+          <w:instrText xml:space="preserve"> PAGEREF _Toc241695171 \h </w:instrText>
         </w:r>
         <w:r>
           <w:rPr>
@@ -939,7 +939,7 @@
           <w14:ligatures w14:val="standardContextual"/>
         </w:rPr>
       </w:pPr>
-      <w:hyperlink w:anchor="_Toc241661016" w:history="1">
+      <w:hyperlink w:anchor="_Toc241695172" w:history="1">
         <w:r>
           <w:rPr>
             <w:rStyle w:val="aff1"/>
@@ -966,7 +966,7 @@
             <w:noProof/>
             <w:webHidden/>
           </w:rPr>
-          <w:instrText xml:space="preserve"> PAGEREF _Toc241661016 \h </w:instrText>
+          <w:instrText xml:space="preserve"> PAGEREF _Toc241695172 \h </w:instrText>
         </w:r>
         <w:r>
           <w:rPr>
@@ -1015,7 +1015,7 @@
           <w14:ligatures w14:val="standardContextual"/>
         </w:rPr>
       </w:pPr>
-      <w:hyperlink w:anchor="_Toc241661017" w:history="1">
+      <w:hyperlink w:anchor="_Toc241695173" w:history="1">
         <w:r>
           <w:rPr>
             <w:rStyle w:val="aff1"/>
@@ -1042,7 +1042,7 @@
             <w:noProof/>
             <w:webHidden/>
           </w:rPr>
-          <w:instrText xml:space="preserve"> PAGEREF _Toc241661017 \h </w:instrText>
+          <w:instrText xml:space="preserve"> PAGEREF _Toc241695173 \h </w:instrText>
         </w:r>
         <w:r>
           <w:rPr>
@@ -1090,7 +1090,7 @@
           <w14:ligatures w14:val="standardContextual"/>
         </w:rPr>
       </w:pPr>
-      <w:hyperlink w:anchor="_Toc241661018" w:history="1">
+      <w:hyperlink w:anchor="_Toc241695174" w:history="1">
         <w:r>
           <w:rPr>
             <w:rStyle w:val="aff1"/>
@@ -1117,7 +1117,7 @@
             <w:noProof/>
             <w:webHidden/>
           </w:rPr>
-          <w:instrText xml:space="preserve"> PAGEREF _Toc241661018 \h </w:instrText>
+          <w:instrText xml:space="preserve"> PAGEREF _Toc241695174 \h </w:instrText>
         </w:r>
         <w:r>
           <w:rPr>
@@ -1166,7 +1166,7 @@
           <w14:ligatures w14:val="standardContextual"/>
         </w:rPr>
       </w:pPr>
-      <w:hyperlink w:anchor="_Toc241661019" w:history="1">
+      <w:hyperlink w:anchor="_Toc241695175" w:history="1">
         <w:r>
           <w:rPr>
             <w:rStyle w:val="aff1"/>
@@ -1193,7 +1193,7 @@
             <w:noProof/>
             <w:webHidden/>
           </w:rPr>
-          <w:instrText xml:space="preserve"> PAGEREF _Toc241661019 \h </w:instrText>
+          <w:instrText xml:space="preserve"> PAGEREF _Toc241695175 \h </w:instrText>
         </w:r>
         <w:r>
           <w:rPr>
@@ -1242,7 +1242,7 @@
           <w14:ligatures w14:val="standardContextual"/>
         </w:rPr>
       </w:pPr>
-      <w:hyperlink w:anchor="_Toc241661020" w:history="1">
+      <w:hyperlink w:anchor="_Toc241695176" w:history="1">
         <w:r>
           <w:rPr>
             <w:rStyle w:val="aff1"/>
@@ -1269,7 +1269,7 @@
             <w:noProof/>
             <w:webHidden/>
           </w:rPr>
-          <w:instrText xml:space="preserve"> PAGEREF _Toc241661020 \h </w:instrText>
+          <w:instrText xml:space="preserve"> PAGEREF _Toc241695176 \h </w:instrText>
         </w:r>
         <w:r>
           <w:rPr>
@@ -1318,7 +1318,7 @@
           <w14:ligatures w14:val="standardContextual"/>
         </w:rPr>
       </w:pPr>
-      <w:hyperlink w:anchor="_Toc241661021" w:history="1">
+      <w:hyperlink w:anchor="_Toc241695177" w:history="1">
         <w:r>
           <w:rPr>
             <w:rStyle w:val="aff1"/>
@@ -1345,7 +1345,7 @@
             <w:noProof/>
             <w:webHidden/>
           </w:rPr>
-          <w:instrText xml:space="preserve"> PAGEREF _Toc241661021 \h </w:instrText>
+          <w:instrText xml:space="preserve"> PAGEREF _Toc241695177 \h </w:instrText>
         </w:r>
         <w:r>
           <w:rPr>
@@ -1394,7 +1394,7 @@
           <w14:ligatures w14:val="standardContextual"/>
         </w:rPr>
       </w:pPr>
-      <w:hyperlink w:anchor="_Toc241661022" w:history="1">
+      <w:hyperlink w:anchor="_Toc241695178" w:history="1">
         <w:r>
           <w:rPr>
             <w:rStyle w:val="aff1"/>
@@ -1421,7 +1421,7 @@
             <w:noProof/>
             <w:webHidden/>
           </w:rPr>
-          <w:instrText xml:space="preserve"> PAGEREF _Toc241661022 \h </w:instrText>
+          <w:instrText xml:space="preserve"> PAGEREF _Toc241695178 \h </w:instrText>
         </w:r>
         <w:r>
           <w:rPr>
@@ -1470,7 +1470,7 @@
           <w14:ligatures w14:val="standardContextual"/>
         </w:rPr>
       </w:pPr>
-      <w:hyperlink w:anchor="_Toc241661023" w:history="1">
+      <w:hyperlink w:anchor="_Toc241695179" w:history="1">
         <w:r>
           <w:rPr>
             <w:rStyle w:val="aff1"/>
@@ -1497,7 +1497,7 @@
             <w:noProof/>
             <w:webHidden/>
           </w:rPr>
-          <w:instrText xml:space="preserve"> PAGEREF _Toc241661023 \h </w:instrText>
+          <w:instrText xml:space="preserve"> PAGEREF _Toc241695179 \h </w:instrText>
         </w:r>
         <w:r>
           <w:rPr>
@@ -1545,7 +1545,7 @@
           <w14:ligatures w14:val="standardContextual"/>
         </w:rPr>
       </w:pPr>
-      <w:hyperlink w:anchor="_Toc241661024" w:history="1">
+      <w:hyperlink w:anchor="_Toc241695180" w:history="1">
         <w:r>
           <w:rPr>
             <w:rStyle w:val="aff1"/>
@@ -1572,7 +1572,7 @@
             <w:noProof/>
             <w:webHidden/>
           </w:rPr>
-          <w:instrText xml:space="preserve"> PAGEREF _Toc241661024 \h </w:instrText>
+          <w:instrText xml:space="preserve"> PAGEREF _Toc241695180 \h </w:instrText>
         </w:r>
         <w:r>
           <w:rPr>
@@ -1621,7 +1621,7 @@
           <w14:ligatures w14:val="standardContextual"/>
         </w:rPr>
       </w:pPr>
-      <w:hyperlink w:anchor="_Toc241661025" w:history="1">
+      <w:hyperlink w:anchor="_Toc241695181" w:history="1">
         <w:r>
           <w:rPr>
             <w:rStyle w:val="aff1"/>
@@ -1648,7 +1648,7 @@
             <w:noProof/>
             <w:webHidden/>
           </w:rPr>
-          <w:instrText xml:space="preserve"> PAGEREF _Toc241661025 \h </w:instrText>
+          <w:instrText xml:space="preserve"> PAGEREF _Toc241695181 \h </w:instrText>
         </w:r>
         <w:r>
           <w:rPr>
@@ -1697,7 +1697,7 @@
           <w14:ligatures w14:val="standardContextual"/>
         </w:rPr>
       </w:pPr>
-      <w:hyperlink w:anchor="_Toc241661026" w:history="1">
+      <w:hyperlink w:anchor="_Toc241695182" w:history="1">
         <w:r>
           <w:rPr>
             <w:rStyle w:val="aff1"/>
@@ -1724,7 +1724,7 @@
             <w:noProof/>
             <w:webHidden/>
           </w:rPr>
-          <w:instrText xml:space="preserve"> PAGEREF _Toc241661026 \h </w:instrText>
+          <w:instrText xml:space="preserve"> PAGEREF _Toc241695182 \h </w:instrText>
         </w:r>
         <w:r>
           <w:rPr>
@@ -1773,7 +1773,7 @@
           <w14:ligatures w14:val="standardContextual"/>
         </w:rPr>
       </w:pPr>
-      <w:hyperlink w:anchor="_Toc241661027" w:history="1">
+      <w:hyperlink w:anchor="_Toc241695183" w:history="1">
         <w:r>
           <w:rPr>
             <w:rStyle w:val="aff1"/>
@@ -1800,7 +1800,7 @@
             <w:noProof/>
             <w:webHidden/>
           </w:rPr>
-          <w:instrText xml:space="preserve"> PAGEREF _Toc241661027 \h </w:instrText>
+          <w:instrText xml:space="preserve"> PAGEREF _Toc241695183 \h </w:instrText>
         </w:r>
         <w:r>
           <w:rPr>
@@ -1849,7 +1849,7 @@
           <w14:ligatures w14:val="standardContextual"/>
         </w:rPr>
       </w:pPr>
-      <w:hyperlink w:anchor="_Toc241661028" w:history="1">
+      <w:hyperlink w:anchor="_Toc241695184" w:history="1">
         <w:r>
           <w:rPr>
             <w:rStyle w:val="aff1"/>
@@ -1876,7 +1876,7 @@
             <w:noProof/>
             <w:webHidden/>
           </w:rPr>
-          <w:instrText xml:space="preserve"> PAGEREF _Toc241661028 \h </w:instrText>
+          <w:instrText xml:space="preserve"> PAGEREF _Toc241695184 \h </w:instrText>
         </w:r>
         <w:r>
           <w:rPr>
@@ -1925,7 +1925,7 @@
           <w14:ligatures w14:val="standardContextual"/>
         </w:rPr>
       </w:pPr>
-      <w:hyperlink w:anchor="_Toc241661029" w:history="1">
+      <w:hyperlink w:anchor="_Toc241695185" w:history="1">
         <w:r>
           <w:rPr>
             <w:rStyle w:val="aff1"/>
@@ -1952,7 +1952,7 @@
             <w:noProof/>
             <w:webHidden/>
           </w:rPr>
-          <w:instrText xml:space="preserve"> PAGEREF _Toc241661029 \h </w:instrText>
+          <w:instrText xml:space="preserve"> PAGEREF _Toc241695185 \h </w:instrText>
         </w:r>
         <w:r>
           <w:rPr>
@@ -2001,7 +2001,7 @@
           <w14:ligatures w14:val="standardContextual"/>
         </w:rPr>
       </w:pPr>
-      <w:hyperlink w:anchor="_Toc241661030" w:history="1">
+      <w:hyperlink w:anchor="_Toc241695186" w:history="1">
         <w:r>
           <w:rPr>
             <w:rStyle w:val="aff1"/>
@@ -2028,7 +2028,7 @@
             <w:noProof/>
             <w:webHidden/>
           </w:rPr>
-          <w:instrText xml:space="preserve"> PAGEREF _Toc241661030 \h </w:instrText>
+          <w:instrText xml:space="preserve"> PAGEREF _Toc241695186 \h </w:instrText>
         </w:r>
         <w:r>
           <w:rPr>
@@ -2076,7 +2076,7 @@
           <w14:ligatures w14:val="standardContextual"/>
         </w:rPr>
       </w:pPr>
-      <w:hyperlink w:anchor="_Toc241661031" w:history="1">
+      <w:hyperlink w:anchor="_Toc241695187" w:history="1">
         <w:r>
           <w:rPr>
             <w:rStyle w:val="aff1"/>
@@ -2103,7 +2103,7 @@
             <w:noProof/>
             <w:webHidden/>
           </w:rPr>
-          <w:instrText xml:space="preserve"> PAGEREF _Toc241661031 \h </w:instrText>
+          <w:instrText xml:space="preserve"> PAGEREF _Toc241695187 \h </w:instrText>
         </w:r>
         <w:r>
           <w:rPr>
@@ -2152,7 +2152,7 @@
           <w14:ligatures w14:val="standardContextual"/>
         </w:rPr>
       </w:pPr>
-      <w:hyperlink w:anchor="_Toc241661032" w:history="1">
+      <w:hyperlink w:anchor="_Toc241695188" w:history="1">
         <w:r>
           <w:rPr>
             <w:rStyle w:val="aff1"/>
@@ -2179,7 +2179,7 @@
             <w:noProof/>
             <w:webHidden/>
           </w:rPr>
-          <w:instrText xml:space="preserve"> PAGEREF _Toc241661032 \h </w:instrText>
+          <w:instrText xml:space="preserve"> PAGEREF _Toc241695188 \h </w:instrText>
         </w:r>
         <w:r>
           <w:rPr>
@@ -2228,7 +2228,7 @@
           <w14:ligatures w14:val="standardContextual"/>
         </w:rPr>
       </w:pPr>
-      <w:hyperlink w:anchor="_Toc241661033" w:history="1">
+      <w:hyperlink w:anchor="_Toc241695189" w:history="1">
         <w:r>
           <w:rPr>
             <w:rStyle w:val="aff1"/>
@@ -2255,7 +2255,7 @@
             <w:noProof/>
             <w:webHidden/>
           </w:rPr>
-          <w:instrText xml:space="preserve"> PAGEREF _Toc241661033 \h </w:instrText>
+          <w:instrText xml:space="preserve"> PAGEREF _Toc241695189 \h </w:instrText>
         </w:r>
         <w:r>
           <w:rPr>
@@ -2304,7 +2304,7 @@
           <w14:ligatures w14:val="standardContextual"/>
         </w:rPr>
       </w:pPr>
-      <w:hyperlink w:anchor="_Toc241661034" w:history="1">
+      <w:hyperlink w:anchor="_Toc241695190" w:history="1">
         <w:r>
           <w:rPr>
             <w:rStyle w:val="aff1"/>
@@ -2331,7 +2331,7 @@
             <w:noProof/>
             <w:webHidden/>
           </w:rPr>
-          <w:instrText xml:space="preserve"> PAGEREF _Toc241661034 \h </w:instrText>
+          <w:instrText xml:space="preserve"> PAGEREF _Toc241695190 \h </w:instrText>
         </w:r>
         <w:r>
           <w:rPr>
@@ -2380,7 +2380,7 @@
           <w14:ligatures w14:val="standardContextual"/>
         </w:rPr>
       </w:pPr>
-      <w:hyperlink w:anchor="_Toc241661035" w:history="1">
+      <w:hyperlink w:anchor="_Toc241695191" w:history="1">
         <w:r>
           <w:rPr>
             <w:rStyle w:val="aff1"/>
@@ -2407,7 +2407,7 @@
             <w:noProof/>
             <w:webHidden/>
           </w:rPr>
-          <w:instrText xml:space="preserve"> PAGEREF _Toc241661035 \h </w:instrText>
+          <w:instrText xml:space="preserve"> PAGEREF _Toc241695191 \h </w:instrText>
         </w:r>
         <w:r>
           <w:rPr>
@@ -2456,7 +2456,7 @@
           <w14:ligatures w14:val="standardContextual"/>
         </w:rPr>
       </w:pPr>
-      <w:hyperlink w:anchor="_Toc241661036" w:history="1">
+      <w:hyperlink w:anchor="_Toc241695192" w:history="1">
         <w:r>
           <w:rPr>
             <w:rStyle w:val="aff1"/>
@@ -2483,7 +2483,7 @@
             <w:noProof/>
             <w:webHidden/>
           </w:rPr>
-          <w:instrText xml:space="preserve"> PAGEREF _Toc241661036 \h </w:instrText>
+          <w:instrText xml:space="preserve"> PAGEREF _Toc241695192 \h </w:instrText>
         </w:r>
         <w:r>
           <w:rPr>
@@ -2532,7 +2532,7 @@
           <w14:ligatures w14:val="standardContextual"/>
         </w:rPr>
       </w:pPr>
-      <w:hyperlink w:anchor="_Toc241661037" w:history="1">
+      <w:hyperlink w:anchor="_Toc241695193" w:history="1">
         <w:r>
           <w:rPr>
             <w:rStyle w:val="aff1"/>
@@ -2559,7 +2559,7 @@
             <w:noProof/>
             <w:webHidden/>
           </w:rPr>
-          <w:instrText xml:space="preserve"> PAGEREF _Toc241661037 \h </w:instrText>
+          <w:instrText xml:space="preserve"> PAGEREF _Toc241695193 \h </w:instrText>
         </w:r>
         <w:r>
           <w:rPr>
@@ -2607,7 +2607,7 @@
           <w14:ligatures w14:val="standardContextual"/>
         </w:rPr>
       </w:pPr>
-      <w:hyperlink w:anchor="_Toc241661038" w:history="1">
+      <w:hyperlink w:anchor="_Toc241695194" w:history="1">
         <w:r>
           <w:rPr>
             <w:rStyle w:val="aff1"/>
@@ -2634,7 +2634,7 @@
             <w:noProof/>
             <w:webHidden/>
           </w:rPr>
-          <w:instrText xml:space="preserve"> PAGEREF _Toc241661038 \h </w:instrText>
+          <w:instrText xml:space="preserve"> PAGEREF _Toc241695194 \h </w:instrText>
         </w:r>
         <w:r>
           <w:rPr>
@@ -2683,7 +2683,7 @@
           <w14:ligatures w14:val="standardContextual"/>
         </w:rPr>
       </w:pPr>
-      <w:hyperlink w:anchor="_Toc241661039" w:history="1">
+      <w:hyperlink w:anchor="_Toc241695195" w:history="1">
         <w:r>
           <w:rPr>
             <w:rStyle w:val="aff1"/>
@@ -2710,7 +2710,7 @@
             <w:noProof/>
             <w:webHidden/>
           </w:rPr>
-          <w:instrText xml:space="preserve"> PAGEREF _Toc241661039 \h </w:instrText>
+          <w:instrText xml:space="preserve"> PAGEREF _Toc241695195 \h </w:instrText>
         </w:r>
         <w:r>
           <w:rPr>
@@ -2759,7 +2759,7 @@
           <w14:ligatures w14:val="standardContextual"/>
         </w:rPr>
       </w:pPr>
-      <w:hyperlink w:anchor="_Toc241661040" w:history="1">
+      <w:hyperlink w:anchor="_Toc241695196" w:history="1">
         <w:r>
           <w:rPr>
             <w:rStyle w:val="aff1"/>
@@ -2786,7 +2786,7 @@
             <w:noProof/>
             <w:webHidden/>
           </w:rPr>
-          <w:instrText xml:space="preserve"> PAGEREF _Toc241661040 \h </w:instrText>
+          <w:instrText xml:space="preserve"> PAGEREF _Toc241695196 \h </w:instrText>
         </w:r>
         <w:r>
           <w:rPr>
@@ -2835,7 +2835,7 @@
           <w14:ligatures w14:val="standardContextual"/>
         </w:rPr>
       </w:pPr>
-      <w:hyperlink w:anchor="_Toc241661041" w:history="1">
+      <w:hyperlink w:anchor="_Toc241695197" w:history="1">
         <w:r>
           <w:rPr>
             <w:rStyle w:val="aff1"/>
@@ -2862,7 +2862,7 @@
             <w:noProof/>
             <w:webHidden/>
           </w:rPr>
-          <w:instrText xml:space="preserve"> PAGEREF _Toc241661041 \h </w:instrText>
+          <w:instrText xml:space="preserve"> PAGEREF _Toc241695197 \h </w:instrText>
         </w:r>
         <w:r>
           <w:rPr>
@@ -2911,7 +2911,7 @@
           <w14:ligatures w14:val="standardContextual"/>
         </w:rPr>
       </w:pPr>
-      <w:hyperlink w:anchor="_Toc241661042" w:history="1">
+      <w:hyperlink w:anchor="_Toc241695198" w:history="1">
         <w:r>
           <w:rPr>
             <w:rStyle w:val="aff1"/>
@@ -2938,7 +2938,7 @@
             <w:noProof/>
             <w:webHidden/>
           </w:rPr>
-          <w:instrText xml:space="preserve"> PAGEREF _Toc241661042 \h </w:instrText>
+          <w:instrText xml:space="preserve"> PAGEREF _Toc241695198 \h </w:instrText>
         </w:r>
         <w:r>
           <w:rPr>
@@ -2987,7 +2987,7 @@
           <w14:ligatures w14:val="standardContextual"/>
         </w:rPr>
       </w:pPr>
-      <w:hyperlink w:anchor="_Toc241661043" w:history="1">
+      <w:hyperlink w:anchor="_Toc241695199" w:history="1">
         <w:r>
           <w:rPr>
             <w:rStyle w:val="aff1"/>
@@ -3014,7 +3014,7 @@
             <w:noProof/>
             <w:webHidden/>
           </w:rPr>
-          <w:instrText xml:space="preserve"> PAGEREF _Toc241661043 \h </w:instrText>
+          <w:instrText xml:space="preserve"> PAGEREF _Toc241695199 \h </w:instrText>
         </w:r>
         <w:r>
           <w:rPr>
@@ -3063,7 +3063,7 @@
           <w14:ligatures w14:val="standardContextual"/>
         </w:rPr>
       </w:pPr>
-      <w:hyperlink w:anchor="_Toc241661044" w:history="1">
+      <w:hyperlink w:anchor="_Toc241695200" w:history="1">
         <w:r>
           <w:rPr>
             <w:rStyle w:val="aff1"/>
@@ -3090,7 +3090,7 @@
             <w:noProof/>
             <w:webHidden/>
           </w:rPr>
-          <w:instrText xml:space="preserve"> PAGEREF _Toc241661044 \h </w:instrText>
+          <w:instrText xml:space="preserve"> PAGEREF _Toc241695200 \h </w:instrText>
         </w:r>
         <w:r>
           <w:rPr>
@@ -3138,7 +3138,7 @@
           <w14:ligatures w14:val="standardContextual"/>
         </w:rPr>
       </w:pPr>
-      <w:hyperlink w:anchor="_Toc241661045" w:history="1">
+      <w:hyperlink w:anchor="_Toc241695201" w:history="1">
         <w:r>
           <w:rPr>
             <w:rStyle w:val="aff1"/>
@@ -3165,7 +3165,7 @@
             <w:noProof/>
             <w:webHidden/>
           </w:rPr>
-          <w:instrText xml:space="preserve"> PAGEREF _Toc241661045 \h </w:instrText>
+          <w:instrText xml:space="preserve"> PAGEREF _Toc241695201 \h </w:instrText>
         </w:r>
         <w:r>
           <w:rPr>
@@ -3214,7 +3214,7 @@
           <w14:ligatures w14:val="standardContextual"/>
         </w:rPr>
       </w:pPr>
-      <w:hyperlink w:anchor="_Toc241661046" w:history="1">
+      <w:hyperlink w:anchor="_Toc241695202" w:history="1">
         <w:r>
           <w:rPr>
             <w:rStyle w:val="aff1"/>
@@ -3241,7 +3241,7 @@
             <w:noProof/>
             <w:webHidden/>
           </w:rPr>
-          <w:instrText xml:space="preserve"> PAGEREF _Toc241661046 \h </w:instrText>
+          <w:instrText xml:space="preserve"> PAGEREF _Toc241695202 \h </w:instrText>
         </w:r>
         <w:r>
           <w:rPr>
@@ -3290,7 +3290,7 @@
           <w14:ligatures w14:val="standardContextual"/>
         </w:rPr>
       </w:pPr>
-      <w:hyperlink w:anchor="_Toc241661047" w:history="1">
+      <w:hyperlink w:anchor="_Toc241695203" w:history="1">
         <w:r>
           <w:rPr>
             <w:rStyle w:val="aff1"/>
@@ -3317,7 +3317,7 @@
             <w:noProof/>
             <w:webHidden/>
           </w:rPr>
-          <w:instrText xml:space="preserve"> PAGEREF _Toc241661047 \h </w:instrText>
+          <w:instrText xml:space="preserve"> PAGEREF _Toc241695203 \h </w:instrText>
         </w:r>
         <w:r>
           <w:rPr>
@@ -3337,7 +3337,7 @@
             <w:noProof/>
             <w:webHidden/>
           </w:rPr>
-          <w:t>20</w:t>
+          <w:t>21</w:t>
         </w:r>
         <w:r>
           <w:rPr>
@@ -3366,7 +3366,7 @@
           <w14:ligatures w14:val="standardContextual"/>
         </w:rPr>
       </w:pPr>
-      <w:hyperlink w:anchor="_Toc241661048" w:history="1">
+      <w:hyperlink w:anchor="_Toc241695204" w:history="1">
         <w:r>
           <w:rPr>
             <w:rStyle w:val="aff1"/>
@@ -3393,7 +3393,7 @@
             <w:noProof/>
             <w:webHidden/>
           </w:rPr>
-          <w:instrText xml:space="preserve"> PAGEREF _Toc241661048 \h </w:instrText>
+          <w:instrText xml:space="preserve"> PAGEREF _Toc241695204 \h </w:instrText>
         </w:r>
         <w:r>
           <w:rPr>
@@ -3442,7 +3442,7 @@
           <w14:ligatures w14:val="standardContextual"/>
         </w:rPr>
       </w:pPr>
-      <w:hyperlink w:anchor="_Toc241661049" w:history="1">
+      <w:hyperlink w:anchor="_Toc241695205" w:history="1">
         <w:r>
           <w:rPr>
             <w:rStyle w:val="aff1"/>
@@ -3469,7 +3469,7 @@
             <w:noProof/>
             <w:webHidden/>
           </w:rPr>
-          <w:instrText xml:space="preserve"> PAGEREF _Toc241661049 \h </w:instrText>
+          <w:instrText xml:space="preserve"> PAGEREF _Toc241695205 \h </w:instrText>
         </w:r>
         <w:r>
           <w:rPr>
@@ -3489,7 +3489,7 @@
             <w:noProof/>
             <w:webHidden/>
           </w:rPr>
-          <w:t>21</w:t>
+          <w:t>22</w:t>
         </w:r>
         <w:r>
           <w:rPr>
@@ -3518,7 +3518,7 @@
           <w14:ligatures w14:val="standardContextual"/>
         </w:rPr>
       </w:pPr>
-      <w:hyperlink w:anchor="_Toc241661050" w:history="1">
+      <w:hyperlink w:anchor="_Toc241695206" w:history="1">
         <w:r>
           <w:rPr>
             <w:rStyle w:val="aff1"/>
@@ -3545,7 +3545,7 @@
             <w:noProof/>
             <w:webHidden/>
           </w:rPr>
-          <w:instrText xml:space="preserve"> PAGEREF _Toc241661050 \h </w:instrText>
+          <w:instrText xml:space="preserve"> PAGEREF _Toc241695206 \h </w:instrText>
         </w:r>
         <w:r>
           <w:rPr>
@@ -3594,7 +3594,7 @@
           <w14:ligatures w14:val="standardContextual"/>
         </w:rPr>
       </w:pPr>
-      <w:hyperlink w:anchor="_Toc241661051" w:history="1">
+      <w:hyperlink w:anchor="_Toc241695207" w:history="1">
         <w:r>
           <w:rPr>
             <w:rStyle w:val="aff1"/>
@@ -3621,7 +3621,7 @@
             <w:noProof/>
             <w:webHidden/>
           </w:rPr>
-          <w:instrText xml:space="preserve"> PAGEREF _Toc241661051 \h </w:instrText>
+          <w:instrText xml:space="preserve"> PAGEREF _Toc241695207 \h </w:instrText>
         </w:r>
         <w:r>
           <w:rPr>
@@ -3670,7 +3670,7 @@
           <w14:ligatures w14:val="standardContextual"/>
         </w:rPr>
       </w:pPr>
-      <w:hyperlink w:anchor="_Toc241661052" w:history="1">
+      <w:hyperlink w:anchor="_Toc241695208" w:history="1">
         <w:r>
           <w:rPr>
             <w:rStyle w:val="aff1"/>
@@ -3697,7 +3697,7 @@
             <w:noProof/>
             <w:webHidden/>
           </w:rPr>
-          <w:instrText xml:space="preserve"> PAGEREF _Toc241661052 \h </w:instrText>
+          <w:instrText xml:space="preserve"> PAGEREF _Toc241695208 \h </w:instrText>
         </w:r>
         <w:r>
           <w:rPr>
@@ -3746,7 +3746,7 @@
           <w14:ligatures w14:val="standardContextual"/>
         </w:rPr>
       </w:pPr>
-      <w:hyperlink w:anchor="_Toc241661053" w:history="1">
+      <w:hyperlink w:anchor="_Toc241695209" w:history="1">
         <w:r>
           <w:rPr>
             <w:rStyle w:val="aff1"/>
@@ -3773,7 +3773,7 @@
             <w:noProof/>
             <w:webHidden/>
           </w:rPr>
-          <w:instrText xml:space="preserve"> PAGEREF _Toc241661053 \h </w:instrText>
+          <w:instrText xml:space="preserve"> PAGEREF _Toc241695209 \h </w:instrText>
         </w:r>
         <w:r>
           <w:rPr>
@@ -3793,7 +3793,7 @@
             <w:noProof/>
             <w:webHidden/>
           </w:rPr>
-          <w:t>22</w:t>
+          <w:t>23</w:t>
         </w:r>
         <w:r>
           <w:rPr>
@@ -3822,7 +3822,7 @@
           <w14:ligatures w14:val="standardContextual"/>
         </w:rPr>
       </w:pPr>
-      <w:hyperlink w:anchor="_Toc241661054" w:history="1">
+      <w:hyperlink w:anchor="_Toc241695210" w:history="1">
         <w:r>
           <w:rPr>
             <w:rStyle w:val="aff1"/>
@@ -3849,7 +3849,7 @@
             <w:noProof/>
             <w:webHidden/>
           </w:rPr>
-          <w:instrText xml:space="preserve"> PAGEREF _Toc241661054 \h </w:instrText>
+          <w:instrText xml:space="preserve"> PAGEREF _Toc241695210 \h </w:instrText>
         </w:r>
         <w:r>
           <w:rPr>
@@ -3897,7 +3897,7 @@
           <w14:ligatures w14:val="standardContextual"/>
         </w:rPr>
       </w:pPr>
-      <w:hyperlink w:anchor="_Toc241661055" w:history="1">
+      <w:hyperlink w:anchor="_Toc241695211" w:history="1">
         <w:r>
           <w:rPr>
             <w:rStyle w:val="aff1"/>
@@ -3924,7 +3924,7 @@
             <w:noProof/>
             <w:webHidden/>
           </w:rPr>
-          <w:instrText xml:space="preserve"> PAGEREF _Toc241661055 \h </w:instrText>
+          <w:instrText xml:space="preserve"> PAGEREF _Toc241695211 \h </w:instrText>
         </w:r>
         <w:r>
           <w:rPr>
@@ -3973,7 +3973,7 @@
           <w14:ligatures w14:val="standardContextual"/>
         </w:rPr>
       </w:pPr>
-      <w:hyperlink w:anchor="_Toc241661056" w:history="1">
+      <w:hyperlink w:anchor="_Toc241695212" w:history="1">
         <w:r>
           <w:rPr>
             <w:rStyle w:val="aff1"/>
@@ -4000,7 +4000,7 @@
             <w:noProof/>
             <w:webHidden/>
           </w:rPr>
-          <w:instrText xml:space="preserve"> PAGEREF _Toc241661056 \h </w:instrText>
+          <w:instrText xml:space="preserve"> PAGEREF _Toc241695212 \h </w:instrText>
         </w:r>
         <w:r>
           <w:rPr>
@@ -4049,7 +4049,7 @@
           <w14:ligatures w14:val="standardContextual"/>
         </w:rPr>
       </w:pPr>
-      <w:hyperlink w:anchor="_Toc241661057" w:history="1">
+      <w:hyperlink w:anchor="_Toc241695213" w:history="1">
         <w:r>
           <w:rPr>
             <w:rStyle w:val="aff1"/>
@@ -4076,7 +4076,7 @@
             <w:noProof/>
             <w:webHidden/>
           </w:rPr>
-          <w:instrText xml:space="preserve"> PAGEREF _Toc241661057 \h </w:instrText>
+          <w:instrText xml:space="preserve"> PAGEREF _Toc241695213 \h </w:instrText>
         </w:r>
         <w:r>
           <w:rPr>
@@ -4125,7 +4125,7 @@
           <w14:ligatures w14:val="standardContextual"/>
         </w:rPr>
       </w:pPr>
-      <w:hyperlink w:anchor="_Toc241661058" w:history="1">
+      <w:hyperlink w:anchor="_Toc241695214" w:history="1">
         <w:r>
           <w:rPr>
             <w:rStyle w:val="aff1"/>
@@ -4152,7 +4152,7 @@
             <w:noProof/>
             <w:webHidden/>
           </w:rPr>
-          <w:instrText xml:space="preserve"> PAGEREF _Toc241661058 \h </w:instrText>
+          <w:instrText xml:space="preserve"> PAGEREF _Toc241695214 \h </w:instrText>
         </w:r>
         <w:r>
           <w:rPr>
@@ -4201,7 +4201,7 @@
           <w14:ligatures w14:val="standardContextual"/>
         </w:rPr>
       </w:pPr>
-      <w:hyperlink w:anchor="_Toc241661059" w:history="1">
+      <w:hyperlink w:anchor="_Toc241695215" w:history="1">
         <w:r>
           <w:rPr>
             <w:rStyle w:val="aff1"/>
@@ -4228,7 +4228,7 @@
             <w:noProof/>
             <w:webHidden/>
           </w:rPr>
-          <w:instrText xml:space="preserve"> PAGEREF _Toc241661059 \h </w:instrText>
+          <w:instrText xml:space="preserve"> PAGEREF _Toc241695215 \h </w:instrText>
         </w:r>
         <w:r>
           <w:rPr>
@@ -4277,7 +4277,7 @@
           <w14:ligatures w14:val="standardContextual"/>
         </w:rPr>
       </w:pPr>
-      <w:hyperlink w:anchor="_Toc241661060" w:history="1">
+      <w:hyperlink w:anchor="_Toc241695216" w:history="1">
         <w:r>
           <w:rPr>
             <w:rStyle w:val="aff1"/>
@@ -4304,7 +4304,7 @@
             <w:noProof/>
             <w:webHidden/>
           </w:rPr>
-          <w:instrText xml:space="preserve"> PAGEREF _Toc241661060 \h </w:instrText>
+          <w:instrText xml:space="preserve"> PAGEREF _Toc241695216 \h </w:instrText>
         </w:r>
         <w:r>
           <w:rPr>
@@ -4353,7 +4353,7 @@
           <w14:ligatures w14:val="standardContextual"/>
         </w:rPr>
       </w:pPr>
-      <w:hyperlink w:anchor="_Toc241661061" w:history="1">
+      <w:hyperlink w:anchor="_Toc241695217" w:history="1">
         <w:r>
           <w:rPr>
             <w:rStyle w:val="aff1"/>
@@ -4380,7 +4380,7 @@
             <w:noProof/>
             <w:webHidden/>
           </w:rPr>
-          <w:instrText xml:space="preserve"> PAGEREF _Toc241661061 \h </w:instrText>
+          <w:instrText xml:space="preserve"> PAGEREF _Toc241695217 \h </w:instrText>
         </w:r>
         <w:r>
           <w:rPr>
@@ -4429,7 +4429,7 @@
           <w14:ligatures w14:val="standardContextual"/>
         </w:rPr>
       </w:pPr>
-      <w:hyperlink w:anchor="_Toc241661062" w:history="1">
+      <w:hyperlink w:anchor="_Toc241695218" w:history="1">
         <w:r>
           <w:rPr>
             <w:rStyle w:val="aff1"/>
@@ -4456,7 +4456,7 @@
             <w:noProof/>
             <w:webHidden/>
           </w:rPr>
-          <w:instrText xml:space="preserve"> PAGEREF _Toc241661062 \h </w:instrText>
+          <w:instrText xml:space="preserve"> PAGEREF _Toc241695218 \h </w:instrText>
         </w:r>
         <w:r>
           <w:rPr>
@@ -4505,7 +4505,7 @@
           <w14:ligatures w14:val="standardContextual"/>
         </w:rPr>
       </w:pPr>
-      <w:hyperlink w:anchor="_Toc241661063" w:history="1">
+      <w:hyperlink w:anchor="_Toc241695219" w:history="1">
         <w:r>
           <w:rPr>
             <w:rStyle w:val="aff1"/>
@@ -4532,7 +4532,7 @@
             <w:noProof/>
             <w:webHidden/>
           </w:rPr>
-          <w:instrText xml:space="preserve"> PAGEREF _Toc241661063 \h </w:instrText>
+          <w:instrText xml:space="preserve"> PAGEREF _Toc241695219 \h </w:instrText>
         </w:r>
         <w:r>
           <w:rPr>
@@ -4581,7 +4581,7 @@
           <w14:ligatures w14:val="standardContextual"/>
         </w:rPr>
       </w:pPr>
-      <w:hyperlink w:anchor="_Toc241661064" w:history="1">
+      <w:hyperlink w:anchor="_Toc241695220" w:history="1">
         <w:r>
           <w:rPr>
             <w:rStyle w:val="aff1"/>
@@ -4608,7 +4608,7 @@
             <w:noProof/>
             <w:webHidden/>
           </w:rPr>
-          <w:instrText xml:space="preserve"> PAGEREF _Toc241661064 \h </w:instrText>
+          <w:instrText xml:space="preserve"> PAGEREF _Toc241695220 \h </w:instrText>
         </w:r>
         <w:r>
           <w:rPr>
@@ -4656,7 +4656,7 @@
           <w14:ligatures w14:val="standardContextual"/>
         </w:rPr>
       </w:pPr>
-      <w:hyperlink w:anchor="_Toc241661065" w:history="1">
+      <w:hyperlink w:anchor="_Toc241695221" w:history="1">
         <w:r>
           <w:rPr>
             <w:rStyle w:val="aff1"/>
@@ -4683,7 +4683,7 @@
             <w:noProof/>
             <w:webHidden/>
           </w:rPr>
-          <w:instrText xml:space="preserve"> PAGEREF _Toc241661065 \h </w:instrText>
+          <w:instrText xml:space="preserve"> PAGEREF _Toc241695221 \h </w:instrText>
         </w:r>
         <w:r>
           <w:rPr>
@@ -4732,7 +4732,7 @@
           <w14:ligatures w14:val="standardContextual"/>
         </w:rPr>
       </w:pPr>
-      <w:hyperlink w:anchor="_Toc241661066" w:history="1">
+      <w:hyperlink w:anchor="_Toc241695222" w:history="1">
         <w:r>
           <w:rPr>
             <w:rStyle w:val="aff1"/>
@@ -4759,7 +4759,7 @@
             <w:noProof/>
             <w:webHidden/>
           </w:rPr>
-          <w:instrText xml:space="preserve"> PAGEREF _Toc241661066 \h </w:instrText>
+          <w:instrText xml:space="preserve"> PAGEREF _Toc241695222 \h </w:instrText>
         </w:r>
         <w:r>
           <w:rPr>
@@ -4808,7 +4808,7 @@
           <w14:ligatures w14:val="standardContextual"/>
         </w:rPr>
       </w:pPr>
-      <w:hyperlink w:anchor="_Toc241661067" w:history="1">
+      <w:hyperlink w:anchor="_Toc241695223" w:history="1">
         <w:r>
           <w:rPr>
             <w:rStyle w:val="aff1"/>
@@ -4835,7 +4835,7 @@
             <w:noProof/>
             <w:webHidden/>
           </w:rPr>
-          <w:instrText xml:space="preserve"> PAGEREF _Toc241661067 \h </w:instrText>
+          <w:instrText xml:space="preserve"> PAGEREF _Toc241695223 \h </w:instrText>
         </w:r>
         <w:r>
           <w:rPr>
@@ -4884,7 +4884,7 @@
           <w14:ligatures w14:val="standardContextual"/>
         </w:rPr>
       </w:pPr>
-      <w:hyperlink w:anchor="_Toc241661068" w:history="1">
+      <w:hyperlink w:anchor="_Toc241695224" w:history="1">
         <w:r>
           <w:rPr>
             <w:rStyle w:val="aff1"/>
@@ -4911,7 +4911,7 @@
             <w:noProof/>
             <w:webHidden/>
           </w:rPr>
-          <w:instrText xml:space="preserve"> PAGEREF _Toc241661068 \h </w:instrText>
+          <w:instrText xml:space="preserve"> PAGEREF _Toc241695224 \h </w:instrText>
         </w:r>
         <w:r>
           <w:rPr>
@@ -4960,7 +4960,7 @@
           <w14:ligatures w14:val="standardContextual"/>
         </w:rPr>
       </w:pPr>
-      <w:hyperlink w:anchor="_Toc241661069" w:history="1">
+      <w:hyperlink w:anchor="_Toc241695225" w:history="1">
         <w:r>
           <w:rPr>
             <w:rStyle w:val="aff1"/>
@@ -4987,7 +4987,7 @@
             <w:noProof/>
             <w:webHidden/>
           </w:rPr>
-          <w:instrText xml:space="preserve"> PAGEREF _Toc241661069 \h </w:instrText>
+          <w:instrText xml:space="preserve"> PAGEREF _Toc241695225 \h </w:instrText>
         </w:r>
         <w:r>
           <w:rPr>
@@ -5036,7 +5036,7 @@
           <w14:ligatures w14:val="standardContextual"/>
         </w:rPr>
       </w:pPr>
-      <w:hyperlink w:anchor="_Toc241661070" w:history="1">
+      <w:hyperlink w:anchor="_Toc241695226" w:history="1">
         <w:r>
           <w:rPr>
             <w:rStyle w:val="aff1"/>
@@ -5063,7 +5063,7 @@
             <w:noProof/>
             <w:webHidden/>
           </w:rPr>
-          <w:instrText xml:space="preserve"> PAGEREF _Toc241661070 \h </w:instrText>
+          <w:instrText xml:space="preserve"> PAGEREF _Toc241695226 \h </w:instrText>
         </w:r>
         <w:r>
           <w:rPr>
@@ -5112,7 +5112,7 @@
           <w14:ligatures w14:val="standardContextual"/>
         </w:rPr>
       </w:pPr>
-      <w:hyperlink w:anchor="_Toc241661071" w:history="1">
+      <w:hyperlink w:anchor="_Toc241695227" w:history="1">
         <w:r>
           <w:rPr>
             <w:rStyle w:val="aff1"/>
@@ -5139,7 +5139,7 @@
             <w:noProof/>
             <w:webHidden/>
           </w:rPr>
-          <w:instrText xml:space="preserve"> PAGEREF _Toc241661071 \h </w:instrText>
+          <w:instrText xml:space="preserve"> PAGEREF _Toc241695227 \h </w:instrText>
         </w:r>
         <w:r>
           <w:rPr>
@@ -5188,7 +5188,7 @@
           <w14:ligatures w14:val="standardContextual"/>
         </w:rPr>
       </w:pPr>
-      <w:hyperlink w:anchor="_Toc241661072" w:history="1">
+      <w:hyperlink w:anchor="_Toc241695228" w:history="1">
         <w:r>
           <w:rPr>
             <w:rStyle w:val="aff1"/>
@@ -5215,7 +5215,7 @@
             <w:noProof/>
             <w:webHidden/>
           </w:rPr>
-          <w:instrText xml:space="preserve"> PAGEREF _Toc241661072 \h </w:instrText>
+          <w:instrText xml:space="preserve"> PAGEREF _Toc241695228 \h </w:instrText>
         </w:r>
         <w:r>
           <w:rPr>
@@ -5263,7 +5263,7 @@
           <w14:ligatures w14:val="standardContextual"/>
         </w:rPr>
       </w:pPr>
-      <w:hyperlink w:anchor="_Toc241661073" w:history="1">
+      <w:hyperlink w:anchor="_Toc241695229" w:history="1">
         <w:r>
           <w:rPr>
             <w:rStyle w:val="aff1"/>
@@ -5290,7 +5290,7 @@
             <w:noProof/>
             <w:webHidden/>
           </w:rPr>
-          <w:instrText xml:space="preserve"> PAGEREF _Toc241661073 \h </w:instrText>
+          <w:instrText xml:space="preserve"> PAGEREF _Toc241695229 \h </w:instrText>
         </w:r>
         <w:r>
           <w:rPr>
@@ -5338,7 +5338,7 @@
           <w14:ligatures w14:val="standardContextual"/>
         </w:rPr>
       </w:pPr>
-      <w:hyperlink w:anchor="_Toc241661074" w:history="1">
+      <w:hyperlink w:anchor="_Toc241695230" w:history="1">
         <w:r>
           <w:rPr>
             <w:rStyle w:val="aff1"/>
@@ -5365,7 +5365,7 @@
             <w:noProof/>
             <w:webHidden/>
           </w:rPr>
-          <w:instrText xml:space="preserve"> PAGEREF _Toc241661074 \h </w:instrText>
+          <w:instrText xml:space="preserve"> PAGEREF _Toc241695230 \h </w:instrText>
         </w:r>
         <w:r>
           <w:rPr>
@@ -5413,7 +5413,7 @@
           <w14:ligatures w14:val="standardContextual"/>
         </w:rPr>
       </w:pPr>
-      <w:hyperlink w:anchor="_Toc241661075" w:history="1">
+      <w:hyperlink w:anchor="_Toc241695231" w:history="1">
         <w:r>
           <w:rPr>
             <w:rStyle w:val="aff1"/>
@@ -5440,7 +5440,7 @@
             <w:noProof/>
             <w:webHidden/>
           </w:rPr>
-          <w:instrText xml:space="preserve"> PAGEREF _Toc241661075 \h </w:instrText>
+          <w:instrText xml:space="preserve"> PAGEREF _Toc241695231 \h </w:instrText>
         </w:r>
         <w:r>
           <w:rPr>
@@ -5490,7 +5490,7 @@
           <w:numId w:val="7"/>
         </w:numPr>
       </w:pPr>
-      <w:bookmarkStart w:id="0" w:name="_Toc241661011"/>
+      <w:bookmarkStart w:id="0" w:name="_Toc241695167"/>
       <w:r>
         <w:lastRenderedPageBreak/>
         <w:t>게임</w:t>
@@ -5523,7 +5523,7 @@
           <w:numId w:val="7"/>
         </w:numPr>
       </w:pPr>
-      <w:bookmarkStart w:id="1" w:name="_Toc241661012"/>
+      <w:bookmarkStart w:id="1" w:name="_Toc241695168"/>
       <w:r>
         <w:t>Executive Summary</w:t>
       </w:r>
@@ -5594,7 +5594,7 @@
           <w:numId w:val="7"/>
         </w:numPr>
       </w:pPr>
-      <w:bookmarkStart w:id="2" w:name="_Toc241661013"/>
+      <w:bookmarkStart w:id="2" w:name="_Toc241695169"/>
       <w:r>
         <w:t>Rev 16 Release Profile</w:t>
       </w:r>
@@ -5618,7 +5618,7 @@
           <w:numId w:val="7"/>
         </w:numPr>
       </w:pPr>
-      <w:bookmarkStart w:id="3" w:name="_Toc241661014"/>
+      <w:bookmarkStart w:id="3" w:name="_Toc241695170"/>
       <w:r>
         <w:t>제품</w:t>
       </w:r>
@@ -5908,7 +5908,7 @@
           <w:numId w:val="7"/>
         </w:numPr>
       </w:pPr>
-      <w:bookmarkStart w:id="4" w:name="_Toc241661015"/>
+      <w:bookmarkStart w:id="4" w:name="_Toc241695171"/>
       <w:r>
         <w:t>디자인</w:t>
       </w:r>
@@ -6278,7 +6278,7 @@
           <w:numId w:val="7"/>
         </w:numPr>
       </w:pPr>
-      <w:bookmarkStart w:id="5" w:name="_Toc241661016"/>
+      <w:bookmarkStart w:id="5" w:name="_Toc241695172"/>
       <w:r>
         <w:t>Target Experience</w:t>
       </w:r>
@@ -6352,7 +6352,7 @@
           <w:numId w:val="7"/>
         </w:numPr>
       </w:pPr>
-      <w:bookmarkStart w:id="6" w:name="_Toc241661017"/>
+      <w:bookmarkStart w:id="6" w:name="_Toc241695173"/>
       <w:r>
         <w:t>명시적</w:t>
       </w:r>
@@ -6624,7 +6624,7 @@
           <w:numId w:val="7"/>
         </w:numPr>
       </w:pPr>
-      <w:bookmarkStart w:id="7" w:name="_Toc241661018"/>
+      <w:bookmarkStart w:id="7" w:name="_Toc241695174"/>
       <w:r>
         <w:lastRenderedPageBreak/>
         <w:t>Contract Run</w:t>
@@ -6660,7 +6660,7 @@
           <w:numId w:val="7"/>
         </w:numPr>
       </w:pPr>
-      <w:bookmarkStart w:id="8" w:name="_Toc241661019"/>
+      <w:bookmarkStart w:id="8" w:name="_Toc241695175"/>
       <w:r>
         <w:t>Core Loop</w:t>
       </w:r>
@@ -7154,7 +7154,7 @@
           <w:numId w:val="7"/>
         </w:numPr>
       </w:pPr>
-      <w:bookmarkStart w:id="9" w:name="_Toc241661020"/>
+      <w:bookmarkStart w:id="9" w:name="_Toc241695176"/>
       <w:r>
         <w:t xml:space="preserve">Contract </w:t>
       </w:r>
@@ -7508,7 +7508,7 @@
           </w:tcPr>
           <w:p>
             <w:r>
-              <w:t>작업 화면의 예상 점수·70점 제출 기준과 Result의 실제 Replica로 체감</w:t>
+              <w:t>작업 화면의 예상 완성도 막대·기준 충족 색과 Result의 실제 Replica로 체감</w:t>
             </w:r>
           </w:p>
         </w:tc>
@@ -7578,7 +7578,7 @@
           <w:numId w:val="7"/>
         </w:numPr>
       </w:pPr>
-      <w:bookmarkStart w:id="10" w:name="_Toc241661021"/>
+      <w:bookmarkStart w:id="10" w:name="_Toc241695177"/>
       <w:r>
         <w:lastRenderedPageBreak/>
         <w:t>성공</w:t>
@@ -7870,7 +7870,7 @@
           <w:numId w:val="7"/>
         </w:numPr>
       </w:pPr>
-      <w:bookmarkStart w:id="11" w:name="_Toc241661022"/>
+      <w:bookmarkStart w:id="11" w:name="_Toc241695178"/>
       <w:r>
         <w:t>Greed Decision</w:t>
       </w:r>
@@ -8239,7 +8239,7 @@
           <w:numId w:val="7"/>
         </w:numPr>
       </w:pPr>
-      <w:bookmarkStart w:id="12" w:name="_Toc241661023"/>
+      <w:bookmarkStart w:id="12" w:name="_Toc241695179"/>
       <w:r>
         <w:t>15~25</w:t>
       </w:r>
@@ -8609,7 +8609,7 @@
           <w:numId w:val="7"/>
         </w:numPr>
       </w:pPr>
-      <w:bookmarkStart w:id="13" w:name="_Toc241661024"/>
+      <w:bookmarkStart w:id="13" w:name="_Toc241695180"/>
       <w:r>
         <w:lastRenderedPageBreak/>
         <w:t>위조와</w:t>
@@ -8636,7 +8636,7 @@
           <w:numId w:val="7"/>
         </w:numPr>
       </w:pPr>
-      <w:bookmarkStart w:id="14" w:name="_Toc241661025"/>
+      <w:bookmarkStart w:id="14" w:name="_Toc241695181"/>
       <w:r>
         <w:t>Artifact</w:t>
       </w:r>
@@ -8915,7 +8915,7 @@
     </w:p>
     <w:p>
       <w:r>
-        <w:t>v1.0의 활성 위조는 Painting Surface Forgery 하나다. 한글 중심 Mode Title, 70점 제출 기준을 포함한 단일 예상 품질, 남은 시간, Submit/Cancel과 하단 조작 안내를 사용한다. Object Assembly는 기존 구현과 자산을 삭제하지 않고 Deferred Expansion으로 보존하지만 현재 Runtime Assignment, UI Entry, Release Map과 Release Gate에는 포함하지 않는다.</w:t>
+        <w:t>v1.0의 활성 위조는 Painting Surface Forgery 하나다. 한글 중심 Mode Title, 색으로 제출 기준 충족을 구분하는 단일 예상 완성도 진행 막대, 남은 시간, Submit/Cancel과 하단 조작 안내를 사용한다. Object Assembly는 기존 구현과 자산을 삭제하지 않고 Deferred Expansion으로 보존하지만 현재 Runtime Assignment, UI Entry, Release Map과 Release Gate에는 포함하지 않는다.</w:t>
       </w:r>
     </w:p>
     <w:p/>
@@ -8937,7 +8937,7 @@
           <w:numId w:val="7"/>
         </w:numPr>
       </w:pPr>
-      <w:bookmarkStart w:id="15" w:name="_Toc241661026"/>
+      <w:bookmarkStart w:id="15" w:name="_Toc241695182"/>
       <w:r>
         <w:lastRenderedPageBreak/>
         <w:t xml:space="preserve">Surface Forgery </w:t>
@@ -8986,7 +8986,7 @@
         </w:numPr>
       </w:pPr>
       <w:r>
-        <w:t>Template Palette 2~8색 중 색을 고르고 승인된 Brush Size Preset을 전환해 Draw/Erase한다. 화면에는 현재 Palette, Drawing Content 안에서 크기가 다른 소/중/대 Brush 표식, 남은 시간과 ‘예상 품질 {점수}/100 · 제출 가능 70+’ 한 줄만 표시한다. 별도 InstructionText와 ModeStatusText는 표시하지 않는다. 별도 서버 점수나 중복된 품질 기준 문구는 표시하지 않고, Draw/Erase/Reset/Submit/Cancel 안내는 하단 한 줄로 통합한다. 예상 품질이 70 미만이면 Submit을 비활성화하며 Point Budget이나 판정 해상도 같은 기술 정보는 노출하지 않는다.</w:t>
+        <w:t>Template Palette 2~8색 중 색을 고르고 승인된 Brush Size Preset을 전환해 Draw/Erase한다. 화면에는 현재 Palette, Drawing Content 안에서 크기가 다른 소/중/대 Brush 표식과 남은 시간을 표시하고, 완성도는 ‘예상 완성도’ 라벨과 진행 막대로 표현한다. 예상 값이 높아지면 70 미만에서는 붉은색에서 주황색으로 변하고, 70점 기준과 기존 제출 활성 조건을 모두 만족할 때만 초록색과 ‘제출 가능’을 표시한다. 그 외에는 ‘보완 필요’로 표시하며 갱신 전의 이전 예상 값이 기준을 넘더라도 초록색을 유지하지 않는다. 작업 화면에 예상 점수 숫자와 70+ 문구는 표시하지 않는다. 별도 InstructionText와 ModeStatusText는 표시하지 않는다. 별도 서버 점수나 중복된 품질 기준 문구는 표시하지 않고, Draw/Erase/Reset/Submit/Cancel 안내는 하단 한 줄로 통합한다. 예상 품질이 70 미만이면 Submit을 비활성화하며 Point Budget이나 판정 해상도 같은 기술 정보는 노출하지 않는다.</w:t>
       </w:r>
     </w:p>
     <w:p>
@@ -9119,7 +9119,7 @@
           <w:numId w:val="7"/>
         </w:numPr>
       </w:pPr>
-      <w:bookmarkStart w:id="16" w:name="_Toc241661027"/>
+      <w:bookmarkStart w:id="16" w:name="_Toc241695183"/>
       <w:r>
         <w:lastRenderedPageBreak/>
         <w:t>Object Assembly — Deferred Expansion</w:t>
@@ -9187,7 +9187,7 @@
           <w:numId w:val="7"/>
         </w:numPr>
       </w:pPr>
-      <w:bookmarkStart w:id="17" w:name="_Toc241661028"/>
+      <w:bookmarkStart w:id="17" w:name="_Toc241695184"/>
       <w:r>
         <w:t>Quality</w:t>
       </w:r>
@@ -9476,7 +9476,7 @@
           <w:numId w:val="7"/>
         </w:numPr>
       </w:pPr>
-      <w:bookmarkStart w:id="18" w:name="_Toc241661029"/>
+      <w:bookmarkStart w:id="18" w:name="_Toc241695185"/>
       <w:r>
         <w:lastRenderedPageBreak/>
         <w:t>핵심</w:t>
@@ -9763,7 +9763,7 @@
           </w:tcPr>
           <w:p>
             <w:r>
-              <w:t>QUALITY 70 REQUIRED와 현재 예상 점수, Submit 비활성</w:t>
+              <w:t>예상 완성도 진행 막대의 기준 미달 색과 Submit 비활성</w:t>
             </w:r>
           </w:p>
         </w:tc>
@@ -9978,7 +9978,7 @@
           <w:numId w:val="7"/>
         </w:numPr>
       </w:pPr>
-      <w:bookmarkStart w:id="19" w:name="_Toc241661030"/>
+      <w:bookmarkStart w:id="19" w:name="_Toc241695186"/>
       <w:r>
         <w:t xml:space="preserve">Owner-only Forgery </w:t>
       </w:r>
@@ -10050,7 +10050,7 @@
               <w:keepNext/>
             </w:pPr>
             <w:r>
-              <w:t>한 문장 INSTRUCTION / TIME</w:t>
+              <w:t>남은 시간 / TIME</w:t>
             </w:r>
           </w:p>
         </w:tc>
@@ -10071,7 +10071,11 @@
               <w:keepNext/>
             </w:pPr>
             <w:r>
-              <w:t>예상 품질 · 제출 가능 70+</w:t>
+              <w:t>예상 완성도 진행 막대</w:t>
+            </w:r>
+            <w:r>
+              <w:br/>
+              <w:t>붉은색 → 주황색 / 제출 가능 초록색</w:t>
             </w:r>
           </w:p>
         </w:tc>
@@ -10225,7 +10229,7 @@
           <w:numId w:val="7"/>
         </w:numPr>
       </w:pPr>
-      <w:bookmarkStart w:id="20" w:name="_Toc241661031"/>
+      <w:bookmarkStart w:id="20" w:name="_Toc241695187"/>
       <w:r>
         <w:lastRenderedPageBreak/>
         <w:t>잠입</w:t>
@@ -10258,7 +10262,7 @@
           <w:numId w:val="7"/>
         </w:numPr>
       </w:pPr>
-      <w:bookmarkStart w:id="21" w:name="_Toc241661032"/>
+      <w:bookmarkStart w:id="21" w:name="_Toc241695188"/>
       <w:r>
         <w:t xml:space="preserve">First-Person </w:t>
       </w:r>
@@ -10317,7 +10321,7 @@
     </w:p>
     <w:p>
       <w:r>
-        <w:t>손전등은 F 키로 켜고 끄며 처음에는 꺼져 있다. 카메라가 향하는 곳을 비추고 동료도 그 빛을 볼 수 있다. PlayerOverlay는 [F] 손전등 ON/OFF를 항상 읽을 수 있게 표시한다. 인벤토리·지도·위조 화면에서는 토글하지 않으며, 기절·구금·탈출 또는 매치 종료 시 꺼진다. 배터리와 손전등 전용 경비 감지 규칙은 추가하지 않는다.</w:t>
+        <w:t>손전등은 F 키로 켜고 끄며 처음에는 꺼져 있다. 카메라가 향하는 곳을 비추고 동료도 그 빛을 볼 수 있다. PlayerOverlay는 손전등 아이콘, [F] 키와 ON/OFF 상태를 항상 읽을 수 있게 표시한다. 인벤토리·지도·위조 화면에서는 토글하지 않으며, 기절·구금·탈출 또는 매치 종료 시 꺼진다. 배터리와 손전등 전용 경비 감지 규칙은 추가하지 않는다.</w:t>
       </w:r>
     </w:p>
     <w:p>
@@ -10328,7 +10332,7 @@
           <w:numId w:val="7"/>
         </w:numPr>
       </w:pPr>
-      <w:bookmarkStart w:id="22" w:name="_Toc241661033"/>
+      <w:bookmarkStart w:id="22" w:name="_Toc241695189"/>
       <w:r>
         <w:t>Walk, Sprint, Weight, Footstep</w:t>
       </w:r>
@@ -10671,7 +10675,7 @@
           <w:numId w:val="7"/>
         </w:numPr>
       </w:pPr>
-      <w:bookmarkStart w:id="23" w:name="_Toc241661034"/>
+      <w:bookmarkStart w:id="23" w:name="_Toc241695190"/>
       <w:r>
         <w:t>Patrol Guard</w:t>
       </w:r>
@@ -11027,7 +11031,7 @@
           <w:numId w:val="7"/>
         </w:numPr>
       </w:pPr>
-      <w:bookmarkStart w:id="24" w:name="_Toc241661035"/>
+      <w:bookmarkStart w:id="24" w:name="_Toc241695191"/>
       <w:r>
         <w:t>CCTV</w:t>
       </w:r>
@@ -11278,7 +11282,7 @@
           <w:numId w:val="7"/>
         </w:numPr>
       </w:pPr>
-      <w:bookmarkStart w:id="25" w:name="_Toc241661036"/>
+      <w:bookmarkStart w:id="25" w:name="_Toc241695192"/>
       <w:r>
         <w:t>Stun, Arrest, Recovery</w:t>
       </w:r>
@@ -11352,7 +11356,7 @@
           <w:numId w:val="7"/>
         </w:numPr>
       </w:pPr>
-      <w:bookmarkStart w:id="26" w:name="_Toc241661037"/>
+      <w:bookmarkStart w:id="26" w:name="_Toc241695193"/>
       <w:r>
         <w:t>두</w:t>
       </w:r>
@@ -11829,7 +11833,7 @@
           <w:numId w:val="7"/>
         </w:numPr>
       </w:pPr>
-      <w:bookmarkStart w:id="27" w:name="_Toc241661038"/>
+      <w:bookmarkStart w:id="27" w:name="_Toc241695194"/>
       <w:r>
         <w:lastRenderedPageBreak/>
         <w:t>협동</w:t>
@@ -11856,7 +11860,7 @@
           <w:numId w:val="7"/>
         </w:numPr>
       </w:pPr>
-      <w:bookmarkStart w:id="28" w:name="_Toc241661039"/>
+      <w:bookmarkStart w:id="28" w:name="_Toc241695195"/>
       <w:r>
         <w:t>Role Switching</w:t>
       </w:r>
@@ -12264,7 +12268,7 @@
           <w:numId w:val="7"/>
         </w:numPr>
       </w:pPr>
-      <w:bookmarkStart w:id="29" w:name="_Toc241661040"/>
+      <w:bookmarkStart w:id="29" w:name="_Toc241695196"/>
       <w:r>
         <w:t>거리</w:t>
       </w:r>
@@ -12323,7 +12327,7 @@
           <w:numId w:val="7"/>
         </w:numPr>
       </w:pPr>
-      <w:bookmarkStart w:id="30" w:name="_Toc241661041"/>
+      <w:bookmarkStart w:id="30" w:name="_Toc241695197"/>
       <w:r>
         <w:t>Inventory, Loose Loot, Coin</w:t>
       </w:r>
@@ -12386,7 +12390,7 @@
           <w:numId w:val="7"/>
         </w:numPr>
       </w:pPr>
-      <w:bookmarkStart w:id="31" w:name="_Toc241661042"/>
+      <w:bookmarkStart w:id="31" w:name="_Toc241695198"/>
       <w:r>
         <w:t>Player Identity</w:t>
       </w:r>
@@ -12809,7 +12813,7 @@
           <w:numId w:val="7"/>
         </w:numPr>
       </w:pPr>
-      <w:bookmarkStart w:id="32" w:name="_Toc241661043"/>
+      <w:bookmarkStart w:id="32" w:name="_Toc241695199"/>
       <w:r>
         <w:t xml:space="preserve">Floor Plan Map </w:t>
       </w:r>
@@ -13021,7 +13025,7 @@
           <w:numId w:val="7"/>
         </w:numPr>
       </w:pPr>
-      <w:bookmarkStart w:id="33" w:name="_Toc241661044"/>
+      <w:bookmarkStart w:id="33" w:name="_Toc241695200"/>
       <w:r>
         <w:t>Shared Extraction</w:t>
       </w:r>
@@ -13101,7 +13105,7 @@
           <w:numId w:val="7"/>
         </w:numPr>
       </w:pPr>
-      <w:bookmarkStart w:id="34" w:name="_Toc241661045"/>
+      <w:bookmarkStart w:id="34" w:name="_Toc241695201"/>
       <w:r>
         <w:lastRenderedPageBreak/>
         <w:t xml:space="preserve">UI, </w:t>
@@ -13119,7 +13123,7 @@
     </w:p>
     <w:p>
       <w:r>
-        <w:t>메뉴와 작업 화면은 전시 도록을 펼쳐 보는 분위기로 통일한다. 먹색 바탕, 아이보리 종이 탭과 절제된 금색 테두리를 사용하고, 주요 행동은 밝은 종이 버튼으로 강조한다. 제목은 명조 계열, 본문과 수치는 고딕 계열로 구분한다. HUD는 월드 시야를 가리는 장식을 줄이고 미션·경계도·팀 상태의 판독성을 우선한다. 로비의 맵 선택은 각 박물관의 실제 장면을 보여준다.</w:t>
+        <w:t>UI는 박물관 전시 라벨의 절제된 분위기와 침입자의 간결한 작전 도구를 함께 표현한다. 먹색·아이보리·금색은 유지하되 장식 액자와 질감 패널을 반복하지 않는다. 제목에는 기존 명조, 본문·수치·조작 안내에는 기존 고딕을 사용한다. 작은 금색 강조, 얇은 구분선과 여백으로 정보 위계를 만들고 실제 작품과 월드 시야를 시각적 중심에 둔다. 메뉴·로비·작업·인벤토리·결과에도 같은 글꼴과 간격 체계를 적용한다.</w:t>
       </w:r>
     </w:p>
     <w:p>
@@ -13130,7 +13134,7 @@
           <w:numId w:val="7"/>
         </w:numPr>
       </w:pPr>
-      <w:bookmarkStart w:id="35" w:name="_Toc241661046"/>
+      <w:bookmarkStart w:id="35" w:name="_Toc241695202"/>
       <w:r>
         <w:t>HUD Information Architecture</w:t>
       </w:r>
@@ -13409,19 +13413,16 @@
           </w:tcPr>
           <w:p>
             <w:r>
-              <w:t>Inventory [TAB] 상태색 / QuickSlot 1~3</w:t>
+              <w:t>Coin [Q] / 손전등 Icon [F] ON·OFF / Inventory [TAB] 상태색</w:t>
             </w:r>
           </w:p>
         </w:tc>
       </w:tr>
     </w:tbl>
     <w:p>
-      <w:pPr>
-        <w:spacing w:after="0" w:line="20" w:lineRule="exact"/>
-        <w:rPr>
-          <w:sz w:val="2"/>
-        </w:rPr>
-      </w:pPr>
+      <w:r>
+        <w:t>HUD는 작은 미션 묶음, 경계도 10칸, 간결한 팀 상태 행과 도구 안내로 구성한다. 큰 장식 테두리를 제거하고 야간 화면에서 판독할 수 있는 먹색 받침을 필요한 영역에만 사용한다. 팀원 이름은 밝은 중립색으로 표시하고 플레이어 구분색은 작은 표식에 적용한다. 상태는 아이콘·문구로 함께 읽히게 하며 고정 네 팀 슬롯의 정보 구조는 유지한다.</w:t>
+      </w:r>
     </w:p>
     <w:p>
       <w:pPr>
@@ -13431,8 +13432,9 @@
           <w:numId w:val="7"/>
         </w:numPr>
       </w:pPr>
-      <w:bookmarkStart w:id="36" w:name="_Toc241661047"/>
-      <w:r>
+      <w:bookmarkStart w:id="36" w:name="_Toc241695203"/>
+      <w:r>
+        <w:lastRenderedPageBreak/>
         <w:t xml:space="preserve">Main HUD </w:t>
       </w:r>
       <w:r>
@@ -13602,11 +13604,11 @@
           </w:tcPr>
           <w:p>
             <w:r>
-              <w:t>TEAM CARD ×4</w:t>
+              <w:t>TEAM STATUS ×4</w:t>
             </w:r>
             <w:r>
               <w:br/>
-              <w:t>Profile · Name · Status · Mic</w:t>
+              <w:t>작은 Profile · Name · Status · Mic</w:t>
             </w:r>
           </w:p>
         </w:tc>
@@ -13628,16 +13630,7 @@
             </w:tcMar>
             <w:vAlign w:val="center"/>
           </w:tcPr>
-          <w:p>
-            <w:r>
-              <w:lastRenderedPageBreak/>
-              <w:t>INVENTORY [TAB]</w:t>
-            </w:r>
-            <w:r>
-              <w:br/>
-              <w:t>Light→Heavy Color</w:t>
-            </w:r>
-          </w:p>
+          <w:p/>
         </w:tc>
         <w:tc>
           <w:tcPr>
@@ -13667,11 +13660,15 @@
           </w:tcPr>
           <w:p>
             <w:r>
-              <w:t>QUICK SLOT ×3</w:t>
+              <w:t>COIN [Q] · 수량</w:t>
             </w:r>
             <w:r>
               <w:br/>
-              <w:t>Image · Count · Key</w:t>
+              <w:t>손전등 [F] ON/OFF</w:t>
+            </w:r>
+            <w:r>
+              <w:br/>
+              <w:t>가방 [TAB] · 상태색</w:t>
             </w:r>
           </w:p>
         </w:tc>
@@ -13746,7 +13743,7 @@
           <w:numId w:val="7"/>
         </w:numPr>
       </w:pPr>
-      <w:bookmarkStart w:id="37" w:name="_Toc241661048"/>
+      <w:bookmarkStart w:id="37" w:name="_Toc241695204"/>
       <w:r>
         <w:t>최소</w:t>
       </w:r>
@@ -13779,7 +13776,7 @@
         </w:numPr>
       </w:pPr>
       <w:r>
-        <w:t>좌측 상단은 ‘미션’, 남은 시간 MM : SS, 필수 목표 작품명과 ‘운반·확보 현재 / 목표’ 한 줄을 표시한다. 현재 값은 팀이 운반 중인 가치와 이미 반출한 가치의 합이며, 실제 반출 완료를 뜻하지 않는다. 작품명은 미획득 회색, 획득 초록이며 남은 시간이 60초 미만이면 시간만 빨간색으로 바꾼다.</w:t>
+        <w:t>좌측 상단은 ‘미션’, 남은 시간 MM : SS, 필수 목표 작품명과 ‘운반·확보 현재 / 목표’ 한 줄을 표시한다. 현재 값은 팀이 운반 중인 가치와 이미 반출한 가치의 합이며, 실제 반출 완료를 뜻하지 않는다. 작품명은 미획득 밝은 아이보리, 획득 초록이며 남은 시간이 60초 미만이면 시간만 빨간색으로 바꾼다.</w:t>
       </w:r>
     </w:p>
     <w:p>
@@ -13818,7 +13815,15 @@
         <w:t>경계도 아래 단일 사건 문구는 CCTV 발각, Laser 접촉, Guard 포획, Stun, Arrest 같은 현재 사건을 짧게 표시한 뒤 사라진다. 별도 Lockdown Countdown 문구는 사용하지 않는다.</w:t>
       </w:r>
     </w:p>
-    <w:p/>
+    <w:p>
+      <w:r>
+        <w:t xml:space="preserve">활성 도구 안내는 Coin의 이미지·수량·Q 키, 손전등의 아이콘·F 키·ON/OFF, 가방의 TAB 키로 정돈한다. 사용하지 않는 두 QuickSlot은 보이지 않게 접고 기능이나 아이템을 추가하지 않는다. 머리 위 이름표는 </w:t>
+      </w:r>
+      <w:r>
+        <w:lastRenderedPageBreak/>
+        <w:t>바깥 배경 테두리 없이 이름과 상태를 표시한다. 위조 화면은 원본과 작업 면적의 위계를 맞추고 남은 시간·선택 도구·제출 가능 여부를 선명하게 구분한다. 예상 완성도는 진행 막대의 길이와 붉은색·주황색·초록색으로 읽히게 하고 예상 점수 숫자는 표시하지 않는다. 팔레트는 원래 색과 고정 크기를 유지하고 선택 상태는 외곽선으로만 강조한다.</w:t>
+      </w:r>
+    </w:p>
     <w:p>
       <w:pPr>
         <w:pStyle w:val="21"/>
@@ -13827,7 +13832,7 @@
           <w:numId w:val="7"/>
         </w:numPr>
       </w:pPr>
-      <w:bookmarkStart w:id="38" w:name="_Toc241661049"/>
+      <w:bookmarkStart w:id="38" w:name="_Toc241695205"/>
       <w:r>
         <w:t xml:space="preserve">Input Mode </w:t>
       </w:r>
@@ -14129,7 +14134,6 @@
               <w:rPr>
                 <w:sz w:val="16"/>
               </w:rPr>
-              <w:lastRenderedPageBreak/>
               <w:t>Map</w:t>
             </w:r>
           </w:p>
@@ -14308,7 +14312,7 @@
           <w:numId w:val="7"/>
         </w:numPr>
       </w:pPr>
-      <w:bookmarkStart w:id="39" w:name="_Toc241661050"/>
+      <w:bookmarkStart w:id="39" w:name="_Toc241695206"/>
       <w:r>
         <w:t>Floor Plan</w:t>
       </w:r>
@@ -14331,7 +14335,7 @@
           <w:numId w:val="7"/>
         </w:numPr>
       </w:pPr>
-      <w:bookmarkStart w:id="40" w:name="_Toc241661051"/>
+      <w:bookmarkStart w:id="40" w:name="_Toc241695207"/>
       <w:r>
         <w:t xml:space="preserve">Floor Plan Map </w:t>
       </w:r>
@@ -14646,7 +14650,7 @@
           <w:numId w:val="7"/>
         </w:numPr>
       </w:pPr>
-      <w:bookmarkStart w:id="41" w:name="_Toc241661052"/>
+      <w:bookmarkStart w:id="41" w:name="_Toc241695208"/>
       <w:r>
         <w:t xml:space="preserve">Team Result / Replica Recap </w:t>
       </w:r>
@@ -14806,12 +14810,9 @@
       </w:tr>
     </w:tbl>
     <w:p>
-      <w:pPr>
-        <w:spacing w:after="0" w:line="20" w:lineRule="exact"/>
-        <w:rPr>
-          <w:sz w:val="2"/>
-        </w:rPr>
-      </w:pPr>
+      <w:r>
+        <w:t>지도는 현재 탐색·정보 공개 규칙을 유지하며 평면도와 범례를 우선한다. 결과는 계약 성패, 팀 확보 가치와 실제 Replica 작품을 먼저 보여주고 개별 기여·세부 내역은 기존 상세 보기에서 확인하게 한다. 로비는 맵 선택과 준비 상태의 구분을 명확히 하고 반복되는 대형 장식 카드의 밀도를 낮춘다. 로비·결과·환경설정은 항목 제목과 대응 행의 열 시작점을 맞추고 같은 열 안의 문자 정렬을 유지한다. 결과의 긴 플레이어 이름은 상태·가치 열에 가리지 않도록 충분한 폭을 우선 배정한다. 버튼 문구는 버튼 영역의 가로·세로 중앙에 둔다.</w:t>
+      </w:r>
     </w:p>
     <w:tbl>
       <w:tblPr>
@@ -15009,12 +15010,9 @@
       </w:tr>
     </w:tbl>
     <w:p>
-      <w:pPr>
-        <w:spacing w:after="0" w:line="20" w:lineRule="exact"/>
-        <w:rPr>
-          <w:sz w:val="2"/>
-        </w:rPr>
-      </w:pPr>
+      <w:r>
+        <w:t>작성하는 UI 크기·간격·패딩·오프셋·아이콘과 UMG에 표시되는 글꼴 크기는 소수점 없는 4의 배수를 사용한다. 앵커·정렬·색·불투명도 등 비율 값, 진행 막대의 동적 비율, DPI 변환과 월드에서 투영되는 동적 위치는 이 격자와 구분한다. 작품과 프로필 이미지는 원본 비율을 보존한다. 기존 글꼴·아이콘을 우선 재사용하고 도록 이미지는 전체 이미지로 표시해 가장자리를 늘이거나 조각내지 않는다.</w:t>
+      </w:r>
     </w:p>
     <w:p>
       <w:pPr>
@@ -15024,7 +15022,7 @@
           <w:numId w:val="7"/>
         </w:numPr>
       </w:pPr>
-      <w:bookmarkStart w:id="42" w:name="_Toc241661053"/>
+      <w:bookmarkStart w:id="42" w:name="_Toc241695209"/>
       <w:r>
         <w:t>첫</w:t>
       </w:r>
@@ -15161,7 +15159,6 @@
           </w:tcPr>
           <w:p>
             <w:r>
-              <w:lastRenderedPageBreak/>
               <w:t>관찰→위조→Submit 후 월드 복귀→회수 대기 케이스 재접근→교체 소음→Grid 운반→Deposit</w:t>
             </w:r>
           </w:p>
@@ -15299,7 +15296,7 @@
           <w:numId w:val="7"/>
         </w:numPr>
       </w:pPr>
-      <w:bookmarkStart w:id="43" w:name="_Toc241661054"/>
+      <w:bookmarkStart w:id="43" w:name="_Toc241695210"/>
       <w:r>
         <w:t>접근성</w:t>
       </w:r>
@@ -15371,7 +15368,7 @@
           <w:numId w:val="7"/>
         </w:numPr>
       </w:pPr>
-      <w:bookmarkStart w:id="44" w:name="_Toc241661055"/>
+      <w:bookmarkStart w:id="44" w:name="_Toc241695211"/>
       <w:r>
         <w:lastRenderedPageBreak/>
         <w:t>레벨</w:t>
@@ -15419,7 +15416,7 @@
           <w:numId w:val="7"/>
         </w:numPr>
       </w:pPr>
-      <w:bookmarkStart w:id="45" w:name="_Toc241661056"/>
+      <w:bookmarkStart w:id="45" w:name="_Toc241695212"/>
       <w:r>
         <w:t>세</w:t>
       </w:r>
@@ -15539,7 +15536,7 @@
       <w:pPr>
         <w:pStyle w:val="31"/>
       </w:pPr>
-      <w:bookmarkStart w:id="46" w:name="_Toc241661057"/>
+      <w:bookmarkStart w:id="46" w:name="_Toc241695213"/>
       <w:r>
         <w:t>전시</w:t>
       </w:r>
@@ -15611,7 +15608,7 @@
           <w:numId w:val="7"/>
         </w:numPr>
       </w:pPr>
-      <w:bookmarkStart w:id="47" w:name="_Toc241661058"/>
+      <w:bookmarkStart w:id="47" w:name="_Toc241695214"/>
       <w:r>
         <w:t>맵</w:t>
       </w:r>
@@ -16038,7 +16035,7 @@
           <w:numId w:val="7"/>
         </w:numPr>
       </w:pPr>
-      <w:bookmarkStart w:id="48" w:name="_Toc241661059"/>
+      <w:bookmarkStart w:id="48" w:name="_Toc241695215"/>
       <w:r>
         <w:lastRenderedPageBreak/>
         <w:t xml:space="preserve">M01 — </w:t>
@@ -16352,7 +16349,7 @@
           <w:numId w:val="7"/>
         </w:numPr>
       </w:pPr>
-      <w:bookmarkStart w:id="49" w:name="_Toc241661060"/>
+      <w:bookmarkStart w:id="49" w:name="_Toc241695216"/>
       <w:r>
         <w:lastRenderedPageBreak/>
         <w:t xml:space="preserve">M02 — </w:t>
@@ -16370,7 +16367,7 @@
     </w:p>
     <w:p>
       <w:r>
-        <w:t>108×88m의 중정형 동양미술관이다. 30×27.5m 정원과 폭 5.5~6m 순환 회랑을 중심으로 21개 구역을 23개 문으로 연결한다. 남서측 전실의 두 꺾임 뒤 정원이 드러나며, 벽에 붙은 입구 병풍과 버튼 대기용 차폐벽, 정원 안의 수면·식재·정자를 정돈해 배치한다. 비스듬한 독립 가림막과 회랑에 흩어진 바위·관목은 배치하지 않는다. 세 CCTV 지름길은 긴 우회 동선과 위험을 교환하고 북동·남동 선택실에 Laser를 둔다. 필수 작품은 동측 E2 전시실의 동쪽 벽에 둔다. 북동 고가실과 E2 사이의 바로 옆 출입문을 닫고, 북쪽 관리 회랑을 일반 우회·이탈로로 유지한다. 북동 버튼은 전시실 북동 모서리, 남동 버튼은 진입문의 동쪽 벽감에 두어 통과 순찰선과 분리한다. 벽 높이는 4.4m이며 목재·동장 프레임·낮은 정원 식재로 관람 공간의 질서를 유지한다. 남동 고가실과 증거실 사이의 중복 지름길도 닫고 서쪽 S3 전시실을 통한 일반 출입·이탈을 유지한다. 차폐벽 아래의 버튼은 국소 조명으로 식별성을 유지한다. 남동 보안 구역은 E1 전시실에서만 진입하며 남쪽 관리 회랑의 구금실 직통 문을 닫는다. 입구 안쪽 벽의 서쪽을 돌아 압수품 보관실과 구금실로 진입하고 기존 남측 순찰에 이 구역 왕복을 포함한다.</w:t>
+        <w:t>108×88m의 중정형 동양미술관이다. 30×27.5m 중앙 공간과 폭 5.5~6m 순환 회랑을 중심으로 21개 구역을 23개 문으로 연결한다. 남서측 전실의 두 꺾임 뒤 중앙 공간이 드러나며, 벽에 붙은 입구 병풍과 버튼 대기용 차폐벽은 유지한다. 중앙은 기존 에셋의 넓은 잎과 높낮이 식재를 밀도 있게 잇는 넓은 식재 섬으로 구성한다. 암석은 보조로 두고 네 방향 순환 통행과 방향 기준점을 유지한다. 천장 조명으로 식재 윤곽과 높이 층을 알아볼 만큼 밝히고 주변 통로의 야간 어둠은 유지한다. 비스듬한 독립 가림막과 회랑에 흩어진 바위·관목은 배치하지 않는다. 세 CCTV 지름길은 긴 우회 동선과 위험을 교환하고 북동·남동 선택실에 Laser를 둔다. 필수 작품은 동측 E2 전시실의 동쪽 벽에 둔다. 북동 고가실과 E2 사이의 바로 옆 출입문을 닫고, 북쪽 관리 회랑을 일반 우회·이탈로로 유지한다. 북동 버튼은 전시실 북동 모서리, 남동 버튼은 진입문의 동쪽 벽감에 두어 통과 순찰선과 분리한다. 벽 높이는 4.4m이며 목재·동장 프레임·중앙 식재로 관람 공간의 질서를 유지한다. 남동 고가실과 증거실 사이의 중복 지름길도 닫고 서쪽 S3 전시실을 통한 일반 출입·이탈을 유지한다. 차폐벽 아래의 버튼은 국소 조명으로 식별성을 유지한다. 남동 보안 구역은 E1 전시실에서만 진입하며 남쪽 관리 회랑의 구금실 직통 문을 닫는다. 입구 안쪽 벽의 서쪽을 돌아 압수품 보관실과 구금실로 진입하고 기존 남측 순찰에 이 구역 왕복을 포함한다.</w:t>
       </w:r>
     </w:p>
     <w:tbl>
@@ -16663,7 +16660,7 @@
           <w:numId w:val="7"/>
         </w:numPr>
       </w:pPr>
-      <w:bookmarkStart w:id="50" w:name="_Toc241661061"/>
+      <w:bookmarkStart w:id="50" w:name="_Toc241695217"/>
       <w:r>
         <w:lastRenderedPageBreak/>
         <w:t xml:space="preserve">M03 — </w:t>
@@ -16969,7 +16966,7 @@
           <w:numId w:val="7"/>
         </w:numPr>
       </w:pPr>
-      <w:bookmarkStart w:id="51" w:name="_Toc241661062"/>
+      <w:bookmarkStart w:id="51" w:name="_Toc241695218"/>
       <w:r>
         <w:lastRenderedPageBreak/>
         <w:t xml:space="preserve">First-Person </w:t>
@@ -17053,7 +17050,7 @@
           <w:numId w:val="7"/>
         </w:numPr>
       </w:pPr>
-      <w:bookmarkStart w:id="52" w:name="_Toc241661063"/>
+      <w:bookmarkStart w:id="52" w:name="_Toc241695219"/>
       <w:r>
         <w:t>사운드</w:t>
       </w:r>
@@ -17493,7 +17490,7 @@
           <w:numId w:val="7"/>
         </w:numPr>
       </w:pPr>
-      <w:bookmarkStart w:id="53" w:name="_Toc241661064"/>
+      <w:bookmarkStart w:id="53" w:name="_Toc241695220"/>
       <w:r>
         <w:lastRenderedPageBreak/>
         <w:t>세계관과</w:t>
@@ -17740,7 +17737,7 @@
           <w:numId w:val="7"/>
         </w:numPr>
       </w:pPr>
-      <w:bookmarkStart w:id="54" w:name="_Toc241661065"/>
+      <w:bookmarkStart w:id="54" w:name="_Toc241695221"/>
       <w:r>
         <w:lastRenderedPageBreak/>
         <w:t>범위</w:t>
@@ -17767,7 +17764,7 @@
           <w:numId w:val="7"/>
         </w:numPr>
       </w:pPr>
-      <w:bookmarkStart w:id="55" w:name="_Toc241661066"/>
+      <w:bookmarkStart w:id="55" w:name="_Toc241695222"/>
       <w:r>
         <w:t>v1.0 Required Scope</w:t>
       </w:r>
@@ -18135,7 +18132,7 @@
           <w:numId w:val="7"/>
         </w:numPr>
       </w:pPr>
-      <w:bookmarkStart w:id="56" w:name="_Toc241661067"/>
+      <w:bookmarkStart w:id="56" w:name="_Toc241695223"/>
       <w:r>
         <w:t>Deferred Expansion</w:t>
       </w:r>
@@ -18159,7 +18156,7 @@
           <w:numId w:val="7"/>
         </w:numPr>
       </w:pPr>
-      <w:bookmarkStart w:id="57" w:name="_Toc241661068"/>
+      <w:bookmarkStart w:id="57" w:name="_Toc241695224"/>
       <w:r>
         <w:t>Stretch</w:t>
       </w:r>
@@ -18537,7 +18534,7 @@
           <w:numId w:val="7"/>
         </w:numPr>
       </w:pPr>
-      <w:bookmarkStart w:id="58" w:name="_Toc241661069"/>
+      <w:bookmarkStart w:id="58" w:name="_Toc241695225"/>
       <w:r>
         <w:lastRenderedPageBreak/>
         <w:t>Starting Balance Targets</w:t>
@@ -19136,7 +19133,7 @@
           <w:numId w:val="7"/>
         </w:numPr>
       </w:pPr>
-      <w:bookmarkStart w:id="59" w:name="_Toc241661070"/>
+      <w:bookmarkStart w:id="59" w:name="_Toc241695226"/>
       <w:r>
         <w:t>Playtest Questions</w:t>
       </w:r>
@@ -19222,7 +19219,7 @@
           <w:numId w:val="7"/>
         </w:numPr>
       </w:pPr>
-      <w:bookmarkStart w:id="60" w:name="_Toc241661071"/>
+      <w:bookmarkStart w:id="60" w:name="_Toc241695227"/>
       <w:r>
         <w:lastRenderedPageBreak/>
         <w:t>Release KPI</w:t>
@@ -19554,7 +19551,7 @@
           <w:numId w:val="7"/>
         </w:numPr>
       </w:pPr>
-      <w:bookmarkStart w:id="61" w:name="_Toc241661072"/>
+      <w:bookmarkStart w:id="61" w:name="_Toc241695228"/>
       <w:r>
         <w:t>W6~W12 Roadmap</w:t>
       </w:r>
@@ -19920,7 +19917,7 @@
         <w:keepLines/>
         <w:pageBreakBefore w:val="0"/>
       </w:pPr>
-      <w:bookmarkStart w:id="62" w:name="_Toc241661073"/>
+      <w:bookmarkStart w:id="62" w:name="_Toc241695229"/>
       <w:r>
         <w:t>Appendix A — 용어</w:t>
       </w:r>
@@ -20311,7 +20308,7 @@
         <w:keepLines/>
         <w:pageBreakBefore w:val="0"/>
       </w:pPr>
-      <w:bookmarkStart w:id="63" w:name="_Toc241661074"/>
+      <w:bookmarkStart w:id="63" w:name="_Toc241695230"/>
       <w:r>
         <w:rPr>
           <w:sz w:val="32"/>
@@ -20535,7 +20532,7 @@
         <w:keepLines/>
         <w:pageBreakBefore w:val="0"/>
       </w:pPr>
-      <w:bookmarkStart w:id="64" w:name="_Toc241661075"/>
+      <w:bookmarkStart w:id="64" w:name="_Toc241695231"/>
       <w:r>
         <w:rPr>
           <w:sz w:val="32"/>

</xml_diff>

<commit_message>
Refine lobby cards and forgery similarity UI
Updates the UI polish pass to match the approved catalogue rules: forgery preview now uses a fixed `작품 유사도` label with neutral text color while readiness is shown only through the progress bar color/state, and lobby layouts are rebalanced with square player cards, centered profile blocks, 16:9 map thumbnails, and tighter shared widths/gaps. Editor automation scripts were also extended with configurable QA output folders/asset filters plus new audit/render checks (including two-player lobby fixtures), and AGENTS/GDD/TDD plus related widget assets were synced to the same contract wording and layout metrics.
</commit_message>
<xml_diff>
--- a/Museum_Heist_GDD.docx
+++ b/Museum_Heist_GDD.docx
@@ -7508,7 +7508,7 @@
           </w:tcPr>
           <w:p>
             <w:r>
-              <w:t>작업 화면의 예상 완성도 막대·기준 충족 색과 Result의 실제 Replica로 체감</w:t>
+              <w:t>작업 화면의 작품 유사도 막대·기준 충족 색과 Result의 실제 Replica로 체감</w:t>
             </w:r>
           </w:p>
         </w:tc>
@@ -8915,7 +8915,7 @@
     </w:p>
     <w:p>
       <w:r>
-        <w:t>v1.0의 활성 위조는 Painting Surface Forgery 하나다. 한글 중심 Mode Title, 색으로 제출 기준 충족을 구분하는 단일 예상 완성도 진행 막대, 남은 시간, Submit/Cancel과 하단 조작 안내를 사용한다. Object Assembly는 기존 구현과 자산을 삭제하지 않고 Deferred Expansion으로 보존하지만 현재 Runtime Assignment, UI Entry, Release Map과 Release Gate에는 포함하지 않는다.</w:t>
+        <w:t>v1.0의 활성 위조는 Painting Surface Forgery 하나다. 한글 중심 Mode Title, 색으로 제출 기준 충족을 구분하는 단일 작품 유사도 진행 막대, 남은 시간, Submit/Cancel과 하단 조작 안내를 사용한다. Object Assembly는 기존 구현과 자산을 삭제하지 않고 Deferred Expansion으로 보존하지만 현재 Runtime Assignment, UI Entry, Release Map과 Release Gate에는 포함하지 않는다.</w:t>
       </w:r>
     </w:p>
     <w:p/>
@@ -8986,7 +8986,7 @@
         </w:numPr>
       </w:pPr>
       <w:r>
-        <w:t>Template Palette 2~8색 중 색을 고르고 승인된 Brush Size Preset을 전환해 Draw/Erase한다. 화면에는 현재 Palette, Drawing Content 안에서 크기가 다른 소/중/대 Brush 표식과 남은 시간을 표시하고, 완성도는 ‘예상 완성도’ 라벨과 진행 막대로 표현한다. 예상 값이 높아지면 70 미만에서는 붉은색에서 주황색으로 변하고, 70점 기준과 기존 제출 활성 조건을 모두 만족할 때만 초록색과 ‘제출 가능’을 표시한다. 그 외에는 ‘보완 필요’로 표시하며 갱신 전의 이전 예상 값이 기준을 넘더라도 초록색을 유지하지 않는다. 작업 화면에 예상 점수 숫자와 70+ 문구는 표시하지 않는다. 별도 InstructionText와 ModeStatusText는 표시하지 않는다. 별도 서버 점수나 중복된 품질 기준 문구는 표시하지 않고, Draw/Erase/Reset/Submit/Cancel 안내는 하단 한 줄로 통합한다. 예상 품질이 70 미만이면 Submit을 비활성화하며 Point Budget이나 판정 해상도 같은 기술 정보는 노출하지 않는다.</w:t>
+        <w:t>Template Palette 2~8색 중 색을 고르고 승인된 Brush Size Preset을 전환해 Draw/Erase한다. 화면에는 현재 Palette, Drawing Content 안에서 크기가 다른 소/중/대 Brush 표식과 남은 시간을 표시하고, ‘작품 유사도’ 고정 라벨과 진행 막대로 표현한다. 예상 값이 높아지면 70 미만에서는 붉은색에서 주황색으로 변하고, 70점 기준과 기존 제출 활성 조건을 모두 만족할 때만 초록색을 표시한다. 갱신 전의 이전 예상 값이 기준을 넘더라도 Submit이 비활성이면 초록색을 유지하지 않는다. 라벨은 상태와 무관하게 고정하며 별도 상태 문구를 표시하지 않는다. 작업 화면에 예상 점수 숫자와 70+ 문구는 표시하지 않는다. 별도 InstructionText와 ModeStatusText는 표시하지 않는다. 별도 서버 점수나 중복된 품질 기준 문구는 표시하지 않고, Draw/Erase/Reset/Submit/Cancel 안내는 하단 한 줄로 통합한다. 예상 품질이 70 미만이면 Submit을 비활성화하며 Point Budget이나 판정 해상도 같은 기술 정보는 노출하지 않는다.</w:t>
       </w:r>
     </w:p>
     <w:p>
@@ -9763,7 +9763,7 @@
           </w:tcPr>
           <w:p>
             <w:r>
-              <w:t>예상 완성도 진행 막대의 기준 미달 색과 Submit 비활성</w:t>
+              <w:t>작품 유사도 진행 막대의 기준 미달 색과 Submit 비활성</w:t>
             </w:r>
           </w:p>
         </w:tc>
@@ -10071,11 +10071,11 @@
               <w:keepNext/>
             </w:pPr>
             <w:r>
-              <w:t>예상 완성도 진행 막대</w:t>
+              <w:t>작품 유사도 진행 막대</w:t>
             </w:r>
             <w:r>
               <w:br/>
-              <w:t>붉은색 → 주황색 / 제출 가능 초록색</w:t>
+              <w:t>붉은색 → 주황색 / Submit 활성 시 초록색</w:t>
             </w:r>
           </w:p>
         </w:tc>
@@ -13821,7 +13821,7 @@
       </w:r>
       <w:r>
         <w:lastRenderedPageBreak/>
-        <w:t>바깥 배경 테두리 없이 이름과 상태를 표시한다. 위조 화면은 원본과 작업 면적의 위계를 맞추고 남은 시간·선택 도구·제출 가능 여부를 선명하게 구분한다. 예상 완성도는 진행 막대의 길이와 붉은색·주황색·초록색으로 읽히게 하고 예상 점수 숫자는 표시하지 않는다. 팔레트는 원래 색과 고정 크기를 유지하고 선택 상태는 외곽선으로만 강조한다.</w:t>
+        <w:t>바깥 배경 테두리 없이 이름과 상태를 표시한다. 위조 화면은 원본과 작업 면적의 위계를 맞추고 남은 시간·선택 도구·제출 가능 여부를 선명하게 구분한다. 작품 유사도는 진행 막대의 길이와 붉은색·주황색·초록색으로 읽히게 하고 예상 점수 숫자는 표시하지 않는다. 팔레트는 원래 색과 고정 크기를 유지하고 선택 상태는 외곽선으로만 강조한다.</w:t>
       </w:r>
     </w:p>
     <w:p>
@@ -14811,7 +14811,7 @@
     </w:tbl>
     <w:p>
       <w:r>
-        <w:t>지도는 현재 탐색·정보 공개 규칙을 유지하며 평면도와 범례를 우선한다. 결과는 계약 성패, 팀 확보 가치와 실제 Replica 작품을 먼저 보여주고 개별 기여·세부 내역은 기존 상세 보기에서 확인하게 한다. 로비는 맵 선택과 준비 상태의 구분을 명확히 하고 반복되는 대형 장식 카드의 밀도를 낮춘다. 로비·결과·환경설정은 항목 제목과 대응 행의 열 시작점을 맞추고 같은 열 안의 문자 정렬을 유지한다. 결과의 긴 플레이어 이름은 상태·가치 열에 가리지 않도록 충분한 폭을 우선 배정한다. 버튼 문구는 버튼 영역의 가로·세로 중앙에 둔다.</w:t>
+        <w:t>지도는 현재 탐색·정보 공개 규칙을 유지하며 평면도와 범례를 우선한다. 결과는 계약 성패, 팀 확보 가치와 실제 Replica 작품을 먼저 보여주고 개별 기여·세부 내역은 기존 상세 보기에서 확인하게 한다. 로비는 맵 선택과 준비 상태의 구분을 명확히 하고 반복되는 대형 장식 카드의 밀도를 낮춘다. 로비·결과·환경설정은 항목 제목과 대응 행의 열 시작점을 맞추고 같은 열 안의 문자 정렬을 유지한다. 결과의 긴 플레이어 이름은 상태·가치 열에 가리지 않도록 충분한 폭을 우선 배정한다. 버튼 문구는 버튼 영역의 가로·세로 중앙에 둔다. 로비의 모든 플레이어 카드는 같은 크기의 카드와 정사각 프로필 이미지를 사용하고 좌우 여백을 대칭으로 통일해 같은 중심축에 정렬한다.</w:t>
       </w:r>
     </w:p>
     <w:tbl>

</xml_diff>

<commit_message>
Revamp co-op UI layout and widget wiring
Applied the approved 2026-10-01 cooperative UI refresh across HUD, lobby, forgery, settings, and result screens, including updated AGENTS/TDD/GDD guidance and refreshed Widget Blueprints. Added editor automation scripts to apply/render the new 1280x720 ScaleBox-based presentation safely. Updated C++ widget/viewmodel bindings to match the new layouts and behaviors (global lobby ready toggle, map card thumbnail/question handling, compact prompt and alert meter modes, revised team/result row presentation, settings slider fill bars, contract value text variants, and forgery reset/timer/score presentation updates).
</commit_message>
<xml_diff>
--- a/Museum_Heist_GDD.docx
+++ b/Museum_Heist_GDD.docx
@@ -8915,7 +8915,7 @@
     </w:p>
     <w:p>
       <w:r>
-        <w:t>v1.0의 활성 위조는 Painting Surface Forgery 하나다. 한글 중심 Mode Title, 색으로 제출 기준 충족을 구분하는 단일 작품 유사도 진행 막대, 남은 시간, Submit/Cancel과 하단 조작 안내를 사용한다. Object Assembly는 기존 구현과 자산을 삭제하지 않고 Deferred Expansion으로 보존하지만 현재 Runtime Assignment, UI Entry, Release Map과 Release Gate에는 포함하지 않는다.</w:t>
+        <w:t>v1.0의 활성 위조는 Painting Surface Forgery 하나다. 한글 중심 Mode Title, 색으로 제출 기준 충족을 구분하는 단일 작품 유사도 진행 막대, 남은 시간, Submit/Cancel을 사용한다. Object Assembly는 기존 구현과 자산을 삭제하지 않고 Deferred Expansion으로 보존하지만 현재 Runtime Assignment, UI Entry, Release Map과 Release Gate에는 포함하지 않는다.</w:t>
       </w:r>
     </w:p>
     <w:p/>
@@ -8986,7 +8986,7 @@
         </w:numPr>
       </w:pPr>
       <w:r>
-        <w:t>Template Palette 2~8색 중 색을 고르고 승인된 Brush Size Preset을 전환해 Draw/Erase한다. 화면에는 현재 Palette, Drawing Content 안에서 크기가 다른 소/중/대 Brush 표식과 남은 시간을 표시하고, ‘작품 유사도’ 고정 라벨과 진행 막대로 표현한다. 예상 값이 높아지면 70 미만에서는 붉은색에서 주황색으로 변하고, 70점 기준과 기존 제출 활성 조건을 모두 만족할 때만 초록색을 표시한다. 갱신 전의 이전 예상 값이 기준을 넘더라도 Submit이 비활성이면 초록색을 유지하지 않는다. 라벨은 상태와 무관하게 고정하며 별도 상태 문구를 표시하지 않는다. 작업 화면에 예상 점수 숫자와 70+ 문구는 표시하지 않는다. 별도 InstructionText와 ModeStatusText는 표시하지 않는다. 별도 서버 점수나 중복된 품질 기준 문구는 표시하지 않고, Draw/Erase/Reset/Submit/Cancel 안내는 하단 한 줄로 통합한다. 예상 품질이 70 미만이면 Submit을 비활성화하며 Point Budget이나 판정 해상도 같은 기술 정보는 노출하지 않는다.</w:t>
+        <w:t>Template Palette 2~8색 중 색을 고르고 승인된 Brush Size Preset을 전환해 Draw/Erase한다. 화면에는 현재 Palette, Drawing Content 안에서 크기가 다른 소/중/대 Brush 표식과 남은 시간을 표시하고, ‘작품 유사도’ 고정 라벨과 진행 막대로 표현한다. 예상 값이 높아지면 70 미만에서는 붉은색에서 주황색으로 변하고, 70점 기준과 기존 제출 활성 조건을 모두 만족할 때만 초록색을 표시한다. 갱신 전의 이전 예상 값이 기준을 넘더라도 Submit이 비활성이면 초록색을 유지하지 않는다. 라벨은 상태와 무관하게 고정하며 별도 상태 문구를 표시하지 않는다. 작업 화면에 예상 점수 숫자와 70+ 문구는 표시하지 않는다. 별도 InstructionText와 ModeStatusText는 표시하지 않는다. 별도 서버 점수나 중복된 품질 기준 문구는 표시하지 않고, Draw/Erase/Reset/Submit/Cancel 조작과 기존 버튼·키 안내는 유지하며 하단 통합 안내는 표시하지 않는다. 예상 품질이 70 미만이면 Submit을 비활성화하며 Point Budget이나 판정 해상도 같은 기술 정보는 노출하지 않는다.</w:t>
       </w:r>
     </w:p>
     <w:p>
@@ -10197,7 +10197,7 @@
           </w:tcPr>
           <w:p>
             <w:r>
-              <w:t>남은 시간 {0}</w:t>
+              <w:t>MM:SS</w:t>
             </w:r>
           </w:p>
         </w:tc>
@@ -13123,7 +13123,7 @@
     </w:p>
     <w:p>
       <w:r>
-        <w:t>UI는 박물관 전시 라벨의 절제된 분위기와 침입자의 간결한 작전 도구를 함께 표현한다. 먹색·아이보리·금색은 유지하되 장식 액자와 질감 패널을 반복하지 않는다. 제목에는 기존 명조, 본문·수치·조작 안내에는 기존 고딕을 사용한다. 작은 금색 강조, 얇은 구분선과 여백으로 정보 위계를 만들고 실제 작품과 월드 시야를 시각적 중심에 둔다. 메뉴·로비·작업·인벤토리·결과에도 같은 글꼴과 간격 체계를 적용한다.</w:t>
+        <w:t>UI는 협동 잠입 중 목표와 팀 상태를 빠르게 읽을 수 있는 간결한 구성으로 표현한다. 밝은 중립색 문자와 먹색 받침, 얇은 구분선과 여백을 사용하며 장식 액자·질감 패널을 반복하지 않는다. 금색과 상태색은 선택·위험·준비 여부에 필요한 작은 강조로 제한한다. 기존 글꼴·아이콘을 재사용하고 실제 작품과 월드 시야를 시각적 중심에 둔다. 메뉴·로비·작업·인벤토리·결과에도 같은 글꼴과 간격 체계를 적용한다.</w:t>
       </w:r>
     </w:p>
     <w:p>
@@ -13421,7 +13421,7 @@
     </w:tbl>
     <w:p>
       <w:r>
-        <w:t>HUD는 작은 미션 묶음, 경계도 10칸, 간결한 팀 상태 행과 도구 안내로 구성한다. 큰 장식 테두리를 제거하고 야간 화면에서 판독할 수 있는 먹색 받침을 필요한 영역에만 사용한다. 팀원 이름은 밝은 중립색으로 표시하고 플레이어 구분색은 작은 표식에 적용한다. 상태는 아이콘·문구로 함께 읽히게 하며 고정 네 팀 슬롯의 정보 구조는 유지한다.</w:t>
+        <w:t>HUD는 좌측 상단의 작은 미션 묶음과 그 아래 얇은 경계도 10칸, 좌측 중단의 팀 상태 네 행, 우측 하단의 F·Q·TAB 도구 안내로 구성한다. 중앙 아래에는 현재 상호작용의 E 키 힌트를 작게 표시한다. 팀 활동·상태는 이름보다 작게 표시하고 비어 있는 슬롯도 유지한다. 큰 장식 테두리를 제거하고 야간 화면에서 판독할 수 있는 먹색 받침을 필요한 영역에만 사용한다. 팀원 이름은 밝은 중립색으로 표시하며 플레이어 구분색은 작은 표식에 적용한다. 기존 사건 안내는 잠깐 표시한 뒤 숨긴다.</w:t>
       </w:r>
     </w:p>
     <w:p>
@@ -13492,18 +13492,18 @@
             <w:r>
               <w:t>미션</w:t>
             </w:r>
-            <w:r>
-              <w:br/>
+            <w:r/>
+            <w:r/>
+          </w:p>
+          <w:p>
+            <w:r>
               <w:t>MM : SS</w:t>
-            </w:r>
-            <w:r>
               <w:br/>
               <w:t>필수 목표 작품명</w:t>
-            </w:r>
-          </w:p>
-          <w:p>
-            <w:r>
+              <w:br/>
               <w:t>운반·확보 현재 / 목표</w:t>
+              <w:br/>
+              <w:t>얇은 경계도 10칸 / 사건 Text</w:t>
             </w:r>
           </w:p>
         </w:tc>
@@ -13548,13 +13548,8 @@
             <w:pPr>
               <w:keepNext/>
             </w:pPr>
-            <w:r>
-              <w:t>경계도 10칸</w:t>
-            </w:r>
-            <w:r>
-              <w:br/>
-              <w:t>사건 상태 Text</w:t>
-            </w:r>
+            <w:r/>
+            <w:r/>
           </w:p>
         </w:tc>
       </w:tr>
@@ -13575,7 +13570,13 @@
             </w:tcMar>
             <w:vAlign w:val="center"/>
           </w:tcPr>
-          <w:p/>
+          <w:p>
+            <w:r>
+              <w:t>TEAM STATUS ×4</w:t>
+              <w:br/>
+              <w:t>작은 Profile · Name · Status · Mic</w:t>
+            </w:r>
+          </w:p>
         </w:tc>
         <w:tc>
           <w:tcPr>
@@ -13603,13 +13604,8 @@
             <w:vAlign w:val="center"/>
           </w:tcPr>
           <w:p>
-            <w:r>
-              <w:t>TEAM STATUS ×4</w:t>
-            </w:r>
-            <w:r>
-              <w:br/>
-              <w:t>작은 Profile · Name · Status · Mic</w:t>
-            </w:r>
+            <w:r/>
+            <w:r/>
           </w:p>
         </w:tc>
       </w:tr>
@@ -13660,11 +13656,11 @@
           </w:tcPr>
           <w:p>
             <w:r>
+              <w:t>손전등 [F] ON/OFF</w:t>
+            </w:r>
+            <w:r>
+              <w:br/>
               <w:t>COIN [Q] · 수량</w:t>
-            </w:r>
-            <w:r>
-              <w:br/>
-              <w:t>손전등 [F] ON/OFF</w:t>
             </w:r>
             <w:r>
               <w:br/>
@@ -13776,7 +13772,7 @@
         </w:numPr>
       </w:pPr>
       <w:r>
-        <w:t>좌측 상단은 ‘미션’, 남은 시간 MM : SS, 필수 목표 작품명과 ‘운반·확보 현재 / 목표’ 한 줄을 표시한다. 현재 값은 팀이 운반 중인 가치와 이미 반출한 가치의 합이며, 실제 반출 완료를 뜻하지 않는다. 작품명은 미획득 밝은 아이보리, 획득 초록이며 남은 시간이 60초 미만이면 시간만 빨간색으로 바꾼다.</w:t>
+        <w:t>좌측 상단은 ‘미션’, 남은 시간 MM : SS, 필수 목표 작품명과 ‘운반·확보 현재 / 목표’ 한 줄을 표시한다. 현재 값은 팀이 운반 중인 가치와 이미 반출한 가치의 합이며, 실제 반출 완료를 뜻하지 않는다. 작품명은 미획득 밝은 중립색, 획득 초록이며 남은 시간이 60초 미만이면 시간만 빨간색으로 바꾼다.</w:t>
       </w:r>
     </w:p>
     <w:p>
@@ -13817,11 +13813,10 @@
     </w:p>
     <w:p>
       <w:r>
-        <w:t xml:space="preserve">활성 도구 안내는 Coin의 이미지·수량·Q 키, 손전등의 아이콘·F 키·ON/OFF, 가방의 TAB 키로 정돈한다. 사용하지 않는 두 QuickSlot은 보이지 않게 접고 기능이나 아이템을 추가하지 않는다. 머리 위 이름표는 </w:t>
-      </w:r>
-      <w:r>
-        <w:lastRenderedPageBreak/>
-        <w:t>바깥 배경 테두리 없이 이름과 상태를 표시한다. 위조 화면은 원본과 작업 면적의 위계를 맞추고 남은 시간·선택 도구·제출 가능 여부를 선명하게 구분한다. 작품 유사도는 진행 막대의 길이와 붉은색·주황색·초록색으로 읽히게 하고 예상 점수 숫자는 표시하지 않는다. 팔레트는 원래 색과 고정 크기를 유지하고 선택 상태는 외곽선으로만 강조한다.</w:t>
+        <w:t xml:space="preserve">활성 도구 안내는 손전등의 아이콘·F 키·ON/OFF, Coin의 이미지·수량·Q 키, 가방의 TAB 키 순으로 정돈한다. 사용하지 않는 두 QuickSlot은 보이지 않게 접고 기능이나 아이템을 추가하지 않는다. 머리 위 이름표는 </w:t>
+      </w:r>
+      <w:r>
+        <w:t>바깥 배경 테두리 없이 이름과 상태를 표시한다. 위조 화면은 복제 작업 왼쪽·팔레트 가운데·관찰한 원본 오른쪽으로 배치한다. 남은 시간은 머리글 오른쪽, 작품 유사도는 원본 위쪽에 두어 작업 면적과 제출 가능 여부를 선명하게 구분한다. 작품 유사도는 진행 막대의 길이와 붉은색·주황색·초록색으로 읽히게 하고 예상 점수 숫자는 표시하지 않는다. 팔레트는 원래 색과 고정 크기를 유지하고 선택 상태는 외곽선으로만 강조한다.</w:t>
       </w:r>
     </w:p>
     <w:p>
@@ -14811,7 +14806,7 @@
     </w:tbl>
     <w:p>
       <w:r>
-        <w:t>지도는 현재 탐색·정보 공개 규칙을 유지하며 평면도와 범례를 우선한다. 결과는 계약 성패, 팀 확보 가치와 실제 Replica 작품을 먼저 보여주고 개별 기여·세부 내역은 기존 상세 보기에서 확인하게 한다. 로비는 맵 선택과 준비 상태의 구분을 명확히 하고 반복되는 대형 장식 카드의 밀도를 낮춘다. 로비·결과·환경설정은 항목 제목과 대응 행의 열 시작점을 맞추고 같은 열 안의 문자 정렬을 유지한다. 결과의 긴 플레이어 이름은 상태·가치 열에 가리지 않도록 충분한 폭을 우선 배정한다. 버튼 문구는 버튼 영역의 가로·세로 중앙에 둔다. 로비의 모든 플레이어 카드는 같은 크기의 카드와 정사각 프로필 이미지를 사용하고 좌우 여백을 대칭으로 통일해 같은 중심축에 정렬한다.</w:t>
+        <w:t>지도는 현재 탐색·정보 공개 규칙을 유지하며 평면도와 범례를 우선한다. 결과는 계약 성패, 팀 확보 가치와 실제 Replica 작품을 먼저 보여준다. 기본 표는 플레이어·상태·확보 가치·최고 품질 네 열이며 나머지 기여 내역은 기존 상세 보기로 전환한다. 로비의 침입 장소는 이름 왼쪽·썸네일 오른쪽의 세로 스크롤 목록이며, 무작위의 물음표 그림 다음 M01·M02·M03 순으로 표시한다. 약 세 행을 보여 추가 맵을 스크롤로 찾게 한다. 팀 슬롯 네 개는 고정하며 이름 아래 준비 상태를 표시한다. 준비·준비 취소와 Host의 게임 시작은 공통 하단 영역에 둔다. 환경설정은 전체 화면의 머리글·설정 행·하단 작업 영역으로 구성한다. 로비·결과·환경설정의 제목과 대응 행은 같은 열 경계에 정렬하고 긴 플레이어 이름에는 상태·가치 열과 겹치지 않는 폭을 배정한다. 버튼 문구는 가로·세로 중앙에 둔다. 로비 플레이어 카드와 정사각 프로필은 같은 크기·중심축·대칭 여백을 사용한다.</w:t>
       </w:r>
     </w:p>
     <w:tbl>
@@ -15011,7 +15006,7 @@
     </w:tbl>
     <w:p>
       <w:r>
-        <w:t>작성하는 UI 크기·간격·패딩·오프셋·아이콘과 UMG에 표시되는 글꼴 크기는 소수점 없는 4의 배수를 사용한다. 앵커·정렬·색·불투명도 등 비율 값, 진행 막대의 동적 비율, DPI 변환과 월드에서 투영되는 동적 위치는 이 격자와 구분한다. 작품과 프로필 이미지는 원본 비율을 보존한다. 기존 글꼴·아이콘을 우선 재사용하고 도록 이미지는 전체 이미지로 표시해 가장자리를 늘이거나 조각내지 않는다.</w:t>
+        <w:t>작성하는 UI 크기·간격·패딩·오프셋·아이콘과 UMG에 표시되는 글꼴 크기는 소수점 없는 4의 배수를 사용한다. 앵커·정렬·색·불투명도 등 비율 값, 진행 막대의 동적 비율, DPI 변환과 월드에서 투영되는 동적 위치는 이 격자와 구분한다. 승인한 기준 화면의 전체 구성을 다른 해상도에도 같은 비율로 맞추며 부분별 크기나 배치를 따로 바꾸지 않는다. 작품과 프로필 이미지는 원본 비율을 보존한다. 기존 글꼴·아이콘을 우선 재사용하고 도록 이미지는 전체 이미지로 표시해 가장자리를 늘이거나 조각내지 않는다.</w:t>
       </w:r>
     </w:p>
     <w:p>

</xml_diff>

<commit_message>
Unify reusable UI presentation and integrate loose loot exhibits
Align settings, HUD, lobby, forgery and results with the approved shared image and widget composition. Preserve original UI art and update design documents.

Integrate existing loose loot anchors with exhibit supports across M01, M02 and M03, correct display transforms and rebuild navigation. Include placement, capture and verification tools.
</commit_message>
<xml_diff>
--- a/Museum_Heist_GDD.docx
+++ b/Museum_Heist_GDD.docx
@@ -13123,7 +13123,7 @@
     </w:p>
     <w:p>
       <w:r>
-        <w:t>UI는 협동 잠입 중 목표와 팀 상태를 빠르게 읽을 수 있는 간결한 구성으로 표현한다. 밝은 중립색 문자와 먹색 받침, 얇은 구분선과 여백을 사용하며 장식 액자·질감 패널을 반복하지 않는다. 금색과 상태색은 선택·위험·준비 여부에 필요한 작은 강조로 제한한다. 기존 글꼴·아이콘을 재사용하고 실제 작품과 월드 시야를 시각적 중심에 둔다. 메뉴·로비·작업·인벤토리·결과에도 같은 글꼴과 간격 체계를 적용한다.</w:t>
+        <w:t>UI는 협동 잠입 중 목표와 팀 상태를 빠르게 읽을 수 있는 간결한 구성으로 표현한다. 밝은 중립색 문자와 먹색 받침, 얇은 구분선과 여백을 사용하며 장식 액자·질감 패널을 반복하지 않는다. 금색과 상태색은 선택·위험·준비 여부에 필요한 작은 강조로 제한한다. 기존 글꼴과 새로 제작한 공용 아이콘을 사용하고 실제 작품과 월드 시야를 시각적 중심에 둔다. 메뉴·로비·작업·인벤토리·결과에도 같은 글꼴과 간격 체계를 적용한다. 손전등·가방·동전·프로필과 상태 아이콘은 같은 단순한 실루엣 체계로 읽히게 한다. 키 안내와 프레임은 모든 화면에 같은 규격을 사용하고 관련 라벨·값·막대는 한 묶음으로 정렬한다.</w:t>
       </w:r>
     </w:p>
     <w:p>
@@ -13421,7 +13421,7 @@
     </w:tbl>
     <w:p>
       <w:r>
-        <w:t>HUD는 좌측 상단의 작은 미션 묶음과 그 아래 얇은 경계도 10칸, 좌측 중단의 팀 상태 네 행, 우측 하단의 F·Q·TAB 도구 안내로 구성한다. 중앙 아래에는 현재 상호작용의 E 키 힌트를 작게 표시한다. 팀 활동·상태는 이름보다 작게 표시하고 비어 있는 슬롯도 유지한다. 큰 장식 테두리를 제거하고 야간 화면에서 판독할 수 있는 먹색 받침을 필요한 영역에만 사용한다. 팀원 이름은 밝은 중립색으로 표시하며 플레이어 구분색은 작은 표식에 적용한다. 기존 사건 안내는 잠깐 표시한 뒤 숨긴다.</w:t>
+        <w:t>HUD는 좌측 상단의 작은 미션 묶음과 그 아래 얇은 경계도 10칸, 좌측 중단의 작은 팀 상태 네 행, 우측 하단의 F·Q·TAB 도구 안내로 구성한다. 좌우 묶음은 넓은 화면에서도 실제 화면 가장자리에 붙이고 월드 시야를 확보한다. 중앙 아래에는 현재 상호작용의 E 키 힌트를 작게 표시한다. 팀 활동·상태는 이름보다 작게 표시하고 비어 있는 슬롯도 유지한다. 큰 장식 테두리를 제거하고 야간 화면에서 판독할 수 있는 먹색 받침을 필요한 영역에만 사용한다. 팀원 이름은 밝은 중립색으로 표시하며 플레이어 구분색은 작은 표식에 적용한다. 기존 사건 안내는 잠깐 표시한 뒤 숨긴다.</w:t>
       </w:r>
     </w:p>
     <w:p>
@@ -13501,7 +13501,7 @@
               <w:br/>
               <w:t>필수 목표 작품명</w:t>
               <w:br/>
-              <w:t>운반·확보 현재 / 목표</w:t>
+              <w:t>전리품 가치 현재 / 목표</w:t>
               <w:br/>
               <w:t>얇은 경계도 10칸 / 사건 Text</w:t>
             </w:r>
@@ -13660,7 +13660,7 @@
             </w:r>
             <w:r>
               <w:br/>
-              <w:t>COIN [Q] · 수량</w:t>
+              <w:t>동전 [Q] · 수량</w:t>
             </w:r>
             <w:r>
               <w:br/>
@@ -13772,7 +13772,7 @@
         </w:numPr>
       </w:pPr>
       <w:r>
-        <w:t>좌측 상단은 ‘미션’, 남은 시간 MM : SS, 필수 목표 작품명과 ‘운반·확보 현재 / 목표’ 한 줄을 표시한다. 현재 값은 팀이 운반 중인 가치와 이미 반출한 가치의 합이며, 실제 반출 완료를 뜻하지 않는다. 작품명은 미획득 밝은 중립색, 획득 초록이며 남은 시간이 60초 미만이면 시간만 빨간색으로 바꾼다.</w:t>
+        <w:t>좌측 상단은 ‘미션’, 남은 시간 MM : SS, 필수 목표 작품명과 ‘전리품 가치 현재 / 목표’ 한 줄을 표시한다. 현재 값은 팀이 운반 중인 가치와 이미 반출한 가치의 합이며, 실제 반출 완료를 뜻하지 않는다. 작품명은 미획득 밝은 중립색, 획득 초록이며 남은 시간이 60초 미만이면 시간만 빨간색으로 바꾼다.</w:t>
       </w:r>
     </w:p>
     <w:p>
@@ -13813,10 +13813,10 @@
     </w:p>
     <w:p>
       <w:r>
-        <w:t xml:space="preserve">활성 도구 안내는 손전등의 아이콘·F 키·ON/OFF, Coin의 이미지·수량·Q 키, 가방의 TAB 키 순으로 정돈한다. 사용하지 않는 두 QuickSlot은 보이지 않게 접고 기능이나 아이템을 추가하지 않는다. 머리 위 이름표는 </w:t>
-      </w:r>
-      <w:r>
-        <w:t>바깥 배경 테두리 없이 이름과 상태를 표시한다. 위조 화면은 복제 작업 왼쪽·팔레트 가운데·관찰한 원본 오른쪽으로 배치한다. 남은 시간은 머리글 오른쪽, 작품 유사도는 원본 위쪽에 두어 작업 면적과 제출 가능 여부를 선명하게 구분한다. 작품 유사도는 진행 막대의 길이와 붉은색·주황색·초록색으로 읽히게 하고 예상 점수 숫자는 표시하지 않는다. 팔레트는 원래 색과 고정 크기를 유지하고 선택 상태는 외곽선으로만 강조한다.</w:t>
+        <w:t xml:space="preserve">활성 도구 안내는 손전등·동전·가방의 아이콘을 기존보다 약 1.5배 크게 표시하고 F·Q·TAB 키 안내는 각 아이콘 아래에 정렬한다. 손전등 ON/OFF와 동전 수량은 기존 의미를 유지한다. 사용하지 않는 두 QuickSlot은 보이지 않게 접고 기능이나 아이템을 추가하지 않는다. 머리 위 이름표는 바깥 배경 테두리 없이 이름과 상태를 표시한다. 위조 화면은 위조품 왼쪽·팔레트 가운데·원본 오른쪽으로 배치한다. 남은 시간은 머리글 오른쪽, 작품 유사도는 원본 위쪽에 두어 작업 면적과 제출 가능 여부를 선명하게 구분한다. 작품 유사도는 진행 막대의 길이와 붉은색·주황색·초록색으로 읽히게 하고 예상 점수 숫자는 표시하지 않는다. 팔레트는 원래 색과 고정 크기를 유지하고 선택 상태는 외곽선으로만 강조한다. 작업 제목은 ‘위조품 제작’, R 안내는 ‘전체 지우기’로 표시하며 제출·취소와 작품 유사도 라벨은 유지한다.</w:t>
+      </w:r>
+      <w:r>
+        <w:t/>
       </w:r>
     </w:p>
     <w:p>
@@ -14806,7 +14806,7 @@
     </w:tbl>
     <w:p>
       <w:r>
-        <w:t>지도는 현재 탐색·정보 공개 규칙을 유지하며 평면도와 범례를 우선한다. 결과는 계약 성패, 팀 확보 가치와 실제 Replica 작품을 먼저 보여준다. 기본 표는 플레이어·상태·확보 가치·최고 품질 네 열이며 나머지 기여 내역은 기존 상세 보기로 전환한다. 로비의 침입 장소는 이름 왼쪽·썸네일 오른쪽의 세로 스크롤 목록이며, 무작위의 물음표 그림 다음 M01·M02·M03 순으로 표시한다. 약 세 행을 보여 추가 맵을 스크롤로 찾게 한다. 팀 슬롯 네 개는 고정하며 이름 아래 준비 상태를 표시한다. 준비·준비 취소와 Host의 게임 시작은 공통 하단 영역에 둔다. 환경설정은 전체 화면의 머리글·설정 행·하단 작업 영역으로 구성한다. 로비·결과·환경설정의 제목과 대응 행은 같은 열 경계에 정렬하고 긴 플레이어 이름에는 상태·가치 열과 겹치지 않는 폭을 배정한다. 버튼 문구는 가로·세로 중앙에 둔다. 로비 플레이어 카드와 정사각 프로필은 같은 크기·중심축·대칭 여백을 사용한다.</w:t>
+        <w:t>지도는 현재 탐색·정보 공개 규칙을 유지하며 평면도와 범례를 우선한다. 결과는 미션 성패, 팀 확보 가치와 실제 Replica 작품을 먼저 보여준다. 기본 표는 플레이어·상태·확보 가치·최고 유사도 네 열이며 상세 내역은 플레이어·위조·원본 회수·경비 유인·동료 구출·경보 발생 여섯 열로 전환한다. 요약과 상세 표는 동시에 표시하지 않는다. 결과 제목은 ‘미션 결과’, 성패는 ‘미션 성공’·‘부분 성공’·‘미션 실패’, 작품 점수는 ‘유사도’로 표시한다. 로비의 침입 장소는 이름 왼쪽·썸네일 오른쪽의 세로 스크롤 목록이며, 무작위의 물음표 그림 다음 M01·M02·M03 순으로 표시한다. 약 세 행을 보여 추가 맵을 스크롤로 찾게 한다. 침입 장소와 팀 목록의 상단을 같은 기준선에 맞추고 열 사이 여백과 행 구분선으로 영역을 나눈다. 참가 코드·복사·참가 인원·나가기는 상단의 한 행에 같은 문자 크기로 정렬한다. 팀 슬롯 네 개는 고정하며 이름 아래 준비 상태를 표시한다. 준비·준비 취소와 Host의 게임 시작은 공통 하단 영역에 둔다. 환경설정은 전체 화면의 머리글·설정 행·하단 작업 영역으로 구성하며 다른 메뉴보다 위에서 입력을 받는 모달로 연다. 상단 닫기는 제거하고 하단 ESC 닫기의 클릭과 Escape 키가 같은 닫기 동작을 수행한다. 로비·결과·환경설정의 제목과 대응 행은 같은 열 경계에 정렬하고 긴 플레이어 이름에는 상태·가치 열과 겹치지 않는 폭을 배정한다. 버튼 문구는 가로·세로 중앙에 둔다. 로비 플레이어 카드와 정사각 프로필은 같은 크기·중심축·대칭 여백을 사용한다. 로비 제목은 ‘대기실’, Host 표시는 ‘방장’, 준비 전은 ‘준비 안 됨’, 원본 운반 상태는 ‘원본 운반 중’, 구금 상태는 ‘구금 중’, Inventory 제목은 ‘가방’으로 표시한다. ‘활동 중’은 이동 여부를 뜻하지 않는 기존 활성 상태로 유지한다.</w:t>
       </w:r>
     </w:p>
     <w:tbl>
@@ -15006,7 +15006,7 @@
     </w:tbl>
     <w:p>
       <w:r>
-        <w:t>작성하는 UI 크기·간격·패딩·오프셋·아이콘과 UMG에 표시되는 글꼴 크기는 소수점 없는 4의 배수를 사용한다. 앵커·정렬·색·불투명도 등 비율 값, 진행 막대의 동적 비율, DPI 변환과 월드에서 투영되는 동적 위치는 이 격자와 구분한다. 승인한 기준 화면의 전체 구성을 다른 해상도에도 같은 비율로 맞추며 부분별 크기나 배치를 따로 바꾸지 않는다. 작품과 프로필 이미지는 원본 비율을 보존한다. 기존 글꼴·아이콘을 우선 재사용하고 도록 이미지는 전체 이미지로 표시해 가장자리를 늘이거나 조각내지 않는다.</w:t>
+        <w:t>작성하는 UI 크기·간격·패딩·오프셋·아이콘과 UMG에 표시되는 글꼴 크기는 소수점 없는 4의 배수를 사용한다. 앵커·정렬·색·불투명도 등 비율 값, 진행 막대의 동적 비율, DPI 변환과 월드에서 투영되는 동적 위치는 이 격자와 구분한다. 메뉴 화면은 승인한 기준 화면의 전체 비율을 유지한다. HUD는 1920×1080을 기준으로 작은 좌측 정보와 큰 우측 기능 아이콘을 각각 화면 가장자리에 배치하고 기존 프로젝트 DPI로 크기를 맞춘다. 작품과 프로필 이미지는 원본 비율을 보존한다. 기존 글꼴은 재사용하고 신규 공용 아이콘·키 안내·프레임은 화면마다 같은 규격으로 사용한다. 기존 도록 이미지는 전체 이미지로 표시해 가장자리를 늘이거나 조각내지 않는다.</w:t>
       </w:r>
     </w:p>
     <w:p>

</xml_diff>

<commit_message>
Add exhibit variation and loot case locking
Implemented the 2026-10-03 exhibit/loot rules across gameplay, data, and tooling. Contract setup now keeps all 60 painting cases visible, activates 12 per match with region-aware selection, assigns decorative templates to inactive cases, and validates release counts/regions; loose loot now spawns as 12 displayed cases with 5 active pickups and 7 decorative-only entries. Added exhibition case latch gameplay (server-authoritative timed unlock, ownership/cancel paths, new DisplayCaseLock sound ping, prompts/UI timing support), updated loot rows/meshes including Loot_SmallSculpture, and expanded automation/editor scripts and tests to verify assignment, visibility, locking, and pickup integrity.
</commit_message>
<xml_diff>
--- a/Museum_Heist_GDD.docx
+++ b/Museum_Heist_GDD.docx
@@ -6844,7 +6844,7 @@
               <w:pStyle w:val="TableText"/>
             </w:pPr>
             <w:r>
-              <w:t>전시실과 Loose Loot를 탐색하고 동선을 나눈다.</w:t>
+              <w:t>매치마다 달라지는 탈취 작품과 전시 케이스 전리품을 탐색하고 동선을 나눈다.</w:t>
             </w:r>
           </w:p>
         </w:tc>
@@ -8921,12 +8921,12 @@
     <w:p/>
     <w:p>
       <w:r>
-        <w:t>각 Release Map은 40종의 Surface Template 카탈로그를 유지한다. 서버는 MatchStart에 M01/M02에서는 20종, M03에서는 12종을 중복 없이 선택해 활성 Painting Exhibit에 한 작품씩 배정한다. Required Target도 이 수량에 포함된다. 플레이어는 Required Target, Quota, Alert와 남은 시간을 보고 추가 절도 여부를 결정한다. M03은 상호작용 작품 12개와 비상호작용 장식 48개, 총 60개를 사용한다. 액자는 Showcase 03a·04a·05a 세 종류로 제한하고 소형·중형·대형 세 단계의 정수 균등 스케일로 맞춰 실제 벽면과 출입구 경계 안에 분산한다.</w:t>
+        <w:t>각 Release Map은 40종의 Surface Template 카탈로그와 그림 전시 위치 60곳을 유지한다. 매치 시작 시 서버는 고정된 핵심 작품 한 점과 지역에 분산한 선택 작품 11점을 탈취 대상으로 고르고, 맵의 40종 중 12종을 중복 없이 배정한다. 나머지 48점은 그림이 보이는 장식으로 남고 상호작용하지 않는다. 장식 그림의 재질도 같은 매치 Seed로 섞되 중복을 허용하며 계약 수량·가치·결과 기록에 포함하지 않는다. 그림 위치·회전·승인된 정수 크기는 유지하고, 작품의 활성 여부와 그림 재질만 달라진다. 플레이어는 Required Target, Quota, Alert와 남은 시간을 보고 추가 절도 여부를 결정한다. 액자는 Showcase 03a·04a·05a 세 종류와 소형·중형·대형 정수 균등 스케일을 유지한다.</w:t>
       </w:r>
     </w:p>
     <w:p>
       <w:r>
-        <w:t>M01·M02·M03은 각각 탈취 가능한 작품 12점과 상호작용하지 않는 일반 전시물 48점, 총 60점을 배치한다. 일반 전시물은 단독·연작·다단 군집으로 전시실을 구성하고 탈취 대상과 같거나 더 큰 작품도 포함한다. 탈취 가능한 작품은 기존 프레임과 하단 보안 패널(바닥에 가까운 큰 액자는 낮은 측면 패널)로 접근 전에 구별한다. 작품 크기, 중앙 위치 또는 양옆의 일반 작품 수가 정답을 드러내는 고정 패턴을 사용하지 않는다. 근거리 행동 안내는 탈취 대상에만 표시하며, 필수 작품은 기존 계약 단서와 발견 표시를 따른다. 그림 크기는 현재 승인된 배치를 기준으로 유지한다. 과거의 1.5배·3배 확대를 반복 적용하지 않는다. 탈취 작품의 행동 영역은 작품 정면의 근거리로 한정한다. 벽 하단 걸레받이와 상단 몰딩은 벽에서 조금 돌출시키되 배율 작성 규칙과 표면 겹침 검사를 따른다.</w:t>
+        <w:t>M01·M02·M03의 기존 그림 60점은 모두 전시 후보이며, 매치마다 그중 12점만 탈취할 수 있고 나머지 48점은 일반 전시물로 보인다. 일반 전시물은 단독·연작·다단 군집으로 전시실을 구성하고 탈취 대상과 같거나 더 큰 작품도 포함한다. 이번 매치에서 활성화한 탈취 작품은 기존 프레임과 하단 보안 패널(바닥에 가까운 큰 액자는 낮은 측면 패널)로 접근 전에 구별한다. 작품 크기, 중앙 위치 또는 양옆의 일반 작품 수가 정답을 드러내는 고정 패턴을 사용하지 않는다. 근거리 행동 안내는 탈취 대상에만 표시하며, 필수 작품은 기존 계약 단서와 발견 표시를 따른다. 그림 크기는 현재 승인된 배치를 기준으로 유지한다. 과거의 1.5배·3배 확대를 반복 적용하지 않는다. 탈취 작품의 행동 영역은 작품 정면의 근거리로 한정한다. 벽 하단 걸레받이와 상단 몰딩은 벽에서 조금 돌출시키되 배율 작성 규칙과 표면 겹침 검사를 따른다.</w:t>
       </w:r>
     </w:p>
     <w:p>
@@ -12355,7 +12355,7 @@
       </w:pPr>
       <w:r>
         <w:lastRenderedPageBreak/>
-        <w:t>Original과 Loose Loot는 가치·무게·크기를 가진다. ReplicaReady에서 E로 교체를 확정한 Original은 즉시 빈 GridSlot에 자동 배치되고, 공간 또는 무게가 부족하면 교체 자체가 확정되지 않는다. Grid가 허용하는 한 여러 Original을 함께 운반할 수 있다.</w:t>
+        <w:t>Original과 Loose Loot는 가치·무게·크기를 가진다. ReplicaReady에서 E로 교체를 확정한 Original은 즉시 빈 GridSlot에 자동 배치되고, 공간 또는 무게가 부족하면 교체 자체가 확정되지 않는다. Grid가 허용하는 한 여러 Original을 함께 운반할 수 있다. 조각상·공예품 전리품은 기존 전시 위치 12곳을 후보로 사용한다. 매치마다 핵심 보관실 전리품 한 개와 전시 후보 네 개만 획득 가능하며 나머지 일곱 개는 보이는 장식으로 남는다. 선택된 전시 케이스는 잠긴 상태로 시작한다. E로 작업을 시작한 뒤 걸쇠마다 달라지는 성공 구간에서 E를 눌러 세 걸쇠를 해제하면 케이스가 열린다. 한 케이스는 한 명이 작업하며 실수하면 현재 걸쇠만 다시 시도하고 금속음으로 근처 경비가 조사한다. 중단해도 완료한 걸쇠는 유지해 동료가 이어서 작업할 수 있다. 개방 후 E로 기존 전리품을 줍고, 가방 공간이나 무게가 부족하면 케이스가 열린 채 작품을 유지한다. 핵심 보관실 전리품·압수품·바닥에 떨어진 전리품은 기존 즉시 획득을 유지한다. 이 획득 방식은 위조·품질 판정이 없는 Loose Loot이며 Object Assembly를 활성화하지 않는다. 왕관·휴대용 회화·단검·도자기 화병·작은 조각상의 외형은 기존 팩 메시를 사용한다. 목걸이는 실물 메시가 없어 활성 출현에서 제외하며 작은 조각상이 그 가치와 출현 비중을 대신한다. 메시·재질이나 Blueprint 종류를 복제하지 않는다.</w:t>
       </w:r>
     </w:p>
     <w:p>
@@ -16673,7 +16673,7 @@
     </w:p>
     <w:p>
       <w:r>
-        <w:t>사용자 승인 갤러리 팩 AIUE5_vol10_01의 기존 메시로 약 106×72m 단층 전시관을 구성한다. 35×13m 원본 홀과 상부 트러스·천창, 기존 A·B·C와 경비실·압수품실·구금실을 유지하고 서·동 전시실, 북측 연속 전시실과 직원 회랑, 남측 진입·전시실을 확장한다. 방과 복도는 별도 경계와 엇갈린 출입구로 구분한다. 상호작용 작품 12개와 장식 작품 48개를 분산하고 필수 작품은 북동 전시실, 레이저 보호 작품 두 점은 동측 별도 전시실에 배치한다. 필수 작품에 레이저 협동을 강제하지 않는다. 액자는 소형·중형·대형 정수 균등 스케일 세 단계로 제한하고 대형은 천장 높이가 충분한 곳에 배치한다. 기존 에셋을 여러 Actor가 참조하며 새 메시·파생 에셋을 생성하지 않는다. 약한 환경광과 작품용 국소 조명으로 밤의 공간감을 유지한다. 이 승인안은 앞의 공통 설명에 남은 M03 외곽 크기·액자 크기·옛 방 이름과 동선 수치에 우선한다. 면적이나 경로만으로 목표 플레이 시간을 달성했다고 판단하지 않는다. M03 전시실·통로 천장은 약 8m 기준으로 높이고 중앙 홀 지붕과 트러스를 함께 올린다. 작품등은 액자보다 충분히 높은 천장에 매달아 작품을 가리지 않게 하며, 통로는 어두운 야간 분위기를 유지한다. 작품 조명은 상호작용 여부와 무관하게 전체 구도와 주요 색을 읽을 수 있도록 균일하게 비춘다. 작품마다 담당 조명을 정하고 통로보다 작품을 강조하되 밝기만으로 훔칠 수 있는 작품을 구분하게 만들지 않는다. M03의 야간 조명은 앞의 세 맵 공통 최종값을 사용하며 과거의 절반 조정을 반복하지 않는다. 조명이 없는 복도에도 약한 차가운 환경광을 보완한다. 암부의 벽·바닥·출입구는 약하게 구분되도록 하되, 전체 노출을 올려 밝은 전시장으로 되돌리지 않는다.</w:t>
+        <w:t>사용자 승인 갤러리 팩 AIUE5_vol10_01의 기존 메시로 약 106×72m 단층 전시관을 구성한다. 35×13m 원본 홀과 상부 트러스·천창, 기존 A·B·C와 경비실·압수품실·구금실을 유지하고 서·동 전시실, 북측 연속 전시실과 직원 회랑, 남측 진입·전시실을 확장한다. 방과 복도는 별도 경계와 엇갈린 출입구로 구분한다. 기존 그림 60곳의 위치와 규모를 유지하고 매치마다 탈취 대상 12점과 보이는 장식 48점을 정한다. 필수 작품은 북동 전시실의 기존 위치와 정체성을 유지하고, 동측 두 보호 작품의 레이저 연결도 보존한다. 보호 작품이 탈취 대상으로 선택되지 않은 매치에는 연결된 레이저를 휴면 상태로 둔다. 필수 작품에 레이저 협동을 강제하지 않는다. 액자는 소형·중형·대형 정수 균등 스케일 세 단계로 제한하고 대형은 천장 높이가 충분한 곳에 배치한다. 기존 에셋을 여러 Actor가 참조하며 새 메시·파생 에셋을 생성하지 않는다. 약한 환경광과 작품용 국소 조명으로 밤의 공간감을 유지한다. 이 승인안은 앞의 공통 설명에 남은 M03 외곽 크기·액자 크기·옛 방 이름과 동선 수치에 우선한다. 면적이나 경로만으로 목표 플레이 시간을 달성했다고 판단하지 않는다. M03 전시실·통로 천장은 약 8m 기준으로 높이고 중앙 홀 지붕과 트러스를 함께 올린다. 작품등은 액자보다 충분히 높은 천장에 매달아 작품을 가리지 않게 하며, 통로는 어두운 야간 분위기를 유지한다. 작품 조명은 상호작용 여부와 무관하게 전체 구도와 주요 색을 읽을 수 있도록 균일하게 비춘다. 작품마다 담당 조명을 정하고 통로보다 작품을 강조하되 밝기만으로 훔칠 수 있는 작품을 구분하게 만들지 않는다. M03의 야간 조명은 앞의 세 맵 공통 최종값을 사용하며 과거의 절반 조정을 반복하지 않는다. 조명이 없는 복도에도 약한 차가운 환경광을 보완한다. 암부의 벽·바닥·출입구는 약하게 구분되도록 하되, 전체 노출을 올려 밝은 전시장으로 되돌리지 않는다.</w:t>
       </w:r>
     </w:p>
     <w:tbl>
@@ -18003,7 +18003,7 @@
               <w:pStyle w:val="TableText"/>
             </w:pPr>
             <w:r>
-              <w:t>Patrol/Investigate/Chase/Search/Inspect, CCTV, Cooperative Laser, Alert/Lockdown, Stun→Arrest→Detention, Evidence Recovery</w:t>
+              <w:t>Patrol/Investigate/Chase/Search/Inspect, CCTV, Cooperative Laser, Alert/Lockdown, Stun→Arrest→Detention, Evidence Recovery 전시 전리품의 세 걸쇠 타이밍 개방</w:t>
             </w:r>
           </w:p>
         </w:tc>
@@ -18135,7 +18135,7 @@
     </w:p>
     <w:p>
       <w:r>
-        <w:t>Object Assembly Forgery, Sculpture/Ceramic Family, Template/Part Data와 관련 Class·Blueprint·SourceArt는 향후 확장 가능성으로 보존한다. 현재 v1.0 Runtime Entry, Assignment, Release Map, UI, Result와 Cook에는 포함하지 않는다.</w:t>
+        <w:t>Object Assembly Forgery, Object Assembly용 Sculpture/Ceramic Family, Template/Part Data와 관련 Class·Blueprint·SourceArt는 향후 확장 가능성으로 보존한다. 현재 v1.0 Runtime Entry, Assignment, Release Map, UI, Result와 Cook에는 포함하지 않는다.</w:t>
       </w:r>
     </w:p>
     <w:p>
@@ -20283,7 +20283,7 @@
           </w:tcPr>
           <w:p>
             <w:r>
-              <w:t>Object Assembly, Sculpture/Ceramic, Template/Part Data와 관련 구현·SourceArt 보존. v1 Runtime/UI/Map/Cook 제외</w:t>
+              <w:t>Object Assembly, Object Assembly용 Sculpture/Ceramic, Template/Part Data와 관련 구현·SourceArt 보존. v1 Runtime/UI/Map/Cook 제외</w:t>
             </w:r>
           </w:p>
         </w:tc>

</xml_diff>

<commit_message>
Harden exhibit assignment and loot case QA
Updated contract initialization to require at least one laser-linked FourStar optional case in release loot-supply maps, while preserving legacy fallback behavior for non-release/sandbox flows. Added dedicated debug helpers for painting assignment and loose-loot initialization logs, and exposed exhibition case state accessors on `AHeistLootActor` as Blueprint-pure APIs.

Expanded editor verification scripts and automation tests to validate authored laser/button chains, active-vs-dormant protection behavior, BP_Loot glass enclosure presentation, operator/session cancellation paths, and 0.25s half-RTT timing compensation. Related map/Blueprint/DataTable/source-art/doc updates align content with the approved 12-station layout (Vault 1 + Exhibition 4 active, 7 decorative) and shared display-case security rules.
</commit_message>
<xml_diff>
--- a/Museum_Heist_GDD.docx
+++ b/Museum_Heist_GDD.docx
@@ -8921,7 +8921,7 @@
     <w:p/>
     <w:p>
       <w:r>
-        <w:t>각 Release Map은 40종의 Surface Template 카탈로그와 그림 전시 위치 60곳을 유지한다. 매치 시작 시 서버는 고정된 핵심 작품 한 점과 지역에 분산한 선택 작품 11점을 탈취 대상으로 고르고, 맵의 40종 중 12종을 중복 없이 배정한다. 나머지 48점은 그림이 보이는 장식으로 남고 상호작용하지 않는다. 장식 그림의 재질도 같은 매치 Seed로 섞되 중복을 허용하며 계약 수량·가치·결과 기록에 포함하지 않는다. 그림 위치·회전·승인된 정수 크기는 유지하고, 작품의 활성 여부와 그림 재질만 달라진다. 플레이어는 Required Target, Quota, Alert와 남은 시간을 보고 추가 절도 여부를 결정한다. 액자는 Showcase 03a·04a·05a 세 종류와 소형·중형·대형 정수 균등 스케일을 유지한다.</w:t>
+        <w:t>각 Release Map은 40종의 Surface Template 카탈로그와 그림 전시 위치 60곳을 유지한다. 매치 시작 시 서버는 고정된 핵심 작품 한 점과 선택 작품 11점을 탈취 대상으로 고른다. 선택 작품 중 한 점은 기존 레이저가 연결된 FourStar 고가 작품에서 우선 골라 협력 경로를 유지하고, 나머지 열 점은 지역에 분산해 무작위로 고른다. 기존 보호 작품·버튼 연결은 보존하고 미선정 보호 작품의 레이저는 휴면 상태로 두며 새 레이저는 만들지 않는다. 맵의 40종 중 12종을 중복 없이 배정한다. 나머지 48점은 그림이 보이는 장식으로 남고 상호작용하지 않는다. 장식 그림의 재질도 같은 매치 Seed로 섞되 중복을 허용하며 계약 수량·가치·결과 기록에 포함하지 않는다. 그림 위치·회전·승인된 정수 크기는 유지하고, 작품의 활성 여부와 그림 재질만 달라진다. 플레이어는 Required Target, Quota, Alert와 남은 시간을 보고 추가 절도 여부를 결정한다. 액자는 Showcase 03a·04a·05a 세 종류와 소형·중형·대형 정수 균등 스케일을 유지한다.</w:t>
       </w:r>
     </w:p>
     <w:p>
@@ -12355,7 +12355,7 @@
       </w:pPr>
       <w:r>
         <w:lastRenderedPageBreak/>
-        <w:t>Original과 Loose Loot는 가치·무게·크기를 가진다. ReplicaReady에서 E로 교체를 확정한 Original은 즉시 빈 GridSlot에 자동 배치되고, 공간 또는 무게가 부족하면 교체 자체가 확정되지 않는다. Grid가 허용하는 한 여러 Original을 함께 운반할 수 있다. 조각상·공예품 전리품은 기존 전시 위치 12곳을 후보로 사용한다. 매치마다 핵심 보관실 전리품 한 개와 전시 후보 네 개만 획득 가능하며 나머지 일곱 개는 보이는 장식으로 남는다. 선택된 전시 케이스는 잠긴 상태로 시작한다. E로 작업을 시작한 뒤 걸쇠마다 달라지는 성공 구간에서 E를 눌러 세 걸쇠를 해제하면 케이스가 열린다. 한 케이스는 한 명이 작업하며 실수하면 현재 걸쇠만 다시 시도하고 금속음으로 근처 경비가 조사한다. 중단해도 완료한 걸쇠는 유지해 동료가 이어서 작업할 수 있다. 개방 후 E로 기존 전리품을 줍고, 가방 공간이나 무게가 부족하면 케이스가 열린 채 작품을 유지한다. 핵심 보관실 전리품·압수품·바닥에 떨어진 전리품은 기존 즉시 획득을 유지한다. 이 획득 방식은 위조·품질 판정이 없는 Loose Loot이며 Object Assembly를 활성화하지 않는다. 왕관·휴대용 회화·단검·도자기 화병·작은 조각상의 외형은 기존 팩 메시를 사용한다. 목걸이는 실물 메시가 없어 활성 출현에서 제외하며 작은 조각상이 그 가치와 출현 비중을 대신한다. 메시·재질이나 Blueprint 종류를 복제하지 않는다.</w:t>
+        <w:t>Original과 Loose Loot는 가치·무게·크기를 가진다. ReplicaReady에서 E로 교체를 확정한 Original은 즉시 빈 GridSlot에 자동 배치되고, 공간 또는 무게가 부족하면 교체 자체가 확정되지 않는다. Grid가 허용하는 한 여러 Original을 함께 운반할 수 있다. 조각상·공예품 전리품은 기존 보관실 두 곳과 전시 구역 열 곳, 총 12곳을 후보로 사용한다. 매치마다 보관실 한 곳과 전시 구역 네 곳의 전리품만 획득 가능하며, 미선정 보관실 한 곳과 전시 구역 여섯 곳의 전리품은 보이는 장식으로 남는다. 선택된 전시 케이스는 잠긴 상태로 시작한다. E로 작업을 시작한 뒤 걸쇠마다 달라지는 성공 구간에서 E를 눌러 세 걸쇠를 해제하면 케이스가 열린다. 한 케이스는 한 명이 작업하며 실수하면 현재 걸쇠만 다시 시도하고 금속음으로 근처 경비가 조사한다. 중단해도 완료한 걸쇠는 유지해 동료가 이어서 작업할 수 있다. 개방 후 E로 기존 전리품을 줍고, 가방 공간이나 무게가 부족하면 케이스가 열린 채 작품을 유지한다. 핵심 보관실 전리품·압수품·바닥에 떨어진 전리품은 기존 즉시 획득을 유지한다. 이 획득 방식은 위조·품질 판정이 없는 Loose Loot이며 Object Assembly를 활성화하지 않는다. 왕관·휴대용 회화·단검·도자기 화병·작은 조각상의 외형은 기존 팩 메시를 사용한다. 목걸이는 실물 메시가 없어 활성 출현에서 제외하며 작은 조각상이 그 가치와 출현 비중을 대신한다. 메시·재질이나 Blueprint 종류를 복제하지 않는다.</w:t>
       </w:r>
     </w:p>
     <w:p>

</xml_diff>

<commit_message>
Apply full museum exhibition layouts and repair patrol navigation
Apply approved exhibition walls, loot stations, furnishings and floor plans across M01-M03 while preserving map concepts and protected gameplay anchors. Correct two M01 patrol waypoints and the floor contact of five M02 guards. Include authoring tools, source metadata and updated project documents.

Validation: saved/reloaded strict navigation 538/538, guard start capsules 14/14 and physical route sweeps 1227/1227. M01/M02 unforced SIE observed for 75 game seconds each, with clean final logs. Natural multiplayer completion, current Unreal C++ build and Steam package verification remain separate.
</commit_message>
<xml_diff>
--- a/Museum_Heist_GDD.docx
+++ b/Museum_Heist_GDD.docx
@@ -111,7 +111,7 @@
             </w:r>
             <w:r>
               <w:br/>
-              <w:t>문서 정합성 검토 · 2026-09-12</w:t>
+              <w:t>문서 정합성 검토 · 2026-10-07</w:t>
             </w:r>
           </w:p>
         </w:tc>
@@ -559,7 +559,7 @@
       <w:r>
         <w:fldChar w:fldCharType="separate"/>
       </w:r>
-      <w:hyperlink w:anchor="_Toc241695167" w:history="1">
+      <w:hyperlink w:anchor="_Toc242310303" w:history="1">
         <w:r>
           <w:rPr>
             <w:rStyle w:val="aff1"/>
@@ -586,7 +586,7 @@
             <w:noProof/>
             <w:webHidden/>
           </w:rPr>
-          <w:instrText xml:space="preserve"> PAGEREF _Toc241695167 \h </w:instrText>
+          <w:instrText xml:space="preserve"> PAGEREF _Toc242310303 \h </w:instrText>
         </w:r>
         <w:r>
           <w:rPr>
@@ -635,7 +635,7 @@
           <w14:ligatures w14:val="standardContextual"/>
         </w:rPr>
       </w:pPr>
-      <w:hyperlink w:anchor="_Toc241695168" w:history="1">
+      <w:hyperlink w:anchor="_Toc242310304" w:history="1">
         <w:r>
           <w:rPr>
             <w:rStyle w:val="aff1"/>
@@ -662,7 +662,7 @@
             <w:noProof/>
             <w:webHidden/>
           </w:rPr>
-          <w:instrText xml:space="preserve"> PAGEREF _Toc241695168 \h </w:instrText>
+          <w:instrText xml:space="preserve"> PAGEREF _Toc242310304 \h </w:instrText>
         </w:r>
         <w:r>
           <w:rPr>
@@ -711,7 +711,7 @@
           <w14:ligatures w14:val="standardContextual"/>
         </w:rPr>
       </w:pPr>
-      <w:hyperlink w:anchor="_Toc241695169" w:history="1">
+      <w:hyperlink w:anchor="_Toc242310305" w:history="1">
         <w:r>
           <w:rPr>
             <w:rStyle w:val="aff1"/>
@@ -738,7 +738,7 @@
             <w:noProof/>
             <w:webHidden/>
           </w:rPr>
-          <w:instrText xml:space="preserve"> PAGEREF _Toc241695169 \h </w:instrText>
+          <w:instrText xml:space="preserve"> PAGEREF _Toc242310305 \h </w:instrText>
         </w:r>
         <w:r>
           <w:rPr>
@@ -787,7 +787,7 @@
           <w14:ligatures w14:val="standardContextual"/>
         </w:rPr>
       </w:pPr>
-      <w:hyperlink w:anchor="_Toc241695170" w:history="1">
+      <w:hyperlink w:anchor="_Toc242310306" w:history="1">
         <w:r>
           <w:rPr>
             <w:rStyle w:val="aff1"/>
@@ -814,7 +814,7 @@
             <w:noProof/>
             <w:webHidden/>
           </w:rPr>
-          <w:instrText xml:space="preserve"> PAGEREF _Toc241695170 \h </w:instrText>
+          <w:instrText xml:space="preserve"> PAGEREF _Toc242310306 \h </w:instrText>
         </w:r>
         <w:r>
           <w:rPr>
@@ -863,7 +863,7 @@
           <w14:ligatures w14:val="standardContextual"/>
         </w:rPr>
       </w:pPr>
-      <w:hyperlink w:anchor="_Toc241695171" w:history="1">
+      <w:hyperlink w:anchor="_Toc242310307" w:history="1">
         <w:r>
           <w:rPr>
             <w:rStyle w:val="aff1"/>
@@ -890,7 +890,7 @@
             <w:noProof/>
             <w:webHidden/>
           </w:rPr>
-          <w:instrText xml:space="preserve"> PAGEREF _Toc241695171 \h </w:instrText>
+          <w:instrText xml:space="preserve"> PAGEREF _Toc242310307 \h </w:instrText>
         </w:r>
         <w:r>
           <w:rPr>
@@ -939,7 +939,7 @@
           <w14:ligatures w14:val="standardContextual"/>
         </w:rPr>
       </w:pPr>
-      <w:hyperlink w:anchor="_Toc241695172" w:history="1">
+      <w:hyperlink w:anchor="_Toc242310308" w:history="1">
         <w:r>
           <w:rPr>
             <w:rStyle w:val="aff1"/>
@@ -966,7 +966,7 @@
             <w:noProof/>
             <w:webHidden/>
           </w:rPr>
-          <w:instrText xml:space="preserve"> PAGEREF _Toc241695172 \h </w:instrText>
+          <w:instrText xml:space="preserve"> PAGEREF _Toc242310308 \h </w:instrText>
         </w:r>
         <w:r>
           <w:rPr>
@@ -1015,7 +1015,7 @@
           <w14:ligatures w14:val="standardContextual"/>
         </w:rPr>
       </w:pPr>
-      <w:hyperlink w:anchor="_Toc241695173" w:history="1">
+      <w:hyperlink w:anchor="_Toc242310309" w:history="1">
         <w:r>
           <w:rPr>
             <w:rStyle w:val="aff1"/>
@@ -1042,7 +1042,7 @@
             <w:noProof/>
             <w:webHidden/>
           </w:rPr>
-          <w:instrText xml:space="preserve"> PAGEREF _Toc241695173 \h </w:instrText>
+          <w:instrText xml:space="preserve"> PAGEREF _Toc242310309 \h </w:instrText>
         </w:r>
         <w:r>
           <w:rPr>
@@ -1090,7 +1090,7 @@
           <w14:ligatures w14:val="standardContextual"/>
         </w:rPr>
       </w:pPr>
-      <w:hyperlink w:anchor="_Toc241695174" w:history="1">
+      <w:hyperlink w:anchor="_Toc242310310" w:history="1">
         <w:r>
           <w:rPr>
             <w:rStyle w:val="aff1"/>
@@ -1117,7 +1117,7 @@
             <w:noProof/>
             <w:webHidden/>
           </w:rPr>
-          <w:instrText xml:space="preserve"> PAGEREF _Toc241695174 \h </w:instrText>
+          <w:instrText xml:space="preserve"> PAGEREF _Toc242310310 \h </w:instrText>
         </w:r>
         <w:r>
           <w:rPr>
@@ -1166,7 +1166,7 @@
           <w14:ligatures w14:val="standardContextual"/>
         </w:rPr>
       </w:pPr>
-      <w:hyperlink w:anchor="_Toc241695175" w:history="1">
+      <w:hyperlink w:anchor="_Toc242310311" w:history="1">
         <w:r>
           <w:rPr>
             <w:rStyle w:val="aff1"/>
@@ -1193,7 +1193,7 @@
             <w:noProof/>
             <w:webHidden/>
           </w:rPr>
-          <w:instrText xml:space="preserve"> PAGEREF _Toc241695175 \h </w:instrText>
+          <w:instrText xml:space="preserve"> PAGEREF _Toc242310311 \h </w:instrText>
         </w:r>
         <w:r>
           <w:rPr>
@@ -1242,7 +1242,7 @@
           <w14:ligatures w14:val="standardContextual"/>
         </w:rPr>
       </w:pPr>
-      <w:hyperlink w:anchor="_Toc241695176" w:history="1">
+      <w:hyperlink w:anchor="_Toc242310312" w:history="1">
         <w:r>
           <w:rPr>
             <w:rStyle w:val="aff1"/>
@@ -1269,7 +1269,7 @@
             <w:noProof/>
             <w:webHidden/>
           </w:rPr>
-          <w:instrText xml:space="preserve"> PAGEREF _Toc241695176 \h </w:instrText>
+          <w:instrText xml:space="preserve"> PAGEREF _Toc242310312 \h </w:instrText>
         </w:r>
         <w:r>
           <w:rPr>
@@ -1318,7 +1318,7 @@
           <w14:ligatures w14:val="standardContextual"/>
         </w:rPr>
       </w:pPr>
-      <w:hyperlink w:anchor="_Toc241695177" w:history="1">
+      <w:hyperlink w:anchor="_Toc242310313" w:history="1">
         <w:r>
           <w:rPr>
             <w:rStyle w:val="aff1"/>
@@ -1345,7 +1345,7 @@
             <w:noProof/>
             <w:webHidden/>
           </w:rPr>
-          <w:instrText xml:space="preserve"> PAGEREF _Toc241695177 \h </w:instrText>
+          <w:instrText xml:space="preserve"> PAGEREF _Toc242310313 \h </w:instrText>
         </w:r>
         <w:r>
           <w:rPr>
@@ -1394,7 +1394,7 @@
           <w14:ligatures w14:val="standardContextual"/>
         </w:rPr>
       </w:pPr>
-      <w:hyperlink w:anchor="_Toc241695178" w:history="1">
+      <w:hyperlink w:anchor="_Toc242310314" w:history="1">
         <w:r>
           <w:rPr>
             <w:rStyle w:val="aff1"/>
@@ -1421,7 +1421,7 @@
             <w:noProof/>
             <w:webHidden/>
           </w:rPr>
-          <w:instrText xml:space="preserve"> PAGEREF _Toc241695178 \h </w:instrText>
+          <w:instrText xml:space="preserve"> PAGEREF _Toc242310314 \h </w:instrText>
         </w:r>
         <w:r>
           <w:rPr>
@@ -1470,7 +1470,7 @@
           <w14:ligatures w14:val="standardContextual"/>
         </w:rPr>
       </w:pPr>
-      <w:hyperlink w:anchor="_Toc241695179" w:history="1">
+      <w:hyperlink w:anchor="_Toc242310315" w:history="1">
         <w:r>
           <w:rPr>
             <w:rStyle w:val="aff1"/>
@@ -1497,7 +1497,7 @@
             <w:noProof/>
             <w:webHidden/>
           </w:rPr>
-          <w:instrText xml:space="preserve"> PAGEREF _Toc241695179 \h </w:instrText>
+          <w:instrText xml:space="preserve"> PAGEREF _Toc242310315 \h </w:instrText>
         </w:r>
         <w:r>
           <w:rPr>
@@ -1545,7 +1545,7 @@
           <w14:ligatures w14:val="standardContextual"/>
         </w:rPr>
       </w:pPr>
-      <w:hyperlink w:anchor="_Toc241695180" w:history="1">
+      <w:hyperlink w:anchor="_Toc242310316" w:history="1">
         <w:r>
           <w:rPr>
             <w:rStyle w:val="aff1"/>
@@ -1572,7 +1572,7 @@
             <w:noProof/>
             <w:webHidden/>
           </w:rPr>
-          <w:instrText xml:space="preserve"> PAGEREF _Toc241695180 \h </w:instrText>
+          <w:instrText xml:space="preserve"> PAGEREF _Toc242310316 \h </w:instrText>
         </w:r>
         <w:r>
           <w:rPr>
@@ -1621,7 +1621,7 @@
           <w14:ligatures w14:val="standardContextual"/>
         </w:rPr>
       </w:pPr>
-      <w:hyperlink w:anchor="_Toc241695181" w:history="1">
+      <w:hyperlink w:anchor="_Toc242310317" w:history="1">
         <w:r>
           <w:rPr>
             <w:rStyle w:val="aff1"/>
@@ -1648,7 +1648,7 @@
             <w:noProof/>
             <w:webHidden/>
           </w:rPr>
-          <w:instrText xml:space="preserve"> PAGEREF _Toc241695181 \h </w:instrText>
+          <w:instrText xml:space="preserve"> PAGEREF _Toc242310317 \h </w:instrText>
         </w:r>
         <w:r>
           <w:rPr>
@@ -1697,7 +1697,7 @@
           <w14:ligatures w14:val="standardContextual"/>
         </w:rPr>
       </w:pPr>
-      <w:hyperlink w:anchor="_Toc241695182" w:history="1">
+      <w:hyperlink w:anchor="_Toc242310318" w:history="1">
         <w:r>
           <w:rPr>
             <w:rStyle w:val="aff1"/>
@@ -1724,7 +1724,7 @@
             <w:noProof/>
             <w:webHidden/>
           </w:rPr>
-          <w:instrText xml:space="preserve"> PAGEREF _Toc241695182 \h </w:instrText>
+          <w:instrText xml:space="preserve"> PAGEREF _Toc242310318 \h </w:instrText>
         </w:r>
         <w:r>
           <w:rPr>
@@ -1773,7 +1773,7 @@
           <w14:ligatures w14:val="standardContextual"/>
         </w:rPr>
       </w:pPr>
-      <w:hyperlink w:anchor="_Toc241695183" w:history="1">
+      <w:hyperlink w:anchor="_Toc242310319" w:history="1">
         <w:r>
           <w:rPr>
             <w:rStyle w:val="aff1"/>
@@ -1800,7 +1800,7 @@
             <w:noProof/>
             <w:webHidden/>
           </w:rPr>
-          <w:instrText xml:space="preserve"> PAGEREF _Toc241695183 \h </w:instrText>
+          <w:instrText xml:space="preserve"> PAGEREF _Toc242310319 \h </w:instrText>
         </w:r>
         <w:r>
           <w:rPr>
@@ -1849,7 +1849,7 @@
           <w14:ligatures w14:val="standardContextual"/>
         </w:rPr>
       </w:pPr>
-      <w:hyperlink w:anchor="_Toc241695184" w:history="1">
+      <w:hyperlink w:anchor="_Toc242310320" w:history="1">
         <w:r>
           <w:rPr>
             <w:rStyle w:val="aff1"/>
@@ -1876,7 +1876,7 @@
             <w:noProof/>
             <w:webHidden/>
           </w:rPr>
-          <w:instrText xml:space="preserve"> PAGEREF _Toc241695184 \h </w:instrText>
+          <w:instrText xml:space="preserve"> PAGEREF _Toc242310320 \h </w:instrText>
         </w:r>
         <w:r>
           <w:rPr>
@@ -1925,7 +1925,7 @@
           <w14:ligatures w14:val="standardContextual"/>
         </w:rPr>
       </w:pPr>
-      <w:hyperlink w:anchor="_Toc241695185" w:history="1">
+      <w:hyperlink w:anchor="_Toc242310321" w:history="1">
         <w:r>
           <w:rPr>
             <w:rStyle w:val="aff1"/>
@@ -1952,7 +1952,7 @@
             <w:noProof/>
             <w:webHidden/>
           </w:rPr>
-          <w:instrText xml:space="preserve"> PAGEREF _Toc241695185 \h </w:instrText>
+          <w:instrText xml:space="preserve"> PAGEREF _Toc242310321 \h </w:instrText>
         </w:r>
         <w:r>
           <w:rPr>
@@ -2001,7 +2001,7 @@
           <w14:ligatures w14:val="standardContextual"/>
         </w:rPr>
       </w:pPr>
-      <w:hyperlink w:anchor="_Toc241695186" w:history="1">
+      <w:hyperlink w:anchor="_Toc242310322" w:history="1">
         <w:r>
           <w:rPr>
             <w:rStyle w:val="aff1"/>
@@ -2028,7 +2028,7 @@
             <w:noProof/>
             <w:webHidden/>
           </w:rPr>
-          <w:instrText xml:space="preserve"> PAGEREF _Toc241695186 \h </w:instrText>
+          <w:instrText xml:space="preserve"> PAGEREF _Toc242310322 \h </w:instrText>
         </w:r>
         <w:r>
           <w:rPr>
@@ -2048,7 +2048,7 @@
             <w:noProof/>
             <w:webHidden/>
           </w:rPr>
-          <w:t>12</w:t>
+          <w:t>13</w:t>
         </w:r>
         <w:r>
           <w:rPr>
@@ -2076,7 +2076,7 @@
           <w14:ligatures w14:val="standardContextual"/>
         </w:rPr>
       </w:pPr>
-      <w:hyperlink w:anchor="_Toc241695187" w:history="1">
+      <w:hyperlink w:anchor="_Toc242310323" w:history="1">
         <w:r>
           <w:rPr>
             <w:rStyle w:val="aff1"/>
@@ -2103,7 +2103,7 @@
             <w:noProof/>
             <w:webHidden/>
           </w:rPr>
-          <w:instrText xml:space="preserve"> PAGEREF _Toc241695187 \h </w:instrText>
+          <w:instrText xml:space="preserve"> PAGEREF _Toc242310323 \h </w:instrText>
         </w:r>
         <w:r>
           <w:rPr>
@@ -2123,7 +2123,7 @@
             <w:noProof/>
             <w:webHidden/>
           </w:rPr>
-          <w:t>13</w:t>
+          <w:t>14</w:t>
         </w:r>
         <w:r>
           <w:rPr>
@@ -2152,7 +2152,7 @@
           <w14:ligatures w14:val="standardContextual"/>
         </w:rPr>
       </w:pPr>
-      <w:hyperlink w:anchor="_Toc241695188" w:history="1">
+      <w:hyperlink w:anchor="_Toc242310324" w:history="1">
         <w:r>
           <w:rPr>
             <w:rStyle w:val="aff1"/>
@@ -2179,7 +2179,7 @@
             <w:noProof/>
             <w:webHidden/>
           </w:rPr>
-          <w:instrText xml:space="preserve"> PAGEREF _Toc241695188 \h </w:instrText>
+          <w:instrText xml:space="preserve"> PAGEREF _Toc242310324 \h </w:instrText>
         </w:r>
         <w:r>
           <w:rPr>
@@ -2199,7 +2199,7 @@
             <w:noProof/>
             <w:webHidden/>
           </w:rPr>
-          <w:t>13</w:t>
+          <w:t>14</w:t>
         </w:r>
         <w:r>
           <w:rPr>
@@ -2228,7 +2228,7 @@
           <w14:ligatures w14:val="standardContextual"/>
         </w:rPr>
       </w:pPr>
-      <w:hyperlink w:anchor="_Toc241695189" w:history="1">
+      <w:hyperlink w:anchor="_Toc242310325" w:history="1">
         <w:r>
           <w:rPr>
             <w:rStyle w:val="aff1"/>
@@ -2255,7 +2255,7 @@
             <w:noProof/>
             <w:webHidden/>
           </w:rPr>
-          <w:instrText xml:space="preserve"> PAGEREF _Toc241695189 \h </w:instrText>
+          <w:instrText xml:space="preserve"> PAGEREF _Toc242310325 \h </w:instrText>
         </w:r>
         <w:r>
           <w:rPr>
@@ -2275,7 +2275,7 @@
             <w:noProof/>
             <w:webHidden/>
           </w:rPr>
-          <w:t>13</w:t>
+          <w:t>14</w:t>
         </w:r>
         <w:r>
           <w:rPr>
@@ -2304,7 +2304,7 @@
           <w14:ligatures w14:val="standardContextual"/>
         </w:rPr>
       </w:pPr>
-      <w:hyperlink w:anchor="_Toc241695190" w:history="1">
+      <w:hyperlink w:anchor="_Toc242310326" w:history="1">
         <w:r>
           <w:rPr>
             <w:rStyle w:val="aff1"/>
@@ -2331,7 +2331,7 @@
             <w:noProof/>
             <w:webHidden/>
           </w:rPr>
-          <w:instrText xml:space="preserve"> PAGEREF _Toc241695190 \h </w:instrText>
+          <w:instrText xml:space="preserve"> PAGEREF _Toc242310326 \h </w:instrText>
         </w:r>
         <w:r>
           <w:rPr>
@@ -2351,7 +2351,7 @@
             <w:noProof/>
             <w:webHidden/>
           </w:rPr>
-          <w:t>13</w:t>
+          <w:t>14</w:t>
         </w:r>
         <w:r>
           <w:rPr>
@@ -2380,7 +2380,7 @@
           <w14:ligatures w14:val="standardContextual"/>
         </w:rPr>
       </w:pPr>
-      <w:hyperlink w:anchor="_Toc241695191" w:history="1">
+      <w:hyperlink w:anchor="_Toc242310327" w:history="1">
         <w:r>
           <w:rPr>
             <w:rStyle w:val="aff1"/>
@@ -2407,7 +2407,7 @@
             <w:noProof/>
             <w:webHidden/>
           </w:rPr>
-          <w:instrText xml:space="preserve"> PAGEREF _Toc241695191 \h </w:instrText>
+          <w:instrText xml:space="preserve"> PAGEREF _Toc242310327 \h </w:instrText>
         </w:r>
         <w:r>
           <w:rPr>
@@ -2427,7 +2427,7 @@
             <w:noProof/>
             <w:webHidden/>
           </w:rPr>
-          <w:t>14</w:t>
+          <w:t>15</w:t>
         </w:r>
         <w:r>
           <w:rPr>
@@ -2456,7 +2456,7 @@
           <w14:ligatures w14:val="standardContextual"/>
         </w:rPr>
       </w:pPr>
-      <w:hyperlink w:anchor="_Toc241695192" w:history="1">
+      <w:hyperlink w:anchor="_Toc242310328" w:history="1">
         <w:r>
           <w:rPr>
             <w:rStyle w:val="aff1"/>
@@ -2483,7 +2483,7 @@
             <w:noProof/>
             <w:webHidden/>
           </w:rPr>
-          <w:instrText xml:space="preserve"> PAGEREF _Toc241695192 \h </w:instrText>
+          <w:instrText xml:space="preserve"> PAGEREF _Toc242310328 \h </w:instrText>
         </w:r>
         <w:r>
           <w:rPr>
@@ -2503,7 +2503,7 @@
             <w:noProof/>
             <w:webHidden/>
           </w:rPr>
-          <w:t>15</w:t>
+          <w:t>16</w:t>
         </w:r>
         <w:r>
           <w:rPr>
@@ -2532,7 +2532,7 @@
           <w14:ligatures w14:val="standardContextual"/>
         </w:rPr>
       </w:pPr>
-      <w:hyperlink w:anchor="_Toc241695193" w:history="1">
+      <w:hyperlink w:anchor="_Toc242310329" w:history="1">
         <w:r>
           <w:rPr>
             <w:rStyle w:val="aff1"/>
@@ -2559,7 +2559,7 @@
             <w:noProof/>
             <w:webHidden/>
           </w:rPr>
-          <w:instrText xml:space="preserve"> PAGEREF _Toc241695193 \h </w:instrText>
+          <w:instrText xml:space="preserve"> PAGEREF _Toc242310329 \h </w:instrText>
         </w:r>
         <w:r>
           <w:rPr>
@@ -2579,7 +2579,7 @@
             <w:noProof/>
             <w:webHidden/>
           </w:rPr>
-          <w:t>15</w:t>
+          <w:t>16</w:t>
         </w:r>
         <w:r>
           <w:rPr>
@@ -2607,7 +2607,7 @@
           <w14:ligatures w14:val="standardContextual"/>
         </w:rPr>
       </w:pPr>
-      <w:hyperlink w:anchor="_Toc241695194" w:history="1">
+      <w:hyperlink w:anchor="_Toc242310330" w:history="1">
         <w:r>
           <w:rPr>
             <w:rStyle w:val="aff1"/>
@@ -2634,7 +2634,7 @@
             <w:noProof/>
             <w:webHidden/>
           </w:rPr>
-          <w:instrText xml:space="preserve"> PAGEREF _Toc241695194 \h </w:instrText>
+          <w:instrText xml:space="preserve"> PAGEREF _Toc242310330 \h </w:instrText>
         </w:r>
         <w:r>
           <w:rPr>
@@ -2654,7 +2654,7 @@
             <w:noProof/>
             <w:webHidden/>
           </w:rPr>
-          <w:t>17</w:t>
+          <w:t>18</w:t>
         </w:r>
         <w:r>
           <w:rPr>
@@ -2683,7 +2683,7 @@
           <w14:ligatures w14:val="standardContextual"/>
         </w:rPr>
       </w:pPr>
-      <w:hyperlink w:anchor="_Toc241695195" w:history="1">
+      <w:hyperlink w:anchor="_Toc242310331" w:history="1">
         <w:r>
           <w:rPr>
             <w:rStyle w:val="aff1"/>
@@ -2710,7 +2710,7 @@
             <w:noProof/>
             <w:webHidden/>
           </w:rPr>
-          <w:instrText xml:space="preserve"> PAGEREF _Toc241695195 \h </w:instrText>
+          <w:instrText xml:space="preserve"> PAGEREF _Toc242310331 \h </w:instrText>
         </w:r>
         <w:r>
           <w:rPr>
@@ -2730,7 +2730,7 @@
             <w:noProof/>
             <w:webHidden/>
           </w:rPr>
-          <w:t>17</w:t>
+          <w:t>18</w:t>
         </w:r>
         <w:r>
           <w:rPr>
@@ -2759,7 +2759,7 @@
           <w14:ligatures w14:val="standardContextual"/>
         </w:rPr>
       </w:pPr>
-      <w:hyperlink w:anchor="_Toc241695196" w:history="1">
+      <w:hyperlink w:anchor="_Toc242310332" w:history="1">
         <w:r>
           <w:rPr>
             <w:rStyle w:val="aff1"/>
@@ -2786,7 +2786,7 @@
             <w:noProof/>
             <w:webHidden/>
           </w:rPr>
-          <w:instrText xml:space="preserve"> PAGEREF _Toc241695196 \h </w:instrText>
+          <w:instrText xml:space="preserve"> PAGEREF _Toc242310332 \h </w:instrText>
         </w:r>
         <w:r>
           <w:rPr>
@@ -2806,7 +2806,7 @@
             <w:noProof/>
             <w:webHidden/>
           </w:rPr>
-          <w:t>17</w:t>
+          <w:t>18</w:t>
         </w:r>
         <w:r>
           <w:rPr>
@@ -2835,7 +2835,7 @@
           <w14:ligatures w14:val="standardContextual"/>
         </w:rPr>
       </w:pPr>
-      <w:hyperlink w:anchor="_Toc241695197" w:history="1">
+      <w:hyperlink w:anchor="_Toc242310333" w:history="1">
         <w:r>
           <w:rPr>
             <w:rStyle w:val="aff1"/>
@@ -2862,7 +2862,7 @@
             <w:noProof/>
             <w:webHidden/>
           </w:rPr>
-          <w:instrText xml:space="preserve"> PAGEREF _Toc241695197 \h </w:instrText>
+          <w:instrText xml:space="preserve"> PAGEREF _Toc242310333 \h </w:instrText>
         </w:r>
         <w:r>
           <w:rPr>
@@ -2882,7 +2882,7 @@
             <w:noProof/>
             <w:webHidden/>
           </w:rPr>
-          <w:t>17</w:t>
+          <w:t>18</w:t>
         </w:r>
         <w:r>
           <w:rPr>
@@ -2911,7 +2911,7 @@
           <w14:ligatures w14:val="standardContextual"/>
         </w:rPr>
       </w:pPr>
-      <w:hyperlink w:anchor="_Toc241695198" w:history="1">
+      <w:hyperlink w:anchor="_Toc242310334" w:history="1">
         <w:r>
           <w:rPr>
             <w:rStyle w:val="aff1"/>
@@ -2938,7 +2938,7 @@
             <w:noProof/>
             <w:webHidden/>
           </w:rPr>
-          <w:instrText xml:space="preserve"> PAGEREF _Toc241695198 \h </w:instrText>
+          <w:instrText xml:space="preserve"> PAGEREF _Toc242310334 \h </w:instrText>
         </w:r>
         <w:r>
           <w:rPr>
@@ -2958,7 +2958,7 @@
             <w:noProof/>
             <w:webHidden/>
           </w:rPr>
-          <w:t>18</w:t>
+          <w:t>19</w:t>
         </w:r>
         <w:r>
           <w:rPr>
@@ -2987,7 +2987,7 @@
           <w14:ligatures w14:val="standardContextual"/>
         </w:rPr>
       </w:pPr>
-      <w:hyperlink w:anchor="_Toc241695199" w:history="1">
+      <w:hyperlink w:anchor="_Toc242310335" w:history="1">
         <w:r>
           <w:rPr>
             <w:rStyle w:val="aff1"/>
@@ -3014,7 +3014,7 @@
             <w:noProof/>
             <w:webHidden/>
           </w:rPr>
-          <w:instrText xml:space="preserve"> PAGEREF _Toc241695199 \h </w:instrText>
+          <w:instrText xml:space="preserve"> PAGEREF _Toc242310335 \h </w:instrText>
         </w:r>
         <w:r>
           <w:rPr>
@@ -3034,7 +3034,7 @@
             <w:noProof/>
             <w:webHidden/>
           </w:rPr>
-          <w:t>18</w:t>
+          <w:t>19</w:t>
         </w:r>
         <w:r>
           <w:rPr>
@@ -3063,7 +3063,7 @@
           <w14:ligatures w14:val="standardContextual"/>
         </w:rPr>
       </w:pPr>
-      <w:hyperlink w:anchor="_Toc241695200" w:history="1">
+      <w:hyperlink w:anchor="_Toc242310336" w:history="1">
         <w:r>
           <w:rPr>
             <w:rStyle w:val="aff1"/>
@@ -3090,7 +3090,7 @@
             <w:noProof/>
             <w:webHidden/>
           </w:rPr>
-          <w:instrText xml:space="preserve"> PAGEREF _Toc241695200 \h </w:instrText>
+          <w:instrText xml:space="preserve"> PAGEREF _Toc242310336 \h </w:instrText>
         </w:r>
         <w:r>
           <w:rPr>
@@ -3110,7 +3110,7 @@
             <w:noProof/>
             <w:webHidden/>
           </w:rPr>
-          <w:t>18</w:t>
+          <w:t>20</w:t>
         </w:r>
         <w:r>
           <w:rPr>
@@ -3138,7 +3138,7 @@
           <w14:ligatures w14:val="standardContextual"/>
         </w:rPr>
       </w:pPr>
-      <w:hyperlink w:anchor="_Toc241695201" w:history="1">
+      <w:hyperlink w:anchor="_Toc242310337" w:history="1">
         <w:r>
           <w:rPr>
             <w:rStyle w:val="aff1"/>
@@ -3165,7 +3165,7 @@
             <w:noProof/>
             <w:webHidden/>
           </w:rPr>
-          <w:instrText xml:space="preserve"> PAGEREF _Toc241695201 \h </w:instrText>
+          <w:instrText xml:space="preserve"> PAGEREF _Toc242310337 \h </w:instrText>
         </w:r>
         <w:r>
           <w:rPr>
@@ -3185,7 +3185,7 @@
             <w:noProof/>
             <w:webHidden/>
           </w:rPr>
-          <w:t>20</w:t>
+          <w:t>21</w:t>
         </w:r>
         <w:r>
           <w:rPr>
@@ -3214,7 +3214,7 @@
           <w14:ligatures w14:val="standardContextual"/>
         </w:rPr>
       </w:pPr>
-      <w:hyperlink w:anchor="_Toc241695202" w:history="1">
+      <w:hyperlink w:anchor="_Toc242310338" w:history="1">
         <w:r>
           <w:rPr>
             <w:rStyle w:val="aff1"/>
@@ -3241,7 +3241,7 @@
             <w:noProof/>
             <w:webHidden/>
           </w:rPr>
-          <w:instrText xml:space="preserve"> PAGEREF _Toc241695202 \h </w:instrText>
+          <w:instrText xml:space="preserve"> PAGEREF _Toc242310338 \h </w:instrText>
         </w:r>
         <w:r>
           <w:rPr>
@@ -3261,7 +3261,7 @@
             <w:noProof/>
             <w:webHidden/>
           </w:rPr>
-          <w:t>20</w:t>
+          <w:t>21</w:t>
         </w:r>
         <w:r>
           <w:rPr>
@@ -3290,7 +3290,7 @@
           <w14:ligatures w14:val="standardContextual"/>
         </w:rPr>
       </w:pPr>
-      <w:hyperlink w:anchor="_Toc241695203" w:history="1">
+      <w:hyperlink w:anchor="_Toc242310339" w:history="1">
         <w:r>
           <w:rPr>
             <w:rStyle w:val="aff1"/>
@@ -3317,7 +3317,7 @@
             <w:noProof/>
             <w:webHidden/>
           </w:rPr>
-          <w:instrText xml:space="preserve"> PAGEREF _Toc241695203 \h </w:instrText>
+          <w:instrText xml:space="preserve"> PAGEREF _Toc242310339 \h </w:instrText>
         </w:r>
         <w:r>
           <w:rPr>
@@ -3337,7 +3337,7 @@
             <w:noProof/>
             <w:webHidden/>
           </w:rPr>
-          <w:t>21</w:t>
+          <w:t>22</w:t>
         </w:r>
         <w:r>
           <w:rPr>
@@ -3366,7 +3366,7 @@
           <w14:ligatures w14:val="standardContextual"/>
         </w:rPr>
       </w:pPr>
-      <w:hyperlink w:anchor="_Toc241695204" w:history="1">
+      <w:hyperlink w:anchor="_Toc242310340" w:history="1">
         <w:r>
           <w:rPr>
             <w:rStyle w:val="aff1"/>
@@ -3393,7 +3393,7 @@
             <w:noProof/>
             <w:webHidden/>
           </w:rPr>
-          <w:instrText xml:space="preserve"> PAGEREF _Toc241695204 \h </w:instrText>
+          <w:instrText xml:space="preserve"> PAGEREF _Toc242310340 \h </w:instrText>
         </w:r>
         <w:r>
           <w:rPr>
@@ -3413,7 +3413,7 @@
             <w:noProof/>
             <w:webHidden/>
           </w:rPr>
-          <w:t>21</w:t>
+          <w:t>22</w:t>
         </w:r>
         <w:r>
           <w:rPr>
@@ -3442,7 +3442,7 @@
           <w14:ligatures w14:val="standardContextual"/>
         </w:rPr>
       </w:pPr>
-      <w:hyperlink w:anchor="_Toc241695205" w:history="1">
+      <w:hyperlink w:anchor="_Toc242310341" w:history="1">
         <w:r>
           <w:rPr>
             <w:rStyle w:val="aff1"/>
@@ -3469,7 +3469,7 @@
             <w:noProof/>
             <w:webHidden/>
           </w:rPr>
-          <w:instrText xml:space="preserve"> PAGEREF _Toc241695205 \h </w:instrText>
+          <w:instrText xml:space="preserve"> PAGEREF _Toc242310341 \h </w:instrText>
         </w:r>
         <w:r>
           <w:rPr>
@@ -3489,7 +3489,7 @@
             <w:noProof/>
             <w:webHidden/>
           </w:rPr>
-          <w:t>22</w:t>
+          <w:t>23</w:t>
         </w:r>
         <w:r>
           <w:rPr>
@@ -3518,7 +3518,7 @@
           <w14:ligatures w14:val="standardContextual"/>
         </w:rPr>
       </w:pPr>
-      <w:hyperlink w:anchor="_Toc241695206" w:history="1">
+      <w:hyperlink w:anchor="_Toc242310342" w:history="1">
         <w:r>
           <w:rPr>
             <w:rStyle w:val="aff1"/>
@@ -3545,7 +3545,7 @@
             <w:noProof/>
             <w:webHidden/>
           </w:rPr>
-          <w:instrText xml:space="preserve"> PAGEREF _Toc241695206 \h </w:instrText>
+          <w:instrText xml:space="preserve"> PAGEREF _Toc242310342 \h </w:instrText>
         </w:r>
         <w:r>
           <w:rPr>
@@ -3565,7 +3565,7 @@
             <w:noProof/>
             <w:webHidden/>
           </w:rPr>
-          <w:t>22</w:t>
+          <w:t>24</w:t>
         </w:r>
         <w:r>
           <w:rPr>
@@ -3594,7 +3594,7 @@
           <w14:ligatures w14:val="standardContextual"/>
         </w:rPr>
       </w:pPr>
-      <w:hyperlink w:anchor="_Toc241695207" w:history="1">
+      <w:hyperlink w:anchor="_Toc242310343" w:history="1">
         <w:r>
           <w:rPr>
             <w:rStyle w:val="aff1"/>
@@ -3621,7 +3621,7 @@
             <w:noProof/>
             <w:webHidden/>
           </w:rPr>
-          <w:instrText xml:space="preserve"> PAGEREF _Toc241695207 \h </w:instrText>
+          <w:instrText xml:space="preserve"> PAGEREF _Toc242310343 \h </w:instrText>
         </w:r>
         <w:r>
           <w:rPr>
@@ -3641,7 +3641,7 @@
             <w:noProof/>
             <w:webHidden/>
           </w:rPr>
-          <w:t>22</w:t>
+          <w:t>24</w:t>
         </w:r>
         <w:r>
           <w:rPr>
@@ -3670,7 +3670,7 @@
           <w14:ligatures w14:val="standardContextual"/>
         </w:rPr>
       </w:pPr>
-      <w:hyperlink w:anchor="_Toc241695208" w:history="1">
+      <w:hyperlink w:anchor="_Toc242310344" w:history="1">
         <w:r>
           <w:rPr>
             <w:rStyle w:val="aff1"/>
@@ -3697,7 +3697,7 @@
             <w:noProof/>
             <w:webHidden/>
           </w:rPr>
-          <w:instrText xml:space="preserve"> PAGEREF _Toc241695208 \h </w:instrText>
+          <w:instrText xml:space="preserve"> PAGEREF _Toc242310344 \h </w:instrText>
         </w:r>
         <w:r>
           <w:rPr>
@@ -3717,7 +3717,7 @@
             <w:noProof/>
             <w:webHidden/>
           </w:rPr>
-          <w:t>22</w:t>
+          <w:t>24</w:t>
         </w:r>
         <w:r>
           <w:rPr>
@@ -3746,7 +3746,7 @@
           <w14:ligatures w14:val="standardContextual"/>
         </w:rPr>
       </w:pPr>
-      <w:hyperlink w:anchor="_Toc241695209" w:history="1">
+      <w:hyperlink w:anchor="_Toc242310345" w:history="1">
         <w:r>
           <w:rPr>
             <w:rStyle w:val="aff1"/>
@@ -3773,7 +3773,7 @@
             <w:noProof/>
             <w:webHidden/>
           </w:rPr>
-          <w:instrText xml:space="preserve"> PAGEREF _Toc241695209 \h </w:instrText>
+          <w:instrText xml:space="preserve"> PAGEREF _Toc242310345 \h </w:instrText>
         </w:r>
         <w:r>
           <w:rPr>
@@ -3793,7 +3793,7 @@
             <w:noProof/>
             <w:webHidden/>
           </w:rPr>
-          <w:t>23</w:t>
+          <w:t>25</w:t>
         </w:r>
         <w:r>
           <w:rPr>
@@ -3822,7 +3822,7 @@
           <w14:ligatures w14:val="standardContextual"/>
         </w:rPr>
       </w:pPr>
-      <w:hyperlink w:anchor="_Toc241695210" w:history="1">
+      <w:hyperlink w:anchor="_Toc242310346" w:history="1">
         <w:r>
           <w:rPr>
             <w:rStyle w:val="aff1"/>
@@ -3849,7 +3849,7 @@
             <w:noProof/>
             <w:webHidden/>
           </w:rPr>
-          <w:instrText xml:space="preserve"> PAGEREF _Toc241695210 \h </w:instrText>
+          <w:instrText xml:space="preserve"> PAGEREF _Toc242310346 \h </w:instrText>
         </w:r>
         <w:r>
           <w:rPr>
@@ -3869,7 +3869,7 @@
             <w:noProof/>
             <w:webHidden/>
           </w:rPr>
-          <w:t>23</w:t>
+          <w:t>25</w:t>
         </w:r>
         <w:r>
           <w:rPr>
@@ -3897,7 +3897,7 @@
           <w14:ligatures w14:val="standardContextual"/>
         </w:rPr>
       </w:pPr>
-      <w:hyperlink w:anchor="_Toc241695211" w:history="1">
+      <w:hyperlink w:anchor="_Toc242310347" w:history="1">
         <w:r>
           <w:rPr>
             <w:rStyle w:val="aff1"/>
@@ -3924,7 +3924,7 @@
             <w:noProof/>
             <w:webHidden/>
           </w:rPr>
-          <w:instrText xml:space="preserve"> PAGEREF _Toc241695211 \h </w:instrText>
+          <w:instrText xml:space="preserve"> PAGEREF _Toc242310347 \h </w:instrText>
         </w:r>
         <w:r>
           <w:rPr>
@@ -3944,7 +3944,7 @@
             <w:noProof/>
             <w:webHidden/>
           </w:rPr>
-          <w:t>24</w:t>
+          <w:t>26</w:t>
         </w:r>
         <w:r>
           <w:rPr>
@@ -3973,7 +3973,7 @@
           <w14:ligatures w14:val="standardContextual"/>
         </w:rPr>
       </w:pPr>
-      <w:hyperlink w:anchor="_Toc241695212" w:history="1">
+      <w:hyperlink w:anchor="_Toc242310348" w:history="1">
         <w:r>
           <w:rPr>
             <w:rStyle w:val="aff1"/>
@@ -4000,7 +4000,7 @@
             <w:noProof/>
             <w:webHidden/>
           </w:rPr>
-          <w:instrText xml:space="preserve"> PAGEREF _Toc241695212 \h </w:instrText>
+          <w:instrText xml:space="preserve"> PAGEREF _Toc242310348 \h </w:instrText>
         </w:r>
         <w:r>
           <w:rPr>
@@ -4020,7 +4020,7 @@
             <w:noProof/>
             <w:webHidden/>
           </w:rPr>
-          <w:t>24</w:t>
+          <w:t>26</w:t>
         </w:r>
         <w:r>
           <w:rPr>
@@ -4049,7 +4049,7 @@
           <w14:ligatures w14:val="standardContextual"/>
         </w:rPr>
       </w:pPr>
-      <w:hyperlink w:anchor="_Toc241695213" w:history="1">
+      <w:hyperlink w:anchor="_Toc242310349" w:history="1">
         <w:r>
           <w:rPr>
             <w:rStyle w:val="aff1"/>
@@ -4076,7 +4076,7 @@
             <w:noProof/>
             <w:webHidden/>
           </w:rPr>
-          <w:instrText xml:space="preserve"> PAGEREF _Toc241695213 \h </w:instrText>
+          <w:instrText xml:space="preserve"> PAGEREF _Toc242310349 \h </w:instrText>
         </w:r>
         <w:r>
           <w:rPr>
@@ -4096,7 +4096,7 @@
             <w:noProof/>
             <w:webHidden/>
           </w:rPr>
-          <w:t>26</w:t>
+          <w:t>28</w:t>
         </w:r>
         <w:r>
           <w:rPr>
@@ -4125,7 +4125,7 @@
           <w14:ligatures w14:val="standardContextual"/>
         </w:rPr>
       </w:pPr>
-      <w:hyperlink w:anchor="_Toc241695214" w:history="1">
+      <w:hyperlink w:anchor="_Toc242310350" w:history="1">
         <w:r>
           <w:rPr>
             <w:rStyle w:val="aff1"/>
@@ -4152,7 +4152,7 @@
             <w:noProof/>
             <w:webHidden/>
           </w:rPr>
-          <w:instrText xml:space="preserve"> PAGEREF _Toc241695214 \h </w:instrText>
+          <w:instrText xml:space="preserve"> PAGEREF _Toc242310350 \h </w:instrText>
         </w:r>
         <w:r>
           <w:rPr>
@@ -4172,7 +4172,7 @@
             <w:noProof/>
             <w:webHidden/>
           </w:rPr>
-          <w:t>26</w:t>
+          <w:t>29</w:t>
         </w:r>
         <w:r>
           <w:rPr>
@@ -4201,7 +4201,7 @@
           <w14:ligatures w14:val="standardContextual"/>
         </w:rPr>
       </w:pPr>
-      <w:hyperlink w:anchor="_Toc241695215" w:history="1">
+      <w:hyperlink w:anchor="_Toc242310351" w:history="1">
         <w:r>
           <w:rPr>
             <w:rStyle w:val="aff1"/>
@@ -4228,7 +4228,7 @@
             <w:noProof/>
             <w:webHidden/>
           </w:rPr>
-          <w:instrText xml:space="preserve"> PAGEREF _Toc241695215 \h </w:instrText>
+          <w:instrText xml:space="preserve"> PAGEREF _Toc242310351 \h </w:instrText>
         </w:r>
         <w:r>
           <w:rPr>
@@ -4248,7 +4248,7 @@
             <w:noProof/>
             <w:webHidden/>
           </w:rPr>
-          <w:t>28</w:t>
+          <w:t>30</w:t>
         </w:r>
         <w:r>
           <w:rPr>
@@ -4277,7 +4277,7 @@
           <w14:ligatures w14:val="standardContextual"/>
         </w:rPr>
       </w:pPr>
-      <w:hyperlink w:anchor="_Toc241695216" w:history="1">
+      <w:hyperlink w:anchor="_Toc242310352" w:history="1">
         <w:r>
           <w:rPr>
             <w:rStyle w:val="aff1"/>
@@ -4304,7 +4304,7 @@
             <w:noProof/>
             <w:webHidden/>
           </w:rPr>
-          <w:instrText xml:space="preserve"> PAGEREF _Toc241695216 \h </w:instrText>
+          <w:instrText xml:space="preserve"> PAGEREF _Toc242310352 \h </w:instrText>
         </w:r>
         <w:r>
           <w:rPr>
@@ -4324,7 +4324,7 @@
             <w:noProof/>
             <w:webHidden/>
           </w:rPr>
-          <w:t>29</w:t>
+          <w:t>31</w:t>
         </w:r>
         <w:r>
           <w:rPr>
@@ -4353,7 +4353,7 @@
           <w14:ligatures w14:val="standardContextual"/>
         </w:rPr>
       </w:pPr>
-      <w:hyperlink w:anchor="_Toc241695217" w:history="1">
+      <w:hyperlink w:anchor="_Toc242310353" w:history="1">
         <w:r>
           <w:rPr>
             <w:rStyle w:val="aff1"/>
@@ -4380,7 +4380,7 @@
             <w:noProof/>
             <w:webHidden/>
           </w:rPr>
-          <w:instrText xml:space="preserve"> PAGEREF _Toc241695217 \h </w:instrText>
+          <w:instrText xml:space="preserve"> PAGEREF _Toc242310353 \h </w:instrText>
         </w:r>
         <w:r>
           <w:rPr>
@@ -4400,7 +4400,7 @@
             <w:noProof/>
             <w:webHidden/>
           </w:rPr>
-          <w:t>30</w:t>
+          <w:t>32</w:t>
         </w:r>
         <w:r>
           <w:rPr>
@@ -4429,7 +4429,7 @@
           <w14:ligatures w14:val="standardContextual"/>
         </w:rPr>
       </w:pPr>
-      <w:hyperlink w:anchor="_Toc241695218" w:history="1">
+      <w:hyperlink w:anchor="_Toc242310354" w:history="1">
         <w:r>
           <w:rPr>
             <w:rStyle w:val="aff1"/>
@@ -4456,7 +4456,7 @@
             <w:noProof/>
             <w:webHidden/>
           </w:rPr>
-          <w:instrText xml:space="preserve"> PAGEREF _Toc241695218 \h </w:instrText>
+          <w:instrText xml:space="preserve"> PAGEREF _Toc242310354 \h </w:instrText>
         </w:r>
         <w:r>
           <w:rPr>
@@ -4476,7 +4476,7 @@
             <w:noProof/>
             <w:webHidden/>
           </w:rPr>
-          <w:t>32</w:t>
+          <w:t>34</w:t>
         </w:r>
         <w:r>
           <w:rPr>
@@ -4505,7 +4505,7 @@
           <w14:ligatures w14:val="standardContextual"/>
         </w:rPr>
       </w:pPr>
-      <w:hyperlink w:anchor="_Toc241695219" w:history="1">
+      <w:hyperlink w:anchor="_Toc242310355" w:history="1">
         <w:r>
           <w:rPr>
             <w:rStyle w:val="aff1"/>
@@ -4532,7 +4532,7 @@
             <w:noProof/>
             <w:webHidden/>
           </w:rPr>
-          <w:instrText xml:space="preserve"> PAGEREF _Toc241695219 \h </w:instrText>
+          <w:instrText xml:space="preserve"> PAGEREF _Toc242310355 \h </w:instrText>
         </w:r>
         <w:r>
           <w:rPr>
@@ -4552,7 +4552,7 @@
             <w:noProof/>
             <w:webHidden/>
           </w:rPr>
-          <w:t>32</w:t>
+          <w:t>34</w:t>
         </w:r>
         <w:r>
           <w:rPr>
@@ -4581,7 +4581,7 @@
           <w14:ligatures w14:val="standardContextual"/>
         </w:rPr>
       </w:pPr>
-      <w:hyperlink w:anchor="_Toc241695220" w:history="1">
+      <w:hyperlink w:anchor="_Toc242310356" w:history="1">
         <w:r>
           <w:rPr>
             <w:rStyle w:val="aff1"/>
@@ -4608,7 +4608,7 @@
             <w:noProof/>
             <w:webHidden/>
           </w:rPr>
-          <w:instrText xml:space="preserve"> PAGEREF _Toc241695220 \h </w:instrText>
+          <w:instrText xml:space="preserve"> PAGEREF _Toc242310356 \h </w:instrText>
         </w:r>
         <w:r>
           <w:rPr>
@@ -4628,7 +4628,7 @@
             <w:noProof/>
             <w:webHidden/>
           </w:rPr>
-          <w:t>33</w:t>
+          <w:t>35</w:t>
         </w:r>
         <w:r>
           <w:rPr>
@@ -4656,7 +4656,7 @@
           <w14:ligatures w14:val="standardContextual"/>
         </w:rPr>
       </w:pPr>
-      <w:hyperlink w:anchor="_Toc241695221" w:history="1">
+      <w:hyperlink w:anchor="_Toc242310357" w:history="1">
         <w:r>
           <w:rPr>
             <w:rStyle w:val="aff1"/>
@@ -4683,7 +4683,7 @@
             <w:noProof/>
             <w:webHidden/>
           </w:rPr>
-          <w:instrText xml:space="preserve"> PAGEREF _Toc241695221 \h </w:instrText>
+          <w:instrText xml:space="preserve"> PAGEREF _Toc242310357 \h </w:instrText>
         </w:r>
         <w:r>
           <w:rPr>
@@ -4703,7 +4703,7 @@
             <w:noProof/>
             <w:webHidden/>
           </w:rPr>
-          <w:t>34</w:t>
+          <w:t>36</w:t>
         </w:r>
         <w:r>
           <w:rPr>
@@ -4732,7 +4732,7 @@
           <w14:ligatures w14:val="standardContextual"/>
         </w:rPr>
       </w:pPr>
-      <w:hyperlink w:anchor="_Toc241695222" w:history="1">
+      <w:hyperlink w:anchor="_Toc242310358" w:history="1">
         <w:r>
           <w:rPr>
             <w:rStyle w:val="aff1"/>
@@ -4759,7 +4759,7 @@
             <w:noProof/>
             <w:webHidden/>
           </w:rPr>
-          <w:instrText xml:space="preserve"> PAGEREF _Toc241695222 \h </w:instrText>
+          <w:instrText xml:space="preserve"> PAGEREF _Toc242310358 \h </w:instrText>
         </w:r>
         <w:r>
           <w:rPr>
@@ -4779,7 +4779,7 @@
             <w:noProof/>
             <w:webHidden/>
           </w:rPr>
-          <w:t>34</w:t>
+          <w:t>36</w:t>
         </w:r>
         <w:r>
           <w:rPr>
@@ -4808,7 +4808,7 @@
           <w14:ligatures w14:val="standardContextual"/>
         </w:rPr>
       </w:pPr>
-      <w:hyperlink w:anchor="_Toc241695223" w:history="1">
+      <w:hyperlink w:anchor="_Toc242310359" w:history="1">
         <w:r>
           <w:rPr>
             <w:rStyle w:val="aff1"/>
@@ -4835,7 +4835,7 @@
             <w:noProof/>
             <w:webHidden/>
           </w:rPr>
-          <w:instrText xml:space="preserve"> PAGEREF _Toc241695223 \h </w:instrText>
+          <w:instrText xml:space="preserve"> PAGEREF _Toc242310359 \h </w:instrText>
         </w:r>
         <w:r>
           <w:rPr>
@@ -4855,7 +4855,7 @@
             <w:noProof/>
             <w:webHidden/>
           </w:rPr>
-          <w:t>34</w:t>
+          <w:t>36</w:t>
         </w:r>
         <w:r>
           <w:rPr>
@@ -4884,7 +4884,7 @@
           <w14:ligatures w14:val="standardContextual"/>
         </w:rPr>
       </w:pPr>
-      <w:hyperlink w:anchor="_Toc241695224" w:history="1">
+      <w:hyperlink w:anchor="_Toc242310360" w:history="1">
         <w:r>
           <w:rPr>
             <w:rStyle w:val="aff1"/>
@@ -4911,7 +4911,7 @@
             <w:noProof/>
             <w:webHidden/>
           </w:rPr>
-          <w:instrText xml:space="preserve"> PAGEREF _Toc241695224 \h </w:instrText>
+          <w:instrText xml:space="preserve"> PAGEREF _Toc242310360 \h </w:instrText>
         </w:r>
         <w:r>
           <w:rPr>
@@ -4931,7 +4931,7 @@
             <w:noProof/>
             <w:webHidden/>
           </w:rPr>
-          <w:t>34</w:t>
+          <w:t>36</w:t>
         </w:r>
         <w:r>
           <w:rPr>
@@ -4960,7 +4960,7 @@
           <w14:ligatures w14:val="standardContextual"/>
         </w:rPr>
       </w:pPr>
-      <w:hyperlink w:anchor="_Toc241695225" w:history="1">
+      <w:hyperlink w:anchor="_Toc242310361" w:history="1">
         <w:r>
           <w:rPr>
             <w:rStyle w:val="aff1"/>
@@ -4987,7 +4987,7 @@
             <w:noProof/>
             <w:webHidden/>
           </w:rPr>
-          <w:instrText xml:space="preserve"> PAGEREF _Toc241695225 \h </w:instrText>
+          <w:instrText xml:space="preserve"> PAGEREF _Toc242310361 \h </w:instrText>
         </w:r>
         <w:r>
           <w:rPr>
@@ -5007,7 +5007,7 @@
             <w:noProof/>
             <w:webHidden/>
           </w:rPr>
-          <w:t>35</w:t>
+          <w:t>37</w:t>
         </w:r>
         <w:r>
           <w:rPr>
@@ -5036,7 +5036,7 @@
           <w14:ligatures w14:val="standardContextual"/>
         </w:rPr>
       </w:pPr>
-      <w:hyperlink w:anchor="_Toc241695226" w:history="1">
+      <w:hyperlink w:anchor="_Toc242310362" w:history="1">
         <w:r>
           <w:rPr>
             <w:rStyle w:val="aff1"/>
@@ -5063,7 +5063,7 @@
             <w:noProof/>
             <w:webHidden/>
           </w:rPr>
-          <w:instrText xml:space="preserve"> PAGEREF _Toc241695226 \h </w:instrText>
+          <w:instrText xml:space="preserve"> PAGEREF _Toc242310362 \h </w:instrText>
         </w:r>
         <w:r>
           <w:rPr>
@@ -5083,7 +5083,7 @@
             <w:noProof/>
             <w:webHidden/>
           </w:rPr>
-          <w:t>35</w:t>
+          <w:t>37</w:t>
         </w:r>
         <w:r>
           <w:rPr>
@@ -5112,7 +5112,7 @@
           <w14:ligatures w14:val="standardContextual"/>
         </w:rPr>
       </w:pPr>
-      <w:hyperlink w:anchor="_Toc241695227" w:history="1">
+      <w:hyperlink w:anchor="_Toc242310363" w:history="1">
         <w:r>
           <w:rPr>
             <w:rStyle w:val="aff1"/>
@@ -5139,7 +5139,7 @@
             <w:noProof/>
             <w:webHidden/>
           </w:rPr>
-          <w:instrText xml:space="preserve"> PAGEREF _Toc241695227 \h </w:instrText>
+          <w:instrText xml:space="preserve"> PAGEREF _Toc242310363 \h </w:instrText>
         </w:r>
         <w:r>
           <w:rPr>
@@ -5159,7 +5159,7 @@
             <w:noProof/>
             <w:webHidden/>
           </w:rPr>
-          <w:t>36</w:t>
+          <w:t>38</w:t>
         </w:r>
         <w:r>
           <w:rPr>
@@ -5188,13 +5188,13 @@
           <w14:ligatures w14:val="standardContextual"/>
         </w:rPr>
       </w:pPr>
-      <w:hyperlink w:anchor="_Toc241695228" w:history="1">
+      <w:hyperlink w:anchor="_Toc242310364" w:history="1">
         <w:r>
           <w:rPr>
             <w:rStyle w:val="aff1"/>
             <w:noProof/>
           </w:rPr>
-          <w:t>8.7 W6~W12 Roadmap</w:t>
+          <w:t>8.7 단계별 출시 조건</w:t>
         </w:r>
         <w:r>
           <w:rPr>
@@ -5215,7 +5215,7 @@
             <w:noProof/>
             <w:webHidden/>
           </w:rPr>
-          <w:instrText xml:space="preserve"> PAGEREF _Toc241695228 \h </w:instrText>
+          <w:instrText xml:space="preserve"> PAGEREF _Toc242310364 \h </w:instrText>
         </w:r>
         <w:r>
           <w:rPr>
@@ -5235,7 +5235,7 @@
             <w:noProof/>
             <w:webHidden/>
           </w:rPr>
-          <w:t>36</w:t>
+          <w:t>38</w:t>
         </w:r>
         <w:r>
           <w:rPr>
@@ -5263,7 +5263,7 @@
           <w14:ligatures w14:val="standardContextual"/>
         </w:rPr>
       </w:pPr>
-      <w:hyperlink w:anchor="_Toc241695229" w:history="1">
+      <w:hyperlink w:anchor="_Toc242310365" w:history="1">
         <w:r>
           <w:rPr>
             <w:rStyle w:val="aff1"/>
@@ -5290,7 +5290,7 @@
             <w:noProof/>
             <w:webHidden/>
           </w:rPr>
-          <w:instrText xml:space="preserve"> PAGEREF _Toc241695229 \h </w:instrText>
+          <w:instrText xml:space="preserve"> PAGEREF _Toc242310365 \h </w:instrText>
         </w:r>
         <w:r>
           <w:rPr>
@@ -5310,7 +5310,7 @@
             <w:noProof/>
             <w:webHidden/>
           </w:rPr>
-          <w:t>37</w:t>
+          <w:t>39</w:t>
         </w:r>
         <w:r>
           <w:rPr>
@@ -5338,7 +5338,7 @@
           <w14:ligatures w14:val="standardContextual"/>
         </w:rPr>
       </w:pPr>
-      <w:hyperlink w:anchor="_Toc241695230" w:history="1">
+      <w:hyperlink w:anchor="_Toc242310366" w:history="1">
         <w:r>
           <w:rPr>
             <w:rStyle w:val="aff1"/>
@@ -5365,7 +5365,7 @@
             <w:noProof/>
             <w:webHidden/>
           </w:rPr>
-          <w:instrText xml:space="preserve"> PAGEREF _Toc241695230 \h </w:instrText>
+          <w:instrText xml:space="preserve"> PAGEREF _Toc242310366 \h </w:instrText>
         </w:r>
         <w:r>
           <w:rPr>
@@ -5385,7 +5385,7 @@
             <w:noProof/>
             <w:webHidden/>
           </w:rPr>
-          <w:t>37</w:t>
+          <w:t>39</w:t>
         </w:r>
         <w:r>
           <w:rPr>
@@ -5413,7 +5413,7 @@
           <w14:ligatures w14:val="standardContextual"/>
         </w:rPr>
       </w:pPr>
-      <w:hyperlink w:anchor="_Toc241695231" w:history="1">
+      <w:hyperlink w:anchor="_Toc242310367" w:history="1">
         <w:r>
           <w:rPr>
             <w:rStyle w:val="aff1"/>
@@ -5440,7 +5440,7 @@
             <w:noProof/>
             <w:webHidden/>
           </w:rPr>
-          <w:instrText xml:space="preserve"> PAGEREF _Toc241695231 \h </w:instrText>
+          <w:instrText xml:space="preserve"> PAGEREF _Toc242310367 \h </w:instrText>
         </w:r>
         <w:r>
           <w:rPr>
@@ -5460,7 +5460,7 @@
             <w:noProof/>
             <w:webHidden/>
           </w:rPr>
-          <w:t>38</w:t>
+          <w:t>40</w:t>
         </w:r>
         <w:r>
           <w:rPr>
@@ -5490,7 +5490,7 @@
           <w:numId w:val="7"/>
         </w:numPr>
       </w:pPr>
-      <w:bookmarkStart w:id="0" w:name="_Toc241695167"/>
+      <w:bookmarkStart w:id="0" w:name="_Toc242310303"/>
       <w:r>
         <w:lastRenderedPageBreak/>
         <w:t>게임</w:t>
@@ -5523,7 +5523,7 @@
           <w:numId w:val="7"/>
         </w:numPr>
       </w:pPr>
-      <w:bookmarkStart w:id="1" w:name="_Toc241695168"/>
+      <w:bookmarkStart w:id="1" w:name="_Toc242310304"/>
       <w:r>
         <w:t>Executive Summary</w:t>
       </w:r>
@@ -5594,7 +5594,7 @@
           <w:numId w:val="7"/>
         </w:numPr>
       </w:pPr>
-      <w:bookmarkStart w:id="2" w:name="_Toc241695169"/>
+      <w:bookmarkStart w:id="2" w:name="_Toc242310305"/>
       <w:r>
         <w:t>Rev 16 Release Profile</w:t>
       </w:r>
@@ -5618,7 +5618,7 @@
           <w:numId w:val="7"/>
         </w:numPr>
       </w:pPr>
-      <w:bookmarkStart w:id="3" w:name="_Toc241695170"/>
+      <w:bookmarkStart w:id="3" w:name="_Toc242310306"/>
       <w:r>
         <w:t>제품</w:t>
       </w:r>
@@ -5837,7 +5837,7 @@
               <w:pStyle w:val="TableText"/>
             </w:pPr>
             <w:r>
-              <w:t>2026-09-20 실제 Public Release 목표. ‘Feature Complete Candidate’가 아니라 출시 가능한 Final RC를 기준으로 판단</w:t>
+              <w:t>기존 2026-09-20 목표는 지난 계획 이력이다. 새 출시일은 미정이며, 출시 가능한 Final RC를 기준으로 판단한다. 일정과 진행은 Notion의 ‘출시 정리와 남은 단계’를 따른다.</w:t>
             </w:r>
           </w:p>
         </w:tc>
@@ -5860,7 +5860,7 @@
         </w:numPr>
       </w:pPr>
       <w:r>
-        <w:t>W5~W6에서 Online Join과 전체 게임 루프를 고정한다.</w:t>
+        <w:t>기존 2026-09-20 출시 목표는 지난 계획 이력으로 보존한다. 새 출시일은 미정이다.</w:t>
       </w:r>
     </w:p>
     <w:p>
@@ -5872,7 +5872,7 @@
         </w:numPr>
       </w:pPr>
       <w:r>
-        <w:t>W8은 세 맵 Release Shape와 Feature Lock 준비 구간이다.</w:t>
+        <w:t>출시 준비는 실패 해결과 최신 빌드 기준 확정, 콘텐츠 확정, Feature Lock과 통합 QA, Clean RC 검증, 공개 판단의 단계별 조건을 따른다.</w:t>
       </w:r>
     </w:p>
     <w:p>
@@ -5884,7 +5884,8 @@
         </w:numPr>
       </w:pPr>
       <w:r>
-        <w:t>W9~W10은 QA Sprint와 RC1, W11은 외부 Playtest, W12는 Final RC와 Release Gate 구간이다.</w:t>
+        <w:lastRenderedPageBreak/>
+        <w:t>개별 Task, 완료 증거와 빌드 Hash 상태를 이 문서에 복제하지 않는다. 일정과 진행의 Source of Truth는 Notion이다.</w:t>
       </w:r>
     </w:p>
     <w:p>
@@ -5896,9 +5897,13 @@
         </w:numPr>
       </w:pPr>
       <w:r>
-        <w:lastRenderedPageBreak/>
-        <w:t>W12 Final Gate를 통과한 경우에만 Public Release를 승인하며, 프로젝트 목표는 실제 출시 가능한 Final RC다.</w:t>
-      </w:r>
+        <w:t xml:space="preserve">현재 일정과 남은 단계는 Notion에서 관리한다: </w:t>
+      </w:r>
+      <w:hyperlink r:id="rId8">
+        <w:r>
+          <w:t>출시 정리와 남은 단계</w:t>
+        </w:r>
+      </w:hyperlink>
     </w:p>
     <w:p>
       <w:pPr>
@@ -5908,7 +5913,7 @@
           <w:numId w:val="7"/>
         </w:numPr>
       </w:pPr>
-      <w:bookmarkStart w:id="4" w:name="_Toc241695171"/>
+      <w:bookmarkStart w:id="4" w:name="_Toc242310307"/>
       <w:r>
         <w:t>디자인</w:t>
       </w:r>
@@ -6278,7 +6283,7 @@
           <w:numId w:val="7"/>
         </w:numPr>
       </w:pPr>
-      <w:bookmarkStart w:id="5" w:name="_Toc241695172"/>
+      <w:bookmarkStart w:id="5" w:name="_Toc242310308"/>
       <w:r>
         <w:t>Target Experience</w:t>
       </w:r>
@@ -6352,7 +6357,7 @@
           <w:numId w:val="7"/>
         </w:numPr>
       </w:pPr>
-      <w:bookmarkStart w:id="6" w:name="_Toc241695173"/>
+      <w:bookmarkStart w:id="6" w:name="_Toc242310309"/>
       <w:r>
         <w:t>명시적</w:t>
       </w:r>
@@ -6624,7 +6629,7 @@
           <w:numId w:val="7"/>
         </w:numPr>
       </w:pPr>
-      <w:bookmarkStart w:id="7" w:name="_Toc241695174"/>
+      <w:bookmarkStart w:id="7" w:name="_Toc242310310"/>
       <w:r>
         <w:lastRenderedPageBreak/>
         <w:t>Contract Run</w:t>
@@ -6660,7 +6665,7 @@
           <w:numId w:val="7"/>
         </w:numPr>
       </w:pPr>
-      <w:bookmarkStart w:id="8" w:name="_Toc241695175"/>
+      <w:bookmarkStart w:id="8" w:name="_Toc242310311"/>
       <w:r>
         <w:t>Core Loop</w:t>
       </w:r>
@@ -7154,7 +7159,7 @@
           <w:numId w:val="7"/>
         </w:numPr>
       </w:pPr>
-      <w:bookmarkStart w:id="9" w:name="_Toc241695176"/>
+      <w:bookmarkStart w:id="9" w:name="_Toc242310312"/>
       <w:r>
         <w:t xml:space="preserve">Contract </w:t>
       </w:r>
@@ -7578,7 +7583,7 @@
           <w:numId w:val="7"/>
         </w:numPr>
       </w:pPr>
-      <w:bookmarkStart w:id="10" w:name="_Toc241695177"/>
+      <w:bookmarkStart w:id="10" w:name="_Toc242310313"/>
       <w:r>
         <w:lastRenderedPageBreak/>
         <w:t>성공</w:t>
@@ -7870,7 +7875,7 @@
           <w:numId w:val="7"/>
         </w:numPr>
       </w:pPr>
-      <w:bookmarkStart w:id="11" w:name="_Toc241695178"/>
+      <w:bookmarkStart w:id="11" w:name="_Toc242310314"/>
       <w:r>
         <w:t>Greed Decision</w:t>
       </w:r>
@@ -8239,7 +8244,7 @@
           <w:numId w:val="7"/>
         </w:numPr>
       </w:pPr>
-      <w:bookmarkStart w:id="12" w:name="_Toc241695179"/>
+      <w:bookmarkStart w:id="12" w:name="_Toc242310315"/>
       <w:r>
         <w:t>15~25</w:t>
       </w:r>
@@ -8609,7 +8614,7 @@
           <w:numId w:val="7"/>
         </w:numPr>
       </w:pPr>
-      <w:bookmarkStart w:id="13" w:name="_Toc241695180"/>
+      <w:bookmarkStart w:id="13" w:name="_Toc242310316"/>
       <w:r>
         <w:lastRenderedPageBreak/>
         <w:t>위조와</w:t>
@@ -8636,7 +8641,7 @@
           <w:numId w:val="7"/>
         </w:numPr>
       </w:pPr>
-      <w:bookmarkStart w:id="14" w:name="_Toc241695181"/>
+      <w:bookmarkStart w:id="14" w:name="_Toc242310317"/>
       <w:r>
         <w:t>Artifact</w:t>
       </w:r>
@@ -8926,7 +8931,11 @@
     </w:p>
     <w:p>
       <w:r>
-        <w:t>M01·M02·M03의 기존 그림 60점은 모두 전시 후보이며, 매치마다 그중 12점만 탈취할 수 있고 나머지 48점은 일반 전시물로 보인다. 일반 전시물은 단독·연작·다단 군집으로 전시실을 구성하고 탈취 대상과 같거나 더 큰 작품도 포함한다. 이번 매치에서 활성화한 탈취 작품은 기존 프레임과 하단 보안 패널(바닥에 가까운 큰 액자는 낮은 측면 패널)로 접근 전에 구별한다. 작품 크기, 중앙 위치 또는 양옆의 일반 작품 수가 정답을 드러내는 고정 패턴을 사용하지 않는다. 근거리 행동 안내는 탈취 대상에만 표시하며, 필수 작품은 기존 계약 단서와 발견 표시를 따른다. 그림 크기는 현재 승인된 배치를 기준으로 유지한다. 과거의 1.5배·3배 확대를 반복 적용하지 않는다. 탈취 작품의 행동 영역은 작품 정면의 근거리로 한정한다. 벽 하단 걸레받이와 상단 몰딩은 벽에서 조금 돌출시키되 배율 작성 규칙과 표면 겹침 검사를 따른다.</w:t>
+        <w:t xml:space="preserve">M01·M02·M03의 기존 그림 60점은 모두 전시 후보이며, 매치마다 그중 12점만 탈취할 수 있고 나머지 48점은 일반 전시물로 보인다. 일반 전시물은 단독·연작·다단 군집으로 전시실을 구성하고 탈취 대상과 같거나 더 큰 작품도 포함한다. 이번 매치에서 활성화한 탈취 작품은 기존 프레임과 하단 보안 패널(바닥에 가까운 큰 액자는 낮은 측면 패널)로 접근 전에 구별한다. 작품 크기, 중앙 위치 또는 양옆의 일반 작품 수가 정답을 드러내는 고정 패턴을 사용하지 않는다. 근거리 행동 안내는 탈취 대상에만 표시하며, 필수 작품은 기존 계약 단서와 발견 표시를 따른다. 그림 크기는 현재 승인된 배치를 기준으로 유지한다. 과거의 1.5배·3배 확대를 반복 적용하지 않는다. 탈취 작품의 행동 영역은 작품 정면의 </w:t>
+      </w:r>
+      <w:r>
+        <w:lastRenderedPageBreak/>
+        <w:t>근거리로 한정한다. 벽 하단 걸레받이와 상단 몰딩은 벽에서 조금 돌출시키되 배율 작성 규칙과 표면 겹침 검사를 따른다.</w:t>
       </w:r>
     </w:p>
     <w:p>
@@ -8937,9 +8946,8 @@
           <w:numId w:val="7"/>
         </w:numPr>
       </w:pPr>
-      <w:bookmarkStart w:id="15" w:name="_Toc241695182"/>
-      <w:r>
-        <w:lastRenderedPageBreak/>
+      <w:bookmarkStart w:id="15" w:name="_Toc242310318"/>
+      <w:r>
         <w:t xml:space="preserve">Surface Forgery </w:t>
       </w:r>
       <w:r>
@@ -9034,6 +9042,7 @@
         </w:numPr>
       </w:pPr>
       <w:r>
+        <w:lastRenderedPageBreak/>
         <w:t>E 확정은 Replica Texture 교체, 덜그럭거리는 교체 Audio/World Feedback, 서버 SoundPing과 인근 Guard의 InvestigateNoise 전환을 한 사건으로 처리한다.</w:t>
       </w:r>
     </w:p>
@@ -9119,9 +9128,8 @@
           <w:numId w:val="7"/>
         </w:numPr>
       </w:pPr>
-      <w:bookmarkStart w:id="16" w:name="_Toc241695183"/>
-      <w:r>
-        <w:lastRenderedPageBreak/>
+      <w:bookmarkStart w:id="16" w:name="_Toc242310319"/>
+      <w:r>
         <w:t>Object Assembly — Deferred Expansion</w:t>
       </w:r>
       <w:bookmarkEnd w:id="16"/>
@@ -9187,7 +9195,7 @@
           <w:numId w:val="7"/>
         </w:numPr>
       </w:pPr>
-      <w:bookmarkStart w:id="17" w:name="_Toc241695184"/>
+      <w:bookmarkStart w:id="17" w:name="_Toc242310320"/>
       <w:r>
         <w:t>Quality</w:t>
       </w:r>
@@ -9465,6 +9473,7 @@
     </w:p>
     <w:p>
       <w:r>
+        <w:lastRenderedPageBreak/>
         <w:t>Forgery Quality는 Replica 교체 가능 여부를 정하는 70점 기준과 Result의 Replica 회고에만 사용하며 Contract Value 또는 Quota와 합치지 않는다. 승인된 70~100점 안에서 Quality가 Alert, Lockdown 또는 Guard 검사 결과를 바꾸지 않는다.</w:t>
       </w:r>
     </w:p>
@@ -9476,9 +9485,8 @@
           <w:numId w:val="7"/>
         </w:numPr>
       </w:pPr>
-      <w:bookmarkStart w:id="18" w:name="_Toc241695185"/>
-      <w:r>
-        <w:lastRenderedPageBreak/>
+      <w:bookmarkStart w:id="18" w:name="_Toc242310321"/>
+      <w:r>
         <w:t>핵심</w:t>
       </w:r>
       <w:r>
@@ -9978,8 +9986,9 @@
           <w:numId w:val="7"/>
         </w:numPr>
       </w:pPr>
-      <w:bookmarkStart w:id="19" w:name="_Toc241695186"/>
-      <w:r>
+      <w:bookmarkStart w:id="19" w:name="_Toc242310322"/>
+      <w:r>
+        <w:lastRenderedPageBreak/>
         <w:t xml:space="preserve">Owner-only Forgery </w:t>
       </w:r>
       <w:r>
@@ -10229,7 +10238,7 @@
           <w:numId w:val="7"/>
         </w:numPr>
       </w:pPr>
-      <w:bookmarkStart w:id="20" w:name="_Toc241695187"/>
+      <w:bookmarkStart w:id="20" w:name="_Toc242310323"/>
       <w:r>
         <w:lastRenderedPageBreak/>
         <w:t>잠입</w:t>
@@ -10262,7 +10271,7 @@
           <w:numId w:val="7"/>
         </w:numPr>
       </w:pPr>
-      <w:bookmarkStart w:id="21" w:name="_Toc241695188"/>
+      <w:bookmarkStart w:id="21" w:name="_Toc242310324"/>
       <w:r>
         <w:t xml:space="preserve">First-Person </w:t>
       </w:r>
@@ -10332,7 +10341,7 @@
           <w:numId w:val="7"/>
         </w:numPr>
       </w:pPr>
-      <w:bookmarkStart w:id="22" w:name="_Toc241695189"/>
+      <w:bookmarkStart w:id="22" w:name="_Toc242310325"/>
       <w:r>
         <w:t>Walk, Sprint, Weight, Footstep</w:t>
       </w:r>
@@ -10675,7 +10684,7 @@
           <w:numId w:val="7"/>
         </w:numPr>
       </w:pPr>
-      <w:bookmarkStart w:id="23" w:name="_Toc241695190"/>
+      <w:bookmarkStart w:id="23" w:name="_Toc242310326"/>
       <w:r>
         <w:t>Patrol Guard</w:t>
       </w:r>
@@ -11031,7 +11040,7 @@
           <w:numId w:val="7"/>
         </w:numPr>
       </w:pPr>
-      <w:bookmarkStart w:id="24" w:name="_Toc241695191"/>
+      <w:bookmarkStart w:id="24" w:name="_Toc242310327"/>
       <w:r>
         <w:t>CCTV</w:t>
       </w:r>
@@ -11282,7 +11291,7 @@
           <w:numId w:val="7"/>
         </w:numPr>
       </w:pPr>
-      <w:bookmarkStart w:id="25" w:name="_Toc241695192"/>
+      <w:bookmarkStart w:id="25" w:name="_Toc242310328"/>
       <w:r>
         <w:t>Stun, Arrest, Recovery</w:t>
       </w:r>
@@ -11356,7 +11365,7 @@
           <w:numId w:val="7"/>
         </w:numPr>
       </w:pPr>
-      <w:bookmarkStart w:id="26" w:name="_Toc241695193"/>
+      <w:bookmarkStart w:id="26" w:name="_Toc242310329"/>
       <w:r>
         <w:t>두</w:t>
       </w:r>
@@ -11833,7 +11842,7 @@
           <w:numId w:val="7"/>
         </w:numPr>
       </w:pPr>
-      <w:bookmarkStart w:id="27" w:name="_Toc241695194"/>
+      <w:bookmarkStart w:id="27" w:name="_Toc242310330"/>
       <w:r>
         <w:lastRenderedPageBreak/>
         <w:t>협동</w:t>
@@ -11860,7 +11869,7 @@
           <w:numId w:val="7"/>
         </w:numPr>
       </w:pPr>
-      <w:bookmarkStart w:id="28" w:name="_Toc241695195"/>
+      <w:bookmarkStart w:id="28" w:name="_Toc242310331"/>
       <w:r>
         <w:t>Role Switching</w:t>
       </w:r>
@@ -12268,7 +12277,7 @@
           <w:numId w:val="7"/>
         </w:numPr>
       </w:pPr>
-      <w:bookmarkStart w:id="29" w:name="_Toc241695196"/>
+      <w:bookmarkStart w:id="29" w:name="_Toc242310332"/>
       <w:r>
         <w:t>거리</w:t>
       </w:r>
@@ -12327,7 +12336,7 @@
           <w:numId w:val="7"/>
         </w:numPr>
       </w:pPr>
-      <w:bookmarkStart w:id="30" w:name="_Toc241695197"/>
+      <w:bookmarkStart w:id="30" w:name="_Toc242310333"/>
       <w:r>
         <w:t>Inventory, Loose Loot, Coin</w:t>
       </w:r>
@@ -12390,7 +12399,7 @@
           <w:numId w:val="7"/>
         </w:numPr>
       </w:pPr>
-      <w:bookmarkStart w:id="31" w:name="_Toc241695198"/>
+      <w:bookmarkStart w:id="31" w:name="_Toc242310334"/>
       <w:r>
         <w:t>Player Identity</w:t>
       </w:r>
@@ -12813,7 +12822,7 @@
           <w:numId w:val="7"/>
         </w:numPr>
       </w:pPr>
-      <w:bookmarkStart w:id="32" w:name="_Toc241695199"/>
+      <w:bookmarkStart w:id="32" w:name="_Toc242310335"/>
       <w:r>
         <w:t xml:space="preserve">Floor Plan Map </w:t>
       </w:r>
@@ -13014,6 +13023,7 @@
     </w:p>
     <w:p>
       <w:r>
+        <w:lastRenderedPageBreak/>
         <w:t>Contract가 정확한 Case 위치를 공개하지 않는 경우 Gallery/Zone만 표시한다. Map은 탐색을 없애는 레이더가 아니라 팀의 공유 공간 기억을 보조하며 Guard/CCTV 위치·시야 Cone과 Laser 내부 상태를 실시간 공개하지 않는다.</w:t>
       </w:r>
     </w:p>
@@ -13025,7 +13035,7 @@
           <w:numId w:val="7"/>
         </w:numPr>
       </w:pPr>
-      <w:bookmarkStart w:id="33" w:name="_Toc241695200"/>
+      <w:bookmarkStart w:id="33" w:name="_Toc242310336"/>
       <w:r>
         <w:t>Shared Extraction</w:t>
       </w:r>
@@ -13069,7 +13079,6 @@
         </w:numPr>
       </w:pPr>
       <w:r>
-        <w:lastRenderedPageBreak/>
         <w:t>Mid-run Settlement는 Painting Original과 Required Target을 Inventory에 유지한다. 정산할 Loose Loot가 없으면 중간 정산을 만들지 않고 같은 Vent의 기존 Final Escape 경로를 사용한다.</w:t>
       </w:r>
     </w:p>
@@ -13105,7 +13114,7 @@
           <w:numId w:val="7"/>
         </w:numPr>
       </w:pPr>
-      <w:bookmarkStart w:id="34" w:name="_Toc241695201"/>
+      <w:bookmarkStart w:id="34" w:name="_Toc242310337"/>
       <w:r>
         <w:lastRenderedPageBreak/>
         <w:t xml:space="preserve">UI, </w:t>
@@ -13134,7 +13143,7 @@
           <w:numId w:val="7"/>
         </w:numPr>
       </w:pPr>
-      <w:bookmarkStart w:id="35" w:name="_Toc241695202"/>
+      <w:bookmarkStart w:id="35" w:name="_Toc242310338"/>
       <w:r>
         <w:t>HUD Information Architecture</w:t>
       </w:r>
@@ -13432,7 +13441,7 @@
           <w:numId w:val="7"/>
         </w:numPr>
       </w:pPr>
-      <w:bookmarkStart w:id="36" w:name="_Toc241695203"/>
+      <w:bookmarkStart w:id="36" w:name="_Toc242310339"/>
       <w:r>
         <w:lastRenderedPageBreak/>
         <w:t xml:space="preserve">Main HUD </w:t>
@@ -13492,16 +13501,20 @@
             <w:r>
               <w:t>미션</w:t>
             </w:r>
-            <w:r/>
-            <w:r/>
           </w:p>
           <w:p>
             <w:r>
               <w:t>MM : SS</w:t>
+            </w:r>
+            <w:r>
               <w:br/>
               <w:t>필수 목표 작품명</w:t>
+            </w:r>
+            <w:r>
               <w:br/>
               <w:t>전리품 가치 현재 / 목표</w:t>
+            </w:r>
+            <w:r>
               <w:br/>
               <w:t>얇은 경계도 10칸 / 사건 Text</w:t>
             </w:r>
@@ -13548,8 +13561,6 @@
             <w:pPr>
               <w:keepNext/>
             </w:pPr>
-            <w:r/>
-            <w:r/>
           </w:p>
         </w:tc>
       </w:tr>
@@ -13573,6 +13584,8 @@
           <w:p>
             <w:r>
               <w:t>TEAM STATUS ×4</w:t>
+            </w:r>
+            <w:r>
               <w:br/>
               <w:t>작은 Profile · Name · Status · Mic</w:t>
             </w:r>
@@ -13603,10 +13616,7 @@
             </w:tcMar>
             <w:vAlign w:val="center"/>
           </w:tcPr>
-          <w:p>
-            <w:r/>
-            <w:r/>
-          </w:p>
+          <w:p/>
         </w:tc>
       </w:tr>
       <w:tr>
@@ -13739,7 +13749,7 @@
           <w:numId w:val="7"/>
         </w:numPr>
       </w:pPr>
-      <w:bookmarkStart w:id="37" w:name="_Toc241695204"/>
+      <w:bookmarkStart w:id="37" w:name="_Toc242310340"/>
       <w:r>
         <w:t>최소</w:t>
       </w:r>
@@ -13813,10 +13823,8 @@
     </w:p>
     <w:p>
       <w:r>
-        <w:t xml:space="preserve">활성 도구 안내는 손전등·동전·가방의 아이콘을 기존보다 약 1.5배 크게 표시하고 F·Q·TAB 키 안내는 각 아이콘 아래에 정렬한다. 손전등 ON/OFF와 동전 수량은 기존 의미를 유지한다. 사용하지 않는 두 QuickSlot은 보이지 않게 접고 기능이나 아이템을 추가하지 않는다. 머리 위 이름표는 바깥 배경 테두리 없이 이름과 상태를 표시한다. 위조 화면은 위조품 왼쪽·팔레트 가운데·원본 오른쪽으로 배치한다. 남은 시간은 머리글 오른쪽, 작품 유사도는 원본 위쪽에 두어 작업 면적과 제출 가능 여부를 선명하게 구분한다. 작품 유사도는 진행 막대의 길이와 붉은색·주황색·초록색으로 읽히게 하고 예상 점수 숫자는 표시하지 않는다. 팔레트는 원래 색과 고정 크기를 유지하고 선택 상태는 외곽선으로만 강조한다. 작업 제목은 ‘위조품 제작’, R 안내는 ‘전체 지우기’로 표시하며 제출·취소와 작품 유사도 라벨은 유지한다.</w:t>
-      </w:r>
-      <w:r>
-        <w:t/>
+        <w:lastRenderedPageBreak/>
+        <w:t>활성 도구 안내는 손전등·동전·가방의 아이콘을 기존보다 약 1.5배 크게 표시하고 F·Q·TAB 키 안내는 각 아이콘 아래에 정렬한다. 손전등 ON/OFF와 동전 수량은 기존 의미를 유지한다. 사용하지 않는 두 QuickSlot은 보이지 않게 접고 기능이나 아이템을 추가하지 않는다. 머리 위 이름표는 바깥 배경 테두리 없이 이름과 상태를 표시한다. 위조 화면은 위조품 왼쪽·팔레트 가운데·원본 오른쪽으로 배치한다. 남은 시간은 머리글 오른쪽, 작품 유사도는 원본 위쪽에 두어 작업 면적과 제출 가능 여부를 선명하게 구분한다. 작품 유사도는 진행 막대의 길이와 붉은색·주황색·초록색으로 읽히게 하고 예상 점수 숫자는 표시하지 않는다. 팔레트는 원래 색과 고정 크기를 유지하고 선택 상태는 외곽선으로만 강조한다. 작업 제목은 ‘위조품 제작’, R 안내는 ‘전체 지우기’로 표시하며 제출·취소와 작품 유사도 라벨은 유지한다.</w:t>
       </w:r>
     </w:p>
     <w:p>
@@ -13827,7 +13835,7 @@
           <w:numId w:val="7"/>
         </w:numPr>
       </w:pPr>
-      <w:bookmarkStart w:id="38" w:name="_Toc241695205"/>
+      <w:bookmarkStart w:id="38" w:name="_Toc242310341"/>
       <w:r>
         <w:t xml:space="preserve">Input Mode </w:t>
       </w:r>
@@ -14307,8 +14315,9 @@
           <w:numId w:val="7"/>
         </w:numPr>
       </w:pPr>
-      <w:bookmarkStart w:id="39" w:name="_Toc241695206"/>
-      <w:r>
+      <w:bookmarkStart w:id="39" w:name="_Toc242310342"/>
+      <w:r>
+        <w:lastRenderedPageBreak/>
         <w:t>Floor Plan</w:t>
       </w:r>
       <w:r>
@@ -14330,7 +14339,7 @@
           <w:numId w:val="7"/>
         </w:numPr>
       </w:pPr>
-      <w:bookmarkStart w:id="40" w:name="_Toc241695207"/>
+      <w:bookmarkStart w:id="40" w:name="_Toc242310343"/>
       <w:r>
         <w:t xml:space="preserve">Floor Plan Map </w:t>
       </w:r>
@@ -14645,7 +14654,7 @@
           <w:numId w:val="7"/>
         </w:numPr>
       </w:pPr>
-      <w:bookmarkStart w:id="41" w:name="_Toc241695208"/>
+      <w:bookmarkStart w:id="41" w:name="_Toc242310344"/>
       <w:r>
         <w:t xml:space="preserve">Team Result / Replica Recap </w:t>
       </w:r>
@@ -14970,6 +14979,7 @@
               <w:pStyle w:val="TableText"/>
             </w:pPr>
             <w:r>
+              <w:lastRenderedPageBreak/>
               <w:t>웃긴 결과도 숨기지 않음</w:t>
             </w:r>
           </w:p>
@@ -15017,7 +15027,7 @@
           <w:numId w:val="7"/>
         </w:numPr>
       </w:pPr>
-      <w:bookmarkStart w:id="42" w:name="_Toc241695209"/>
+      <w:bookmarkStart w:id="42" w:name="_Toc242310345"/>
       <w:r>
         <w:t>첫</w:t>
       </w:r>
@@ -15291,7 +15301,7 @@
           <w:numId w:val="7"/>
         </w:numPr>
       </w:pPr>
-      <w:bookmarkStart w:id="43" w:name="_Toc241695210"/>
+      <w:bookmarkStart w:id="43" w:name="_Toc242310346"/>
       <w:r>
         <w:t>접근성</w:t>
       </w:r>
@@ -15363,7 +15373,7 @@
           <w:numId w:val="7"/>
         </w:numPr>
       </w:pPr>
-      <w:bookmarkStart w:id="44" w:name="_Toc241695211"/>
+      <w:bookmarkStart w:id="44" w:name="_Toc242310347"/>
       <w:r>
         <w:lastRenderedPageBreak/>
         <w:t>레벨</w:t>
@@ -15411,7 +15421,7 @@
           <w:numId w:val="7"/>
         </w:numPr>
       </w:pPr>
-      <w:bookmarkStart w:id="45" w:name="_Toc241695212"/>
+      <w:bookmarkStart w:id="45" w:name="_Toc242310348"/>
       <w:r>
         <w:t>세</w:t>
       </w:r>
@@ -15531,7 +15541,7 @@
       <w:pPr>
         <w:pStyle w:val="31"/>
       </w:pPr>
-      <w:bookmarkStart w:id="46" w:name="_Toc241695213"/>
+      <w:bookmarkStart w:id="46" w:name="_Toc242310349"/>
       <w:r>
         <w:t>전시</w:t>
       </w:r>
@@ -15593,6 +15603,15 @@
     <w:p>
       <w:r>
         <w:t>각 맵은 최소 10종의 구별되는 배치를 실제 전시 벽에 사용한다. 좌우 반전, 그림 교체, 간격의 미세 변경은 별도 유형으로 세지 않는다. 일반 작품만 있는 독립 벽을 두고 도난 대상은 단독·군집의 가장자리·작은 작품 위치에도 배치한다. M01은 고전 회랑과 살롱, M02는 세로 연작과 여백, M03는 연속·격자와 독립 전시를 강조한다. 벽 길이와 출입구에 맞춰 배치하며 무작위 산포로 다양성을 대신하지 않는다.</w:t>
+      </w:r>
+    </w:p>
+    <w:p>
+      <w:r>
+        <w:t xml:space="preserve">2026-10-07 승인 전체 전시 시안은 기존 공간 안에서 회화·조각·공예품을 관람 순서가 있는 전시 묶음으로 구성한다. M01/M02/M03에 각 10개 전시 묶음과 5개 관람·휴식·안내 묶음을 적용하고, 일반 회화 총 25곳(M01 8곳·M02 10곳·M03 7곳)과 각 맵의 전시 유물 후보 10곳 및 받침을 이동한다. M01 A8에는 방 중앙의 공동 전시대, 양옆 벤치와 뒤쪽 화분을 두고 해당 순찰 경유점은 전시대 남쪽으로 우회한다. 기존 외곽·방·회랑·문·바닥·천장·M02 정원과 맵 컨셉은 유지하며 필수·보호 작품, 레이저·버튼, 출구·구금·압수품 공간의 위치와 기능 연결은 보존한다. 그림 60곳 중 매치 활성 12곳, 유물 후보 12곳 중 매치 활성 5곳의 구성과 플레이어 지도 정보 정책도 유지한다. 지정된 기존 벽·가구·장식 원본을 </w:t>
+      </w:r>
+      <w:r>
+        <w:lastRenderedPageBreak/>
+        <w:t>재사용하고 실제 크기·충돌·순찰·작업 접근·시야를 확인한 뒤 저장한다. 이 범위에서만 이전 그림 위치 보존 규칙을 대체하며 에셋 사본이나 새 게임 규칙을 추가하지 않는다.</w:t>
       </w:r>
     </w:p>
     <w:p>
@@ -15603,7 +15622,7 @@
           <w:numId w:val="7"/>
         </w:numPr>
       </w:pPr>
-      <w:bookmarkStart w:id="47" w:name="_Toc241695214"/>
+      <w:bookmarkStart w:id="47" w:name="_Toc242310350"/>
       <w:r>
         <w:t>맵</w:t>
       </w:r>
@@ -15880,7 +15899,6 @@
               <w:rPr>
                 <w:sz w:val="16"/>
               </w:rPr>
-              <w:lastRenderedPageBreak/>
               <w:t>M02 월야 동양미술관</w:t>
             </w:r>
           </w:p>
@@ -16030,7 +16048,7 @@
           <w:numId w:val="7"/>
         </w:numPr>
       </w:pPr>
-      <w:bookmarkStart w:id="48" w:name="_Toc241695215"/>
+      <w:bookmarkStart w:id="48" w:name="_Toc242310351"/>
       <w:r>
         <w:lastRenderedPageBreak/>
         <w:t xml:space="preserve">M01 — </w:t>
@@ -16300,317 +16318,6 @@
                       <pic:pic xmlns:pic="http://schemas.openxmlformats.org/drawingml/2006/picture">
                         <pic:nvPicPr>
                           <pic:cNvPr id="0" name="T_FloorPlan_M01.png"/>
-                          <pic:cNvPicPr/>
-                        </pic:nvPicPr>
-                        <pic:blipFill>
-                          <a:blip r:embed="rId8"/>
-                          <a:stretch>
-                            <a:fillRect/>
-                          </a:stretch>
-                        </pic:blipFill>
-                        <pic:spPr>
-                          <a:xfrm>
-                            <a:off x="0" y="0"/>
-                            <a:ext cx="5120640" cy="3200400"/>
-                          </a:xfrm>
-                          <a:prstGeom prst="rect">
-                            <a:avLst/>
-                          </a:prstGeom>
-                        </pic:spPr>
-                      </pic:pic>
-                    </a:graphicData>
-                  </a:graphic>
-                </wp:inline>
-              </w:drawing>
-            </w:r>
-          </w:p>
-        </w:tc>
-      </w:tr>
-    </w:tbl>
-    <w:p>
-      <w:pPr>
-        <w:pStyle w:val="CaptionCustom"/>
-      </w:pPr>
-      <w:r>
-        <w:t>그림 1. M01 저장된 맵의 벽·문 구성과 게임 내 지도</w:t>
-      </w:r>
-    </w:p>
-    <w:p>
-      <w:pPr>
-        <w:pStyle w:val="21"/>
-        <w:pageBreakBefore/>
-        <w:numPr>
-          <w:ilvl w:val="1"/>
-          <w:numId w:val="7"/>
-        </w:numPr>
-      </w:pPr>
-      <w:bookmarkStart w:id="49" w:name="_Toc241695216"/>
-      <w:r>
-        <w:lastRenderedPageBreak/>
-        <w:t xml:space="preserve">M02 — </w:t>
-      </w:r>
-      <w:r>
-        <w:t>월야</w:t>
-      </w:r>
-      <w:r>
-        <w:t xml:space="preserve"> </w:t>
-      </w:r>
-      <w:r>
-        <w:t>동양미술관</w:t>
-      </w:r>
-      <w:bookmarkEnd w:id="49"/>
-    </w:p>
-    <w:p>
-      <w:r>
-        <w:t>108×88m의 중정형 동양미술관이다. 30×27.5m 중앙 공간과 폭 5.5~6m 순환 회랑을 중심으로 21개 구역을 23개 문으로 연결한다. 남서측 전실의 두 꺾임 뒤 중앙 공간이 드러나며, 벽에 붙은 입구 병풍과 버튼 대기용 차폐벽은 유지한다. 중앙은 기존 에셋의 넓은 잎과 높낮이 식재를 밀도 있게 잇는 넓은 식재 섬으로 구성한다. 암석은 보조로 두고 네 방향 순환 통행과 방향 기준점을 유지한다. 천장 조명으로 식재 윤곽과 높이 층을 알아볼 만큼 밝히고 주변 통로의 야간 어둠은 유지한다. 비스듬한 독립 가림막과 회랑에 흩어진 바위·관목은 배치하지 않는다. 세 CCTV 지름길은 긴 우회 동선과 위험을 교환하고 북동·남동 선택실에 Laser를 둔다. 필수 작품은 동측 E2 전시실의 동쪽 벽에 둔다. 북동 고가실과 E2 사이의 바로 옆 출입문을 닫고, 북쪽 관리 회랑을 일반 우회·이탈로로 유지한다. 북동 버튼은 전시실 북동 모서리, 남동 버튼은 진입문의 동쪽 벽감에 두어 통과 순찰선과 분리한다. 벽 높이는 4.4m이며 목재·동장 프레임·중앙 식재로 관람 공간의 질서를 유지한다. 남동 고가실과 증거실 사이의 중복 지름길도 닫고 서쪽 S3 전시실을 통한 일반 출입·이탈을 유지한다. 차폐벽 아래의 버튼은 국소 조명으로 식별성을 유지한다. 남동 보안 구역은 E1 전시실에서만 진입하며 남쪽 관리 회랑의 구금실 직통 문을 닫는다. 입구 안쪽 벽의 서쪽을 돌아 압수품 보관실과 구금실로 진입하고 기존 남측 순찰에 이 구역 왕복을 포함한다.</w:t>
-      </w:r>
-    </w:p>
-    <w:tbl>
-      <w:tblPr>
-        <w:tblStyle w:val="af9"/>
-        <w:tblW w:w="9864" w:type="dxa"/>
-        <w:jc w:val="center"/>
-        <w:tblLayout w:type="fixed"/>
-        <w:tblLook w:val="04A0" w:firstRow="1" w:lastRow="0" w:firstColumn="1" w:lastColumn="0" w:noHBand="0" w:noVBand="1"/>
-      </w:tblPr>
-      <w:tblGrid>
-        <w:gridCol w:w="2466"/>
-        <w:gridCol w:w="2959"/>
-        <w:gridCol w:w="2302"/>
-        <w:gridCol w:w="2137"/>
-      </w:tblGrid>
-      <w:tr>
-        <w:trPr>
-          <w:cantSplit/>
-          <w:tblHeader/>
-          <w:jc w:val="center"/>
-        </w:trPr>
-        <w:tc>
-          <w:tcPr>
-            <w:tcW w:w="2466" w:type="dxa"/>
-            <w:shd w:val="clear" w:color="auto" w:fill="EAF2F8"/>
-            <w:tcMar>
-              <w:top w:w="80" w:type="dxa"/>
-              <w:left w:w="100" w:type="dxa"/>
-              <w:bottom w:w="80" w:type="dxa"/>
-              <w:right w:w="100" w:type="dxa"/>
-            </w:tcMar>
-            <w:vAlign w:val="center"/>
-          </w:tcPr>
-          <w:p>
-            <w:pPr>
-              <w:pStyle w:val="TableText"/>
-              <w:keepNext/>
-              <w:jc w:val="center"/>
-            </w:pPr>
-            <w:r>
-              <w:rPr>
-                <w:b/>
-                <w:color w:val="17365D"/>
-              </w:rPr>
-              <w:t>조명/색감</w:t>
-            </w:r>
-          </w:p>
-        </w:tc>
-        <w:tc>
-          <w:tcPr>
-            <w:tcW w:w="2959" w:type="dxa"/>
-            <w:shd w:val="clear" w:color="auto" w:fill="EAF2F8"/>
-            <w:tcMar>
-              <w:top w:w="80" w:type="dxa"/>
-              <w:left w:w="100" w:type="dxa"/>
-              <w:bottom w:w="80" w:type="dxa"/>
-              <w:right w:w="100" w:type="dxa"/>
-            </w:tcMar>
-            <w:vAlign w:val="center"/>
-          </w:tcPr>
-          <w:p>
-            <w:pPr>
-              <w:pStyle w:val="TableText"/>
-              <w:keepNext/>
-              <w:jc w:val="center"/>
-            </w:pPr>
-            <w:r>
-              <w:rPr>
-                <w:b/>
-                <w:color w:val="17365D"/>
-              </w:rPr>
-              <w:t>핵심 공간</w:t>
-            </w:r>
-          </w:p>
-        </w:tc>
-        <w:tc>
-          <w:tcPr>
-            <w:tcW w:w="2302" w:type="dxa"/>
-            <w:shd w:val="clear" w:color="auto" w:fill="EAF2F8"/>
-            <w:tcMar>
-              <w:top w:w="80" w:type="dxa"/>
-              <w:left w:w="100" w:type="dxa"/>
-              <w:bottom w:w="80" w:type="dxa"/>
-              <w:right w:w="100" w:type="dxa"/>
-            </w:tcMar>
-            <w:vAlign w:val="center"/>
-          </w:tcPr>
-          <w:p>
-            <w:pPr>
-              <w:pStyle w:val="TableText"/>
-              <w:keepNext/>
-              <w:jc w:val="center"/>
-            </w:pPr>
-            <w:r>
-              <w:rPr>
-                <w:b/>
-                <w:color w:val="17365D"/>
-              </w:rPr>
-              <w:t>Guard 압박</w:t>
-            </w:r>
-          </w:p>
-        </w:tc>
-        <w:tc>
-          <w:tcPr>
-            <w:tcW w:w="2137" w:type="dxa"/>
-            <w:shd w:val="clear" w:color="auto" w:fill="EAF2F8"/>
-            <w:tcMar>
-              <w:top w:w="80" w:type="dxa"/>
-              <w:left w:w="100" w:type="dxa"/>
-              <w:bottom w:w="80" w:type="dxa"/>
-              <w:right w:w="100" w:type="dxa"/>
-            </w:tcMar>
-            <w:vAlign w:val="center"/>
-          </w:tcPr>
-          <w:p>
-            <w:pPr>
-              <w:pStyle w:val="TableText"/>
-              <w:keepNext/>
-              <w:jc w:val="center"/>
-            </w:pPr>
-            <w:r>
-              <w:rPr>
-                <w:b/>
-                <w:color w:val="17365D"/>
-              </w:rPr>
-              <w:t>아트 목표</w:t>
-            </w:r>
-          </w:p>
-        </w:tc>
-      </w:tr>
-      <w:tr>
-        <w:trPr>
-          <w:cantSplit/>
-          <w:jc w:val="center"/>
-        </w:trPr>
-        <w:tc>
-          <w:tcPr>
-            <w:tcW w:w="2466" w:type="dxa"/>
-            <w:vAlign w:val="center"/>
-          </w:tcPr>
-          <w:p>
-            <w:pPr>
-              <w:pStyle w:val="TableText"/>
-            </w:pPr>
-            <w:r>
-              <w:t>암청·옻칠 적갈색·젖은 반사</w:t>
-            </w:r>
-          </w:p>
-        </w:tc>
-        <w:tc>
-          <w:tcPr>
-            <w:tcW w:w="2959" w:type="dxa"/>
-            <w:vAlign w:val="center"/>
-          </w:tcPr>
-          <w:p>
-            <w:r>
-              <w:t>30×27.5m 중정, 5.5~6m 순환 회랑, 굴절 진입, 북·남 관리 회랑</w:t>
-            </w:r>
-          </w:p>
-        </w:tc>
-        <w:tc>
-          <w:tcPr>
-            <w:tcW w:w="2302" w:type="dxa"/>
-            <w:vAlign w:val="center"/>
-          </w:tcPr>
-          <w:p>
-            <w:pPr>
-              <w:pStyle w:val="TableText"/>
-            </w:pPr>
-            <w:r>
-              <w:t>Blind Corner·짧은 시야·지름길 CCTV·높은 Footstep 민감</w:t>
-            </w:r>
-          </w:p>
-        </w:tc>
-        <w:tc>
-          <w:tcPr>
-            <w:tcW w:w="2137" w:type="dxa"/>
-            <w:vAlign w:val="center"/>
-          </w:tcPr>
-          <w:p>
-            <w:pPr>
-              <w:pStyle w:val="TableText"/>
-            </w:pPr>
-            <w:r>
-              <w:t>‘소리 하나로 무너질 수 있다’는 긴장</w:t>
-            </w:r>
-          </w:p>
-        </w:tc>
-      </w:tr>
-    </w:tbl>
-    <w:p>
-      <w:pPr>
-        <w:spacing w:after="0" w:line="20" w:lineRule="exact"/>
-        <w:rPr>
-          <w:sz w:val="2"/>
-        </w:rPr>
-      </w:pPr>
-    </w:p>
-    <w:tbl>
-      <w:tblPr>
-        <w:tblStyle w:val="af9"/>
-        <w:tblW w:w="9864" w:type="dxa"/>
-        <w:jc w:val="center"/>
-        <w:tblLayout w:type="fixed"/>
-        <w:tblLook w:val="04A0" w:firstRow="1" w:lastRow="0" w:firstColumn="1" w:lastColumn="0" w:noHBand="0" w:noVBand="1"/>
-      </w:tblPr>
-      <w:tblGrid>
-        <w:gridCol w:w="9864"/>
-      </w:tblGrid>
-      <w:tr>
-        <w:trPr>
-          <w:cantSplit/>
-          <w:jc w:val="center"/>
-        </w:trPr>
-        <w:tc>
-          <w:tcPr>
-            <w:tcW w:w="9864" w:type="dxa"/>
-            <w:shd w:val="clear" w:color="auto" w:fill="F7F9FB"/>
-            <w:tcMar>
-              <w:top w:w="80" w:type="dxa"/>
-              <w:left w:w="100" w:type="dxa"/>
-              <w:bottom w:w="80" w:type="dxa"/>
-              <w:right w:w="100" w:type="dxa"/>
-            </w:tcMar>
-            <w:vAlign w:val="center"/>
-          </w:tcPr>
-          <w:p>
-            <w:pPr>
-              <w:jc w:val="center"/>
-            </w:pPr>
-            <w:r>
-              <w:rPr>
-                <w:noProof/>
-              </w:rPr>
-              <w:drawing>
-                <wp:inline distT="0" distB="0" distL="0" distR="0" wp14:anchorId="184977C7" wp14:editId="5584D24D">
-                  <wp:extent cx="5120640" cy="3200400"/>
-                  <wp:effectExtent l="0" t="0" r="0" b="0"/>
-                  <wp:docPr id="2" name="Picture 2"/>
-                  <wp:cNvGraphicFramePr>
-                    <a:graphicFrameLocks xmlns:a="http://schemas.openxmlformats.org/drawingml/2006/main" noChangeAspect="1"/>
-                  </wp:cNvGraphicFramePr>
-                  <a:graphic xmlns:a="http://schemas.openxmlformats.org/drawingml/2006/main">
-                    <a:graphicData uri="http://schemas.openxmlformats.org/drawingml/2006/picture">
-                      <pic:pic xmlns:pic="http://schemas.openxmlformats.org/drawingml/2006/picture">
-                        <pic:nvPicPr>
-                          <pic:cNvPr id="0" name="T_FloorPlan_M02.png"/>
                           <pic:cNvPicPr/>
                         </pic:nvPicPr>
                         <pic:blipFill>
@@ -16643,7 +16350,7 @@
         <w:pStyle w:val="CaptionCustom"/>
       </w:pPr>
       <w:r>
-        <w:t>그림 2. M02 저장된 맵의 벽·문 구성과 게임 내 지도</w:t>
+        <w:t>그림 1. M01 저장된 맵의 벽·문 구성과 게임 내 지도</w:t>
       </w:r>
     </w:p>
     <w:p>
@@ -16655,25 +16362,25 @@
           <w:numId w:val="7"/>
         </w:numPr>
       </w:pPr>
-      <w:bookmarkStart w:id="50" w:name="_Toc241695217"/>
+      <w:bookmarkStart w:id="49" w:name="_Toc242310352"/>
       <w:r>
         <w:lastRenderedPageBreak/>
-        <w:t xml:space="preserve">M03 — </w:t>
-      </w:r>
-      <w:r>
-        <w:t>글래스하우스</w:t>
+        <w:t xml:space="preserve">M02 — </w:t>
+      </w:r>
+      <w:r>
+        <w:t>월야</w:t>
       </w:r>
       <w:r>
         <w:t xml:space="preserve"> </w:t>
       </w:r>
       <w:r>
-        <w:t>현대미술관</w:t>
-      </w:r>
-      <w:bookmarkEnd w:id="50"/>
+        <w:t>동양미술관</w:t>
+      </w:r>
+      <w:bookmarkEnd w:id="49"/>
     </w:p>
     <w:p>
       <w:r>
-        <w:t>사용자 승인 갤러리 팩 AIUE5_vol10_01의 기존 메시로 약 106×72m 단층 전시관을 구성한다. 35×13m 원본 홀과 상부 트러스·천창, 기존 A·B·C와 경비실·압수품실·구금실을 유지하고 서·동 전시실, 북측 연속 전시실과 직원 회랑, 남측 진입·전시실을 확장한다. 방과 복도는 별도 경계와 엇갈린 출입구로 구분한다. 기존 그림 60곳의 위치와 규모를 유지하고 매치마다 탈취 대상 12점과 보이는 장식 48점을 정한다. 필수 작품은 북동 전시실의 기존 위치와 정체성을 유지하고, 동측 두 보호 작품의 레이저 연결도 보존한다. 보호 작품이 탈취 대상으로 선택되지 않은 매치에는 연결된 레이저를 휴면 상태로 둔다. 필수 작품에 레이저 협동을 강제하지 않는다. 액자는 소형·중형·대형 정수 균등 스케일 세 단계로 제한하고 대형은 천장 높이가 충분한 곳에 배치한다. 기존 에셋을 여러 Actor가 참조하며 새 메시·파생 에셋을 생성하지 않는다. 약한 환경광과 작품용 국소 조명으로 밤의 공간감을 유지한다. 이 승인안은 앞의 공통 설명에 남은 M03 외곽 크기·액자 크기·옛 방 이름과 동선 수치에 우선한다. 면적이나 경로만으로 목표 플레이 시간을 달성했다고 판단하지 않는다. M03 전시실·통로 천장은 약 8m 기준으로 높이고 중앙 홀 지붕과 트러스를 함께 올린다. 작품등은 액자보다 충분히 높은 천장에 매달아 작품을 가리지 않게 하며, 통로는 어두운 야간 분위기를 유지한다. 작품 조명은 상호작용 여부와 무관하게 전체 구도와 주요 색을 읽을 수 있도록 균일하게 비춘다. 작품마다 담당 조명을 정하고 통로보다 작품을 강조하되 밝기만으로 훔칠 수 있는 작품을 구분하게 만들지 않는다. M03의 야간 조명은 앞의 세 맵 공통 최종값을 사용하며 과거의 절반 조정을 반복하지 않는다. 조명이 없는 복도에도 약한 차가운 환경광을 보완한다. 암부의 벽·바닥·출입구는 약하게 구분되도록 하되, 전체 노출을 올려 밝은 전시장으로 되돌리지 않는다.</w:t>
+        <w:t>108×88m의 중정형 동양미술관이다. 30×27.5m 중앙 공간과 폭 5.5~6m 순환 회랑을 중심으로 21개 구역을 23개 문으로 연결한다. 남서측 전실의 두 꺾임 뒤 중앙 공간이 드러나며, 벽에 붙은 입구 병풍과 버튼 대기용 차폐벽은 유지한다. 중앙은 기존 에셋의 넓은 잎과 높낮이 식재를 밀도 있게 잇는 넓은 식재 섬으로 구성한다. 암석은 보조로 두고 네 방향 순환 통행과 방향 기준점을 유지한다. 천장 조명으로 식재 윤곽과 높이 층을 알아볼 만큼 밝히고 주변 통로의 야간 어둠은 유지한다. 비스듬한 독립 가림막과 회랑에 흩어진 바위·관목은 배치하지 않는다. 세 CCTV 지름길은 긴 우회 동선과 위험을 교환하고 북동·남동 선택실에 Laser를 둔다. 필수 작품은 동측 E2 전시실의 동쪽 벽에 둔다. 북동 고가실과 E2 사이의 바로 옆 출입문을 닫고, 북쪽 관리 회랑을 일반 우회·이탈로로 유지한다. 북동 버튼은 전시실 북동 모서리, 남동 버튼은 진입문의 동쪽 벽감에 두어 통과 순찰선과 분리한다. 벽 높이는 4.4m이며 목재·동장 프레임·중앙 식재로 관람 공간의 질서를 유지한다. 남동 고가실과 증거실 사이의 중복 지름길도 닫고 서쪽 S3 전시실을 통한 일반 출입·이탈을 유지한다. 차폐벽 아래의 버튼은 국소 조명으로 식별성을 유지한다. 남동 보안 구역은 E1 전시실에서만 진입하며 남쪽 관리 회랑의 구금실 직통 문을 닫는다. 입구 안쪽 벽의 서쪽을 돌아 압수품 보관실과 구금실로 진입하고 기존 남측 순찰에 이 구역 왕복을 포함한다.</w:t>
       </w:r>
     </w:p>
     <w:tbl>
@@ -16820,6 +16527,317 @@
               <w:pStyle w:val="TableText"/>
             </w:pPr>
             <w:r>
+              <w:t>암청·옻칠 적갈색·젖은 반사</w:t>
+            </w:r>
+          </w:p>
+        </w:tc>
+        <w:tc>
+          <w:tcPr>
+            <w:tcW w:w="2959" w:type="dxa"/>
+            <w:vAlign w:val="center"/>
+          </w:tcPr>
+          <w:p>
+            <w:r>
+              <w:t>30×27.5m 중정, 5.5~6m 순환 회랑, 굴절 진입, 북·남 관리 회랑</w:t>
+            </w:r>
+          </w:p>
+        </w:tc>
+        <w:tc>
+          <w:tcPr>
+            <w:tcW w:w="2302" w:type="dxa"/>
+            <w:vAlign w:val="center"/>
+          </w:tcPr>
+          <w:p>
+            <w:pPr>
+              <w:pStyle w:val="TableText"/>
+            </w:pPr>
+            <w:r>
+              <w:t>Blind Corner·짧은 시야·지름길 CCTV·높은 Footstep 민감</w:t>
+            </w:r>
+          </w:p>
+        </w:tc>
+        <w:tc>
+          <w:tcPr>
+            <w:tcW w:w="2137" w:type="dxa"/>
+            <w:vAlign w:val="center"/>
+          </w:tcPr>
+          <w:p>
+            <w:pPr>
+              <w:pStyle w:val="TableText"/>
+            </w:pPr>
+            <w:r>
+              <w:t>‘소리 하나로 무너질 수 있다’는 긴장</w:t>
+            </w:r>
+          </w:p>
+        </w:tc>
+      </w:tr>
+    </w:tbl>
+    <w:p>
+      <w:pPr>
+        <w:spacing w:after="0" w:line="20" w:lineRule="exact"/>
+        <w:rPr>
+          <w:sz w:val="2"/>
+        </w:rPr>
+      </w:pPr>
+    </w:p>
+    <w:tbl>
+      <w:tblPr>
+        <w:tblStyle w:val="af9"/>
+        <w:tblW w:w="9864" w:type="dxa"/>
+        <w:jc w:val="center"/>
+        <w:tblLayout w:type="fixed"/>
+        <w:tblLook w:val="04A0" w:firstRow="1" w:lastRow="0" w:firstColumn="1" w:lastColumn="0" w:noHBand="0" w:noVBand="1"/>
+      </w:tblPr>
+      <w:tblGrid>
+        <w:gridCol w:w="9864"/>
+      </w:tblGrid>
+      <w:tr>
+        <w:trPr>
+          <w:cantSplit/>
+          <w:jc w:val="center"/>
+        </w:trPr>
+        <w:tc>
+          <w:tcPr>
+            <w:tcW w:w="9864" w:type="dxa"/>
+            <w:shd w:val="clear" w:color="auto" w:fill="F7F9FB"/>
+            <w:tcMar>
+              <w:top w:w="80" w:type="dxa"/>
+              <w:left w:w="100" w:type="dxa"/>
+              <w:bottom w:w="80" w:type="dxa"/>
+              <w:right w:w="100" w:type="dxa"/>
+            </w:tcMar>
+            <w:vAlign w:val="center"/>
+          </w:tcPr>
+          <w:p>
+            <w:pPr>
+              <w:jc w:val="center"/>
+            </w:pPr>
+            <w:r>
+              <w:rPr>
+                <w:noProof/>
+              </w:rPr>
+              <w:drawing>
+                <wp:inline distT="0" distB="0" distL="0" distR="0" wp14:anchorId="184977C7" wp14:editId="5584D24D">
+                  <wp:extent cx="5120640" cy="3200400"/>
+                  <wp:effectExtent l="0" t="0" r="0" b="0"/>
+                  <wp:docPr id="2" name="Picture 2"/>
+                  <wp:cNvGraphicFramePr>
+                    <a:graphicFrameLocks xmlns:a="http://schemas.openxmlformats.org/drawingml/2006/main" noChangeAspect="1"/>
+                  </wp:cNvGraphicFramePr>
+                  <a:graphic xmlns:a="http://schemas.openxmlformats.org/drawingml/2006/main">
+                    <a:graphicData uri="http://schemas.openxmlformats.org/drawingml/2006/picture">
+                      <pic:pic xmlns:pic="http://schemas.openxmlformats.org/drawingml/2006/picture">
+                        <pic:nvPicPr>
+                          <pic:cNvPr id="0" name="T_FloorPlan_M02.png"/>
+                          <pic:cNvPicPr/>
+                        </pic:nvPicPr>
+                        <pic:blipFill>
+                          <a:blip r:embed="rId10"/>
+                          <a:stretch>
+                            <a:fillRect/>
+                          </a:stretch>
+                        </pic:blipFill>
+                        <pic:spPr>
+                          <a:xfrm>
+                            <a:off x="0" y="0"/>
+                            <a:ext cx="5120640" cy="3200400"/>
+                          </a:xfrm>
+                          <a:prstGeom prst="rect">
+                            <a:avLst/>
+                          </a:prstGeom>
+                        </pic:spPr>
+                      </pic:pic>
+                    </a:graphicData>
+                  </a:graphic>
+                </wp:inline>
+              </w:drawing>
+            </w:r>
+          </w:p>
+        </w:tc>
+      </w:tr>
+    </w:tbl>
+    <w:p>
+      <w:pPr>
+        <w:pStyle w:val="CaptionCustom"/>
+      </w:pPr>
+      <w:r>
+        <w:t>그림 2. M02 저장된 맵의 벽·문 구성과 게임 내 지도</w:t>
+      </w:r>
+    </w:p>
+    <w:p>
+      <w:pPr>
+        <w:pStyle w:val="21"/>
+        <w:pageBreakBefore/>
+        <w:numPr>
+          <w:ilvl w:val="1"/>
+          <w:numId w:val="7"/>
+        </w:numPr>
+      </w:pPr>
+      <w:bookmarkStart w:id="50" w:name="_Toc242310353"/>
+      <w:r>
+        <w:lastRenderedPageBreak/>
+        <w:t xml:space="preserve">M03 — </w:t>
+      </w:r>
+      <w:r>
+        <w:t>글래스하우스</w:t>
+      </w:r>
+      <w:r>
+        <w:t xml:space="preserve"> </w:t>
+      </w:r>
+      <w:r>
+        <w:t>현대미술관</w:t>
+      </w:r>
+      <w:bookmarkEnd w:id="50"/>
+    </w:p>
+    <w:p>
+      <w:r>
+        <w:t>사용자 승인 갤러리 팩 AIUE5_vol10_01의 기존 메시로 약 106×72m 단층 전시관을 구성한다. 35×13m 원본 홀과 상부 트러스·천창, 기존 A·B·C와 경비실·압수품실·구금실을 유지하고 서·동 전시실, 북측 연속 전시실과 직원 회랑, 남측 진입·전시실을 확장한다. 방과 복도는 별도 경계와 엇갈린 출입구로 구분한다. 기존 그림 60곳의 위치와 규모를 유지하고 매치마다 탈취 대상 12점과 보이는 장식 48점을 정한다. 필수 작품은 북동 전시실의 기존 위치와 정체성을 유지하고, 동측 두 보호 작품의 레이저 연결도 보존한다. 보호 작품이 탈취 대상으로 선택되지 않은 매치에는 연결된 레이저를 휴면 상태로 둔다. 필수 작품에 레이저 협동을 강제하지 않는다. 액자는 소형·중형·대형 정수 균등 스케일 세 단계로 제한하고 대형은 천장 높이가 충분한 곳에 배치한다. 기존 에셋을 여러 Actor가 참조하며 새 메시·파생 에셋을 생성하지 않는다. 약한 환경광과 작품용 국소 조명으로 밤의 공간감을 유지한다. 이 승인안은 앞의 공통 설명에 남은 M03 외곽 크기·액자 크기·옛 방 이름과 동선 수치에 우선한다. 면적이나 경로만으로 목표 플레이 시간을 달성했다고 판단하지 않는다. M03 전시실·통로 천장은 약 8m 기준으로 높이고 중앙 홀 지붕과 트러스를 함께 올린다. 작품등은 액자보다 충분히 높은 천장에 매달아 작품을 가리지 않게 하며, 통로는 어두운 야간 분위기를 유지한다. 작품 조명은 상호작용 여부와 무관하게 전체 구도와 주요 색을 읽을 수 있도록 균일하게 비춘다. 작품마다 담당 조명을 정하고 통로보다 작품을 강조하되 밝기만으로 훔칠 수 있는 작품을 구분하게 만들지 않는다. M03의 야간 조명은 앞의 세 맵 공통 최종값을 사용하며 과거의 절반 조정을 반복하지 않는다. 조명이 없는 복도에도 약한 차가운 환경광을 보완한다. 암부의 벽·바닥·출입구는 약하게 구분되도록 하되, 전체 노출을 올려 밝은 전시장으로 되돌리지 않는다.</w:t>
+      </w:r>
+    </w:p>
+    <w:tbl>
+      <w:tblPr>
+        <w:tblStyle w:val="af9"/>
+        <w:tblW w:w="9864" w:type="dxa"/>
+        <w:jc w:val="center"/>
+        <w:tblLayout w:type="fixed"/>
+        <w:tblLook w:val="04A0" w:firstRow="1" w:lastRow="0" w:firstColumn="1" w:lastColumn="0" w:noHBand="0" w:noVBand="1"/>
+      </w:tblPr>
+      <w:tblGrid>
+        <w:gridCol w:w="2466"/>
+        <w:gridCol w:w="2959"/>
+        <w:gridCol w:w="2302"/>
+        <w:gridCol w:w="2137"/>
+      </w:tblGrid>
+      <w:tr>
+        <w:trPr>
+          <w:cantSplit/>
+          <w:tblHeader/>
+          <w:jc w:val="center"/>
+        </w:trPr>
+        <w:tc>
+          <w:tcPr>
+            <w:tcW w:w="2466" w:type="dxa"/>
+            <w:shd w:val="clear" w:color="auto" w:fill="EAF2F8"/>
+            <w:tcMar>
+              <w:top w:w="80" w:type="dxa"/>
+              <w:left w:w="100" w:type="dxa"/>
+              <w:bottom w:w="80" w:type="dxa"/>
+              <w:right w:w="100" w:type="dxa"/>
+            </w:tcMar>
+            <w:vAlign w:val="center"/>
+          </w:tcPr>
+          <w:p>
+            <w:pPr>
+              <w:pStyle w:val="TableText"/>
+              <w:keepNext/>
+              <w:jc w:val="center"/>
+            </w:pPr>
+            <w:r>
+              <w:rPr>
+                <w:b/>
+                <w:color w:val="17365D"/>
+              </w:rPr>
+              <w:t>조명/색감</w:t>
+            </w:r>
+          </w:p>
+        </w:tc>
+        <w:tc>
+          <w:tcPr>
+            <w:tcW w:w="2959" w:type="dxa"/>
+            <w:shd w:val="clear" w:color="auto" w:fill="EAF2F8"/>
+            <w:tcMar>
+              <w:top w:w="80" w:type="dxa"/>
+              <w:left w:w="100" w:type="dxa"/>
+              <w:bottom w:w="80" w:type="dxa"/>
+              <w:right w:w="100" w:type="dxa"/>
+            </w:tcMar>
+            <w:vAlign w:val="center"/>
+          </w:tcPr>
+          <w:p>
+            <w:pPr>
+              <w:pStyle w:val="TableText"/>
+              <w:keepNext/>
+              <w:jc w:val="center"/>
+            </w:pPr>
+            <w:r>
+              <w:rPr>
+                <w:b/>
+                <w:color w:val="17365D"/>
+              </w:rPr>
+              <w:t>핵심 공간</w:t>
+            </w:r>
+          </w:p>
+        </w:tc>
+        <w:tc>
+          <w:tcPr>
+            <w:tcW w:w="2302" w:type="dxa"/>
+            <w:shd w:val="clear" w:color="auto" w:fill="EAF2F8"/>
+            <w:tcMar>
+              <w:top w:w="80" w:type="dxa"/>
+              <w:left w:w="100" w:type="dxa"/>
+              <w:bottom w:w="80" w:type="dxa"/>
+              <w:right w:w="100" w:type="dxa"/>
+            </w:tcMar>
+            <w:vAlign w:val="center"/>
+          </w:tcPr>
+          <w:p>
+            <w:pPr>
+              <w:pStyle w:val="TableText"/>
+              <w:keepNext/>
+              <w:jc w:val="center"/>
+            </w:pPr>
+            <w:r>
+              <w:rPr>
+                <w:b/>
+                <w:color w:val="17365D"/>
+              </w:rPr>
+              <w:t>Guard 압박</w:t>
+            </w:r>
+          </w:p>
+        </w:tc>
+        <w:tc>
+          <w:tcPr>
+            <w:tcW w:w="2137" w:type="dxa"/>
+            <w:shd w:val="clear" w:color="auto" w:fill="EAF2F8"/>
+            <w:tcMar>
+              <w:top w:w="80" w:type="dxa"/>
+              <w:left w:w="100" w:type="dxa"/>
+              <w:bottom w:w="80" w:type="dxa"/>
+              <w:right w:w="100" w:type="dxa"/>
+            </w:tcMar>
+            <w:vAlign w:val="center"/>
+          </w:tcPr>
+          <w:p>
+            <w:pPr>
+              <w:pStyle w:val="TableText"/>
+              <w:keepNext/>
+              <w:jc w:val="center"/>
+            </w:pPr>
+            <w:r>
+              <w:rPr>
+                <w:b/>
+                <w:color w:val="17365D"/>
+              </w:rPr>
+              <w:t>아트 목표</w:t>
+            </w:r>
+          </w:p>
+        </w:tc>
+      </w:tr>
+      <w:tr>
+        <w:trPr>
+          <w:cantSplit/>
+          <w:jc w:val="center"/>
+        </w:trPr>
+        <w:tc>
+          <w:tcPr>
+            <w:tcW w:w="2466" w:type="dxa"/>
+            <w:vAlign w:val="center"/>
+          </w:tcPr>
+          <w:p>
+            <w:pPr>
+              <w:pStyle w:val="TableText"/>
+            </w:pPr>
+            <w:r>
               <w:t>백색·청록 유리·적색 비상등</w:t>
             </w:r>
           </w:p>
@@ -16920,7 +16938,7 @@
                           <pic:cNvPicPr/>
                         </pic:nvPicPr>
                         <pic:blipFill>
-                          <a:blip r:embed="rId10"/>
+                          <a:blip r:embed="rId11"/>
                           <a:stretch>
                             <a:fillRect/>
                           </a:stretch>
@@ -16961,7 +16979,7 @@
           <w:numId w:val="7"/>
         </w:numPr>
       </w:pPr>
-      <w:bookmarkStart w:id="51" w:name="_Toc241695218"/>
+      <w:bookmarkStart w:id="51" w:name="_Toc242310354"/>
       <w:r>
         <w:lastRenderedPageBreak/>
         <w:t xml:space="preserve">First-Person </w:t>
@@ -17045,7 +17063,7 @@
           <w:numId w:val="7"/>
         </w:numPr>
       </w:pPr>
-      <w:bookmarkStart w:id="52" w:name="_Toc241695219"/>
+      <w:bookmarkStart w:id="52" w:name="_Toc242310355"/>
       <w:r>
         <w:t>사운드</w:t>
       </w:r>
@@ -17485,7 +17503,7 @@
           <w:numId w:val="7"/>
         </w:numPr>
       </w:pPr>
-      <w:bookmarkStart w:id="53" w:name="_Toc241695220"/>
+      <w:bookmarkStart w:id="53" w:name="_Toc242310356"/>
       <w:r>
         <w:lastRenderedPageBreak/>
         <w:t>세계관과</w:t>
@@ -17732,7 +17750,7 @@
           <w:numId w:val="7"/>
         </w:numPr>
       </w:pPr>
-      <w:bookmarkStart w:id="54" w:name="_Toc241695221"/>
+      <w:bookmarkStart w:id="54" w:name="_Toc242310357"/>
       <w:r>
         <w:lastRenderedPageBreak/>
         <w:t>범위</w:t>
@@ -17759,7 +17777,7 @@
           <w:numId w:val="7"/>
         </w:numPr>
       </w:pPr>
-      <w:bookmarkStart w:id="55" w:name="_Toc241695222"/>
+      <w:bookmarkStart w:id="55" w:name="_Toc242310358"/>
       <w:r>
         <w:t>v1.0 Required Scope</w:t>
       </w:r>
@@ -18127,7 +18145,7 @@
           <w:numId w:val="7"/>
         </w:numPr>
       </w:pPr>
-      <w:bookmarkStart w:id="56" w:name="_Toc241695223"/>
+      <w:bookmarkStart w:id="56" w:name="_Toc242310359"/>
       <w:r>
         <w:t>Deferred Expansion</w:t>
       </w:r>
@@ -18151,7 +18169,7 @@
           <w:numId w:val="7"/>
         </w:numPr>
       </w:pPr>
-      <w:bookmarkStart w:id="57" w:name="_Toc241695224"/>
+      <w:bookmarkStart w:id="57" w:name="_Toc242310360"/>
       <w:r>
         <w:t>Stretch</w:t>
       </w:r>
@@ -18529,7 +18547,7 @@
           <w:numId w:val="7"/>
         </w:numPr>
       </w:pPr>
-      <w:bookmarkStart w:id="58" w:name="_Toc241695225"/>
+      <w:bookmarkStart w:id="58" w:name="_Toc242310361"/>
       <w:r>
         <w:lastRenderedPageBreak/>
         <w:t>Starting Balance Targets</w:t>
@@ -18714,7 +18732,7 @@
               <w:pStyle w:val="TableText"/>
             </w:pPr>
             <w:r>
-              <w:t>1.35초 Build-up (1.2~1.5)</w:t>
+              <w:t>2.025초 Build-up (1.8~2.25)</w:t>
             </w:r>
           </w:p>
         </w:tc>
@@ -18903,7 +18921,7 @@
               <w:pStyle w:val="TableText"/>
             </w:pPr>
             <w:r>
-              <w:t>맵별 카탈로그 40, 총 120 / 매치별 활성 20</w:t>
+              <w:t>맵별 카탈로그 40, 총 120 / 매치별 활성 12</w:t>
             </w:r>
           </w:p>
         </w:tc>
@@ -19128,7 +19146,7 @@
           <w:numId w:val="7"/>
         </w:numPr>
       </w:pPr>
-      <w:bookmarkStart w:id="59" w:name="_Toc241695226"/>
+      <w:bookmarkStart w:id="59" w:name="_Toc242310362"/>
       <w:r>
         <w:t>Playtest Questions</w:t>
       </w:r>
@@ -19214,7 +19232,7 @@
           <w:numId w:val="7"/>
         </w:numPr>
       </w:pPr>
-      <w:bookmarkStart w:id="60" w:name="_Toc241695227"/>
+      <w:bookmarkStart w:id="60" w:name="_Toc242310363"/>
       <w:r>
         <w:lastRenderedPageBreak/>
         <w:t>Release KPI</w:t>
@@ -19546,9 +19564,21 @@
           <w:numId w:val="7"/>
         </w:numPr>
       </w:pPr>
-      <w:bookmarkStart w:id="61" w:name="_Toc241695228"/>
-      <w:r>
-        <w:t>W6~W12 Roadmap</w:t>
+      <w:bookmarkStart w:id="61" w:name="_Toc242310364"/>
+      <w:r>
+        <w:t>단계별</w:t>
+      </w:r>
+      <w:r>
+        <w:t xml:space="preserve"> </w:t>
+      </w:r>
+      <w:r>
+        <w:t>출시</w:t>
+      </w:r>
+      <w:r>
+        <w:t xml:space="preserve"> </w:t>
+      </w:r>
+      <w:r>
+        <w:t>조건</w:t>
       </w:r>
       <w:bookmarkEnd w:id="61"/>
     </w:p>
@@ -19588,7 +19618,7 @@
               <w:keepNext/>
             </w:pPr>
             <w:r>
-              <w:t>주차</w:t>
+              <w:t>단계</w:t>
             </w:r>
           </w:p>
         </w:tc>
@@ -19647,7 +19677,7 @@
           </w:tcPr>
           <w:p>
             <w:r>
-              <w:t>W6</w:t>
+              <w:t>A</w:t>
             </w:r>
           </w:p>
         </w:tc>
@@ -19658,7 +19688,7 @@
           </w:tcPr>
           <w:p>
             <w:r>
-              <w:t>Contract Run Feature Complete</w:t>
+              <w:t>현재 실패 해결 · 최신 빌드 기준 확정</w:t>
             </w:r>
           </w:p>
         </w:tc>
@@ -19669,7 +19699,7 @@
           </w:tcPr>
           <w:p>
             <w:r>
-              <w:t>당시 내부 1P/4P 자동화 기준으로 완주. Rev14 Release Gate는 2P/3P/4P로 별도 적용</w:t>
+              <w:t>현재 실패를 재현·해결하고 동일 Revision의 최신 빌드와 입력 기준을 확보한다.</w:t>
             </w:r>
           </w:p>
         </w:tc>
@@ -19686,7 +19716,7 @@
           </w:tcPr>
           <w:p>
             <w:r>
-              <w:t>W7</w:t>
+              <w:t>B</w:t>
             </w:r>
           </w:p>
         </w:tc>
@@ -19697,7 +19727,7 @@
           </w:tcPr>
           <w:p>
             <w:r>
-              <w:t>Player Experience Integration</w:t>
+              <w:t>콘텐츠 · UI · 캐릭터 · 권리 확정</w:t>
             </w:r>
           </w:p>
         </w:tc>
@@ -19708,7 +19738,7 @@
           </w:tcPr>
           <w:p>
             <w:r>
-              <w:t>협동 상태를 2초 내 파악하고 한 판에 탐욕 대 퇴각 선택이 최소 2회 발생</w:t>
+              <w:t>세 맵 콘텐츠, UI, 캐릭터와 배포 권리를 확정한다.</w:t>
             </w:r>
           </w:p>
         </w:tc>
@@ -19725,7 +19755,7 @@
           </w:tcPr>
           <w:p>
             <w:r>
-              <w:t>W8</w:t>
+              <w:t>C</w:t>
             </w:r>
           </w:p>
         </w:tc>
@@ -19736,7 +19766,7 @@
           </w:tcPr>
           <w:p>
             <w:r>
-              <w:t>3-Map Release Shape / Feature Lock 준비</w:t>
+              <w:t>Feature Lock · 통합 QA</w:t>
             </w:r>
           </w:p>
         </w:tc>
@@ -19747,7 +19777,7 @@
           </w:tcPr>
           <w:p>
             <w:r>
-              <w:t>2~4인 Painting Contract, CCTV/Laser 배치·밸런스 기록, P0 Placeholder 0, 신규 Gameplay Feature 종료</w:t>
+              <w:t>기능을 잠그고 M01/M02/M03 각각 2인·3인·4인의 전체 루프와 회귀를 검증한다.</w:t>
             </w:r>
           </w:p>
         </w:tc>
@@ -19763,7 +19793,7 @@
           </w:tcPr>
           <w:p>
             <w:r>
-              <w:t>W9</w:t>
+              <w:t>D</w:t>
             </w:r>
           </w:p>
         </w:tc>
@@ -19773,7 +19803,7 @@
           </w:tcPr>
           <w:p>
             <w:r>
-              <w:t>Feature Lock / QA Sprint 1</w:t>
+              <w:t>Clean RC1 · Steam · 외부 검증</w:t>
             </w:r>
           </w:p>
         </w:tc>
@@ -19783,7 +19813,7 @@
           </w:tcPr>
           <w:p>
             <w:r>
-              <w:t>3-Map Regression Matrix, Network/Forgery Edge Case, Crash·Softlock·Original 유실 0</w:t>
+              <w:t>Clean RC1에서 서로 다른 Steam 2계정의 Session·Travel·Voice와 자연 완주, 외부 플레이테스트를 검증한다.</w:t>
             </w:r>
           </w:p>
         </w:tc>
@@ -19799,7 +19829,7 @@
           </w:tcPr>
           <w:p>
             <w:r>
-              <w:t>W10</w:t>
+              <w:t>E</w:t>
             </w:r>
           </w:p>
         </w:tc>
@@ -19809,7 +19839,7 @@
           </w:tcPr>
           <w:p>
             <w:r>
-              <w:t>RC1 / Internal Gate</w:t>
+              <w:t>동일 Hash RC2 · 공개 판단</w:t>
             </w:r>
           </w:p>
         </w:tc>
@@ -19819,7 +19849,7 @@
           </w:tcPr>
           <w:p>
             <w:r>
-              <w:t>Clean RC1에서 Host/Join/Travel/Contract Run/Result/Lobby Return 통과</w:t>
+              <w:t>동일 Hash RC2의 회귀, 설치 Smoke, Store·Credits와 Rollback 준비를 확인한 뒤 공개 여부를 판단한다.</w:t>
             </w:r>
           </w:p>
         </w:tc>
@@ -19835,7 +19865,7 @@
           </w:tcPr>
           <w:p>
             <w:r>
-              <w:t>W11</w:t>
+              <w:t>과거 기준</w:t>
             </w:r>
           </w:p>
         </w:tc>
@@ -19845,7 +19875,7 @@
           </w:tcPr>
           <w:p>
             <w:r>
-              <w:t>External Playtest / Final Scope</w:t>
+              <w:t>이전 W6 내부 자동화</w:t>
             </w:r>
           </w:p>
         </w:tc>
@@ -19855,7 +19885,7 @@
           </w:tcPr>
           <w:p>
             <w:r>
-              <w:t>설명 없이 첫 판 목표와 결과를 이해, Critical 0, 최종 수정 범위를 Ship Blocker로 제한</w:t>
+              <w:t>당시 내부 1P/4P 자동화 완주는 역사 증거로 보존한다. 현행 2~4인 출시 Gate 통과 증거를 대신하지 않는다.</w:t>
             </w:r>
           </w:p>
         </w:tc>
@@ -19872,7 +19902,7 @@
           <w:p>
             <w:r>
               <w:lastRenderedPageBreak/>
-              <w:t>W12</w:t>
+              <w:t>운영 기록</w:t>
             </w:r>
           </w:p>
         </w:tc>
@@ -19881,9 +19911,11 @@
             <w:tcW w:w="4192" w:type="dxa"/>
           </w:tcPr>
           <w:p>
-            <w:r>
-              <w:t>Final RC / Release Gate</w:t>
-            </w:r>
+            <w:hyperlink r:id="rId12">
+              <w:r>
+                <w:t>Notion 출시 정리와 남은 단계</w:t>
+              </w:r>
+            </w:hyperlink>
           </w:p>
         </w:tc>
         <w:tc>
@@ -19892,7 +19924,7 @@
           </w:tcPr>
           <w:p>
             <w:r>
-              <w:t>최종 3-Map·2인/3인/4인 회귀, Clean Install, Version/License/Store/Hotfix 준비 후 출시 승인</w:t>
+              <w:t>새 출시일은 미정이다. 일정·진행·Task·완료 증거·Hash 상태는 연결된 Notion에서 관리한다.</w:t>
             </w:r>
           </w:p>
         </w:tc>
@@ -19912,7 +19944,7 @@
         <w:keepLines/>
         <w:pageBreakBefore w:val="0"/>
       </w:pPr>
-      <w:bookmarkStart w:id="62" w:name="_Toc241695229"/>
+      <w:bookmarkStart w:id="62" w:name="_Toc242310365"/>
       <w:r>
         <w:t>Appendix A — 용어</w:t>
       </w:r>
@@ -20303,7 +20335,7 @@
         <w:keepLines/>
         <w:pageBreakBefore w:val="0"/>
       </w:pPr>
-      <w:bookmarkStart w:id="63" w:name="_Toc241695230"/>
+      <w:bookmarkStart w:id="63" w:name="_Toc242310366"/>
       <w:r>
         <w:rPr>
           <w:sz w:val="32"/>
@@ -20527,7 +20559,7 @@
         <w:keepLines/>
         <w:pageBreakBefore w:val="0"/>
       </w:pPr>
-      <w:bookmarkStart w:id="64" w:name="_Toc241695231"/>
+      <w:bookmarkStart w:id="64" w:name="_Toc242310367"/>
       <w:r>
         <w:rPr>
           <w:sz w:val="32"/>
@@ -20610,8 +20642,8 @@
       </w:r>
     </w:p>
     <w:sectPr>
-      <w:headerReference w:type="default" r:id="rId11"/>
-      <w:footerReference w:type="default" r:id="rId12"/>
+      <w:headerReference w:type="default" r:id="rId13"/>
+      <w:footerReference w:type="default" r:id="rId14"/>
       <w:pgSz w:w="11906" w:h="16838"/>
       <w:pgMar w:top="1020" w:right="1020" w:bottom="907" w:left="1020" w:header="454" w:footer="397" w:gutter="0"/>
       <w:cols w:space="720"/>

</xml_diff>

<commit_message>
Rework museum security layouts and add detention sentries
Update M01/M02/M03 patrol routes and CCTV placements for the current exhibitions. Add one detention-area sentry per map and fixed camera mounts while preserving existing assets and gameplay anchors.

Record approved placement data, migration tools, and validation boundaries in AGENTS and GDD/TDD. Validation: strict Nav 357/357, guard-start capsules 27/27, physical sweeps 1238 subsegments, and nine diagnostic local SIE fixtures with 9/11/14 active guards. Natural online play, current C++ build, and package tests remain unverified.
</commit_message>
<xml_diff>
--- a/Museum_Heist_GDD.docx
+++ b/Museum_Heist_GDD.docx
@@ -10742,7 +10742,7 @@
     </w:p>
     <w:p>
       <w:r>
-        <w:t>경비는 상체 앞쪽에서 진행 방향을 비추는 손전등을 항상 켜고 순찰한다. 플레이어보다 밝은 빛으로 경비의 존재와 방향을 읽을 수 있게 하되 실제 감지 범위는 기존 경비 시야 규칙을 유지한다.</w:t>
+        <w:t xml:space="preserve">경비는 상체 앞쪽에서 진행 방향을 비추는 손전등을 항상 켜고 순찰한다. 플레이어보다 밝은 빛으로 경비의 존재와 방향을 읽을 수 있게 하되 실제 감지 범위는 기존 경비 시야 규칙을 유지한다. 현장 경비는 전시 구역마다 짧은 지역 순찰을 맡아 주변을 살피고 이동 시점을 고르게 한다. 구금 구역의 기존 전담 순찰은 유지하고, 각 맵의 구금실 근처에 상주 경비 한 명을 추가해 구조와 압수품 회수 시점을 선택하게 한다. 상주 경비도 소음과 추적에는 기존 경비와 같은 방식으로 반응한다.</w:t>
       </w:r>
     </w:p>
     <w:tbl>
@@ -11054,7 +11054,7 @@
     </w:p>
     <w:p>
       <w:r>
-        <w:t>CCTV는 첫 포착 시 회전을 멈추고 2.025초 노출 시 경계도 +0.5와 근처 Guard 조사를 유발한다. 모두 시야를 벗어나면 누적을 지우고 1.5초 뒤 같은 각도·방향에서 회전을 재개한다. 재포착은 복귀를 취소한다. 렌즈·본체·조명은 함께 움직이고 흰빛은 누적에 따라 붉어져 발각 시 잠시 유지된다. 감지·조명 거리는 기존의 2/3이며 시야각·야간 조명은 유지한다.</w:t>
+        <w:t xml:space="preserve">CCTV는 첫 포착 시 회전을 멈추고 2.025초 노출 시 경계도 +0.5와 근처 Guard 조사를 유발한다. 모두 시야를 벗어나면 누적을 지우고 1.5초 뒤 같은 각도·방향에서 회전을 재개한다. 재포착은 복귀를 취소한다. 렌즈·본체·조명은 함께 움직이고 흰빛은 누적에 따라 붉어져 발각 시 잠시 유지된다. CCTV는 작품 작업점을 상시 덮기보다 진입과 전리품 회수 동선을 감시한다. 회전 방향과 빈틈을 보고 이동 시점을 선택하게 하며 약한 야간 조명과 기존 발각 규칙은 유지한다.</w:t>
       </w:r>
     </w:p>
     <w:p>
@@ -15509,7 +15509,7 @@
         </w:numPr>
       </w:pPr>
       <w:r>
-        <w:t>세 맵은 동일한 Gameplay Rule을 사용하되, Material과 Lighting만이 아니라 Macro Topology, 첫 10초의 정보 공개 방식, Landmark, Target 이후 귀환 경로로 서로 다른 플레이 정체성을 만든다. 야간 침입은 상시 전면 조명 대신 꺼진 구역과 국소 조명의 대비로 표현한다. M01은 따뜻한 전시 잔등, M02는 푸른 중정과 어두운 회랑, M03는 차가운 유리 채광과 서비스 조명을 중심으로 구성한다. 작품 앞과 버튼·출구는 식별 가능하게 유지하며 조명만으로 도난 대상을 알려주지 않는다. 경비실과 구금실은 관람 동선에서 갈라지는 단일 보안 진입부 뒤에 둔다. 폭 1.8m 출입구와 불투명 전실 벽으로 직접 시야를 끊고, CCTV와 내부 순찰을 통과한 뒤 압수품 회수 또는 구금실 구조를 선택한다. 구금실에는 잠긴 철창문으로만 통과할 수 있는 완전한 철제 칸막이와 고정 벤치를 두고, 보안 표지·금속 문틀·차가운 국소등으로 일반 전시실과 경계를 구분한다. 추가 열쇠나 해킹 없이 기존 상호작용으로 구조·회수하며 구조 또는 구속 시간 경과 후 동일 진입부를 통해 탈출을 시도한다. 각 맵의 기존 경비 한 명을 보안 구역과 인접 복도를 순찰하도록 배치한다. 순환 목표는 25~35초이며 철창 앞에서 2~3초 확인한다. 철창 안 구금자는 시야만으로 재체포하지 않으며 작업 실패 소음에는 조사로 반응한다.</w:t>
+        <w:t xml:space="preserve">세 맵은 동일한 Gameplay Rule을 사용하되, Material과 Lighting만이 아니라 Macro Topology, 첫 10초의 정보 공개 방식, Landmark, Target 이후 귀환 경로로 서로 다른 플레이 정체성을 만든다. 야간 침입은 상시 전면 조명 대신 꺼진 구역과 국소 조명의 대비로 표현한다. M01은 따뜻한 전시 잔등, M02는 푸른 중정과 어두운 회랑, M03는 차가운 유리 채광과 서비스 조명을 중심으로 구성한다. 작품 앞과 버튼·출구는 식별 가능하게 유지하며 조명만으로 도난 대상을 알려주지 않는다. 경비실과 구금실은 관람 동선에서 갈라지는 단일 보안 진입부 뒤에 둔다. 폭 1.8m 출입구와 불투명 전실 벽으로 직접 시야를 끊고, CCTV와 내부 순찰을 통과한 뒤 압수품 회수 또는 구금실 구조를 선택한다. 구금실에는 잠긴 철창문으로만 통과할 수 있는 완전한 철제 칸막이와 고정 벤치를 두고, 보안 표지·금속 문틀·차가운 국소등으로 일반 전시실과 경계를 구분한다. 추가 열쇠나 해킹 없이 기존 상호작용으로 구조·회수하며 구조 또는 구속 시간 경과 후 동일 진입부를 통해 탈출을 시도한다. 각 맵의 기존 경비 한 명을 보안 구역과 인접 복도를 순찰하도록 배치한다. 순환 목표는 25~35초이며 철창 앞에서 2~3초 확인한다. 철창 안 구금자는 시야만으로 재체포하지 않으며 작업 실패 소음에는 조사로 반응한다. 보안 보강은 전시·건축·가구와 필수 작품·레이저·구금·압수품·탈출 위치를 유지한 채 경비·CCTV 배치와 순찰 경로만 조정한다.</w:t>
       </w:r>
     </w:p>
     <w:p>

</xml_diff>

<commit_message>
Fix Medium startup, guard navigation, and CCTV work access
Lock graphics to Medium at startup, use engine crowd navigation for guards, and repair the M03 vent interaction approach.

Commit the saved CCTV orientation layout and validation tools with GDD/TDD and source metadata. Read historical CCTV authoring inputs from ProjectResources while preserving baseline guards and disposable Saved outputs.
</commit_message>
<xml_diff>
--- a/Museum_Heist_GDD.docx
+++ b/Museum_Heist_GDD.docx
@@ -559,7 +559,7 @@
       <w:r>
         <w:fldChar w:fldCharType="separate"/>
       </w:r>
-      <w:hyperlink w:anchor="_Toc242310303" w:history="1">
+      <w:hyperlink w:anchor="_Toc242474087" w:history="1">
         <w:r>
           <w:rPr>
             <w:rStyle w:val="aff1"/>
@@ -586,7 +586,7 @@
             <w:noProof/>
             <w:webHidden/>
           </w:rPr>
-          <w:instrText xml:space="preserve"> PAGEREF _Toc242310303 \h </w:instrText>
+          <w:instrText xml:space="preserve"> PAGEREF _Toc242474087 \h </w:instrText>
         </w:r>
         <w:r>
           <w:rPr>
@@ -635,7 +635,7 @@
           <w14:ligatures w14:val="standardContextual"/>
         </w:rPr>
       </w:pPr>
-      <w:hyperlink w:anchor="_Toc242310304" w:history="1">
+      <w:hyperlink w:anchor="_Toc242474088" w:history="1">
         <w:r>
           <w:rPr>
             <w:rStyle w:val="aff1"/>
@@ -662,7 +662,7 @@
             <w:noProof/>
             <w:webHidden/>
           </w:rPr>
-          <w:instrText xml:space="preserve"> PAGEREF _Toc242310304 \h </w:instrText>
+          <w:instrText xml:space="preserve"> PAGEREF _Toc242474088 \h </w:instrText>
         </w:r>
         <w:r>
           <w:rPr>
@@ -711,7 +711,7 @@
           <w14:ligatures w14:val="standardContextual"/>
         </w:rPr>
       </w:pPr>
-      <w:hyperlink w:anchor="_Toc242310305" w:history="1">
+      <w:hyperlink w:anchor="_Toc242474089" w:history="1">
         <w:r>
           <w:rPr>
             <w:rStyle w:val="aff1"/>
@@ -738,7 +738,7 @@
             <w:noProof/>
             <w:webHidden/>
           </w:rPr>
-          <w:instrText xml:space="preserve"> PAGEREF _Toc242310305 \h </w:instrText>
+          <w:instrText xml:space="preserve"> PAGEREF _Toc242474089 \h </w:instrText>
         </w:r>
         <w:r>
           <w:rPr>
@@ -787,7 +787,7 @@
           <w14:ligatures w14:val="standardContextual"/>
         </w:rPr>
       </w:pPr>
-      <w:hyperlink w:anchor="_Toc242310306" w:history="1">
+      <w:hyperlink w:anchor="_Toc242474090" w:history="1">
         <w:r>
           <w:rPr>
             <w:rStyle w:val="aff1"/>
@@ -814,7 +814,7 @@
             <w:noProof/>
             <w:webHidden/>
           </w:rPr>
-          <w:instrText xml:space="preserve"> PAGEREF _Toc242310306 \h </w:instrText>
+          <w:instrText xml:space="preserve"> PAGEREF _Toc242474090 \h </w:instrText>
         </w:r>
         <w:r>
           <w:rPr>
@@ -863,7 +863,7 @@
           <w14:ligatures w14:val="standardContextual"/>
         </w:rPr>
       </w:pPr>
-      <w:hyperlink w:anchor="_Toc242310307" w:history="1">
+      <w:hyperlink w:anchor="_Toc242474091" w:history="1">
         <w:r>
           <w:rPr>
             <w:rStyle w:val="aff1"/>
@@ -890,7 +890,7 @@
             <w:noProof/>
             <w:webHidden/>
           </w:rPr>
-          <w:instrText xml:space="preserve"> PAGEREF _Toc242310307 \h </w:instrText>
+          <w:instrText xml:space="preserve"> PAGEREF _Toc242474091 \h </w:instrText>
         </w:r>
         <w:r>
           <w:rPr>
@@ -939,7 +939,7 @@
           <w14:ligatures w14:val="standardContextual"/>
         </w:rPr>
       </w:pPr>
-      <w:hyperlink w:anchor="_Toc242310308" w:history="1">
+      <w:hyperlink w:anchor="_Toc242474092" w:history="1">
         <w:r>
           <w:rPr>
             <w:rStyle w:val="aff1"/>
@@ -966,7 +966,7 @@
             <w:noProof/>
             <w:webHidden/>
           </w:rPr>
-          <w:instrText xml:space="preserve"> PAGEREF _Toc242310308 \h </w:instrText>
+          <w:instrText xml:space="preserve"> PAGEREF _Toc242474092 \h </w:instrText>
         </w:r>
         <w:r>
           <w:rPr>
@@ -1015,7 +1015,7 @@
           <w14:ligatures w14:val="standardContextual"/>
         </w:rPr>
       </w:pPr>
-      <w:hyperlink w:anchor="_Toc242310309" w:history="1">
+      <w:hyperlink w:anchor="_Toc242474093" w:history="1">
         <w:r>
           <w:rPr>
             <w:rStyle w:val="aff1"/>
@@ -1042,7 +1042,7 @@
             <w:noProof/>
             <w:webHidden/>
           </w:rPr>
-          <w:instrText xml:space="preserve"> PAGEREF _Toc242310309 \h </w:instrText>
+          <w:instrText xml:space="preserve"> PAGEREF _Toc242474093 \h </w:instrText>
         </w:r>
         <w:r>
           <w:rPr>
@@ -1090,7 +1090,7 @@
           <w14:ligatures w14:val="standardContextual"/>
         </w:rPr>
       </w:pPr>
-      <w:hyperlink w:anchor="_Toc242310310" w:history="1">
+      <w:hyperlink w:anchor="_Toc242474094" w:history="1">
         <w:r>
           <w:rPr>
             <w:rStyle w:val="aff1"/>
@@ -1117,7 +1117,7 @@
             <w:noProof/>
             <w:webHidden/>
           </w:rPr>
-          <w:instrText xml:space="preserve"> PAGEREF _Toc242310310 \h </w:instrText>
+          <w:instrText xml:space="preserve"> PAGEREF _Toc242474094 \h </w:instrText>
         </w:r>
         <w:r>
           <w:rPr>
@@ -1166,7 +1166,7 @@
           <w14:ligatures w14:val="standardContextual"/>
         </w:rPr>
       </w:pPr>
-      <w:hyperlink w:anchor="_Toc242310311" w:history="1">
+      <w:hyperlink w:anchor="_Toc242474095" w:history="1">
         <w:r>
           <w:rPr>
             <w:rStyle w:val="aff1"/>
@@ -1193,7 +1193,7 @@
             <w:noProof/>
             <w:webHidden/>
           </w:rPr>
-          <w:instrText xml:space="preserve"> PAGEREF _Toc242310311 \h </w:instrText>
+          <w:instrText xml:space="preserve"> PAGEREF _Toc242474095 \h </w:instrText>
         </w:r>
         <w:r>
           <w:rPr>
@@ -1242,7 +1242,7 @@
           <w14:ligatures w14:val="standardContextual"/>
         </w:rPr>
       </w:pPr>
-      <w:hyperlink w:anchor="_Toc242310312" w:history="1">
+      <w:hyperlink w:anchor="_Toc242474096" w:history="1">
         <w:r>
           <w:rPr>
             <w:rStyle w:val="aff1"/>
@@ -1269,7 +1269,7 @@
             <w:noProof/>
             <w:webHidden/>
           </w:rPr>
-          <w:instrText xml:space="preserve"> PAGEREF _Toc242310312 \h </w:instrText>
+          <w:instrText xml:space="preserve"> PAGEREF _Toc242474096 \h </w:instrText>
         </w:r>
         <w:r>
           <w:rPr>
@@ -1318,7 +1318,7 @@
           <w14:ligatures w14:val="standardContextual"/>
         </w:rPr>
       </w:pPr>
-      <w:hyperlink w:anchor="_Toc242310313" w:history="1">
+      <w:hyperlink w:anchor="_Toc242474097" w:history="1">
         <w:r>
           <w:rPr>
             <w:rStyle w:val="aff1"/>
@@ -1345,7 +1345,7 @@
             <w:noProof/>
             <w:webHidden/>
           </w:rPr>
-          <w:instrText xml:space="preserve"> PAGEREF _Toc242310313 \h </w:instrText>
+          <w:instrText xml:space="preserve"> PAGEREF _Toc242474097 \h </w:instrText>
         </w:r>
         <w:r>
           <w:rPr>
@@ -1394,7 +1394,7 @@
           <w14:ligatures w14:val="standardContextual"/>
         </w:rPr>
       </w:pPr>
-      <w:hyperlink w:anchor="_Toc242310314" w:history="1">
+      <w:hyperlink w:anchor="_Toc242474098" w:history="1">
         <w:r>
           <w:rPr>
             <w:rStyle w:val="aff1"/>
@@ -1421,7 +1421,7 @@
             <w:noProof/>
             <w:webHidden/>
           </w:rPr>
-          <w:instrText xml:space="preserve"> PAGEREF _Toc242310314 \h </w:instrText>
+          <w:instrText xml:space="preserve"> PAGEREF _Toc242474098 \h </w:instrText>
         </w:r>
         <w:r>
           <w:rPr>
@@ -1470,7 +1470,7 @@
           <w14:ligatures w14:val="standardContextual"/>
         </w:rPr>
       </w:pPr>
-      <w:hyperlink w:anchor="_Toc242310315" w:history="1">
+      <w:hyperlink w:anchor="_Toc242474099" w:history="1">
         <w:r>
           <w:rPr>
             <w:rStyle w:val="aff1"/>
@@ -1497,7 +1497,7 @@
             <w:noProof/>
             <w:webHidden/>
           </w:rPr>
-          <w:instrText xml:space="preserve"> PAGEREF _Toc242310315 \h </w:instrText>
+          <w:instrText xml:space="preserve"> PAGEREF _Toc242474099 \h </w:instrText>
         </w:r>
         <w:r>
           <w:rPr>
@@ -1545,7 +1545,7 @@
           <w14:ligatures w14:val="standardContextual"/>
         </w:rPr>
       </w:pPr>
-      <w:hyperlink w:anchor="_Toc242310316" w:history="1">
+      <w:hyperlink w:anchor="_Toc242474100" w:history="1">
         <w:r>
           <w:rPr>
             <w:rStyle w:val="aff1"/>
@@ -1572,7 +1572,7 @@
             <w:noProof/>
             <w:webHidden/>
           </w:rPr>
-          <w:instrText xml:space="preserve"> PAGEREF _Toc242310316 \h </w:instrText>
+          <w:instrText xml:space="preserve"> PAGEREF _Toc242474100 \h </w:instrText>
         </w:r>
         <w:r>
           <w:rPr>
@@ -1621,7 +1621,7 @@
           <w14:ligatures w14:val="standardContextual"/>
         </w:rPr>
       </w:pPr>
-      <w:hyperlink w:anchor="_Toc242310317" w:history="1">
+      <w:hyperlink w:anchor="_Toc242474101" w:history="1">
         <w:r>
           <w:rPr>
             <w:rStyle w:val="aff1"/>
@@ -1648,7 +1648,7 @@
             <w:noProof/>
             <w:webHidden/>
           </w:rPr>
-          <w:instrText xml:space="preserve"> PAGEREF _Toc242310317 \h </w:instrText>
+          <w:instrText xml:space="preserve"> PAGEREF _Toc242474101 \h </w:instrText>
         </w:r>
         <w:r>
           <w:rPr>
@@ -1697,7 +1697,7 @@
           <w14:ligatures w14:val="standardContextual"/>
         </w:rPr>
       </w:pPr>
-      <w:hyperlink w:anchor="_Toc242310318" w:history="1">
+      <w:hyperlink w:anchor="_Toc242474102" w:history="1">
         <w:r>
           <w:rPr>
             <w:rStyle w:val="aff1"/>
@@ -1724,7 +1724,7 @@
             <w:noProof/>
             <w:webHidden/>
           </w:rPr>
-          <w:instrText xml:space="preserve"> PAGEREF _Toc242310318 \h </w:instrText>
+          <w:instrText xml:space="preserve"> PAGEREF _Toc242474102 \h </w:instrText>
         </w:r>
         <w:r>
           <w:rPr>
@@ -1773,7 +1773,7 @@
           <w14:ligatures w14:val="standardContextual"/>
         </w:rPr>
       </w:pPr>
-      <w:hyperlink w:anchor="_Toc242310319" w:history="1">
+      <w:hyperlink w:anchor="_Toc242474103" w:history="1">
         <w:r>
           <w:rPr>
             <w:rStyle w:val="aff1"/>
@@ -1800,7 +1800,7 @@
             <w:noProof/>
             <w:webHidden/>
           </w:rPr>
-          <w:instrText xml:space="preserve"> PAGEREF _Toc242310319 \h </w:instrText>
+          <w:instrText xml:space="preserve"> PAGEREF _Toc242474103 \h </w:instrText>
         </w:r>
         <w:r>
           <w:rPr>
@@ -1849,7 +1849,7 @@
           <w14:ligatures w14:val="standardContextual"/>
         </w:rPr>
       </w:pPr>
-      <w:hyperlink w:anchor="_Toc242310320" w:history="1">
+      <w:hyperlink w:anchor="_Toc242474104" w:history="1">
         <w:r>
           <w:rPr>
             <w:rStyle w:val="aff1"/>
@@ -1876,7 +1876,7 @@
             <w:noProof/>
             <w:webHidden/>
           </w:rPr>
-          <w:instrText xml:space="preserve"> PAGEREF _Toc242310320 \h </w:instrText>
+          <w:instrText xml:space="preserve"> PAGEREF _Toc242474104 \h </w:instrText>
         </w:r>
         <w:r>
           <w:rPr>
@@ -1925,7 +1925,7 @@
           <w14:ligatures w14:val="standardContextual"/>
         </w:rPr>
       </w:pPr>
-      <w:hyperlink w:anchor="_Toc242310321" w:history="1">
+      <w:hyperlink w:anchor="_Toc242474105" w:history="1">
         <w:r>
           <w:rPr>
             <w:rStyle w:val="aff1"/>
@@ -1952,7 +1952,7 @@
             <w:noProof/>
             <w:webHidden/>
           </w:rPr>
-          <w:instrText xml:space="preserve"> PAGEREF _Toc242310321 \h </w:instrText>
+          <w:instrText xml:space="preserve"> PAGEREF _Toc242474105 \h </w:instrText>
         </w:r>
         <w:r>
           <w:rPr>
@@ -2001,7 +2001,7 @@
           <w14:ligatures w14:val="standardContextual"/>
         </w:rPr>
       </w:pPr>
-      <w:hyperlink w:anchor="_Toc242310322" w:history="1">
+      <w:hyperlink w:anchor="_Toc242474106" w:history="1">
         <w:r>
           <w:rPr>
             <w:rStyle w:val="aff1"/>
@@ -2028,7 +2028,7 @@
             <w:noProof/>
             <w:webHidden/>
           </w:rPr>
-          <w:instrText xml:space="preserve"> PAGEREF _Toc242310322 \h </w:instrText>
+          <w:instrText xml:space="preserve"> PAGEREF _Toc242474106 \h </w:instrText>
         </w:r>
         <w:r>
           <w:rPr>
@@ -2076,7 +2076,7 @@
           <w14:ligatures w14:val="standardContextual"/>
         </w:rPr>
       </w:pPr>
-      <w:hyperlink w:anchor="_Toc242310323" w:history="1">
+      <w:hyperlink w:anchor="_Toc242474107" w:history="1">
         <w:r>
           <w:rPr>
             <w:rStyle w:val="aff1"/>
@@ -2103,7 +2103,7 @@
             <w:noProof/>
             <w:webHidden/>
           </w:rPr>
-          <w:instrText xml:space="preserve"> PAGEREF _Toc242310323 \h </w:instrText>
+          <w:instrText xml:space="preserve"> PAGEREF _Toc242474107 \h </w:instrText>
         </w:r>
         <w:r>
           <w:rPr>
@@ -2152,7 +2152,7 @@
           <w14:ligatures w14:val="standardContextual"/>
         </w:rPr>
       </w:pPr>
-      <w:hyperlink w:anchor="_Toc242310324" w:history="1">
+      <w:hyperlink w:anchor="_Toc242474108" w:history="1">
         <w:r>
           <w:rPr>
             <w:rStyle w:val="aff1"/>
@@ -2179,7 +2179,7 @@
             <w:noProof/>
             <w:webHidden/>
           </w:rPr>
-          <w:instrText xml:space="preserve"> PAGEREF _Toc242310324 \h </w:instrText>
+          <w:instrText xml:space="preserve"> PAGEREF _Toc242474108 \h </w:instrText>
         </w:r>
         <w:r>
           <w:rPr>
@@ -2228,7 +2228,7 @@
           <w14:ligatures w14:val="standardContextual"/>
         </w:rPr>
       </w:pPr>
-      <w:hyperlink w:anchor="_Toc242310325" w:history="1">
+      <w:hyperlink w:anchor="_Toc242474109" w:history="1">
         <w:r>
           <w:rPr>
             <w:rStyle w:val="aff1"/>
@@ -2255,7 +2255,7 @@
             <w:noProof/>
             <w:webHidden/>
           </w:rPr>
-          <w:instrText xml:space="preserve"> PAGEREF _Toc242310325 \h </w:instrText>
+          <w:instrText xml:space="preserve"> PAGEREF _Toc242474109 \h </w:instrText>
         </w:r>
         <w:r>
           <w:rPr>
@@ -2304,7 +2304,7 @@
           <w14:ligatures w14:val="standardContextual"/>
         </w:rPr>
       </w:pPr>
-      <w:hyperlink w:anchor="_Toc242310326" w:history="1">
+      <w:hyperlink w:anchor="_Toc242474110" w:history="1">
         <w:r>
           <w:rPr>
             <w:rStyle w:val="aff1"/>
@@ -2331,7 +2331,7 @@
             <w:noProof/>
             <w:webHidden/>
           </w:rPr>
-          <w:instrText xml:space="preserve"> PAGEREF _Toc242310326 \h </w:instrText>
+          <w:instrText xml:space="preserve"> PAGEREF _Toc242474110 \h </w:instrText>
         </w:r>
         <w:r>
           <w:rPr>
@@ -2380,7 +2380,7 @@
           <w14:ligatures w14:val="standardContextual"/>
         </w:rPr>
       </w:pPr>
-      <w:hyperlink w:anchor="_Toc242310327" w:history="1">
+      <w:hyperlink w:anchor="_Toc242474111" w:history="1">
         <w:r>
           <w:rPr>
             <w:rStyle w:val="aff1"/>
@@ -2407,7 +2407,7 @@
             <w:noProof/>
             <w:webHidden/>
           </w:rPr>
-          <w:instrText xml:space="preserve"> PAGEREF _Toc242310327 \h </w:instrText>
+          <w:instrText xml:space="preserve"> PAGEREF _Toc242474111 \h </w:instrText>
         </w:r>
         <w:r>
           <w:rPr>
@@ -2456,7 +2456,7 @@
           <w14:ligatures w14:val="standardContextual"/>
         </w:rPr>
       </w:pPr>
-      <w:hyperlink w:anchor="_Toc242310328" w:history="1">
+      <w:hyperlink w:anchor="_Toc242474112" w:history="1">
         <w:r>
           <w:rPr>
             <w:rStyle w:val="aff1"/>
@@ -2483,7 +2483,7 @@
             <w:noProof/>
             <w:webHidden/>
           </w:rPr>
-          <w:instrText xml:space="preserve"> PAGEREF _Toc242310328 \h </w:instrText>
+          <w:instrText xml:space="preserve"> PAGEREF _Toc242474112 \h </w:instrText>
         </w:r>
         <w:r>
           <w:rPr>
@@ -2532,7 +2532,7 @@
           <w14:ligatures w14:val="standardContextual"/>
         </w:rPr>
       </w:pPr>
-      <w:hyperlink w:anchor="_Toc242310329" w:history="1">
+      <w:hyperlink w:anchor="_Toc242474113" w:history="1">
         <w:r>
           <w:rPr>
             <w:rStyle w:val="aff1"/>
@@ -2559,7 +2559,7 @@
             <w:noProof/>
             <w:webHidden/>
           </w:rPr>
-          <w:instrText xml:space="preserve"> PAGEREF _Toc242310329 \h </w:instrText>
+          <w:instrText xml:space="preserve"> PAGEREF _Toc242474113 \h </w:instrText>
         </w:r>
         <w:r>
           <w:rPr>
@@ -2579,7 +2579,7 @@
             <w:noProof/>
             <w:webHidden/>
           </w:rPr>
-          <w:t>16</w:t>
+          <w:t>17</w:t>
         </w:r>
         <w:r>
           <w:rPr>
@@ -2607,7 +2607,7 @@
           <w14:ligatures w14:val="standardContextual"/>
         </w:rPr>
       </w:pPr>
-      <w:hyperlink w:anchor="_Toc242310330" w:history="1">
+      <w:hyperlink w:anchor="_Toc242474114" w:history="1">
         <w:r>
           <w:rPr>
             <w:rStyle w:val="aff1"/>
@@ -2634,7 +2634,7 @@
             <w:noProof/>
             <w:webHidden/>
           </w:rPr>
-          <w:instrText xml:space="preserve"> PAGEREF _Toc242310330 \h </w:instrText>
+          <w:instrText xml:space="preserve"> PAGEREF _Toc242474114 \h </w:instrText>
         </w:r>
         <w:r>
           <w:rPr>
@@ -2683,7 +2683,7 @@
           <w14:ligatures w14:val="standardContextual"/>
         </w:rPr>
       </w:pPr>
-      <w:hyperlink w:anchor="_Toc242310331" w:history="1">
+      <w:hyperlink w:anchor="_Toc242474115" w:history="1">
         <w:r>
           <w:rPr>
             <w:rStyle w:val="aff1"/>
@@ -2710,7 +2710,7 @@
             <w:noProof/>
             <w:webHidden/>
           </w:rPr>
-          <w:instrText xml:space="preserve"> PAGEREF _Toc242310331 \h </w:instrText>
+          <w:instrText xml:space="preserve"> PAGEREF _Toc242474115 \h </w:instrText>
         </w:r>
         <w:r>
           <w:rPr>
@@ -2759,7 +2759,7 @@
           <w14:ligatures w14:val="standardContextual"/>
         </w:rPr>
       </w:pPr>
-      <w:hyperlink w:anchor="_Toc242310332" w:history="1">
+      <w:hyperlink w:anchor="_Toc242474116" w:history="1">
         <w:r>
           <w:rPr>
             <w:rStyle w:val="aff1"/>
@@ -2786,7 +2786,7 @@
             <w:noProof/>
             <w:webHidden/>
           </w:rPr>
-          <w:instrText xml:space="preserve"> PAGEREF _Toc242310332 \h </w:instrText>
+          <w:instrText xml:space="preserve"> PAGEREF _Toc242474116 \h </w:instrText>
         </w:r>
         <w:r>
           <w:rPr>
@@ -2835,7 +2835,7 @@
           <w14:ligatures w14:val="standardContextual"/>
         </w:rPr>
       </w:pPr>
-      <w:hyperlink w:anchor="_Toc242310333" w:history="1">
+      <w:hyperlink w:anchor="_Toc242474117" w:history="1">
         <w:r>
           <w:rPr>
             <w:rStyle w:val="aff1"/>
@@ -2862,7 +2862,7 @@
             <w:noProof/>
             <w:webHidden/>
           </w:rPr>
-          <w:instrText xml:space="preserve"> PAGEREF _Toc242310333 \h </w:instrText>
+          <w:instrText xml:space="preserve"> PAGEREF _Toc242474117 \h </w:instrText>
         </w:r>
         <w:r>
           <w:rPr>
@@ -2911,7 +2911,7 @@
           <w14:ligatures w14:val="standardContextual"/>
         </w:rPr>
       </w:pPr>
-      <w:hyperlink w:anchor="_Toc242310334" w:history="1">
+      <w:hyperlink w:anchor="_Toc242474118" w:history="1">
         <w:r>
           <w:rPr>
             <w:rStyle w:val="aff1"/>
@@ -2938,7 +2938,7 @@
             <w:noProof/>
             <w:webHidden/>
           </w:rPr>
-          <w:instrText xml:space="preserve"> PAGEREF _Toc242310334 \h </w:instrText>
+          <w:instrText xml:space="preserve"> PAGEREF _Toc242474118 \h </w:instrText>
         </w:r>
         <w:r>
           <w:rPr>
@@ -2987,7 +2987,7 @@
           <w14:ligatures w14:val="standardContextual"/>
         </w:rPr>
       </w:pPr>
-      <w:hyperlink w:anchor="_Toc242310335" w:history="1">
+      <w:hyperlink w:anchor="_Toc242474119" w:history="1">
         <w:r>
           <w:rPr>
             <w:rStyle w:val="aff1"/>
@@ -3014,7 +3014,7 @@
             <w:noProof/>
             <w:webHidden/>
           </w:rPr>
-          <w:instrText xml:space="preserve"> PAGEREF _Toc242310335 \h </w:instrText>
+          <w:instrText xml:space="preserve"> PAGEREF _Toc242474119 \h </w:instrText>
         </w:r>
         <w:r>
           <w:rPr>
@@ -3063,7 +3063,7 @@
           <w14:ligatures w14:val="standardContextual"/>
         </w:rPr>
       </w:pPr>
-      <w:hyperlink w:anchor="_Toc242310336" w:history="1">
+      <w:hyperlink w:anchor="_Toc242474120" w:history="1">
         <w:r>
           <w:rPr>
             <w:rStyle w:val="aff1"/>
@@ -3090,7 +3090,7 @@
             <w:noProof/>
             <w:webHidden/>
           </w:rPr>
-          <w:instrText xml:space="preserve"> PAGEREF _Toc242310336 \h </w:instrText>
+          <w:instrText xml:space="preserve"> PAGEREF _Toc242474120 \h </w:instrText>
         </w:r>
         <w:r>
           <w:rPr>
@@ -3138,7 +3138,7 @@
           <w14:ligatures w14:val="standardContextual"/>
         </w:rPr>
       </w:pPr>
-      <w:hyperlink w:anchor="_Toc242310337" w:history="1">
+      <w:hyperlink w:anchor="_Toc242474121" w:history="1">
         <w:r>
           <w:rPr>
             <w:rStyle w:val="aff1"/>
@@ -3165,7 +3165,7 @@
             <w:noProof/>
             <w:webHidden/>
           </w:rPr>
-          <w:instrText xml:space="preserve"> PAGEREF _Toc242310337 \h </w:instrText>
+          <w:instrText xml:space="preserve"> PAGEREF _Toc242474121 \h </w:instrText>
         </w:r>
         <w:r>
           <w:rPr>
@@ -3214,7 +3214,7 @@
           <w14:ligatures w14:val="standardContextual"/>
         </w:rPr>
       </w:pPr>
-      <w:hyperlink w:anchor="_Toc242310338" w:history="1">
+      <w:hyperlink w:anchor="_Toc242474122" w:history="1">
         <w:r>
           <w:rPr>
             <w:rStyle w:val="aff1"/>
@@ -3241,7 +3241,7 @@
             <w:noProof/>
             <w:webHidden/>
           </w:rPr>
-          <w:instrText xml:space="preserve"> PAGEREF _Toc242310338 \h </w:instrText>
+          <w:instrText xml:space="preserve"> PAGEREF _Toc242474122 \h </w:instrText>
         </w:r>
         <w:r>
           <w:rPr>
@@ -3290,7 +3290,7 @@
           <w14:ligatures w14:val="standardContextual"/>
         </w:rPr>
       </w:pPr>
-      <w:hyperlink w:anchor="_Toc242310339" w:history="1">
+      <w:hyperlink w:anchor="_Toc242474123" w:history="1">
         <w:r>
           <w:rPr>
             <w:rStyle w:val="aff1"/>
@@ -3317,7 +3317,7 @@
             <w:noProof/>
             <w:webHidden/>
           </w:rPr>
-          <w:instrText xml:space="preserve"> PAGEREF _Toc242310339 \h </w:instrText>
+          <w:instrText xml:space="preserve"> PAGEREF _Toc242474123 \h </w:instrText>
         </w:r>
         <w:r>
           <w:rPr>
@@ -3366,7 +3366,7 @@
           <w14:ligatures w14:val="standardContextual"/>
         </w:rPr>
       </w:pPr>
-      <w:hyperlink w:anchor="_Toc242310340" w:history="1">
+      <w:hyperlink w:anchor="_Toc242474124" w:history="1">
         <w:r>
           <w:rPr>
             <w:rStyle w:val="aff1"/>
@@ -3393,7 +3393,7 @@
             <w:noProof/>
             <w:webHidden/>
           </w:rPr>
-          <w:instrText xml:space="preserve"> PAGEREF _Toc242310340 \h </w:instrText>
+          <w:instrText xml:space="preserve"> PAGEREF _Toc242474124 \h </w:instrText>
         </w:r>
         <w:r>
           <w:rPr>
@@ -3442,7 +3442,7 @@
           <w14:ligatures w14:val="standardContextual"/>
         </w:rPr>
       </w:pPr>
-      <w:hyperlink w:anchor="_Toc242310341" w:history="1">
+      <w:hyperlink w:anchor="_Toc242474125" w:history="1">
         <w:r>
           <w:rPr>
             <w:rStyle w:val="aff1"/>
@@ -3469,7 +3469,7 @@
             <w:noProof/>
             <w:webHidden/>
           </w:rPr>
-          <w:instrText xml:space="preserve"> PAGEREF _Toc242310341 \h </w:instrText>
+          <w:instrText xml:space="preserve"> PAGEREF _Toc242474125 \h </w:instrText>
         </w:r>
         <w:r>
           <w:rPr>
@@ -3518,7 +3518,7 @@
           <w14:ligatures w14:val="standardContextual"/>
         </w:rPr>
       </w:pPr>
-      <w:hyperlink w:anchor="_Toc242310342" w:history="1">
+      <w:hyperlink w:anchor="_Toc242474126" w:history="1">
         <w:r>
           <w:rPr>
             <w:rStyle w:val="aff1"/>
@@ -3545,7 +3545,7 @@
             <w:noProof/>
             <w:webHidden/>
           </w:rPr>
-          <w:instrText xml:space="preserve"> PAGEREF _Toc242310342 \h </w:instrText>
+          <w:instrText xml:space="preserve"> PAGEREF _Toc242474126 \h </w:instrText>
         </w:r>
         <w:r>
           <w:rPr>
@@ -3594,7 +3594,7 @@
           <w14:ligatures w14:val="standardContextual"/>
         </w:rPr>
       </w:pPr>
-      <w:hyperlink w:anchor="_Toc242310343" w:history="1">
+      <w:hyperlink w:anchor="_Toc242474127" w:history="1">
         <w:r>
           <w:rPr>
             <w:rStyle w:val="aff1"/>
@@ -3621,7 +3621,7 @@
             <w:noProof/>
             <w:webHidden/>
           </w:rPr>
-          <w:instrText xml:space="preserve"> PAGEREF _Toc242310343 \h </w:instrText>
+          <w:instrText xml:space="preserve"> PAGEREF _Toc242474127 \h </w:instrText>
         </w:r>
         <w:r>
           <w:rPr>
@@ -3670,7 +3670,7 @@
           <w14:ligatures w14:val="standardContextual"/>
         </w:rPr>
       </w:pPr>
-      <w:hyperlink w:anchor="_Toc242310344" w:history="1">
+      <w:hyperlink w:anchor="_Toc242474128" w:history="1">
         <w:r>
           <w:rPr>
             <w:rStyle w:val="aff1"/>
@@ -3697,7 +3697,7 @@
             <w:noProof/>
             <w:webHidden/>
           </w:rPr>
-          <w:instrText xml:space="preserve"> PAGEREF _Toc242310344 \h </w:instrText>
+          <w:instrText xml:space="preserve"> PAGEREF _Toc242474128 \h </w:instrText>
         </w:r>
         <w:r>
           <w:rPr>
@@ -3746,7 +3746,7 @@
           <w14:ligatures w14:val="standardContextual"/>
         </w:rPr>
       </w:pPr>
-      <w:hyperlink w:anchor="_Toc242310345" w:history="1">
+      <w:hyperlink w:anchor="_Toc242474129" w:history="1">
         <w:r>
           <w:rPr>
             <w:rStyle w:val="aff1"/>
@@ -3773,7 +3773,7 @@
             <w:noProof/>
             <w:webHidden/>
           </w:rPr>
-          <w:instrText xml:space="preserve"> PAGEREF _Toc242310345 \h </w:instrText>
+          <w:instrText xml:space="preserve"> PAGEREF _Toc242474129 \h </w:instrText>
         </w:r>
         <w:r>
           <w:rPr>
@@ -3822,7 +3822,7 @@
           <w14:ligatures w14:val="standardContextual"/>
         </w:rPr>
       </w:pPr>
-      <w:hyperlink w:anchor="_Toc242310346" w:history="1">
+      <w:hyperlink w:anchor="_Toc242474130" w:history="1">
         <w:r>
           <w:rPr>
             <w:rStyle w:val="aff1"/>
@@ -3849,7 +3849,7 @@
             <w:noProof/>
             <w:webHidden/>
           </w:rPr>
-          <w:instrText xml:space="preserve"> PAGEREF _Toc242310346 \h </w:instrText>
+          <w:instrText xml:space="preserve"> PAGEREF _Toc242474130 \h </w:instrText>
         </w:r>
         <w:r>
           <w:rPr>
@@ -3897,7 +3897,7 @@
           <w14:ligatures w14:val="standardContextual"/>
         </w:rPr>
       </w:pPr>
-      <w:hyperlink w:anchor="_Toc242310347" w:history="1">
+      <w:hyperlink w:anchor="_Toc242474131" w:history="1">
         <w:r>
           <w:rPr>
             <w:rStyle w:val="aff1"/>
@@ -3924,7 +3924,7 @@
             <w:noProof/>
             <w:webHidden/>
           </w:rPr>
-          <w:instrText xml:space="preserve"> PAGEREF _Toc242310347 \h </w:instrText>
+          <w:instrText xml:space="preserve"> PAGEREF _Toc242474131 \h </w:instrText>
         </w:r>
         <w:r>
           <w:rPr>
@@ -3973,7 +3973,7 @@
           <w14:ligatures w14:val="standardContextual"/>
         </w:rPr>
       </w:pPr>
-      <w:hyperlink w:anchor="_Toc242310348" w:history="1">
+      <w:hyperlink w:anchor="_Toc242474132" w:history="1">
         <w:r>
           <w:rPr>
             <w:rStyle w:val="aff1"/>
@@ -4000,7 +4000,7 @@
             <w:noProof/>
             <w:webHidden/>
           </w:rPr>
-          <w:instrText xml:space="preserve"> PAGEREF _Toc242310348 \h </w:instrText>
+          <w:instrText xml:space="preserve"> PAGEREF _Toc242474132 \h </w:instrText>
         </w:r>
         <w:r>
           <w:rPr>
@@ -4049,7 +4049,7 @@
           <w14:ligatures w14:val="standardContextual"/>
         </w:rPr>
       </w:pPr>
-      <w:hyperlink w:anchor="_Toc242310349" w:history="1">
+      <w:hyperlink w:anchor="_Toc242474133" w:history="1">
         <w:r>
           <w:rPr>
             <w:rStyle w:val="aff1"/>
@@ -4076,7 +4076,7 @@
             <w:noProof/>
             <w:webHidden/>
           </w:rPr>
-          <w:instrText xml:space="preserve"> PAGEREF _Toc242310349 \h </w:instrText>
+          <w:instrText xml:space="preserve"> PAGEREF _Toc242474133 \h </w:instrText>
         </w:r>
         <w:r>
           <w:rPr>
@@ -4125,7 +4125,7 @@
           <w14:ligatures w14:val="standardContextual"/>
         </w:rPr>
       </w:pPr>
-      <w:hyperlink w:anchor="_Toc242310350" w:history="1">
+      <w:hyperlink w:anchor="_Toc242474134" w:history="1">
         <w:r>
           <w:rPr>
             <w:rStyle w:val="aff1"/>
@@ -4152,7 +4152,7 @@
             <w:noProof/>
             <w:webHidden/>
           </w:rPr>
-          <w:instrText xml:space="preserve"> PAGEREF _Toc242310350 \h </w:instrText>
+          <w:instrText xml:space="preserve"> PAGEREF _Toc242474134 \h </w:instrText>
         </w:r>
         <w:r>
           <w:rPr>
@@ -4201,7 +4201,7 @@
           <w14:ligatures w14:val="standardContextual"/>
         </w:rPr>
       </w:pPr>
-      <w:hyperlink w:anchor="_Toc242310351" w:history="1">
+      <w:hyperlink w:anchor="_Toc242474135" w:history="1">
         <w:r>
           <w:rPr>
             <w:rStyle w:val="aff1"/>
@@ -4228,7 +4228,7 @@
             <w:noProof/>
             <w:webHidden/>
           </w:rPr>
-          <w:instrText xml:space="preserve"> PAGEREF _Toc242310351 \h </w:instrText>
+          <w:instrText xml:space="preserve"> PAGEREF _Toc242474135 \h </w:instrText>
         </w:r>
         <w:r>
           <w:rPr>
@@ -4277,7 +4277,7 @@
           <w14:ligatures w14:val="standardContextual"/>
         </w:rPr>
       </w:pPr>
-      <w:hyperlink w:anchor="_Toc242310352" w:history="1">
+      <w:hyperlink w:anchor="_Toc242474136" w:history="1">
         <w:r>
           <w:rPr>
             <w:rStyle w:val="aff1"/>
@@ -4304,7 +4304,7 @@
             <w:noProof/>
             <w:webHidden/>
           </w:rPr>
-          <w:instrText xml:space="preserve"> PAGEREF _Toc242310352 \h </w:instrText>
+          <w:instrText xml:space="preserve"> PAGEREF _Toc242474136 \h </w:instrText>
         </w:r>
         <w:r>
           <w:rPr>
@@ -4353,7 +4353,7 @@
           <w14:ligatures w14:val="standardContextual"/>
         </w:rPr>
       </w:pPr>
-      <w:hyperlink w:anchor="_Toc242310353" w:history="1">
+      <w:hyperlink w:anchor="_Toc242474137" w:history="1">
         <w:r>
           <w:rPr>
             <w:rStyle w:val="aff1"/>
@@ -4380,7 +4380,7 @@
             <w:noProof/>
             <w:webHidden/>
           </w:rPr>
-          <w:instrText xml:space="preserve"> PAGEREF _Toc242310353 \h </w:instrText>
+          <w:instrText xml:space="preserve"> PAGEREF _Toc242474137 \h </w:instrText>
         </w:r>
         <w:r>
           <w:rPr>
@@ -4429,7 +4429,7 @@
           <w14:ligatures w14:val="standardContextual"/>
         </w:rPr>
       </w:pPr>
-      <w:hyperlink w:anchor="_Toc242310354" w:history="1">
+      <w:hyperlink w:anchor="_Toc242474138" w:history="1">
         <w:r>
           <w:rPr>
             <w:rStyle w:val="aff1"/>
@@ -4456,7 +4456,7 @@
             <w:noProof/>
             <w:webHidden/>
           </w:rPr>
-          <w:instrText xml:space="preserve"> PAGEREF _Toc242310354 \h </w:instrText>
+          <w:instrText xml:space="preserve"> PAGEREF _Toc242474138 \h </w:instrText>
         </w:r>
         <w:r>
           <w:rPr>
@@ -4505,7 +4505,7 @@
           <w14:ligatures w14:val="standardContextual"/>
         </w:rPr>
       </w:pPr>
-      <w:hyperlink w:anchor="_Toc242310355" w:history="1">
+      <w:hyperlink w:anchor="_Toc242474139" w:history="1">
         <w:r>
           <w:rPr>
             <w:rStyle w:val="aff1"/>
@@ -4532,7 +4532,7 @@
             <w:noProof/>
             <w:webHidden/>
           </w:rPr>
-          <w:instrText xml:space="preserve"> PAGEREF _Toc242310355 \h </w:instrText>
+          <w:instrText xml:space="preserve"> PAGEREF _Toc242474139 \h </w:instrText>
         </w:r>
         <w:r>
           <w:rPr>
@@ -4581,7 +4581,7 @@
           <w14:ligatures w14:val="standardContextual"/>
         </w:rPr>
       </w:pPr>
-      <w:hyperlink w:anchor="_Toc242310356" w:history="1">
+      <w:hyperlink w:anchor="_Toc242474140" w:history="1">
         <w:r>
           <w:rPr>
             <w:rStyle w:val="aff1"/>
@@ -4608,7 +4608,7 @@
             <w:noProof/>
             <w:webHidden/>
           </w:rPr>
-          <w:instrText xml:space="preserve"> PAGEREF _Toc242310356 \h </w:instrText>
+          <w:instrText xml:space="preserve"> PAGEREF _Toc242474140 \h </w:instrText>
         </w:r>
         <w:r>
           <w:rPr>
@@ -4656,7 +4656,7 @@
           <w14:ligatures w14:val="standardContextual"/>
         </w:rPr>
       </w:pPr>
-      <w:hyperlink w:anchor="_Toc242310357" w:history="1">
+      <w:hyperlink w:anchor="_Toc242474141" w:history="1">
         <w:r>
           <w:rPr>
             <w:rStyle w:val="aff1"/>
@@ -4683,7 +4683,7 @@
             <w:noProof/>
             <w:webHidden/>
           </w:rPr>
-          <w:instrText xml:space="preserve"> PAGEREF _Toc242310357 \h </w:instrText>
+          <w:instrText xml:space="preserve"> PAGEREF _Toc242474141 \h </w:instrText>
         </w:r>
         <w:r>
           <w:rPr>
@@ -4732,7 +4732,7 @@
           <w14:ligatures w14:val="standardContextual"/>
         </w:rPr>
       </w:pPr>
-      <w:hyperlink w:anchor="_Toc242310358" w:history="1">
+      <w:hyperlink w:anchor="_Toc242474142" w:history="1">
         <w:r>
           <w:rPr>
             <w:rStyle w:val="aff1"/>
@@ -4759,7 +4759,7 @@
             <w:noProof/>
             <w:webHidden/>
           </w:rPr>
-          <w:instrText xml:space="preserve"> PAGEREF _Toc242310358 \h </w:instrText>
+          <w:instrText xml:space="preserve"> PAGEREF _Toc242474142 \h </w:instrText>
         </w:r>
         <w:r>
           <w:rPr>
@@ -4808,7 +4808,7 @@
           <w14:ligatures w14:val="standardContextual"/>
         </w:rPr>
       </w:pPr>
-      <w:hyperlink w:anchor="_Toc242310359" w:history="1">
+      <w:hyperlink w:anchor="_Toc242474143" w:history="1">
         <w:r>
           <w:rPr>
             <w:rStyle w:val="aff1"/>
@@ -4835,7 +4835,7 @@
             <w:noProof/>
             <w:webHidden/>
           </w:rPr>
-          <w:instrText xml:space="preserve"> PAGEREF _Toc242310359 \h </w:instrText>
+          <w:instrText xml:space="preserve"> PAGEREF _Toc242474143 \h </w:instrText>
         </w:r>
         <w:r>
           <w:rPr>
@@ -4884,7 +4884,7 @@
           <w14:ligatures w14:val="standardContextual"/>
         </w:rPr>
       </w:pPr>
-      <w:hyperlink w:anchor="_Toc242310360" w:history="1">
+      <w:hyperlink w:anchor="_Toc242474144" w:history="1">
         <w:r>
           <w:rPr>
             <w:rStyle w:val="aff1"/>
@@ -4911,7 +4911,7 @@
             <w:noProof/>
             <w:webHidden/>
           </w:rPr>
-          <w:instrText xml:space="preserve"> PAGEREF _Toc242310360 \h </w:instrText>
+          <w:instrText xml:space="preserve"> PAGEREF _Toc242474144 \h </w:instrText>
         </w:r>
         <w:r>
           <w:rPr>
@@ -4960,7 +4960,7 @@
           <w14:ligatures w14:val="standardContextual"/>
         </w:rPr>
       </w:pPr>
-      <w:hyperlink w:anchor="_Toc242310361" w:history="1">
+      <w:hyperlink w:anchor="_Toc242474145" w:history="1">
         <w:r>
           <w:rPr>
             <w:rStyle w:val="aff1"/>
@@ -4987,7 +4987,7 @@
             <w:noProof/>
             <w:webHidden/>
           </w:rPr>
-          <w:instrText xml:space="preserve"> PAGEREF _Toc242310361 \h </w:instrText>
+          <w:instrText xml:space="preserve"> PAGEREF _Toc242474145 \h </w:instrText>
         </w:r>
         <w:r>
           <w:rPr>
@@ -5036,7 +5036,7 @@
           <w14:ligatures w14:val="standardContextual"/>
         </w:rPr>
       </w:pPr>
-      <w:hyperlink w:anchor="_Toc242310362" w:history="1">
+      <w:hyperlink w:anchor="_Toc242474146" w:history="1">
         <w:r>
           <w:rPr>
             <w:rStyle w:val="aff1"/>
@@ -5063,7 +5063,7 @@
             <w:noProof/>
             <w:webHidden/>
           </w:rPr>
-          <w:instrText xml:space="preserve"> PAGEREF _Toc242310362 \h </w:instrText>
+          <w:instrText xml:space="preserve"> PAGEREF _Toc242474146 \h </w:instrText>
         </w:r>
         <w:r>
           <w:rPr>
@@ -5112,7 +5112,7 @@
           <w14:ligatures w14:val="standardContextual"/>
         </w:rPr>
       </w:pPr>
-      <w:hyperlink w:anchor="_Toc242310363" w:history="1">
+      <w:hyperlink w:anchor="_Toc242474147" w:history="1">
         <w:r>
           <w:rPr>
             <w:rStyle w:val="aff1"/>
@@ -5139,7 +5139,7 @@
             <w:noProof/>
             <w:webHidden/>
           </w:rPr>
-          <w:instrText xml:space="preserve"> PAGEREF _Toc242310363 \h </w:instrText>
+          <w:instrText xml:space="preserve"> PAGEREF _Toc242474147 \h </w:instrText>
         </w:r>
         <w:r>
           <w:rPr>
@@ -5188,7 +5188,7 @@
           <w14:ligatures w14:val="standardContextual"/>
         </w:rPr>
       </w:pPr>
-      <w:hyperlink w:anchor="_Toc242310364" w:history="1">
+      <w:hyperlink w:anchor="_Toc242474148" w:history="1">
         <w:r>
           <w:rPr>
             <w:rStyle w:val="aff1"/>
@@ -5215,7 +5215,7 @@
             <w:noProof/>
             <w:webHidden/>
           </w:rPr>
-          <w:instrText xml:space="preserve"> PAGEREF _Toc242310364 \h </w:instrText>
+          <w:instrText xml:space="preserve"> PAGEREF _Toc242474148 \h </w:instrText>
         </w:r>
         <w:r>
           <w:rPr>
@@ -5263,7 +5263,7 @@
           <w14:ligatures w14:val="standardContextual"/>
         </w:rPr>
       </w:pPr>
-      <w:hyperlink w:anchor="_Toc242310365" w:history="1">
+      <w:hyperlink w:anchor="_Toc242474149" w:history="1">
         <w:r>
           <w:rPr>
             <w:rStyle w:val="aff1"/>
@@ -5290,7 +5290,7 @@
             <w:noProof/>
             <w:webHidden/>
           </w:rPr>
-          <w:instrText xml:space="preserve"> PAGEREF _Toc242310365 \h </w:instrText>
+          <w:instrText xml:space="preserve"> PAGEREF _Toc242474149 \h </w:instrText>
         </w:r>
         <w:r>
           <w:rPr>
@@ -5338,7 +5338,7 @@
           <w14:ligatures w14:val="standardContextual"/>
         </w:rPr>
       </w:pPr>
-      <w:hyperlink w:anchor="_Toc242310366" w:history="1">
+      <w:hyperlink w:anchor="_Toc242474150" w:history="1">
         <w:r>
           <w:rPr>
             <w:rStyle w:val="aff1"/>
@@ -5365,7 +5365,7 @@
             <w:noProof/>
             <w:webHidden/>
           </w:rPr>
-          <w:instrText xml:space="preserve"> PAGEREF _Toc242310366 \h </w:instrText>
+          <w:instrText xml:space="preserve"> PAGEREF _Toc242474150 \h </w:instrText>
         </w:r>
         <w:r>
           <w:rPr>
@@ -5413,7 +5413,7 @@
           <w14:ligatures w14:val="standardContextual"/>
         </w:rPr>
       </w:pPr>
-      <w:hyperlink w:anchor="_Toc242310367" w:history="1">
+      <w:hyperlink w:anchor="_Toc242474151" w:history="1">
         <w:r>
           <w:rPr>
             <w:rStyle w:val="aff1"/>
@@ -5440,7 +5440,7 @@
             <w:noProof/>
             <w:webHidden/>
           </w:rPr>
-          <w:instrText xml:space="preserve"> PAGEREF _Toc242310367 \h </w:instrText>
+          <w:instrText xml:space="preserve"> PAGEREF _Toc242474151 \h </w:instrText>
         </w:r>
         <w:r>
           <w:rPr>
@@ -5490,7 +5490,7 @@
           <w:numId w:val="7"/>
         </w:numPr>
       </w:pPr>
-      <w:bookmarkStart w:id="0" w:name="_Toc242310303"/>
+      <w:bookmarkStart w:id="0" w:name="_Toc242474087"/>
       <w:r>
         <w:lastRenderedPageBreak/>
         <w:t>게임</w:t>
@@ -5523,7 +5523,7 @@
           <w:numId w:val="7"/>
         </w:numPr>
       </w:pPr>
-      <w:bookmarkStart w:id="1" w:name="_Toc242310304"/>
+      <w:bookmarkStart w:id="1" w:name="_Toc242474088"/>
       <w:r>
         <w:t>Executive Summary</w:t>
       </w:r>
@@ -5594,7 +5594,7 @@
           <w:numId w:val="7"/>
         </w:numPr>
       </w:pPr>
-      <w:bookmarkStart w:id="2" w:name="_Toc242310305"/>
+      <w:bookmarkStart w:id="2" w:name="_Toc242474089"/>
       <w:r>
         <w:t>Rev 16 Release Profile</w:t>
       </w:r>
@@ -5618,7 +5618,7 @@
           <w:numId w:val="7"/>
         </w:numPr>
       </w:pPr>
-      <w:bookmarkStart w:id="3" w:name="_Toc242310306"/>
+      <w:bookmarkStart w:id="3" w:name="_Toc242474090"/>
       <w:r>
         <w:t>제품</w:t>
       </w:r>
@@ -5913,7 +5913,7 @@
           <w:numId w:val="7"/>
         </w:numPr>
       </w:pPr>
-      <w:bookmarkStart w:id="4" w:name="_Toc242310307"/>
+      <w:bookmarkStart w:id="4" w:name="_Toc242474091"/>
       <w:r>
         <w:t>디자인</w:t>
       </w:r>
@@ -6283,7 +6283,7 @@
           <w:numId w:val="7"/>
         </w:numPr>
       </w:pPr>
-      <w:bookmarkStart w:id="5" w:name="_Toc242310308"/>
+      <w:bookmarkStart w:id="5" w:name="_Toc242474092"/>
       <w:r>
         <w:t>Target Experience</w:t>
       </w:r>
@@ -6357,7 +6357,7 @@
           <w:numId w:val="7"/>
         </w:numPr>
       </w:pPr>
-      <w:bookmarkStart w:id="6" w:name="_Toc242310309"/>
+      <w:bookmarkStart w:id="6" w:name="_Toc242474093"/>
       <w:r>
         <w:t>명시적</w:t>
       </w:r>
@@ -6629,7 +6629,7 @@
           <w:numId w:val="7"/>
         </w:numPr>
       </w:pPr>
-      <w:bookmarkStart w:id="7" w:name="_Toc242310310"/>
+      <w:bookmarkStart w:id="7" w:name="_Toc242474094"/>
       <w:r>
         <w:lastRenderedPageBreak/>
         <w:t>Contract Run</w:t>
@@ -6665,7 +6665,7 @@
           <w:numId w:val="7"/>
         </w:numPr>
       </w:pPr>
-      <w:bookmarkStart w:id="8" w:name="_Toc242310311"/>
+      <w:bookmarkStart w:id="8" w:name="_Toc242474095"/>
       <w:r>
         <w:t>Core Loop</w:t>
       </w:r>
@@ -7159,7 +7159,7 @@
           <w:numId w:val="7"/>
         </w:numPr>
       </w:pPr>
-      <w:bookmarkStart w:id="9" w:name="_Toc242310312"/>
+      <w:bookmarkStart w:id="9" w:name="_Toc242474096"/>
       <w:r>
         <w:t xml:space="preserve">Contract </w:t>
       </w:r>
@@ -7583,7 +7583,7 @@
           <w:numId w:val="7"/>
         </w:numPr>
       </w:pPr>
-      <w:bookmarkStart w:id="10" w:name="_Toc242310313"/>
+      <w:bookmarkStart w:id="10" w:name="_Toc242474097"/>
       <w:r>
         <w:lastRenderedPageBreak/>
         <w:t>성공</w:t>
@@ -7875,7 +7875,7 @@
           <w:numId w:val="7"/>
         </w:numPr>
       </w:pPr>
-      <w:bookmarkStart w:id="11" w:name="_Toc242310314"/>
+      <w:bookmarkStart w:id="11" w:name="_Toc242474098"/>
       <w:r>
         <w:t>Greed Decision</w:t>
       </w:r>
@@ -8244,7 +8244,7 @@
           <w:numId w:val="7"/>
         </w:numPr>
       </w:pPr>
-      <w:bookmarkStart w:id="12" w:name="_Toc242310315"/>
+      <w:bookmarkStart w:id="12" w:name="_Toc242474099"/>
       <w:r>
         <w:t>15~25</w:t>
       </w:r>
@@ -8614,7 +8614,7 @@
           <w:numId w:val="7"/>
         </w:numPr>
       </w:pPr>
-      <w:bookmarkStart w:id="13" w:name="_Toc242310316"/>
+      <w:bookmarkStart w:id="13" w:name="_Toc242474100"/>
       <w:r>
         <w:lastRenderedPageBreak/>
         <w:t>위조와</w:t>
@@ -8641,7 +8641,7 @@
           <w:numId w:val="7"/>
         </w:numPr>
       </w:pPr>
-      <w:bookmarkStart w:id="14" w:name="_Toc242310317"/>
+      <w:bookmarkStart w:id="14" w:name="_Toc242474101"/>
       <w:r>
         <w:t>Artifact</w:t>
       </w:r>
@@ -8946,7 +8946,7 @@
           <w:numId w:val="7"/>
         </w:numPr>
       </w:pPr>
-      <w:bookmarkStart w:id="15" w:name="_Toc242310318"/>
+      <w:bookmarkStart w:id="15" w:name="_Toc242474102"/>
       <w:r>
         <w:t xml:space="preserve">Surface Forgery </w:t>
       </w:r>
@@ -9128,7 +9128,7 @@
           <w:numId w:val="7"/>
         </w:numPr>
       </w:pPr>
-      <w:bookmarkStart w:id="16" w:name="_Toc242310319"/>
+      <w:bookmarkStart w:id="16" w:name="_Toc242474103"/>
       <w:r>
         <w:t>Object Assembly — Deferred Expansion</w:t>
       </w:r>
@@ -9195,7 +9195,7 @@
           <w:numId w:val="7"/>
         </w:numPr>
       </w:pPr>
-      <w:bookmarkStart w:id="17" w:name="_Toc242310320"/>
+      <w:bookmarkStart w:id="17" w:name="_Toc242474104"/>
       <w:r>
         <w:t>Quality</w:t>
       </w:r>
@@ -9485,7 +9485,7 @@
           <w:numId w:val="7"/>
         </w:numPr>
       </w:pPr>
-      <w:bookmarkStart w:id="18" w:name="_Toc242310321"/>
+      <w:bookmarkStart w:id="18" w:name="_Toc242474105"/>
       <w:r>
         <w:t>핵심</w:t>
       </w:r>
@@ -9986,7 +9986,7 @@
           <w:numId w:val="7"/>
         </w:numPr>
       </w:pPr>
-      <w:bookmarkStart w:id="19" w:name="_Toc242310322"/>
+      <w:bookmarkStart w:id="19" w:name="_Toc242474106"/>
       <w:r>
         <w:lastRenderedPageBreak/>
         <w:t xml:space="preserve">Owner-only Forgery </w:t>
@@ -10238,7 +10238,7 @@
           <w:numId w:val="7"/>
         </w:numPr>
       </w:pPr>
-      <w:bookmarkStart w:id="20" w:name="_Toc242310323"/>
+      <w:bookmarkStart w:id="20" w:name="_Toc242474107"/>
       <w:r>
         <w:lastRenderedPageBreak/>
         <w:t>잠입</w:t>
@@ -10271,7 +10271,7 @@
           <w:numId w:val="7"/>
         </w:numPr>
       </w:pPr>
-      <w:bookmarkStart w:id="21" w:name="_Toc242310324"/>
+      <w:bookmarkStart w:id="21" w:name="_Toc242474108"/>
       <w:r>
         <w:t xml:space="preserve">First-Person </w:t>
       </w:r>
@@ -10341,7 +10341,7 @@
           <w:numId w:val="7"/>
         </w:numPr>
       </w:pPr>
-      <w:bookmarkStart w:id="22" w:name="_Toc242310325"/>
+      <w:bookmarkStart w:id="22" w:name="_Toc242474109"/>
       <w:r>
         <w:t>Walk, Sprint, Weight, Footstep</w:t>
       </w:r>
@@ -10684,7 +10684,7 @@
           <w:numId w:val="7"/>
         </w:numPr>
       </w:pPr>
-      <w:bookmarkStart w:id="23" w:name="_Toc242310326"/>
+      <w:bookmarkStart w:id="23" w:name="_Toc242474110"/>
       <w:r>
         <w:t>Patrol Guard</w:t>
       </w:r>
@@ -10742,7 +10742,7 @@
     </w:p>
     <w:p>
       <w:r>
-        <w:t xml:space="preserve">경비는 상체 앞쪽에서 진행 방향을 비추는 손전등을 항상 켜고 순찰한다. 플레이어보다 밝은 빛으로 경비의 존재와 방향을 읽을 수 있게 하되 실제 감지 범위는 기존 경비 시야 규칙을 유지한다. 현장 경비는 전시 구역마다 짧은 지역 순찰을 맡아 주변을 살피고 이동 시점을 고르게 한다. 구금 구역의 기존 전담 순찰은 유지하고, 각 맵의 구금실 근처에 상주 경비 한 명을 추가해 구조와 압수품 회수 시점을 선택하게 한다. 상주 경비도 소음과 추적에는 기존 경비와 같은 방식으로 반응한다.</w:t>
+        <w:t>경비는 상체 앞쪽에서 진행 방향을 비추는 손전등을 항상 켜고 순찰한다. 플레이어보다 밝은 빛으로 경비의 존재와 방향을 읽을 수 있게 하되 실제 감지 범위는 기존 경비 시야 규칙을 유지한다. 현장 경비는 전시 구역마다 짧은 지역 순찰을 맡아 주변을 살피고 이동 시점을 고르게 한다. 구금 구역의 기존 전담 순찰은 유지하고, 각 맵의 구금실 근처에 상주 경비 한 명을 추가해 구조와 압수품 회수 시점을 선택하게 한다. 상주 경비도 소음과 추적에는 기존 경비와 같은 방식으로 반응한다.</w:t>
       </w:r>
     </w:p>
     <w:tbl>
@@ -11040,7 +11040,7 @@
           <w:numId w:val="7"/>
         </w:numPr>
       </w:pPr>
-      <w:bookmarkStart w:id="24" w:name="_Toc242310327"/>
+      <w:bookmarkStart w:id="24" w:name="_Toc242474111"/>
       <w:r>
         <w:t>CCTV</w:t>
       </w:r>
@@ -11054,7 +11054,7 @@
     </w:p>
     <w:p>
       <w:r>
-        <w:t xml:space="preserve">CCTV는 첫 포착 시 회전을 멈추고 2.025초 노출 시 경계도 +0.5와 근처 Guard 조사를 유발한다. 모두 시야를 벗어나면 누적을 지우고 1.5초 뒤 같은 각도·방향에서 회전을 재개한다. 재포착은 복귀를 취소한다. 렌즈·본체·조명은 함께 움직이고 흰빛은 누적에 따라 붉어져 발각 시 잠시 유지된다. CCTV는 작품 작업점을 상시 덮기보다 진입과 전리품 회수 동선을 감시한다. 회전 방향과 빈틈을 보고 이동 시점을 선택하게 하며 약한 야간 조명과 기존 발각 규칙은 유지한다.</w:t>
+        <w:t>CCTV는 첫 포착 시 회전을 멈추고 2.025초 노출 시 경계도 +0.5와 근처 Guard 조사를 유발한다. 모두 시야를 벗어나면 누적을 지우고 1.5초 뒤 같은 각도·방향에서 회전을 재개한다. 재포착은 복귀를 취소한다. 렌즈·본체·조명은 함께 움직이고 흰빛은 누적에 따라 붉어져 발각 시 잠시 유지된다. CCTV는 전시실 진입·접근·반출 동선을 감시하며 작품 앞 작업을 강제로 발각시키는 배치를 피한다. 매 판 활성 위치가 달라지므로 각 맵의 그림 후보 60곳과 유물 후보 12곳 모두에 실제로 서서 상호작용하고 작업을 마칠 수 있는 자리를 적어도 하나 남긴다. 넓은 작업 여유는 권장하며 좁은 자리라는 이유만으로 기존 상호작용이 가능한 작품을 제외하지 않는다. 해당 자리는 다른 CCTV를 포함한 전체 회전 범위에서도 보이지 않아야 하며 필수 작품에도 같은 기준을 적용한다. 작품 앞 위험은 경비의 순찰을 보고 작업 시점을 선택하는 방식으로 유지한다. CCTV의 회전 방향과 빈틈은 이동 시점을 선택하게 하며 약한 야간 조명과 기존 발각 규칙은 유지한다.</w:t>
       </w:r>
     </w:p>
     <w:p>
@@ -11064,6 +11064,7 @@
     </w:p>
     <w:p>
       <w:r>
+        <w:lastRenderedPageBreak/>
         <w:t>한 Player가 Button을 Hold하는 2~5초 동안 다른 Player가 문턱을 통과한다. 전체 Forgery 시간 동안 기다리게 하지 않고, 작업 후 나올 때 다시 협동한다.</w:t>
       </w:r>
     </w:p>
@@ -11194,7 +11195,6 @@
           </w:tcPr>
           <w:p>
             <w:r>
-              <w:lastRenderedPageBreak/>
               <w:t>CCTV</w:t>
             </w:r>
           </w:p>
@@ -11291,7 +11291,7 @@
           <w:numId w:val="7"/>
         </w:numPr>
       </w:pPr>
-      <w:bookmarkStart w:id="25" w:name="_Toc242310328"/>
+      <w:bookmarkStart w:id="25" w:name="_Toc242474112"/>
       <w:r>
         <w:t>Stun, Arrest, Recovery</w:t>
       </w:r>
@@ -11354,6 +11354,7 @@
         </w:numPr>
       </w:pPr>
       <w:r>
+        <w:lastRenderedPageBreak/>
         <w:t>강한 Blur와 지속 Camera Shake를 기본 경고로 사용하지 않는다.</w:t>
       </w:r>
     </w:p>
@@ -11365,7 +11366,7 @@
           <w:numId w:val="7"/>
         </w:numPr>
       </w:pPr>
-      <w:bookmarkStart w:id="26" w:name="_Toc242310329"/>
+      <w:bookmarkStart w:id="26" w:name="_Toc242474113"/>
       <w:r>
         <w:t>두</w:t>
       </w:r>
@@ -11653,7 +11654,6 @@
               <w:pStyle w:val="TableText"/>
             </w:pPr>
             <w:r>
-              <w:lastRenderedPageBreak/>
               <w:t>Arrest</w:t>
             </w:r>
           </w:p>
@@ -11842,7 +11842,7 @@
           <w:numId w:val="7"/>
         </w:numPr>
       </w:pPr>
-      <w:bookmarkStart w:id="27" w:name="_Toc242310330"/>
+      <w:bookmarkStart w:id="27" w:name="_Toc242474114"/>
       <w:r>
         <w:lastRenderedPageBreak/>
         <w:t>협동</w:t>
@@ -11869,7 +11869,7 @@
           <w:numId w:val="7"/>
         </w:numPr>
       </w:pPr>
-      <w:bookmarkStart w:id="28" w:name="_Toc242310331"/>
+      <w:bookmarkStart w:id="28" w:name="_Toc242474115"/>
       <w:r>
         <w:t>Role Switching</w:t>
       </w:r>
@@ -12277,7 +12277,7 @@
           <w:numId w:val="7"/>
         </w:numPr>
       </w:pPr>
-      <w:bookmarkStart w:id="29" w:name="_Toc242310332"/>
+      <w:bookmarkStart w:id="29" w:name="_Toc242474116"/>
       <w:r>
         <w:t>거리</w:t>
       </w:r>
@@ -12336,7 +12336,7 @@
           <w:numId w:val="7"/>
         </w:numPr>
       </w:pPr>
-      <w:bookmarkStart w:id="30" w:name="_Toc242310333"/>
+      <w:bookmarkStart w:id="30" w:name="_Toc242474117"/>
       <w:r>
         <w:t>Inventory, Loose Loot, Coin</w:t>
       </w:r>
@@ -12399,7 +12399,7 @@
           <w:numId w:val="7"/>
         </w:numPr>
       </w:pPr>
-      <w:bookmarkStart w:id="31" w:name="_Toc242310334"/>
+      <w:bookmarkStart w:id="31" w:name="_Toc242474118"/>
       <w:r>
         <w:t>Player Identity</w:t>
       </w:r>
@@ -12822,7 +12822,7 @@
           <w:numId w:val="7"/>
         </w:numPr>
       </w:pPr>
-      <w:bookmarkStart w:id="32" w:name="_Toc242310335"/>
+      <w:bookmarkStart w:id="32" w:name="_Toc242474119"/>
       <w:r>
         <w:t xml:space="preserve">Floor Plan Map </w:t>
       </w:r>
@@ -13035,7 +13035,7 @@
           <w:numId w:val="7"/>
         </w:numPr>
       </w:pPr>
-      <w:bookmarkStart w:id="33" w:name="_Toc242310336"/>
+      <w:bookmarkStart w:id="33" w:name="_Toc242474120"/>
       <w:r>
         <w:t>Shared Extraction</w:t>
       </w:r>
@@ -13114,7 +13114,7 @@
           <w:numId w:val="7"/>
         </w:numPr>
       </w:pPr>
-      <w:bookmarkStart w:id="34" w:name="_Toc242310337"/>
+      <w:bookmarkStart w:id="34" w:name="_Toc242474121"/>
       <w:r>
         <w:lastRenderedPageBreak/>
         <w:t xml:space="preserve">UI, </w:t>
@@ -13143,7 +13143,7 @@
           <w:numId w:val="7"/>
         </w:numPr>
       </w:pPr>
-      <w:bookmarkStart w:id="35" w:name="_Toc242310338"/>
+      <w:bookmarkStart w:id="35" w:name="_Toc242474122"/>
       <w:r>
         <w:t>HUD Information Architecture</w:t>
       </w:r>
@@ -13441,7 +13441,7 @@
           <w:numId w:val="7"/>
         </w:numPr>
       </w:pPr>
-      <w:bookmarkStart w:id="36" w:name="_Toc242310339"/>
+      <w:bookmarkStart w:id="36" w:name="_Toc242474123"/>
       <w:r>
         <w:lastRenderedPageBreak/>
         <w:t xml:space="preserve">Main HUD </w:t>
@@ -13749,7 +13749,7 @@
           <w:numId w:val="7"/>
         </w:numPr>
       </w:pPr>
-      <w:bookmarkStart w:id="37" w:name="_Toc242310340"/>
+      <w:bookmarkStart w:id="37" w:name="_Toc242474124"/>
       <w:r>
         <w:t>최소</w:t>
       </w:r>
@@ -13835,7 +13835,7 @@
           <w:numId w:val="7"/>
         </w:numPr>
       </w:pPr>
-      <w:bookmarkStart w:id="38" w:name="_Toc242310341"/>
+      <w:bookmarkStart w:id="38" w:name="_Toc242474125"/>
       <w:r>
         <w:t xml:space="preserve">Input Mode </w:t>
       </w:r>
@@ -14315,7 +14315,7 @@
           <w:numId w:val="7"/>
         </w:numPr>
       </w:pPr>
-      <w:bookmarkStart w:id="39" w:name="_Toc242310342"/>
+      <w:bookmarkStart w:id="39" w:name="_Toc242474126"/>
       <w:r>
         <w:lastRenderedPageBreak/>
         <w:t>Floor Plan</w:t>
@@ -14339,7 +14339,7 @@
           <w:numId w:val="7"/>
         </w:numPr>
       </w:pPr>
-      <w:bookmarkStart w:id="40" w:name="_Toc242310343"/>
+      <w:bookmarkStart w:id="40" w:name="_Toc242474127"/>
       <w:r>
         <w:t xml:space="preserve">Floor Plan Map </w:t>
       </w:r>
@@ -14654,7 +14654,7 @@
           <w:numId w:val="7"/>
         </w:numPr>
       </w:pPr>
-      <w:bookmarkStart w:id="41" w:name="_Toc242310344"/>
+      <w:bookmarkStart w:id="41" w:name="_Toc242474128"/>
       <w:r>
         <w:t xml:space="preserve">Team Result / Replica Recap </w:t>
       </w:r>
@@ -14815,7 +14815,7 @@
     </w:tbl>
     <w:p>
       <w:r>
-        <w:t>지도는 현재 탐색·정보 공개 규칙을 유지하며 평면도와 범례를 우선한다. 결과는 미션 성패, 팀 확보 가치와 실제 Replica 작품을 먼저 보여준다. 기본 표는 플레이어·상태·확보 가치·최고 유사도 네 열이며 상세 내역은 플레이어·위조·원본 회수·경비 유인·동료 구출·경보 발생 여섯 열로 전환한다. 요약과 상세 표는 동시에 표시하지 않는다. 결과 제목은 ‘미션 결과’, 성패는 ‘미션 성공’·‘부분 성공’·‘미션 실패’, 작품 점수는 ‘유사도’로 표시한다. 로비의 침입 장소는 이름 왼쪽·썸네일 오른쪽의 세로 스크롤 목록이며, 무작위의 물음표 그림 다음 M01·M02·M03 순으로 표시한다. 약 세 행을 보여 추가 맵을 스크롤로 찾게 한다. 침입 장소와 팀 목록의 상단을 같은 기준선에 맞추고 열 사이 여백과 행 구분선으로 영역을 나눈다. 참가 코드·복사·참가 인원·나가기는 상단의 한 행에 같은 문자 크기로 정렬한다. 팀 슬롯 네 개는 고정하며 이름 아래 준비 상태를 표시한다. 준비·준비 취소와 Host의 게임 시작은 공통 하단 영역에 둔다. 환경설정은 전체 화면의 머리글·설정 행·하단 작업 영역으로 구성하며 다른 메뉴보다 위에서 입력을 받는 모달로 연다. 상단 닫기는 제거하고 하단 ESC 닫기의 클릭과 Escape 키가 같은 닫기 동작을 수행한다. 로비·결과·환경설정의 제목과 대응 행은 같은 열 경계에 정렬하고 긴 플레이어 이름에는 상태·가치 열과 겹치지 않는 폭을 배정한다. 버튼 문구는 가로·세로 중앙에 둔다. 로비 플레이어 카드와 정사각 프로필은 같은 크기·중심축·대칭 여백을 사용한다. 로비 제목은 ‘대기실’, Host 표시는 ‘방장’, 준비 전은 ‘준비 안 됨’, 원본 운반 상태는 ‘원본 운반 중’, 구금 상태는 ‘구금 중’, Inventory 제목은 ‘가방’으로 표시한다. ‘활동 중’은 이동 여부를 뜻하지 않는 기존 활성 상태로 유지한다.</w:t>
+        <w:t>지도는 현재 탐색·정보 공개 규칙을 유지하며 평면도와 범례를 우선한다. 결과는 미션 성패, 팀 확보 가치와 실제 Replica 작품을 먼저 보여준다. 기본 표는 플레이어·상태·확보 가치·최고 유사도 네 열이며 상세 내역은 플레이어·위조·원본 회수·경비 유인·동료 구출·경보 발생 여섯 열로 전환한다. 요약과 상세 표는 동시에 표시하지 않는다. 결과 제목은 ‘미션 결과’, 성패는 ‘미션 성공’·‘부분 성공’·‘미션 실패’, 작품 점수는 ‘유사도’로 표시한다. 로비의 침입 장소는 이름 왼쪽·썸네일 오른쪽의 세로 스크롤 목록이며, 무작위의 물음표 그림 다음 M01·M02·M03 순으로 표시한다. 약 세 행을 보여 추가 맵을 스크롤로 찾게 한다. 침입 장소와 팀 목록의 상단을 같은 기준선에 맞추고 열 사이 여백과 행 구분선으로 영역을 나눈다. 참가 코드·복사·참가 인원·나가기는 상단의 한 행에 같은 문자 크기로 정렬한다. 팀 슬롯 네 개는 고정하며 이름 아래 준비 상태를 표시한다. 준비·준비 취소와 Host의 게임 시작은 공통 하단 영역에 둔다. 그래픽 품질은 Medium으로 고정하고 환경설정에는 품질 선택 항목을 제공하지 않는다. 화면 해상도·창 모드와 기존 조작·소리 설정은 유지한다. 환경설정은 전체 화면의 머리글·설정 행·하단 작업 영역으로 구성하며 다른 메뉴보다 위에서 입력을 받는 모달로 연다. 상단 닫기는 제거하고 하단 ESC 닫기의 클릭과 Escape 키가 같은 닫기 동작을 수행한다. 로비·결과·환경설정의 제목과 대응 행은 같은 열 경계에 정렬하고 긴 플레이어 이름에는 상태·가치 열과 겹치지 않는 폭을 배정한다. 버튼 문구는 가로·세로 중앙에 둔다. 로비 플레이어 카드와 정사각 프로필은 같은 크기·중심축·대칭 여백을 사용한다. 로비 제목은 ‘대기실’, Host 표시는 ‘방장’, 준비 전은 ‘준비 안 됨’, 원본 운반 상태는 ‘원본 운반 중’, 구금 상태는 ‘구금 중’, Inventory 제목은 ‘가방’으로 표시한다. ‘활동 중’은 이동 여부를 뜻하지 않는 기존 활성 상태로 유지한다.</w:t>
       </w:r>
     </w:p>
     <w:tbl>
@@ -14860,6 +14860,7 @@
                 <w:b/>
                 <w:color w:val="17365D"/>
               </w:rPr>
+              <w:lastRenderedPageBreak/>
               <w:t>Replica Showcase</w:t>
             </w:r>
           </w:p>
@@ -14979,7 +14980,6 @@
               <w:pStyle w:val="TableText"/>
             </w:pPr>
             <w:r>
-              <w:lastRenderedPageBreak/>
               <w:t>웃긴 결과도 숨기지 않음</w:t>
             </w:r>
           </w:p>
@@ -15027,7 +15027,7 @@
           <w:numId w:val="7"/>
         </w:numPr>
       </w:pPr>
-      <w:bookmarkStart w:id="42" w:name="_Toc242310345"/>
+      <w:bookmarkStart w:id="42" w:name="_Toc242474129"/>
       <w:r>
         <w:t>첫</w:t>
       </w:r>
@@ -15301,7 +15301,7 @@
           <w:numId w:val="7"/>
         </w:numPr>
       </w:pPr>
-      <w:bookmarkStart w:id="43" w:name="_Toc242310346"/>
+      <w:bookmarkStart w:id="43" w:name="_Toc242474130"/>
       <w:r>
         <w:t>접근성</w:t>
       </w:r>
@@ -15373,7 +15373,7 @@
           <w:numId w:val="7"/>
         </w:numPr>
       </w:pPr>
-      <w:bookmarkStart w:id="44" w:name="_Toc242310347"/>
+      <w:bookmarkStart w:id="44" w:name="_Toc242474131"/>
       <w:r>
         <w:lastRenderedPageBreak/>
         <w:t>레벨</w:t>
@@ -15421,7 +15421,7 @@
           <w:numId w:val="7"/>
         </w:numPr>
       </w:pPr>
-      <w:bookmarkStart w:id="45" w:name="_Toc242310348"/>
+      <w:bookmarkStart w:id="45" w:name="_Toc242474132"/>
       <w:r>
         <w:t>세</w:t>
       </w:r>
@@ -15509,7 +15509,7 @@
         </w:numPr>
       </w:pPr>
       <w:r>
-        <w:t xml:space="preserve">세 맵은 동일한 Gameplay Rule을 사용하되, Material과 Lighting만이 아니라 Macro Topology, 첫 10초의 정보 공개 방식, Landmark, Target 이후 귀환 경로로 서로 다른 플레이 정체성을 만든다. 야간 침입은 상시 전면 조명 대신 꺼진 구역과 국소 조명의 대비로 표현한다. M01은 따뜻한 전시 잔등, M02는 푸른 중정과 어두운 회랑, M03는 차가운 유리 채광과 서비스 조명을 중심으로 구성한다. 작품 앞과 버튼·출구는 식별 가능하게 유지하며 조명만으로 도난 대상을 알려주지 않는다. 경비실과 구금실은 관람 동선에서 갈라지는 단일 보안 진입부 뒤에 둔다. 폭 1.8m 출입구와 불투명 전실 벽으로 직접 시야를 끊고, CCTV와 내부 순찰을 통과한 뒤 압수품 회수 또는 구금실 구조를 선택한다. 구금실에는 잠긴 철창문으로만 통과할 수 있는 완전한 철제 칸막이와 고정 벤치를 두고, 보안 표지·금속 문틀·차가운 국소등으로 일반 전시실과 경계를 구분한다. 추가 열쇠나 해킹 없이 기존 상호작용으로 구조·회수하며 구조 또는 구속 시간 경과 후 동일 진입부를 통해 탈출을 시도한다. 각 맵의 기존 경비 한 명을 보안 구역과 인접 복도를 순찰하도록 배치한다. 순환 목표는 25~35초이며 철창 앞에서 2~3초 확인한다. 철창 안 구금자는 시야만으로 재체포하지 않으며 작업 실패 소음에는 조사로 반응한다. 보안 보강은 전시·건축·가구와 필수 작품·레이저·구금·압수품·탈출 위치를 유지한 채 경비·CCTV 배치와 순찰 경로만 조정한다.</w:t>
+        <w:t>세 맵은 동일한 Gameplay Rule을 사용하되, Material과 Lighting만이 아니라 Macro Topology, 첫 10초의 정보 공개 방식, Landmark, Target 이후 귀환 경로로 서로 다른 플레이 정체성을 만든다. 야간 침입은 상시 전면 조명 대신 꺼진 구역과 국소 조명의 대비로 표현한다. M01은 따뜻한 전시 잔등, M02는 푸른 중정과 어두운 회랑, M03는 차가운 유리 채광과 서비스 조명을 중심으로 구성한다. 작품 앞과 버튼·출구는 식별 가능하게 유지하며 조명만으로 도난 대상을 알려주지 않는다. 경비실과 구금실은 관람 동선에서 갈라지는 단일 보안 진입부 뒤에 둔다. 폭 1.8m 출입구와 불투명 전실 벽으로 직접 시야를 끊고, CCTV와 내부 순찰을 통과한 뒤 압수품 회수 또는 구금실 구조를 선택한다. 구금실에는 잠긴 철창문으로만 통과할 수 있는 완전한 철제 칸막이와 고정 벤치를 두고, 보안 표지·금속 문틀·차가운 국소등으로 일반 전시실과 경계를 구분한다. 추가 열쇠나 해킹 없이 기존 상호작용으로 구조·회수하며 구조 또는 구속 시간 경과 후 동일 진입부를 통해 탈출을 시도한다. 각 맵의 기존 경비 한 명을 보안 구역과 인접 복도를 순찰하도록 배치한다. 순환 목표는 25~35초이며 철창 앞에서 2~3초 확인한다. 철창 안 구금자는 시야만으로 재체포하지 않으며 작업 실패 소음에는 조사로 반응한다. 보안 보강은 전시·건축·가구와 필수 작품·레이저·구금·압수품·탈출 위치를 유지한 채 경비·CCTV 배치와 순찰 경로만 조정한다.</w:t>
       </w:r>
     </w:p>
     <w:p>
@@ -15541,7 +15541,7 @@
       <w:pPr>
         <w:pStyle w:val="31"/>
       </w:pPr>
-      <w:bookmarkStart w:id="46" w:name="_Toc242310349"/>
+      <w:bookmarkStart w:id="46" w:name="_Toc242474133"/>
       <w:r>
         <w:t>전시</w:t>
       </w:r>
@@ -15622,7 +15622,7 @@
           <w:numId w:val="7"/>
         </w:numPr>
       </w:pPr>
-      <w:bookmarkStart w:id="47" w:name="_Toc242310350"/>
+      <w:bookmarkStart w:id="47" w:name="_Toc242474134"/>
       <w:r>
         <w:t>맵</w:t>
       </w:r>
@@ -16048,7 +16048,7 @@
           <w:numId w:val="7"/>
         </w:numPr>
       </w:pPr>
-      <w:bookmarkStart w:id="48" w:name="_Toc242310351"/>
+      <w:bookmarkStart w:id="48" w:name="_Toc242474135"/>
       <w:r>
         <w:lastRenderedPageBreak/>
         <w:t xml:space="preserve">M01 — </w:t>
@@ -16362,7 +16362,7 @@
           <w:numId w:val="7"/>
         </w:numPr>
       </w:pPr>
-      <w:bookmarkStart w:id="49" w:name="_Toc242310352"/>
+      <w:bookmarkStart w:id="49" w:name="_Toc242474136"/>
       <w:r>
         <w:lastRenderedPageBreak/>
         <w:t xml:space="preserve">M02 — </w:t>
@@ -16673,7 +16673,7 @@
           <w:numId w:val="7"/>
         </w:numPr>
       </w:pPr>
-      <w:bookmarkStart w:id="50" w:name="_Toc242310353"/>
+      <w:bookmarkStart w:id="50" w:name="_Toc242474137"/>
       <w:r>
         <w:lastRenderedPageBreak/>
         <w:t xml:space="preserve">M03 — </w:t>
@@ -16979,7 +16979,7 @@
           <w:numId w:val="7"/>
         </w:numPr>
       </w:pPr>
-      <w:bookmarkStart w:id="51" w:name="_Toc242310354"/>
+      <w:bookmarkStart w:id="51" w:name="_Toc242474138"/>
       <w:r>
         <w:lastRenderedPageBreak/>
         <w:t xml:space="preserve">First-Person </w:t>
@@ -17063,7 +17063,7 @@
           <w:numId w:val="7"/>
         </w:numPr>
       </w:pPr>
-      <w:bookmarkStart w:id="52" w:name="_Toc242310355"/>
+      <w:bookmarkStart w:id="52" w:name="_Toc242474139"/>
       <w:r>
         <w:t>사운드</w:t>
       </w:r>
@@ -17503,7 +17503,7 @@
           <w:numId w:val="7"/>
         </w:numPr>
       </w:pPr>
-      <w:bookmarkStart w:id="53" w:name="_Toc242310356"/>
+      <w:bookmarkStart w:id="53" w:name="_Toc242474140"/>
       <w:r>
         <w:lastRenderedPageBreak/>
         <w:t>세계관과</w:t>
@@ -17750,7 +17750,7 @@
           <w:numId w:val="7"/>
         </w:numPr>
       </w:pPr>
-      <w:bookmarkStart w:id="54" w:name="_Toc242310357"/>
+      <w:bookmarkStart w:id="54" w:name="_Toc242474141"/>
       <w:r>
         <w:lastRenderedPageBreak/>
         <w:t>범위</w:t>
@@ -17777,7 +17777,7 @@
           <w:numId w:val="7"/>
         </w:numPr>
       </w:pPr>
-      <w:bookmarkStart w:id="55" w:name="_Toc242310358"/>
+      <w:bookmarkStart w:id="55" w:name="_Toc242474142"/>
       <w:r>
         <w:t>v1.0 Required Scope</w:t>
       </w:r>
@@ -18145,7 +18145,7 @@
           <w:numId w:val="7"/>
         </w:numPr>
       </w:pPr>
-      <w:bookmarkStart w:id="56" w:name="_Toc242310359"/>
+      <w:bookmarkStart w:id="56" w:name="_Toc242474143"/>
       <w:r>
         <w:t>Deferred Expansion</w:t>
       </w:r>
@@ -18169,7 +18169,7 @@
           <w:numId w:val="7"/>
         </w:numPr>
       </w:pPr>
-      <w:bookmarkStart w:id="57" w:name="_Toc242310360"/>
+      <w:bookmarkStart w:id="57" w:name="_Toc242474144"/>
       <w:r>
         <w:t>Stretch</w:t>
       </w:r>
@@ -18547,7 +18547,7 @@
           <w:numId w:val="7"/>
         </w:numPr>
       </w:pPr>
-      <w:bookmarkStart w:id="58" w:name="_Toc242310361"/>
+      <w:bookmarkStart w:id="58" w:name="_Toc242474145"/>
       <w:r>
         <w:lastRenderedPageBreak/>
         <w:t>Starting Balance Targets</w:t>
@@ -19146,7 +19146,7 @@
           <w:numId w:val="7"/>
         </w:numPr>
       </w:pPr>
-      <w:bookmarkStart w:id="59" w:name="_Toc242310362"/>
+      <w:bookmarkStart w:id="59" w:name="_Toc242474146"/>
       <w:r>
         <w:t>Playtest Questions</w:t>
       </w:r>
@@ -19232,7 +19232,7 @@
           <w:numId w:val="7"/>
         </w:numPr>
       </w:pPr>
-      <w:bookmarkStart w:id="60" w:name="_Toc242310363"/>
+      <w:bookmarkStart w:id="60" w:name="_Toc242474147"/>
       <w:r>
         <w:lastRenderedPageBreak/>
         <w:t>Release KPI</w:t>
@@ -19564,7 +19564,7 @@
           <w:numId w:val="7"/>
         </w:numPr>
       </w:pPr>
-      <w:bookmarkStart w:id="61" w:name="_Toc242310364"/>
+      <w:bookmarkStart w:id="61" w:name="_Toc242474148"/>
       <w:r>
         <w:t>단계별</w:t>
       </w:r>
@@ -19944,7 +19944,7 @@
         <w:keepLines/>
         <w:pageBreakBefore w:val="0"/>
       </w:pPr>
-      <w:bookmarkStart w:id="62" w:name="_Toc242310365"/>
+      <w:bookmarkStart w:id="62" w:name="_Toc242474149"/>
       <w:r>
         <w:t>Appendix A — 용어</w:t>
       </w:r>
@@ -20335,7 +20335,7 @@
         <w:keepLines/>
         <w:pageBreakBefore w:val="0"/>
       </w:pPr>
-      <w:bookmarkStart w:id="63" w:name="_Toc242310366"/>
+      <w:bookmarkStart w:id="63" w:name="_Toc242474150"/>
       <w:r>
         <w:rPr>
           <w:sz w:val="32"/>
@@ -20559,7 +20559,7 @@
         <w:keepLines/>
         <w:pageBreakBefore w:val="0"/>
       </w:pPr>
-      <w:bookmarkStart w:id="64" w:name="_Toc242310367"/>
+      <w:bookmarkStart w:id="64" w:name="_Toc242474151"/>
       <w:r>
         <w:rPr>
           <w:sz w:val="32"/>

</xml_diff>